<commit_message>
Aggiunta parte dei potenziali rischi nel project plan
</commit_message>
<xml_diff>
--- a/documentazione/project plan.docx
+++ b/documentazione/project plan.docx
@@ -86,7 +86,23 @@
           <w:sz w:val="24"/>
           <w:szCs w:val="24"/>
         </w:rPr>
-        <w:t>Dopo una prima fase di registrazione (se necessaria) e login, si apre direttamente la mappa stessa con marker che identificano le colonnine presenti nella zona scelta.</w:t>
+        <w:t xml:space="preserve">Dopo una prima fase di registrazione (se </w:t>
+      </w:r>
+      <w:proofErr w:type="spellStart"/>
+      <w:r>
+        <w:rPr>
+          <w:sz w:val="24"/>
+          <w:szCs w:val="24"/>
+        </w:rPr>
+        <w:t>necessaria</w:t>
+      </w:r>
+      <w:proofErr w:type="spellEnd"/>
+      <w:r>
+        <w:rPr>
+          <w:sz w:val="24"/>
+          <w:szCs w:val="24"/>
+        </w:rPr>
+        <w:t>) e login, si apre direttamente la mappa stessa con marker che identificano le colonnine presenti nella zona scelta.</w:t>
       </w:r>
     </w:p>
     <w:p>
@@ -290,7 +306,23 @@
           <w:sz w:val="24"/>
           <w:szCs w:val="24"/>
         </w:rPr>
-        <w:t>L’approccio si ispira in particolare al modello scrum SCRUM e sui suoi cicli iterativi così composti.</w:t>
+        <w:t xml:space="preserve">L’approccio si ispira in particolare al modello </w:t>
+      </w:r>
+      <w:proofErr w:type="spellStart"/>
+      <w:r>
+        <w:rPr>
+          <w:sz w:val="24"/>
+          <w:szCs w:val="24"/>
+        </w:rPr>
+        <w:t>scrum</w:t>
+      </w:r>
+      <w:proofErr w:type="spellEnd"/>
+      <w:r>
+        <w:rPr>
+          <w:sz w:val="24"/>
+          <w:szCs w:val="24"/>
+        </w:rPr>
+        <w:t xml:space="preserve"> SCRUM e sui suoi cicli iterativi così composti.</w:t>
       </w:r>
     </w:p>
     <w:p>
@@ -383,7 +415,21 @@
     <w:p/>
     <w:p/>
     <w:p>
-      <w:r>
+      <w:pPr>
+        <w:rPr>
+          <w:b/>
+          <w:bCs/>
+          <w:sz w:val="28"/>
+          <w:szCs w:val="28"/>
+        </w:rPr>
+      </w:pPr>
+      <w:r>
+        <w:rPr>
+          <w:b/>
+          <w:bCs/>
+          <w:sz w:val="28"/>
+          <w:szCs w:val="28"/>
+        </w:rPr>
         <w:lastRenderedPageBreak/>
         <w:t>ORGANIZZAZIONE DEL PROCESSO</w:t>
       </w:r>
@@ -392,8 +438,16 @@
       <w:pPr>
         <w:spacing w:after="0"/>
         <w:jc w:val="both"/>
-      </w:pPr>
-      <w:r>
+        <w:rPr>
+          <w:sz w:val="24"/>
+          <w:szCs w:val="24"/>
+        </w:rPr>
+      </w:pPr>
+      <w:r>
+        <w:rPr>
+          <w:sz w:val="24"/>
+          <w:szCs w:val="24"/>
+        </w:rPr>
         <w:t>I ruoli dei membri del gruppo sono stati così suddivisi:</w:t>
       </w:r>
     </w:p>
@@ -401,26 +455,84 @@
       <w:pPr>
         <w:spacing w:after="0"/>
         <w:jc w:val="both"/>
-      </w:pPr>
-      <w:r>
-        <w:t>Frontend: sviluppo interfaccia, mappa interattiva, passaggio tra pagine, menù.</w:t>
-      </w:r>
-    </w:p>
-    <w:p>
-      <w:pPr>
-        <w:spacing w:after="0"/>
-        <w:jc w:val="both"/>
-      </w:pPr>
-      <w:r>
-        <w:t>Backend+Database: gestione firebase, controlli utente e prenotazioni, salvataggio dati, sicurezza</w:t>
-      </w:r>
-    </w:p>
-    <w:p>
-      <w:pPr>
-        <w:spacing w:after="0"/>
-        <w:jc w:val="both"/>
-      </w:pPr>
-      <w:r>
+        <w:rPr>
+          <w:sz w:val="24"/>
+          <w:szCs w:val="24"/>
+        </w:rPr>
+      </w:pPr>
+      <w:proofErr w:type="spellStart"/>
+      <w:r>
+        <w:rPr>
+          <w:sz w:val="24"/>
+          <w:szCs w:val="24"/>
+        </w:rPr>
+        <w:t>Frontend</w:t>
+      </w:r>
+      <w:proofErr w:type="spellEnd"/>
+      <w:r>
+        <w:rPr>
+          <w:sz w:val="24"/>
+          <w:szCs w:val="24"/>
+        </w:rPr>
+        <w:t>: sviluppo interfaccia, mappa interattiva, passaggio tra pagine, menù.</w:t>
+      </w:r>
+    </w:p>
+    <w:p>
+      <w:pPr>
+        <w:spacing w:after="0"/>
+        <w:jc w:val="both"/>
+        <w:rPr>
+          <w:sz w:val="24"/>
+          <w:szCs w:val="24"/>
+        </w:rPr>
+      </w:pPr>
+      <w:proofErr w:type="spellStart"/>
+      <w:r>
+        <w:rPr>
+          <w:sz w:val="24"/>
+          <w:szCs w:val="24"/>
+        </w:rPr>
+        <w:t>Backend+Database</w:t>
+      </w:r>
+      <w:proofErr w:type="spellEnd"/>
+      <w:r>
+        <w:rPr>
+          <w:sz w:val="24"/>
+          <w:szCs w:val="24"/>
+        </w:rPr>
+        <w:t xml:space="preserve">: gestione </w:t>
+      </w:r>
+      <w:proofErr w:type="spellStart"/>
+      <w:r>
+        <w:rPr>
+          <w:sz w:val="24"/>
+          <w:szCs w:val="24"/>
+        </w:rPr>
+        <w:t>firebase</w:t>
+      </w:r>
+      <w:proofErr w:type="spellEnd"/>
+      <w:r>
+        <w:rPr>
+          <w:sz w:val="24"/>
+          <w:szCs w:val="24"/>
+        </w:rPr>
+        <w:t>, controlli utente e prenotazioni, salvataggio dati, sicurezza</w:t>
+      </w:r>
+    </w:p>
+    <w:p>
+      <w:pPr>
+        <w:spacing w:after="0"/>
+        <w:jc w:val="both"/>
+        <w:rPr>
+          <w:sz w:val="24"/>
+          <w:szCs w:val="24"/>
+        </w:rPr>
+      </w:pPr>
+      <w:r>
+        <w:rPr>
+          <w:sz w:val="24"/>
+          <w:szCs w:val="24"/>
+        </w:rPr>
         <w:t xml:space="preserve">Testing: </w:t>
       </w:r>
     </w:p>
@@ -428,8 +540,16 @@
       <w:pPr>
         <w:spacing w:after="0"/>
         <w:jc w:val="both"/>
-      </w:pPr>
-      <w:r>
+        <w:rPr>
+          <w:sz w:val="24"/>
+          <w:szCs w:val="24"/>
+        </w:rPr>
+      </w:pPr>
+      <w:r>
+        <w:rPr>
+          <w:sz w:val="24"/>
+          <w:szCs w:val="24"/>
+        </w:rPr>
         <w:t>Documentazione: project plan, diagrammi UML, informazioni generali.</w:t>
       </w:r>
     </w:p>
@@ -437,29 +557,85 @@
       <w:pPr>
         <w:spacing w:after="0"/>
         <w:jc w:val="both"/>
-      </w:pPr>
-    </w:p>
-    <w:p>
-      <w:pPr>
-        <w:spacing w:after="0"/>
-        <w:jc w:val="both"/>
-      </w:pPr>
-    </w:p>
-    <w:p>
-      <w:pPr>
-        <w:spacing w:after="0"/>
-        <w:jc w:val="both"/>
-      </w:pPr>
-      <w:r>
-        <w:t>Si possono dividere i ruoli in product owner, scrum master e team di implementazione (di cui fanno parte tutti)</w:t>
-      </w:r>
-    </w:p>
-    <w:p>
-      <w:pPr>
-        <w:spacing w:after="0"/>
-        <w:jc w:val="both"/>
-      </w:pPr>
-      <w:r>
+        <w:rPr>
+          <w:sz w:val="24"/>
+          <w:szCs w:val="24"/>
+        </w:rPr>
+      </w:pPr>
+    </w:p>
+    <w:p>
+      <w:pPr>
+        <w:spacing w:after="0"/>
+        <w:jc w:val="both"/>
+        <w:rPr>
+          <w:sz w:val="24"/>
+          <w:szCs w:val="24"/>
+        </w:rPr>
+      </w:pPr>
+    </w:p>
+    <w:p>
+      <w:pPr>
+        <w:spacing w:after="0"/>
+        <w:jc w:val="both"/>
+        <w:rPr>
+          <w:sz w:val="24"/>
+          <w:szCs w:val="24"/>
+        </w:rPr>
+      </w:pPr>
+      <w:r>
+        <w:rPr>
+          <w:sz w:val="24"/>
+          <w:szCs w:val="24"/>
+        </w:rPr>
+        <w:t xml:space="preserve">Si possono dividere i ruoli in product </w:t>
+      </w:r>
+      <w:proofErr w:type="spellStart"/>
+      <w:r>
+        <w:rPr>
+          <w:sz w:val="24"/>
+          <w:szCs w:val="24"/>
+        </w:rPr>
+        <w:t>owner</w:t>
+      </w:r>
+      <w:proofErr w:type="spellEnd"/>
+      <w:r>
+        <w:rPr>
+          <w:sz w:val="24"/>
+          <w:szCs w:val="24"/>
+        </w:rPr>
+        <w:t xml:space="preserve">, </w:t>
+      </w:r>
+      <w:proofErr w:type="spellStart"/>
+      <w:r>
+        <w:rPr>
+          <w:sz w:val="24"/>
+          <w:szCs w:val="24"/>
+        </w:rPr>
+        <w:t>scrum</w:t>
+      </w:r>
+      <w:proofErr w:type="spellEnd"/>
+      <w:r>
+        <w:rPr>
+          <w:sz w:val="24"/>
+          <w:szCs w:val="24"/>
+        </w:rPr>
+        <w:t xml:space="preserve"> master e team di implementazione (di cui fanno parte tutti)</w:t>
+      </w:r>
+    </w:p>
+    <w:p>
+      <w:pPr>
+        <w:spacing w:after="0"/>
+        <w:jc w:val="both"/>
+        <w:rPr>
+          <w:sz w:val="24"/>
+          <w:szCs w:val="24"/>
+        </w:rPr>
+      </w:pPr>
+      <w:r>
+        <w:rPr>
+          <w:sz w:val="24"/>
+          <w:szCs w:val="24"/>
+        </w:rPr>
         <w:t>//qui possiamo spiegare cosa fa ognuno e nella parte di implementazione mettiamo front end back end …</w:t>
       </w:r>
     </w:p>
@@ -467,26 +643,75 @@
       <w:pPr>
         <w:spacing w:after="0"/>
         <w:jc w:val="both"/>
-      </w:pPr>
-      <w:r>
-        <w:t xml:space="preserve">Product owner → Davide Mascheretti </w:t>
-      </w:r>
-    </w:p>
-    <w:p>
-      <w:pPr>
-        <w:spacing w:after="0"/>
-        <w:jc w:val="both"/>
-      </w:pPr>
-      <w:r>
-        <w:t>Scrum master → Tommaso Maistrello</w:t>
-      </w:r>
-    </w:p>
-    <w:p>
-      <w:pPr>
-        <w:spacing w:after="0"/>
-        <w:jc w:val="both"/>
-      </w:pPr>
-      <w:r>
+        <w:rPr>
+          <w:sz w:val="24"/>
+          <w:szCs w:val="24"/>
+        </w:rPr>
+      </w:pPr>
+      <w:r>
+        <w:rPr>
+          <w:sz w:val="24"/>
+          <w:szCs w:val="24"/>
+        </w:rPr>
+        <w:t xml:space="preserve">Product </w:t>
+      </w:r>
+      <w:proofErr w:type="spellStart"/>
+      <w:r>
+        <w:rPr>
+          <w:sz w:val="24"/>
+          <w:szCs w:val="24"/>
+        </w:rPr>
+        <w:t>owner</w:t>
+      </w:r>
+      <w:proofErr w:type="spellEnd"/>
+      <w:r>
+        <w:rPr>
+          <w:sz w:val="24"/>
+          <w:szCs w:val="24"/>
+        </w:rPr>
+        <w:t xml:space="preserve"> → Davide Mascheretti </w:t>
+      </w:r>
+    </w:p>
+    <w:p>
+      <w:pPr>
+        <w:spacing w:after="0"/>
+        <w:jc w:val="both"/>
+        <w:rPr>
+          <w:sz w:val="24"/>
+          <w:szCs w:val="24"/>
+        </w:rPr>
+      </w:pPr>
+      <w:proofErr w:type="spellStart"/>
+      <w:r>
+        <w:rPr>
+          <w:sz w:val="24"/>
+          <w:szCs w:val="24"/>
+        </w:rPr>
+        <w:t>Scrum</w:t>
+      </w:r>
+      <w:proofErr w:type="spellEnd"/>
+      <w:r>
+        <w:rPr>
+          <w:sz w:val="24"/>
+          <w:szCs w:val="24"/>
+        </w:rPr>
+        <w:t xml:space="preserve"> master → Tommaso Maistrello</w:t>
+      </w:r>
+    </w:p>
+    <w:p>
+      <w:pPr>
+        <w:spacing w:after="0"/>
+        <w:jc w:val="both"/>
+        <w:rPr>
+          <w:sz w:val="24"/>
+          <w:szCs w:val="24"/>
+        </w:rPr>
+      </w:pPr>
+      <w:r>
+        <w:rPr>
+          <w:sz w:val="24"/>
+          <w:szCs w:val="24"/>
+        </w:rPr>
         <w:t>Team di implementazione → Tommaso Maistrello, Davide Mascheretti, Claudio Morgera, Francesco Valenari.</w:t>
       </w:r>
     </w:p>
@@ -494,8 +719,16 @@
       <w:pPr>
         <w:spacing w:after="0"/>
         <w:jc w:val="both"/>
-      </w:pPr>
-      <w:r>
+        <w:rPr>
+          <w:sz w:val="24"/>
+          <w:szCs w:val="24"/>
+        </w:rPr>
+      </w:pPr>
+      <w:r>
+        <w:rPr>
+          <w:sz w:val="24"/>
+          <w:szCs w:val="24"/>
+        </w:rPr>
         <w:t>Nonostante ciò, nel caso di necessità un membro del gruppo può contribuire alla collaborazione con il membro affidato a quel ruolo. La conoscenza deve essere utilizzata in maniera trasversale.</w:t>
       </w:r>
     </w:p>
@@ -503,8 +736,16 @@
       <w:pPr>
         <w:spacing w:after="0"/>
         <w:jc w:val="both"/>
-      </w:pPr>
-      <w:r>
+        <w:rPr>
+          <w:sz w:val="24"/>
+          <w:szCs w:val="24"/>
+        </w:rPr>
+      </w:pPr>
+      <w:r>
+        <w:rPr>
+          <w:sz w:val="24"/>
+          <w:szCs w:val="24"/>
+        </w:rPr>
         <w:t>Ad esempio, se l’addetto al back end riscontra problemi con la gestione del database, al fine di velocizzare i procedimenti, può chiedere supporto aggiuntivo ad un altro membro del gruppo, il quale potrebbe avere le competenze adatte per risolvere il dato problema in minor tempo.</w:t>
       </w:r>
     </w:p>
@@ -512,8 +753,16 @@
       <w:pPr>
         <w:spacing w:after="0"/>
         <w:jc w:val="both"/>
-      </w:pPr>
-      <w:r>
+        <w:rPr>
+          <w:sz w:val="24"/>
+          <w:szCs w:val="24"/>
+        </w:rPr>
+      </w:pPr>
+      <w:r>
+        <w:rPr>
+          <w:sz w:val="24"/>
+          <w:szCs w:val="24"/>
+        </w:rPr>
         <w:t>La documentazione chiara e dettagliata è considerata responsabilità condivisa tra tutti i membri del gruppo, essa deve essere il compito di tutti.</w:t>
       </w:r>
     </w:p>
@@ -521,14 +770,26 @@
       <w:pPr>
         <w:spacing w:after="0"/>
         <w:jc w:val="both"/>
-      </w:pPr>
-    </w:p>
-    <w:p>
-      <w:pPr>
-        <w:spacing w:after="0"/>
-        <w:jc w:val="both"/>
-      </w:pPr>
-      <w:r>
+        <w:rPr>
+          <w:sz w:val="24"/>
+          <w:szCs w:val="24"/>
+        </w:rPr>
+      </w:pPr>
+    </w:p>
+    <w:p>
+      <w:pPr>
+        <w:spacing w:after="0"/>
+        <w:jc w:val="both"/>
+        <w:rPr>
+          <w:sz w:val="24"/>
+          <w:szCs w:val="24"/>
+        </w:rPr>
+      </w:pPr>
+      <w:r>
+        <w:rPr>
+          <w:sz w:val="24"/>
+          <w:szCs w:val="24"/>
+        </w:rPr>
         <w:t>Altre importanti caratteristiche di organizzazione sono riportate a seguire.</w:t>
       </w:r>
     </w:p>
@@ -536,8 +797,16 @@
       <w:pPr>
         <w:spacing w:after="0"/>
         <w:jc w:val="both"/>
-      </w:pPr>
-      <w:r>
+        <w:rPr>
+          <w:sz w:val="24"/>
+          <w:szCs w:val="24"/>
+        </w:rPr>
+      </w:pPr>
+      <w:r>
+        <w:rPr>
+          <w:sz w:val="24"/>
+          <w:szCs w:val="24"/>
+        </w:rPr>
         <w:t>Brevi meeting principalmente non online per risolvere problemi e per chiarimenti vari.</w:t>
       </w:r>
     </w:p>
@@ -545,8 +814,16 @@
       <w:pPr>
         <w:spacing w:after="0"/>
         <w:jc w:val="both"/>
-      </w:pPr>
-      <w:r>
+        <w:rPr>
+          <w:sz w:val="24"/>
+          <w:szCs w:val="24"/>
+        </w:rPr>
+      </w:pPr>
+      <w:r>
+        <w:rPr>
+          <w:sz w:val="24"/>
+          <w:szCs w:val="24"/>
+        </w:rPr>
         <w:t>La comunicazione quotidiana deve avvenire tramite un gruppo Whatsapp apposito, utilizzato per scambio di informazioni e domande inerenti al progetto o a problemi riscontrati.</w:t>
       </w:r>
     </w:p>
@@ -554,8 +831,16 @@
       <w:pPr>
         <w:spacing w:after="0"/>
         <w:jc w:val="both"/>
-      </w:pPr>
-      <w:r>
+        <w:rPr>
+          <w:sz w:val="24"/>
+          <w:szCs w:val="24"/>
+        </w:rPr>
+      </w:pPr>
+      <w:r>
+        <w:rPr>
+          <w:sz w:val="24"/>
+          <w:szCs w:val="24"/>
+        </w:rPr>
         <w:t>Decisioni, urgenze e task vengono gestiti dal gruppo stesso durante i meeting settimanali, in cui si decide anche se è necessario un cambio di ruoli.</w:t>
       </w:r>
     </w:p>
@@ -563,36 +848,85 @@
       <w:pPr>
         <w:spacing w:after="0"/>
         <w:jc w:val="both"/>
-      </w:pPr>
-      <w:r>
-        <w:t>Utilizzo di GitHub privato condiviso con i membri del gruppo per gestire issue e tenere in memoria le azioni di ogni persona. Utilizzo iniziale di Google Drive per la documentazione e per i riassunti dei meeting con data e descrizione, da caricare poi su GitHub.</w:t>
-      </w:r>
-    </w:p>
-    <w:p/>
-    <w:p/>
-    <w:p/>
-    <w:p/>
-    <w:p/>
-    <w:p/>
-    <w:p/>
-    <w:p/>
-    <w:p/>
-    <w:p/>
-    <w:p/>
-    <w:p>
-      <w:r>
+        <w:rPr>
+          <w:sz w:val="24"/>
+          <w:szCs w:val="24"/>
+        </w:rPr>
+      </w:pPr>
+      <w:r>
+        <w:rPr>
+          <w:sz w:val="24"/>
+          <w:szCs w:val="24"/>
+        </w:rPr>
+        <w:t xml:space="preserve">Utilizzo di GitHub privato condiviso con i membri del gruppo per gestire </w:t>
+      </w:r>
+      <w:proofErr w:type="spellStart"/>
+      <w:r>
+        <w:rPr>
+          <w:sz w:val="24"/>
+          <w:szCs w:val="24"/>
+        </w:rPr>
+        <w:t>issue</w:t>
+      </w:r>
+      <w:proofErr w:type="spellEnd"/>
+      <w:r>
+        <w:rPr>
+          <w:sz w:val="24"/>
+          <w:szCs w:val="24"/>
+        </w:rPr>
+        <w:t xml:space="preserve"> e tenere in memoria le azioni di ogni persona. Utilizzo iniziale di Google Drive per la documentazione e per i riassunti dei meeting con data e descrizione, da caricare poi su GitHub.</w:t>
+      </w:r>
+    </w:p>
+    <w:p/>
+    <w:p/>
+    <w:p/>
+    <w:p/>
+    <w:p/>
+    <w:p/>
+    <w:p/>
+    <w:p/>
+    <w:p>
+      <w:pPr>
+        <w:rPr>
+          <w:b/>
+          <w:bCs/>
+          <w:sz w:val="28"/>
+          <w:szCs w:val="28"/>
+        </w:rPr>
+      </w:pPr>
+      <w:r>
+        <w:rPr>
+          <w:b/>
+          <w:bCs/>
+          <w:sz w:val="28"/>
+          <w:szCs w:val="28"/>
+        </w:rPr>
         <w:lastRenderedPageBreak/>
         <w:t>STANDARD, LINEE GUIDE E PROCEDURE</w:t>
       </w:r>
     </w:p>
     <w:p>
-      <w:r>
-        <w:t>STANDARD LINEE GUIDA E PROCEDURE</w:t>
-      </w:r>
-    </w:p>
-    <w:p>
-      <w:r>
-        <w:t>Per gestire tutte le procedure e tutti i cambiamenti del nostro progetto si utilizza Github, gestore di configurazione online distribuito che permette ad ognuno di avere una propria local repo.</w:t>
+      <w:pPr>
+        <w:jc w:val="both"/>
+      </w:pPr>
+      <w:r>
+        <w:t xml:space="preserve">Per gestire tutte le procedure e tutti i cambiamenti del nostro progetto si utilizza </w:t>
+      </w:r>
+      <w:proofErr w:type="spellStart"/>
+      <w:r>
+        <w:t>Github</w:t>
+      </w:r>
+      <w:proofErr w:type="spellEnd"/>
+      <w:r>
+        <w:t xml:space="preserve">, gestore di configurazione online distribuito che permette ad ognuno di avere una propria </w:t>
+      </w:r>
+      <w:proofErr w:type="spellStart"/>
+      <w:r>
+        <w:t>local</w:t>
+      </w:r>
+      <w:proofErr w:type="spellEnd"/>
+      <w:r>
+        <w:t xml:space="preserve"> repo.</w:t>
       </w:r>
       <w:r>
         <w:t xml:space="preserve"> </w:t>
@@ -604,77 +938,247 @@
         <w:t xml:space="preserve"> </w:t>
       </w:r>
       <w:r>
-        <w:t>Riguardo la documentazione è necessaria chiarezza sia per le classi aggiunte, che devono essere esplicitamente e dettagliatamente spiegate, sia per tutti i commit che vengono fatti.</w:t>
-      </w:r>
-    </w:p>
-    <w:p>
-      <w:r>
-        <w:t>Nel titolo del commit ci deve essere in generale le modifiche principali apportate e cosa cambia di importante rispetto alla versione precedente. Nella descrizione è possibile aggiungere tutte le informazioni necessarie che descrivono i cambiamenti passo per passo, le scelte effettuate, le motivazioni se necessarie e tutto ciò che permette di comprendere al meglio da una persona esterna cosa è cambiato in seguito alle modifiche effettuate.</w:t>
-      </w:r>
-    </w:p>
-    <w:p>
-      <w:r>
-        <w:t>La documentazione è da consegnare necessariamente in seguito al cambiamento del macro argomento su cui stiamo lavorando. Non è necessario fare commenti se i cambiamenti sono ininfluenti sul funzionamento generale dell’applicazione, piuttosto meglio attendere e fare push una volta aggiunto qualcosa di realmente significativo.</w:t>
-      </w:r>
-    </w:p>
-    <w:p>
-      <w:r>
-        <w:t>Nel caso di modifiche con bug presenti (leggeri non che annullano il funzionamento generale)  è consigliato comunque fare commit, magari aggiungendo la descrizione dell’errore. In questo modo ognuno è aggiornato alla versione corretta ed è possibile risolvere il bug o in parallelo allo sviluppo, oppure alla fine del progetto.</w:t>
-      </w:r>
-    </w:p>
-    <w:p>
+        <w:t xml:space="preserve">Riguardo la documentazione è necessaria chiarezza sia per le classi aggiunte, che devono essere esplicitamente e dettagliatamente spiegate, sia per tutti i </w:t>
+      </w:r>
+      <w:proofErr w:type="spellStart"/>
+      <w:r>
+        <w:t>commit</w:t>
+      </w:r>
+      <w:proofErr w:type="spellEnd"/>
+      <w:r>
+        <w:t xml:space="preserve"> che vengono fatti.</w:t>
+      </w:r>
+    </w:p>
+    <w:p>
+      <w:pPr>
+        <w:jc w:val="both"/>
+      </w:pPr>
+      <w:r>
+        <w:t xml:space="preserve">Nel titolo del </w:t>
+      </w:r>
+      <w:proofErr w:type="spellStart"/>
+      <w:r>
+        <w:t>commit</w:t>
+      </w:r>
+      <w:proofErr w:type="spellEnd"/>
+      <w:r>
+        <w:t xml:space="preserve"> ci deve essere in generale le modifiche principali apportate e cosa cambia di importante rispetto alla versione precedente. Nella descrizione è possibile aggiungere tutte le informazioni necessarie che descrivono i cambiamenti passo per passo, le scelte effettuate, le motivazioni se necessarie e tutto ciò che permette di comprendere al meglio da una persona esterna cosa è cambiato in seguito alle modifiche effettuate.</w:t>
+      </w:r>
+    </w:p>
+    <w:p>
+      <w:pPr>
+        <w:jc w:val="both"/>
+      </w:pPr>
+      <w:r>
+        <w:t xml:space="preserve">La documentazione è da consegnare necessariamente in seguito al cambiamento del macro argomento su cui stiamo lavorando. Non è necessario fare commenti se i cambiamenti sono ininfluenti sul funzionamento generale dell’applicazione, piuttosto meglio attendere e fare </w:t>
+      </w:r>
+      <w:proofErr w:type="spellStart"/>
+      <w:r>
+        <w:t>push</w:t>
+      </w:r>
+      <w:proofErr w:type="spellEnd"/>
+      <w:r>
+        <w:t xml:space="preserve"> una volta aggiunto qualcosa di realmente significativo.</w:t>
+      </w:r>
+    </w:p>
+    <w:p>
+      <w:pPr>
+        <w:jc w:val="both"/>
+      </w:pPr>
+      <w:r>
+        <w:t xml:space="preserve">Nel caso di modifiche con bug presenti (leggeri non che annullano il funzionamento generale)  è consigliato comunque fare </w:t>
+      </w:r>
+      <w:proofErr w:type="spellStart"/>
+      <w:r>
+        <w:t>commit</w:t>
+      </w:r>
+      <w:proofErr w:type="spellEnd"/>
+      <w:r>
+        <w:t>, magari aggiungendo la descrizione dell’errore. In questo modo ognuno è aggiornato alla versione corretta ed è possibile risolvere il bug o in parallelo allo sviluppo, oppure alla fine del progetto.</w:t>
+      </w:r>
+    </w:p>
+    <w:p>
+      <w:pPr>
+        <w:jc w:val="both"/>
+      </w:pPr>
       <w:r>
         <w:t>Ci si aspetta che ognuno rispetti le linee guida in maniera autonoma, nessun membro del gruppo verifica che gli altri membri rispettino le linee guida.</w:t>
       </w:r>
     </w:p>
     <w:p>
+      <w:pPr>
+        <w:jc w:val="both"/>
+      </w:pPr>
       <w:r>
         <w:t>Analizziamo ora le scelte tecniche che caratterizzano il nostro progetto.</w:t>
       </w:r>
     </w:p>
     <w:p>
+      <w:pPr>
+        <w:jc w:val="both"/>
+      </w:pPr>
       <w:r>
         <w:t>In relazione al database utilizzato abbiamo deciso di utilizzare regole standard da configurazione, database privato, in modo che solo i membri interni al gruppo possano visualizzare e modificare. Non è gestita parte di password criptate.</w:t>
       </w:r>
     </w:p>
     <w:p>
-      <w:r>
-        <w:t>Potrebbe essere inoltre utile l'utilizzo di una kanban board per avere una visione oggettiva e in tempo reale dei progressi dell’applicazione.</w:t>
-      </w:r>
-    </w:p>
-    <w:p>
-      <w:r>
-        <w:t>Per la parte database abbiamo utilizzato firebase - real time database, basato su linguaggio NOSQL. Tramite questo gestiamo tutta la parte di salvataggio, autenticazione, controlli.</w:t>
-      </w:r>
-    </w:p>
-    <w:p>
-      <w:r>
-        <w:t>Abbiamo tre nodi: uno che rappresenta gli utenti, uno che rappresenta le prenotazioni e uno che rappresenta le prenotazioni per utente. In questo modo è più semplice fare tutte le operazioni di ricerca e confronto che avverranno nel backend della nostra applicazione.</w:t>
-      </w:r>
-    </w:p>
-    <w:p>
-      <w:r>
-        <w:t>La gestione dei sottonodi verrà decisa in base a come è più comodo, in particolare per il nodo prenotazione (si pensa ad una gestione del tipo prenotazione → date → ora→ info ma non è confermato).</w:t>
-      </w:r>
-    </w:p>
-    <w:p>
-      <w:r>
-        <w:t>Per la parte grafica utilizziamo Vaadin. Oltre a gestire la parte grafica già integrata, dovrebbe rendere più semplice il collegamento con la parte back end dell’applicazione.</w:t>
-      </w:r>
-    </w:p>
-    <w:p>
-      <w:r>
-        <w:t>Per la gestione stili e colore di caratteri e in generale della parte web visiva abbiamo integrato Vaadin (che è limitato sotto tale punto di vista) con delle aggiunte css e javascript.</w:t>
-      </w:r>
-    </w:p>
-    <w:p>
+      <w:pPr>
+        <w:jc w:val="both"/>
+      </w:pPr>
+      <w:r>
+        <w:t xml:space="preserve">Potrebbe essere inoltre utile l'utilizzo di una </w:t>
+      </w:r>
+      <w:proofErr w:type="spellStart"/>
+      <w:r>
+        <w:t>kanban</w:t>
+      </w:r>
+      <w:proofErr w:type="spellEnd"/>
+      <w:r>
+        <w:t xml:space="preserve"> board per avere una visione oggettiva e in tempo reale dei progressi dell’applicazione.</w:t>
+      </w:r>
+    </w:p>
+    <w:p>
+      <w:pPr>
+        <w:jc w:val="both"/>
+      </w:pPr>
+      <w:r>
+        <w:t xml:space="preserve">Per la parte database abbiamo utilizzato </w:t>
+      </w:r>
+      <w:proofErr w:type="spellStart"/>
+      <w:r>
+        <w:t>firebase</w:t>
+      </w:r>
+      <w:proofErr w:type="spellEnd"/>
+      <w:r>
+        <w:t xml:space="preserve"> - </w:t>
+      </w:r>
+      <w:proofErr w:type="spellStart"/>
+      <w:r>
+        <w:t>real</w:t>
+      </w:r>
+      <w:proofErr w:type="spellEnd"/>
+      <w:r>
+        <w:t xml:space="preserve"> time database, basato su linguaggio NOSQL. Tramite questo gestiamo tutta la parte di salvataggio, autenticazione, controlli.</w:t>
+      </w:r>
+    </w:p>
+    <w:p>
+      <w:pPr>
+        <w:jc w:val="both"/>
+      </w:pPr>
+      <w:r>
+        <w:t xml:space="preserve">Abbiamo tre nodi: uno che rappresenta gli utenti, uno che rappresenta le prenotazioni e uno che rappresenta le prenotazioni per utente. In questo modo è più semplice fare tutte le operazioni di ricerca e confronto che avverranno nel </w:t>
+      </w:r>
+      <w:proofErr w:type="spellStart"/>
+      <w:r>
+        <w:t>backend</w:t>
+      </w:r>
+      <w:proofErr w:type="spellEnd"/>
+      <w:r>
+        <w:t xml:space="preserve"> della nostra applicazione.</w:t>
+      </w:r>
+    </w:p>
+    <w:p>
+      <w:pPr>
+        <w:jc w:val="both"/>
+      </w:pPr>
+      <w:r>
+        <w:t xml:space="preserve">La gestione dei </w:t>
+      </w:r>
+      <w:proofErr w:type="spellStart"/>
+      <w:r>
+        <w:t>sottonodi</w:t>
+      </w:r>
+      <w:proofErr w:type="spellEnd"/>
+      <w:r>
+        <w:t xml:space="preserve"> verrà decisa in base a come è più comodo, in particolare per il nodo prenotazione (si pensa ad una gestione del tipo prenotazione → date → ora→ info ma non è confermato).</w:t>
+      </w:r>
+    </w:p>
+    <w:p>
+      <w:pPr>
+        <w:jc w:val="both"/>
+      </w:pPr>
+      <w:r>
+        <w:t xml:space="preserve">Per la parte grafica utilizziamo </w:t>
+      </w:r>
+      <w:proofErr w:type="spellStart"/>
+      <w:r>
+        <w:t>Vaadin</w:t>
+      </w:r>
+      <w:proofErr w:type="spellEnd"/>
+      <w:r>
+        <w:t>. Oltre a gestire la parte grafica già integrata, dovrebbe rendere più semplice il collegamento con la parte back end dell’applicazione.</w:t>
+      </w:r>
+    </w:p>
+    <w:p>
+      <w:pPr>
+        <w:jc w:val="both"/>
+      </w:pPr>
+      <w:r>
+        <w:t xml:space="preserve">Per la gestione stili e colore di caratteri e in generale della parte web visiva abbiamo integrato </w:t>
+      </w:r>
+      <w:proofErr w:type="spellStart"/>
+      <w:r>
+        <w:t>Vaadin</w:t>
+      </w:r>
+      <w:proofErr w:type="spellEnd"/>
+      <w:r>
+        <w:t xml:space="preserve"> (che è limitato sotto tale punto di vista) con delle aggiunte </w:t>
+      </w:r>
+      <w:proofErr w:type="spellStart"/>
+      <w:r>
+        <w:t>css</w:t>
+      </w:r>
+      <w:proofErr w:type="spellEnd"/>
+      <w:r>
+        <w:t xml:space="preserve"> e </w:t>
+      </w:r>
+      <w:proofErr w:type="spellStart"/>
+      <w:r>
+        <w:t>javascript</w:t>
+      </w:r>
+      <w:proofErr w:type="spellEnd"/>
+      <w:r>
+        <w:t>.</w:t>
+      </w:r>
+    </w:p>
+    <w:p>
+      <w:pPr>
+        <w:jc w:val="both"/>
+      </w:pPr>
+      <w:r>
+        <w:t xml:space="preserve">Infine per la mappa abbiamo optato per </w:t>
+      </w:r>
+      <w:proofErr w:type="spellStart"/>
+      <w:r>
+        <w:t>Leaflet</w:t>
+      </w:r>
+      <w:proofErr w:type="spellEnd"/>
+      <w:r>
+        <w:t xml:space="preserve">, un software open source che ci permette di usare mappe interattive senza troppi problemi (inizialmente avevamo pensato a </w:t>
+      </w:r>
+      <w:proofErr w:type="spellStart"/>
+      <w:r>
+        <w:t>google</w:t>
+      </w:r>
+      <w:proofErr w:type="spellEnd"/>
+      <w:r>
+        <w:t xml:space="preserve"> API </w:t>
+      </w:r>
+      <w:proofErr w:type="spellStart"/>
+      <w:r>
+        <w:t>maps</w:t>
+      </w:r>
+      <w:proofErr w:type="spellEnd"/>
+      <w:r>
+        <w:t xml:space="preserve"> ma la procedura di ottenimento della chiave era molto più complessa).</w:t>
+      </w:r>
+    </w:p>
+    <w:p>
+      <w:pPr>
+        <w:jc w:val="both"/>
+      </w:pPr>
       <w:r>
         <w:lastRenderedPageBreak/>
-        <w:t>Infine per la mappa abbiamo optato per Leaflet, un software open source che ci permette di usare mappe interattive senza troppi problemi (inizialmente avevamo pensato a google API maps ma la procedura di ottenimento della chiave era molto più complessa).</w:t>
-      </w:r>
-    </w:p>
-    <w:p>
-      <w:r>
         <w:t>Queste aggiunte rendono la nostra applicazione più professionale e, in un futuro, realmente utilizzabile.</w:t>
       </w:r>
     </w:p>
@@ -710,8 +1214,25 @@
     <w:p/>
     <w:p/>
     <w:p/>
-    <w:p>
-      <w:r>
+    <w:p/>
+    <w:p/>
+    <w:p/>
+    <w:p>
+      <w:pPr>
+        <w:rPr>
+          <w:b/>
+          <w:bCs/>
+          <w:sz w:val="28"/>
+          <w:szCs w:val="28"/>
+        </w:rPr>
+      </w:pPr>
+      <w:r>
+        <w:rPr>
+          <w:b/>
+          <w:bCs/>
+          <w:sz w:val="28"/>
+          <w:szCs w:val="28"/>
+        </w:rPr>
         <w:lastRenderedPageBreak/>
         <w:t>ATTIVITÀ DI GESTIONE</w:t>
       </w:r>
@@ -746,35 +1267,309 @@
     <w:p/>
     <w:p/>
     <w:p/>
-    <w:p/>
-    <w:p>
-      <w:r>
+    <w:p>
+      <w:pPr>
+        <w:rPr>
+          <w:b/>
+          <w:bCs/>
+          <w:sz w:val="28"/>
+          <w:szCs w:val="28"/>
+        </w:rPr>
+      </w:pPr>
+      <w:r>
+        <w:rPr>
+          <w:b/>
+          <w:bCs/>
+          <w:sz w:val="28"/>
+          <w:szCs w:val="28"/>
+        </w:rPr>
         <w:lastRenderedPageBreak/>
         <w:t>POTENZIALI RISCHI</w:t>
       </w:r>
     </w:p>
-    <w:p/>
-    <w:p/>
-    <w:p/>
-    <w:p/>
-    <w:p/>
-    <w:p/>
-    <w:p/>
-    <w:p/>
-    <w:p/>
-    <w:p/>
-    <w:p/>
-    <w:p/>
-    <w:p/>
-    <w:p/>
-    <w:p/>
-    <w:p/>
-    <w:p/>
-    <w:p/>
-    <w:p/>
-    <w:p/>
-    <w:p/>
-    <w:p/>
+    <w:p>
+      <w:pPr>
+        <w:spacing w:after="0"/>
+        <w:jc w:val="both"/>
+        <w:rPr>
+          <w:u w:val="single"/>
+        </w:rPr>
+      </w:pPr>
+      <w:r>
+        <w:rPr>
+          <w:u w:val="single"/>
+        </w:rPr>
+        <w:t>Rischi organizzativi e gestionali.</w:t>
+      </w:r>
+    </w:p>
+    <w:p>
+      <w:pPr>
+        <w:spacing w:after="0"/>
+        <w:jc w:val="both"/>
+      </w:pPr>
+      <w:r>
+        <w:t xml:space="preserve">I principali problemi potrebbero riguardare principalmente ritardi nella stesura nei diversi diagrammi e nella consegna tendenzialmente giornaliera degli aggiornamenti e delle modifiche. </w:t>
+      </w:r>
+    </w:p>
+    <w:p>
+      <w:pPr>
+        <w:spacing w:after="0"/>
+        <w:jc w:val="both"/>
+      </w:pPr>
+      <w:r>
+        <w:t xml:space="preserve">Potrebbe succedere che per alcuni periodi (di esami) sia più complicato lavorare al progetto, rallentando la sua evoluzione e diminuendo la produttività e il numero di </w:t>
+      </w:r>
+      <w:proofErr w:type="spellStart"/>
+      <w:r>
+        <w:t>commit</w:t>
+      </w:r>
+      <w:proofErr w:type="spellEnd"/>
+      <w:r>
+        <w:t xml:space="preserve"> effettuati.</w:t>
+      </w:r>
+    </w:p>
+    <w:p>
+      <w:pPr>
+        <w:spacing w:after="0"/>
+        <w:jc w:val="both"/>
+      </w:pPr>
+      <w:r>
+        <w:t xml:space="preserve">Da non sottovalutare sono i </w:t>
+      </w:r>
+      <w:r>
+        <w:rPr>
+          <w:u w:val="single"/>
+        </w:rPr>
+        <w:t>rischi tecnici</w:t>
+      </w:r>
+      <w:r>
+        <w:t xml:space="preserve"> legato alle scelte intraprese per il progetto.</w:t>
+      </w:r>
+    </w:p>
+    <w:p>
+      <w:pPr>
+        <w:spacing w:after="0"/>
+        <w:jc w:val="both"/>
+      </w:pPr>
+      <w:r>
+        <w:t xml:space="preserve">Altri problemi potrebbero ad esempio riguardare il database. </w:t>
+      </w:r>
+    </w:p>
+    <w:p>
+      <w:pPr>
+        <w:spacing w:after="0"/>
+        <w:jc w:val="both"/>
+      </w:pPr>
+      <w:r>
+        <w:t xml:space="preserve">Utilizzando </w:t>
+      </w:r>
+      <w:proofErr w:type="spellStart"/>
+      <w:r>
+        <w:t>firebase</w:t>
+      </w:r>
+      <w:proofErr w:type="spellEnd"/>
+      <w:r>
+        <w:t xml:space="preserve"> database (nessun membro del gruppo lo aveva mai utilizzato in precedenza) potrebbero sorgere problematiche di gestione dei dati, creazione database, interrogazioni </w:t>
+      </w:r>
+      <w:proofErr w:type="spellStart"/>
+      <w:r>
+        <w:t>ecc</w:t>
+      </w:r>
+      <w:proofErr w:type="spellEnd"/>
+      <w:r>
+        <w:t xml:space="preserve"> ecc.</w:t>
+      </w:r>
+      <w:r>
+        <w:t xml:space="preserve"> </w:t>
+      </w:r>
+    </w:p>
+    <w:p>
+      <w:pPr>
+        <w:spacing w:after="0"/>
+        <w:jc w:val="both"/>
+      </w:pPr>
+      <w:r>
+        <w:t>Importante è anche capire come gestire la chiave privata del service account e tutti i rischi di sicurezza ad essa legata.</w:t>
+      </w:r>
+    </w:p>
+    <w:p>
+      <w:pPr>
+        <w:spacing w:after="0"/>
+        <w:jc w:val="both"/>
+      </w:pPr>
+      <w:r>
+        <w:t xml:space="preserve">Questi fanno parte dei rischi denominato </w:t>
+      </w:r>
+      <w:r>
+        <w:rPr>
+          <w:u w:val="single"/>
+        </w:rPr>
+        <w:t>rischi di sicurezza</w:t>
+      </w:r>
+      <w:r>
+        <w:t>.</w:t>
+      </w:r>
+    </w:p>
+    <w:p>
+      <w:pPr>
+        <w:spacing w:after="0"/>
+        <w:jc w:val="both"/>
+      </w:pPr>
+      <w:r>
+        <w:t xml:space="preserve">Infatti </w:t>
+      </w:r>
+      <w:r>
+        <w:t>è altamente sconsigliato inserire</w:t>
+      </w:r>
+      <w:r>
+        <w:t xml:space="preserve"> la chiave direttamente sulla repository</w:t>
+      </w:r>
+      <w:r>
+        <w:t xml:space="preserve"> online GitHub (se privata è possibile, ma non una buona norma).</w:t>
+      </w:r>
+    </w:p>
+    <w:p>
+      <w:pPr>
+        <w:spacing w:after="0"/>
+        <w:jc w:val="both"/>
+      </w:pPr>
+      <w:r>
+        <w:t xml:space="preserve">Utilizzando inoltre </w:t>
+      </w:r>
+      <w:proofErr w:type="spellStart"/>
+      <w:r>
+        <w:t>noSQL</w:t>
+      </w:r>
+      <w:proofErr w:type="spellEnd"/>
+      <w:r>
+        <w:t xml:space="preserve"> i problemi potrebbero essere maggiori e più complicati da risolvere nel tempo.</w:t>
+      </w:r>
+    </w:p>
+    <w:p>
+      <w:pPr>
+        <w:spacing w:after="0"/>
+        <w:jc w:val="both"/>
+      </w:pPr>
+      <w:r>
+        <w:t>E’ ancora più necessario in questa parte il contributo di tutto il gruppo.</w:t>
+      </w:r>
+    </w:p>
+    <w:p>
+      <w:pPr>
+        <w:spacing w:after="0"/>
+        <w:jc w:val="both"/>
+      </w:pPr>
+      <w:r>
+        <w:t xml:space="preserve">Nello stesso modo vale per </w:t>
+      </w:r>
+      <w:proofErr w:type="spellStart"/>
+      <w:r>
+        <w:t>Vaadin</w:t>
+      </w:r>
+      <w:proofErr w:type="spellEnd"/>
+      <w:r>
+        <w:t>.</w:t>
+      </w:r>
+    </w:p>
+    <w:p>
+      <w:pPr>
+        <w:spacing w:after="0"/>
+        <w:jc w:val="both"/>
+      </w:pPr>
+      <w:r>
+        <w:t>È necessaria una fase inziale di comprensione su come utilizzarlo, cosa permette di fare e se è effettivamente utile e necessario al nostro progetto.</w:t>
+      </w:r>
+    </w:p>
+    <w:p>
+      <w:pPr>
+        <w:spacing w:after="0"/>
+        <w:jc w:val="both"/>
+      </w:pPr>
+      <w:r>
+        <w:t>In generale, p</w:t>
+      </w:r>
+      <w:r>
+        <w:t>er avere maggiore realismo e serietà dell’app ci sono innumerevoli rischi e problemi a cui andremo incontro, vista l’assente conoscenza nell’ambito di tutti i membri del gruppo.</w:t>
+      </w:r>
+    </w:p>
+    <w:p>
+      <w:pPr>
+        <w:spacing w:after="0"/>
+        <w:jc w:val="both"/>
+      </w:pPr>
+      <w:r>
+        <w:t>Sono sempre poi possibili complessi bug che fanno parte di ogni progetto ed è necessario risolverli prima della consegna dell’elaborato.</w:t>
+      </w:r>
+    </w:p>
+    <w:p>
+      <w:pPr>
+        <w:spacing w:after="0"/>
+        <w:jc w:val="both"/>
+      </w:pPr>
+      <w:r>
+        <w:t>Riferendosi invece alla funzionalità dell’app i problemi riguardano principalmente la concorrenza e il fatto che più utenti possono accedere al database in maniera simultanea.</w:t>
+      </w:r>
+      <w:r>
+        <w:t xml:space="preserve"> Possono essere quindi diversi i </w:t>
+      </w:r>
+      <w:r>
+        <w:rPr>
+          <w:u w:val="single"/>
+        </w:rPr>
+        <w:t>rischi legati alle funzionalità dell’app</w:t>
+      </w:r>
+      <w:r>
+        <w:t>.</w:t>
+      </w:r>
+    </w:p>
+    <w:p>
+      <w:pPr>
+        <w:spacing w:after="0"/>
+        <w:jc w:val="both"/>
+      </w:pPr>
+      <w:r>
+        <w:t>Occorre implementare meccanismi di controllo che garantiscano che due utenti non possano prenotare due colonnine nella stessa fascia oraria.</w:t>
+      </w:r>
+    </w:p>
+    <w:p>
+      <w:pPr>
+        <w:spacing w:after="0"/>
+        <w:jc w:val="both"/>
+      </w:pPr>
+      <w:r>
+        <w:t>Questo è fondamentale che venga rispettato.</w:t>
+      </w:r>
+    </w:p>
+    <w:p>
+      <w:pPr>
+        <w:spacing w:after="0"/>
+        <w:jc w:val="both"/>
+      </w:pPr>
+      <w:r>
+        <w:t xml:space="preserve">Sono sempre poi presenti potenziali rischi riguardo </w:t>
+      </w:r>
+      <w:r>
+        <w:t>numerosi</w:t>
+      </w:r>
+      <w:r>
+        <w:t xml:space="preserve"> aspetti dell’applicazione ma questi li andremo a gestire passo dopo passo, risolvendo o prendendo altre strade per evitarli.</w:t>
+      </w:r>
+    </w:p>
+    <w:p>
+      <w:pPr>
+        <w:spacing w:after="0"/>
+        <w:jc w:val="both"/>
+      </w:pPr>
+    </w:p>
+    <w:p>
+      <w:pPr>
+        <w:spacing w:after="0"/>
+        <w:jc w:val="both"/>
+      </w:pPr>
+      <w:r>
+        <w:t>Potremmo dividere meglio tra le tipologie di rischio</w:t>
+      </w:r>
+    </w:p>
     <w:p/>
     <w:p/>
     <w:p/>
@@ -1663,6 +2458,7 @@
   <w:style w:type="character" w:default="1" w:styleId="Carpredefinitoparagrafo">
     <w:name w:val="Default Paragraph Font"/>
     <w:uiPriority w:val="1"/>
+    <w:semiHidden/>
     <w:unhideWhenUsed/>
   </w:style>
   <w:style w:type="table" w:default="1" w:styleId="Tabellanormale">

</xml_diff>

<commit_message>
Test caricamento project plan md
</commit_message>
<xml_diff>
--- a/documentazione/project plan.docx
+++ b/documentazione/project plan.docx
@@ -86,23 +86,7 @@
           <w:sz w:val="24"/>
           <w:szCs w:val="24"/>
         </w:rPr>
-        <w:t xml:space="preserve">Dopo una prima fase di registrazione (se </w:t>
-      </w:r>
-      <w:proofErr w:type="spellStart"/>
-      <w:r>
-        <w:rPr>
-          <w:sz w:val="24"/>
-          <w:szCs w:val="24"/>
-        </w:rPr>
-        <w:t>necessaria</w:t>
-      </w:r>
-      <w:proofErr w:type="spellEnd"/>
-      <w:r>
-        <w:rPr>
-          <w:sz w:val="24"/>
-          <w:szCs w:val="24"/>
-        </w:rPr>
-        <w:t>) e login, si apre direttamente la mappa stessa con marker che identificano le colonnine presenti nella zona scelta.</w:t>
+        <w:t>Dopo una prima fase di registrazione (se necessaria) e login, si apre direttamente la mappa stessa con marker che identificano le colonnine presenti nella zona scelta.</w:t>
       </w:r>
     </w:p>
     <w:p>
@@ -306,23 +290,7 @@
           <w:sz w:val="24"/>
           <w:szCs w:val="24"/>
         </w:rPr>
-        <w:t xml:space="preserve">L’approccio si ispira in particolare al modello </w:t>
-      </w:r>
-      <w:proofErr w:type="spellStart"/>
-      <w:r>
-        <w:rPr>
-          <w:sz w:val="24"/>
-          <w:szCs w:val="24"/>
-        </w:rPr>
-        <w:t>scrum</w:t>
-      </w:r>
-      <w:proofErr w:type="spellEnd"/>
-      <w:r>
-        <w:rPr>
-          <w:sz w:val="24"/>
-          <w:szCs w:val="24"/>
-        </w:rPr>
-        <w:t xml:space="preserve"> SCRUM e sui suoi cicli iterativi così composti.</w:t>
+        <w:t>L’approccio si ispira in particolare al modello SCRUM e sui suoi cicli iterativi così composti.</w:t>
       </w:r>
     </w:p>
     <w:p>
@@ -460,63 +428,29 @@
           <w:szCs w:val="24"/>
         </w:rPr>
       </w:pPr>
-      <w:proofErr w:type="spellStart"/>
-      <w:r>
-        <w:rPr>
-          <w:sz w:val="24"/>
-          <w:szCs w:val="24"/>
-        </w:rPr>
-        <w:t>Frontend</w:t>
-      </w:r>
-      <w:proofErr w:type="spellEnd"/>
-      <w:r>
-        <w:rPr>
-          <w:sz w:val="24"/>
-          <w:szCs w:val="24"/>
-        </w:rPr>
-        <w:t>: sviluppo interfaccia, mappa interattiva, passaggio tra pagine, menù.</w:t>
-      </w:r>
-    </w:p>
-    <w:p>
-      <w:pPr>
-        <w:spacing w:after="0"/>
-        <w:jc w:val="both"/>
-        <w:rPr>
-          <w:sz w:val="24"/>
-          <w:szCs w:val="24"/>
-        </w:rPr>
-      </w:pPr>
-      <w:proofErr w:type="spellStart"/>
-      <w:r>
-        <w:rPr>
-          <w:sz w:val="24"/>
-          <w:szCs w:val="24"/>
-        </w:rPr>
-        <w:t>Backend+Database</w:t>
-      </w:r>
-      <w:proofErr w:type="spellEnd"/>
-      <w:r>
-        <w:rPr>
-          <w:sz w:val="24"/>
-          <w:szCs w:val="24"/>
-        </w:rPr>
-        <w:t xml:space="preserve">: gestione </w:t>
-      </w:r>
-      <w:proofErr w:type="spellStart"/>
-      <w:r>
-        <w:rPr>
-          <w:sz w:val="24"/>
-          <w:szCs w:val="24"/>
-        </w:rPr>
-        <w:t>firebase</w:t>
-      </w:r>
-      <w:proofErr w:type="spellEnd"/>
-      <w:r>
-        <w:rPr>
-          <w:sz w:val="24"/>
-          <w:szCs w:val="24"/>
-        </w:rPr>
-        <w:t>, controlli utente e prenotazioni, salvataggio dati, sicurezza</w:t>
+      <w:r>
+        <w:rPr>
+          <w:sz w:val="24"/>
+          <w:szCs w:val="24"/>
+        </w:rPr>
+        <w:t>Frontend: sviluppo interfaccia, mappa interattiva, passaggio tra pagine, menù.</w:t>
+      </w:r>
+    </w:p>
+    <w:p>
+      <w:pPr>
+        <w:spacing w:after="0"/>
+        <w:jc w:val="both"/>
+        <w:rPr>
+          <w:sz w:val="24"/>
+          <w:szCs w:val="24"/>
+        </w:rPr>
+      </w:pPr>
+      <w:r>
+        <w:rPr>
+          <w:sz w:val="24"/>
+          <w:szCs w:val="24"/>
+        </w:rPr>
+        <w:t>Backend+Database: gestione firebase, controlli utente e prenotazioni, salvataggio dati, sicurezza</w:t>
       </w:r>
     </w:p>
     <w:p>
@@ -587,39 +521,7 @@
           <w:sz w:val="24"/>
           <w:szCs w:val="24"/>
         </w:rPr>
-        <w:t xml:space="preserve">Si possono dividere i ruoli in product </w:t>
-      </w:r>
-      <w:proofErr w:type="spellStart"/>
-      <w:r>
-        <w:rPr>
-          <w:sz w:val="24"/>
-          <w:szCs w:val="24"/>
-        </w:rPr>
-        <w:t>owner</w:t>
-      </w:r>
-      <w:proofErr w:type="spellEnd"/>
-      <w:r>
-        <w:rPr>
-          <w:sz w:val="24"/>
-          <w:szCs w:val="24"/>
-        </w:rPr>
-        <w:t xml:space="preserve">, </w:t>
-      </w:r>
-      <w:proofErr w:type="spellStart"/>
-      <w:r>
-        <w:rPr>
-          <w:sz w:val="24"/>
-          <w:szCs w:val="24"/>
-        </w:rPr>
-        <w:t>scrum</w:t>
-      </w:r>
-      <w:proofErr w:type="spellEnd"/>
-      <w:r>
-        <w:rPr>
-          <w:sz w:val="24"/>
-          <w:szCs w:val="24"/>
-        </w:rPr>
-        <w:t xml:space="preserve"> master e team di implementazione (di cui fanno parte tutti)</w:t>
+        <w:t>Si possono dividere i ruoli in product owner, scrum master e team di implementazione (di cui fanno parte tutti)</w:t>
       </w:r>
     </w:p>
     <w:p>
@@ -653,49 +555,24 @@
           <w:sz w:val="24"/>
           <w:szCs w:val="24"/>
         </w:rPr>
-        <w:t xml:space="preserve">Product </w:t>
-      </w:r>
-      <w:proofErr w:type="spellStart"/>
-      <w:r>
-        <w:rPr>
-          <w:sz w:val="24"/>
-          <w:szCs w:val="24"/>
-        </w:rPr>
-        <w:t>owner</w:t>
-      </w:r>
-      <w:proofErr w:type="spellEnd"/>
-      <w:r>
-        <w:rPr>
-          <w:sz w:val="24"/>
-          <w:szCs w:val="24"/>
-        </w:rPr>
-        <w:t xml:space="preserve"> → Davide Mascheretti </w:t>
-      </w:r>
-    </w:p>
-    <w:p>
-      <w:pPr>
-        <w:spacing w:after="0"/>
-        <w:jc w:val="both"/>
-        <w:rPr>
-          <w:sz w:val="24"/>
-          <w:szCs w:val="24"/>
-        </w:rPr>
-      </w:pPr>
-      <w:proofErr w:type="spellStart"/>
-      <w:r>
-        <w:rPr>
-          <w:sz w:val="24"/>
-          <w:szCs w:val="24"/>
-        </w:rPr>
-        <w:t>Scrum</w:t>
-      </w:r>
-      <w:proofErr w:type="spellEnd"/>
-      <w:r>
-        <w:rPr>
-          <w:sz w:val="24"/>
-          <w:szCs w:val="24"/>
-        </w:rPr>
-        <w:t xml:space="preserve"> master → Tommaso Maistrello</w:t>
+        <w:t xml:space="preserve">Product owner → Davide Mascheretti </w:t>
+      </w:r>
+    </w:p>
+    <w:p>
+      <w:pPr>
+        <w:spacing w:after="0"/>
+        <w:jc w:val="both"/>
+        <w:rPr>
+          <w:sz w:val="24"/>
+          <w:szCs w:val="24"/>
+        </w:rPr>
+      </w:pPr>
+      <w:r>
+        <w:rPr>
+          <w:sz w:val="24"/>
+          <w:szCs w:val="24"/>
+        </w:rPr>
+        <w:t>Scrum master → Tommaso Maistrello</w:t>
       </w:r>
     </w:p>
     <w:p>
@@ -858,23 +735,7 @@
           <w:sz w:val="24"/>
           <w:szCs w:val="24"/>
         </w:rPr>
-        <w:t xml:space="preserve">Utilizzo di GitHub privato condiviso con i membri del gruppo per gestire </w:t>
-      </w:r>
-      <w:proofErr w:type="spellStart"/>
-      <w:r>
-        <w:rPr>
-          <w:sz w:val="24"/>
-          <w:szCs w:val="24"/>
-        </w:rPr>
-        <w:t>issue</w:t>
-      </w:r>
-      <w:proofErr w:type="spellEnd"/>
-      <w:r>
-        <w:rPr>
-          <w:sz w:val="24"/>
-          <w:szCs w:val="24"/>
-        </w:rPr>
-        <w:t xml:space="preserve"> e tenere in memoria le azioni di ogni persona. Utilizzo iniziale di Google Drive per la documentazione e per i riassunti dei meeting con data e descrizione, da caricare poi su GitHub.</w:t>
+        <w:t>Utilizzo di GitHub privato condiviso con i membri del gruppo per gestire issue e tenere in memoria le azioni di ogni persona. Utilizzo iniziale di Google Drive per la documentazione e per i riassunti dei meeting con data e descrizione, da caricare poi su GitHub.</w:t>
       </w:r>
     </w:p>
     <w:p/>
@@ -910,23 +771,7 @@
         <w:jc w:val="both"/>
       </w:pPr>
       <w:r>
-        <w:t xml:space="preserve">Per gestire tutte le procedure e tutti i cambiamenti del nostro progetto si utilizza </w:t>
-      </w:r>
-      <w:proofErr w:type="spellStart"/>
-      <w:r>
-        <w:t>Github</w:t>
-      </w:r>
-      <w:proofErr w:type="spellEnd"/>
-      <w:r>
-        <w:t xml:space="preserve">, gestore di configurazione online distribuito che permette ad ognuno di avere una propria </w:t>
-      </w:r>
-      <w:proofErr w:type="spellStart"/>
-      <w:r>
-        <w:t>local</w:t>
-      </w:r>
-      <w:proofErr w:type="spellEnd"/>
-      <w:r>
-        <w:t xml:space="preserve"> repo.</w:t>
+        <w:t>Per gestire tutte le procedure e tutti i cambiamenti del nostro progetto si utilizza Github, gestore di configurazione online distribuito che permette ad ognuno di avere una propria local repo.</w:t>
       </w:r>
       <w:r>
         <w:t xml:space="preserve"> </w:t>
@@ -938,63 +783,31 @@
         <w:t xml:space="preserve"> </w:t>
       </w:r>
       <w:r>
-        <w:t xml:space="preserve">Riguardo la documentazione è necessaria chiarezza sia per le classi aggiunte, che devono essere esplicitamente e dettagliatamente spiegate, sia per tutti i </w:t>
-      </w:r>
-      <w:proofErr w:type="spellStart"/>
-      <w:r>
-        <w:t>commit</w:t>
-      </w:r>
-      <w:proofErr w:type="spellEnd"/>
-      <w:r>
-        <w:t xml:space="preserve"> che vengono fatti.</w:t>
-      </w:r>
-    </w:p>
-    <w:p>
-      <w:pPr>
-        <w:jc w:val="both"/>
-      </w:pPr>
-      <w:r>
-        <w:t xml:space="preserve">Nel titolo del </w:t>
-      </w:r>
-      <w:proofErr w:type="spellStart"/>
-      <w:r>
-        <w:t>commit</w:t>
-      </w:r>
-      <w:proofErr w:type="spellEnd"/>
-      <w:r>
-        <w:t xml:space="preserve"> ci deve essere in generale le modifiche principali apportate e cosa cambia di importante rispetto alla versione precedente. Nella descrizione è possibile aggiungere tutte le informazioni necessarie che descrivono i cambiamenti passo per passo, le scelte effettuate, le motivazioni se necessarie e tutto ciò che permette di comprendere al meglio da una persona esterna cosa è cambiato in seguito alle modifiche effettuate.</w:t>
-      </w:r>
-    </w:p>
-    <w:p>
-      <w:pPr>
-        <w:jc w:val="both"/>
-      </w:pPr>
-      <w:r>
-        <w:t xml:space="preserve">La documentazione è da consegnare necessariamente in seguito al cambiamento del macro argomento su cui stiamo lavorando. Non è necessario fare commenti se i cambiamenti sono ininfluenti sul funzionamento generale dell’applicazione, piuttosto meglio attendere e fare </w:t>
-      </w:r>
-      <w:proofErr w:type="spellStart"/>
-      <w:r>
-        <w:t>push</w:t>
-      </w:r>
-      <w:proofErr w:type="spellEnd"/>
-      <w:r>
-        <w:t xml:space="preserve"> una volta aggiunto qualcosa di realmente significativo.</w:t>
-      </w:r>
-    </w:p>
-    <w:p>
-      <w:pPr>
-        <w:jc w:val="both"/>
-      </w:pPr>
-      <w:r>
-        <w:t xml:space="preserve">Nel caso di modifiche con bug presenti (leggeri non che annullano il funzionamento generale)  è consigliato comunque fare </w:t>
-      </w:r>
-      <w:proofErr w:type="spellStart"/>
-      <w:r>
-        <w:t>commit</w:t>
-      </w:r>
-      <w:proofErr w:type="spellEnd"/>
-      <w:r>
-        <w:t>, magari aggiungendo la descrizione dell’errore. In questo modo ognuno è aggiornato alla versione corretta ed è possibile risolvere il bug o in parallelo allo sviluppo, oppure alla fine del progetto.</w:t>
+        <w:t>Riguardo la documentazione è necessaria chiarezza sia per le classi aggiunte, che devono essere esplicitamente e dettagliatamente spiegate, sia per tutti i commit che vengono fatti.</w:t>
+      </w:r>
+    </w:p>
+    <w:p>
+      <w:pPr>
+        <w:jc w:val="both"/>
+      </w:pPr>
+      <w:r>
+        <w:t>Nel titolo del commit ci deve essere in generale le modifiche principali apportate e cosa cambia di importante rispetto alla versione precedente. Nella descrizione è possibile aggiungere tutte le informazioni necessarie che descrivono i cambiamenti passo per passo, le scelte effettuate, le motivazioni se necessarie e tutto ciò che permette di comprendere al meglio da una persona esterna cosa è cambiato in seguito alle modifiche effettuate.</w:t>
+      </w:r>
+    </w:p>
+    <w:p>
+      <w:pPr>
+        <w:jc w:val="both"/>
+      </w:pPr>
+      <w:r>
+        <w:t>La documentazione è da consegnare necessariamente in seguito al cambiamento del macro argomento su cui stiamo lavorando. Non è necessario fare commenti se i cambiamenti sono ininfluenti sul funzionamento generale dell’applicazione, piuttosto meglio attendere e fare push una volta aggiunto qualcosa di realmente significativo.</w:t>
+      </w:r>
+    </w:p>
+    <w:p>
+      <w:pPr>
+        <w:jc w:val="both"/>
+      </w:pPr>
+      <w:r>
+        <w:t>Nel caso di modifiche con bug presenti (leggeri non che annullano il funzionamento generale)  è consigliato comunque fare commit, magari aggiungendo la descrizione dell’errore. In questo modo ognuno è aggiornato alla versione corretta ed è possibile risolvere il bug o in parallelo allo sviluppo, oppure alla fine del progetto.</w:t>
       </w:r>
     </w:p>
     <w:p>
@@ -1026,151 +839,55 @@
         <w:jc w:val="both"/>
       </w:pPr>
       <w:r>
-        <w:t xml:space="preserve">Potrebbe essere inoltre utile l'utilizzo di una </w:t>
-      </w:r>
-      <w:proofErr w:type="spellStart"/>
-      <w:r>
-        <w:t>kanban</w:t>
-      </w:r>
-      <w:proofErr w:type="spellEnd"/>
-      <w:r>
-        <w:t xml:space="preserve"> board per avere una visione oggettiva e in tempo reale dei progressi dell’applicazione.</w:t>
-      </w:r>
-    </w:p>
-    <w:p>
-      <w:pPr>
-        <w:jc w:val="both"/>
-      </w:pPr>
-      <w:r>
-        <w:t xml:space="preserve">Per la parte database abbiamo utilizzato </w:t>
-      </w:r>
-      <w:proofErr w:type="spellStart"/>
-      <w:r>
-        <w:t>firebase</w:t>
-      </w:r>
-      <w:proofErr w:type="spellEnd"/>
-      <w:r>
-        <w:t xml:space="preserve"> - </w:t>
-      </w:r>
-      <w:proofErr w:type="spellStart"/>
-      <w:r>
-        <w:t>real</w:t>
-      </w:r>
-      <w:proofErr w:type="spellEnd"/>
-      <w:r>
-        <w:t xml:space="preserve"> time database, basato su linguaggio NOSQL. Tramite questo gestiamo tutta la parte di salvataggio, autenticazione, controlli.</w:t>
-      </w:r>
-    </w:p>
-    <w:p>
-      <w:pPr>
-        <w:jc w:val="both"/>
-      </w:pPr>
-      <w:r>
-        <w:t xml:space="preserve">Abbiamo tre nodi: uno che rappresenta gli utenti, uno che rappresenta le prenotazioni e uno che rappresenta le prenotazioni per utente. In questo modo è più semplice fare tutte le operazioni di ricerca e confronto che avverranno nel </w:t>
-      </w:r>
-      <w:proofErr w:type="spellStart"/>
-      <w:r>
-        <w:t>backend</w:t>
-      </w:r>
-      <w:proofErr w:type="spellEnd"/>
-      <w:r>
-        <w:t xml:space="preserve"> della nostra applicazione.</w:t>
-      </w:r>
-    </w:p>
-    <w:p>
-      <w:pPr>
-        <w:jc w:val="both"/>
-      </w:pPr>
-      <w:r>
-        <w:t xml:space="preserve">La gestione dei </w:t>
-      </w:r>
-      <w:proofErr w:type="spellStart"/>
-      <w:r>
-        <w:t>sottonodi</w:t>
-      </w:r>
-      <w:proofErr w:type="spellEnd"/>
-      <w:r>
-        <w:t xml:space="preserve"> verrà decisa in base a come è più comodo, in particolare per il nodo prenotazione (si pensa ad una gestione del tipo prenotazione → date → ora→ info ma non è confermato).</w:t>
-      </w:r>
-    </w:p>
-    <w:p>
-      <w:pPr>
-        <w:jc w:val="both"/>
-      </w:pPr>
-      <w:r>
-        <w:t xml:space="preserve">Per la parte grafica utilizziamo </w:t>
-      </w:r>
-      <w:proofErr w:type="spellStart"/>
-      <w:r>
-        <w:t>Vaadin</w:t>
-      </w:r>
-      <w:proofErr w:type="spellEnd"/>
-      <w:r>
-        <w:t>. Oltre a gestire la parte grafica già integrata, dovrebbe rendere più semplice il collegamento con la parte back end dell’applicazione.</w:t>
-      </w:r>
-    </w:p>
-    <w:p>
-      <w:pPr>
-        <w:jc w:val="both"/>
-      </w:pPr>
-      <w:r>
-        <w:t xml:space="preserve">Per la gestione stili e colore di caratteri e in generale della parte web visiva abbiamo integrato </w:t>
-      </w:r>
-      <w:proofErr w:type="spellStart"/>
-      <w:r>
-        <w:t>Vaadin</w:t>
-      </w:r>
-      <w:proofErr w:type="spellEnd"/>
-      <w:r>
-        <w:t xml:space="preserve"> (che è limitato sotto tale punto di vista) con delle aggiunte </w:t>
-      </w:r>
-      <w:proofErr w:type="spellStart"/>
-      <w:r>
-        <w:t>css</w:t>
-      </w:r>
-      <w:proofErr w:type="spellEnd"/>
-      <w:r>
-        <w:t xml:space="preserve"> e </w:t>
-      </w:r>
-      <w:proofErr w:type="spellStart"/>
-      <w:r>
-        <w:t>javascript</w:t>
-      </w:r>
-      <w:proofErr w:type="spellEnd"/>
-      <w:r>
-        <w:t>.</w:t>
-      </w:r>
-    </w:p>
-    <w:p>
-      <w:pPr>
-        <w:jc w:val="both"/>
-      </w:pPr>
-      <w:r>
-        <w:t xml:space="preserve">Infine per la mappa abbiamo optato per </w:t>
-      </w:r>
-      <w:proofErr w:type="spellStart"/>
-      <w:r>
-        <w:t>Leaflet</w:t>
-      </w:r>
-      <w:proofErr w:type="spellEnd"/>
-      <w:r>
-        <w:t xml:space="preserve">, un software open source che ci permette di usare mappe interattive senza troppi problemi (inizialmente avevamo pensato a </w:t>
-      </w:r>
-      <w:proofErr w:type="spellStart"/>
-      <w:r>
-        <w:t>google</w:t>
-      </w:r>
-      <w:proofErr w:type="spellEnd"/>
-      <w:r>
-        <w:t xml:space="preserve"> API </w:t>
-      </w:r>
-      <w:proofErr w:type="spellStart"/>
-      <w:r>
-        <w:t>maps</w:t>
-      </w:r>
-      <w:proofErr w:type="spellEnd"/>
-      <w:r>
-        <w:t xml:space="preserve"> ma la procedura di ottenimento della chiave era molto più complessa).</w:t>
+        <w:t>Potrebbe essere inoltre utile l'utilizzo di una kanban board per avere una visione oggettiva e in tempo reale dei progressi dell’applicazione.</w:t>
+      </w:r>
+    </w:p>
+    <w:p>
+      <w:pPr>
+        <w:jc w:val="both"/>
+      </w:pPr>
+      <w:r>
+        <w:t>Per la parte database abbiamo utilizzato firebase - real time database, basato su linguaggio NOSQL. Tramite questo gestiamo tutta la parte di salvataggio, autenticazione, controlli.</w:t>
+      </w:r>
+    </w:p>
+    <w:p>
+      <w:pPr>
+        <w:jc w:val="both"/>
+      </w:pPr>
+      <w:r>
+        <w:t>Abbiamo tre nodi: uno che rappresenta gli utenti, uno che rappresenta le prenotazioni e uno che rappresenta le prenotazioni per utente. In questo modo è più semplice fare tutte le operazioni di ricerca e confronto che avverranno nel backend della nostra applicazione.</w:t>
+      </w:r>
+    </w:p>
+    <w:p>
+      <w:pPr>
+        <w:jc w:val="both"/>
+      </w:pPr>
+      <w:r>
+        <w:t>La gestione dei sottonodi verrà decisa in base a come è più comodo, in particolare per il nodo prenotazione (si pensa ad una gestione del tipo prenotazione → date → ora→ info ma non è confermato).</w:t>
+      </w:r>
+    </w:p>
+    <w:p>
+      <w:pPr>
+        <w:jc w:val="both"/>
+      </w:pPr>
+      <w:r>
+        <w:t>Per la parte grafica utilizziamo Vaadin. Oltre a gestire la parte grafica già integrata, dovrebbe rendere più semplice il collegamento con la parte back end dell’applicazione.</w:t>
+      </w:r>
+    </w:p>
+    <w:p>
+      <w:pPr>
+        <w:jc w:val="both"/>
+      </w:pPr>
+      <w:r>
+        <w:t>Per la gestione stili e colore di caratteri e in generale della parte web visiva abbiamo integrato Vaadin (che è limitato sotto tale punto di vista) con delle aggiunte css e javascript.</w:t>
+      </w:r>
+    </w:p>
+    <w:p>
+      <w:pPr>
+        <w:jc w:val="both"/>
+      </w:pPr>
+      <w:r>
+        <w:t>Infine per la mappa abbiamo optato per Leaflet, un software open source che ci permette di usare mappe interattive senza troppi problemi (inizialmente avevamo pensato a google API maps ma la procedura di ottenimento della chiave era molto più complessa).</w:t>
       </w:r>
     </w:p>
     <w:p>
@@ -1317,15 +1034,7 @@
         <w:jc w:val="both"/>
       </w:pPr>
       <w:r>
-        <w:t xml:space="preserve">Potrebbe succedere che per alcuni periodi (di esami) sia più complicato lavorare al progetto, rallentando la sua evoluzione e diminuendo la produttività e il numero di </w:t>
-      </w:r>
-      <w:proofErr w:type="spellStart"/>
-      <w:r>
-        <w:t>commit</w:t>
-      </w:r>
-      <w:proofErr w:type="spellEnd"/>
-      <w:r>
-        <w:t xml:space="preserve"> effettuati.</w:t>
+        <w:t>Potrebbe succedere che per alcuni periodi (di esami) sia più complicato lavorare al progetto, rallentando la sua evoluzione e diminuendo la produttività e il numero di commit effettuati.</w:t>
       </w:r>
     </w:p>
     <w:p>
@@ -1361,26 +1070,7 @@
         <w:jc w:val="both"/>
       </w:pPr>
       <w:r>
-        <w:t xml:space="preserve">Utilizzando </w:t>
-      </w:r>
-      <w:proofErr w:type="spellStart"/>
-      <w:r>
-        <w:t>firebase</w:t>
-      </w:r>
-      <w:proofErr w:type="spellEnd"/>
-      <w:r>
-        <w:t xml:space="preserve"> database (nessun membro del gruppo lo aveva mai utilizzato in precedenza) potrebbero sorgere problematiche di gestione dei dati, creazione database, interrogazioni </w:t>
-      </w:r>
-      <w:proofErr w:type="spellStart"/>
-      <w:r>
-        <w:t>ecc</w:t>
-      </w:r>
-      <w:proofErr w:type="spellEnd"/>
-      <w:r>
-        <w:t xml:space="preserve"> ecc.</w:t>
-      </w:r>
-      <w:r>
-        <w:t xml:space="preserve"> </w:t>
+        <w:t xml:space="preserve">Utilizzando firebase database (nessun membro del gruppo lo aveva mai utilizzato in precedenza) potrebbero sorgere problematiche di gestione dei dati, creazione database, interrogazioni ecc ecc. </w:t>
       </w:r>
     </w:p>
     <w:p>
@@ -1416,33 +1106,16 @@
         <w:jc w:val="both"/>
       </w:pPr>
       <w:r>
-        <w:t xml:space="preserve">Infatti </w:t>
-      </w:r>
-      <w:r>
-        <w:t>è altamente sconsigliato inserire</w:t>
-      </w:r>
-      <w:r>
-        <w:t xml:space="preserve"> la chiave direttamente sulla repository</w:t>
-      </w:r>
-      <w:r>
-        <w:t xml:space="preserve"> online GitHub (se privata è possibile, ma non una buona norma).</w:t>
-      </w:r>
-    </w:p>
-    <w:p>
-      <w:pPr>
-        <w:spacing w:after="0"/>
-        <w:jc w:val="both"/>
-      </w:pPr>
-      <w:r>
-        <w:t xml:space="preserve">Utilizzando inoltre </w:t>
-      </w:r>
-      <w:proofErr w:type="spellStart"/>
-      <w:r>
-        <w:t>noSQL</w:t>
-      </w:r>
-      <w:proofErr w:type="spellEnd"/>
-      <w:r>
-        <w:t xml:space="preserve"> i problemi potrebbero essere maggiori e più complicati da risolvere nel tempo.</w:t>
+        <w:t>Infatti è altamente sconsigliato inserire la chiave direttamente sulla repository online GitHub (se privata è possibile, ma non una buona norma).</w:t>
+      </w:r>
+    </w:p>
+    <w:p>
+      <w:pPr>
+        <w:spacing w:after="0"/>
+        <w:jc w:val="both"/>
+      </w:pPr>
+      <w:r>
+        <w:t>Utilizzando inoltre noSQL i problemi potrebbero essere maggiori e più complicati da risolvere nel tempo.</w:t>
       </w:r>
     </w:p>
     <w:p>
@@ -1460,15 +1133,7 @@
         <w:jc w:val="both"/>
       </w:pPr>
       <w:r>
-        <w:t xml:space="preserve">Nello stesso modo vale per </w:t>
-      </w:r>
-      <w:proofErr w:type="spellStart"/>
-      <w:r>
-        <w:t>Vaadin</w:t>
-      </w:r>
-      <w:proofErr w:type="spellEnd"/>
-      <w:r>
-        <w:t>.</w:t>
+        <w:t>Nello stesso modo vale per Vaadin.</w:t>
       </w:r>
     </w:p>
     <w:p>
@@ -1486,10 +1151,7 @@
         <w:jc w:val="both"/>
       </w:pPr>
       <w:r>
-        <w:t>In generale, p</w:t>
-      </w:r>
-      <w:r>
-        <w:t>er avere maggiore realismo e serietà dell’app ci sono innumerevoli rischi e problemi a cui andremo incontro, vista l’assente conoscenza nell’ambito di tutti i membri del gruppo.</w:t>
+        <w:t>In generale, per avere maggiore realismo e serietà dell’app ci sono innumerevoli rischi e problemi a cui andremo incontro, vista l’assente conoscenza nell’ambito di tutti i membri del gruppo.</w:t>
       </w:r>
     </w:p>
     <w:p>

</xml_diff>

<commit_message>
Aggiunta bozza pacchetti di lavoro, risorse e budget nel project plan
Aggiunta di informazioni riguardanti pacchetti di lavoro, risorse e personale sia nel project plan in docx sia in markdown
</commit_message>
<xml_diff>
--- a/documentazione/project plan.docx
+++ b/documentazione/project plan.docx
@@ -86,7 +86,23 @@
           <w:sz w:val="24"/>
           <w:szCs w:val="24"/>
         </w:rPr>
-        <w:t>Dopo una prima fase di registrazione (se necessaria) e login, si apre direttamente la mappa stessa con marker che identificano le colonnine presenti nella zona scelta.</w:t>
+        <w:t xml:space="preserve">Dopo una prima fase di registrazione (se </w:t>
+      </w:r>
+      <w:proofErr w:type="spellStart"/>
+      <w:r>
+        <w:rPr>
+          <w:sz w:val="24"/>
+          <w:szCs w:val="24"/>
+        </w:rPr>
+        <w:t>necessaria</w:t>
+      </w:r>
+      <w:proofErr w:type="spellEnd"/>
+      <w:r>
+        <w:rPr>
+          <w:sz w:val="24"/>
+          <w:szCs w:val="24"/>
+        </w:rPr>
+        <w:t>) e login, si apre direttamente la mappa stessa con marker che identificano le colonnine presenti nella zona scelta.</w:t>
       </w:r>
     </w:p>
     <w:p>
@@ -428,12 +444,21 @@
           <w:szCs w:val="24"/>
         </w:rPr>
       </w:pPr>
-      <w:r>
-        <w:rPr>
-          <w:sz w:val="24"/>
-          <w:szCs w:val="24"/>
-        </w:rPr>
-        <w:t>Frontend: sviluppo interfaccia, mappa interattiva, passaggio tra pagine, menù.</w:t>
+      <w:proofErr w:type="spellStart"/>
+      <w:r>
+        <w:rPr>
+          <w:sz w:val="24"/>
+          <w:szCs w:val="24"/>
+        </w:rPr>
+        <w:t>Frontend</w:t>
+      </w:r>
+      <w:proofErr w:type="spellEnd"/>
+      <w:r>
+        <w:rPr>
+          <w:sz w:val="24"/>
+          <w:szCs w:val="24"/>
+        </w:rPr>
+        <w:t>: sviluppo interfaccia, mappa interattiva, passaggio tra pagine, menù.</w:t>
       </w:r>
     </w:p>
     <w:p>
@@ -445,12 +470,37 @@
           <w:szCs w:val="24"/>
         </w:rPr>
       </w:pPr>
-      <w:r>
-        <w:rPr>
-          <w:sz w:val="24"/>
-          <w:szCs w:val="24"/>
-        </w:rPr>
-        <w:t>Backend+Database: gestione firebase, controlli utente e prenotazioni, salvataggio dati, sicurezza</w:t>
+      <w:proofErr w:type="spellStart"/>
+      <w:r>
+        <w:rPr>
+          <w:sz w:val="24"/>
+          <w:szCs w:val="24"/>
+        </w:rPr>
+        <w:t>Backend+Database</w:t>
+      </w:r>
+      <w:proofErr w:type="spellEnd"/>
+      <w:r>
+        <w:rPr>
+          <w:sz w:val="24"/>
+          <w:szCs w:val="24"/>
+        </w:rPr>
+        <w:t xml:space="preserve">: gestione </w:t>
+      </w:r>
+      <w:proofErr w:type="spellStart"/>
+      <w:r>
+        <w:rPr>
+          <w:sz w:val="24"/>
+          <w:szCs w:val="24"/>
+        </w:rPr>
+        <w:t>firebase</w:t>
+      </w:r>
+      <w:proofErr w:type="spellEnd"/>
+      <w:r>
+        <w:rPr>
+          <w:sz w:val="24"/>
+          <w:szCs w:val="24"/>
+        </w:rPr>
+        <w:t>, controlli utente e prenotazioni, salvataggio dati, sicurezza</w:t>
       </w:r>
     </w:p>
     <w:p>
@@ -521,7 +571,39 @@
           <w:sz w:val="24"/>
           <w:szCs w:val="24"/>
         </w:rPr>
-        <w:t>Si possono dividere i ruoli in product owner, scrum master e team di implementazione (di cui fanno parte tutti)</w:t>
+        <w:t xml:space="preserve">Si possono dividere i ruoli in product </w:t>
+      </w:r>
+      <w:proofErr w:type="spellStart"/>
+      <w:r>
+        <w:rPr>
+          <w:sz w:val="24"/>
+          <w:szCs w:val="24"/>
+        </w:rPr>
+        <w:t>owner</w:t>
+      </w:r>
+      <w:proofErr w:type="spellEnd"/>
+      <w:r>
+        <w:rPr>
+          <w:sz w:val="24"/>
+          <w:szCs w:val="24"/>
+        </w:rPr>
+        <w:t xml:space="preserve">, </w:t>
+      </w:r>
+      <w:proofErr w:type="spellStart"/>
+      <w:r>
+        <w:rPr>
+          <w:sz w:val="24"/>
+          <w:szCs w:val="24"/>
+        </w:rPr>
+        <w:t>scrum</w:t>
+      </w:r>
+      <w:proofErr w:type="spellEnd"/>
+      <w:r>
+        <w:rPr>
+          <w:sz w:val="24"/>
+          <w:szCs w:val="24"/>
+        </w:rPr>
+        <w:t xml:space="preserve"> master e team di implementazione (di cui fanno parte tutti)</w:t>
       </w:r>
     </w:p>
     <w:p>
@@ -555,7 +637,23 @@
           <w:sz w:val="24"/>
           <w:szCs w:val="24"/>
         </w:rPr>
-        <w:t xml:space="preserve">Product owner → Davide Mascheretti </w:t>
+        <w:t xml:space="preserve">Product </w:t>
+      </w:r>
+      <w:proofErr w:type="spellStart"/>
+      <w:r>
+        <w:rPr>
+          <w:sz w:val="24"/>
+          <w:szCs w:val="24"/>
+        </w:rPr>
+        <w:t>owner</w:t>
+      </w:r>
+      <w:proofErr w:type="spellEnd"/>
+      <w:r>
+        <w:rPr>
+          <w:sz w:val="24"/>
+          <w:szCs w:val="24"/>
+        </w:rPr>
+        <w:t xml:space="preserve"> → Davide Mascheretti </w:t>
       </w:r>
     </w:p>
     <w:p>
@@ -567,12 +665,21 @@
           <w:szCs w:val="24"/>
         </w:rPr>
       </w:pPr>
-      <w:r>
-        <w:rPr>
-          <w:sz w:val="24"/>
-          <w:szCs w:val="24"/>
-        </w:rPr>
-        <w:t>Scrum master → Tommaso Maistrello</w:t>
+      <w:proofErr w:type="spellStart"/>
+      <w:r>
+        <w:rPr>
+          <w:sz w:val="24"/>
+          <w:szCs w:val="24"/>
+        </w:rPr>
+        <w:t>Scrum</w:t>
+      </w:r>
+      <w:proofErr w:type="spellEnd"/>
+      <w:r>
+        <w:rPr>
+          <w:sz w:val="24"/>
+          <w:szCs w:val="24"/>
+        </w:rPr>
+        <w:t xml:space="preserve"> master → Tommaso Maistrello</w:t>
       </w:r>
     </w:p>
     <w:p>
@@ -735,7 +842,23 @@
           <w:sz w:val="24"/>
           <w:szCs w:val="24"/>
         </w:rPr>
-        <w:t>Utilizzo di GitHub privato condiviso con i membri del gruppo per gestire issue e tenere in memoria le azioni di ogni persona. Utilizzo iniziale di Google Drive per la documentazione e per i riassunti dei meeting con data e descrizione, da caricare poi su GitHub.</w:t>
+        <w:t xml:space="preserve">Utilizzo di GitHub privato condiviso con i membri del gruppo per gestire </w:t>
+      </w:r>
+      <w:proofErr w:type="spellStart"/>
+      <w:r>
+        <w:rPr>
+          <w:sz w:val="24"/>
+          <w:szCs w:val="24"/>
+        </w:rPr>
+        <w:t>issue</w:t>
+      </w:r>
+      <w:proofErr w:type="spellEnd"/>
+      <w:r>
+        <w:rPr>
+          <w:sz w:val="24"/>
+          <w:szCs w:val="24"/>
+        </w:rPr>
+        <w:t xml:space="preserve"> e tenere in memoria le azioni di ogni persona. Utilizzo iniziale di Google Drive per la documentazione e per i riassunti dei meeting con data e descrizione, da caricare poi su GitHub.</w:t>
       </w:r>
     </w:p>
     <w:p/>
@@ -771,7 +894,23 @@
         <w:jc w:val="both"/>
       </w:pPr>
       <w:r>
-        <w:t>Per gestire tutte le procedure e tutti i cambiamenti del nostro progetto si utilizza Github, gestore di configurazione online distribuito che permette ad ognuno di avere una propria local repo.</w:t>
+        <w:t xml:space="preserve">Per gestire tutte le procedure e tutti i cambiamenti del nostro progetto si utilizza </w:t>
+      </w:r>
+      <w:proofErr w:type="spellStart"/>
+      <w:r>
+        <w:t>Github</w:t>
+      </w:r>
+      <w:proofErr w:type="spellEnd"/>
+      <w:r>
+        <w:t xml:space="preserve">, gestore di configurazione online distribuito che permette ad ognuno di avere una propria </w:t>
+      </w:r>
+      <w:proofErr w:type="spellStart"/>
+      <w:r>
+        <w:t>local</w:t>
+      </w:r>
+      <w:proofErr w:type="spellEnd"/>
+      <w:r>
+        <w:t xml:space="preserve"> repo.</w:t>
       </w:r>
       <w:r>
         <w:t xml:space="preserve"> </w:t>
@@ -783,31 +922,63 @@
         <w:t xml:space="preserve"> </w:t>
       </w:r>
       <w:r>
-        <w:t>Riguardo la documentazione è necessaria chiarezza sia per le classi aggiunte, che devono essere esplicitamente e dettagliatamente spiegate, sia per tutti i commit che vengono fatti.</w:t>
-      </w:r>
-    </w:p>
-    <w:p>
-      <w:pPr>
-        <w:jc w:val="both"/>
-      </w:pPr>
-      <w:r>
-        <w:t>Nel titolo del commit ci deve essere in generale le modifiche principali apportate e cosa cambia di importante rispetto alla versione precedente. Nella descrizione è possibile aggiungere tutte le informazioni necessarie che descrivono i cambiamenti passo per passo, le scelte effettuate, le motivazioni se necessarie e tutto ciò che permette di comprendere al meglio da una persona esterna cosa è cambiato in seguito alle modifiche effettuate.</w:t>
-      </w:r>
-    </w:p>
-    <w:p>
-      <w:pPr>
-        <w:jc w:val="both"/>
-      </w:pPr>
-      <w:r>
-        <w:t>La documentazione è da consegnare necessariamente in seguito al cambiamento del macro argomento su cui stiamo lavorando. Non è necessario fare commenti se i cambiamenti sono ininfluenti sul funzionamento generale dell’applicazione, piuttosto meglio attendere e fare push una volta aggiunto qualcosa di realmente significativo.</w:t>
-      </w:r>
-    </w:p>
-    <w:p>
-      <w:pPr>
-        <w:jc w:val="both"/>
-      </w:pPr>
-      <w:r>
-        <w:t>Nel caso di modifiche con bug presenti (leggeri non che annullano il funzionamento generale)  è consigliato comunque fare commit, magari aggiungendo la descrizione dell’errore. In questo modo ognuno è aggiornato alla versione corretta ed è possibile risolvere il bug o in parallelo allo sviluppo, oppure alla fine del progetto.</w:t>
+        <w:t xml:space="preserve">Riguardo la documentazione è necessaria chiarezza sia per le classi aggiunte, che devono essere esplicitamente e dettagliatamente spiegate, sia per tutti i </w:t>
+      </w:r>
+      <w:proofErr w:type="spellStart"/>
+      <w:r>
+        <w:t>commit</w:t>
+      </w:r>
+      <w:proofErr w:type="spellEnd"/>
+      <w:r>
+        <w:t xml:space="preserve"> che vengono fatti.</w:t>
+      </w:r>
+    </w:p>
+    <w:p>
+      <w:pPr>
+        <w:jc w:val="both"/>
+      </w:pPr>
+      <w:r>
+        <w:t xml:space="preserve">Nel titolo del </w:t>
+      </w:r>
+      <w:proofErr w:type="spellStart"/>
+      <w:r>
+        <w:t>commit</w:t>
+      </w:r>
+      <w:proofErr w:type="spellEnd"/>
+      <w:r>
+        <w:t xml:space="preserve"> ci deve essere in generale le modifiche principali apportate e cosa cambia di importante rispetto alla versione precedente. Nella descrizione è possibile aggiungere tutte le informazioni necessarie che descrivono i cambiamenti passo per passo, le scelte effettuate, le motivazioni se necessarie e tutto ciò che permette di comprendere al meglio da una persona esterna cosa è cambiato in seguito alle modifiche effettuate.</w:t>
+      </w:r>
+    </w:p>
+    <w:p>
+      <w:pPr>
+        <w:jc w:val="both"/>
+      </w:pPr>
+      <w:r>
+        <w:t xml:space="preserve">La documentazione è da consegnare necessariamente in seguito al cambiamento del macro argomento su cui stiamo lavorando. Non è necessario fare commenti se i cambiamenti sono ininfluenti sul funzionamento generale dell’applicazione, piuttosto meglio attendere e fare </w:t>
+      </w:r>
+      <w:proofErr w:type="spellStart"/>
+      <w:r>
+        <w:t>push</w:t>
+      </w:r>
+      <w:proofErr w:type="spellEnd"/>
+      <w:r>
+        <w:t xml:space="preserve"> una volta aggiunto qualcosa di realmente significativo.</w:t>
+      </w:r>
+    </w:p>
+    <w:p>
+      <w:pPr>
+        <w:jc w:val="both"/>
+      </w:pPr>
+      <w:r>
+        <w:t xml:space="preserve">Nel caso di modifiche con bug presenti (leggeri non che annullano il funzionamento generale)  è consigliato comunque fare </w:t>
+      </w:r>
+      <w:proofErr w:type="spellStart"/>
+      <w:r>
+        <w:t>commit</w:t>
+      </w:r>
+      <w:proofErr w:type="spellEnd"/>
+      <w:r>
+        <w:t>, magari aggiungendo la descrizione dell’errore. In questo modo ognuno è aggiornato alla versione corretta ed è possibile risolvere il bug o in parallelo allo sviluppo, oppure alla fine del progetto.</w:t>
       </w:r>
     </w:p>
     <w:p>
@@ -839,55 +1010,151 @@
         <w:jc w:val="both"/>
       </w:pPr>
       <w:r>
-        <w:t>Potrebbe essere inoltre utile l'utilizzo di una kanban board per avere una visione oggettiva e in tempo reale dei progressi dell’applicazione.</w:t>
-      </w:r>
-    </w:p>
-    <w:p>
-      <w:pPr>
-        <w:jc w:val="both"/>
-      </w:pPr>
-      <w:r>
-        <w:t>Per la parte database abbiamo utilizzato firebase - real time database, basato su linguaggio NOSQL. Tramite questo gestiamo tutta la parte di salvataggio, autenticazione, controlli.</w:t>
-      </w:r>
-    </w:p>
-    <w:p>
-      <w:pPr>
-        <w:jc w:val="both"/>
-      </w:pPr>
-      <w:r>
-        <w:t>Abbiamo tre nodi: uno che rappresenta gli utenti, uno che rappresenta le prenotazioni e uno che rappresenta le prenotazioni per utente. In questo modo è più semplice fare tutte le operazioni di ricerca e confronto che avverranno nel backend della nostra applicazione.</w:t>
-      </w:r>
-    </w:p>
-    <w:p>
-      <w:pPr>
-        <w:jc w:val="both"/>
-      </w:pPr>
-      <w:r>
-        <w:t>La gestione dei sottonodi verrà decisa in base a come è più comodo, in particolare per il nodo prenotazione (si pensa ad una gestione del tipo prenotazione → date → ora→ info ma non è confermato).</w:t>
-      </w:r>
-    </w:p>
-    <w:p>
-      <w:pPr>
-        <w:jc w:val="both"/>
-      </w:pPr>
-      <w:r>
-        <w:t>Per la parte grafica utilizziamo Vaadin. Oltre a gestire la parte grafica già integrata, dovrebbe rendere più semplice il collegamento con la parte back end dell’applicazione.</w:t>
-      </w:r>
-    </w:p>
-    <w:p>
-      <w:pPr>
-        <w:jc w:val="both"/>
-      </w:pPr>
-      <w:r>
-        <w:t>Per la gestione stili e colore di caratteri e in generale della parte web visiva abbiamo integrato Vaadin (che è limitato sotto tale punto di vista) con delle aggiunte css e javascript.</w:t>
-      </w:r>
-    </w:p>
-    <w:p>
-      <w:pPr>
-        <w:jc w:val="both"/>
-      </w:pPr>
-      <w:r>
-        <w:t>Infine per la mappa abbiamo optato per Leaflet, un software open source che ci permette di usare mappe interattive senza troppi problemi (inizialmente avevamo pensato a google API maps ma la procedura di ottenimento della chiave era molto più complessa).</w:t>
+        <w:t xml:space="preserve">Potrebbe essere inoltre utile l'utilizzo di una </w:t>
+      </w:r>
+      <w:proofErr w:type="spellStart"/>
+      <w:r>
+        <w:t>kanban</w:t>
+      </w:r>
+      <w:proofErr w:type="spellEnd"/>
+      <w:r>
+        <w:t xml:space="preserve"> board per avere una visione oggettiva e in tempo reale dei progressi dell’applicazione.</w:t>
+      </w:r>
+    </w:p>
+    <w:p>
+      <w:pPr>
+        <w:jc w:val="both"/>
+      </w:pPr>
+      <w:r>
+        <w:t xml:space="preserve">Per la parte database abbiamo utilizzato </w:t>
+      </w:r>
+      <w:proofErr w:type="spellStart"/>
+      <w:r>
+        <w:t>firebase</w:t>
+      </w:r>
+      <w:proofErr w:type="spellEnd"/>
+      <w:r>
+        <w:t xml:space="preserve"> - </w:t>
+      </w:r>
+      <w:proofErr w:type="spellStart"/>
+      <w:r>
+        <w:t>real</w:t>
+      </w:r>
+      <w:proofErr w:type="spellEnd"/>
+      <w:r>
+        <w:t xml:space="preserve"> time database, basato su linguaggio NOSQL. Tramite questo gestiamo tutta la parte di salvataggio, autenticazione, controlli.</w:t>
+      </w:r>
+    </w:p>
+    <w:p>
+      <w:pPr>
+        <w:jc w:val="both"/>
+      </w:pPr>
+      <w:r>
+        <w:t xml:space="preserve">Abbiamo tre nodi: uno che rappresenta gli utenti, uno che rappresenta le prenotazioni e uno che rappresenta le prenotazioni per utente. In questo modo è più semplice fare tutte le operazioni di ricerca e confronto che avverranno nel </w:t>
+      </w:r>
+      <w:proofErr w:type="spellStart"/>
+      <w:r>
+        <w:t>backend</w:t>
+      </w:r>
+      <w:proofErr w:type="spellEnd"/>
+      <w:r>
+        <w:t xml:space="preserve"> della nostra applicazione.</w:t>
+      </w:r>
+    </w:p>
+    <w:p>
+      <w:pPr>
+        <w:jc w:val="both"/>
+      </w:pPr>
+      <w:r>
+        <w:t xml:space="preserve">La gestione dei </w:t>
+      </w:r>
+      <w:proofErr w:type="spellStart"/>
+      <w:r>
+        <w:t>sottonodi</w:t>
+      </w:r>
+      <w:proofErr w:type="spellEnd"/>
+      <w:r>
+        <w:t xml:space="preserve"> verrà decisa in base a come è più comodo, in particolare per il nodo prenotazione (si pensa ad una gestione del tipo prenotazione → date → ora→ info ma non è confermato).</w:t>
+      </w:r>
+    </w:p>
+    <w:p>
+      <w:pPr>
+        <w:jc w:val="both"/>
+      </w:pPr>
+      <w:r>
+        <w:t xml:space="preserve">Per la parte grafica utilizziamo </w:t>
+      </w:r>
+      <w:proofErr w:type="spellStart"/>
+      <w:r>
+        <w:t>Vaadin</w:t>
+      </w:r>
+      <w:proofErr w:type="spellEnd"/>
+      <w:r>
+        <w:t>. Oltre a gestire la parte grafica già integrata, dovrebbe rendere più semplice il collegamento con la parte back end dell’applicazione.</w:t>
+      </w:r>
+    </w:p>
+    <w:p>
+      <w:pPr>
+        <w:jc w:val="both"/>
+      </w:pPr>
+      <w:r>
+        <w:t xml:space="preserve">Per la gestione stili e colore di caratteri e in generale della parte web visiva abbiamo integrato </w:t>
+      </w:r>
+      <w:proofErr w:type="spellStart"/>
+      <w:r>
+        <w:t>Vaadin</w:t>
+      </w:r>
+      <w:proofErr w:type="spellEnd"/>
+      <w:r>
+        <w:t xml:space="preserve"> (che è limitato sotto tale punto di vista) con delle aggiunte </w:t>
+      </w:r>
+      <w:proofErr w:type="spellStart"/>
+      <w:r>
+        <w:t>css</w:t>
+      </w:r>
+      <w:proofErr w:type="spellEnd"/>
+      <w:r>
+        <w:t xml:space="preserve"> e </w:t>
+      </w:r>
+      <w:proofErr w:type="spellStart"/>
+      <w:r>
+        <w:t>javascript</w:t>
+      </w:r>
+      <w:proofErr w:type="spellEnd"/>
+      <w:r>
+        <w:t>.</w:t>
+      </w:r>
+    </w:p>
+    <w:p>
+      <w:pPr>
+        <w:jc w:val="both"/>
+      </w:pPr>
+      <w:r>
+        <w:t xml:space="preserve">Infine per la mappa abbiamo optato per </w:t>
+      </w:r>
+      <w:proofErr w:type="spellStart"/>
+      <w:r>
+        <w:t>Leaflet</w:t>
+      </w:r>
+      <w:proofErr w:type="spellEnd"/>
+      <w:r>
+        <w:t xml:space="preserve">, un software open source che ci permette di usare mappe interattive senza troppi problemi (inizialmente avevamo pensato a </w:t>
+      </w:r>
+      <w:proofErr w:type="spellStart"/>
+      <w:r>
+        <w:t>google</w:t>
+      </w:r>
+      <w:proofErr w:type="spellEnd"/>
+      <w:r>
+        <w:t xml:space="preserve"> API </w:t>
+      </w:r>
+      <w:proofErr w:type="spellStart"/>
+      <w:r>
+        <w:t>maps</w:t>
+      </w:r>
+      <w:proofErr w:type="spellEnd"/>
+      <w:r>
+        <w:t xml:space="preserve"> ma la procedura di ottenimento della chiave era molto più complessa).</w:t>
       </w:r>
     </w:p>
     <w:p>
@@ -1034,7 +1301,15 @@
         <w:jc w:val="both"/>
       </w:pPr>
       <w:r>
-        <w:t>Potrebbe succedere che per alcuni periodi (di esami) sia più complicato lavorare al progetto, rallentando la sua evoluzione e diminuendo la produttività e il numero di commit effettuati.</w:t>
+        <w:t xml:space="preserve">Potrebbe succedere che per alcuni periodi (di esami) sia più complicato lavorare al progetto, rallentando la sua evoluzione e diminuendo la produttività e il numero di </w:t>
+      </w:r>
+      <w:proofErr w:type="spellStart"/>
+      <w:r>
+        <w:t>commit</w:t>
+      </w:r>
+      <w:proofErr w:type="spellEnd"/>
+      <w:r>
+        <w:t xml:space="preserve"> effettuati.</w:t>
       </w:r>
     </w:p>
     <w:p>
@@ -1070,7 +1345,23 @@
         <w:jc w:val="both"/>
       </w:pPr>
       <w:r>
-        <w:t xml:space="preserve">Utilizzando firebase database (nessun membro del gruppo lo aveva mai utilizzato in precedenza) potrebbero sorgere problematiche di gestione dei dati, creazione database, interrogazioni ecc ecc. </w:t>
+        <w:t xml:space="preserve">Utilizzando </w:t>
+      </w:r>
+      <w:proofErr w:type="spellStart"/>
+      <w:r>
+        <w:t>firebase</w:t>
+      </w:r>
+      <w:proofErr w:type="spellEnd"/>
+      <w:r>
+        <w:t xml:space="preserve"> database (nessun membro del gruppo lo aveva mai utilizzato in precedenza) potrebbero sorgere problematiche di gestione dei dati, creazione database, interrogazioni </w:t>
+      </w:r>
+      <w:proofErr w:type="spellStart"/>
+      <w:r>
+        <w:t>ecc</w:t>
+      </w:r>
+      <w:proofErr w:type="spellEnd"/>
+      <w:r>
+        <w:t xml:space="preserve"> ecc. </w:t>
       </w:r>
     </w:p>
     <w:p>
@@ -1115,7 +1406,15 @@
         <w:jc w:val="both"/>
       </w:pPr>
       <w:r>
-        <w:t>Utilizzando inoltre noSQL i problemi potrebbero essere maggiori e più complicati da risolvere nel tempo.</w:t>
+        <w:t xml:space="preserve">Utilizzando inoltre </w:t>
+      </w:r>
+      <w:proofErr w:type="spellStart"/>
+      <w:r>
+        <w:t>noSQL</w:t>
+      </w:r>
+      <w:proofErr w:type="spellEnd"/>
+      <w:r>
+        <w:t xml:space="preserve"> i problemi potrebbero essere maggiori e più complicati da risolvere nel tempo.</w:t>
       </w:r>
     </w:p>
     <w:p>
@@ -1133,7 +1432,15 @@
         <w:jc w:val="both"/>
       </w:pPr>
       <w:r>
-        <w:t>Nello stesso modo vale per Vaadin.</w:t>
+        <w:t xml:space="preserve">Nello stesso modo vale per </w:t>
+      </w:r>
+      <w:proofErr w:type="spellStart"/>
+      <w:r>
+        <w:t>Vaadin</w:t>
+      </w:r>
+      <w:proofErr w:type="spellEnd"/>
+      <w:r>
+        <w:t>.</w:t>
       </w:r>
     </w:p>
     <w:p>
@@ -1353,119 +1660,1945 @@
     <w:p/>
     <w:p/>
     <w:p>
-      <w:r>
+      <w:pPr>
+        <w:rPr>
+          <w:b/>
+          <w:bCs/>
+          <w:sz w:val="28"/>
+          <w:szCs w:val="28"/>
+        </w:rPr>
+      </w:pPr>
+      <w:r>
+        <w:rPr>
+          <w:b/>
+          <w:bCs/>
+          <w:sz w:val="28"/>
+          <w:szCs w:val="28"/>
+        </w:rPr>
         <w:lastRenderedPageBreak/>
         <w:t>PACCHETTI DI LAVORO</w:t>
       </w:r>
     </w:p>
-    <w:p/>
-    <w:p/>
-    <w:p/>
-    <w:p/>
-    <w:p/>
-    <w:p/>
-    <w:p/>
-    <w:p/>
-    <w:p/>
-    <w:p/>
-    <w:p/>
-    <w:p/>
-    <w:p/>
-    <w:p/>
-    <w:p/>
-    <w:p/>
-    <w:p/>
-    <w:p/>
-    <w:p/>
-    <w:p/>
-    <w:p/>
-    <w:p/>
-    <w:p/>
-    <w:p/>
-    <w:p/>
-    <w:p/>
-    <w:p/>
-    <w:p/>
-    <w:p/>
-    <w:p/>
-    <w:p/>
-    <w:p>
-      <w:r>
+    <w:p>
+      <w:pPr>
+        <w:spacing w:before="240" w:after="240" w:line="240" w:lineRule="auto"/>
+        <w:rPr>
+          <w:rFonts w:eastAsia="Times New Roman" w:cstheme="minorHAnsi"/>
+          <w:kern w:val="0"/>
+          <w:sz w:val="24"/>
+          <w:szCs w:val="24"/>
+          <w:lang w:eastAsia="it-IT"/>
+          <w14:ligatures w14:val="none"/>
+        </w:rPr>
+      </w:pPr>
+      <w:proofErr w:type="spellStart"/>
+      <w:r>
+        <w:rPr>
+          <w:rFonts w:eastAsia="Times New Roman" w:cstheme="minorHAnsi"/>
+          <w:color w:val="000000"/>
+          <w:kern w:val="0"/>
+          <w:lang w:eastAsia="it-IT"/>
+          <w14:ligatures w14:val="none"/>
+        </w:rPr>
+        <w:t>ll</w:t>
+      </w:r>
+      <w:proofErr w:type="spellEnd"/>
+      <w:r>
+        <w:rPr>
+          <w:rFonts w:eastAsia="Times New Roman" w:cstheme="minorHAnsi"/>
+          <w:color w:val="000000"/>
+          <w:kern w:val="0"/>
+          <w:lang w:eastAsia="it-IT"/>
+          <w14:ligatures w14:val="none"/>
+        </w:rPr>
+        <w:t xml:space="preserve"> progetto è suddiviso nei seguenti macro-blocchi, che verranno poi scomposti tra i diversi membri del gruppo, in relazione al ruolo a loro assegnato.</w:t>
+      </w:r>
+    </w:p>
+    <w:p>
+      <w:pPr>
+        <w:spacing w:before="240" w:after="0" w:line="240" w:lineRule="auto"/>
+        <w:textAlignment w:val="baseline"/>
+        <w:rPr>
+          <w:rFonts w:eastAsia="Times New Roman" w:cstheme="minorHAnsi"/>
+          <w:color w:val="000000"/>
+          <w:kern w:val="0"/>
+          <w:lang w:eastAsia="it-IT"/>
+          <w14:ligatures w14:val="none"/>
+        </w:rPr>
+      </w:pPr>
+      <w:r>
+        <w:rPr>
+          <w:rFonts w:eastAsia="Times New Roman" w:cstheme="minorHAnsi"/>
+          <w:color w:val="000000"/>
+          <w:kern w:val="0"/>
+          <w:lang w:eastAsia="it-IT"/>
+          <w14:ligatures w14:val="none"/>
+        </w:rPr>
+        <w:t>1-</w:t>
+      </w:r>
+      <w:r>
+        <w:rPr>
+          <w:rFonts w:eastAsia="Times New Roman" w:cstheme="minorHAnsi"/>
+          <w:i/>
+          <w:iCs/>
+          <w:color w:val="000000"/>
+          <w:kern w:val="0"/>
+          <w:lang w:eastAsia="it-IT"/>
+          <w14:ligatures w14:val="none"/>
+        </w:rPr>
+        <w:t xml:space="preserve"> Inizializzazione progetto e configurazione dipendenze</w:t>
+      </w:r>
+    </w:p>
+    <w:p>
+      <w:pPr>
+        <w:numPr>
+          <w:ilvl w:val="1"/>
+          <w:numId w:val="1"/>
+        </w:numPr>
+        <w:spacing w:after="0" w:line="240" w:lineRule="auto"/>
+        <w:textAlignment w:val="baseline"/>
+        <w:rPr>
+          <w:rFonts w:eastAsia="Times New Roman" w:cstheme="minorHAnsi"/>
+          <w:color w:val="000000"/>
+          <w:kern w:val="0"/>
+          <w:lang w:eastAsia="it-IT"/>
+          <w14:ligatures w14:val="none"/>
+        </w:rPr>
+      </w:pPr>
+      <w:r>
+        <w:rPr>
+          <w:rFonts w:eastAsia="Times New Roman" w:cstheme="minorHAnsi"/>
+          <w:color w:val="000000"/>
+          <w:kern w:val="0"/>
+          <w:lang w:eastAsia="it-IT"/>
+          <w14:ligatures w14:val="none"/>
+        </w:rPr>
+        <w:t xml:space="preserve">Creazione repository privata GitHub e struttura progetto </w:t>
+      </w:r>
+      <w:proofErr w:type="spellStart"/>
+      <w:r>
+        <w:rPr>
+          <w:rFonts w:eastAsia="Times New Roman" w:cstheme="minorHAnsi"/>
+          <w:color w:val="000000"/>
+          <w:kern w:val="0"/>
+          <w:lang w:eastAsia="it-IT"/>
+          <w14:ligatures w14:val="none"/>
+        </w:rPr>
+        <w:t>Vaadin</w:t>
+      </w:r>
+      <w:proofErr w:type="spellEnd"/>
+      <w:r>
+        <w:rPr>
+          <w:rFonts w:eastAsia="Times New Roman" w:cstheme="minorHAnsi"/>
+          <w:color w:val="000000"/>
+          <w:kern w:val="0"/>
+          <w:lang w:eastAsia="it-IT"/>
+          <w14:ligatures w14:val="none"/>
+        </w:rPr>
+        <w:t xml:space="preserve"> e Spring Boot con dipendenze nel </w:t>
+      </w:r>
+      <w:proofErr w:type="spellStart"/>
+      <w:r>
+        <w:rPr>
+          <w:rFonts w:eastAsia="Times New Roman" w:cstheme="minorHAnsi"/>
+          <w:color w:val="000000"/>
+          <w:kern w:val="0"/>
+          <w:lang w:eastAsia="it-IT"/>
+          <w14:ligatures w14:val="none"/>
+        </w:rPr>
+        <w:t>pom</w:t>
+      </w:r>
+      <w:proofErr w:type="spellEnd"/>
+    </w:p>
+    <w:p>
+      <w:pPr>
+        <w:numPr>
+          <w:ilvl w:val="1"/>
+          <w:numId w:val="1"/>
+        </w:numPr>
+        <w:spacing w:after="0" w:line="240" w:lineRule="auto"/>
+        <w:textAlignment w:val="baseline"/>
+        <w:rPr>
+          <w:rFonts w:eastAsia="Times New Roman" w:cstheme="minorHAnsi"/>
+          <w:color w:val="000000"/>
+          <w:kern w:val="0"/>
+          <w:lang w:eastAsia="it-IT"/>
+          <w14:ligatures w14:val="none"/>
+        </w:rPr>
+      </w:pPr>
+      <w:r>
+        <w:rPr>
+          <w:rFonts w:eastAsia="Times New Roman" w:cstheme="minorHAnsi"/>
+          <w:color w:val="000000"/>
+          <w:kern w:val="0"/>
+          <w:lang w:eastAsia="it-IT"/>
+          <w14:ligatures w14:val="none"/>
+        </w:rPr>
+        <w:t xml:space="preserve">Configurazione </w:t>
+      </w:r>
+      <w:proofErr w:type="spellStart"/>
+      <w:r>
+        <w:rPr>
+          <w:rFonts w:eastAsia="Times New Roman" w:cstheme="minorHAnsi"/>
+          <w:color w:val="000000"/>
+          <w:kern w:val="0"/>
+          <w:lang w:eastAsia="it-IT"/>
+          <w14:ligatures w14:val="none"/>
+        </w:rPr>
+        <w:t>Firebase</w:t>
+      </w:r>
+      <w:proofErr w:type="spellEnd"/>
+      <w:r>
+        <w:rPr>
+          <w:rFonts w:eastAsia="Times New Roman" w:cstheme="minorHAnsi"/>
+          <w:color w:val="000000"/>
+          <w:kern w:val="0"/>
+          <w:lang w:eastAsia="it-IT"/>
+          <w14:ligatures w14:val="none"/>
+        </w:rPr>
+        <w:t xml:space="preserve"> (</w:t>
+      </w:r>
+      <w:proofErr w:type="spellStart"/>
+      <w:r>
+        <w:rPr>
+          <w:rFonts w:eastAsia="Times New Roman" w:cstheme="minorHAnsi"/>
+          <w:color w:val="000000"/>
+          <w:kern w:val="0"/>
+          <w:lang w:eastAsia="it-IT"/>
+          <w14:ligatures w14:val="none"/>
+        </w:rPr>
+        <w:t>Realtime</w:t>
+      </w:r>
+      <w:proofErr w:type="spellEnd"/>
+      <w:r>
+        <w:rPr>
+          <w:rFonts w:eastAsia="Times New Roman" w:cstheme="minorHAnsi"/>
+          <w:color w:val="000000"/>
+          <w:kern w:val="0"/>
+          <w:lang w:eastAsia="it-IT"/>
+          <w14:ligatures w14:val="none"/>
+        </w:rPr>
+        <w:t xml:space="preserve"> Database) e chiavi di accesso nella classe apposita</w:t>
+      </w:r>
+    </w:p>
+    <w:p>
+      <w:pPr>
+        <w:numPr>
+          <w:ilvl w:val="1"/>
+          <w:numId w:val="1"/>
+        </w:numPr>
+        <w:spacing w:after="0" w:line="240" w:lineRule="auto"/>
+        <w:textAlignment w:val="baseline"/>
+        <w:rPr>
+          <w:rFonts w:eastAsia="Times New Roman" w:cstheme="minorHAnsi"/>
+          <w:color w:val="000000"/>
+          <w:kern w:val="0"/>
+          <w:lang w:eastAsia="it-IT"/>
+          <w14:ligatures w14:val="none"/>
+        </w:rPr>
+      </w:pPr>
+      <w:r>
+        <w:rPr>
+          <w:rFonts w:eastAsia="Times New Roman" w:cstheme="minorHAnsi"/>
+          <w:color w:val="000000"/>
+          <w:kern w:val="0"/>
+          <w:lang w:eastAsia="it-IT"/>
+          <w14:ligatures w14:val="none"/>
+        </w:rPr>
+        <w:t>Creazione prima classe Application per verificare funzionamento</w:t>
+      </w:r>
+    </w:p>
+    <w:p>
+      <w:pPr>
+        <w:spacing w:after="0" w:line="240" w:lineRule="auto"/>
+        <w:ind w:left="1440"/>
+        <w:textAlignment w:val="baseline"/>
+        <w:rPr>
+          <w:rFonts w:eastAsia="Times New Roman" w:cstheme="minorHAnsi"/>
+          <w:color w:val="000000"/>
+          <w:kern w:val="0"/>
+          <w:lang w:eastAsia="it-IT"/>
+          <w14:ligatures w14:val="none"/>
+        </w:rPr>
+      </w:pPr>
+    </w:p>
+    <w:p>
+      <w:pPr>
+        <w:spacing w:after="0" w:line="240" w:lineRule="auto"/>
+        <w:textAlignment w:val="baseline"/>
+        <w:rPr>
+          <w:rFonts w:eastAsia="Times New Roman" w:cstheme="minorHAnsi"/>
+          <w:color w:val="000000"/>
+          <w:kern w:val="0"/>
+          <w:lang w:eastAsia="it-IT"/>
+          <w14:ligatures w14:val="none"/>
+        </w:rPr>
+      </w:pPr>
+      <w:r>
+        <w:rPr>
+          <w:rFonts w:eastAsia="Times New Roman" w:cstheme="minorHAnsi"/>
+          <w:color w:val="000000"/>
+          <w:kern w:val="0"/>
+          <w:lang w:eastAsia="it-IT"/>
+          <w14:ligatures w14:val="none"/>
+        </w:rPr>
+        <w:t xml:space="preserve">2- </w:t>
+      </w:r>
+      <w:r>
+        <w:rPr>
+          <w:rFonts w:eastAsia="Times New Roman" w:cstheme="minorHAnsi"/>
+          <w:i/>
+          <w:iCs/>
+          <w:color w:val="000000"/>
+          <w:kern w:val="0"/>
+          <w:lang w:eastAsia="it-IT"/>
+          <w14:ligatures w14:val="none"/>
+        </w:rPr>
+        <w:t>Gestione Utente</w:t>
+      </w:r>
+    </w:p>
+    <w:p>
+      <w:pPr>
+        <w:numPr>
+          <w:ilvl w:val="1"/>
+          <w:numId w:val="1"/>
+        </w:numPr>
+        <w:spacing w:after="0" w:line="240" w:lineRule="auto"/>
+        <w:textAlignment w:val="baseline"/>
+        <w:rPr>
+          <w:rFonts w:eastAsia="Times New Roman" w:cstheme="minorHAnsi"/>
+          <w:color w:val="000000"/>
+          <w:kern w:val="0"/>
+          <w:lang w:eastAsia="it-IT"/>
+          <w14:ligatures w14:val="none"/>
+        </w:rPr>
+      </w:pPr>
+      <w:r>
+        <w:rPr>
+          <w:rFonts w:eastAsia="Times New Roman" w:cstheme="minorHAnsi"/>
+          <w:color w:val="000000"/>
+          <w:kern w:val="0"/>
+          <w:lang w:eastAsia="it-IT"/>
+          <w14:ligatures w14:val="none"/>
+        </w:rPr>
+        <w:t>Implementazione viste di registrazione e login</w:t>
+      </w:r>
+    </w:p>
+    <w:p>
+      <w:pPr>
+        <w:numPr>
+          <w:ilvl w:val="1"/>
+          <w:numId w:val="1"/>
+        </w:numPr>
+        <w:spacing w:after="0" w:line="240" w:lineRule="auto"/>
+        <w:textAlignment w:val="baseline"/>
+        <w:rPr>
+          <w:rFonts w:eastAsia="Times New Roman" w:cstheme="minorHAnsi"/>
+          <w:color w:val="000000"/>
+          <w:kern w:val="0"/>
+          <w:lang w:eastAsia="it-IT"/>
+          <w14:ligatures w14:val="none"/>
+        </w:rPr>
+      </w:pPr>
+      <w:r>
+        <w:rPr>
+          <w:rFonts w:eastAsia="Times New Roman" w:cstheme="minorHAnsi"/>
+          <w:color w:val="000000"/>
+          <w:kern w:val="0"/>
+          <w:lang w:eastAsia="it-IT"/>
+          <w14:ligatures w14:val="none"/>
+        </w:rPr>
+        <w:t>Creazione collegamento tra la pagina di login e la pagina principale (poi da implementare)</w:t>
+      </w:r>
+    </w:p>
+    <w:p>
+      <w:pPr>
+        <w:numPr>
+          <w:ilvl w:val="1"/>
+          <w:numId w:val="1"/>
+        </w:numPr>
+        <w:spacing w:after="0" w:line="240" w:lineRule="auto"/>
+        <w:textAlignment w:val="baseline"/>
+        <w:rPr>
+          <w:rFonts w:eastAsia="Times New Roman" w:cstheme="minorHAnsi"/>
+          <w:color w:val="000000"/>
+          <w:kern w:val="0"/>
+          <w:lang w:eastAsia="it-IT"/>
+          <w14:ligatures w14:val="none"/>
+        </w:rPr>
+      </w:pPr>
+      <w:r>
+        <w:rPr>
+          <w:rFonts w:eastAsia="Times New Roman" w:cstheme="minorHAnsi"/>
+          <w:color w:val="000000"/>
+          <w:kern w:val="0"/>
+          <w:lang w:eastAsia="it-IT"/>
+          <w14:ligatures w14:val="none"/>
+        </w:rPr>
+        <w:t>Implementazione del database nelle pagine, salvataggio utenti e controllo username già esistente</w:t>
+      </w:r>
+    </w:p>
+    <w:p>
+      <w:pPr>
+        <w:numPr>
+          <w:ilvl w:val="1"/>
+          <w:numId w:val="1"/>
+        </w:numPr>
+        <w:spacing w:after="0" w:line="240" w:lineRule="auto"/>
+        <w:textAlignment w:val="baseline"/>
+        <w:rPr>
+          <w:rFonts w:eastAsia="Times New Roman" w:cstheme="minorHAnsi"/>
+          <w:color w:val="000000"/>
+          <w:kern w:val="0"/>
+          <w:lang w:eastAsia="it-IT"/>
+          <w14:ligatures w14:val="none"/>
+        </w:rPr>
+      </w:pPr>
+      <w:r>
+        <w:rPr>
+          <w:rFonts w:eastAsia="Times New Roman" w:cstheme="minorHAnsi"/>
+          <w:color w:val="000000"/>
+          <w:kern w:val="0"/>
+          <w:lang w:eastAsia="it-IT"/>
+          <w14:ligatures w14:val="none"/>
+        </w:rPr>
+        <w:t>Controlli su campi vuoti, mail non valide, password verificate (inserimento doppio della password per verifica)</w:t>
+      </w:r>
+    </w:p>
+    <w:p>
+      <w:pPr>
+        <w:spacing w:after="0" w:line="240" w:lineRule="auto"/>
+        <w:ind w:left="1440"/>
+        <w:textAlignment w:val="baseline"/>
+        <w:rPr>
+          <w:rFonts w:eastAsia="Times New Roman" w:cstheme="minorHAnsi"/>
+          <w:color w:val="000000"/>
+          <w:kern w:val="0"/>
+          <w:lang w:eastAsia="it-IT"/>
+          <w14:ligatures w14:val="none"/>
+        </w:rPr>
+      </w:pPr>
+    </w:p>
+    <w:p>
+      <w:pPr>
+        <w:spacing w:after="0" w:line="240" w:lineRule="auto"/>
+        <w:textAlignment w:val="baseline"/>
+        <w:rPr>
+          <w:rFonts w:eastAsia="Times New Roman" w:cstheme="minorHAnsi"/>
+          <w:color w:val="000000"/>
+          <w:kern w:val="0"/>
+          <w:lang w:eastAsia="it-IT"/>
+          <w14:ligatures w14:val="none"/>
+        </w:rPr>
+      </w:pPr>
+      <w:r>
+        <w:rPr>
+          <w:rFonts w:eastAsia="Times New Roman" w:cstheme="minorHAnsi"/>
+          <w:color w:val="000000"/>
+          <w:kern w:val="0"/>
+          <w:lang w:eastAsia="it-IT"/>
+          <w14:ligatures w14:val="none"/>
+        </w:rPr>
+        <w:t xml:space="preserve">3- </w:t>
+      </w:r>
+      <w:r>
+        <w:rPr>
+          <w:rFonts w:eastAsia="Times New Roman" w:cstheme="minorHAnsi"/>
+          <w:i/>
+          <w:iCs/>
+          <w:color w:val="000000"/>
+          <w:kern w:val="0"/>
+          <w:lang w:eastAsia="it-IT"/>
+          <w14:ligatures w14:val="none"/>
+        </w:rPr>
+        <w:t>Mappa e Visualizzazione Colonnine:</w:t>
+      </w:r>
+    </w:p>
+    <w:p>
+      <w:pPr>
+        <w:numPr>
+          <w:ilvl w:val="1"/>
+          <w:numId w:val="1"/>
+        </w:numPr>
+        <w:spacing w:after="0" w:line="240" w:lineRule="auto"/>
+        <w:textAlignment w:val="baseline"/>
+        <w:rPr>
+          <w:rFonts w:eastAsia="Times New Roman" w:cstheme="minorHAnsi"/>
+          <w:color w:val="000000"/>
+          <w:kern w:val="0"/>
+          <w:lang w:eastAsia="it-IT"/>
+          <w14:ligatures w14:val="none"/>
+        </w:rPr>
+      </w:pPr>
+      <w:r>
+        <w:rPr>
+          <w:rFonts w:eastAsia="Times New Roman" w:cstheme="minorHAnsi"/>
+          <w:color w:val="000000"/>
+          <w:kern w:val="0"/>
+          <w:lang w:eastAsia="it-IT"/>
+          <w14:ligatures w14:val="none"/>
+        </w:rPr>
+        <w:t xml:space="preserve">Implementazione delle dipendenze necessarie per utilizzare </w:t>
+      </w:r>
+      <w:proofErr w:type="spellStart"/>
+      <w:r>
+        <w:rPr>
+          <w:rFonts w:eastAsia="Times New Roman" w:cstheme="minorHAnsi"/>
+          <w:color w:val="000000"/>
+          <w:kern w:val="0"/>
+          <w:lang w:eastAsia="it-IT"/>
+          <w14:ligatures w14:val="none"/>
+        </w:rPr>
+        <w:t>Leaflet</w:t>
+      </w:r>
+      <w:proofErr w:type="spellEnd"/>
+    </w:p>
+    <w:p>
+      <w:pPr>
+        <w:numPr>
+          <w:ilvl w:val="1"/>
+          <w:numId w:val="1"/>
+        </w:numPr>
+        <w:spacing w:after="0" w:line="240" w:lineRule="auto"/>
+        <w:textAlignment w:val="baseline"/>
+        <w:rPr>
+          <w:rFonts w:eastAsia="Times New Roman" w:cstheme="minorHAnsi"/>
+          <w:color w:val="000000"/>
+          <w:kern w:val="0"/>
+          <w:lang w:eastAsia="it-IT"/>
+          <w14:ligatures w14:val="none"/>
+        </w:rPr>
+      </w:pPr>
+      <w:r>
+        <w:rPr>
+          <w:rFonts w:eastAsia="Times New Roman" w:cstheme="minorHAnsi"/>
+          <w:color w:val="000000"/>
+          <w:kern w:val="0"/>
+          <w:lang w:eastAsia="it-IT"/>
+          <w14:ligatures w14:val="none"/>
+        </w:rPr>
+        <w:t>Implementazione della pagina principale con mappa e menu laterale</w:t>
+      </w:r>
+    </w:p>
+    <w:p>
+      <w:pPr>
+        <w:numPr>
+          <w:ilvl w:val="1"/>
+          <w:numId w:val="1"/>
+        </w:numPr>
+        <w:spacing w:after="0" w:line="240" w:lineRule="auto"/>
+        <w:textAlignment w:val="baseline"/>
+        <w:rPr>
+          <w:rFonts w:eastAsia="Times New Roman" w:cstheme="minorHAnsi"/>
+          <w:color w:val="000000"/>
+          <w:kern w:val="0"/>
+          <w:lang w:eastAsia="it-IT"/>
+          <w14:ligatures w14:val="none"/>
+        </w:rPr>
+      </w:pPr>
+      <w:r>
+        <w:rPr>
+          <w:rFonts w:eastAsia="Times New Roman" w:cstheme="minorHAnsi"/>
+          <w:color w:val="000000"/>
+          <w:kern w:val="0"/>
+          <w:lang w:eastAsia="it-IT"/>
+          <w14:ligatures w14:val="none"/>
+        </w:rPr>
+        <w:t xml:space="preserve">Caricamento dei marker delle colonnine da </w:t>
+      </w:r>
+      <w:proofErr w:type="spellStart"/>
+      <w:r>
+        <w:rPr>
+          <w:rFonts w:eastAsia="Times New Roman" w:cstheme="minorHAnsi"/>
+          <w:color w:val="000000"/>
+          <w:kern w:val="0"/>
+          <w:lang w:eastAsia="it-IT"/>
+          <w14:ligatures w14:val="none"/>
+        </w:rPr>
+        <w:t>Firebase</w:t>
+      </w:r>
+      <w:proofErr w:type="spellEnd"/>
+      <w:r>
+        <w:rPr>
+          <w:rFonts w:eastAsia="Times New Roman" w:cstheme="minorHAnsi"/>
+          <w:color w:val="000000"/>
+          <w:kern w:val="0"/>
+          <w:lang w:eastAsia="it-IT"/>
+          <w14:ligatures w14:val="none"/>
+        </w:rPr>
+        <w:t xml:space="preserve"> sulla mappa </w:t>
+      </w:r>
+      <w:proofErr w:type="spellStart"/>
+      <w:r>
+        <w:rPr>
+          <w:rFonts w:eastAsia="Times New Roman" w:cstheme="minorHAnsi"/>
+          <w:color w:val="000000"/>
+          <w:kern w:val="0"/>
+          <w:lang w:eastAsia="it-IT"/>
+          <w14:ligatures w14:val="none"/>
+        </w:rPr>
+        <w:t>Leaflet</w:t>
+      </w:r>
+      <w:proofErr w:type="spellEnd"/>
+      <w:r>
+        <w:rPr>
+          <w:rFonts w:eastAsia="Times New Roman" w:cstheme="minorHAnsi"/>
+          <w:color w:val="000000"/>
+          <w:kern w:val="0"/>
+          <w:lang w:eastAsia="it-IT"/>
+          <w14:ligatures w14:val="none"/>
+        </w:rPr>
+        <w:t>, con coordinate</w:t>
+      </w:r>
+    </w:p>
+    <w:p>
+      <w:pPr>
+        <w:numPr>
+          <w:ilvl w:val="1"/>
+          <w:numId w:val="1"/>
+        </w:numPr>
+        <w:spacing w:after="0" w:line="240" w:lineRule="auto"/>
+        <w:textAlignment w:val="baseline"/>
+        <w:rPr>
+          <w:rFonts w:eastAsia="Times New Roman" w:cstheme="minorHAnsi"/>
+          <w:color w:val="000000"/>
+          <w:kern w:val="0"/>
+          <w:lang w:eastAsia="it-IT"/>
+          <w14:ligatures w14:val="none"/>
+        </w:rPr>
+      </w:pPr>
+      <w:r>
+        <w:rPr>
+          <w:rFonts w:eastAsia="Times New Roman" w:cstheme="minorHAnsi"/>
+          <w:color w:val="000000"/>
+          <w:kern w:val="0"/>
+          <w:lang w:eastAsia="it-IT"/>
+          <w14:ligatures w14:val="none"/>
+        </w:rPr>
+        <w:t>Implementazione barra di ricerca e filtri (tipo, nome, posizione) per ricerca colonnine</w:t>
+      </w:r>
+    </w:p>
+    <w:p>
+      <w:pPr>
+        <w:numPr>
+          <w:ilvl w:val="1"/>
+          <w:numId w:val="1"/>
+        </w:numPr>
+        <w:spacing w:after="0" w:line="240" w:lineRule="auto"/>
+        <w:textAlignment w:val="baseline"/>
+        <w:rPr>
+          <w:rFonts w:eastAsia="Times New Roman" w:cstheme="minorHAnsi"/>
+          <w:color w:val="000000"/>
+          <w:kern w:val="0"/>
+          <w:lang w:eastAsia="it-IT"/>
+          <w14:ligatures w14:val="none"/>
+        </w:rPr>
+      </w:pPr>
+      <w:r>
+        <w:rPr>
+          <w:rFonts w:eastAsia="Times New Roman" w:cstheme="minorHAnsi"/>
+          <w:color w:val="000000"/>
+          <w:kern w:val="0"/>
+          <w:lang w:eastAsia="it-IT"/>
+          <w14:ligatures w14:val="none"/>
+        </w:rPr>
+        <w:t xml:space="preserve">Visualizzazione </w:t>
+      </w:r>
+      <w:proofErr w:type="spellStart"/>
+      <w:r>
+        <w:rPr>
+          <w:rFonts w:eastAsia="Times New Roman" w:cstheme="minorHAnsi"/>
+          <w:color w:val="000000"/>
+          <w:kern w:val="0"/>
+          <w:lang w:eastAsia="it-IT"/>
+          <w14:ligatures w14:val="none"/>
+        </w:rPr>
+        <w:t>sidebar</w:t>
+      </w:r>
+      <w:proofErr w:type="spellEnd"/>
+      <w:r>
+        <w:rPr>
+          <w:rFonts w:eastAsia="Times New Roman" w:cstheme="minorHAnsi"/>
+          <w:color w:val="000000"/>
+          <w:kern w:val="0"/>
+          <w:lang w:eastAsia="it-IT"/>
+          <w14:ligatures w14:val="none"/>
+        </w:rPr>
+        <w:t xml:space="preserve"> con dettagli colonnina al click sul marker con al suo interno tasto prenota, recensioni e segnalazioni</w:t>
+      </w:r>
+    </w:p>
+    <w:p>
+      <w:pPr>
+        <w:numPr>
+          <w:ilvl w:val="1"/>
+          <w:numId w:val="1"/>
+        </w:numPr>
+        <w:spacing w:after="0" w:line="240" w:lineRule="auto"/>
+        <w:textAlignment w:val="baseline"/>
+        <w:rPr>
+          <w:rFonts w:eastAsia="Times New Roman" w:cstheme="minorHAnsi"/>
+          <w:color w:val="000000"/>
+          <w:kern w:val="0"/>
+          <w:lang w:eastAsia="it-IT"/>
+          <w14:ligatures w14:val="none"/>
+        </w:rPr>
+      </w:pPr>
+      <w:r>
+        <w:rPr>
+          <w:rFonts w:eastAsia="Times New Roman" w:cstheme="minorHAnsi"/>
+          <w:color w:val="000000"/>
+          <w:kern w:val="0"/>
+          <w:lang w:eastAsia="it-IT"/>
+          <w14:ligatures w14:val="none"/>
+        </w:rPr>
+        <w:t>Aggiunta barra laterale con pagine dedicate (utente, colonnine…) e tasto logout</w:t>
+      </w:r>
+    </w:p>
+    <w:p>
+      <w:pPr>
+        <w:spacing w:after="0" w:line="240" w:lineRule="auto"/>
+        <w:ind w:left="1440"/>
+        <w:textAlignment w:val="baseline"/>
+        <w:rPr>
+          <w:rFonts w:eastAsia="Times New Roman" w:cstheme="minorHAnsi"/>
+          <w:color w:val="000000"/>
+          <w:kern w:val="0"/>
+          <w:lang w:eastAsia="it-IT"/>
+          <w14:ligatures w14:val="none"/>
+        </w:rPr>
+      </w:pPr>
+    </w:p>
+    <w:p>
+      <w:pPr>
+        <w:spacing w:after="0" w:line="240" w:lineRule="auto"/>
+        <w:textAlignment w:val="baseline"/>
+        <w:rPr>
+          <w:rFonts w:eastAsia="Times New Roman" w:cstheme="minorHAnsi"/>
+          <w:color w:val="000000"/>
+          <w:kern w:val="0"/>
+          <w:lang w:eastAsia="it-IT"/>
+          <w14:ligatures w14:val="none"/>
+        </w:rPr>
+      </w:pPr>
+      <w:r>
+        <w:rPr>
+          <w:rFonts w:eastAsia="Times New Roman" w:cstheme="minorHAnsi"/>
+          <w:color w:val="000000"/>
+          <w:kern w:val="0"/>
+          <w:lang w:eastAsia="it-IT"/>
+          <w14:ligatures w14:val="none"/>
+        </w:rPr>
+        <w:t xml:space="preserve">4- </w:t>
+      </w:r>
+      <w:r>
+        <w:rPr>
+          <w:rFonts w:eastAsia="Times New Roman" w:cstheme="minorHAnsi"/>
+          <w:i/>
+          <w:iCs/>
+          <w:color w:val="000000"/>
+          <w:kern w:val="0"/>
+          <w:lang w:eastAsia="it-IT"/>
+          <w14:ligatures w14:val="none"/>
+        </w:rPr>
+        <w:t>Sistema di Prenotazione:</w:t>
+      </w:r>
+    </w:p>
+    <w:p>
+      <w:pPr>
+        <w:numPr>
+          <w:ilvl w:val="1"/>
+          <w:numId w:val="1"/>
+        </w:numPr>
+        <w:spacing w:after="0" w:line="240" w:lineRule="auto"/>
+        <w:textAlignment w:val="baseline"/>
+        <w:rPr>
+          <w:rFonts w:eastAsia="Times New Roman" w:cstheme="minorHAnsi"/>
+          <w:color w:val="000000"/>
+          <w:kern w:val="0"/>
+          <w:lang w:eastAsia="it-IT"/>
+          <w14:ligatures w14:val="none"/>
+        </w:rPr>
+      </w:pPr>
+      <w:r>
+        <w:rPr>
+          <w:rFonts w:eastAsia="Times New Roman" w:cstheme="minorHAnsi"/>
+          <w:color w:val="000000"/>
+          <w:kern w:val="0"/>
+          <w:lang w:eastAsia="it-IT"/>
+          <w14:ligatures w14:val="none"/>
+        </w:rPr>
+        <w:t xml:space="preserve">Sviluppo interfaccia di selezione data e slot orari con menù a tendina nella </w:t>
+      </w:r>
+      <w:proofErr w:type="spellStart"/>
+      <w:r>
+        <w:rPr>
+          <w:rFonts w:eastAsia="Times New Roman" w:cstheme="minorHAnsi"/>
+          <w:color w:val="000000"/>
+          <w:kern w:val="0"/>
+          <w:lang w:eastAsia="it-IT"/>
+          <w14:ligatures w14:val="none"/>
+        </w:rPr>
+        <w:t>sidebar</w:t>
+      </w:r>
+      <w:proofErr w:type="spellEnd"/>
+      <w:r>
+        <w:rPr>
+          <w:rFonts w:eastAsia="Times New Roman" w:cstheme="minorHAnsi"/>
+          <w:color w:val="000000"/>
+          <w:kern w:val="0"/>
+          <w:lang w:eastAsia="it-IT"/>
+          <w14:ligatures w14:val="none"/>
+        </w:rPr>
+        <w:t xml:space="preserve"> che si visualizza dopo il click sulla colonnina</w:t>
+      </w:r>
+    </w:p>
+    <w:p>
+      <w:pPr>
+        <w:numPr>
+          <w:ilvl w:val="1"/>
+          <w:numId w:val="1"/>
+        </w:numPr>
+        <w:spacing w:after="0" w:line="240" w:lineRule="auto"/>
+        <w:textAlignment w:val="baseline"/>
+        <w:rPr>
+          <w:rFonts w:eastAsia="Times New Roman" w:cstheme="minorHAnsi"/>
+          <w:color w:val="000000"/>
+          <w:kern w:val="0"/>
+          <w:lang w:eastAsia="it-IT"/>
+          <w14:ligatures w14:val="none"/>
+        </w:rPr>
+      </w:pPr>
+      <w:r>
+        <w:rPr>
+          <w:rFonts w:eastAsia="Times New Roman" w:cstheme="minorHAnsi"/>
+          <w:color w:val="000000"/>
+          <w:kern w:val="0"/>
+          <w:lang w:eastAsia="it-IT"/>
+          <w14:ligatures w14:val="none"/>
+        </w:rPr>
+        <w:t xml:space="preserve">Implementazione logica </w:t>
+      </w:r>
+      <w:proofErr w:type="spellStart"/>
+      <w:r>
+        <w:rPr>
+          <w:rFonts w:eastAsia="Times New Roman" w:cstheme="minorHAnsi"/>
+          <w:color w:val="000000"/>
+          <w:kern w:val="0"/>
+          <w:lang w:eastAsia="it-IT"/>
+          <w14:ligatures w14:val="none"/>
+        </w:rPr>
+        <w:t>backend</w:t>
+      </w:r>
+      <w:proofErr w:type="spellEnd"/>
+      <w:r>
+        <w:rPr>
+          <w:rFonts w:eastAsia="Times New Roman" w:cstheme="minorHAnsi"/>
+          <w:color w:val="000000"/>
+          <w:kern w:val="0"/>
+          <w:lang w:eastAsia="it-IT"/>
+          <w14:ligatures w14:val="none"/>
+        </w:rPr>
+        <w:t xml:space="preserve"> per la validazione della prenotazione, gestione </w:t>
+      </w:r>
+      <w:proofErr w:type="spellStart"/>
+      <w:r>
+        <w:rPr>
+          <w:rFonts w:eastAsia="Times New Roman" w:cstheme="minorHAnsi"/>
+          <w:color w:val="000000"/>
+          <w:kern w:val="0"/>
+          <w:lang w:eastAsia="it-IT"/>
+          <w14:ligatures w14:val="none"/>
+        </w:rPr>
+        <w:t>db</w:t>
+      </w:r>
+      <w:proofErr w:type="spellEnd"/>
+      <w:r>
+        <w:rPr>
+          <w:rFonts w:eastAsia="Times New Roman" w:cstheme="minorHAnsi"/>
+          <w:color w:val="000000"/>
+          <w:kern w:val="0"/>
+          <w:lang w:eastAsia="it-IT"/>
+          <w14:ligatures w14:val="none"/>
+        </w:rPr>
+        <w:t xml:space="preserve"> con salvataggio delle prenotazioni e controlli</w:t>
+      </w:r>
+    </w:p>
+    <w:p>
+      <w:pPr>
+        <w:numPr>
+          <w:ilvl w:val="1"/>
+          <w:numId w:val="1"/>
+        </w:numPr>
+        <w:spacing w:after="0" w:line="240" w:lineRule="auto"/>
+        <w:textAlignment w:val="baseline"/>
+        <w:rPr>
+          <w:rFonts w:eastAsia="Times New Roman" w:cstheme="minorHAnsi"/>
+          <w:color w:val="000000"/>
+          <w:kern w:val="0"/>
+          <w:lang w:eastAsia="it-IT"/>
+          <w14:ligatures w14:val="none"/>
+        </w:rPr>
+      </w:pPr>
+      <w:r>
+        <w:rPr>
+          <w:rFonts w:eastAsia="Times New Roman" w:cstheme="minorHAnsi"/>
+          <w:color w:val="000000"/>
+          <w:kern w:val="0"/>
+          <w:lang w:eastAsia="it-IT"/>
+          <w14:ligatures w14:val="none"/>
+        </w:rPr>
+        <w:t>Gestione della concorrenza con controllo nel database di un nodo uguale (colonnina/data/orario)</w:t>
+      </w:r>
+    </w:p>
+    <w:p>
+      <w:pPr>
+        <w:numPr>
+          <w:ilvl w:val="1"/>
+          <w:numId w:val="1"/>
+        </w:numPr>
+        <w:spacing w:after="0" w:line="240" w:lineRule="auto"/>
+        <w:textAlignment w:val="baseline"/>
+        <w:rPr>
+          <w:rFonts w:eastAsia="Times New Roman" w:cstheme="minorHAnsi"/>
+          <w:color w:val="000000"/>
+          <w:kern w:val="0"/>
+          <w:lang w:eastAsia="it-IT"/>
+          <w14:ligatures w14:val="none"/>
+        </w:rPr>
+      </w:pPr>
+      <w:r>
+        <w:rPr>
+          <w:rFonts w:eastAsia="Times New Roman" w:cstheme="minorHAnsi"/>
+          <w:color w:val="000000"/>
+          <w:kern w:val="0"/>
+          <w:lang w:eastAsia="it-IT"/>
+          <w14:ligatures w14:val="none"/>
+        </w:rPr>
+        <w:t xml:space="preserve">Implementazione in </w:t>
+      </w:r>
+      <w:proofErr w:type="spellStart"/>
+      <w:r>
+        <w:rPr>
+          <w:rFonts w:eastAsia="Times New Roman" w:cstheme="minorHAnsi"/>
+          <w:color w:val="000000"/>
+          <w:kern w:val="0"/>
+          <w:lang w:eastAsia="it-IT"/>
+          <w14:ligatures w14:val="none"/>
+        </w:rPr>
+        <w:t>Firebase</w:t>
+      </w:r>
+      <w:proofErr w:type="spellEnd"/>
+      <w:r>
+        <w:rPr>
+          <w:rFonts w:eastAsia="Times New Roman" w:cstheme="minorHAnsi"/>
+          <w:color w:val="000000"/>
+          <w:kern w:val="0"/>
+          <w:lang w:eastAsia="it-IT"/>
+          <w14:ligatures w14:val="none"/>
+        </w:rPr>
+        <w:t xml:space="preserve"> Service di tutti i nodi necessari per corretta gestione DB</w:t>
+      </w:r>
+    </w:p>
+    <w:p>
+      <w:pPr>
+        <w:spacing w:after="0" w:line="240" w:lineRule="auto"/>
+        <w:ind w:left="1440"/>
+        <w:textAlignment w:val="baseline"/>
+        <w:rPr>
+          <w:rFonts w:eastAsia="Times New Roman" w:cstheme="minorHAnsi"/>
+          <w:color w:val="000000"/>
+          <w:kern w:val="0"/>
+          <w:lang w:eastAsia="it-IT"/>
+          <w14:ligatures w14:val="none"/>
+        </w:rPr>
+      </w:pPr>
+    </w:p>
+    <w:p>
+      <w:pPr>
+        <w:spacing w:after="0" w:line="240" w:lineRule="auto"/>
+        <w:textAlignment w:val="baseline"/>
+        <w:rPr>
+          <w:rFonts w:eastAsia="Times New Roman" w:cstheme="minorHAnsi"/>
+          <w:color w:val="000000"/>
+          <w:kern w:val="0"/>
+          <w:lang w:eastAsia="it-IT"/>
+          <w14:ligatures w14:val="none"/>
+        </w:rPr>
+      </w:pPr>
+      <w:r>
+        <w:rPr>
+          <w:rFonts w:eastAsia="Times New Roman" w:cstheme="minorHAnsi"/>
+          <w:color w:val="000000"/>
+          <w:kern w:val="0"/>
+          <w:lang w:eastAsia="it-IT"/>
+          <w14:ligatures w14:val="none"/>
+        </w:rPr>
+        <w:t xml:space="preserve">5- </w:t>
+      </w:r>
+      <w:r>
+        <w:rPr>
+          <w:rFonts w:eastAsia="Times New Roman" w:cstheme="minorHAnsi"/>
+          <w:i/>
+          <w:iCs/>
+          <w:color w:val="000000"/>
+          <w:kern w:val="0"/>
+          <w:lang w:eastAsia="it-IT"/>
+          <w14:ligatures w14:val="none"/>
+        </w:rPr>
+        <w:t>Menu laterale e pagine dedicate</w:t>
+      </w:r>
+    </w:p>
+    <w:p>
+      <w:pPr>
+        <w:numPr>
+          <w:ilvl w:val="1"/>
+          <w:numId w:val="1"/>
+        </w:numPr>
+        <w:spacing w:after="0" w:line="240" w:lineRule="auto"/>
+        <w:textAlignment w:val="baseline"/>
+        <w:rPr>
+          <w:rFonts w:eastAsia="Times New Roman" w:cstheme="minorHAnsi"/>
+          <w:color w:val="000000"/>
+          <w:kern w:val="0"/>
+          <w:lang w:eastAsia="it-IT"/>
+          <w14:ligatures w14:val="none"/>
+        </w:rPr>
+      </w:pPr>
+      <w:r>
+        <w:rPr>
+          <w:rFonts w:eastAsia="Times New Roman" w:cstheme="minorHAnsi"/>
+          <w:color w:val="000000"/>
+          <w:kern w:val="0"/>
+          <w:lang w:eastAsia="it-IT"/>
+          <w14:ligatures w14:val="none"/>
+        </w:rPr>
+        <w:t>Implementazione delle pagine dedicate (utente, colonnine…) nella barra laterale</w:t>
+      </w:r>
+    </w:p>
+    <w:p>
+      <w:pPr>
+        <w:numPr>
+          <w:ilvl w:val="1"/>
+          <w:numId w:val="1"/>
+        </w:numPr>
+        <w:spacing w:after="0" w:line="240" w:lineRule="auto"/>
+        <w:textAlignment w:val="baseline"/>
+        <w:rPr>
+          <w:rFonts w:eastAsia="Times New Roman" w:cstheme="minorHAnsi"/>
+          <w:color w:val="000000"/>
+          <w:kern w:val="0"/>
+          <w:lang w:eastAsia="it-IT"/>
+          <w14:ligatures w14:val="none"/>
+        </w:rPr>
+      </w:pPr>
+      <w:r>
+        <w:rPr>
+          <w:rFonts w:eastAsia="Times New Roman" w:cstheme="minorHAnsi"/>
+          <w:color w:val="000000"/>
+          <w:kern w:val="0"/>
+          <w:lang w:eastAsia="it-IT"/>
+          <w14:ligatures w14:val="none"/>
+        </w:rPr>
+        <w:t>Implementazione parte grafica in queste pagine</w:t>
+      </w:r>
+    </w:p>
+    <w:p>
+      <w:pPr>
+        <w:numPr>
+          <w:ilvl w:val="1"/>
+          <w:numId w:val="1"/>
+        </w:numPr>
+        <w:spacing w:after="0" w:line="240" w:lineRule="auto"/>
+        <w:textAlignment w:val="baseline"/>
+        <w:rPr>
+          <w:rFonts w:eastAsia="Times New Roman" w:cstheme="minorHAnsi"/>
+          <w:color w:val="000000"/>
+          <w:kern w:val="0"/>
+          <w:lang w:eastAsia="it-IT"/>
+          <w14:ligatures w14:val="none"/>
+        </w:rPr>
+      </w:pPr>
+      <w:r>
+        <w:rPr>
+          <w:rFonts w:eastAsia="Times New Roman" w:cstheme="minorHAnsi"/>
+          <w:color w:val="000000"/>
+          <w:kern w:val="0"/>
+          <w:lang w:eastAsia="it-IT"/>
+          <w14:ligatures w14:val="none"/>
+        </w:rPr>
+        <w:t>Implementazione collegamento con Database nella pagina utente per visualizzare tutte le prenotazioni</w:t>
+      </w:r>
+    </w:p>
+    <w:p>
+      <w:pPr>
+        <w:spacing w:after="0" w:line="240" w:lineRule="auto"/>
+        <w:ind w:left="1440"/>
+        <w:textAlignment w:val="baseline"/>
+        <w:rPr>
+          <w:rFonts w:eastAsia="Times New Roman" w:cstheme="minorHAnsi"/>
+          <w:color w:val="000000"/>
+          <w:kern w:val="0"/>
+          <w:lang w:eastAsia="it-IT"/>
+          <w14:ligatures w14:val="none"/>
+        </w:rPr>
+      </w:pPr>
+    </w:p>
+    <w:p>
+      <w:pPr>
+        <w:spacing w:after="0" w:line="240" w:lineRule="auto"/>
+        <w:textAlignment w:val="baseline"/>
+        <w:rPr>
+          <w:rFonts w:eastAsia="Times New Roman" w:cstheme="minorHAnsi"/>
+          <w:i/>
+          <w:iCs/>
+          <w:color w:val="000000"/>
+          <w:kern w:val="0"/>
+          <w:lang w:eastAsia="it-IT"/>
+          <w14:ligatures w14:val="none"/>
+        </w:rPr>
+      </w:pPr>
+      <w:r>
+        <w:rPr>
+          <w:rFonts w:eastAsia="Times New Roman" w:cstheme="minorHAnsi"/>
+          <w:color w:val="000000"/>
+          <w:kern w:val="0"/>
+          <w:lang w:eastAsia="it-IT"/>
+          <w14:ligatures w14:val="none"/>
+        </w:rPr>
+        <w:t>6</w:t>
+      </w:r>
+      <w:r>
+        <w:rPr>
+          <w:rFonts w:eastAsia="Times New Roman" w:cstheme="minorHAnsi"/>
+          <w:color w:val="000000"/>
+          <w:kern w:val="0"/>
+          <w:lang w:eastAsia="it-IT"/>
+          <w14:ligatures w14:val="none"/>
+        </w:rPr>
+        <w:t xml:space="preserve">- </w:t>
+      </w:r>
+      <w:r>
+        <w:rPr>
+          <w:rFonts w:eastAsia="Times New Roman" w:cstheme="minorHAnsi"/>
+          <w:i/>
+          <w:iCs/>
+          <w:color w:val="000000"/>
+          <w:kern w:val="0"/>
+          <w:lang w:eastAsia="it-IT"/>
+          <w14:ligatures w14:val="none"/>
+        </w:rPr>
+        <w:t>Generazione e Gestione QR Code:</w:t>
+      </w:r>
+    </w:p>
+    <w:p>
+      <w:pPr>
+        <w:numPr>
+          <w:ilvl w:val="1"/>
+          <w:numId w:val="1"/>
+        </w:numPr>
+        <w:spacing w:after="0" w:line="240" w:lineRule="auto"/>
+        <w:textAlignment w:val="baseline"/>
+        <w:rPr>
+          <w:rFonts w:eastAsia="Times New Roman" w:cstheme="minorHAnsi"/>
+          <w:color w:val="000000"/>
+          <w:kern w:val="0"/>
+          <w:lang w:eastAsia="it-IT"/>
+          <w14:ligatures w14:val="none"/>
+        </w:rPr>
+      </w:pPr>
+      <w:r>
+        <w:rPr>
+          <w:rFonts w:eastAsia="Times New Roman" w:cstheme="minorHAnsi"/>
+          <w:color w:val="000000"/>
+          <w:kern w:val="0"/>
+          <w:lang w:eastAsia="it-IT"/>
+          <w14:ligatures w14:val="none"/>
+        </w:rPr>
+        <w:t>Implementazione dipendenza per la generazione del QR code univoco basato sulla stringa assegnata alla prenotazione </w:t>
+      </w:r>
+    </w:p>
+    <w:p>
+      <w:pPr>
+        <w:numPr>
+          <w:ilvl w:val="1"/>
+          <w:numId w:val="1"/>
+        </w:numPr>
+        <w:spacing w:after="0" w:line="240" w:lineRule="auto"/>
+        <w:textAlignment w:val="baseline"/>
+        <w:rPr>
+          <w:rFonts w:eastAsia="Times New Roman" w:cstheme="minorHAnsi"/>
+          <w:color w:val="000000"/>
+          <w:kern w:val="0"/>
+          <w:lang w:eastAsia="it-IT"/>
+          <w14:ligatures w14:val="none"/>
+        </w:rPr>
+      </w:pPr>
+      <w:r>
+        <w:rPr>
+          <w:rFonts w:eastAsia="Times New Roman" w:cstheme="minorHAnsi"/>
+          <w:color w:val="000000"/>
+          <w:kern w:val="0"/>
+          <w:lang w:eastAsia="it-IT"/>
+          <w14:ligatures w14:val="none"/>
+        </w:rPr>
+        <w:t>Salvataggio del QR code nel database, utilizzabile poi nella pagina utente</w:t>
+      </w:r>
+    </w:p>
+    <w:p>
+      <w:pPr>
+        <w:spacing w:after="0" w:line="240" w:lineRule="auto"/>
+        <w:ind w:left="1440"/>
+        <w:textAlignment w:val="baseline"/>
+        <w:rPr>
+          <w:rFonts w:eastAsia="Times New Roman" w:cstheme="minorHAnsi"/>
+          <w:color w:val="000000"/>
+          <w:kern w:val="0"/>
+          <w:lang w:eastAsia="it-IT"/>
+          <w14:ligatures w14:val="none"/>
+        </w:rPr>
+      </w:pPr>
+    </w:p>
+    <w:p>
+      <w:pPr>
+        <w:spacing w:after="0" w:line="240" w:lineRule="auto"/>
+        <w:textAlignment w:val="baseline"/>
+        <w:rPr>
+          <w:rFonts w:eastAsia="Times New Roman" w:cstheme="minorHAnsi"/>
+          <w:color w:val="000000"/>
+          <w:kern w:val="0"/>
+          <w:lang w:eastAsia="it-IT"/>
+          <w14:ligatures w14:val="none"/>
+        </w:rPr>
+      </w:pPr>
+      <w:r>
+        <w:rPr>
+          <w:rFonts w:eastAsia="Times New Roman" w:cstheme="minorHAnsi"/>
+          <w:color w:val="000000"/>
+          <w:kern w:val="0"/>
+          <w:lang w:eastAsia="it-IT"/>
+          <w14:ligatures w14:val="none"/>
+        </w:rPr>
+        <w:t>7</w:t>
+      </w:r>
+      <w:r>
+        <w:rPr>
+          <w:rFonts w:eastAsia="Times New Roman" w:cstheme="minorHAnsi"/>
+          <w:color w:val="000000"/>
+          <w:kern w:val="0"/>
+          <w:lang w:eastAsia="it-IT"/>
+          <w14:ligatures w14:val="none"/>
+        </w:rPr>
+        <w:t>-</w:t>
+      </w:r>
+      <w:r>
+        <w:rPr>
+          <w:rFonts w:eastAsia="Times New Roman" w:cstheme="minorHAnsi"/>
+          <w:color w:val="000000"/>
+          <w:kern w:val="0"/>
+          <w:lang w:eastAsia="it-IT"/>
+          <w14:ligatures w14:val="none"/>
+        </w:rPr>
+        <w:t xml:space="preserve"> </w:t>
+      </w:r>
+      <w:r>
+        <w:rPr>
+          <w:rFonts w:eastAsia="Times New Roman" w:cstheme="minorHAnsi"/>
+          <w:i/>
+          <w:iCs/>
+          <w:color w:val="000000"/>
+          <w:kern w:val="0"/>
+          <w:lang w:eastAsia="it-IT"/>
+          <w14:ligatures w14:val="none"/>
+        </w:rPr>
+        <w:t>Fase di testing</w:t>
+      </w:r>
+    </w:p>
+    <w:p>
+      <w:pPr>
+        <w:numPr>
+          <w:ilvl w:val="1"/>
+          <w:numId w:val="1"/>
+        </w:numPr>
+        <w:spacing w:after="0" w:line="240" w:lineRule="auto"/>
+        <w:textAlignment w:val="baseline"/>
+        <w:rPr>
+          <w:rFonts w:eastAsia="Times New Roman" w:cstheme="minorHAnsi"/>
+          <w:color w:val="000000"/>
+          <w:kern w:val="0"/>
+          <w:lang w:eastAsia="it-IT"/>
+          <w14:ligatures w14:val="none"/>
+        </w:rPr>
+      </w:pPr>
+      <w:r>
+        <w:rPr>
+          <w:rFonts w:eastAsia="Times New Roman" w:cstheme="minorHAnsi"/>
+          <w:color w:val="000000"/>
+          <w:kern w:val="0"/>
+          <w:lang w:eastAsia="it-IT"/>
+          <w14:ligatures w14:val="none"/>
+        </w:rPr>
+        <w:t>Testing</w:t>
+      </w:r>
+    </w:p>
+    <w:p>
+      <w:pPr>
+        <w:numPr>
+          <w:ilvl w:val="1"/>
+          <w:numId w:val="1"/>
+        </w:numPr>
+        <w:spacing w:after="0" w:line="240" w:lineRule="auto"/>
+        <w:textAlignment w:val="baseline"/>
+        <w:rPr>
+          <w:rFonts w:eastAsia="Times New Roman" w:cstheme="minorHAnsi"/>
+          <w:color w:val="000000"/>
+          <w:kern w:val="0"/>
+          <w:lang w:eastAsia="it-IT"/>
+          <w14:ligatures w14:val="none"/>
+        </w:rPr>
+      </w:pPr>
+      <w:r>
+        <w:rPr>
+          <w:rFonts w:eastAsia="Times New Roman" w:cstheme="minorHAnsi"/>
+          <w:color w:val="000000"/>
+          <w:kern w:val="0"/>
+          <w:lang w:eastAsia="it-IT"/>
+          <w14:ligatures w14:val="none"/>
+        </w:rPr>
+        <w:t>Aggiunte/modifiche JS e CSS per interfaccia e parte grafica</w:t>
+      </w:r>
+    </w:p>
+    <w:p>
+      <w:pPr>
+        <w:spacing w:after="0" w:line="240" w:lineRule="auto"/>
+        <w:ind w:left="1440"/>
+        <w:textAlignment w:val="baseline"/>
+        <w:rPr>
+          <w:rFonts w:eastAsia="Times New Roman" w:cstheme="minorHAnsi"/>
+          <w:color w:val="000000"/>
+          <w:kern w:val="0"/>
+          <w:lang w:eastAsia="it-IT"/>
+          <w14:ligatures w14:val="none"/>
+        </w:rPr>
+      </w:pPr>
+    </w:p>
+    <w:p>
+      <w:pPr>
+        <w:spacing w:after="0" w:line="240" w:lineRule="auto"/>
+        <w:textAlignment w:val="baseline"/>
+        <w:rPr>
+          <w:rFonts w:eastAsia="Times New Roman" w:cstheme="minorHAnsi"/>
+          <w:color w:val="000000"/>
+          <w:kern w:val="0"/>
+          <w:lang w:eastAsia="it-IT"/>
+          <w14:ligatures w14:val="none"/>
+        </w:rPr>
+      </w:pPr>
+    </w:p>
+    <w:p>
+      <w:pPr>
+        <w:spacing w:after="0" w:line="240" w:lineRule="auto"/>
+        <w:textAlignment w:val="baseline"/>
+        <w:rPr>
+          <w:rFonts w:eastAsia="Times New Roman" w:cstheme="minorHAnsi"/>
+          <w:i/>
+          <w:iCs/>
+          <w:color w:val="000000"/>
+          <w:kern w:val="0"/>
+          <w:lang w:eastAsia="it-IT"/>
+          <w14:ligatures w14:val="none"/>
+        </w:rPr>
+      </w:pPr>
+      <w:r>
+        <w:rPr>
+          <w:rFonts w:eastAsia="Times New Roman" w:cstheme="minorHAnsi"/>
+          <w:color w:val="000000"/>
+          <w:kern w:val="0"/>
+          <w:lang w:eastAsia="it-IT"/>
+          <w14:ligatures w14:val="none"/>
+        </w:rPr>
+        <w:lastRenderedPageBreak/>
+        <w:t xml:space="preserve">8- </w:t>
+      </w:r>
+      <w:r>
+        <w:rPr>
+          <w:rFonts w:eastAsia="Times New Roman" w:cstheme="minorHAnsi"/>
+          <w:i/>
+          <w:iCs/>
+          <w:color w:val="000000"/>
+          <w:kern w:val="0"/>
+          <w:lang w:eastAsia="it-IT"/>
+          <w14:ligatures w14:val="none"/>
+        </w:rPr>
+        <w:t>Modifiche e aggiunte finali</w:t>
+      </w:r>
+    </w:p>
+    <w:p>
+      <w:pPr>
+        <w:numPr>
+          <w:ilvl w:val="1"/>
+          <w:numId w:val="1"/>
+        </w:numPr>
+        <w:spacing w:after="0" w:line="240" w:lineRule="auto"/>
+        <w:textAlignment w:val="baseline"/>
+        <w:rPr>
+          <w:rFonts w:eastAsia="Times New Roman" w:cstheme="minorHAnsi"/>
+          <w:color w:val="000000"/>
+          <w:kern w:val="0"/>
+          <w:lang w:eastAsia="it-IT"/>
+          <w14:ligatures w14:val="none"/>
+        </w:rPr>
+      </w:pPr>
+      <w:r>
+        <w:rPr>
+          <w:rFonts w:eastAsia="Times New Roman" w:cstheme="minorHAnsi"/>
+          <w:color w:val="000000"/>
+          <w:kern w:val="0"/>
+          <w:lang w:eastAsia="it-IT"/>
+          <w14:ligatures w14:val="none"/>
+        </w:rPr>
+        <w:t>Implementazione di funzionalità extra</w:t>
+      </w:r>
+      <w:r>
+        <w:rPr>
+          <w:rFonts w:eastAsia="Times New Roman" w:cstheme="minorHAnsi"/>
+          <w:color w:val="000000"/>
+          <w:kern w:val="0"/>
+          <w:lang w:eastAsia="it-IT"/>
+          <w14:ligatures w14:val="none"/>
+        </w:rPr>
+        <w:t xml:space="preserve"> (notifiche, segnalazioni, recensioni…)</w:t>
+      </w:r>
+    </w:p>
+    <w:p>
+      <w:pPr>
+        <w:numPr>
+          <w:ilvl w:val="1"/>
+          <w:numId w:val="1"/>
+        </w:numPr>
+        <w:spacing w:after="0" w:line="240" w:lineRule="auto"/>
+        <w:textAlignment w:val="baseline"/>
+        <w:rPr>
+          <w:rFonts w:eastAsia="Times New Roman" w:cstheme="minorHAnsi"/>
+          <w:color w:val="000000"/>
+          <w:kern w:val="0"/>
+          <w:lang w:eastAsia="it-IT"/>
+          <w14:ligatures w14:val="none"/>
+        </w:rPr>
+      </w:pPr>
+      <w:r>
+        <w:rPr>
+          <w:rFonts w:eastAsia="Times New Roman" w:cstheme="minorHAnsi"/>
+          <w:color w:val="000000"/>
+          <w:kern w:val="0"/>
+          <w:lang w:eastAsia="it-IT"/>
+          <w14:ligatures w14:val="none"/>
+        </w:rPr>
+        <w:t>Modifiche grafiche per interfaccia più user-friendly</w:t>
+      </w:r>
+    </w:p>
+    <w:p/>
+    <w:p/>
+    <w:p/>
+    <w:p/>
+    <w:p/>
+    <w:p/>
+    <w:p/>
+    <w:p/>
+    <w:p/>
+    <w:p/>
+    <w:p/>
+    <w:p/>
+    <w:p/>
+    <w:p/>
+    <w:p/>
+    <w:p/>
+    <w:p/>
+    <w:p/>
+    <w:p/>
+    <w:p/>
+    <w:p/>
+    <w:p/>
+    <w:p/>
+    <w:p/>
+    <w:p/>
+    <w:p/>
+    <w:p/>
+    <w:p/>
+    <w:p/>
+    <w:p>
+      <w:pPr>
+        <w:rPr>
+          <w:b/>
+          <w:bCs/>
+          <w:sz w:val="28"/>
+          <w:szCs w:val="28"/>
+        </w:rPr>
+      </w:pPr>
+    </w:p>
+    <w:p>
+      <w:pPr>
+        <w:rPr>
+          <w:b/>
+          <w:bCs/>
+          <w:sz w:val="28"/>
+          <w:szCs w:val="28"/>
+        </w:rPr>
+      </w:pPr>
+      <w:r>
+        <w:rPr>
+          <w:b/>
+          <w:bCs/>
+          <w:sz w:val="28"/>
+          <w:szCs w:val="28"/>
+        </w:rPr>
         <w:lastRenderedPageBreak/>
         <w:t>RISORSE</w:t>
       </w:r>
     </w:p>
-    <w:p/>
-    <w:p/>
-    <w:p/>
-    <w:p/>
-    <w:p/>
-    <w:p/>
-    <w:p/>
-    <w:p/>
-    <w:p/>
-    <w:p/>
-    <w:p/>
-    <w:p/>
-    <w:p/>
-    <w:p/>
-    <w:p/>
-    <w:p/>
-    <w:p/>
-    <w:p/>
-    <w:p/>
-    <w:p/>
-    <w:p/>
-    <w:p/>
-    <w:p/>
-    <w:p/>
-    <w:p/>
-    <w:p/>
-    <w:p/>
-    <w:p/>
-    <w:p/>
-    <w:p/>
-    <w:p/>
-    <w:p>
-      <w:r>
-        <w:lastRenderedPageBreak/>
+    <w:p>
+      <w:pPr>
+        <w:pStyle w:val="Paragrafoelenco"/>
+        <w:numPr>
+          <w:ilvl w:val="0"/>
+          <w:numId w:val="2"/>
+        </w:numPr>
+      </w:pPr>
+      <w:r>
+        <w:t xml:space="preserve">Risorse </w:t>
+      </w:r>
+      <w:r>
+        <w:t>u</w:t>
+      </w:r>
+      <w:r>
+        <w:t>mane:</w:t>
+      </w:r>
+    </w:p>
+    <w:p>
+      <w:pPr>
+        <w:numPr>
+          <w:ilvl w:val="1"/>
+          <w:numId w:val="2"/>
+        </w:numPr>
+      </w:pPr>
+      <w:r>
+        <w:t>4 membri del team di sviluppo</w:t>
+      </w:r>
+    </w:p>
+    <w:p>
+      <w:pPr>
+        <w:numPr>
+          <w:ilvl w:val="0"/>
+          <w:numId w:val="2"/>
+        </w:numPr>
+      </w:pPr>
+      <w:r>
+        <w:t xml:space="preserve">Software </w:t>
+      </w:r>
+      <w:r>
+        <w:t xml:space="preserve">(piattaforme): </w:t>
+      </w:r>
+    </w:p>
+    <w:p>
+      <w:pPr>
+        <w:numPr>
+          <w:ilvl w:val="1"/>
+          <w:numId w:val="2"/>
+        </w:numPr>
+      </w:pPr>
+      <w:r>
+        <w:t>IDE: Eclipse IDE for Java Developers - 2025-09</w:t>
+      </w:r>
+    </w:p>
+    <w:p>
+      <w:pPr>
+        <w:numPr>
+          <w:ilvl w:val="1"/>
+          <w:numId w:val="2"/>
+        </w:numPr>
+      </w:pPr>
+      <w:r>
+        <w:t>JDK (Java Development Kit) + inserire versione</w:t>
+      </w:r>
+    </w:p>
+    <w:p>
+      <w:pPr>
+        <w:numPr>
+          <w:ilvl w:val="1"/>
+          <w:numId w:val="2"/>
+        </w:numPr>
+      </w:pPr>
+      <w:r>
+        <w:t>GitHub (per repository privato).</w:t>
+      </w:r>
+    </w:p>
+    <w:p>
+      <w:pPr>
+        <w:numPr>
+          <w:ilvl w:val="1"/>
+          <w:numId w:val="2"/>
+        </w:numPr>
+      </w:pPr>
+      <w:proofErr w:type="spellStart"/>
+      <w:r>
+        <w:t>Firebase</w:t>
+      </w:r>
+      <w:proofErr w:type="spellEnd"/>
+      <w:r>
+        <w:t xml:space="preserve"> </w:t>
+      </w:r>
+      <w:proofErr w:type="spellStart"/>
+      <w:r>
+        <w:t>Realtime</w:t>
+      </w:r>
+      <w:proofErr w:type="spellEnd"/>
+      <w:r>
+        <w:t xml:space="preserve"> Database (piano gratuito).</w:t>
+      </w:r>
+    </w:p>
+    <w:p>
+      <w:pPr>
+        <w:numPr>
+          <w:ilvl w:val="1"/>
+          <w:numId w:val="2"/>
+        </w:numPr>
+      </w:pPr>
+      <w:proofErr w:type="spellStart"/>
+      <w:r>
+        <w:t>Vaadin</w:t>
+      </w:r>
+      <w:proofErr w:type="spellEnd"/>
+      <w:r>
+        <w:t xml:space="preserve"> + inserire versione</w:t>
+      </w:r>
+    </w:p>
+    <w:p>
+      <w:pPr>
+        <w:numPr>
+          <w:ilvl w:val="1"/>
+          <w:numId w:val="2"/>
+        </w:numPr>
+      </w:pPr>
+      <w:r>
+        <w:t>Spring Boot + inserire versione</w:t>
+      </w:r>
+    </w:p>
+    <w:p>
+      <w:pPr>
+        <w:numPr>
+          <w:ilvl w:val="1"/>
+          <w:numId w:val="2"/>
+        </w:numPr>
+      </w:pPr>
+      <w:proofErr w:type="spellStart"/>
+      <w:r>
+        <w:t>Leaflet</w:t>
+      </w:r>
+      <w:proofErr w:type="spellEnd"/>
+      <w:r>
+        <w:t xml:space="preserve"> (per la mappa)</w:t>
+      </w:r>
+    </w:p>
+    <w:p>
+      <w:pPr>
+        <w:numPr>
+          <w:ilvl w:val="1"/>
+          <w:numId w:val="2"/>
+        </w:numPr>
+      </w:pPr>
+      <w:proofErr w:type="spellStart"/>
+      <w:r>
+        <w:t>ZXing</w:t>
+      </w:r>
+      <w:proofErr w:type="spellEnd"/>
+      <w:r>
+        <w:t xml:space="preserve"> per la generazione di QR code</w:t>
+      </w:r>
+    </w:p>
+    <w:p>
+      <w:pPr>
+        <w:numPr>
+          <w:ilvl w:val="1"/>
+          <w:numId w:val="2"/>
+        </w:numPr>
+      </w:pPr>
+      <w:r>
+        <w:t>Nessuna licenza</w:t>
+      </w:r>
+      <w:r>
+        <w:t xml:space="preserve"> a pagamento</w:t>
+      </w:r>
+      <w:r>
+        <w:t xml:space="preserve"> necessaria</w:t>
+      </w:r>
+      <w:r>
+        <w:t>, tutti i piano sono gratuiti e limitati</w:t>
+      </w:r>
+    </w:p>
+    <w:p>
+      <w:pPr>
+        <w:numPr>
+          <w:ilvl w:val="0"/>
+          <w:numId w:val="2"/>
+        </w:numPr>
+      </w:pPr>
+      <w:r>
+        <w:t>Software (</w:t>
+      </w:r>
+      <w:r>
+        <w:t>c</w:t>
+      </w:r>
+      <w:r>
+        <w:t xml:space="preserve">omunicazione e </w:t>
+      </w:r>
+      <w:r>
+        <w:t>g</w:t>
+      </w:r>
+      <w:r>
+        <w:t>estione):</w:t>
+      </w:r>
+    </w:p>
+    <w:p>
+      <w:pPr>
+        <w:numPr>
+          <w:ilvl w:val="1"/>
+          <w:numId w:val="2"/>
+        </w:numPr>
+      </w:pPr>
+      <w:r>
+        <w:t>WhatsApp (comunicazione quotidiana).</w:t>
+      </w:r>
+    </w:p>
+    <w:p>
+      <w:pPr>
+        <w:numPr>
+          <w:ilvl w:val="1"/>
+          <w:numId w:val="2"/>
+        </w:numPr>
+      </w:pPr>
+      <w:r>
+        <w:t>Google Drive (documentazione iniziale aggiornata)</w:t>
+      </w:r>
+    </w:p>
+    <w:p>
+      <w:pPr>
+        <w:numPr>
+          <w:ilvl w:val="1"/>
+          <w:numId w:val="2"/>
+        </w:numPr>
+      </w:pPr>
+      <w:r>
+        <w:t xml:space="preserve">GitHub </w:t>
+      </w:r>
+      <w:r>
+        <w:t>D</w:t>
+      </w:r>
+      <w:r>
+        <w:t xml:space="preserve">esktop per i </w:t>
+      </w:r>
+      <w:proofErr w:type="spellStart"/>
+      <w:r>
+        <w:t>commit</w:t>
+      </w:r>
+      <w:proofErr w:type="spellEnd"/>
+      <w:r>
+        <w:t xml:space="preserve"> e le modifiche</w:t>
+      </w:r>
+    </w:p>
+    <w:p>
+      <w:pPr>
+        <w:numPr>
+          <w:ilvl w:val="0"/>
+          <w:numId w:val="2"/>
+        </w:numPr>
+      </w:pPr>
+      <w:r>
+        <w:t>Hardware:</w:t>
+      </w:r>
+    </w:p>
+    <w:p>
+      <w:pPr>
+        <w:numPr>
+          <w:ilvl w:val="1"/>
+          <w:numId w:val="2"/>
+        </w:numPr>
+      </w:pPr>
+      <w:r>
+        <w:t>PC di ogni membro del team</w:t>
+      </w:r>
+      <w:r>
+        <w:t xml:space="preserve"> già in suo possesso</w:t>
+      </w:r>
+    </w:p>
+    <w:p/>
+    <w:p/>
+    <w:p/>
+    <w:p/>
+    <w:p/>
+    <w:p/>
+    <w:p/>
+    <w:p/>
+    <w:p/>
+    <w:p/>
+    <w:p/>
+    <w:p/>
+    <w:p/>
+    <w:p>
+      <w:pPr>
+        <w:rPr>
+          <w:b/>
+          <w:bCs/>
+          <w:sz w:val="28"/>
+          <w:szCs w:val="28"/>
+        </w:rPr>
+      </w:pPr>
+      <w:r>
+        <w:rPr>
+          <w:b/>
+          <w:bCs/>
+          <w:sz w:val="28"/>
+          <w:szCs w:val="28"/>
+        </w:rPr>
         <w:t>BUDGET</w:t>
       </w:r>
     </w:p>
-    <w:p/>
-    <w:p/>
-    <w:p/>
-    <w:p/>
-    <w:p/>
-    <w:p/>
-    <w:p/>
-    <w:p/>
-    <w:p/>
-    <w:p/>
-    <w:p/>
-    <w:p/>
-    <w:p/>
-    <w:p/>
-    <w:p/>
-    <w:p/>
-    <w:p/>
-    <w:p/>
-    <w:p/>
-    <w:p/>
-    <w:p/>
-    <w:p/>
-    <w:p/>
-    <w:p/>
-    <w:p/>
-    <w:p/>
-    <w:p/>
-    <w:p/>
-    <w:p/>
-    <w:p/>
-    <w:p/>
-    <w:p>
-      <w:r>
-        <w:lastRenderedPageBreak/>
+    <w:p>
+      <w:r>
+        <w:t>Trattandosi di un progetto sviluppato in ambito accademico, il budget monetario è pari a zero.</w:t>
+      </w:r>
+    </w:p>
+    <w:p>
+      <w:pPr>
+        <w:numPr>
+          <w:ilvl w:val="0"/>
+          <w:numId w:val="7"/>
+        </w:numPr>
+      </w:pPr>
+      <w:r>
+        <w:t xml:space="preserve">Costi </w:t>
+      </w:r>
+      <w:r>
+        <w:t>s</w:t>
+      </w:r>
+      <w:r>
+        <w:t xml:space="preserve">oftware: </w:t>
+      </w:r>
+      <w:r>
+        <w:t>nulli</w:t>
+      </w:r>
+      <w:r>
+        <w:t>. </w:t>
+      </w:r>
+    </w:p>
+    <w:p>
+      <w:r>
+        <w:t xml:space="preserve">Tutte le tecnologie e piattaforme utilizzate (Java, </w:t>
+      </w:r>
+      <w:proofErr w:type="spellStart"/>
+      <w:r>
+        <w:t>Vaadin</w:t>
+      </w:r>
+      <w:proofErr w:type="spellEnd"/>
+      <w:r>
+        <w:t xml:space="preserve">, </w:t>
+      </w:r>
+      <w:proofErr w:type="spellStart"/>
+      <w:r>
+        <w:t>Leaflet</w:t>
+      </w:r>
+      <w:proofErr w:type="spellEnd"/>
+      <w:r>
+        <w:t xml:space="preserve">, </w:t>
+      </w:r>
+      <w:proofErr w:type="spellStart"/>
+      <w:r>
+        <w:t>Firebase</w:t>
+      </w:r>
+      <w:proofErr w:type="spellEnd"/>
+      <w:r>
+        <w:t xml:space="preserve"> piano base, GitHub Free) sono gratuite per gli scopi del progetto</w:t>
+      </w:r>
+      <w:r>
+        <w:t>.</w:t>
+      </w:r>
+    </w:p>
+    <w:p>
+      <w:pPr>
+        <w:numPr>
+          <w:ilvl w:val="0"/>
+          <w:numId w:val="5"/>
+        </w:numPr>
+      </w:pPr>
+      <w:r>
+        <w:t xml:space="preserve">Costi </w:t>
+      </w:r>
+      <w:r>
+        <w:t>h</w:t>
+      </w:r>
+      <w:r>
+        <w:t xml:space="preserve">ardware: </w:t>
+      </w:r>
+      <w:r>
+        <w:t>nulli</w:t>
+      </w:r>
+      <w:r>
+        <w:t>. </w:t>
+      </w:r>
+    </w:p>
+    <w:p>
+      <w:r>
+        <w:t>Ogni membro utilizza il proprio PC personale già in suo possesso.</w:t>
+      </w:r>
+    </w:p>
+    <w:p>
+      <w:pPr>
+        <w:numPr>
+          <w:ilvl w:val="0"/>
+          <w:numId w:val="6"/>
+        </w:numPr>
+      </w:pPr>
+      <w:r>
+        <w:t xml:space="preserve">Costi di </w:t>
+      </w:r>
+      <w:r>
+        <w:t>p</w:t>
+      </w:r>
+      <w:r>
+        <w:t>ersonale: </w:t>
+      </w:r>
+      <w:r>
+        <w:t>nulli.</w:t>
+      </w:r>
+    </w:p>
+    <w:p>
+      <w:r>
+        <w:t>Il lavoro fa parte del percorso formativo universitario. Non sono previsti compensi economici.</w:t>
+      </w:r>
+    </w:p>
+    <w:p/>
+    <w:p/>
+    <w:p/>
+    <w:p/>
+    <w:p/>
+    <w:p/>
+    <w:p/>
+    <w:p/>
+    <w:p/>
+    <w:p/>
+    <w:p/>
+    <w:p/>
+    <w:p/>
+    <w:p/>
+    <w:p/>
+    <w:p/>
+    <w:p/>
+    <w:p/>
+    <w:p/>
+    <w:p/>
+    <w:p/>
+    <w:p/>
+    <w:p/>
+    <w:p>
+      <w:r>
         <w:t>CAMBIAMENTI</w:t>
       </w:r>
     </w:p>
@@ -1502,7 +3635,6 @@
     <w:p/>
     <w:p>
       <w:r>
-        <w:lastRenderedPageBreak/>
         <w:t>CONSEGNA</w:t>
       </w:r>
     </w:p>
@@ -1515,6 +3647,1076 @@
     </w:sectPr>
   </w:body>
 </w:document>
+</file>
+
+<file path=word/numbering.xml><?xml version="1.0" encoding="utf-8"?>
+<w:numbering xmlns:wpc="http://schemas.microsoft.com/office/word/2010/wordprocessingCanvas" xmlns:cx="http://schemas.microsoft.com/office/drawing/2014/chartex" xmlns:cx1="http://schemas.microsoft.com/office/drawing/2015/9/8/chartex" xmlns:cx2="http://schemas.microsoft.com/office/drawing/2015/10/21/chartex" xmlns:cx3="http://schemas.microsoft.com/office/drawing/2016/5/9/chartex" xmlns:cx4="http://schemas.microsoft.com/office/drawing/2016/5/10/chartex" xmlns:cx5="http://schemas.microsoft.com/office/drawing/2016/5/11/chartex" xmlns:cx6="http://schemas.microsoft.com/office/drawing/2016/5/12/chartex" xmlns:cx7="http://schemas.microsoft.com/office/drawing/2016/5/13/chartex" xmlns:cx8="http://schemas.microsoft.com/office/drawing/2016/5/14/chartex" xmlns:mc="http://schemas.openxmlformats.org/markup-compatibility/2006" xmlns:aink="http://schemas.microsoft.com/office/drawing/2016/ink" xmlns:am3d="http://schemas.microsoft.com/office/drawing/2017/model3d" xmlns:o="urn:schemas-microsoft-com:office:office" xmlns:oel="http://schemas.microsoft.com/office/2019/extlst" xmlns:r="http://schemas.openxmlformats.org/officeDocument/2006/relationships" xmlns:m="http://schemas.openxmlformats.org/officeDocument/2006/math" xmlns:v="urn:schemas-microsoft-com:vml" xmlns:wp14="http://schemas.microsoft.com/office/word/2010/wordprocessingDrawing" xmlns:wp="http://schemas.openxmlformats.org/drawingml/2006/wordprocessingDrawing" xmlns:w10="urn:schemas-microsoft-com:office:word" xmlns:w="http://schemas.openxmlformats.org/wordprocessingml/2006/main" xmlns:w14="http://schemas.microsoft.com/office/word/2010/wordml" xmlns:w15="http://schemas.microsoft.com/office/word/2012/wordml" xmlns:w16cex="http://schemas.microsoft.com/office/word/2018/wordml/cex" xmlns:w16cid="http://schemas.microsoft.com/office/word/2016/wordml/cid" xmlns:w16="http://schemas.microsoft.com/office/word/2018/wordml" xmlns:w16du="http://schemas.microsoft.com/office/word/2023/wordml/word16du" xmlns:w16sdtdh="http://schemas.microsoft.com/office/word/2020/wordml/sdtdatahash" xmlns:w16sdtfl="http://schemas.microsoft.com/office/word/2024/wordml/sdtformatlock" xmlns:w16se="http://schemas.microsoft.com/office/word/2015/wordml/symex" xmlns:wpg="http://schemas.microsoft.com/office/word/2010/wordprocessingGroup" xmlns:wpi="http://schemas.microsoft.com/office/word/2010/wordprocessingInk" xmlns:wne="http://schemas.microsoft.com/office/word/2006/wordml" xmlns:wps="http://schemas.microsoft.com/office/word/2010/wordprocessingShape" mc:Ignorable="w14 w15 w16se w16cid w16 w16cex w16sdtdh w16sdtfl w16du wp14">
+  <w:abstractNum w:abstractNumId="0" w15:restartNumberingAfterBreak="0">
+    <w:nsid w:val="00C6594E"/>
+    <w:multiLevelType w:val="multilevel"/>
+    <w:tmpl w:val="AC9A27F8"/>
+    <w:lvl w:ilvl="0">
+      <w:start w:val="1"/>
+      <w:numFmt w:val="bullet"/>
+      <w:lvlText w:val="o"/>
+      <w:lvlJc w:val="left"/>
+      <w:pPr>
+        <w:tabs>
+          <w:tab w:val="num" w:pos="720"/>
+        </w:tabs>
+        <w:ind w:left="720" w:hanging="360"/>
+      </w:pPr>
+      <w:rPr>
+        <w:rFonts w:ascii="Courier New" w:hAnsi="Courier New" w:cs="Courier New" w:hint="default"/>
+        <w:sz w:val="20"/>
+      </w:rPr>
+    </w:lvl>
+    <w:lvl w:ilvl="1" w:tentative="1">
+      <w:start w:val="1"/>
+      <w:numFmt w:val="bullet"/>
+      <w:lvlText w:val="o"/>
+      <w:lvlJc w:val="left"/>
+      <w:pPr>
+        <w:tabs>
+          <w:tab w:val="num" w:pos="1440"/>
+        </w:tabs>
+        <w:ind w:left="1440" w:hanging="360"/>
+      </w:pPr>
+      <w:rPr>
+        <w:rFonts w:ascii="Courier New" w:hAnsi="Courier New" w:hint="default"/>
+        <w:sz w:val="20"/>
+      </w:rPr>
+    </w:lvl>
+    <w:lvl w:ilvl="2" w:tentative="1">
+      <w:start w:val="1"/>
+      <w:numFmt w:val="bullet"/>
+      <w:lvlText w:val=""/>
+      <w:lvlJc w:val="left"/>
+      <w:pPr>
+        <w:tabs>
+          <w:tab w:val="num" w:pos="2160"/>
+        </w:tabs>
+        <w:ind w:left="2160" w:hanging="360"/>
+      </w:pPr>
+      <w:rPr>
+        <w:rFonts w:ascii="Wingdings" w:hAnsi="Wingdings" w:hint="default"/>
+        <w:sz w:val="20"/>
+      </w:rPr>
+    </w:lvl>
+    <w:lvl w:ilvl="3" w:tentative="1">
+      <w:start w:val="1"/>
+      <w:numFmt w:val="bullet"/>
+      <w:lvlText w:val=""/>
+      <w:lvlJc w:val="left"/>
+      <w:pPr>
+        <w:tabs>
+          <w:tab w:val="num" w:pos="2880"/>
+        </w:tabs>
+        <w:ind w:left="2880" w:hanging="360"/>
+      </w:pPr>
+      <w:rPr>
+        <w:rFonts w:ascii="Wingdings" w:hAnsi="Wingdings" w:hint="default"/>
+        <w:sz w:val="20"/>
+      </w:rPr>
+    </w:lvl>
+    <w:lvl w:ilvl="4" w:tentative="1">
+      <w:start w:val="1"/>
+      <w:numFmt w:val="bullet"/>
+      <w:lvlText w:val=""/>
+      <w:lvlJc w:val="left"/>
+      <w:pPr>
+        <w:tabs>
+          <w:tab w:val="num" w:pos="3600"/>
+        </w:tabs>
+        <w:ind w:left="3600" w:hanging="360"/>
+      </w:pPr>
+      <w:rPr>
+        <w:rFonts w:ascii="Wingdings" w:hAnsi="Wingdings" w:hint="default"/>
+        <w:sz w:val="20"/>
+      </w:rPr>
+    </w:lvl>
+    <w:lvl w:ilvl="5" w:tentative="1">
+      <w:start w:val="1"/>
+      <w:numFmt w:val="bullet"/>
+      <w:lvlText w:val=""/>
+      <w:lvlJc w:val="left"/>
+      <w:pPr>
+        <w:tabs>
+          <w:tab w:val="num" w:pos="4320"/>
+        </w:tabs>
+        <w:ind w:left="4320" w:hanging="360"/>
+      </w:pPr>
+      <w:rPr>
+        <w:rFonts w:ascii="Wingdings" w:hAnsi="Wingdings" w:hint="default"/>
+        <w:sz w:val="20"/>
+      </w:rPr>
+    </w:lvl>
+    <w:lvl w:ilvl="6" w:tentative="1">
+      <w:start w:val="1"/>
+      <w:numFmt w:val="bullet"/>
+      <w:lvlText w:val=""/>
+      <w:lvlJc w:val="left"/>
+      <w:pPr>
+        <w:tabs>
+          <w:tab w:val="num" w:pos="5040"/>
+        </w:tabs>
+        <w:ind w:left="5040" w:hanging="360"/>
+      </w:pPr>
+      <w:rPr>
+        <w:rFonts w:ascii="Wingdings" w:hAnsi="Wingdings" w:hint="default"/>
+        <w:sz w:val="20"/>
+      </w:rPr>
+    </w:lvl>
+    <w:lvl w:ilvl="7" w:tentative="1">
+      <w:start w:val="1"/>
+      <w:numFmt w:val="bullet"/>
+      <w:lvlText w:val=""/>
+      <w:lvlJc w:val="left"/>
+      <w:pPr>
+        <w:tabs>
+          <w:tab w:val="num" w:pos="5760"/>
+        </w:tabs>
+        <w:ind w:left="5760" w:hanging="360"/>
+      </w:pPr>
+      <w:rPr>
+        <w:rFonts w:ascii="Wingdings" w:hAnsi="Wingdings" w:hint="default"/>
+        <w:sz w:val="20"/>
+      </w:rPr>
+    </w:lvl>
+    <w:lvl w:ilvl="8" w:tentative="1">
+      <w:start w:val="1"/>
+      <w:numFmt w:val="bullet"/>
+      <w:lvlText w:val=""/>
+      <w:lvlJc w:val="left"/>
+      <w:pPr>
+        <w:tabs>
+          <w:tab w:val="num" w:pos="6480"/>
+        </w:tabs>
+        <w:ind w:left="6480" w:hanging="360"/>
+      </w:pPr>
+      <w:rPr>
+        <w:rFonts w:ascii="Wingdings" w:hAnsi="Wingdings" w:hint="default"/>
+        <w:sz w:val="20"/>
+      </w:rPr>
+    </w:lvl>
+  </w:abstractNum>
+  <w:abstractNum w:abstractNumId="1" w15:restartNumberingAfterBreak="0">
+    <w:nsid w:val="0190177D"/>
+    <w:multiLevelType w:val="multilevel"/>
+    <w:tmpl w:val="F54ACB00"/>
+    <w:lvl w:ilvl="0">
+      <w:start w:val="1"/>
+      <w:numFmt w:val="bullet"/>
+      <w:lvlText w:val="o"/>
+      <w:lvlJc w:val="left"/>
+      <w:pPr>
+        <w:tabs>
+          <w:tab w:val="num" w:pos="720"/>
+        </w:tabs>
+        <w:ind w:left="720" w:hanging="360"/>
+      </w:pPr>
+      <w:rPr>
+        <w:rFonts w:ascii="Courier New" w:hAnsi="Courier New" w:cs="Courier New" w:hint="default"/>
+        <w:sz w:val="20"/>
+      </w:rPr>
+    </w:lvl>
+    <w:lvl w:ilvl="1" w:tentative="1">
+      <w:start w:val="1"/>
+      <w:numFmt w:val="bullet"/>
+      <w:lvlText w:val="o"/>
+      <w:lvlJc w:val="left"/>
+      <w:pPr>
+        <w:tabs>
+          <w:tab w:val="num" w:pos="1440"/>
+        </w:tabs>
+        <w:ind w:left="1440" w:hanging="360"/>
+      </w:pPr>
+      <w:rPr>
+        <w:rFonts w:ascii="Courier New" w:hAnsi="Courier New" w:hint="default"/>
+        <w:sz w:val="20"/>
+      </w:rPr>
+    </w:lvl>
+    <w:lvl w:ilvl="2" w:tentative="1">
+      <w:start w:val="1"/>
+      <w:numFmt w:val="bullet"/>
+      <w:lvlText w:val=""/>
+      <w:lvlJc w:val="left"/>
+      <w:pPr>
+        <w:tabs>
+          <w:tab w:val="num" w:pos="2160"/>
+        </w:tabs>
+        <w:ind w:left="2160" w:hanging="360"/>
+      </w:pPr>
+      <w:rPr>
+        <w:rFonts w:ascii="Wingdings" w:hAnsi="Wingdings" w:hint="default"/>
+        <w:sz w:val="20"/>
+      </w:rPr>
+    </w:lvl>
+    <w:lvl w:ilvl="3" w:tentative="1">
+      <w:start w:val="1"/>
+      <w:numFmt w:val="bullet"/>
+      <w:lvlText w:val=""/>
+      <w:lvlJc w:val="left"/>
+      <w:pPr>
+        <w:tabs>
+          <w:tab w:val="num" w:pos="2880"/>
+        </w:tabs>
+        <w:ind w:left="2880" w:hanging="360"/>
+      </w:pPr>
+      <w:rPr>
+        <w:rFonts w:ascii="Wingdings" w:hAnsi="Wingdings" w:hint="default"/>
+        <w:sz w:val="20"/>
+      </w:rPr>
+    </w:lvl>
+    <w:lvl w:ilvl="4" w:tentative="1">
+      <w:start w:val="1"/>
+      <w:numFmt w:val="bullet"/>
+      <w:lvlText w:val=""/>
+      <w:lvlJc w:val="left"/>
+      <w:pPr>
+        <w:tabs>
+          <w:tab w:val="num" w:pos="3600"/>
+        </w:tabs>
+        <w:ind w:left="3600" w:hanging="360"/>
+      </w:pPr>
+      <w:rPr>
+        <w:rFonts w:ascii="Wingdings" w:hAnsi="Wingdings" w:hint="default"/>
+        <w:sz w:val="20"/>
+      </w:rPr>
+    </w:lvl>
+    <w:lvl w:ilvl="5" w:tentative="1">
+      <w:start w:val="1"/>
+      <w:numFmt w:val="bullet"/>
+      <w:lvlText w:val=""/>
+      <w:lvlJc w:val="left"/>
+      <w:pPr>
+        <w:tabs>
+          <w:tab w:val="num" w:pos="4320"/>
+        </w:tabs>
+        <w:ind w:left="4320" w:hanging="360"/>
+      </w:pPr>
+      <w:rPr>
+        <w:rFonts w:ascii="Wingdings" w:hAnsi="Wingdings" w:hint="default"/>
+        <w:sz w:val="20"/>
+      </w:rPr>
+    </w:lvl>
+    <w:lvl w:ilvl="6" w:tentative="1">
+      <w:start w:val="1"/>
+      <w:numFmt w:val="bullet"/>
+      <w:lvlText w:val=""/>
+      <w:lvlJc w:val="left"/>
+      <w:pPr>
+        <w:tabs>
+          <w:tab w:val="num" w:pos="5040"/>
+        </w:tabs>
+        <w:ind w:left="5040" w:hanging="360"/>
+      </w:pPr>
+      <w:rPr>
+        <w:rFonts w:ascii="Wingdings" w:hAnsi="Wingdings" w:hint="default"/>
+        <w:sz w:val="20"/>
+      </w:rPr>
+    </w:lvl>
+    <w:lvl w:ilvl="7" w:tentative="1">
+      <w:start w:val="1"/>
+      <w:numFmt w:val="bullet"/>
+      <w:lvlText w:val=""/>
+      <w:lvlJc w:val="left"/>
+      <w:pPr>
+        <w:tabs>
+          <w:tab w:val="num" w:pos="5760"/>
+        </w:tabs>
+        <w:ind w:left="5760" w:hanging="360"/>
+      </w:pPr>
+      <w:rPr>
+        <w:rFonts w:ascii="Wingdings" w:hAnsi="Wingdings" w:hint="default"/>
+        <w:sz w:val="20"/>
+      </w:rPr>
+    </w:lvl>
+    <w:lvl w:ilvl="8" w:tentative="1">
+      <w:start w:val="1"/>
+      <w:numFmt w:val="bullet"/>
+      <w:lvlText w:val=""/>
+      <w:lvlJc w:val="left"/>
+      <w:pPr>
+        <w:tabs>
+          <w:tab w:val="num" w:pos="6480"/>
+        </w:tabs>
+        <w:ind w:left="6480" w:hanging="360"/>
+      </w:pPr>
+      <w:rPr>
+        <w:rFonts w:ascii="Wingdings" w:hAnsi="Wingdings" w:hint="default"/>
+        <w:sz w:val="20"/>
+      </w:rPr>
+    </w:lvl>
+  </w:abstractNum>
+  <w:abstractNum w:abstractNumId="2" w15:restartNumberingAfterBreak="0">
+    <w:nsid w:val="042C3256"/>
+    <w:multiLevelType w:val="multilevel"/>
+    <w:tmpl w:val="7EE22306"/>
+    <w:lvl w:ilvl="0">
+      <w:start w:val="1"/>
+      <w:numFmt w:val="bullet"/>
+      <w:lvlText w:val="o"/>
+      <w:lvlJc w:val="left"/>
+      <w:pPr>
+        <w:tabs>
+          <w:tab w:val="num" w:pos="720"/>
+        </w:tabs>
+        <w:ind w:left="720" w:hanging="360"/>
+      </w:pPr>
+      <w:rPr>
+        <w:rFonts w:ascii="Courier New" w:hAnsi="Courier New" w:cs="Courier New" w:hint="default"/>
+        <w:sz w:val="20"/>
+      </w:rPr>
+    </w:lvl>
+    <w:lvl w:ilvl="1" w:tentative="1">
+      <w:start w:val="1"/>
+      <w:numFmt w:val="bullet"/>
+      <w:lvlText w:val="o"/>
+      <w:lvlJc w:val="left"/>
+      <w:pPr>
+        <w:tabs>
+          <w:tab w:val="num" w:pos="1440"/>
+        </w:tabs>
+        <w:ind w:left="1440" w:hanging="360"/>
+      </w:pPr>
+      <w:rPr>
+        <w:rFonts w:ascii="Courier New" w:hAnsi="Courier New" w:hint="default"/>
+        <w:sz w:val="20"/>
+      </w:rPr>
+    </w:lvl>
+    <w:lvl w:ilvl="2" w:tentative="1">
+      <w:start w:val="1"/>
+      <w:numFmt w:val="bullet"/>
+      <w:lvlText w:val=""/>
+      <w:lvlJc w:val="left"/>
+      <w:pPr>
+        <w:tabs>
+          <w:tab w:val="num" w:pos="2160"/>
+        </w:tabs>
+        <w:ind w:left="2160" w:hanging="360"/>
+      </w:pPr>
+      <w:rPr>
+        <w:rFonts w:ascii="Wingdings" w:hAnsi="Wingdings" w:hint="default"/>
+        <w:sz w:val="20"/>
+      </w:rPr>
+    </w:lvl>
+    <w:lvl w:ilvl="3" w:tentative="1">
+      <w:start w:val="1"/>
+      <w:numFmt w:val="bullet"/>
+      <w:lvlText w:val=""/>
+      <w:lvlJc w:val="left"/>
+      <w:pPr>
+        <w:tabs>
+          <w:tab w:val="num" w:pos="2880"/>
+        </w:tabs>
+        <w:ind w:left="2880" w:hanging="360"/>
+      </w:pPr>
+      <w:rPr>
+        <w:rFonts w:ascii="Wingdings" w:hAnsi="Wingdings" w:hint="default"/>
+        <w:sz w:val="20"/>
+      </w:rPr>
+    </w:lvl>
+    <w:lvl w:ilvl="4" w:tentative="1">
+      <w:start w:val="1"/>
+      <w:numFmt w:val="bullet"/>
+      <w:lvlText w:val=""/>
+      <w:lvlJc w:val="left"/>
+      <w:pPr>
+        <w:tabs>
+          <w:tab w:val="num" w:pos="3600"/>
+        </w:tabs>
+        <w:ind w:left="3600" w:hanging="360"/>
+      </w:pPr>
+      <w:rPr>
+        <w:rFonts w:ascii="Wingdings" w:hAnsi="Wingdings" w:hint="default"/>
+        <w:sz w:val="20"/>
+      </w:rPr>
+    </w:lvl>
+    <w:lvl w:ilvl="5" w:tentative="1">
+      <w:start w:val="1"/>
+      <w:numFmt w:val="bullet"/>
+      <w:lvlText w:val=""/>
+      <w:lvlJc w:val="left"/>
+      <w:pPr>
+        <w:tabs>
+          <w:tab w:val="num" w:pos="4320"/>
+        </w:tabs>
+        <w:ind w:left="4320" w:hanging="360"/>
+      </w:pPr>
+      <w:rPr>
+        <w:rFonts w:ascii="Wingdings" w:hAnsi="Wingdings" w:hint="default"/>
+        <w:sz w:val="20"/>
+      </w:rPr>
+    </w:lvl>
+    <w:lvl w:ilvl="6" w:tentative="1">
+      <w:start w:val="1"/>
+      <w:numFmt w:val="bullet"/>
+      <w:lvlText w:val=""/>
+      <w:lvlJc w:val="left"/>
+      <w:pPr>
+        <w:tabs>
+          <w:tab w:val="num" w:pos="5040"/>
+        </w:tabs>
+        <w:ind w:left="5040" w:hanging="360"/>
+      </w:pPr>
+      <w:rPr>
+        <w:rFonts w:ascii="Wingdings" w:hAnsi="Wingdings" w:hint="default"/>
+        <w:sz w:val="20"/>
+      </w:rPr>
+    </w:lvl>
+    <w:lvl w:ilvl="7" w:tentative="1">
+      <w:start w:val="1"/>
+      <w:numFmt w:val="bullet"/>
+      <w:lvlText w:val=""/>
+      <w:lvlJc w:val="left"/>
+      <w:pPr>
+        <w:tabs>
+          <w:tab w:val="num" w:pos="5760"/>
+        </w:tabs>
+        <w:ind w:left="5760" w:hanging="360"/>
+      </w:pPr>
+      <w:rPr>
+        <w:rFonts w:ascii="Wingdings" w:hAnsi="Wingdings" w:hint="default"/>
+        <w:sz w:val="20"/>
+      </w:rPr>
+    </w:lvl>
+    <w:lvl w:ilvl="8" w:tentative="1">
+      <w:start w:val="1"/>
+      <w:numFmt w:val="bullet"/>
+      <w:lvlText w:val=""/>
+      <w:lvlJc w:val="left"/>
+      <w:pPr>
+        <w:tabs>
+          <w:tab w:val="num" w:pos="6480"/>
+        </w:tabs>
+        <w:ind w:left="6480" w:hanging="360"/>
+      </w:pPr>
+      <w:rPr>
+        <w:rFonts w:ascii="Wingdings" w:hAnsi="Wingdings" w:hint="default"/>
+        <w:sz w:val="20"/>
+      </w:rPr>
+    </w:lvl>
+  </w:abstractNum>
+  <w:abstractNum w:abstractNumId="3" w15:restartNumberingAfterBreak="0">
+    <w:nsid w:val="09E42619"/>
+    <w:multiLevelType w:val="multilevel"/>
+    <w:tmpl w:val="9F1C721A"/>
+    <w:lvl w:ilvl="0">
+      <w:start w:val="1"/>
+      <w:numFmt w:val="decimal"/>
+      <w:lvlText w:val="%1-"/>
+      <w:lvlJc w:val="left"/>
+      <w:pPr>
+        <w:tabs>
+          <w:tab w:val="num" w:pos="720"/>
+        </w:tabs>
+        <w:ind w:left="720" w:hanging="360"/>
+      </w:pPr>
+      <w:rPr>
+        <w:rFonts w:asciiTheme="minorHAnsi" w:eastAsiaTheme="minorHAnsi" w:hAnsiTheme="minorHAnsi" w:cstheme="minorBidi"/>
+        <w:sz w:val="20"/>
+      </w:rPr>
+    </w:lvl>
+    <w:lvl w:ilvl="1">
+      <w:start w:val="1"/>
+      <w:numFmt w:val="bullet"/>
+      <w:lvlText w:val="o"/>
+      <w:lvlJc w:val="left"/>
+      <w:pPr>
+        <w:tabs>
+          <w:tab w:val="num" w:pos="1440"/>
+        </w:tabs>
+        <w:ind w:left="1440" w:hanging="360"/>
+      </w:pPr>
+      <w:rPr>
+        <w:rFonts w:ascii="Courier New" w:hAnsi="Courier New" w:hint="default"/>
+        <w:sz w:val="20"/>
+      </w:rPr>
+    </w:lvl>
+    <w:lvl w:ilvl="2" w:tentative="1">
+      <w:start w:val="1"/>
+      <w:numFmt w:val="bullet"/>
+      <w:lvlText w:val=""/>
+      <w:lvlJc w:val="left"/>
+      <w:pPr>
+        <w:tabs>
+          <w:tab w:val="num" w:pos="2160"/>
+        </w:tabs>
+        <w:ind w:left="2160" w:hanging="360"/>
+      </w:pPr>
+      <w:rPr>
+        <w:rFonts w:ascii="Wingdings" w:hAnsi="Wingdings" w:hint="default"/>
+        <w:sz w:val="20"/>
+      </w:rPr>
+    </w:lvl>
+    <w:lvl w:ilvl="3" w:tentative="1">
+      <w:start w:val="1"/>
+      <w:numFmt w:val="bullet"/>
+      <w:lvlText w:val=""/>
+      <w:lvlJc w:val="left"/>
+      <w:pPr>
+        <w:tabs>
+          <w:tab w:val="num" w:pos="2880"/>
+        </w:tabs>
+        <w:ind w:left="2880" w:hanging="360"/>
+      </w:pPr>
+      <w:rPr>
+        <w:rFonts w:ascii="Wingdings" w:hAnsi="Wingdings" w:hint="default"/>
+        <w:sz w:val="20"/>
+      </w:rPr>
+    </w:lvl>
+    <w:lvl w:ilvl="4" w:tentative="1">
+      <w:start w:val="1"/>
+      <w:numFmt w:val="bullet"/>
+      <w:lvlText w:val=""/>
+      <w:lvlJc w:val="left"/>
+      <w:pPr>
+        <w:tabs>
+          <w:tab w:val="num" w:pos="3600"/>
+        </w:tabs>
+        <w:ind w:left="3600" w:hanging="360"/>
+      </w:pPr>
+      <w:rPr>
+        <w:rFonts w:ascii="Wingdings" w:hAnsi="Wingdings" w:hint="default"/>
+        <w:sz w:val="20"/>
+      </w:rPr>
+    </w:lvl>
+    <w:lvl w:ilvl="5" w:tentative="1">
+      <w:start w:val="1"/>
+      <w:numFmt w:val="bullet"/>
+      <w:lvlText w:val=""/>
+      <w:lvlJc w:val="left"/>
+      <w:pPr>
+        <w:tabs>
+          <w:tab w:val="num" w:pos="4320"/>
+        </w:tabs>
+        <w:ind w:left="4320" w:hanging="360"/>
+      </w:pPr>
+      <w:rPr>
+        <w:rFonts w:ascii="Wingdings" w:hAnsi="Wingdings" w:hint="default"/>
+        <w:sz w:val="20"/>
+      </w:rPr>
+    </w:lvl>
+    <w:lvl w:ilvl="6" w:tentative="1">
+      <w:start w:val="1"/>
+      <w:numFmt w:val="bullet"/>
+      <w:lvlText w:val=""/>
+      <w:lvlJc w:val="left"/>
+      <w:pPr>
+        <w:tabs>
+          <w:tab w:val="num" w:pos="5040"/>
+        </w:tabs>
+        <w:ind w:left="5040" w:hanging="360"/>
+      </w:pPr>
+      <w:rPr>
+        <w:rFonts w:ascii="Wingdings" w:hAnsi="Wingdings" w:hint="default"/>
+        <w:sz w:val="20"/>
+      </w:rPr>
+    </w:lvl>
+    <w:lvl w:ilvl="7" w:tentative="1">
+      <w:start w:val="1"/>
+      <w:numFmt w:val="bullet"/>
+      <w:lvlText w:val=""/>
+      <w:lvlJc w:val="left"/>
+      <w:pPr>
+        <w:tabs>
+          <w:tab w:val="num" w:pos="5760"/>
+        </w:tabs>
+        <w:ind w:left="5760" w:hanging="360"/>
+      </w:pPr>
+      <w:rPr>
+        <w:rFonts w:ascii="Wingdings" w:hAnsi="Wingdings" w:hint="default"/>
+        <w:sz w:val="20"/>
+      </w:rPr>
+    </w:lvl>
+    <w:lvl w:ilvl="8" w:tentative="1">
+      <w:start w:val="1"/>
+      <w:numFmt w:val="bullet"/>
+      <w:lvlText w:val=""/>
+      <w:lvlJc w:val="left"/>
+      <w:pPr>
+        <w:tabs>
+          <w:tab w:val="num" w:pos="6480"/>
+        </w:tabs>
+        <w:ind w:left="6480" w:hanging="360"/>
+      </w:pPr>
+      <w:rPr>
+        <w:rFonts w:ascii="Wingdings" w:hAnsi="Wingdings" w:hint="default"/>
+        <w:sz w:val="20"/>
+      </w:rPr>
+    </w:lvl>
+  </w:abstractNum>
+  <w:abstractNum w:abstractNumId="4" w15:restartNumberingAfterBreak="0">
+    <w:nsid w:val="3FAB32B5"/>
+    <w:multiLevelType w:val="multilevel"/>
+    <w:tmpl w:val="F75C12D8"/>
+    <w:lvl w:ilvl="0">
+      <w:start w:val="1"/>
+      <w:numFmt w:val="bullet"/>
+      <w:lvlText w:val=""/>
+      <w:lvlJc w:val="left"/>
+      <w:pPr>
+        <w:tabs>
+          <w:tab w:val="num" w:pos="720"/>
+        </w:tabs>
+        <w:ind w:left="720" w:hanging="360"/>
+      </w:pPr>
+      <w:rPr>
+        <w:rFonts w:ascii="Symbol" w:hAnsi="Symbol" w:hint="default"/>
+        <w:sz w:val="20"/>
+      </w:rPr>
+    </w:lvl>
+    <w:lvl w:ilvl="1" w:tentative="1">
+      <w:start w:val="1"/>
+      <w:numFmt w:val="bullet"/>
+      <w:lvlText w:val="o"/>
+      <w:lvlJc w:val="left"/>
+      <w:pPr>
+        <w:tabs>
+          <w:tab w:val="num" w:pos="1440"/>
+        </w:tabs>
+        <w:ind w:left="1440" w:hanging="360"/>
+      </w:pPr>
+      <w:rPr>
+        <w:rFonts w:ascii="Courier New" w:hAnsi="Courier New" w:hint="default"/>
+        <w:sz w:val="20"/>
+      </w:rPr>
+    </w:lvl>
+    <w:lvl w:ilvl="2" w:tentative="1">
+      <w:start w:val="1"/>
+      <w:numFmt w:val="bullet"/>
+      <w:lvlText w:val=""/>
+      <w:lvlJc w:val="left"/>
+      <w:pPr>
+        <w:tabs>
+          <w:tab w:val="num" w:pos="2160"/>
+        </w:tabs>
+        <w:ind w:left="2160" w:hanging="360"/>
+      </w:pPr>
+      <w:rPr>
+        <w:rFonts w:ascii="Wingdings" w:hAnsi="Wingdings" w:hint="default"/>
+        <w:sz w:val="20"/>
+      </w:rPr>
+    </w:lvl>
+    <w:lvl w:ilvl="3" w:tentative="1">
+      <w:start w:val="1"/>
+      <w:numFmt w:val="bullet"/>
+      <w:lvlText w:val=""/>
+      <w:lvlJc w:val="left"/>
+      <w:pPr>
+        <w:tabs>
+          <w:tab w:val="num" w:pos="2880"/>
+        </w:tabs>
+        <w:ind w:left="2880" w:hanging="360"/>
+      </w:pPr>
+      <w:rPr>
+        <w:rFonts w:ascii="Wingdings" w:hAnsi="Wingdings" w:hint="default"/>
+        <w:sz w:val="20"/>
+      </w:rPr>
+    </w:lvl>
+    <w:lvl w:ilvl="4" w:tentative="1">
+      <w:start w:val="1"/>
+      <w:numFmt w:val="bullet"/>
+      <w:lvlText w:val=""/>
+      <w:lvlJc w:val="left"/>
+      <w:pPr>
+        <w:tabs>
+          <w:tab w:val="num" w:pos="3600"/>
+        </w:tabs>
+        <w:ind w:left="3600" w:hanging="360"/>
+      </w:pPr>
+      <w:rPr>
+        <w:rFonts w:ascii="Wingdings" w:hAnsi="Wingdings" w:hint="default"/>
+        <w:sz w:val="20"/>
+      </w:rPr>
+    </w:lvl>
+    <w:lvl w:ilvl="5" w:tentative="1">
+      <w:start w:val="1"/>
+      <w:numFmt w:val="bullet"/>
+      <w:lvlText w:val=""/>
+      <w:lvlJc w:val="left"/>
+      <w:pPr>
+        <w:tabs>
+          <w:tab w:val="num" w:pos="4320"/>
+        </w:tabs>
+        <w:ind w:left="4320" w:hanging="360"/>
+      </w:pPr>
+      <w:rPr>
+        <w:rFonts w:ascii="Wingdings" w:hAnsi="Wingdings" w:hint="default"/>
+        <w:sz w:val="20"/>
+      </w:rPr>
+    </w:lvl>
+    <w:lvl w:ilvl="6" w:tentative="1">
+      <w:start w:val="1"/>
+      <w:numFmt w:val="bullet"/>
+      <w:lvlText w:val=""/>
+      <w:lvlJc w:val="left"/>
+      <w:pPr>
+        <w:tabs>
+          <w:tab w:val="num" w:pos="5040"/>
+        </w:tabs>
+        <w:ind w:left="5040" w:hanging="360"/>
+      </w:pPr>
+      <w:rPr>
+        <w:rFonts w:ascii="Wingdings" w:hAnsi="Wingdings" w:hint="default"/>
+        <w:sz w:val="20"/>
+      </w:rPr>
+    </w:lvl>
+    <w:lvl w:ilvl="7" w:tentative="1">
+      <w:start w:val="1"/>
+      <w:numFmt w:val="bullet"/>
+      <w:lvlText w:val=""/>
+      <w:lvlJc w:val="left"/>
+      <w:pPr>
+        <w:tabs>
+          <w:tab w:val="num" w:pos="5760"/>
+        </w:tabs>
+        <w:ind w:left="5760" w:hanging="360"/>
+      </w:pPr>
+      <w:rPr>
+        <w:rFonts w:ascii="Wingdings" w:hAnsi="Wingdings" w:hint="default"/>
+        <w:sz w:val="20"/>
+      </w:rPr>
+    </w:lvl>
+    <w:lvl w:ilvl="8" w:tentative="1">
+      <w:start w:val="1"/>
+      <w:numFmt w:val="bullet"/>
+      <w:lvlText w:val=""/>
+      <w:lvlJc w:val="left"/>
+      <w:pPr>
+        <w:tabs>
+          <w:tab w:val="num" w:pos="6480"/>
+        </w:tabs>
+        <w:ind w:left="6480" w:hanging="360"/>
+      </w:pPr>
+      <w:rPr>
+        <w:rFonts w:ascii="Wingdings" w:hAnsi="Wingdings" w:hint="default"/>
+        <w:sz w:val="20"/>
+      </w:rPr>
+    </w:lvl>
+  </w:abstractNum>
+  <w:abstractNum w:abstractNumId="5" w15:restartNumberingAfterBreak="0">
+    <w:nsid w:val="4A9C7DCD"/>
+    <w:multiLevelType w:val="multilevel"/>
+    <w:tmpl w:val="9F1C721A"/>
+    <w:styleLink w:val="Elencocorrente1"/>
+    <w:lvl w:ilvl="0">
+      <w:start w:val="1"/>
+      <w:numFmt w:val="decimal"/>
+      <w:lvlText w:val="%1-"/>
+      <w:lvlJc w:val="left"/>
+      <w:pPr>
+        <w:tabs>
+          <w:tab w:val="num" w:pos="720"/>
+        </w:tabs>
+        <w:ind w:left="720" w:hanging="360"/>
+      </w:pPr>
+      <w:rPr>
+        <w:rFonts w:asciiTheme="minorHAnsi" w:eastAsiaTheme="minorHAnsi" w:hAnsiTheme="minorHAnsi" w:cstheme="minorBidi"/>
+        <w:sz w:val="20"/>
+      </w:rPr>
+    </w:lvl>
+    <w:lvl w:ilvl="1">
+      <w:start w:val="1"/>
+      <w:numFmt w:val="bullet"/>
+      <w:lvlText w:val="o"/>
+      <w:lvlJc w:val="left"/>
+      <w:pPr>
+        <w:tabs>
+          <w:tab w:val="num" w:pos="1440"/>
+        </w:tabs>
+        <w:ind w:left="1440" w:hanging="360"/>
+      </w:pPr>
+      <w:rPr>
+        <w:rFonts w:ascii="Courier New" w:hAnsi="Courier New" w:hint="default"/>
+        <w:sz w:val="20"/>
+      </w:rPr>
+    </w:lvl>
+    <w:lvl w:ilvl="2">
+      <w:start w:val="1"/>
+      <w:numFmt w:val="bullet"/>
+      <w:lvlText w:val=""/>
+      <w:lvlJc w:val="left"/>
+      <w:pPr>
+        <w:tabs>
+          <w:tab w:val="num" w:pos="2160"/>
+        </w:tabs>
+        <w:ind w:left="2160" w:hanging="360"/>
+      </w:pPr>
+      <w:rPr>
+        <w:rFonts w:ascii="Wingdings" w:hAnsi="Wingdings" w:hint="default"/>
+        <w:sz w:val="20"/>
+      </w:rPr>
+    </w:lvl>
+    <w:lvl w:ilvl="3">
+      <w:start w:val="1"/>
+      <w:numFmt w:val="bullet"/>
+      <w:lvlText w:val=""/>
+      <w:lvlJc w:val="left"/>
+      <w:pPr>
+        <w:tabs>
+          <w:tab w:val="num" w:pos="2880"/>
+        </w:tabs>
+        <w:ind w:left="2880" w:hanging="360"/>
+      </w:pPr>
+      <w:rPr>
+        <w:rFonts w:ascii="Wingdings" w:hAnsi="Wingdings" w:hint="default"/>
+        <w:sz w:val="20"/>
+      </w:rPr>
+    </w:lvl>
+    <w:lvl w:ilvl="4">
+      <w:start w:val="1"/>
+      <w:numFmt w:val="bullet"/>
+      <w:lvlText w:val=""/>
+      <w:lvlJc w:val="left"/>
+      <w:pPr>
+        <w:tabs>
+          <w:tab w:val="num" w:pos="3600"/>
+        </w:tabs>
+        <w:ind w:left="3600" w:hanging="360"/>
+      </w:pPr>
+      <w:rPr>
+        <w:rFonts w:ascii="Wingdings" w:hAnsi="Wingdings" w:hint="default"/>
+        <w:sz w:val="20"/>
+      </w:rPr>
+    </w:lvl>
+    <w:lvl w:ilvl="5">
+      <w:start w:val="1"/>
+      <w:numFmt w:val="bullet"/>
+      <w:lvlText w:val=""/>
+      <w:lvlJc w:val="left"/>
+      <w:pPr>
+        <w:tabs>
+          <w:tab w:val="num" w:pos="4320"/>
+        </w:tabs>
+        <w:ind w:left="4320" w:hanging="360"/>
+      </w:pPr>
+      <w:rPr>
+        <w:rFonts w:ascii="Wingdings" w:hAnsi="Wingdings" w:hint="default"/>
+        <w:sz w:val="20"/>
+      </w:rPr>
+    </w:lvl>
+    <w:lvl w:ilvl="6">
+      <w:start w:val="1"/>
+      <w:numFmt w:val="bullet"/>
+      <w:lvlText w:val=""/>
+      <w:lvlJc w:val="left"/>
+      <w:pPr>
+        <w:tabs>
+          <w:tab w:val="num" w:pos="5040"/>
+        </w:tabs>
+        <w:ind w:left="5040" w:hanging="360"/>
+      </w:pPr>
+      <w:rPr>
+        <w:rFonts w:ascii="Wingdings" w:hAnsi="Wingdings" w:hint="default"/>
+        <w:sz w:val="20"/>
+      </w:rPr>
+    </w:lvl>
+    <w:lvl w:ilvl="7">
+      <w:start w:val="1"/>
+      <w:numFmt w:val="bullet"/>
+      <w:lvlText w:val=""/>
+      <w:lvlJc w:val="left"/>
+      <w:pPr>
+        <w:tabs>
+          <w:tab w:val="num" w:pos="5760"/>
+        </w:tabs>
+        <w:ind w:left="5760" w:hanging="360"/>
+      </w:pPr>
+      <w:rPr>
+        <w:rFonts w:ascii="Wingdings" w:hAnsi="Wingdings" w:hint="default"/>
+        <w:sz w:val="20"/>
+      </w:rPr>
+    </w:lvl>
+    <w:lvl w:ilvl="8">
+      <w:start w:val="1"/>
+      <w:numFmt w:val="bullet"/>
+      <w:lvlText w:val=""/>
+      <w:lvlJc w:val="left"/>
+      <w:pPr>
+        <w:tabs>
+          <w:tab w:val="num" w:pos="6480"/>
+        </w:tabs>
+        <w:ind w:left="6480" w:hanging="360"/>
+      </w:pPr>
+      <w:rPr>
+        <w:rFonts w:ascii="Wingdings" w:hAnsi="Wingdings" w:hint="default"/>
+        <w:sz w:val="20"/>
+      </w:rPr>
+    </w:lvl>
+  </w:abstractNum>
+  <w:abstractNum w:abstractNumId="6" w15:restartNumberingAfterBreak="0">
+    <w:nsid w:val="5E367BBE"/>
+    <w:multiLevelType w:val="multilevel"/>
+    <w:tmpl w:val="194E4582"/>
+    <w:lvl w:ilvl="0">
+      <w:start w:val="1"/>
+      <w:numFmt w:val="bullet"/>
+      <w:lvlText w:val=""/>
+      <w:lvlJc w:val="left"/>
+      <w:pPr>
+        <w:tabs>
+          <w:tab w:val="num" w:pos="720"/>
+        </w:tabs>
+        <w:ind w:left="720" w:hanging="360"/>
+      </w:pPr>
+      <w:rPr>
+        <w:rFonts w:ascii="Symbol" w:hAnsi="Symbol" w:hint="default"/>
+        <w:sz w:val="20"/>
+      </w:rPr>
+    </w:lvl>
+    <w:lvl w:ilvl="1">
+      <w:start w:val="1"/>
+      <w:numFmt w:val="bullet"/>
+      <w:lvlText w:val="o"/>
+      <w:lvlJc w:val="left"/>
+      <w:pPr>
+        <w:tabs>
+          <w:tab w:val="num" w:pos="1440"/>
+        </w:tabs>
+        <w:ind w:left="1440" w:hanging="360"/>
+      </w:pPr>
+      <w:rPr>
+        <w:rFonts w:ascii="Courier New" w:hAnsi="Courier New" w:hint="default"/>
+        <w:sz w:val="20"/>
+      </w:rPr>
+    </w:lvl>
+    <w:lvl w:ilvl="2" w:tentative="1">
+      <w:start w:val="1"/>
+      <w:numFmt w:val="bullet"/>
+      <w:lvlText w:val=""/>
+      <w:lvlJc w:val="left"/>
+      <w:pPr>
+        <w:tabs>
+          <w:tab w:val="num" w:pos="2160"/>
+        </w:tabs>
+        <w:ind w:left="2160" w:hanging="360"/>
+      </w:pPr>
+      <w:rPr>
+        <w:rFonts w:ascii="Wingdings" w:hAnsi="Wingdings" w:hint="default"/>
+        <w:sz w:val="20"/>
+      </w:rPr>
+    </w:lvl>
+    <w:lvl w:ilvl="3" w:tentative="1">
+      <w:start w:val="1"/>
+      <w:numFmt w:val="bullet"/>
+      <w:lvlText w:val=""/>
+      <w:lvlJc w:val="left"/>
+      <w:pPr>
+        <w:tabs>
+          <w:tab w:val="num" w:pos="2880"/>
+        </w:tabs>
+        <w:ind w:left="2880" w:hanging="360"/>
+      </w:pPr>
+      <w:rPr>
+        <w:rFonts w:ascii="Wingdings" w:hAnsi="Wingdings" w:hint="default"/>
+        <w:sz w:val="20"/>
+      </w:rPr>
+    </w:lvl>
+    <w:lvl w:ilvl="4" w:tentative="1">
+      <w:start w:val="1"/>
+      <w:numFmt w:val="bullet"/>
+      <w:lvlText w:val=""/>
+      <w:lvlJc w:val="left"/>
+      <w:pPr>
+        <w:tabs>
+          <w:tab w:val="num" w:pos="3600"/>
+        </w:tabs>
+        <w:ind w:left="3600" w:hanging="360"/>
+      </w:pPr>
+      <w:rPr>
+        <w:rFonts w:ascii="Wingdings" w:hAnsi="Wingdings" w:hint="default"/>
+        <w:sz w:val="20"/>
+      </w:rPr>
+    </w:lvl>
+    <w:lvl w:ilvl="5" w:tentative="1">
+      <w:start w:val="1"/>
+      <w:numFmt w:val="bullet"/>
+      <w:lvlText w:val=""/>
+      <w:lvlJc w:val="left"/>
+      <w:pPr>
+        <w:tabs>
+          <w:tab w:val="num" w:pos="4320"/>
+        </w:tabs>
+        <w:ind w:left="4320" w:hanging="360"/>
+      </w:pPr>
+      <w:rPr>
+        <w:rFonts w:ascii="Wingdings" w:hAnsi="Wingdings" w:hint="default"/>
+        <w:sz w:val="20"/>
+      </w:rPr>
+    </w:lvl>
+    <w:lvl w:ilvl="6" w:tentative="1">
+      <w:start w:val="1"/>
+      <w:numFmt w:val="bullet"/>
+      <w:lvlText w:val=""/>
+      <w:lvlJc w:val="left"/>
+      <w:pPr>
+        <w:tabs>
+          <w:tab w:val="num" w:pos="5040"/>
+        </w:tabs>
+        <w:ind w:left="5040" w:hanging="360"/>
+      </w:pPr>
+      <w:rPr>
+        <w:rFonts w:ascii="Wingdings" w:hAnsi="Wingdings" w:hint="default"/>
+        <w:sz w:val="20"/>
+      </w:rPr>
+    </w:lvl>
+    <w:lvl w:ilvl="7" w:tentative="1">
+      <w:start w:val="1"/>
+      <w:numFmt w:val="bullet"/>
+      <w:lvlText w:val=""/>
+      <w:lvlJc w:val="left"/>
+      <w:pPr>
+        <w:tabs>
+          <w:tab w:val="num" w:pos="5760"/>
+        </w:tabs>
+        <w:ind w:left="5760" w:hanging="360"/>
+      </w:pPr>
+      <w:rPr>
+        <w:rFonts w:ascii="Wingdings" w:hAnsi="Wingdings" w:hint="default"/>
+        <w:sz w:val="20"/>
+      </w:rPr>
+    </w:lvl>
+    <w:lvl w:ilvl="8" w:tentative="1">
+      <w:start w:val="1"/>
+      <w:numFmt w:val="bullet"/>
+      <w:lvlText w:val=""/>
+      <w:lvlJc w:val="left"/>
+      <w:pPr>
+        <w:tabs>
+          <w:tab w:val="num" w:pos="6480"/>
+        </w:tabs>
+        <w:ind w:left="6480" w:hanging="360"/>
+      </w:pPr>
+      <w:rPr>
+        <w:rFonts w:ascii="Wingdings" w:hAnsi="Wingdings" w:hint="default"/>
+        <w:sz w:val="20"/>
+      </w:rPr>
+    </w:lvl>
+  </w:abstractNum>
+  <w:num w:numId="1" w16cid:durableId="2015645311">
+    <w:abstractNumId w:val="6"/>
+  </w:num>
+  <w:num w:numId="2" w16cid:durableId="819343127">
+    <w:abstractNumId w:val="3"/>
+  </w:num>
+  <w:num w:numId="3" w16cid:durableId="1771847880">
+    <w:abstractNumId w:val="5"/>
+  </w:num>
+  <w:num w:numId="4" w16cid:durableId="544408528">
+    <w:abstractNumId w:val="4"/>
+  </w:num>
+  <w:num w:numId="5" w16cid:durableId="183790548">
+    <w:abstractNumId w:val="2"/>
+  </w:num>
+  <w:num w:numId="6" w16cid:durableId="338630034">
+    <w:abstractNumId w:val="0"/>
+  </w:num>
+  <w:num w:numId="7" w16cid:durableId="1114785242">
+    <w:abstractNumId w:val="1"/>
+  </w:num>
+</w:numbering>
 </file>
 
 <file path=word/styles.xml><?xml version="1.0" encoding="utf-8"?>
@@ -2120,7 +5322,6 @@
   <w:style w:type="character" w:default="1" w:styleId="Carpredefinitoparagrafo">
     <w:name w:val="Default Paragraph Font"/>
     <w:uiPriority w:val="1"/>
-    <w:semiHidden/>
     <w:unhideWhenUsed/>
   </w:style>
   <w:style w:type="table" w:default="1" w:styleId="Tabellanormale">
@@ -2434,6 +5635,16 @@
       <w:spacing w:val="5"/>
     </w:rPr>
   </w:style>
+  <w:style w:type="numbering" w:customStyle="1" w:styleId="Elencocorrente1">
+    <w:name w:val="Elenco corrente1"/>
+    <w:uiPriority w:val="99"/>
+    <w:rsid w:val="00B55E09"/>
+    <w:pPr>
+      <w:numPr>
+        <w:numId w:val="3"/>
+      </w:numPr>
+    </w:pPr>
+  </w:style>
 </w:styles>
 </file>
 

</xml_diff>

<commit_message>
Refractoring vario codice e documentazione
</commit_message>
<xml_diff>
--- a/documentazione/project plan.docx
+++ b/documentazione/project plan.docx
@@ -4,6 +4,7 @@
   <w:body>
     <w:p>
       <w:pPr>
+        <w:jc w:val="both"/>
         <w:rPr>
           <w:b/>
           <w:bCs/>
@@ -224,22 +225,79 @@
         <w:t>E’ inoltre molto semplice rendere questa app scalabile anche a grandi città, in cui utenti possono anche collaborare segnalando la presenza di nuove colonnine, guasti e talvolta recensioni e commenti che possono essere inseriti nella scheda della colonnina corrispondente.</w:t>
       </w:r>
     </w:p>
-    <w:p/>
-    <w:p/>
-    <w:p/>
-    <w:p/>
-    <w:p/>
-    <w:p/>
-    <w:p/>
-    <w:p/>
-    <w:p/>
-    <w:p/>
-    <w:p/>
-    <w:p/>
-    <w:p/>
-    <w:p/>
-    <w:p>
-      <w:pPr>
+    <w:p>
+      <w:pPr>
+        <w:jc w:val="both"/>
+      </w:pPr>
+    </w:p>
+    <w:p>
+      <w:pPr>
+        <w:jc w:val="both"/>
+      </w:pPr>
+    </w:p>
+    <w:p>
+      <w:pPr>
+        <w:jc w:val="both"/>
+      </w:pPr>
+    </w:p>
+    <w:p>
+      <w:pPr>
+        <w:jc w:val="both"/>
+      </w:pPr>
+    </w:p>
+    <w:p>
+      <w:pPr>
+        <w:jc w:val="both"/>
+      </w:pPr>
+    </w:p>
+    <w:p>
+      <w:pPr>
+        <w:jc w:val="both"/>
+      </w:pPr>
+    </w:p>
+    <w:p>
+      <w:pPr>
+        <w:jc w:val="both"/>
+      </w:pPr>
+    </w:p>
+    <w:p>
+      <w:pPr>
+        <w:jc w:val="both"/>
+      </w:pPr>
+    </w:p>
+    <w:p>
+      <w:pPr>
+        <w:jc w:val="both"/>
+      </w:pPr>
+    </w:p>
+    <w:p>
+      <w:pPr>
+        <w:jc w:val="both"/>
+      </w:pPr>
+    </w:p>
+    <w:p>
+      <w:pPr>
+        <w:jc w:val="both"/>
+      </w:pPr>
+    </w:p>
+    <w:p>
+      <w:pPr>
+        <w:jc w:val="both"/>
+      </w:pPr>
+    </w:p>
+    <w:p>
+      <w:pPr>
+        <w:jc w:val="both"/>
+      </w:pPr>
+    </w:p>
+    <w:p>
+      <w:pPr>
+        <w:jc w:val="both"/>
+      </w:pPr>
+    </w:p>
+    <w:p>
+      <w:pPr>
+        <w:jc w:val="both"/>
         <w:rPr>
           <w:b/>
           <w:bCs/>
@@ -377,29 +435,114 @@
         <w:t>Review: uno/due meeting di revisione per verificare che tutte le funzionalità dello Sprint siano corrette e funzionanti.</w:t>
       </w:r>
     </w:p>
-    <w:p/>
-    <w:p/>
-    <w:p/>
-    <w:p/>
-    <w:p/>
-    <w:p/>
-    <w:p/>
-    <w:p/>
-    <w:p/>
-    <w:p/>
-    <w:p/>
-    <w:p/>
-    <w:p/>
-    <w:p/>
-    <w:p/>
-    <w:p/>
-    <w:p/>
-    <w:p/>
-    <w:p/>
-    <w:p/>
-    <w:p/>
-    <w:p>
-      <w:pPr>
+    <w:p>
+      <w:pPr>
+        <w:jc w:val="both"/>
+      </w:pPr>
+    </w:p>
+    <w:p>
+      <w:pPr>
+        <w:jc w:val="both"/>
+      </w:pPr>
+    </w:p>
+    <w:p>
+      <w:pPr>
+        <w:jc w:val="both"/>
+      </w:pPr>
+    </w:p>
+    <w:p>
+      <w:pPr>
+        <w:jc w:val="both"/>
+      </w:pPr>
+    </w:p>
+    <w:p>
+      <w:pPr>
+        <w:jc w:val="both"/>
+      </w:pPr>
+    </w:p>
+    <w:p>
+      <w:pPr>
+        <w:jc w:val="both"/>
+      </w:pPr>
+    </w:p>
+    <w:p>
+      <w:pPr>
+        <w:jc w:val="both"/>
+      </w:pPr>
+    </w:p>
+    <w:p>
+      <w:pPr>
+        <w:jc w:val="both"/>
+      </w:pPr>
+    </w:p>
+    <w:p>
+      <w:pPr>
+        <w:jc w:val="both"/>
+      </w:pPr>
+    </w:p>
+    <w:p>
+      <w:pPr>
+        <w:jc w:val="both"/>
+      </w:pPr>
+    </w:p>
+    <w:p>
+      <w:pPr>
+        <w:jc w:val="both"/>
+      </w:pPr>
+    </w:p>
+    <w:p>
+      <w:pPr>
+        <w:jc w:val="both"/>
+      </w:pPr>
+    </w:p>
+    <w:p>
+      <w:pPr>
+        <w:jc w:val="both"/>
+      </w:pPr>
+    </w:p>
+    <w:p>
+      <w:pPr>
+        <w:jc w:val="both"/>
+      </w:pPr>
+    </w:p>
+    <w:p>
+      <w:pPr>
+        <w:jc w:val="both"/>
+      </w:pPr>
+    </w:p>
+    <w:p>
+      <w:pPr>
+        <w:jc w:val="both"/>
+      </w:pPr>
+    </w:p>
+    <w:p>
+      <w:pPr>
+        <w:jc w:val="both"/>
+      </w:pPr>
+    </w:p>
+    <w:p>
+      <w:pPr>
+        <w:jc w:val="both"/>
+      </w:pPr>
+    </w:p>
+    <w:p>
+      <w:pPr>
+        <w:jc w:val="both"/>
+      </w:pPr>
+    </w:p>
+    <w:p>
+      <w:pPr>
+        <w:jc w:val="both"/>
+      </w:pPr>
+    </w:p>
+    <w:p>
+      <w:pPr>
+        <w:jc w:val="both"/>
+      </w:pPr>
+    </w:p>
+    <w:p>
+      <w:pPr>
+        <w:jc w:val="both"/>
         <w:rPr>
           <w:b/>
           <w:bCs/>
@@ -861,16 +1004,49 @@
         <w:t xml:space="preserve"> e tenere in memoria le azioni di ogni persona. Utilizzo iniziale di Google Drive per la documentazione e per i riassunti dei meeting con data e descrizione, da caricare poi su GitHub.</w:t>
       </w:r>
     </w:p>
-    <w:p/>
-    <w:p/>
-    <w:p/>
-    <w:p/>
-    <w:p/>
-    <w:p/>
-    <w:p/>
-    <w:p/>
-    <w:p>
-      <w:pPr>
+    <w:p>
+      <w:pPr>
+        <w:jc w:val="both"/>
+      </w:pPr>
+    </w:p>
+    <w:p>
+      <w:pPr>
+        <w:jc w:val="both"/>
+      </w:pPr>
+    </w:p>
+    <w:p>
+      <w:pPr>
+        <w:jc w:val="both"/>
+      </w:pPr>
+    </w:p>
+    <w:p>
+      <w:pPr>
+        <w:jc w:val="both"/>
+      </w:pPr>
+    </w:p>
+    <w:p>
+      <w:pPr>
+        <w:jc w:val="both"/>
+      </w:pPr>
+    </w:p>
+    <w:p>
+      <w:pPr>
+        <w:jc w:val="both"/>
+      </w:pPr>
+    </w:p>
+    <w:p>
+      <w:pPr>
+        <w:jc w:val="both"/>
+      </w:pPr>
+    </w:p>
+    <w:p>
+      <w:pPr>
+        <w:jc w:val="both"/>
+      </w:pPr>
+    </w:p>
+    <w:p>
+      <w:pPr>
+        <w:jc w:val="both"/>
         <w:rPr>
           <w:b/>
           <w:bCs/>
@@ -1166,43 +1342,167 @@
         <w:t>Queste aggiunte rendono la nostra applicazione più professionale e, in un futuro, realmente utilizzabile.</w:t>
       </w:r>
     </w:p>
-    <w:p/>
-    <w:p>
+    <w:p>
+      <w:pPr>
+        <w:jc w:val="both"/>
+      </w:pPr>
+    </w:p>
+    <w:p>
+      <w:pPr>
+        <w:jc w:val="both"/>
+      </w:pPr>
       <w:r>
         <w:t>FORSE PARTE DI COSA ABBIAMO UTILIZZATO MEGLIO METTERLE IN TECNICHE?</w:t>
       </w:r>
     </w:p>
-    <w:p/>
-    <w:p/>
-    <w:p/>
-    <w:p/>
-    <w:p/>
-    <w:p/>
-    <w:p/>
-    <w:p/>
-    <w:p/>
-    <w:p/>
-    <w:p/>
-    <w:p/>
-    <w:p/>
-    <w:p/>
-    <w:p/>
-    <w:p/>
-    <w:p/>
-    <w:p/>
-    <w:p/>
-    <w:p/>
-    <w:p/>
-    <w:p/>
-    <w:p/>
-    <w:p/>
-    <w:p/>
-    <w:p/>
-    <w:p/>
-    <w:p/>
-    <w:p/>
-    <w:p>
-      <w:pPr>
+    <w:p>
+      <w:pPr>
+        <w:jc w:val="both"/>
+      </w:pPr>
+    </w:p>
+    <w:p>
+      <w:pPr>
+        <w:jc w:val="both"/>
+      </w:pPr>
+    </w:p>
+    <w:p>
+      <w:pPr>
+        <w:jc w:val="both"/>
+      </w:pPr>
+    </w:p>
+    <w:p>
+      <w:pPr>
+        <w:jc w:val="both"/>
+      </w:pPr>
+    </w:p>
+    <w:p>
+      <w:pPr>
+        <w:jc w:val="both"/>
+      </w:pPr>
+    </w:p>
+    <w:p>
+      <w:pPr>
+        <w:jc w:val="both"/>
+      </w:pPr>
+    </w:p>
+    <w:p>
+      <w:pPr>
+        <w:jc w:val="both"/>
+      </w:pPr>
+    </w:p>
+    <w:p>
+      <w:pPr>
+        <w:jc w:val="both"/>
+      </w:pPr>
+    </w:p>
+    <w:p>
+      <w:pPr>
+        <w:jc w:val="both"/>
+      </w:pPr>
+    </w:p>
+    <w:p>
+      <w:pPr>
+        <w:jc w:val="both"/>
+      </w:pPr>
+    </w:p>
+    <w:p>
+      <w:pPr>
+        <w:jc w:val="both"/>
+      </w:pPr>
+    </w:p>
+    <w:p>
+      <w:pPr>
+        <w:jc w:val="both"/>
+      </w:pPr>
+    </w:p>
+    <w:p>
+      <w:pPr>
+        <w:jc w:val="both"/>
+      </w:pPr>
+    </w:p>
+    <w:p>
+      <w:pPr>
+        <w:jc w:val="both"/>
+      </w:pPr>
+    </w:p>
+    <w:p>
+      <w:pPr>
+        <w:jc w:val="both"/>
+      </w:pPr>
+    </w:p>
+    <w:p>
+      <w:pPr>
+        <w:jc w:val="both"/>
+      </w:pPr>
+    </w:p>
+    <w:p>
+      <w:pPr>
+        <w:jc w:val="both"/>
+      </w:pPr>
+    </w:p>
+    <w:p>
+      <w:pPr>
+        <w:jc w:val="both"/>
+      </w:pPr>
+    </w:p>
+    <w:p>
+      <w:pPr>
+        <w:jc w:val="both"/>
+      </w:pPr>
+    </w:p>
+    <w:p>
+      <w:pPr>
+        <w:jc w:val="both"/>
+      </w:pPr>
+    </w:p>
+    <w:p>
+      <w:pPr>
+        <w:jc w:val="both"/>
+      </w:pPr>
+    </w:p>
+    <w:p>
+      <w:pPr>
+        <w:jc w:val="both"/>
+      </w:pPr>
+    </w:p>
+    <w:p>
+      <w:pPr>
+        <w:jc w:val="both"/>
+      </w:pPr>
+    </w:p>
+    <w:p>
+      <w:pPr>
+        <w:jc w:val="both"/>
+      </w:pPr>
+    </w:p>
+    <w:p>
+      <w:pPr>
+        <w:jc w:val="both"/>
+      </w:pPr>
+    </w:p>
+    <w:p>
+      <w:pPr>
+        <w:jc w:val="both"/>
+      </w:pPr>
+    </w:p>
+    <w:p>
+      <w:pPr>
+        <w:jc w:val="both"/>
+      </w:pPr>
+    </w:p>
+    <w:p>
+      <w:pPr>
+        <w:jc w:val="both"/>
+      </w:pPr>
+    </w:p>
+    <w:p>
+      <w:pPr>
+        <w:jc w:val="both"/>
+      </w:pPr>
+    </w:p>
+    <w:p>
+      <w:pPr>
+        <w:jc w:val="both"/>
         <w:rPr>
           <w:b/>
           <w:bCs/>
@@ -1221,38 +1521,164 @@
         <w:t>ATTIVITÀ DI GESTIONE</w:t>
       </w:r>
     </w:p>
-    <w:p/>
-    <w:p/>
-    <w:p/>
-    <w:p/>
-    <w:p/>
-    <w:p/>
-    <w:p/>
-    <w:p/>
-    <w:p/>
-    <w:p/>
-    <w:p/>
-    <w:p/>
-    <w:p/>
-    <w:p/>
-    <w:p/>
-    <w:p/>
-    <w:p/>
-    <w:p/>
-    <w:p/>
-    <w:p/>
-    <w:p/>
-    <w:p/>
-    <w:p/>
-    <w:p/>
-    <w:p/>
-    <w:p/>
-    <w:p/>
-    <w:p/>
-    <w:p/>
-    <w:p/>
-    <w:p>
-      <w:pPr>
+    <w:p>
+      <w:pPr>
+        <w:jc w:val="both"/>
+      </w:pPr>
+      <w:r>
+        <w:t>La gestione del progetto avviene attraverso incontri ravvicinati soprattutto in ambiente universitario. Durante l‘incontro ogni membro aggiorna il gruppo sulle modifiche apportate al codice, eventuali problemi che ha rilevato, accorgimenti e un ipotetica suddivisione dei compiti che devono essere assegnati agli altri membri nel caso siano necessari per lo sviluppo del progetto.</w:t>
+      </w:r>
+    </w:p>
+    <w:p>
+      <w:pPr>
+        <w:jc w:val="both"/>
+      </w:pPr>
+      <w:r>
+        <w:t xml:space="preserve">Naturalmente tutto ciò, oltre ad essere tema di incontro, deve essere dettagliatamente descritto nella documentazione o negli </w:t>
+      </w:r>
+      <w:proofErr w:type="spellStart"/>
+      <w:r>
+        <w:t>issue</w:t>
+      </w:r>
+      <w:proofErr w:type="spellEnd"/>
+      <w:r>
+        <w:t xml:space="preserve"> tramite GitHub.</w:t>
+      </w:r>
+    </w:p>
+    <w:p>
+      <w:pPr>
+        <w:jc w:val="both"/>
+      </w:pPr>
+      <w:r>
+        <w:t xml:space="preserve">In caso di domande o dubbi dopo i vari incontri possono essere chiariti anche tramite gruppo Whatsapp creato per una messaggistica rapida, a cui può seguire una chiamata o una discussione per la ricerca di una possibile risoluzione della problematica. In caso di mancata soluzione al problema, e la conseguente impossibilità di chiusura della </w:t>
+      </w:r>
+      <w:proofErr w:type="spellStart"/>
+      <w:r>
+        <w:t>issue</w:t>
+      </w:r>
+      <w:proofErr w:type="spellEnd"/>
+      <w:r>
+        <w:t xml:space="preserve"> nel caso sia stata creata, si opterà per un nuovo incontro di gruppo.</w:t>
+      </w:r>
+    </w:p>
+    <w:p>
+      <w:pPr>
+        <w:jc w:val="both"/>
+      </w:pPr>
+    </w:p>
+    <w:p>
+      <w:pPr>
+        <w:jc w:val="both"/>
+      </w:pPr>
+    </w:p>
+    <w:p>
+      <w:pPr>
+        <w:jc w:val="both"/>
+      </w:pPr>
+    </w:p>
+    <w:p>
+      <w:pPr>
+        <w:jc w:val="both"/>
+      </w:pPr>
+    </w:p>
+    <w:p>
+      <w:pPr>
+        <w:jc w:val="both"/>
+      </w:pPr>
+    </w:p>
+    <w:p>
+      <w:pPr>
+        <w:jc w:val="both"/>
+      </w:pPr>
+    </w:p>
+    <w:p>
+      <w:pPr>
+        <w:jc w:val="both"/>
+      </w:pPr>
+    </w:p>
+    <w:p>
+      <w:pPr>
+        <w:jc w:val="both"/>
+      </w:pPr>
+    </w:p>
+    <w:p>
+      <w:pPr>
+        <w:jc w:val="both"/>
+      </w:pPr>
+    </w:p>
+    <w:p>
+      <w:pPr>
+        <w:jc w:val="both"/>
+      </w:pPr>
+    </w:p>
+    <w:p>
+      <w:pPr>
+        <w:jc w:val="both"/>
+      </w:pPr>
+    </w:p>
+    <w:p>
+      <w:pPr>
+        <w:jc w:val="both"/>
+      </w:pPr>
+    </w:p>
+    <w:p>
+      <w:pPr>
+        <w:jc w:val="both"/>
+      </w:pPr>
+    </w:p>
+    <w:p>
+      <w:pPr>
+        <w:jc w:val="both"/>
+      </w:pPr>
+    </w:p>
+    <w:p>
+      <w:pPr>
+        <w:jc w:val="both"/>
+      </w:pPr>
+    </w:p>
+    <w:p>
+      <w:pPr>
+        <w:jc w:val="both"/>
+      </w:pPr>
+    </w:p>
+    <w:p>
+      <w:pPr>
+        <w:jc w:val="both"/>
+      </w:pPr>
+    </w:p>
+    <w:p>
+      <w:pPr>
+        <w:jc w:val="both"/>
+      </w:pPr>
+    </w:p>
+    <w:p>
+      <w:pPr>
+        <w:jc w:val="both"/>
+      </w:pPr>
+    </w:p>
+    <w:p>
+      <w:pPr>
+        <w:jc w:val="both"/>
+      </w:pPr>
+    </w:p>
+    <w:p>
+      <w:pPr>
+        <w:jc w:val="both"/>
+      </w:pPr>
+    </w:p>
+    <w:p>
+      <w:pPr>
+        <w:jc w:val="both"/>
+      </w:pPr>
+    </w:p>
+    <w:p>
+      <w:pPr>
+        <w:jc w:val="both"/>
+      </w:pPr>
+    </w:p>
+    <w:p>
+      <w:pPr>
+        <w:jc w:val="both"/>
         <w:rPr>
           <w:b/>
           <w:bCs/>
@@ -1539,129 +1965,56 @@
         <w:t>Potremmo dividere meglio tra le tipologie di rischio</w:t>
       </w:r>
     </w:p>
-    <w:p/>
-    <w:p/>
-    <w:p/>
-    <w:p/>
-    <w:p/>
-    <w:p/>
-    <w:p/>
-    <w:p/>
-    <w:p/>
-    <w:p>
-      <w:r>
-        <w:lastRenderedPageBreak/>
-        <w:t>PERSONALE</w:t>
-      </w:r>
-    </w:p>
-    <w:p/>
-    <w:p/>
-    <w:p/>
-    <w:p/>
-    <w:p/>
-    <w:p/>
-    <w:p/>
-    <w:p/>
-    <w:p/>
-    <w:p/>
-    <w:p/>
-    <w:p/>
-    <w:p/>
-    <w:p/>
-    <w:p/>
-    <w:p/>
-    <w:p/>
-    <w:p/>
-    <w:p/>
-    <w:p/>
-    <w:p/>
-    <w:p/>
-    <w:p/>
-    <w:p/>
-    <w:p/>
-    <w:p/>
-    <w:p/>
-    <w:p/>
-    <w:p/>
-    <w:p/>
-    <w:p/>
-    <w:p>
-      <w:r>
-        <w:lastRenderedPageBreak/>
-        <w:t>METODI E TECNICHE</w:t>
-      </w:r>
-    </w:p>
-    <w:p/>
-    <w:p/>
-    <w:p/>
-    <w:p/>
-    <w:p/>
-    <w:p/>
-    <w:p/>
-    <w:p/>
-    <w:p/>
-    <w:p/>
-    <w:p/>
-    <w:p/>
-    <w:p/>
-    <w:p/>
-    <w:p/>
-    <w:p/>
-    <w:p/>
-    <w:p/>
-    <w:p/>
-    <w:p/>
-    <w:p/>
-    <w:p/>
-    <w:p/>
-    <w:p/>
-    <w:p/>
-    <w:p/>
-    <w:p/>
-    <w:p/>
-    <w:p/>
-    <w:p/>
-    <w:p/>
-    <w:p>
-      <w:r>
-        <w:lastRenderedPageBreak/>
-        <w:t>GARANZIE DI QUALITÀ</w:t>
-      </w:r>
-    </w:p>
-    <w:p/>
-    <w:p/>
-    <w:p/>
-    <w:p/>
-    <w:p/>
-    <w:p/>
-    <w:p/>
-    <w:p/>
-    <w:p/>
-    <w:p/>
-    <w:p/>
-    <w:p/>
-    <w:p/>
-    <w:p/>
-    <w:p/>
-    <w:p/>
-    <w:p/>
-    <w:p/>
-    <w:p/>
-    <w:p/>
-    <w:p/>
-    <w:p/>
-    <w:p/>
-    <w:p/>
-    <w:p/>
-    <w:p/>
-    <w:p/>
-    <w:p/>
-    <w:p/>
-    <w:p/>
-    <w:p/>
-    <w:p>
-      <w:pPr>
-        <w:rPr>
+    <w:p>
+      <w:pPr>
+        <w:jc w:val="both"/>
+      </w:pPr>
+    </w:p>
+    <w:p>
+      <w:pPr>
+        <w:jc w:val="both"/>
+      </w:pPr>
+    </w:p>
+    <w:p>
+      <w:pPr>
+        <w:jc w:val="both"/>
+      </w:pPr>
+    </w:p>
+    <w:p>
+      <w:pPr>
+        <w:jc w:val="both"/>
+      </w:pPr>
+    </w:p>
+    <w:p>
+      <w:pPr>
+        <w:jc w:val="both"/>
+      </w:pPr>
+    </w:p>
+    <w:p>
+      <w:pPr>
+        <w:jc w:val="both"/>
+      </w:pPr>
+    </w:p>
+    <w:p>
+      <w:pPr>
+        <w:jc w:val="both"/>
+      </w:pPr>
+    </w:p>
+    <w:p>
+      <w:pPr>
+        <w:jc w:val="both"/>
+      </w:pPr>
+    </w:p>
+    <w:p>
+      <w:pPr>
+        <w:jc w:val="both"/>
+      </w:pPr>
+    </w:p>
+    <w:p>
+      <w:pPr>
+        <w:jc w:val="both"/>
+        <w:rPr>
+          <w:rFonts w:cstheme="minorHAnsi"/>
           <w:b/>
           <w:bCs/>
           <w:sz w:val="28"/>
@@ -1670,18 +2023,587 @@
       </w:pPr>
       <w:r>
         <w:rPr>
+          <w:rFonts w:cstheme="minorHAnsi"/>
           <w:b/>
           <w:bCs/>
           <w:sz w:val="28"/>
           <w:szCs w:val="28"/>
         </w:rPr>
         <w:lastRenderedPageBreak/>
+        <w:t>PERSONALE</w:t>
+      </w:r>
+    </w:p>
+    <w:p>
+      <w:pPr>
+        <w:jc w:val="both"/>
+      </w:pPr>
+      <w:r>
+        <w:t>Il progetto prevede il coinvolgimento costante di quattro membri, studenti del corso di laurea in Ingegneria Informatica. Tutti possiedono competenze nello sviluppo software in Java e nell’utilizzo dell’ambiente di sviluppo Eclipse.</w:t>
+      </w:r>
+    </w:p>
+    <w:p>
+      <w:pPr>
+        <w:jc w:val="both"/>
+      </w:pPr>
+      <w:r>
+        <w:t>Non sono previsti costi per il personale, poiché si tratta di un progetto universitario a scopo formativo.</w:t>
+      </w:r>
+    </w:p>
+    <w:p>
+      <w:pPr>
+        <w:jc w:val="both"/>
+      </w:pPr>
+      <w:r>
+        <w:t>Ciascun componente del gruppo partecipa attivamente alla programmazione, con attività sia di Front End sia di Back End, secondo le proprie competenze. Per una migliore organizzazione del lavoro, i ruoli principali sono così assegnati:</w:t>
+      </w:r>
+    </w:p>
+    <w:p>
+      <w:pPr>
+        <w:jc w:val="both"/>
+      </w:pPr>
+      <w:r>
+        <w:t>[Davide Mascheretti] — Project Manager e Sviluppatore Back End</w:t>
+      </w:r>
+    </w:p>
+    <w:p>
+      <w:pPr>
+        <w:jc w:val="both"/>
+      </w:pPr>
+      <w:r>
+        <w:t>Coordina le attività del gruppo, pianifica le scadenze. Implementa la logica applicativa e gestisce l’integrazione tra moduli, servizi  e database contenenti i dati del progetto.</w:t>
+      </w:r>
+    </w:p>
+    <w:p>
+      <w:pPr>
+        <w:jc w:val="both"/>
+      </w:pPr>
+      <w:r>
+        <w:t>[Francesco Valenari] — Progettista Software e Collaboratore Front End</w:t>
+      </w:r>
+    </w:p>
+    <w:p>
+      <w:pPr>
+        <w:jc w:val="both"/>
+      </w:pPr>
+      <w:r>
+        <w:t>Definisce l’architettura del sistema, la struttura del codice e i diagrammi UML, garantendo coerenza e qualità del design. Aiuta nella realizzazione dell'interfaccia utente.</w:t>
+      </w:r>
+    </w:p>
+    <w:p>
+      <w:pPr>
+        <w:jc w:val="both"/>
+      </w:pPr>
+      <w:r>
+        <w:t>[Tommaso Maistrello] — Analista dei requisiti e Sviluppatore Front End</w:t>
+      </w:r>
+    </w:p>
+    <w:p>
+      <w:pPr>
+        <w:jc w:val="both"/>
+      </w:pPr>
+      <w:r>
+        <w:t>Cura la documentazione e raccoglie i requisiti funzionali e non funzionali. Realizza l’interfaccia utente.</w:t>
+      </w:r>
+    </w:p>
+    <w:p>
+      <w:pPr>
+        <w:jc w:val="both"/>
+      </w:pPr>
+      <w:r>
+        <w:t>[Claudio Morgera] — Collaboratore Back End e Tester</w:t>
+      </w:r>
+    </w:p>
+    <w:p>
+      <w:pPr>
+        <w:jc w:val="both"/>
+      </w:pPr>
+      <w:r>
+        <w:t>Aiuta nell‘implementazione della logica applicativa e gestisce l’integrazione tra moduli, servizi e database. Si occupa dei test funzionali e unitari e verifica la correttezza complessiva del software.</w:t>
+      </w:r>
+    </w:p>
+    <w:p>
+      <w:pPr>
+        <w:jc w:val="both"/>
+      </w:pPr>
+      <w:r>
+        <w:t>L’impegno dei membri sarà costante per tutta la durata del progetto, con maggiore intensità nelle fasi di sviluppo e collaudo.</w:t>
+      </w:r>
+    </w:p>
+    <w:p>
+      <w:pPr>
+        <w:jc w:val="both"/>
+      </w:pPr>
+    </w:p>
+    <w:p>
+      <w:pPr>
+        <w:jc w:val="both"/>
+      </w:pPr>
+    </w:p>
+    <w:p>
+      <w:pPr>
+        <w:jc w:val="both"/>
+      </w:pPr>
+    </w:p>
+    <w:p>
+      <w:pPr>
+        <w:jc w:val="both"/>
+      </w:pPr>
+    </w:p>
+    <w:p>
+      <w:pPr>
+        <w:jc w:val="both"/>
+      </w:pPr>
+    </w:p>
+    <w:p>
+      <w:pPr>
+        <w:jc w:val="both"/>
+      </w:pPr>
+    </w:p>
+    <w:p>
+      <w:pPr>
+        <w:jc w:val="both"/>
+      </w:pPr>
+    </w:p>
+    <w:p>
+      <w:pPr>
+        <w:jc w:val="both"/>
+      </w:pPr>
+    </w:p>
+    <w:p>
+      <w:pPr>
+        <w:jc w:val="both"/>
+      </w:pPr>
+    </w:p>
+    <w:p>
+      <w:pPr>
+        <w:jc w:val="both"/>
+      </w:pPr>
+    </w:p>
+    <w:p>
+      <w:pPr>
+        <w:jc w:val="both"/>
+      </w:pPr>
+    </w:p>
+    <w:p>
+      <w:pPr>
+        <w:jc w:val="both"/>
+      </w:pPr>
+    </w:p>
+    <w:p>
+      <w:pPr>
+        <w:jc w:val="both"/>
+      </w:pPr>
+    </w:p>
+    <w:p>
+      <w:pPr>
+        <w:jc w:val="both"/>
+        <w:rPr>
+          <w:b/>
+          <w:bCs/>
+          <w:sz w:val="28"/>
+          <w:szCs w:val="28"/>
+        </w:rPr>
+      </w:pPr>
+      <w:r>
+        <w:rPr>
+          <w:b/>
+          <w:bCs/>
+          <w:sz w:val="28"/>
+          <w:szCs w:val="28"/>
+        </w:rPr>
+        <w:lastRenderedPageBreak/>
+        <w:t>METODI E TECNICHE</w:t>
+      </w:r>
+    </w:p>
+    <w:p>
+      <w:pPr>
+        <w:jc w:val="both"/>
+      </w:pPr>
+      <w:r>
+        <w:t>Durante lo sviluppo del progetto saranno adottati metodi e tecniche di ingegneria del software che coprono tutte le fasi del ciclo di vita: analisi dei requisiti, progettazione, implementazione e test.</w:t>
+      </w:r>
+    </w:p>
+    <w:p>
+      <w:pPr>
+        <w:jc w:val="both"/>
+      </w:pPr>
+      <w:r>
+        <w:t>Ingegneria dei requisiti: i requisiti saranno raccolti tramite incontri di gruppo e discussioni guidate dal Project Manager. Saranno documentati in modo strutturato utilizzando diagrammi dei casi d’uso e specifiche testuali, redatte con strumenti di videoscrittura condivisi (ad esempio Google Docs o simili).</w:t>
+      </w:r>
+    </w:p>
+    <w:p>
+      <w:pPr>
+        <w:jc w:val="both"/>
+      </w:pPr>
+      <w:r>
+        <w:t xml:space="preserve">Progettazione: sarà impiegato un approccio </w:t>
+      </w:r>
+      <w:proofErr w:type="spellStart"/>
+      <w:r>
+        <w:t>object-oriented</w:t>
+      </w:r>
+      <w:proofErr w:type="spellEnd"/>
+      <w:r>
+        <w:t xml:space="preserve"> (OO), con l’ausilio di diagrammi UML per rappresentare classi, sequenze e componenti. La progettazione sarà validata in gruppo prima dell’inizio della codifica.</w:t>
+      </w:r>
+    </w:p>
+    <w:p>
+      <w:pPr>
+        <w:jc w:val="both"/>
+      </w:pPr>
+      <w:r>
+        <w:t>Implementazione: lo sviluppo sarà realizzato in Java, utilizzando l’ambiente Eclipse IDE. Verrà seguito un processo incrementale e iterativo dove ciascun componente sarà sviluppato, testato e integrato progressivamente per tutta la durata del progetto.</w:t>
+      </w:r>
+    </w:p>
+    <w:p>
+      <w:pPr>
+        <w:jc w:val="both"/>
+      </w:pPr>
+      <w:r>
+        <w:t xml:space="preserve">Controllo di versione: il codice sarà gestito tramite </w:t>
+      </w:r>
+      <w:proofErr w:type="spellStart"/>
+      <w:r>
+        <w:t>Git</w:t>
+      </w:r>
+      <w:proofErr w:type="spellEnd"/>
+      <w:r>
+        <w:t xml:space="preserve">, con repository su GitHub per il </w:t>
+      </w:r>
+      <w:proofErr w:type="spellStart"/>
+      <w:r>
+        <w:t>versioneamento</w:t>
+      </w:r>
+      <w:proofErr w:type="spellEnd"/>
+      <w:r>
+        <w:t xml:space="preserve">, la collaborazione e la revisione del codice. Ogni membro effettuerà </w:t>
+      </w:r>
+      <w:proofErr w:type="spellStart"/>
+      <w:r>
+        <w:t>commit</w:t>
+      </w:r>
+      <w:proofErr w:type="spellEnd"/>
+      <w:r>
+        <w:t xml:space="preserve"> regolari e aprirà pull </w:t>
+      </w:r>
+      <w:proofErr w:type="spellStart"/>
+      <w:r>
+        <w:t>request</w:t>
+      </w:r>
+      <w:proofErr w:type="spellEnd"/>
+      <w:r>
+        <w:t xml:space="preserve"> per l’integrazione del proprio lavoro.</w:t>
+      </w:r>
+    </w:p>
+    <w:p>
+      <w:pPr>
+        <w:jc w:val="both"/>
+      </w:pPr>
+      <w:r>
+        <w:t xml:space="preserve">Documentazione tecnica: sarà prodotta e mantenuta durante tutto il progetto, comprendendo specifiche dei requisiti, manuali tecnici e relazioni di test. I documenti saranno salvati in formato digitale condiviso e </w:t>
+      </w:r>
+      <w:proofErr w:type="spellStart"/>
+      <w:r>
+        <w:t>versionati</w:t>
+      </w:r>
+      <w:proofErr w:type="spellEnd"/>
+      <w:r>
+        <w:t xml:space="preserve"> insieme al codice.</w:t>
+      </w:r>
+    </w:p>
+    <w:p>
+      <w:pPr>
+        <w:jc w:val="both"/>
+      </w:pPr>
+      <w:r>
+        <w:t>Ambiente di prova: i test saranno condotti sui computer personali dotati di Java Development Kit (JDK) e Eclipse, replicando l’ambiente di esecuzione previsto.</w:t>
+      </w:r>
+    </w:p>
+    <w:p>
+      <w:pPr>
+        <w:jc w:val="both"/>
+      </w:pPr>
+      <w:r>
+        <w:t>Integrazione e test: i componenti saranno testati in ordine crescente di complessità, iniziando dai moduli di base fino alla versione integrata. I test di accettazione verranno eseguiti sotto la supervisione del gruppo, verificando la conformità ai requisiti funzionali e prestazionali.</w:t>
+      </w:r>
+    </w:p>
+    <w:p>
+      <w:pPr>
+        <w:jc w:val="both"/>
+      </w:pPr>
+    </w:p>
+    <w:p>
+      <w:pPr>
+        <w:jc w:val="both"/>
+      </w:pPr>
+    </w:p>
+    <w:p>
+      <w:pPr>
+        <w:jc w:val="both"/>
+      </w:pPr>
+    </w:p>
+    <w:p>
+      <w:pPr>
+        <w:jc w:val="both"/>
+      </w:pPr>
+    </w:p>
+    <w:p>
+      <w:pPr>
+        <w:jc w:val="both"/>
+      </w:pPr>
+    </w:p>
+    <w:p>
+      <w:pPr>
+        <w:jc w:val="both"/>
+      </w:pPr>
+    </w:p>
+    <w:p>
+      <w:pPr>
+        <w:jc w:val="both"/>
+      </w:pPr>
+    </w:p>
+    <w:p>
+      <w:pPr>
+        <w:jc w:val="both"/>
+      </w:pPr>
+    </w:p>
+    <w:p>
+      <w:pPr>
+        <w:jc w:val="both"/>
+      </w:pPr>
+    </w:p>
+    <w:p>
+      <w:pPr>
+        <w:jc w:val="both"/>
+      </w:pPr>
+    </w:p>
+    <w:p>
+      <w:pPr>
+        <w:jc w:val="both"/>
+      </w:pPr>
+    </w:p>
+    <w:p>
+      <w:pPr>
+        <w:jc w:val="both"/>
+      </w:pPr>
+    </w:p>
+    <w:p>
+      <w:pPr>
+        <w:jc w:val="both"/>
+      </w:pPr>
+    </w:p>
+    <w:p>
+      <w:pPr>
+        <w:jc w:val="both"/>
+        <w:rPr>
+          <w:b/>
+          <w:bCs/>
+          <w:sz w:val="28"/>
+          <w:szCs w:val="28"/>
+        </w:rPr>
+      </w:pPr>
+      <w:r>
+        <w:rPr>
+          <w:b/>
+          <w:bCs/>
+          <w:sz w:val="28"/>
+          <w:szCs w:val="28"/>
+        </w:rPr>
+        <w:lastRenderedPageBreak/>
+        <w:t>GARANZIE DI QUALITÀ</w:t>
+      </w:r>
+    </w:p>
+    <w:p>
+      <w:pPr>
+        <w:jc w:val="both"/>
+      </w:pPr>
+      <w:r>
+        <w:t>La garanzia della qualità del software sarà assicurata attraverso un insieme di procedure e controlli mirati a garantire che il prodotto finale soddisfi i requisiti definiti.</w:t>
+      </w:r>
+    </w:p>
+    <w:p>
+      <w:pPr>
+        <w:jc w:val="both"/>
+      </w:pPr>
+      <w:r>
+        <w:t>Revisione dei requisiti e del design: ogni documento e modello progettuale sarà rivisto in gruppo per verificarne la completezza e la coerenza con gli obiettivi del progetto.</w:t>
+      </w:r>
+    </w:p>
+    <w:p>
+      <w:pPr>
+        <w:jc w:val="both"/>
+      </w:pPr>
+      <w:r>
+        <w:t>Controllo della qualità del codice: verranno adottate convenzioni di programmazione condivise (stile, nomenclatura, formattazione) e saranno effettuate revisioni periodiche del codice tramite code review su GitHub.</w:t>
+      </w:r>
+    </w:p>
+    <w:p>
+      <w:pPr>
+        <w:jc w:val="both"/>
+      </w:pPr>
+      <w:r>
+        <w:t>Test di qualità: saranno realizzati test unitari, di integrazione e di sistema per garantire il corretto funzionamento del software. Gli esiti dei test saranno documentati in appositi report.</w:t>
+      </w:r>
+    </w:p>
+    <w:p>
+      <w:pPr>
+        <w:jc w:val="both"/>
+      </w:pPr>
+      <w:r>
+        <w:t>Tracciabilità: verrà mantenuta una corrispondenza tra requisiti, componenti implementati e casi di test, per assicurare la copertura completa delle funzionalità.</w:t>
+      </w:r>
+    </w:p>
+    <w:p>
+      <w:pPr>
+        <w:jc w:val="both"/>
+      </w:pPr>
+      <w:r>
+        <w:t xml:space="preserve">Gestione delle modifiche: eventuali correzioni o miglioramenti saranno tracciati nel sistema di </w:t>
+      </w:r>
+      <w:proofErr w:type="spellStart"/>
+      <w:r>
+        <w:t>versionamento</w:t>
+      </w:r>
+      <w:proofErr w:type="spellEnd"/>
+      <w:r>
+        <w:t xml:space="preserve"> </w:t>
+      </w:r>
+      <w:proofErr w:type="spellStart"/>
+      <w:r>
+        <w:t>Git</w:t>
+      </w:r>
+      <w:proofErr w:type="spellEnd"/>
+      <w:r>
+        <w:t>, garantendo il controllo delle revisioni e la riproducibilità del lavoro.</w:t>
+      </w:r>
+    </w:p>
+    <w:p>
+      <w:pPr>
+        <w:jc w:val="both"/>
+      </w:pPr>
+      <w:r>
+        <w:t>Verifica finale: prima della consegna, il software sarà sottoposto a un test di accettazione finale per confermare la conformità alle specifiche e la stabilità del sistema.</w:t>
+      </w:r>
+    </w:p>
+    <w:p>
+      <w:pPr>
+        <w:jc w:val="both"/>
+      </w:pPr>
+    </w:p>
+    <w:p>
+      <w:pPr>
+        <w:jc w:val="both"/>
+      </w:pPr>
+    </w:p>
+    <w:p>
+      <w:pPr>
+        <w:jc w:val="both"/>
+      </w:pPr>
+    </w:p>
+    <w:p>
+      <w:pPr>
+        <w:jc w:val="both"/>
+      </w:pPr>
+    </w:p>
+    <w:p>
+      <w:pPr>
+        <w:jc w:val="both"/>
+      </w:pPr>
+    </w:p>
+    <w:p>
+      <w:pPr>
+        <w:jc w:val="both"/>
+      </w:pPr>
+    </w:p>
+    <w:p>
+      <w:pPr>
+        <w:jc w:val="both"/>
+      </w:pPr>
+    </w:p>
+    <w:p>
+      <w:pPr>
+        <w:jc w:val="both"/>
+      </w:pPr>
+    </w:p>
+    <w:p>
+      <w:pPr>
+        <w:jc w:val="both"/>
+      </w:pPr>
+    </w:p>
+    <w:p>
+      <w:pPr>
+        <w:jc w:val="both"/>
+      </w:pPr>
+    </w:p>
+    <w:p>
+      <w:pPr>
+        <w:jc w:val="both"/>
+      </w:pPr>
+    </w:p>
+    <w:p>
+      <w:pPr>
+        <w:jc w:val="both"/>
+      </w:pPr>
+    </w:p>
+    <w:p>
+      <w:pPr>
+        <w:jc w:val="both"/>
+      </w:pPr>
+    </w:p>
+    <w:p>
+      <w:pPr>
+        <w:jc w:val="both"/>
+      </w:pPr>
+    </w:p>
+    <w:p>
+      <w:pPr>
+        <w:jc w:val="both"/>
+      </w:pPr>
+    </w:p>
+    <w:p>
+      <w:pPr>
+        <w:jc w:val="both"/>
+      </w:pPr>
+    </w:p>
+    <w:p>
+      <w:pPr>
+        <w:jc w:val="both"/>
+      </w:pPr>
+    </w:p>
+    <w:p>
+      <w:pPr>
+        <w:jc w:val="both"/>
+      </w:pPr>
+    </w:p>
+    <w:p>
+      <w:pPr>
+        <w:jc w:val="both"/>
+      </w:pPr>
+    </w:p>
+    <w:p>
+      <w:pPr>
+        <w:jc w:val="both"/>
+        <w:rPr>
+          <w:b/>
+          <w:bCs/>
+          <w:sz w:val="28"/>
+          <w:szCs w:val="28"/>
+        </w:rPr>
+      </w:pPr>
+      <w:r>
+        <w:rPr>
+          <w:b/>
+          <w:bCs/>
+          <w:sz w:val="28"/>
+          <w:szCs w:val="28"/>
+        </w:rPr>
         <w:t>PACCHETTI DI LAVORO</w:t>
       </w:r>
     </w:p>
     <w:p>
       <w:pPr>
         <w:spacing w:before="240" w:after="240" w:line="240" w:lineRule="auto"/>
+        <w:jc w:val="both"/>
         <w:rPr>
           <w:rFonts w:eastAsia="Times New Roman" w:cstheme="minorHAnsi"/>
           <w:kern w:val="0"/>
@@ -1717,6 +2639,7 @@
     <w:p>
       <w:pPr>
         <w:spacing w:before="240" w:after="0" w:line="240" w:lineRule="auto"/>
+        <w:jc w:val="both"/>
         <w:textAlignment w:val="baseline"/>
         <w:rPr>
           <w:rFonts w:eastAsia="Times New Roman" w:cstheme="minorHAnsi"/>
@@ -1756,6 +2679,7 @@
           <w:numId w:val="1"/>
         </w:numPr>
         <w:spacing w:after="0" w:line="240" w:lineRule="auto"/>
+        <w:jc w:val="both"/>
         <w:textAlignment w:val="baseline"/>
         <w:rPr>
           <w:rFonts w:eastAsia="Times New Roman" w:cstheme="minorHAnsi"/>
@@ -1817,6 +2741,7 @@
           <w:numId w:val="1"/>
         </w:numPr>
         <w:spacing w:after="0" w:line="240" w:lineRule="auto"/>
+        <w:jc w:val="both"/>
         <w:textAlignment w:val="baseline"/>
         <w:rPr>
           <w:rFonts w:eastAsia="Times New Roman" w:cstheme="minorHAnsi"/>
@@ -1888,6 +2813,7 @@
           <w:numId w:val="1"/>
         </w:numPr>
         <w:spacing w:after="0" w:line="240" w:lineRule="auto"/>
+        <w:jc w:val="both"/>
         <w:textAlignment w:val="baseline"/>
         <w:rPr>
           <w:rFonts w:eastAsia="Times New Roman" w:cstheme="minorHAnsi"/>
@@ -1912,6 +2838,7 @@
       <w:pPr>
         <w:spacing w:after="0" w:line="240" w:lineRule="auto"/>
         <w:ind w:left="1440"/>
+        <w:jc w:val="both"/>
         <w:textAlignment w:val="baseline"/>
         <w:rPr>
           <w:rFonts w:eastAsia="Times New Roman" w:cstheme="minorHAnsi"/>
@@ -1925,6 +2852,7 @@
     <w:p>
       <w:pPr>
         <w:spacing w:after="0" w:line="240" w:lineRule="auto"/>
+        <w:jc w:val="both"/>
         <w:textAlignment w:val="baseline"/>
         <w:rPr>
           <w:rFonts w:eastAsia="Times New Roman" w:cstheme="minorHAnsi"/>
@@ -1964,6 +2892,7 @@
           <w:numId w:val="1"/>
         </w:numPr>
         <w:spacing w:after="0" w:line="240" w:lineRule="auto"/>
+        <w:jc w:val="both"/>
         <w:textAlignment w:val="baseline"/>
         <w:rPr>
           <w:rFonts w:eastAsia="Times New Roman" w:cstheme="minorHAnsi"/>
@@ -1991,6 +2920,7 @@
           <w:numId w:val="1"/>
         </w:numPr>
         <w:spacing w:after="0" w:line="240" w:lineRule="auto"/>
+        <w:jc w:val="both"/>
         <w:textAlignment w:val="baseline"/>
         <w:rPr>
           <w:rFonts w:eastAsia="Times New Roman" w:cstheme="minorHAnsi"/>
@@ -2018,6 +2948,7 @@
           <w:numId w:val="1"/>
         </w:numPr>
         <w:spacing w:after="0" w:line="240" w:lineRule="auto"/>
+        <w:jc w:val="both"/>
         <w:textAlignment w:val="baseline"/>
         <w:rPr>
           <w:rFonts w:eastAsia="Times New Roman" w:cstheme="minorHAnsi"/>
@@ -2045,6 +2976,7 @@
           <w:numId w:val="1"/>
         </w:numPr>
         <w:spacing w:after="0" w:line="240" w:lineRule="auto"/>
+        <w:jc w:val="both"/>
         <w:textAlignment w:val="baseline"/>
         <w:rPr>
           <w:rFonts w:eastAsia="Times New Roman" w:cstheme="minorHAnsi"/>
@@ -2069,6 +3001,7 @@
       <w:pPr>
         <w:spacing w:after="0" w:line="240" w:lineRule="auto"/>
         <w:ind w:left="1440"/>
+        <w:jc w:val="both"/>
         <w:textAlignment w:val="baseline"/>
         <w:rPr>
           <w:rFonts w:eastAsia="Times New Roman" w:cstheme="minorHAnsi"/>
@@ -2082,6 +3015,7 @@
     <w:p>
       <w:pPr>
         <w:spacing w:after="0" w:line="240" w:lineRule="auto"/>
+        <w:jc w:val="both"/>
         <w:textAlignment w:val="baseline"/>
         <w:rPr>
           <w:rFonts w:eastAsia="Times New Roman" w:cstheme="minorHAnsi"/>
@@ -2121,6 +3055,7 @@
           <w:numId w:val="1"/>
         </w:numPr>
         <w:spacing w:after="0" w:line="240" w:lineRule="auto"/>
+        <w:jc w:val="both"/>
         <w:textAlignment w:val="baseline"/>
         <w:rPr>
           <w:rFonts w:eastAsia="Times New Roman" w:cstheme="minorHAnsi"/>
@@ -2160,6 +3095,7 @@
           <w:numId w:val="1"/>
         </w:numPr>
         <w:spacing w:after="0" w:line="240" w:lineRule="auto"/>
+        <w:jc w:val="both"/>
         <w:textAlignment w:val="baseline"/>
         <w:rPr>
           <w:rFonts w:eastAsia="Times New Roman" w:cstheme="minorHAnsi"/>
@@ -2187,6 +3123,7 @@
           <w:numId w:val="1"/>
         </w:numPr>
         <w:spacing w:after="0" w:line="240" w:lineRule="auto"/>
+        <w:jc w:val="both"/>
         <w:textAlignment w:val="baseline"/>
         <w:rPr>
           <w:rFonts w:eastAsia="Times New Roman" w:cstheme="minorHAnsi"/>
@@ -2258,6 +3195,7 @@
           <w:numId w:val="1"/>
         </w:numPr>
         <w:spacing w:after="0" w:line="240" w:lineRule="auto"/>
+        <w:jc w:val="both"/>
         <w:textAlignment w:val="baseline"/>
         <w:rPr>
           <w:rFonts w:eastAsia="Times New Roman" w:cstheme="minorHAnsi"/>
@@ -2285,6 +3223,7 @@
           <w:numId w:val="1"/>
         </w:numPr>
         <w:spacing w:after="0" w:line="240" w:lineRule="auto"/>
+        <w:jc w:val="both"/>
         <w:textAlignment w:val="baseline"/>
         <w:rPr>
           <w:rFonts w:eastAsia="Times New Roman" w:cstheme="minorHAnsi"/>
@@ -2334,6 +3273,7 @@
           <w:numId w:val="1"/>
         </w:numPr>
         <w:spacing w:after="0" w:line="240" w:lineRule="auto"/>
+        <w:jc w:val="both"/>
         <w:textAlignment w:val="baseline"/>
         <w:rPr>
           <w:rFonts w:eastAsia="Times New Roman" w:cstheme="minorHAnsi"/>
@@ -2358,6 +3298,7 @@
       <w:pPr>
         <w:spacing w:after="0" w:line="240" w:lineRule="auto"/>
         <w:ind w:left="1440"/>
+        <w:jc w:val="both"/>
         <w:textAlignment w:val="baseline"/>
         <w:rPr>
           <w:rFonts w:eastAsia="Times New Roman" w:cstheme="minorHAnsi"/>
@@ -2371,6 +3312,7 @@
     <w:p>
       <w:pPr>
         <w:spacing w:after="0" w:line="240" w:lineRule="auto"/>
+        <w:jc w:val="both"/>
         <w:textAlignment w:val="baseline"/>
         <w:rPr>
           <w:rFonts w:eastAsia="Times New Roman" w:cstheme="minorHAnsi"/>
@@ -2410,6 +3352,7 @@
           <w:numId w:val="1"/>
         </w:numPr>
         <w:spacing w:after="0" w:line="240" w:lineRule="auto"/>
+        <w:jc w:val="both"/>
         <w:textAlignment w:val="baseline"/>
         <w:rPr>
           <w:rFonts w:eastAsia="Times New Roman" w:cstheme="minorHAnsi"/>
@@ -2459,6 +3402,7 @@
           <w:numId w:val="1"/>
         </w:numPr>
         <w:spacing w:after="0" w:line="240" w:lineRule="auto"/>
+        <w:jc w:val="both"/>
         <w:textAlignment w:val="baseline"/>
         <w:rPr>
           <w:rFonts w:eastAsia="Times New Roman" w:cstheme="minorHAnsi"/>
@@ -2530,6 +3474,7 @@
           <w:numId w:val="1"/>
         </w:numPr>
         <w:spacing w:after="0" w:line="240" w:lineRule="auto"/>
+        <w:jc w:val="both"/>
         <w:textAlignment w:val="baseline"/>
         <w:rPr>
           <w:rFonts w:eastAsia="Times New Roman" w:cstheme="minorHAnsi"/>
@@ -2557,6 +3502,7 @@
           <w:numId w:val="1"/>
         </w:numPr>
         <w:spacing w:after="0" w:line="240" w:lineRule="auto"/>
+        <w:jc w:val="both"/>
         <w:textAlignment w:val="baseline"/>
         <w:rPr>
           <w:rFonts w:eastAsia="Times New Roman" w:cstheme="minorHAnsi"/>
@@ -2603,6 +3549,7 @@
       <w:pPr>
         <w:spacing w:after="0" w:line="240" w:lineRule="auto"/>
         <w:ind w:left="1440"/>
+        <w:jc w:val="both"/>
         <w:textAlignment w:val="baseline"/>
         <w:rPr>
           <w:rFonts w:eastAsia="Times New Roman" w:cstheme="minorHAnsi"/>
@@ -2616,6 +3563,7 @@
     <w:p>
       <w:pPr>
         <w:spacing w:after="0" w:line="240" w:lineRule="auto"/>
+        <w:jc w:val="both"/>
         <w:textAlignment w:val="baseline"/>
         <w:rPr>
           <w:rFonts w:eastAsia="Times New Roman" w:cstheme="minorHAnsi"/>
@@ -2655,6 +3603,7 @@
           <w:numId w:val="1"/>
         </w:numPr>
         <w:spacing w:after="0" w:line="240" w:lineRule="auto"/>
+        <w:jc w:val="both"/>
         <w:textAlignment w:val="baseline"/>
         <w:rPr>
           <w:rFonts w:eastAsia="Times New Roman" w:cstheme="minorHAnsi"/>
@@ -2682,6 +3631,7 @@
           <w:numId w:val="1"/>
         </w:numPr>
         <w:spacing w:after="0" w:line="240" w:lineRule="auto"/>
+        <w:jc w:val="both"/>
         <w:textAlignment w:val="baseline"/>
         <w:rPr>
           <w:rFonts w:eastAsia="Times New Roman" w:cstheme="minorHAnsi"/>
@@ -2709,6 +3659,7 @@
           <w:numId w:val="1"/>
         </w:numPr>
         <w:spacing w:after="0" w:line="240" w:lineRule="auto"/>
+        <w:jc w:val="both"/>
         <w:textAlignment w:val="baseline"/>
         <w:rPr>
           <w:rFonts w:eastAsia="Times New Roman" w:cstheme="minorHAnsi"/>
@@ -2733,6 +3684,7 @@
       <w:pPr>
         <w:spacing w:after="0" w:line="240" w:lineRule="auto"/>
         <w:ind w:left="1440"/>
+        <w:jc w:val="both"/>
         <w:textAlignment w:val="baseline"/>
         <w:rPr>
           <w:rFonts w:eastAsia="Times New Roman" w:cstheme="minorHAnsi"/>
@@ -2746,6 +3698,7 @@
     <w:p>
       <w:pPr>
         <w:spacing w:after="0" w:line="240" w:lineRule="auto"/>
+        <w:jc w:val="both"/>
         <w:textAlignment w:val="baseline"/>
         <w:rPr>
           <w:rFonts w:eastAsia="Times New Roman" w:cstheme="minorHAnsi"/>
@@ -2797,6 +3750,7 @@
           <w:numId w:val="1"/>
         </w:numPr>
         <w:spacing w:after="0" w:line="240" w:lineRule="auto"/>
+        <w:jc w:val="both"/>
         <w:textAlignment w:val="baseline"/>
         <w:rPr>
           <w:rFonts w:eastAsia="Times New Roman" w:cstheme="minorHAnsi"/>
@@ -2824,6 +3778,7 @@
           <w:numId w:val="1"/>
         </w:numPr>
         <w:spacing w:after="0" w:line="240" w:lineRule="auto"/>
+        <w:jc w:val="both"/>
         <w:textAlignment w:val="baseline"/>
         <w:rPr>
           <w:rFonts w:eastAsia="Times New Roman" w:cstheme="minorHAnsi"/>
@@ -2848,6 +3803,7 @@
       <w:pPr>
         <w:spacing w:after="0" w:line="240" w:lineRule="auto"/>
         <w:ind w:left="1440"/>
+        <w:jc w:val="both"/>
         <w:textAlignment w:val="baseline"/>
         <w:rPr>
           <w:rFonts w:eastAsia="Times New Roman" w:cstheme="minorHAnsi"/>
@@ -2861,6 +3817,7 @@
     <w:p>
       <w:pPr>
         <w:spacing w:after="0" w:line="240" w:lineRule="auto"/>
+        <w:jc w:val="both"/>
         <w:textAlignment w:val="baseline"/>
         <w:rPr>
           <w:rFonts w:eastAsia="Times New Roman" w:cstheme="minorHAnsi"/>
@@ -2920,6 +3877,7 @@
           <w:numId w:val="1"/>
         </w:numPr>
         <w:spacing w:after="0" w:line="240" w:lineRule="auto"/>
+        <w:jc w:val="both"/>
         <w:textAlignment w:val="baseline"/>
         <w:rPr>
           <w:rFonts w:eastAsia="Times New Roman" w:cstheme="minorHAnsi"/>
@@ -2947,6 +3905,7 @@
           <w:numId w:val="1"/>
         </w:numPr>
         <w:spacing w:after="0" w:line="240" w:lineRule="auto"/>
+        <w:jc w:val="both"/>
         <w:textAlignment w:val="baseline"/>
         <w:rPr>
           <w:rFonts w:eastAsia="Times New Roman" w:cstheme="minorHAnsi"/>
@@ -2971,6 +3930,7 @@
       <w:pPr>
         <w:spacing w:after="0" w:line="240" w:lineRule="auto"/>
         <w:ind w:left="1440"/>
+        <w:jc w:val="both"/>
         <w:textAlignment w:val="baseline"/>
         <w:rPr>
           <w:rFonts w:eastAsia="Times New Roman" w:cstheme="minorHAnsi"/>
@@ -2984,6 +3944,7 @@
     <w:p>
       <w:pPr>
         <w:spacing w:after="0" w:line="240" w:lineRule="auto"/>
+        <w:jc w:val="both"/>
         <w:textAlignment w:val="baseline"/>
         <w:rPr>
           <w:rFonts w:eastAsia="Times New Roman" w:cstheme="minorHAnsi"/>
@@ -2997,6 +3958,7 @@
     <w:p>
       <w:pPr>
         <w:spacing w:after="0" w:line="240" w:lineRule="auto"/>
+        <w:jc w:val="both"/>
         <w:textAlignment w:val="baseline"/>
         <w:rPr>
           <w:rFonts w:eastAsia="Times New Roman" w:cstheme="minorHAnsi"/>
@@ -3016,7 +3978,6 @@
           <w:lang w:eastAsia="it-IT"/>
           <w14:ligatures w14:val="none"/>
         </w:rPr>
-        <w:lastRenderedPageBreak/>
         <w:t xml:space="preserve">8- </w:t>
       </w:r>
       <w:r>
@@ -3039,6 +4000,7 @@
           <w:numId w:val="1"/>
         </w:numPr>
         <w:spacing w:after="0" w:line="240" w:lineRule="auto"/>
+        <w:jc w:val="both"/>
         <w:textAlignment w:val="baseline"/>
         <w:rPr>
           <w:rFonts w:eastAsia="Times New Roman" w:cstheme="minorHAnsi"/>
@@ -3076,6 +4038,7 @@
           <w:numId w:val="1"/>
         </w:numPr>
         <w:spacing w:after="0" w:line="240" w:lineRule="auto"/>
+        <w:jc w:val="both"/>
         <w:textAlignment w:val="baseline"/>
         <w:rPr>
           <w:rFonts w:eastAsia="Times New Roman" w:cstheme="minorHAnsi"/>
@@ -3096,37 +4059,149 @@
         <w:t>Modifiche grafiche per interfaccia più user-friendly</w:t>
       </w:r>
     </w:p>
-    <w:p/>
-    <w:p/>
-    <w:p/>
-    <w:p/>
-    <w:p/>
-    <w:p/>
-    <w:p/>
-    <w:p/>
-    <w:p/>
-    <w:p/>
-    <w:p/>
-    <w:p/>
-    <w:p/>
-    <w:p/>
-    <w:p/>
-    <w:p/>
-    <w:p/>
-    <w:p/>
-    <w:p/>
-    <w:p/>
-    <w:p/>
-    <w:p/>
-    <w:p/>
-    <w:p/>
-    <w:p/>
-    <w:p/>
-    <w:p/>
-    <w:p/>
-    <w:p/>
-    <w:p>
-      <w:pPr>
+    <w:p>
+      <w:pPr>
+        <w:jc w:val="both"/>
+      </w:pPr>
+    </w:p>
+    <w:p>
+      <w:pPr>
+        <w:jc w:val="both"/>
+      </w:pPr>
+    </w:p>
+    <w:p>
+      <w:pPr>
+        <w:jc w:val="both"/>
+      </w:pPr>
+    </w:p>
+    <w:p>
+      <w:pPr>
+        <w:jc w:val="both"/>
+      </w:pPr>
+    </w:p>
+    <w:p>
+      <w:pPr>
+        <w:jc w:val="both"/>
+      </w:pPr>
+    </w:p>
+    <w:p>
+      <w:pPr>
+        <w:jc w:val="both"/>
+      </w:pPr>
+    </w:p>
+    <w:p>
+      <w:pPr>
+        <w:jc w:val="both"/>
+      </w:pPr>
+    </w:p>
+    <w:p>
+      <w:pPr>
+        <w:jc w:val="both"/>
+      </w:pPr>
+    </w:p>
+    <w:p>
+      <w:pPr>
+        <w:jc w:val="both"/>
+      </w:pPr>
+    </w:p>
+    <w:p>
+      <w:pPr>
+        <w:jc w:val="both"/>
+      </w:pPr>
+    </w:p>
+    <w:p>
+      <w:pPr>
+        <w:jc w:val="both"/>
+      </w:pPr>
+    </w:p>
+    <w:p>
+      <w:pPr>
+        <w:jc w:val="both"/>
+      </w:pPr>
+    </w:p>
+    <w:p>
+      <w:pPr>
+        <w:jc w:val="both"/>
+      </w:pPr>
+    </w:p>
+    <w:p>
+      <w:pPr>
+        <w:jc w:val="both"/>
+      </w:pPr>
+    </w:p>
+    <w:p>
+      <w:pPr>
+        <w:jc w:val="both"/>
+      </w:pPr>
+    </w:p>
+    <w:p>
+      <w:pPr>
+        <w:jc w:val="both"/>
+      </w:pPr>
+    </w:p>
+    <w:p>
+      <w:pPr>
+        <w:jc w:val="both"/>
+      </w:pPr>
+    </w:p>
+    <w:p>
+      <w:pPr>
+        <w:jc w:val="both"/>
+      </w:pPr>
+    </w:p>
+    <w:p>
+      <w:pPr>
+        <w:jc w:val="both"/>
+      </w:pPr>
+    </w:p>
+    <w:p>
+      <w:pPr>
+        <w:jc w:val="both"/>
+      </w:pPr>
+    </w:p>
+    <w:p>
+      <w:pPr>
+        <w:jc w:val="both"/>
+      </w:pPr>
+    </w:p>
+    <w:p>
+      <w:pPr>
+        <w:jc w:val="both"/>
+      </w:pPr>
+    </w:p>
+    <w:p>
+      <w:pPr>
+        <w:jc w:val="both"/>
+      </w:pPr>
+    </w:p>
+    <w:p>
+      <w:pPr>
+        <w:jc w:val="both"/>
+      </w:pPr>
+    </w:p>
+    <w:p>
+      <w:pPr>
+        <w:jc w:val="both"/>
+      </w:pPr>
+    </w:p>
+    <w:p>
+      <w:pPr>
+        <w:jc w:val="both"/>
+      </w:pPr>
+    </w:p>
+    <w:p>
+      <w:pPr>
+        <w:jc w:val="both"/>
+      </w:pPr>
+    </w:p>
+    <w:p>
+      <w:pPr>
+        <w:jc w:val="both"/>
+      </w:pPr>
+    </w:p>
+    <w:p>
+      <w:pPr>
+        <w:jc w:val="both"/>
         <w:rPr>
           <w:b/>
           <w:bCs/>
@@ -3137,6 +4212,7 @@
     </w:p>
     <w:p>
       <w:pPr>
+        <w:jc w:val="both"/>
         <w:rPr>
           <w:b/>
           <w:bCs/>
@@ -3162,6 +4238,7 @@
           <w:ilvl w:val="0"/>
           <w:numId w:val="2"/>
         </w:numPr>
+        <w:jc w:val="both"/>
       </w:pPr>
       <w:r>
         <w:t xml:space="preserve">Risorse </w:t>
@@ -3179,6 +4256,7 @@
           <w:ilvl w:val="1"/>
           <w:numId w:val="2"/>
         </w:numPr>
+        <w:jc w:val="both"/>
       </w:pPr>
       <w:r>
         <w:t>4 membri del team di sviluppo</w:t>
@@ -3190,6 +4268,7 @@
           <w:ilvl w:val="0"/>
           <w:numId w:val="2"/>
         </w:numPr>
+        <w:jc w:val="both"/>
       </w:pPr>
       <w:r>
         <w:t xml:space="preserve">Software </w:t>
@@ -3204,6 +4283,7 @@
           <w:ilvl w:val="1"/>
           <w:numId w:val="2"/>
         </w:numPr>
+        <w:jc w:val="both"/>
       </w:pPr>
       <w:r>
         <w:t>IDE: Eclipse IDE for Java Developers - 2025-09</w:t>
@@ -3215,6 +4295,7 @@
           <w:ilvl w:val="1"/>
           <w:numId w:val="2"/>
         </w:numPr>
+        <w:jc w:val="both"/>
       </w:pPr>
       <w:r>
         <w:t>JDK (Java Development Kit) + inserire versione</w:t>
@@ -3226,6 +4307,7 @@
           <w:ilvl w:val="1"/>
           <w:numId w:val="2"/>
         </w:numPr>
+        <w:jc w:val="both"/>
       </w:pPr>
       <w:r>
         <w:t>GitHub (per repository privato).</w:t>
@@ -3237,6 +4319,7 @@
           <w:ilvl w:val="1"/>
           <w:numId w:val="2"/>
         </w:numPr>
+        <w:jc w:val="both"/>
       </w:pPr>
       <w:proofErr w:type="spellStart"/>
       <w:r>
@@ -3261,6 +4344,7 @@
           <w:ilvl w:val="1"/>
           <w:numId w:val="2"/>
         </w:numPr>
+        <w:jc w:val="both"/>
       </w:pPr>
       <w:proofErr w:type="spellStart"/>
       <w:r>
@@ -3277,6 +4361,7 @@
           <w:ilvl w:val="1"/>
           <w:numId w:val="2"/>
         </w:numPr>
+        <w:jc w:val="both"/>
       </w:pPr>
       <w:r>
         <w:t>Spring Boot + inserire versione</w:t>
@@ -3288,6 +4373,7 @@
           <w:ilvl w:val="1"/>
           <w:numId w:val="2"/>
         </w:numPr>
+        <w:jc w:val="both"/>
       </w:pPr>
       <w:proofErr w:type="spellStart"/>
       <w:r>
@@ -3304,6 +4390,7 @@
           <w:ilvl w:val="1"/>
           <w:numId w:val="2"/>
         </w:numPr>
+        <w:jc w:val="both"/>
       </w:pPr>
       <w:proofErr w:type="spellStart"/>
       <w:r>
@@ -3320,6 +4407,7 @@
           <w:ilvl w:val="1"/>
           <w:numId w:val="2"/>
         </w:numPr>
+        <w:jc w:val="both"/>
       </w:pPr>
       <w:r>
         <w:t>Nessuna licenza</w:t>
@@ -3340,6 +4428,7 @@
           <w:ilvl w:val="0"/>
           <w:numId w:val="2"/>
         </w:numPr>
+        <w:jc w:val="both"/>
       </w:pPr>
       <w:r>
         <w:t>Software (</w:t>
@@ -3363,6 +4452,7 @@
           <w:ilvl w:val="1"/>
           <w:numId w:val="2"/>
         </w:numPr>
+        <w:jc w:val="both"/>
       </w:pPr>
       <w:r>
         <w:t>WhatsApp (comunicazione quotidiana).</w:t>
@@ -3374,6 +4464,7 @@
           <w:ilvl w:val="1"/>
           <w:numId w:val="2"/>
         </w:numPr>
+        <w:jc w:val="both"/>
       </w:pPr>
       <w:r>
         <w:t>Google Drive (documentazione iniziale aggiornata)</w:t>
@@ -3385,6 +4476,7 @@
           <w:ilvl w:val="1"/>
           <w:numId w:val="2"/>
         </w:numPr>
+        <w:jc w:val="both"/>
       </w:pPr>
       <w:r>
         <w:t xml:space="preserve">GitHub </w:t>
@@ -3410,6 +4502,7 @@
           <w:ilvl w:val="0"/>
           <w:numId w:val="2"/>
         </w:numPr>
+        <w:jc w:val="both"/>
       </w:pPr>
       <w:r>
         <w:t>Hardware:</w:t>
@@ -3421,6 +4514,7 @@
           <w:ilvl w:val="1"/>
           <w:numId w:val="2"/>
         </w:numPr>
+        <w:jc w:val="both"/>
       </w:pPr>
       <w:r>
         <w:t>PC di ogni membro del team</w:t>
@@ -3429,21 +4523,69 @@
         <w:t xml:space="preserve"> già in suo possesso</w:t>
       </w:r>
     </w:p>
-    <w:p/>
-    <w:p/>
-    <w:p/>
-    <w:p/>
-    <w:p/>
-    <w:p/>
-    <w:p/>
-    <w:p/>
-    <w:p/>
-    <w:p/>
-    <w:p/>
-    <w:p/>
-    <w:p/>
-    <w:p>
-      <w:pPr>
+    <w:p>
+      <w:pPr>
+        <w:jc w:val="both"/>
+      </w:pPr>
+    </w:p>
+    <w:p>
+      <w:pPr>
+        <w:jc w:val="both"/>
+      </w:pPr>
+    </w:p>
+    <w:p>
+      <w:pPr>
+        <w:jc w:val="both"/>
+      </w:pPr>
+    </w:p>
+    <w:p>
+      <w:pPr>
+        <w:jc w:val="both"/>
+      </w:pPr>
+    </w:p>
+    <w:p>
+      <w:pPr>
+        <w:jc w:val="both"/>
+      </w:pPr>
+    </w:p>
+    <w:p>
+      <w:pPr>
+        <w:jc w:val="both"/>
+      </w:pPr>
+    </w:p>
+    <w:p>
+      <w:pPr>
+        <w:jc w:val="both"/>
+      </w:pPr>
+    </w:p>
+    <w:p>
+      <w:pPr>
+        <w:jc w:val="both"/>
+      </w:pPr>
+    </w:p>
+    <w:p>
+      <w:pPr>
+        <w:jc w:val="both"/>
+      </w:pPr>
+    </w:p>
+    <w:p>
+      <w:pPr>
+        <w:jc w:val="both"/>
+      </w:pPr>
+    </w:p>
+    <w:p>
+      <w:pPr>
+        <w:jc w:val="both"/>
+      </w:pPr>
+    </w:p>
+    <w:p>
+      <w:pPr>
+        <w:jc w:val="both"/>
+      </w:pPr>
+    </w:p>
+    <w:p>
+      <w:pPr>
+        <w:jc w:val="both"/>
         <w:rPr>
           <w:b/>
           <w:bCs/>
@@ -3458,10 +4600,14 @@
           <w:sz w:val="28"/>
           <w:szCs w:val="28"/>
         </w:rPr>
+        <w:lastRenderedPageBreak/>
         <w:t>BUDGET</w:t>
       </w:r>
     </w:p>
     <w:p>
+      <w:pPr>
+        <w:jc w:val="both"/>
+      </w:pPr>
       <w:r>
         <w:t>Trattandosi di un progetto sviluppato in ambito accademico, il budget monetario è pari a zero.</w:t>
       </w:r>
@@ -3472,6 +4618,7 @@
           <w:ilvl w:val="0"/>
           <w:numId w:val="7"/>
         </w:numPr>
+        <w:jc w:val="both"/>
       </w:pPr>
       <w:r>
         <w:t xml:space="preserve">Costi </w:t>
@@ -3490,6 +4637,9 @@
       </w:r>
     </w:p>
     <w:p>
+      <w:pPr>
+        <w:jc w:val="both"/>
+      </w:pPr>
       <w:r>
         <w:t xml:space="preserve">Tutte le tecnologie e piattaforme utilizzate (Java, </w:t>
       </w:r>
@@ -3527,6 +4677,7 @@
           <w:ilvl w:val="0"/>
           <w:numId w:val="5"/>
         </w:numPr>
+        <w:jc w:val="both"/>
       </w:pPr>
       <w:r>
         <w:t xml:space="preserve">Costi </w:t>
@@ -3545,6 +4696,9 @@
       </w:r>
     </w:p>
     <w:p>
+      <w:pPr>
+        <w:jc w:val="both"/>
+      </w:pPr>
       <w:r>
         <w:t>Ogni membro utilizza il proprio PC personale già in suo possesso.</w:t>
       </w:r>
@@ -3555,6 +4709,7 @@
           <w:ilvl w:val="0"/>
           <w:numId w:val="6"/>
         </w:numPr>
+        <w:jc w:val="both"/>
       </w:pPr>
       <w:r>
         <w:t xml:space="preserve">Costi di </w:t>
@@ -3570,75 +4725,405 @@
       </w:r>
     </w:p>
     <w:p>
+      <w:pPr>
+        <w:jc w:val="both"/>
+      </w:pPr>
       <w:r>
         <w:t>Il lavoro fa parte del percorso formativo universitario. Non sono previsti compensi economici.</w:t>
       </w:r>
     </w:p>
-    <w:p/>
-    <w:p/>
-    <w:p/>
-    <w:p/>
-    <w:p/>
-    <w:p/>
-    <w:p/>
-    <w:p/>
-    <w:p/>
-    <w:p/>
-    <w:p/>
-    <w:p/>
-    <w:p/>
-    <w:p/>
-    <w:p/>
-    <w:p/>
-    <w:p/>
-    <w:p/>
-    <w:p/>
-    <w:p/>
-    <w:p/>
-    <w:p/>
-    <w:p/>
-    <w:p>
-      <w:r>
+    <w:p>
+      <w:pPr>
+        <w:jc w:val="both"/>
+      </w:pPr>
+    </w:p>
+    <w:p>
+      <w:pPr>
+        <w:jc w:val="both"/>
+      </w:pPr>
+    </w:p>
+    <w:p>
+      <w:pPr>
+        <w:jc w:val="both"/>
+      </w:pPr>
+    </w:p>
+    <w:p>
+      <w:pPr>
+        <w:jc w:val="both"/>
+      </w:pPr>
+    </w:p>
+    <w:p>
+      <w:pPr>
+        <w:jc w:val="both"/>
+      </w:pPr>
+    </w:p>
+    <w:p>
+      <w:pPr>
+        <w:jc w:val="both"/>
+      </w:pPr>
+    </w:p>
+    <w:p>
+      <w:pPr>
+        <w:jc w:val="both"/>
+      </w:pPr>
+    </w:p>
+    <w:p>
+      <w:pPr>
+        <w:jc w:val="both"/>
+      </w:pPr>
+    </w:p>
+    <w:p>
+      <w:pPr>
+        <w:jc w:val="both"/>
+      </w:pPr>
+    </w:p>
+    <w:p>
+      <w:pPr>
+        <w:jc w:val="both"/>
+      </w:pPr>
+    </w:p>
+    <w:p>
+      <w:pPr>
+        <w:jc w:val="both"/>
+      </w:pPr>
+    </w:p>
+    <w:p>
+      <w:pPr>
+        <w:jc w:val="both"/>
+      </w:pPr>
+    </w:p>
+    <w:p>
+      <w:pPr>
+        <w:jc w:val="both"/>
+      </w:pPr>
+    </w:p>
+    <w:p>
+      <w:pPr>
+        <w:jc w:val="both"/>
+      </w:pPr>
+    </w:p>
+    <w:p>
+      <w:pPr>
+        <w:jc w:val="both"/>
+      </w:pPr>
+    </w:p>
+    <w:p>
+      <w:pPr>
+        <w:jc w:val="both"/>
+      </w:pPr>
+    </w:p>
+    <w:p>
+      <w:pPr>
+        <w:jc w:val="both"/>
+      </w:pPr>
+    </w:p>
+    <w:p>
+      <w:pPr>
+        <w:jc w:val="both"/>
+      </w:pPr>
+    </w:p>
+    <w:p>
+      <w:pPr>
+        <w:jc w:val="both"/>
+      </w:pPr>
+    </w:p>
+    <w:p>
+      <w:pPr>
+        <w:jc w:val="both"/>
+      </w:pPr>
+    </w:p>
+    <w:p>
+      <w:pPr>
+        <w:jc w:val="both"/>
+      </w:pPr>
+    </w:p>
+    <w:p>
+      <w:pPr>
+        <w:jc w:val="both"/>
+      </w:pPr>
+    </w:p>
+    <w:p>
+      <w:pPr>
+        <w:jc w:val="both"/>
+      </w:pPr>
+    </w:p>
+    <w:p>
+      <w:pPr>
+        <w:jc w:val="both"/>
+        <w:rPr>
+          <w:b/>
+          <w:bCs/>
+          <w:sz w:val="28"/>
+          <w:szCs w:val="28"/>
+        </w:rPr>
+      </w:pPr>
+      <w:r>
+        <w:rPr>
+          <w:b/>
+          <w:bCs/>
+          <w:sz w:val="28"/>
+          <w:szCs w:val="28"/>
+        </w:rPr>
+        <w:lastRenderedPageBreak/>
         <w:t>CAMBIAMENTI</w:t>
       </w:r>
     </w:p>
-    <w:p/>
-    <w:p/>
-    <w:p/>
-    <w:p/>
-    <w:p/>
-    <w:p/>
-    <w:p/>
-    <w:p/>
-    <w:p/>
-    <w:p/>
-    <w:p/>
-    <w:p/>
-    <w:p/>
-    <w:p/>
-    <w:p/>
-    <w:p/>
-    <w:p/>
-    <w:p/>
-    <w:p/>
-    <w:p/>
-    <w:p/>
-    <w:p/>
-    <w:p/>
-    <w:p/>
-    <w:p/>
-    <w:p/>
-    <w:p/>
-    <w:p/>
-    <w:p/>
-    <w:p/>
-    <w:p/>
-    <w:p>
-      <w:r>
+    <w:p>
+      <w:pPr>
+        <w:jc w:val="both"/>
+      </w:pPr>
+      <w:r>
+        <w:t>Nel corso del progetto potranno verificarsi modifiche ai requisiti o all’implementazione di grande impatto sul progetto. È quindi necessario gestire tali cambiamenti in modo ordinato e tracciabile, per evitare incoerenze o perdite di qualità del progetto.</w:t>
+      </w:r>
+    </w:p>
+    <w:p>
+      <w:pPr>
+        <w:jc w:val="both"/>
+      </w:pPr>
+      <w:r>
+        <w:t>Poiché il progetto segue un approccio iterativo e leggero, i cambiamenti corposi saranno gestiti in maniera agile: ogni nuova iterazione di questo tipo introdurrà miglioramenti del software con una documentazione ben dettagliata.</w:t>
+      </w:r>
+    </w:p>
+    <w:p>
+      <w:pPr>
+        <w:jc w:val="both"/>
+      </w:pPr>
+      <w:r>
+        <w:t>Tuttavia, per garantire il controllo e la coerenza del lavoro svolto, verranno seguite procedure condivise:</w:t>
+      </w:r>
+    </w:p>
+    <w:p>
+      <w:pPr>
+        <w:jc w:val="both"/>
+      </w:pPr>
+      <w:r>
+        <w:t>Ogni proposta di modifica (ai requisiti, al design o al codice) dovrà essere discussa e approvata dal gruppo, in particolare dal Project Manager.</w:t>
+      </w:r>
+    </w:p>
+    <w:p>
+      <w:pPr>
+        <w:jc w:val="both"/>
+      </w:pPr>
+      <w:r>
+        <w:t>Una volta approvata, la modifica sarà documentata brevemente indicando la motivazione, l’impatto stimato e i file coinvolti.</w:t>
+      </w:r>
+    </w:p>
+    <w:p>
+      <w:pPr>
+        <w:jc w:val="both"/>
+      </w:pPr>
+      <w:r>
+        <w:t xml:space="preserve">Le modifiche al codice saranno gestite tramite </w:t>
+      </w:r>
+      <w:proofErr w:type="spellStart"/>
+      <w:r>
+        <w:t>Git</w:t>
+      </w:r>
+      <w:proofErr w:type="spellEnd"/>
+      <w:r>
+        <w:t xml:space="preserve">, creando un nuovo </w:t>
+      </w:r>
+      <w:proofErr w:type="spellStart"/>
+      <w:r>
+        <w:t>branch</w:t>
+      </w:r>
+      <w:proofErr w:type="spellEnd"/>
+      <w:r>
+        <w:t xml:space="preserve"> o </w:t>
+      </w:r>
+      <w:proofErr w:type="spellStart"/>
+      <w:r>
+        <w:t>commit</w:t>
+      </w:r>
+      <w:proofErr w:type="spellEnd"/>
+      <w:r>
+        <w:t xml:space="preserve"> dedicato e una pull </w:t>
+      </w:r>
+      <w:proofErr w:type="spellStart"/>
+      <w:r>
+        <w:t>request</w:t>
+      </w:r>
+      <w:proofErr w:type="spellEnd"/>
+      <w:r>
+        <w:t xml:space="preserve"> per la revisione e l’integrazione.</w:t>
+      </w:r>
+    </w:p>
+    <w:p>
+      <w:pPr>
+        <w:jc w:val="both"/>
+      </w:pPr>
+      <w:r>
+        <w:t>Le modifiche che comportano aggiornamenti alla documentazione tecnica (diagrammi, manuali o specifiche) saranno riportate anche nei relativi file, per mantenere la coerenza tra codice e documentazione.</w:t>
+      </w:r>
+    </w:p>
+    <w:p>
+      <w:pPr>
+        <w:jc w:val="both"/>
+      </w:pPr>
+      <w:r>
+        <w:t>Questo approccio permette di mantenere un controllo chiaro sulle versioni del software e di prevenire modifiche non tracciate che potrebbero compromettere la qualità e aumentare i tempi di sviluppo.</w:t>
+      </w:r>
+    </w:p>
+    <w:p>
+      <w:pPr>
+        <w:jc w:val="both"/>
+      </w:pPr>
+    </w:p>
+    <w:p>
+      <w:pPr>
+        <w:jc w:val="both"/>
+      </w:pPr>
+    </w:p>
+    <w:p>
+      <w:pPr>
+        <w:jc w:val="both"/>
+      </w:pPr>
+    </w:p>
+    <w:p>
+      <w:pPr>
+        <w:jc w:val="both"/>
+      </w:pPr>
+    </w:p>
+    <w:p>
+      <w:pPr>
+        <w:jc w:val="both"/>
+      </w:pPr>
+    </w:p>
+    <w:p>
+      <w:pPr>
+        <w:jc w:val="both"/>
+      </w:pPr>
+    </w:p>
+    <w:p>
+      <w:pPr>
+        <w:jc w:val="both"/>
+      </w:pPr>
+    </w:p>
+    <w:p>
+      <w:pPr>
+        <w:jc w:val="both"/>
+      </w:pPr>
+    </w:p>
+    <w:p>
+      <w:pPr>
+        <w:jc w:val="both"/>
+      </w:pPr>
+    </w:p>
+    <w:p>
+      <w:pPr>
+        <w:jc w:val="both"/>
+      </w:pPr>
+    </w:p>
+    <w:p>
+      <w:pPr>
+        <w:jc w:val="both"/>
+      </w:pPr>
+    </w:p>
+    <w:p>
+      <w:pPr>
+        <w:jc w:val="both"/>
+      </w:pPr>
+    </w:p>
+    <w:p>
+      <w:pPr>
+        <w:jc w:val="both"/>
+      </w:pPr>
+    </w:p>
+    <w:p>
+      <w:pPr>
+        <w:jc w:val="both"/>
+      </w:pPr>
+    </w:p>
+    <w:p>
+      <w:pPr>
+        <w:jc w:val="both"/>
+      </w:pPr>
+    </w:p>
+    <w:p>
+      <w:pPr>
+        <w:jc w:val="both"/>
+        <w:rPr>
+          <w:b/>
+          <w:bCs/>
+          <w:sz w:val="28"/>
+          <w:szCs w:val="28"/>
+        </w:rPr>
+      </w:pPr>
+    </w:p>
+    <w:p>
+      <w:pPr>
+        <w:jc w:val="both"/>
+        <w:rPr>
+          <w:b/>
+          <w:bCs/>
+          <w:sz w:val="28"/>
+          <w:szCs w:val="28"/>
+        </w:rPr>
+      </w:pPr>
+      <w:r>
+        <w:rPr>
+          <w:b/>
+          <w:bCs/>
+          <w:sz w:val="28"/>
+          <w:szCs w:val="28"/>
+        </w:rPr>
+        <w:lastRenderedPageBreak/>
         <w:t>CONSEGNA</w:t>
       </w:r>
     </w:p>
-    <w:p/>
+    <w:p>
+      <w:pPr>
+        <w:jc w:val="both"/>
+      </w:pPr>
+      <w:r>
+        <w:t xml:space="preserve">Per la consegna del progetto è obbligatorio mettere il tutto in un repository </w:t>
+      </w:r>
+      <w:proofErr w:type="spellStart"/>
+      <w:r>
+        <w:t>github</w:t>
+      </w:r>
+      <w:proofErr w:type="spellEnd"/>
+      <w:r>
+        <w:t xml:space="preserve"> da condividere preventivamente con il professore (account </w:t>
+      </w:r>
+      <w:proofErr w:type="spellStart"/>
+      <w:r>
+        <w:t>github</w:t>
+      </w:r>
+      <w:proofErr w:type="spellEnd"/>
+      <w:r>
+        <w:t xml:space="preserve">: </w:t>
+      </w:r>
+      <w:proofErr w:type="spellStart"/>
+      <w:r>
+        <w:t>garganti</w:t>
+      </w:r>
+      <w:proofErr w:type="spellEnd"/>
+      <w:r>
+        <w:t xml:space="preserve">) e con l’esercitatrice (account </w:t>
+      </w:r>
+      <w:proofErr w:type="spellStart"/>
+      <w:r>
+        <w:t>github</w:t>
+      </w:r>
+      <w:proofErr w:type="spellEnd"/>
+      <w:r>
+        <w:t xml:space="preserve">: </w:t>
+      </w:r>
+      <w:proofErr w:type="spellStart"/>
+      <w:r>
+        <w:t>silviabonfanti</w:t>
+      </w:r>
+      <w:proofErr w:type="spellEnd"/>
+      <w:r>
+        <w:t>). Mentre per i tempi di consegna possono variare in base alla decisione del gruppo nel voler svolgere l‘esame di Ingegneria del Software, siccome il project plan deve essere pronto un mese circa prima dell’esame. Il progetto deve essere completato 5 giorni prima della sua presentazione.</w:t>
+      </w:r>
+    </w:p>
+    <w:p>
+      <w:pPr>
+        <w:jc w:val="both"/>
+      </w:pPr>
+    </w:p>
     <w:sectPr>
       <w:pgSz w:w="11906" w:h="16838"/>
       <w:pgMar w:top="1417" w:right="1134" w:bottom="1134" w:left="1134" w:header="708" w:footer="708" w:gutter="0"/>
@@ -5322,6 +6807,7 @@
   <w:style w:type="character" w:default="1" w:styleId="Carpredefinitoparagrafo">
     <w:name w:val="Default Paragraph Font"/>
     <w:uiPriority w:val="1"/>
+    <w:semiHidden/>
     <w:unhideWhenUsed/>
   </w:style>
   <w:style w:type="table" w:default="1" w:styleId="Tabellanormale">

</xml_diff>

<commit_message>
Modifiche e aggiunte al project plan
Modifiche per i primi 6 punti del project plan. Aggiunto descrizioni più precise e aggiunto elementi extra.
</commit_message>
<xml_diff>
--- a/documentazione/project plan.docx
+++ b/documentazione/project plan.docx
@@ -26,16 +26,8 @@
       <w:pPr>
         <w:spacing w:after="0"/>
         <w:jc w:val="both"/>
-        <w:rPr>
-          <w:sz w:val="24"/>
-          <w:szCs w:val="24"/>
-        </w:rPr>
-      </w:pPr>
-      <w:r>
-        <w:rPr>
-          <w:sz w:val="24"/>
-          <w:szCs w:val="24"/>
-        </w:rPr>
+      </w:pPr>
+      <w:r>
         <w:t>Il nostro progetto consiste nello sviluppo di una web app che permette agli utenti di prenotare colonnine di ricarica per veicoli elettrici.</w:t>
       </w:r>
     </w:p>
@@ -43,66 +35,40 @@
       <w:pPr>
         <w:spacing w:after="0"/>
         <w:jc w:val="both"/>
-        <w:rPr>
-          <w:sz w:val="24"/>
-          <w:szCs w:val="24"/>
-        </w:rPr>
-      </w:pPr>
-      <w:r>
-        <w:rPr>
-          <w:sz w:val="24"/>
-          <w:szCs w:val="24"/>
-        </w:rPr>
-        <w:t>L’app consente agli utenti di bloccare uno slot orario dalla durata di 30 minuti, cumulabili fino ad un massimo di 2 ore, scegliendo direttamente da una mappa integrata.</w:t>
-      </w:r>
-    </w:p>
-    <w:p>
-      <w:pPr>
-        <w:spacing w:after="0"/>
-        <w:jc w:val="both"/>
-        <w:rPr>
-          <w:sz w:val="24"/>
-          <w:szCs w:val="24"/>
-        </w:rPr>
-      </w:pPr>
-      <w:r>
-        <w:rPr>
-          <w:sz w:val="24"/>
-          <w:szCs w:val="24"/>
-        </w:rPr>
-        <w:t>La ricerca può essere filtrata per tipologia, nome e posizione.</w:t>
-      </w:r>
-    </w:p>
-    <w:p>
-      <w:pPr>
-        <w:spacing w:after="0"/>
-        <w:jc w:val="both"/>
-        <w:rPr>
-          <w:sz w:val="24"/>
-          <w:szCs w:val="24"/>
-        </w:rPr>
-      </w:pPr>
-      <w:r>
-        <w:rPr>
-          <w:sz w:val="24"/>
-          <w:szCs w:val="24"/>
-        </w:rPr>
+      </w:pPr>
+      <w:r>
+        <w:t>L’app consente agli utenti di bloccare uno slot orario dalla durata di 30 minuti, cumulabili fino ad un massimo di 2 ore, scegliendo direttamente da una mappa integrata</w:t>
+      </w:r>
+      <w:r>
+        <w:t>, centrata sulla posizione corrente dell’utente.</w:t>
+      </w:r>
+    </w:p>
+    <w:p>
+      <w:pPr>
+        <w:spacing w:after="0"/>
+        <w:jc w:val="both"/>
+      </w:pPr>
+      <w:r>
+        <w:t>La ricerca può essere filtrata per tipologia, nome e posizione</w:t>
+      </w:r>
+      <w:r>
+        <w:t xml:space="preserve"> sia dalla mappa sia tramite una sezione apposita contenente tutte l’elenco completo delle colonnine disponibili.</w:t>
+      </w:r>
+    </w:p>
+    <w:p>
+      <w:pPr>
+        <w:spacing w:after="0"/>
+        <w:jc w:val="both"/>
+      </w:pPr>
+      <w:r>
         <w:t xml:space="preserve">Dopo una prima fase di registrazione (se </w:t>
       </w:r>
       <w:proofErr w:type="spellStart"/>
       <w:r>
-        <w:rPr>
-          <w:sz w:val="24"/>
-          <w:szCs w:val="24"/>
-        </w:rPr>
         <w:t>necessaria</w:t>
       </w:r>
       <w:proofErr w:type="spellEnd"/>
       <w:r>
-        <w:rPr>
-          <w:sz w:val="24"/>
-          <w:szCs w:val="24"/>
-        </w:rPr>
         <w:t>) e login, si apre direttamente la mappa stessa con marker che identificano le colonnine presenti nella zona scelta.</w:t>
       </w:r>
     </w:p>
@@ -110,33 +76,20 @@
       <w:pPr>
         <w:spacing w:after="0"/>
         <w:jc w:val="both"/>
-        <w:rPr>
-          <w:sz w:val="24"/>
-          <w:szCs w:val="24"/>
-        </w:rPr>
-      </w:pPr>
-      <w:r>
-        <w:rPr>
-          <w:sz w:val="24"/>
-          <w:szCs w:val="24"/>
-        </w:rPr>
-        <w:t>La prenotazione può avvenire sia tramite una barra laterale che appare nel momento in cui si clicca su una colonnina, sia tramite una pagina apposita.</w:t>
-      </w:r>
-    </w:p>
-    <w:p>
-      <w:pPr>
-        <w:spacing w:after="0"/>
-        <w:jc w:val="both"/>
-        <w:rPr>
-          <w:sz w:val="24"/>
-          <w:szCs w:val="24"/>
-        </w:rPr>
-      </w:pPr>
-      <w:r>
-        <w:rPr>
-          <w:sz w:val="24"/>
-          <w:szCs w:val="24"/>
-        </w:rPr>
+      </w:pPr>
+      <w:r>
+        <w:t xml:space="preserve">La prenotazione può avvenire sia tramite una barra laterale che appare nel momento in cui si clicca su una colonnina, sia tramite una pagina </w:t>
+      </w:r>
+      <w:r>
+        <w:t>presente nel menù laterale.</w:t>
+      </w:r>
+    </w:p>
+    <w:p>
+      <w:pPr>
+        <w:spacing w:after="0"/>
+        <w:jc w:val="both"/>
+      </w:pPr>
+      <w:r>
         <w:t>A conferma dell’operazione, il sistema genera automaticamente un QR code univoco associato alla colonnina, alla data e all’orario della prenotazione.</w:t>
       </w:r>
     </w:p>
@@ -144,16 +97,8 @@
       <w:pPr>
         <w:spacing w:after="0"/>
         <w:jc w:val="both"/>
-        <w:rPr>
-          <w:sz w:val="24"/>
-          <w:szCs w:val="24"/>
-        </w:rPr>
-      </w:pPr>
-      <w:r>
-        <w:rPr>
-          <w:sz w:val="24"/>
-          <w:szCs w:val="24"/>
-        </w:rPr>
+      </w:pPr>
+      <w:r>
         <w:t>Esso viene salvato nella sezione “profilo utente”  dell’app e permette poi tramite la scansione direttamente sulla colonnina di controllare che tutto corrisponda per poi avviare l’erogazione della corrente e la ricarica dell’auto (la gestione di questa fase non rientra nel nostro progetto).</w:t>
       </w:r>
     </w:p>
@@ -161,16 +106,8 @@
       <w:pPr>
         <w:spacing w:after="0"/>
         <w:jc w:val="both"/>
-        <w:rPr>
-          <w:sz w:val="24"/>
-          <w:szCs w:val="24"/>
-        </w:rPr>
-      </w:pPr>
-      <w:r>
-        <w:rPr>
-          <w:sz w:val="24"/>
-          <w:szCs w:val="24"/>
-        </w:rPr>
+      </w:pPr>
+      <w:r>
         <w:t>L’idea del QR code permette che solo l’utente che ha prenotato in quello slot può usufruire del servizio, evitando abusi.</w:t>
       </w:r>
     </w:p>
@@ -178,16 +115,8 @@
       <w:pPr>
         <w:spacing w:after="0"/>
         <w:jc w:val="both"/>
-        <w:rPr>
-          <w:sz w:val="24"/>
-          <w:szCs w:val="24"/>
-        </w:rPr>
-      </w:pPr>
-      <w:r>
-        <w:rPr>
-          <w:sz w:val="24"/>
-          <w:szCs w:val="24"/>
-        </w:rPr>
+      </w:pPr>
+      <w:r>
         <w:t>L’utente può in ogni momento effettuare il logout dall’applicazione tramite un apposito pulsante presente nel menu.</w:t>
       </w:r>
     </w:p>
@@ -195,16 +124,17 @@
       <w:pPr>
         <w:spacing w:after="0"/>
         <w:jc w:val="both"/>
-        <w:rPr>
-          <w:sz w:val="24"/>
-          <w:szCs w:val="24"/>
-        </w:rPr>
-      </w:pPr>
-      <w:r>
-        <w:rPr>
-          <w:sz w:val="24"/>
-          <w:szCs w:val="24"/>
-        </w:rPr>
+      </w:pPr>
+      <w:r>
+        <w:t>L’applicazione include inoltre funzionalità di recensione, valutazione e segnalazione dei guasti.</w:t>
+      </w:r>
+    </w:p>
+    <w:p>
+      <w:pPr>
+        <w:spacing w:after="0"/>
+        <w:jc w:val="both"/>
+      </w:pPr>
+      <w:r>
         <w:t>La nostra applicazione andrebbe a risolvere il problema che, in un futuro con un maggior numero di auto elettriche, una persona che necessita ricarica non rischia di trovare la colonnina occupata, sapendo che nello slot prenotato sarà sicuramente libera.</w:t>
       </w:r>
     </w:p>
@@ -212,28 +142,10 @@
       <w:pPr>
         <w:spacing w:after="0"/>
         <w:jc w:val="both"/>
-        <w:rPr>
-          <w:sz w:val="24"/>
-          <w:szCs w:val="24"/>
-        </w:rPr>
-      </w:pPr>
-      <w:r>
-        <w:rPr>
-          <w:sz w:val="24"/>
-          <w:szCs w:val="24"/>
-        </w:rPr>
+      </w:pPr>
+      <w:r>
         <w:t>E’ inoltre molto semplice rendere questa app scalabile anche a grandi città, in cui utenti possono anche collaborare segnalando la presenza di nuove colonnine, guasti e talvolta recensioni e commenti che possono essere inseriti nella scheda della colonnina corrispondente.</w:t>
       </w:r>
-    </w:p>
-    <w:p>
-      <w:pPr>
-        <w:jc w:val="both"/>
-      </w:pPr>
-    </w:p>
-    <w:p>
-      <w:pPr>
-        <w:jc w:val="both"/>
-      </w:pPr>
     </w:p>
     <w:p>
       <w:pPr>
@@ -305,743 +217,274 @@
           <w:szCs w:val="28"/>
         </w:rPr>
       </w:pPr>
-      <w:r>
+    </w:p>
+    <w:p>
+      <w:pPr>
+        <w:jc w:val="both"/>
         <w:rPr>
           <w:b/>
           <w:bCs/>
           <w:sz w:val="28"/>
           <w:szCs w:val="28"/>
         </w:rPr>
-        <w:lastRenderedPageBreak/>
-        <w:t>MODELLO DI PROCESSO</w:t>
-      </w:r>
-    </w:p>
-    <w:p>
-      <w:pPr>
-        <w:spacing w:after="0"/>
-        <w:jc w:val="both"/>
-        <w:rPr>
-          <w:sz w:val="24"/>
-          <w:szCs w:val="24"/>
-        </w:rPr>
-      </w:pPr>
-      <w:r>
-        <w:rPr>
-          <w:sz w:val="24"/>
-          <w:szCs w:val="24"/>
-        </w:rPr>
-        <w:t xml:space="preserve">Il modello utilizzato è un modello di tipo agile. Questo permette di avere piccoli incrementi molto frequenti che ci fanno proseguire con lo sviluppo della nostra applicazione senza avere documenti e fasi rigide da seguire come avverrebbe per altri modelli. In questo modo abbiamo più libertà a favore della collaborazione tra i membri del gruppo, avendo sempre un software funzionante. </w:t>
-      </w:r>
-    </w:p>
-    <w:p>
-      <w:pPr>
-        <w:spacing w:after="0"/>
-        <w:jc w:val="both"/>
-        <w:rPr>
-          <w:sz w:val="24"/>
-          <w:szCs w:val="24"/>
-        </w:rPr>
-      </w:pPr>
-      <w:r>
-        <w:rPr>
-          <w:sz w:val="24"/>
-          <w:szCs w:val="24"/>
-        </w:rPr>
-        <w:t>Dunque si pone maggior focus su un design semplice, su meeting frequenti ma brevi e su cambiamenti e integrazione continua.</w:t>
-      </w:r>
-    </w:p>
-    <w:p>
-      <w:pPr>
-        <w:spacing w:after="0"/>
-        <w:jc w:val="both"/>
-        <w:rPr>
-          <w:sz w:val="24"/>
-          <w:szCs w:val="24"/>
-        </w:rPr>
-      </w:pPr>
-      <w:r>
-        <w:rPr>
-          <w:sz w:val="24"/>
-          <w:szCs w:val="24"/>
-        </w:rPr>
-        <w:t>L’approccio si ispira in particolare al modello SCRUM e sui suoi cicli iterativi così composti.</w:t>
-      </w:r>
-    </w:p>
-    <w:p>
-      <w:pPr>
-        <w:spacing w:after="0"/>
-        <w:jc w:val="both"/>
-        <w:rPr>
-          <w:sz w:val="24"/>
-          <w:szCs w:val="24"/>
-        </w:rPr>
-      </w:pPr>
-      <w:r>
-        <w:rPr>
-          <w:sz w:val="24"/>
-          <w:szCs w:val="24"/>
-        </w:rPr>
-        <w:t>La suddivisione del tempo a disposizione avviene in tale maniera:</w:t>
-      </w:r>
-    </w:p>
-    <w:p>
-      <w:pPr>
-        <w:spacing w:after="0"/>
-        <w:jc w:val="both"/>
-        <w:rPr>
-          <w:sz w:val="24"/>
-          <w:szCs w:val="24"/>
-        </w:rPr>
-      </w:pPr>
-      <w:r>
-        <w:rPr>
-          <w:sz w:val="24"/>
-          <w:szCs w:val="24"/>
-        </w:rPr>
-        <w:t>Backlog: 3 giorni di decisione riguardo funzioni da implementare e obiettivi da raggiungere nella fase di Sprint</w:t>
-      </w:r>
-    </w:p>
-    <w:p>
-      <w:pPr>
-        <w:spacing w:after="0"/>
-        <w:jc w:val="both"/>
-        <w:rPr>
-          <w:sz w:val="24"/>
-          <w:szCs w:val="24"/>
-        </w:rPr>
-      </w:pPr>
-      <w:r>
-        <w:rPr>
-          <w:sz w:val="24"/>
-          <w:szCs w:val="24"/>
-        </w:rPr>
-        <w:t xml:space="preserve">Sprint: due settimane di  implementazione effettiva delle funzionalità decise in precedenza con meeting in presenza per aggiornamenti su eventuali problematiche </w:t>
-      </w:r>
-    </w:p>
-    <w:p>
-      <w:pPr>
-        <w:spacing w:after="0"/>
-        <w:jc w:val="both"/>
-        <w:rPr>
-          <w:sz w:val="24"/>
-          <w:szCs w:val="24"/>
-        </w:rPr>
-      </w:pPr>
-      <w:r>
-        <w:rPr>
-          <w:sz w:val="24"/>
-          <w:szCs w:val="24"/>
-        </w:rPr>
-        <w:t>Review: uno/due meeting di revisione per verificare che tutte le funzionalità dello Sprint siano corrette e funzionanti.</w:t>
-      </w:r>
-    </w:p>
-    <w:p>
-      <w:pPr>
-        <w:jc w:val="both"/>
-      </w:pPr>
-    </w:p>
-    <w:p>
-      <w:pPr>
-        <w:jc w:val="both"/>
-      </w:pPr>
-    </w:p>
-    <w:p>
-      <w:pPr>
-        <w:jc w:val="both"/>
-      </w:pPr>
-    </w:p>
-    <w:p>
-      <w:pPr>
-        <w:jc w:val="both"/>
-      </w:pPr>
-    </w:p>
-    <w:p>
-      <w:pPr>
-        <w:jc w:val="both"/>
-      </w:pPr>
-    </w:p>
-    <w:p>
-      <w:pPr>
-        <w:jc w:val="both"/>
-      </w:pPr>
-    </w:p>
-    <w:p>
-      <w:pPr>
-        <w:jc w:val="both"/>
-      </w:pPr>
-    </w:p>
-    <w:p>
-      <w:pPr>
-        <w:jc w:val="both"/>
-      </w:pPr>
-    </w:p>
-    <w:p>
-      <w:pPr>
-        <w:jc w:val="both"/>
-      </w:pPr>
-    </w:p>
-    <w:p>
-      <w:pPr>
-        <w:jc w:val="both"/>
-      </w:pPr>
-    </w:p>
-    <w:p>
-      <w:pPr>
-        <w:jc w:val="both"/>
-      </w:pPr>
-    </w:p>
-    <w:p>
-      <w:pPr>
-        <w:jc w:val="both"/>
-      </w:pPr>
-    </w:p>
-    <w:p>
-      <w:pPr>
-        <w:jc w:val="both"/>
-      </w:pPr>
-    </w:p>
-    <w:p>
-      <w:pPr>
-        <w:jc w:val="both"/>
-      </w:pPr>
-    </w:p>
-    <w:p>
-      <w:pPr>
-        <w:jc w:val="both"/>
-      </w:pPr>
-    </w:p>
-    <w:p>
-      <w:pPr>
-        <w:jc w:val="both"/>
-      </w:pPr>
-    </w:p>
-    <w:p>
-      <w:pPr>
-        <w:jc w:val="both"/>
-      </w:pPr>
-    </w:p>
-    <w:p>
-      <w:pPr>
-        <w:jc w:val="both"/>
-      </w:pPr>
-    </w:p>
-    <w:p>
-      <w:pPr>
-        <w:jc w:val="both"/>
-      </w:pPr>
-    </w:p>
-    <w:p>
-      <w:pPr>
-        <w:jc w:val="both"/>
-      </w:pPr>
-    </w:p>
-    <w:p>
-      <w:pPr>
-        <w:jc w:val="both"/>
-      </w:pPr>
-    </w:p>
-    <w:p>
-      <w:pPr>
-        <w:jc w:val="both"/>
+      </w:pPr>
+      <w:r>
         <w:rPr>
           <w:b/>
           <w:bCs/>
           <w:sz w:val="28"/>
           <w:szCs w:val="28"/>
         </w:rPr>
-      </w:pPr>
-      <w:r>
+        <w:lastRenderedPageBreak/>
+        <w:t>MODELLO DI PROCESSO</w:t>
+      </w:r>
+    </w:p>
+    <w:p>
+      <w:pPr>
+        <w:spacing w:after="0"/>
+        <w:jc w:val="both"/>
+      </w:pPr>
+      <w:r>
+        <w:t xml:space="preserve">Il modello </w:t>
+      </w:r>
+      <w:r>
+        <w:t>adottato</w:t>
+      </w:r>
+      <w:r>
+        <w:t xml:space="preserve"> è un modello di tipo agile.</w:t>
+      </w:r>
+    </w:p>
+    <w:p>
+      <w:pPr>
+        <w:spacing w:after="0"/>
+        <w:jc w:val="both"/>
+      </w:pPr>
+      <w:r>
+        <w:t>Tale approccio</w:t>
+      </w:r>
+      <w:r>
+        <w:t xml:space="preserve"> permette di </w:t>
+      </w:r>
+      <w:r>
+        <w:t>realizzare</w:t>
+      </w:r>
+      <w:r>
+        <w:t xml:space="preserve"> piccoli incrementi molto frequenti che ci fanno proseguire con lo sviluppo della nostra applicazione senza avere documenti e fasi rigide da seguire come avverrebbe per altri modelli</w:t>
+      </w:r>
+      <w:r>
+        <w:t>.</w:t>
+      </w:r>
+    </w:p>
+    <w:p>
+      <w:pPr>
+        <w:spacing w:after="0"/>
+        <w:jc w:val="both"/>
+      </w:pPr>
+      <w:r>
+        <w:t>L’adozione di un metodo agile favorisce</w:t>
+      </w:r>
+      <w:r>
+        <w:t xml:space="preserve"> </w:t>
+      </w:r>
+      <w:r>
+        <w:t>maggiore libertà, collaborazione continua e assicura l’esistenza di un software funzionante in ogni fase del progetto.</w:t>
+      </w:r>
+    </w:p>
+    <w:p>
+      <w:pPr>
+        <w:spacing w:after="0"/>
+        <w:jc w:val="both"/>
+      </w:pPr>
+      <w:r>
+        <w:t>Si pone dunque maggiore attenzione</w:t>
+      </w:r>
+      <w:r>
+        <w:t xml:space="preserve"> su design semplice, meeting frequenti ma brevi e </w:t>
+      </w:r>
+      <w:r>
+        <w:t xml:space="preserve">a processi di </w:t>
+      </w:r>
+      <w:r>
+        <w:t>cambiament</w:t>
+      </w:r>
+      <w:r>
+        <w:t xml:space="preserve">o </w:t>
+      </w:r>
+      <w:r>
+        <w:t>e integrazione continua.</w:t>
+      </w:r>
+    </w:p>
+    <w:p>
+      <w:pPr>
+        <w:spacing w:after="0"/>
+        <w:jc w:val="both"/>
+      </w:pPr>
+      <w:r>
+        <w:t>L’approccio si ispira in particolare al modello SCRUM e sui suoi cicli iterativi così composti.</w:t>
+      </w:r>
+    </w:p>
+    <w:p>
+      <w:pPr>
+        <w:spacing w:after="0"/>
+        <w:jc w:val="both"/>
+      </w:pPr>
+      <w:r>
+        <w:t>La suddivisione del tempo a disposizione avviene in tale maniera:</w:t>
+      </w:r>
+    </w:p>
+    <w:p>
+      <w:pPr>
+        <w:spacing w:after="0"/>
+        <w:jc w:val="both"/>
+      </w:pPr>
+      <w:r>
+        <w:t>Backlog: 3 giorni di decisione riguardo funzioni da implementare e obiettivi da raggiungere nella fase di Sprint</w:t>
+      </w:r>
+    </w:p>
+    <w:p>
+      <w:pPr>
+        <w:spacing w:after="0"/>
+        <w:jc w:val="both"/>
+      </w:pPr>
+      <w:r>
+        <w:t xml:space="preserve">Sprint: </w:t>
+      </w:r>
+      <w:r>
+        <w:t xml:space="preserve">dieci giorni </w:t>
+      </w:r>
+      <w:r>
+        <w:t xml:space="preserve">di  implementazione effettiva delle funzionalità decise in precedenza con meeting in presenza per aggiornamenti su eventuali problematiche </w:t>
+      </w:r>
+    </w:p>
+    <w:p>
+      <w:pPr>
+        <w:spacing w:after="0"/>
+        <w:jc w:val="both"/>
+      </w:pPr>
+      <w:r>
+        <w:t>Review: uno/due meeting di revisione per verificare che tutte le funzionalità dello Sprint siano corrette e funzionanti.</w:t>
+      </w:r>
+      <w:r>
+        <w:t xml:space="preserve"> </w:t>
+      </w:r>
+    </w:p>
+    <w:p>
+      <w:pPr>
+        <w:spacing w:after="0"/>
+        <w:jc w:val="both"/>
+      </w:pPr>
+      <w:r>
+        <w:t>Durante la fase di review e di backlog si può procedere con la stesura dei documenti necessari.</w:t>
+      </w:r>
+    </w:p>
+    <w:p>
+      <w:pPr>
+        <w:spacing w:after="0"/>
+        <w:jc w:val="both"/>
+      </w:pPr>
+      <w:r>
+        <w:t>La scelta di questo approccio permette quindi di gestire in maniera più flessibile le priorità, la comunicazione e gli aggiornamenti del software.</w:t>
+      </w:r>
+    </w:p>
+    <w:p>
+      <w:pPr>
+        <w:spacing w:after="0"/>
+        <w:jc w:val="both"/>
+        <w:rPr>
+          <w:sz w:val="24"/>
+          <w:szCs w:val="24"/>
+        </w:rPr>
+      </w:pPr>
+    </w:p>
+    <w:p>
+      <w:pPr>
+        <w:jc w:val="both"/>
+      </w:pPr>
+    </w:p>
+    <w:p>
+      <w:pPr>
+        <w:jc w:val="both"/>
+      </w:pPr>
+    </w:p>
+    <w:p>
+      <w:pPr>
+        <w:jc w:val="both"/>
+      </w:pPr>
+    </w:p>
+    <w:p>
+      <w:pPr>
+        <w:jc w:val="both"/>
+      </w:pPr>
+    </w:p>
+    <w:p>
+      <w:pPr>
+        <w:jc w:val="both"/>
+      </w:pPr>
+    </w:p>
+    <w:p>
+      <w:pPr>
+        <w:jc w:val="both"/>
+      </w:pPr>
+    </w:p>
+    <w:p>
+      <w:pPr>
+        <w:jc w:val="both"/>
+      </w:pPr>
+    </w:p>
+    <w:p>
+      <w:pPr>
+        <w:jc w:val="both"/>
+      </w:pPr>
+    </w:p>
+    <w:p>
+      <w:pPr>
+        <w:jc w:val="both"/>
+      </w:pPr>
+    </w:p>
+    <w:p>
+      <w:pPr>
+        <w:jc w:val="both"/>
+      </w:pPr>
+    </w:p>
+    <w:p>
+      <w:pPr>
+        <w:jc w:val="both"/>
+      </w:pPr>
+    </w:p>
+    <w:p>
+      <w:pPr>
+        <w:jc w:val="both"/>
+      </w:pPr>
+    </w:p>
+    <w:p>
+      <w:pPr>
+        <w:jc w:val="both"/>
+      </w:pPr>
+    </w:p>
+    <w:p>
+      <w:pPr>
+        <w:jc w:val="both"/>
+      </w:pPr>
+    </w:p>
+    <w:p>
+      <w:pPr>
+        <w:jc w:val="both"/>
+      </w:pPr>
+    </w:p>
+    <w:p>
+      <w:pPr>
+        <w:jc w:val="both"/>
+      </w:pPr>
+    </w:p>
+    <w:p>
+      <w:pPr>
+        <w:jc w:val="both"/>
         <w:rPr>
           <w:b/>
           <w:bCs/>
           <w:sz w:val="28"/>
           <w:szCs w:val="28"/>
         </w:rPr>
-        <w:lastRenderedPageBreak/>
-        <w:t>ORGANIZZAZIONE DEL PROCESSO</w:t>
-      </w:r>
-    </w:p>
-    <w:p>
-      <w:pPr>
-        <w:spacing w:after="0"/>
-        <w:jc w:val="both"/>
-        <w:rPr>
-          <w:sz w:val="24"/>
-          <w:szCs w:val="24"/>
-        </w:rPr>
-      </w:pPr>
-      <w:r>
-        <w:rPr>
-          <w:sz w:val="24"/>
-          <w:szCs w:val="24"/>
-        </w:rPr>
-        <w:t>I ruoli dei membri del gruppo sono stati così suddivisi:</w:t>
-      </w:r>
-    </w:p>
-    <w:p>
-      <w:pPr>
-        <w:spacing w:after="0"/>
-        <w:jc w:val="both"/>
-        <w:rPr>
-          <w:sz w:val="24"/>
-          <w:szCs w:val="24"/>
-        </w:rPr>
-      </w:pPr>
-      <w:proofErr w:type="spellStart"/>
-      <w:r>
-        <w:rPr>
-          <w:sz w:val="24"/>
-          <w:szCs w:val="24"/>
-        </w:rPr>
-        <w:t>Frontend</w:t>
-      </w:r>
-      <w:proofErr w:type="spellEnd"/>
-      <w:r>
-        <w:rPr>
-          <w:sz w:val="24"/>
-          <w:szCs w:val="24"/>
-        </w:rPr>
-        <w:t>: sviluppo interfaccia, mappa interattiva, passaggio tra pagine, menù.</w:t>
-      </w:r>
-    </w:p>
-    <w:p>
-      <w:pPr>
-        <w:spacing w:after="0"/>
-        <w:jc w:val="both"/>
-        <w:rPr>
-          <w:sz w:val="24"/>
-          <w:szCs w:val="24"/>
-        </w:rPr>
-      </w:pPr>
-      <w:proofErr w:type="spellStart"/>
-      <w:r>
-        <w:rPr>
-          <w:sz w:val="24"/>
-          <w:szCs w:val="24"/>
-        </w:rPr>
-        <w:t>Backend+Database</w:t>
-      </w:r>
-      <w:proofErr w:type="spellEnd"/>
-      <w:r>
-        <w:rPr>
-          <w:sz w:val="24"/>
-          <w:szCs w:val="24"/>
-        </w:rPr>
-        <w:t xml:space="preserve">: gestione </w:t>
-      </w:r>
-      <w:proofErr w:type="spellStart"/>
-      <w:r>
-        <w:rPr>
-          <w:sz w:val="24"/>
-          <w:szCs w:val="24"/>
-        </w:rPr>
-        <w:t>firebase</w:t>
-      </w:r>
-      <w:proofErr w:type="spellEnd"/>
-      <w:r>
-        <w:rPr>
-          <w:sz w:val="24"/>
-          <w:szCs w:val="24"/>
-        </w:rPr>
-        <w:t>, controlli utente e prenotazioni, salvataggio dati, sicurezza</w:t>
-      </w:r>
-    </w:p>
-    <w:p>
-      <w:pPr>
-        <w:spacing w:after="0"/>
-        <w:jc w:val="both"/>
-        <w:rPr>
-          <w:sz w:val="24"/>
-          <w:szCs w:val="24"/>
-        </w:rPr>
-      </w:pPr>
-      <w:r>
-        <w:rPr>
-          <w:sz w:val="24"/>
-          <w:szCs w:val="24"/>
-        </w:rPr>
-        <w:t xml:space="preserve">Testing: </w:t>
-      </w:r>
-    </w:p>
-    <w:p>
-      <w:pPr>
-        <w:spacing w:after="0"/>
-        <w:jc w:val="both"/>
-        <w:rPr>
-          <w:sz w:val="24"/>
-          <w:szCs w:val="24"/>
-        </w:rPr>
-      </w:pPr>
-      <w:r>
-        <w:rPr>
-          <w:sz w:val="24"/>
-          <w:szCs w:val="24"/>
-        </w:rPr>
-        <w:t>Documentazione: project plan, diagrammi UML, informazioni generali.</w:t>
-      </w:r>
-    </w:p>
-    <w:p>
-      <w:pPr>
-        <w:spacing w:after="0"/>
-        <w:jc w:val="both"/>
-        <w:rPr>
-          <w:sz w:val="24"/>
-          <w:szCs w:val="24"/>
-        </w:rPr>
-      </w:pPr>
-    </w:p>
-    <w:p>
-      <w:pPr>
-        <w:spacing w:after="0"/>
-        <w:jc w:val="both"/>
-        <w:rPr>
-          <w:sz w:val="24"/>
-          <w:szCs w:val="24"/>
-        </w:rPr>
-      </w:pPr>
-    </w:p>
-    <w:p>
-      <w:pPr>
-        <w:spacing w:after="0"/>
-        <w:jc w:val="both"/>
-        <w:rPr>
-          <w:sz w:val="24"/>
-          <w:szCs w:val="24"/>
-        </w:rPr>
-      </w:pPr>
-      <w:r>
-        <w:rPr>
-          <w:sz w:val="24"/>
-          <w:szCs w:val="24"/>
-        </w:rPr>
-        <w:t xml:space="preserve">Si possono dividere i ruoli in product </w:t>
-      </w:r>
-      <w:proofErr w:type="spellStart"/>
-      <w:r>
-        <w:rPr>
-          <w:sz w:val="24"/>
-          <w:szCs w:val="24"/>
-        </w:rPr>
-        <w:t>owner</w:t>
-      </w:r>
-      <w:proofErr w:type="spellEnd"/>
-      <w:r>
-        <w:rPr>
-          <w:sz w:val="24"/>
-          <w:szCs w:val="24"/>
-        </w:rPr>
-        <w:t xml:space="preserve">, </w:t>
-      </w:r>
-      <w:proofErr w:type="spellStart"/>
-      <w:r>
-        <w:rPr>
-          <w:sz w:val="24"/>
-          <w:szCs w:val="24"/>
-        </w:rPr>
-        <w:t>scrum</w:t>
-      </w:r>
-      <w:proofErr w:type="spellEnd"/>
-      <w:r>
-        <w:rPr>
-          <w:sz w:val="24"/>
-          <w:szCs w:val="24"/>
-        </w:rPr>
-        <w:t xml:space="preserve"> master e team di implementazione (di cui fanno parte tutti)</w:t>
-      </w:r>
-    </w:p>
-    <w:p>
-      <w:pPr>
-        <w:spacing w:after="0"/>
-        <w:jc w:val="both"/>
-        <w:rPr>
-          <w:sz w:val="24"/>
-          <w:szCs w:val="24"/>
-        </w:rPr>
-      </w:pPr>
-      <w:r>
-        <w:rPr>
-          <w:sz w:val="24"/>
-          <w:szCs w:val="24"/>
-        </w:rPr>
-        <w:t>//qui possiamo spiegare cosa fa ognuno e nella parte di implementazione mettiamo front end back end …</w:t>
-      </w:r>
-    </w:p>
-    <w:p>
-      <w:pPr>
-        <w:spacing w:after="0"/>
-        <w:jc w:val="both"/>
-        <w:rPr>
-          <w:sz w:val="24"/>
-          <w:szCs w:val="24"/>
-        </w:rPr>
-      </w:pPr>
-      <w:r>
-        <w:rPr>
-          <w:sz w:val="24"/>
-          <w:szCs w:val="24"/>
-        </w:rPr>
-        <w:t xml:space="preserve">Product </w:t>
-      </w:r>
-      <w:proofErr w:type="spellStart"/>
-      <w:r>
-        <w:rPr>
-          <w:sz w:val="24"/>
-          <w:szCs w:val="24"/>
-        </w:rPr>
-        <w:t>owner</w:t>
-      </w:r>
-      <w:proofErr w:type="spellEnd"/>
-      <w:r>
-        <w:rPr>
-          <w:sz w:val="24"/>
-          <w:szCs w:val="24"/>
-        </w:rPr>
-        <w:t xml:space="preserve"> → Davide Mascheretti </w:t>
-      </w:r>
-    </w:p>
-    <w:p>
-      <w:pPr>
-        <w:spacing w:after="0"/>
-        <w:jc w:val="both"/>
-        <w:rPr>
-          <w:sz w:val="24"/>
-          <w:szCs w:val="24"/>
-        </w:rPr>
-      </w:pPr>
-      <w:proofErr w:type="spellStart"/>
-      <w:r>
-        <w:rPr>
-          <w:sz w:val="24"/>
-          <w:szCs w:val="24"/>
-        </w:rPr>
-        <w:t>Scrum</w:t>
-      </w:r>
-      <w:proofErr w:type="spellEnd"/>
-      <w:r>
-        <w:rPr>
-          <w:sz w:val="24"/>
-          <w:szCs w:val="24"/>
-        </w:rPr>
-        <w:t xml:space="preserve"> master → Tommaso Maistrello</w:t>
-      </w:r>
-    </w:p>
-    <w:p>
-      <w:pPr>
-        <w:spacing w:after="0"/>
-        <w:jc w:val="both"/>
-        <w:rPr>
-          <w:sz w:val="24"/>
-          <w:szCs w:val="24"/>
-        </w:rPr>
-      </w:pPr>
-      <w:r>
-        <w:rPr>
-          <w:sz w:val="24"/>
-          <w:szCs w:val="24"/>
-        </w:rPr>
-        <w:t>Team di implementazione → Tommaso Maistrello, Davide Mascheretti, Claudio Morgera, Francesco Valenari.</w:t>
-      </w:r>
-    </w:p>
-    <w:p>
-      <w:pPr>
-        <w:spacing w:after="0"/>
-        <w:jc w:val="both"/>
-        <w:rPr>
-          <w:sz w:val="24"/>
-          <w:szCs w:val="24"/>
-        </w:rPr>
-      </w:pPr>
-      <w:r>
-        <w:rPr>
-          <w:sz w:val="24"/>
-          <w:szCs w:val="24"/>
-        </w:rPr>
-        <w:t>Nonostante ciò, nel caso di necessità un membro del gruppo può contribuire alla collaborazione con il membro affidato a quel ruolo. La conoscenza deve essere utilizzata in maniera trasversale.</w:t>
-      </w:r>
-    </w:p>
-    <w:p>
-      <w:pPr>
-        <w:spacing w:after="0"/>
-        <w:jc w:val="both"/>
-        <w:rPr>
-          <w:sz w:val="24"/>
-          <w:szCs w:val="24"/>
-        </w:rPr>
-      </w:pPr>
-      <w:r>
-        <w:rPr>
-          <w:sz w:val="24"/>
-          <w:szCs w:val="24"/>
-        </w:rPr>
-        <w:t>Ad esempio, se l’addetto al back end riscontra problemi con la gestione del database, al fine di velocizzare i procedimenti, può chiedere supporto aggiuntivo ad un altro membro del gruppo, il quale potrebbe avere le competenze adatte per risolvere il dato problema in minor tempo.</w:t>
-      </w:r>
-    </w:p>
-    <w:p>
-      <w:pPr>
-        <w:spacing w:after="0"/>
-        <w:jc w:val="both"/>
-        <w:rPr>
-          <w:sz w:val="24"/>
-          <w:szCs w:val="24"/>
-        </w:rPr>
-      </w:pPr>
-      <w:r>
-        <w:rPr>
-          <w:sz w:val="24"/>
-          <w:szCs w:val="24"/>
-        </w:rPr>
-        <w:t>La documentazione chiara e dettagliata è considerata responsabilità condivisa tra tutti i membri del gruppo, essa deve essere il compito di tutti.</w:t>
-      </w:r>
-    </w:p>
-    <w:p>
-      <w:pPr>
-        <w:spacing w:after="0"/>
-        <w:jc w:val="both"/>
-        <w:rPr>
-          <w:sz w:val="24"/>
-          <w:szCs w:val="24"/>
-        </w:rPr>
-      </w:pPr>
-    </w:p>
-    <w:p>
-      <w:pPr>
-        <w:spacing w:after="0"/>
-        <w:jc w:val="both"/>
-        <w:rPr>
-          <w:sz w:val="24"/>
-          <w:szCs w:val="24"/>
-        </w:rPr>
-      </w:pPr>
-      <w:r>
-        <w:rPr>
-          <w:sz w:val="24"/>
-          <w:szCs w:val="24"/>
-        </w:rPr>
-        <w:t>Altre importanti caratteristiche di organizzazione sono riportate a seguire.</w:t>
-      </w:r>
-    </w:p>
-    <w:p>
-      <w:pPr>
-        <w:spacing w:after="0"/>
-        <w:jc w:val="both"/>
-        <w:rPr>
-          <w:sz w:val="24"/>
-          <w:szCs w:val="24"/>
-        </w:rPr>
-      </w:pPr>
-      <w:r>
-        <w:rPr>
-          <w:sz w:val="24"/>
-          <w:szCs w:val="24"/>
-        </w:rPr>
-        <w:t>Brevi meeting principalmente non online per risolvere problemi e per chiarimenti vari.</w:t>
-      </w:r>
-    </w:p>
-    <w:p>
-      <w:pPr>
-        <w:spacing w:after="0"/>
-        <w:jc w:val="both"/>
-        <w:rPr>
-          <w:sz w:val="24"/>
-          <w:szCs w:val="24"/>
-        </w:rPr>
-      </w:pPr>
-      <w:r>
-        <w:rPr>
-          <w:sz w:val="24"/>
-          <w:szCs w:val="24"/>
-        </w:rPr>
-        <w:t>La comunicazione quotidiana deve avvenire tramite un gruppo Whatsapp apposito, utilizzato per scambio di informazioni e domande inerenti al progetto o a problemi riscontrati.</w:t>
-      </w:r>
-    </w:p>
-    <w:p>
-      <w:pPr>
-        <w:spacing w:after="0"/>
-        <w:jc w:val="both"/>
-        <w:rPr>
-          <w:sz w:val="24"/>
-          <w:szCs w:val="24"/>
-        </w:rPr>
-      </w:pPr>
-      <w:r>
-        <w:rPr>
-          <w:sz w:val="24"/>
-          <w:szCs w:val="24"/>
-        </w:rPr>
-        <w:t>Decisioni, urgenze e task vengono gestiti dal gruppo stesso durante i meeting settimanali, in cui si decide anche se è necessario un cambio di ruoli.</w:t>
-      </w:r>
-    </w:p>
-    <w:p>
-      <w:pPr>
-        <w:spacing w:after="0"/>
-        <w:jc w:val="both"/>
-        <w:rPr>
-          <w:sz w:val="24"/>
-          <w:szCs w:val="24"/>
-        </w:rPr>
-      </w:pPr>
-      <w:r>
-        <w:rPr>
-          <w:sz w:val="24"/>
-          <w:szCs w:val="24"/>
-        </w:rPr>
-        <w:t xml:space="preserve">Utilizzo di GitHub privato condiviso con i membri del gruppo per gestire </w:t>
-      </w:r>
-      <w:proofErr w:type="spellStart"/>
-      <w:r>
-        <w:rPr>
-          <w:sz w:val="24"/>
-          <w:szCs w:val="24"/>
-        </w:rPr>
-        <w:t>issue</w:t>
-      </w:r>
-      <w:proofErr w:type="spellEnd"/>
-      <w:r>
-        <w:rPr>
-          <w:sz w:val="24"/>
-          <w:szCs w:val="24"/>
-        </w:rPr>
-        <w:t xml:space="preserve"> e tenere in memoria le azioni di ogni persona. Utilizzo iniziale di Google Drive per la documentazione e per i riassunti dei meeting con data e descrizione, da caricare poi su GitHub.</w:t>
-      </w:r>
-    </w:p>
-    <w:p>
-      <w:pPr>
-        <w:jc w:val="both"/>
-      </w:pPr>
-    </w:p>
-    <w:p>
-      <w:pPr>
-        <w:jc w:val="both"/>
-      </w:pPr>
-    </w:p>
-    <w:p>
-      <w:pPr>
-        <w:jc w:val="both"/>
-      </w:pPr>
-    </w:p>
-    <w:p>
-      <w:pPr>
-        <w:jc w:val="both"/>
-      </w:pPr>
-    </w:p>
-    <w:p>
-      <w:pPr>
-        <w:jc w:val="both"/>
-      </w:pPr>
-    </w:p>
-    <w:p>
-      <w:pPr>
-        <w:jc w:val="both"/>
-      </w:pPr>
-    </w:p>
-    <w:p>
-      <w:pPr>
-        <w:jc w:val="both"/>
-      </w:pPr>
-    </w:p>
-    <w:p>
-      <w:pPr>
-        <w:jc w:val="both"/>
       </w:pPr>
     </w:p>
     <w:p>
@@ -1054,645 +497,1406 @@
           <w:szCs w:val="28"/>
         </w:rPr>
       </w:pPr>
-      <w:r>
+    </w:p>
+    <w:p>
+      <w:pPr>
+        <w:jc w:val="both"/>
         <w:rPr>
           <w:b/>
           <w:bCs/>
           <w:sz w:val="28"/>
           <w:szCs w:val="28"/>
         </w:rPr>
-        <w:lastRenderedPageBreak/>
-        <w:t>STANDARD, LINEE GUIDE E PROCEDURE</w:t>
-      </w:r>
-    </w:p>
-    <w:p>
-      <w:pPr>
-        <w:jc w:val="both"/>
-      </w:pPr>
-      <w:r>
-        <w:t xml:space="preserve">Per gestire tutte le procedure e tutti i cambiamenti del nostro progetto si utilizza </w:t>
-      </w:r>
-      <w:proofErr w:type="spellStart"/>
-      <w:r>
-        <w:t>Github</w:t>
-      </w:r>
-      <w:proofErr w:type="spellEnd"/>
-      <w:r>
-        <w:t xml:space="preserve">, gestore di configurazione online distribuito che permette ad ognuno di avere una propria </w:t>
-      </w:r>
-      <w:proofErr w:type="spellStart"/>
-      <w:r>
-        <w:t>local</w:t>
-      </w:r>
-      <w:proofErr w:type="spellEnd"/>
-      <w:r>
-        <w:t xml:space="preserve"> repo.</w:t>
-      </w:r>
-      <w:r>
-        <w:t xml:space="preserve"> </w:t>
-      </w:r>
-      <w:r>
-        <w:t>Gli standard di programmazione sono quelli classici di java definite da Oracle.</w:t>
-      </w:r>
-      <w:r>
-        <w:t xml:space="preserve"> </w:t>
-      </w:r>
-      <w:r>
-        <w:t xml:space="preserve">Riguardo la documentazione è necessaria chiarezza sia per le classi aggiunte, che devono essere esplicitamente e dettagliatamente spiegate, sia per tutti i </w:t>
-      </w:r>
-      <w:proofErr w:type="spellStart"/>
-      <w:r>
-        <w:t>commit</w:t>
-      </w:r>
-      <w:proofErr w:type="spellEnd"/>
-      <w:r>
-        <w:t xml:space="preserve"> che vengono fatti.</w:t>
-      </w:r>
-    </w:p>
-    <w:p>
-      <w:pPr>
-        <w:jc w:val="both"/>
-      </w:pPr>
-      <w:r>
-        <w:t xml:space="preserve">Nel titolo del </w:t>
-      </w:r>
-      <w:proofErr w:type="spellStart"/>
-      <w:r>
-        <w:t>commit</w:t>
-      </w:r>
-      <w:proofErr w:type="spellEnd"/>
-      <w:r>
-        <w:t xml:space="preserve"> ci deve essere in generale le modifiche principali apportate e cosa cambia di importante rispetto alla versione precedente. Nella descrizione è possibile aggiungere tutte le informazioni necessarie che descrivono i cambiamenti passo per passo, le scelte effettuate, le motivazioni se necessarie e tutto ciò che permette di comprendere al meglio da una persona esterna cosa è cambiato in seguito alle modifiche effettuate.</w:t>
-      </w:r>
-    </w:p>
-    <w:p>
-      <w:pPr>
-        <w:jc w:val="both"/>
-      </w:pPr>
-      <w:r>
-        <w:t xml:space="preserve">La documentazione è da consegnare necessariamente in seguito al cambiamento del macro argomento su cui stiamo lavorando. Non è necessario fare commenti se i cambiamenti sono ininfluenti sul funzionamento generale dell’applicazione, piuttosto meglio attendere e fare </w:t>
-      </w:r>
-      <w:proofErr w:type="spellStart"/>
-      <w:r>
-        <w:t>push</w:t>
-      </w:r>
-      <w:proofErr w:type="spellEnd"/>
-      <w:r>
-        <w:t xml:space="preserve"> una volta aggiunto qualcosa di realmente significativo.</w:t>
-      </w:r>
-    </w:p>
-    <w:p>
-      <w:pPr>
-        <w:jc w:val="both"/>
-      </w:pPr>
-      <w:r>
-        <w:t xml:space="preserve">Nel caso di modifiche con bug presenti (leggeri non che annullano il funzionamento generale)  è consigliato comunque fare </w:t>
-      </w:r>
-      <w:proofErr w:type="spellStart"/>
-      <w:r>
-        <w:t>commit</w:t>
-      </w:r>
-      <w:proofErr w:type="spellEnd"/>
-      <w:r>
-        <w:t>, magari aggiungendo la descrizione dell’errore. In questo modo ognuno è aggiornato alla versione corretta ed è possibile risolvere il bug o in parallelo allo sviluppo, oppure alla fine del progetto.</w:t>
-      </w:r>
-    </w:p>
-    <w:p>
-      <w:pPr>
-        <w:jc w:val="both"/>
-      </w:pPr>
-      <w:r>
-        <w:t>Ci si aspetta che ognuno rispetti le linee guida in maniera autonoma, nessun membro del gruppo verifica che gli altri membri rispettino le linee guida.</w:t>
-      </w:r>
-    </w:p>
-    <w:p>
-      <w:pPr>
-        <w:jc w:val="both"/>
-      </w:pPr>
-      <w:r>
-        <w:t>Analizziamo ora le scelte tecniche che caratterizzano il nostro progetto.</w:t>
-      </w:r>
-    </w:p>
-    <w:p>
-      <w:pPr>
-        <w:jc w:val="both"/>
-      </w:pPr>
-      <w:r>
-        <w:t>In relazione al database utilizzato abbiamo deciso di utilizzare regole standard da configurazione, database privato, in modo che solo i membri interni al gruppo possano visualizzare e modificare. Non è gestita parte di password criptate.</w:t>
-      </w:r>
-    </w:p>
-    <w:p>
-      <w:pPr>
-        <w:jc w:val="both"/>
-      </w:pPr>
-      <w:r>
-        <w:t xml:space="preserve">Potrebbe essere inoltre utile l'utilizzo di una </w:t>
-      </w:r>
-      <w:proofErr w:type="spellStart"/>
-      <w:r>
-        <w:t>kanban</w:t>
-      </w:r>
-      <w:proofErr w:type="spellEnd"/>
-      <w:r>
-        <w:t xml:space="preserve"> board per avere una visione oggettiva e in tempo reale dei progressi dell’applicazione.</w:t>
-      </w:r>
-    </w:p>
-    <w:p>
-      <w:pPr>
-        <w:jc w:val="both"/>
-      </w:pPr>
-      <w:r>
-        <w:t xml:space="preserve">Per la parte database abbiamo utilizzato </w:t>
-      </w:r>
-      <w:proofErr w:type="spellStart"/>
-      <w:r>
-        <w:t>firebase</w:t>
-      </w:r>
-      <w:proofErr w:type="spellEnd"/>
-      <w:r>
-        <w:t xml:space="preserve"> - </w:t>
-      </w:r>
-      <w:proofErr w:type="spellStart"/>
-      <w:r>
-        <w:t>real</w:t>
-      </w:r>
-      <w:proofErr w:type="spellEnd"/>
-      <w:r>
-        <w:t xml:space="preserve"> time database, basato su linguaggio NOSQL. Tramite questo gestiamo tutta la parte di salvataggio, autenticazione, controlli.</w:t>
-      </w:r>
-    </w:p>
-    <w:p>
-      <w:pPr>
-        <w:jc w:val="both"/>
-      </w:pPr>
-      <w:r>
-        <w:t xml:space="preserve">Abbiamo tre nodi: uno che rappresenta gli utenti, uno che rappresenta le prenotazioni e uno che rappresenta le prenotazioni per utente. In questo modo è più semplice fare tutte le operazioni di ricerca e confronto che avverranno nel </w:t>
-      </w:r>
-      <w:proofErr w:type="spellStart"/>
-      <w:r>
-        <w:t>backend</w:t>
-      </w:r>
-      <w:proofErr w:type="spellEnd"/>
-      <w:r>
-        <w:t xml:space="preserve"> della nostra applicazione.</w:t>
-      </w:r>
-    </w:p>
-    <w:p>
-      <w:pPr>
-        <w:jc w:val="both"/>
-      </w:pPr>
-      <w:r>
-        <w:t xml:space="preserve">La gestione dei </w:t>
-      </w:r>
-      <w:proofErr w:type="spellStart"/>
-      <w:r>
-        <w:t>sottonodi</w:t>
-      </w:r>
-      <w:proofErr w:type="spellEnd"/>
-      <w:r>
-        <w:t xml:space="preserve"> verrà decisa in base a come è più comodo, in particolare per il nodo prenotazione (si pensa ad una gestione del tipo prenotazione → date → ora→ info ma non è confermato).</w:t>
-      </w:r>
-    </w:p>
-    <w:p>
-      <w:pPr>
-        <w:jc w:val="both"/>
-      </w:pPr>
-      <w:r>
-        <w:t xml:space="preserve">Per la parte grafica utilizziamo </w:t>
-      </w:r>
-      <w:proofErr w:type="spellStart"/>
-      <w:r>
-        <w:t>Vaadin</w:t>
-      </w:r>
-      <w:proofErr w:type="spellEnd"/>
-      <w:r>
-        <w:t>. Oltre a gestire la parte grafica già integrata, dovrebbe rendere più semplice il collegamento con la parte back end dell’applicazione.</w:t>
-      </w:r>
-    </w:p>
-    <w:p>
-      <w:pPr>
-        <w:jc w:val="both"/>
-      </w:pPr>
-      <w:r>
-        <w:t xml:space="preserve">Per la gestione stili e colore di caratteri e in generale della parte web visiva abbiamo integrato </w:t>
-      </w:r>
-      <w:proofErr w:type="spellStart"/>
-      <w:r>
-        <w:t>Vaadin</w:t>
-      </w:r>
-      <w:proofErr w:type="spellEnd"/>
-      <w:r>
-        <w:t xml:space="preserve"> (che è limitato sotto tale punto di vista) con delle aggiunte </w:t>
-      </w:r>
-      <w:proofErr w:type="spellStart"/>
-      <w:r>
-        <w:t>css</w:t>
-      </w:r>
-      <w:proofErr w:type="spellEnd"/>
-      <w:r>
-        <w:t xml:space="preserve"> e </w:t>
-      </w:r>
-      <w:proofErr w:type="spellStart"/>
-      <w:r>
-        <w:t>javascript</w:t>
-      </w:r>
-      <w:proofErr w:type="spellEnd"/>
-      <w:r>
-        <w:t>.</w:t>
-      </w:r>
-    </w:p>
-    <w:p>
-      <w:pPr>
-        <w:jc w:val="both"/>
-      </w:pPr>
-      <w:r>
-        <w:t xml:space="preserve">Infine per la mappa abbiamo optato per </w:t>
-      </w:r>
-      <w:proofErr w:type="spellStart"/>
-      <w:r>
-        <w:t>Leaflet</w:t>
-      </w:r>
-      <w:proofErr w:type="spellEnd"/>
-      <w:r>
-        <w:t xml:space="preserve">, un software open source che ci permette di usare mappe interattive senza troppi problemi (inizialmente avevamo pensato a </w:t>
-      </w:r>
-      <w:proofErr w:type="spellStart"/>
-      <w:r>
-        <w:t>google</w:t>
-      </w:r>
-      <w:proofErr w:type="spellEnd"/>
-      <w:r>
-        <w:t xml:space="preserve"> API </w:t>
-      </w:r>
-      <w:proofErr w:type="spellStart"/>
-      <w:r>
-        <w:t>maps</w:t>
-      </w:r>
-      <w:proofErr w:type="spellEnd"/>
-      <w:r>
-        <w:t xml:space="preserve"> ma la procedura di ottenimento della chiave era molto più complessa).</w:t>
-      </w:r>
-    </w:p>
-    <w:p>
-      <w:pPr>
-        <w:jc w:val="both"/>
-      </w:pPr>
-      <w:r>
-        <w:lastRenderedPageBreak/>
-        <w:t>Queste aggiunte rendono la nostra applicazione più professionale e, in un futuro, realmente utilizzabile.</w:t>
-      </w:r>
-    </w:p>
-    <w:p>
-      <w:pPr>
-        <w:jc w:val="both"/>
-      </w:pPr>
-    </w:p>
-    <w:p>
-      <w:pPr>
-        <w:jc w:val="both"/>
-      </w:pPr>
-      <w:r>
-        <w:t>FORSE PARTE DI COSA ABBIAMO UTILIZZATO MEGLIO METTERLE IN TECNICHE?</w:t>
-      </w:r>
-    </w:p>
-    <w:p>
-      <w:pPr>
-        <w:jc w:val="both"/>
-      </w:pPr>
-    </w:p>
-    <w:p>
-      <w:pPr>
-        <w:jc w:val="both"/>
-      </w:pPr>
-    </w:p>
-    <w:p>
-      <w:pPr>
-        <w:jc w:val="both"/>
-      </w:pPr>
-    </w:p>
-    <w:p>
-      <w:pPr>
-        <w:jc w:val="both"/>
-      </w:pPr>
-    </w:p>
-    <w:p>
-      <w:pPr>
-        <w:jc w:val="both"/>
-      </w:pPr>
-    </w:p>
-    <w:p>
-      <w:pPr>
-        <w:jc w:val="both"/>
-      </w:pPr>
-    </w:p>
-    <w:p>
-      <w:pPr>
-        <w:jc w:val="both"/>
-      </w:pPr>
-    </w:p>
-    <w:p>
-      <w:pPr>
-        <w:jc w:val="both"/>
-      </w:pPr>
-    </w:p>
-    <w:p>
-      <w:pPr>
-        <w:jc w:val="both"/>
-      </w:pPr>
-    </w:p>
-    <w:p>
-      <w:pPr>
-        <w:jc w:val="both"/>
-      </w:pPr>
-    </w:p>
-    <w:p>
-      <w:pPr>
-        <w:jc w:val="both"/>
-      </w:pPr>
-    </w:p>
-    <w:p>
-      <w:pPr>
-        <w:jc w:val="both"/>
-      </w:pPr>
-    </w:p>
-    <w:p>
-      <w:pPr>
-        <w:jc w:val="both"/>
-      </w:pPr>
-    </w:p>
-    <w:p>
-      <w:pPr>
-        <w:jc w:val="both"/>
-      </w:pPr>
-    </w:p>
-    <w:p>
-      <w:pPr>
-        <w:jc w:val="both"/>
-      </w:pPr>
-    </w:p>
-    <w:p>
-      <w:pPr>
-        <w:jc w:val="both"/>
-      </w:pPr>
-    </w:p>
-    <w:p>
-      <w:pPr>
-        <w:jc w:val="both"/>
-      </w:pPr>
-    </w:p>
-    <w:p>
-      <w:pPr>
-        <w:jc w:val="both"/>
-      </w:pPr>
-    </w:p>
-    <w:p>
-      <w:pPr>
-        <w:jc w:val="both"/>
-      </w:pPr>
-    </w:p>
-    <w:p>
-      <w:pPr>
-        <w:jc w:val="both"/>
-      </w:pPr>
-    </w:p>
-    <w:p>
-      <w:pPr>
-        <w:jc w:val="both"/>
-      </w:pPr>
-    </w:p>
-    <w:p>
-      <w:pPr>
-        <w:jc w:val="both"/>
-      </w:pPr>
-    </w:p>
-    <w:p>
-      <w:pPr>
-        <w:jc w:val="both"/>
-      </w:pPr>
-    </w:p>
-    <w:p>
-      <w:pPr>
-        <w:jc w:val="both"/>
-      </w:pPr>
-    </w:p>
-    <w:p>
-      <w:pPr>
-        <w:jc w:val="both"/>
-      </w:pPr>
-    </w:p>
-    <w:p>
-      <w:pPr>
-        <w:jc w:val="both"/>
-      </w:pPr>
-    </w:p>
-    <w:p>
-      <w:pPr>
-        <w:jc w:val="both"/>
-      </w:pPr>
-    </w:p>
-    <w:p>
-      <w:pPr>
-        <w:jc w:val="both"/>
-      </w:pPr>
-    </w:p>
-    <w:p>
-      <w:pPr>
-        <w:jc w:val="both"/>
-      </w:pPr>
-    </w:p>
-    <w:p>
-      <w:pPr>
-        <w:jc w:val="both"/>
+      </w:pPr>
+      <w:r>
         <w:rPr>
           <w:b/>
           <w:bCs/>
           <w:sz w:val="28"/>
           <w:szCs w:val="28"/>
         </w:rPr>
-      </w:pPr>
-      <w:r>
+        <w:lastRenderedPageBreak/>
+        <w:t>ORGANIZZAZIONE DEL PROCESSO</w:t>
+      </w:r>
+    </w:p>
+    <w:p>
+      <w:pPr>
+        <w:spacing w:after="0"/>
+        <w:jc w:val="both"/>
+      </w:pPr>
+      <w:r>
+        <w:t>Sono stati definiti i seguenti ruoli, in accordo con le regole del metodo SCRUM utilizzato.</w:t>
+      </w:r>
+    </w:p>
+    <w:p>
+      <w:pPr>
+        <w:spacing w:after="0"/>
+        <w:jc w:val="both"/>
+      </w:pPr>
+      <w:r>
+        <w:rPr>
+          <w:b/>
+          <w:bCs/>
+        </w:rPr>
+        <w:t>Product owner</w:t>
+      </w:r>
+      <w:r>
+        <w:t xml:space="preserve"> </w:t>
+      </w:r>
+      <w:r>
+        <w:t>-</w:t>
+      </w:r>
+      <w:r>
+        <w:t xml:space="preserve"> Davide Mascheretti </w:t>
+      </w:r>
+      <w:r>
+        <w:t>: responsabile della gestione generale del progetto, delle risorse e delle funzionalità principali.</w:t>
+      </w:r>
+    </w:p>
+    <w:p>
+      <w:pPr>
+        <w:spacing w:after="0"/>
+        <w:jc w:val="both"/>
+      </w:pPr>
+      <w:r>
+        <w:rPr>
+          <w:b/>
+          <w:bCs/>
+        </w:rPr>
+        <w:t>Scrum master</w:t>
+      </w:r>
+      <w:r>
+        <w:t xml:space="preserve"> </w:t>
+      </w:r>
+      <w:r>
+        <w:t>-</w:t>
+      </w:r>
+      <w:r>
+        <w:t xml:space="preserve"> Tommaso Maistrello</w:t>
+      </w:r>
+      <w:r>
+        <w:t xml:space="preserve"> : responsabile del corretto svolgimento dell’approccio agile, della comunicazione nel team e risolutore di problemi di natura tecnica e non.</w:t>
+      </w:r>
+    </w:p>
+    <w:p>
+      <w:pPr>
+        <w:spacing w:after="0"/>
+        <w:jc w:val="both"/>
+      </w:pPr>
+      <w:r>
+        <w:rPr>
+          <w:b/>
+          <w:bCs/>
+        </w:rPr>
+        <w:t>Team di implementazione</w:t>
+      </w:r>
+      <w:r>
+        <w:t xml:space="preserve"> </w:t>
+      </w:r>
+      <w:r>
+        <w:t xml:space="preserve">- </w:t>
+      </w:r>
+      <w:r>
+        <w:t>Tommaso Maistrello, Davide Mascheretti, Claudio Morgera, Francesco Valenari</w:t>
+      </w:r>
+      <w:r>
+        <w:t xml:space="preserve"> : responsabili dello sviluppo del software e della documentazione.</w:t>
+      </w:r>
+    </w:p>
+    <w:p>
+      <w:pPr>
+        <w:spacing w:after="0"/>
+        <w:jc w:val="both"/>
+      </w:pPr>
+    </w:p>
+    <w:p>
+      <w:pPr>
+        <w:spacing w:after="0"/>
+        <w:jc w:val="both"/>
+      </w:pPr>
+      <w:r>
+        <w:t>Inoltre, a</w:t>
+      </w:r>
+      <w:r>
+        <w:t>ll’interno del team di implementazione</w:t>
+      </w:r>
+      <w:r>
+        <w:t>,</w:t>
+      </w:r>
+      <w:r>
+        <w:t xml:space="preserve"> i ruoli sono stati inoltre cos</w:t>
+      </w:r>
+      <w:r>
+        <w:t>ì</w:t>
+      </w:r>
+      <w:r>
+        <w:t xml:space="preserve"> ridefiniti.</w:t>
+      </w:r>
+    </w:p>
+    <w:p>
+      <w:pPr>
+        <w:spacing w:after="0"/>
+        <w:jc w:val="both"/>
+      </w:pPr>
+    </w:p>
+    <w:p>
+      <w:pPr>
+        <w:spacing w:after="0"/>
+        <w:jc w:val="both"/>
+      </w:pPr>
+      <w:r>
+        <w:rPr>
+          <w:b/>
+          <w:bCs/>
+        </w:rPr>
+        <w:t>Frontend</w:t>
+      </w:r>
+      <w:r>
+        <w:t>: sviluppo interfaccia, mappa interattiva, passaggio tra pagine, menù.</w:t>
+      </w:r>
+    </w:p>
+    <w:p>
+      <w:pPr>
+        <w:spacing w:after="0"/>
+        <w:jc w:val="both"/>
+      </w:pPr>
+      <w:r>
+        <w:rPr>
+          <w:b/>
+          <w:bCs/>
+        </w:rPr>
+        <w:t>Backend</w:t>
+      </w:r>
+      <w:r>
+        <w:rPr>
+          <w:b/>
+          <w:bCs/>
+        </w:rPr>
+        <w:t xml:space="preserve"> </w:t>
+      </w:r>
+      <w:r>
+        <w:rPr>
+          <w:b/>
+          <w:bCs/>
+        </w:rPr>
+        <w:t>+</w:t>
+      </w:r>
+      <w:r>
+        <w:rPr>
+          <w:b/>
+          <w:bCs/>
+        </w:rPr>
+        <w:t xml:space="preserve"> </w:t>
+      </w:r>
+      <w:r>
+        <w:rPr>
+          <w:b/>
+          <w:bCs/>
+        </w:rPr>
+        <w:t>Database</w:t>
+      </w:r>
+      <w:r>
+        <w:t>: gestione firebase Realtime Database, controlli utente e prenotazioni, salvataggio dati, sicurezza</w:t>
+      </w:r>
+    </w:p>
+    <w:p>
+      <w:pPr>
+        <w:spacing w:after="0"/>
+        <w:jc w:val="both"/>
+        <w:rPr>
+          <w:b/>
+          <w:bCs/>
+        </w:rPr>
+      </w:pPr>
+      <w:r>
+        <w:rPr>
+          <w:b/>
+          <w:bCs/>
+        </w:rPr>
+        <w:t xml:space="preserve">Testing: </w:t>
+      </w:r>
+    </w:p>
+    <w:p>
+      <w:pPr>
+        <w:spacing w:after="0"/>
+        <w:jc w:val="both"/>
+      </w:pPr>
+      <w:r>
+        <w:rPr>
+          <w:b/>
+          <w:bCs/>
+        </w:rPr>
+        <w:t>Documentazione</w:t>
+      </w:r>
+      <w:r>
+        <w:t>: project plan, diagrammi UML, informazioni generali.</w:t>
+      </w:r>
+    </w:p>
+    <w:p>
+      <w:pPr>
+        <w:spacing w:after="0"/>
+        <w:jc w:val="both"/>
+      </w:pPr>
+      <w:r>
+        <w:t xml:space="preserve">Le specifiche e l’assegnazione di questi ruoli all’interno del team sono </w:t>
+      </w:r>
+      <w:r>
+        <w:t>illustrate in maniera più dettagliata</w:t>
+      </w:r>
+      <w:r>
+        <w:t xml:space="preserve"> all’interno del paragrafo </w:t>
+      </w:r>
+      <w:r>
+        <w:rPr>
+          <w:u w:val="single"/>
+        </w:rPr>
+        <w:t>Personale</w:t>
+      </w:r>
+      <w:r>
+        <w:t>.</w:t>
+      </w:r>
+    </w:p>
+    <w:p>
+      <w:pPr>
+        <w:spacing w:after="0"/>
+        <w:jc w:val="both"/>
+      </w:pPr>
+    </w:p>
+    <w:p>
+      <w:pPr>
+        <w:spacing w:after="0"/>
+        <w:jc w:val="both"/>
+      </w:pPr>
+      <w:r>
+        <w:t>Nonostante ciò, nel caso di necessità un membro del gruppo può contribuire alla collaborazione con il membro affidato a quel ruolo.</w:t>
+      </w:r>
+    </w:p>
+    <w:p>
+      <w:pPr>
+        <w:spacing w:after="0"/>
+        <w:jc w:val="both"/>
+      </w:pPr>
+      <w:r>
+        <w:t>La conoscenza deve essere utilizzata in maniera trasversale</w:t>
+      </w:r>
+      <w:r>
+        <w:t xml:space="preserve"> e il gruppo deve adottare un approccio collaborativo.</w:t>
+      </w:r>
+    </w:p>
+    <w:p>
+      <w:pPr>
+        <w:spacing w:after="0"/>
+        <w:jc w:val="both"/>
+      </w:pPr>
+      <w:r>
+        <w:t>La documentazione chiara e dettagliata è considerata responsabilità condivisa tra tutti i membri del gruppo, essa deve essere il compito di tutti.</w:t>
+      </w:r>
+    </w:p>
+    <w:p>
+      <w:pPr>
+        <w:spacing w:after="0"/>
+        <w:jc w:val="both"/>
+      </w:pPr>
+    </w:p>
+    <w:p>
+      <w:pPr>
+        <w:spacing w:after="0"/>
+        <w:jc w:val="both"/>
+      </w:pPr>
+      <w:r>
+        <w:t xml:space="preserve">La comunicazione quotidiana interna avviene tramite un gruppo Whatsapp </w:t>
+      </w:r>
+      <w:r>
+        <w:t>dedicato</w:t>
+      </w:r>
+      <w:r>
+        <w:t>, utilizzato per scambio di informazioni</w:t>
+      </w:r>
+      <w:r>
+        <w:t xml:space="preserve">, aggiornamenti, </w:t>
+      </w:r>
+      <w:r>
+        <w:t>domande inerenti al progetto o a problemi riscontrati.</w:t>
+      </w:r>
+    </w:p>
+    <w:p>
+      <w:pPr>
+        <w:spacing w:after="0"/>
+        <w:jc w:val="both"/>
+      </w:pPr>
+      <w:r>
+        <w:t>Sono previsti inoltre b</w:t>
+      </w:r>
+      <w:r>
+        <w:t xml:space="preserve">revi meeting principalmente non online per risolvere problemi </w:t>
+      </w:r>
+      <w:r>
+        <w:t xml:space="preserve">e </w:t>
+      </w:r>
+      <w:r>
+        <w:t xml:space="preserve">per </w:t>
+      </w:r>
+      <w:r>
+        <w:t xml:space="preserve">eventuali </w:t>
+      </w:r>
+      <w:r>
+        <w:t>chiarimenti</w:t>
+      </w:r>
+      <w:r>
+        <w:t>.</w:t>
+      </w:r>
+    </w:p>
+    <w:p>
+      <w:pPr>
+        <w:spacing w:after="0"/>
+        <w:jc w:val="both"/>
+      </w:pPr>
+      <w:r>
+        <w:t>Decisioni, urgenze e task vengono gestiti dal gruppo stesso durante i meeting settimanali, in cui si decide anche se è necessario un cambio di ruoli.</w:t>
+      </w:r>
+    </w:p>
+    <w:p>
+      <w:pPr>
+        <w:spacing w:after="0"/>
+        <w:jc w:val="both"/>
+      </w:pPr>
+      <w:r>
+        <w:t>La gestione delle attività che ogni membro svolge sul codice viene gestita tramite l’u</w:t>
+      </w:r>
+      <w:r>
+        <w:t xml:space="preserve">tilizzo di GitHub privato condiviso </w:t>
+      </w:r>
+      <w:r>
+        <w:t>con il gruppo.</w:t>
+      </w:r>
+    </w:p>
+    <w:p>
+      <w:pPr>
+        <w:spacing w:after="0"/>
+        <w:jc w:val="both"/>
+      </w:pPr>
+      <w:r>
+        <w:t xml:space="preserve">Esso è inoltre utilizzato per la tracciabilità e per la gestione delle </w:t>
+      </w:r>
+      <w:proofErr w:type="spellStart"/>
+      <w:r>
+        <w:t>issue</w:t>
+      </w:r>
+      <w:proofErr w:type="spellEnd"/>
+      <w:r>
+        <w:t>.</w:t>
+      </w:r>
+    </w:p>
+    <w:p>
+      <w:pPr>
+        <w:spacing w:after="0"/>
+        <w:jc w:val="both"/>
+      </w:pPr>
+      <w:r>
+        <w:t>La documentazione viene inizialmente caricata e modificata in un file condiviso in Google Drive per poi essere integrata ufficialmente nella repository.</w:t>
+      </w:r>
+    </w:p>
+    <w:p>
+      <w:pPr>
+        <w:spacing w:after="0"/>
+        <w:jc w:val="both"/>
+      </w:pPr>
+      <w:r>
+        <w:t>Questa tipologia di organizzazione permette ai membri del gruppo di avere una definita suddivisone dei ruoli, in cui ognuno è a conoscenza delle sue responsabilità al fine di avere una corretta evoluzione del progetto.</w:t>
+      </w:r>
+    </w:p>
+    <w:p>
+      <w:pPr>
+        <w:spacing w:after="0"/>
+        <w:jc w:val="both"/>
+      </w:pPr>
+      <w:r>
+        <w:t>È necessario lavoro costante da parte di tutto il team.</w:t>
+      </w:r>
+    </w:p>
+    <w:p>
+      <w:pPr>
+        <w:jc w:val="both"/>
+      </w:pPr>
+    </w:p>
+    <w:p>
+      <w:pPr>
+        <w:jc w:val="both"/>
+      </w:pPr>
+    </w:p>
+    <w:p>
+      <w:pPr>
+        <w:jc w:val="both"/>
+      </w:pPr>
+    </w:p>
+    <w:p>
+      <w:pPr>
+        <w:jc w:val="both"/>
+      </w:pPr>
+    </w:p>
+    <w:p>
+      <w:pPr>
+        <w:jc w:val="both"/>
+      </w:pPr>
+    </w:p>
+    <w:p>
+      <w:pPr>
+        <w:jc w:val="both"/>
         <w:rPr>
           <w:b/>
           <w:bCs/>
           <w:sz w:val="28"/>
           <w:szCs w:val="28"/>
         </w:rPr>
-        <w:lastRenderedPageBreak/>
-        <w:t>ATTIVITÀ DI GESTIONE</w:t>
-      </w:r>
-    </w:p>
-    <w:p>
-      <w:pPr>
-        <w:jc w:val="both"/>
-      </w:pPr>
-      <w:r>
-        <w:t>La gestione del progetto avviene attraverso incontri ravvicinati soprattutto in ambiente universitario. Durante l‘incontro ogni membro aggiorna il gruppo sulle modifiche apportate al codice, eventuali problemi che ha rilevato, accorgimenti e un ipotetica suddivisione dei compiti che devono essere assegnati agli altri membri nel caso siano necessari per lo sviluppo del progetto.</w:t>
-      </w:r>
-    </w:p>
-    <w:p>
-      <w:pPr>
-        <w:jc w:val="both"/>
-      </w:pPr>
-      <w:r>
-        <w:t xml:space="preserve">Naturalmente tutto ciò, oltre ad essere tema di incontro, deve essere dettagliatamente descritto nella documentazione o negli </w:t>
-      </w:r>
-      <w:proofErr w:type="spellStart"/>
-      <w:r>
-        <w:t>issue</w:t>
-      </w:r>
-      <w:proofErr w:type="spellEnd"/>
-      <w:r>
-        <w:t xml:space="preserve"> tramite GitHub.</w:t>
-      </w:r>
-    </w:p>
-    <w:p>
-      <w:pPr>
-        <w:jc w:val="both"/>
-      </w:pPr>
-      <w:r>
-        <w:t xml:space="preserve">In caso di domande o dubbi dopo i vari incontri possono essere chiariti anche tramite gruppo Whatsapp creato per una messaggistica rapida, a cui può seguire una chiamata o una discussione per la ricerca di una possibile risoluzione della problematica. In caso di mancata soluzione al problema, e la conseguente impossibilità di chiusura della </w:t>
-      </w:r>
-      <w:proofErr w:type="spellStart"/>
-      <w:r>
-        <w:t>issue</w:t>
-      </w:r>
-      <w:proofErr w:type="spellEnd"/>
-      <w:r>
-        <w:t xml:space="preserve"> nel caso sia stata creata, si opterà per un nuovo incontro di gruppo.</w:t>
-      </w:r>
-    </w:p>
-    <w:p>
-      <w:pPr>
-        <w:jc w:val="both"/>
-      </w:pPr>
-    </w:p>
-    <w:p>
-      <w:pPr>
-        <w:jc w:val="both"/>
-      </w:pPr>
-    </w:p>
-    <w:p>
-      <w:pPr>
-        <w:jc w:val="both"/>
-      </w:pPr>
-    </w:p>
-    <w:p>
-      <w:pPr>
-        <w:jc w:val="both"/>
-      </w:pPr>
-    </w:p>
-    <w:p>
-      <w:pPr>
-        <w:jc w:val="both"/>
-      </w:pPr>
-    </w:p>
-    <w:p>
-      <w:pPr>
-        <w:jc w:val="both"/>
-      </w:pPr>
-    </w:p>
-    <w:p>
-      <w:pPr>
-        <w:jc w:val="both"/>
-      </w:pPr>
-    </w:p>
-    <w:p>
-      <w:pPr>
-        <w:jc w:val="both"/>
-      </w:pPr>
-    </w:p>
-    <w:p>
-      <w:pPr>
-        <w:jc w:val="both"/>
-      </w:pPr>
-    </w:p>
-    <w:p>
-      <w:pPr>
-        <w:jc w:val="both"/>
-      </w:pPr>
-    </w:p>
-    <w:p>
-      <w:pPr>
-        <w:jc w:val="both"/>
-      </w:pPr>
-    </w:p>
-    <w:p>
-      <w:pPr>
-        <w:jc w:val="both"/>
-      </w:pPr>
-    </w:p>
-    <w:p>
-      <w:pPr>
-        <w:jc w:val="both"/>
-      </w:pPr>
-    </w:p>
-    <w:p>
-      <w:pPr>
-        <w:jc w:val="both"/>
-      </w:pPr>
-    </w:p>
-    <w:p>
-      <w:pPr>
-        <w:jc w:val="both"/>
-      </w:pPr>
-    </w:p>
-    <w:p>
-      <w:pPr>
-        <w:jc w:val="both"/>
-      </w:pPr>
-    </w:p>
-    <w:p>
-      <w:pPr>
-        <w:jc w:val="both"/>
-      </w:pPr>
-    </w:p>
-    <w:p>
-      <w:pPr>
-        <w:jc w:val="both"/>
-      </w:pPr>
-    </w:p>
-    <w:p>
-      <w:pPr>
-        <w:jc w:val="both"/>
-      </w:pPr>
-    </w:p>
-    <w:p>
-      <w:pPr>
-        <w:jc w:val="both"/>
-      </w:pPr>
-    </w:p>
-    <w:p>
-      <w:pPr>
-        <w:jc w:val="both"/>
-      </w:pPr>
-    </w:p>
-    <w:p>
-      <w:pPr>
-        <w:jc w:val="both"/>
-      </w:pPr>
-    </w:p>
-    <w:p>
-      <w:pPr>
-        <w:jc w:val="both"/>
-      </w:pPr>
-    </w:p>
-    <w:p>
-      <w:pPr>
-        <w:jc w:val="both"/>
+      </w:pPr>
+      <w:r>
         <w:rPr>
           <w:b/>
           <w:bCs/>
           <w:sz w:val="28"/>
           <w:szCs w:val="28"/>
         </w:rPr>
-      </w:pPr>
-      <w:r>
+        <w:lastRenderedPageBreak/>
+        <w:t>STANDARD, LINEE GUIDE E PROCEDURE</w:t>
+      </w:r>
+    </w:p>
+    <w:p>
+      <w:pPr>
+        <w:jc w:val="both"/>
+        <w:rPr>
+          <w:i/>
+          <w:iCs/>
+        </w:rPr>
+      </w:pPr>
+      <w:r>
+        <w:rPr>
+          <w:i/>
+          <w:iCs/>
+        </w:rPr>
+        <w:t>Gestione codice</w:t>
+      </w:r>
+    </w:p>
+    <w:p>
+      <w:pPr>
+        <w:spacing w:after="0"/>
+        <w:jc w:val="both"/>
+      </w:pPr>
+      <w:r>
+        <w:t xml:space="preserve">Per gestire tutte le procedure e tutti i cambiamenti del nostro progetto </w:t>
+      </w:r>
+      <w:r>
+        <w:t xml:space="preserve">è obbligatorio utilizzare </w:t>
+      </w:r>
+      <w:proofErr w:type="spellStart"/>
+      <w:r>
+        <w:t>Github</w:t>
+      </w:r>
+      <w:proofErr w:type="spellEnd"/>
+      <w:r>
+        <w:t xml:space="preserve">, gestore di configurazione online distribuito che permette ad ognuno di avere una propria </w:t>
+      </w:r>
+      <w:proofErr w:type="spellStart"/>
+      <w:r>
+        <w:t>local</w:t>
+      </w:r>
+      <w:proofErr w:type="spellEnd"/>
+      <w:r>
+        <w:t xml:space="preserve"> repo</w:t>
+      </w:r>
+      <w:r>
+        <w:t>sitory</w:t>
+      </w:r>
+      <w:r>
+        <w:t>.</w:t>
+      </w:r>
+      <w:r>
+        <w:t xml:space="preserve"> </w:t>
+      </w:r>
+    </w:p>
+    <w:p>
+      <w:pPr>
+        <w:spacing w:after="0"/>
+        <w:jc w:val="both"/>
+      </w:pPr>
+      <w:r>
+        <w:t xml:space="preserve">Riguardo la documentazione è necessaria chiarezza sia per le classi aggiunte, che devono essere esplicitamente e dettagliatamente spiegate, sia per tutti i </w:t>
+      </w:r>
+      <w:proofErr w:type="spellStart"/>
+      <w:r>
+        <w:t>commit</w:t>
+      </w:r>
+      <w:proofErr w:type="spellEnd"/>
+      <w:r>
+        <w:t xml:space="preserve"> che vengono fatti.</w:t>
+      </w:r>
+    </w:p>
+    <w:p>
+      <w:pPr>
+        <w:spacing w:after="0"/>
+        <w:jc w:val="both"/>
+      </w:pPr>
+      <w:r>
+        <w:t>La tracciabilità delle modifiche deve essere un aspetto fondamentale.</w:t>
+      </w:r>
+    </w:p>
+    <w:p>
+      <w:pPr>
+        <w:spacing w:after="0"/>
+        <w:jc w:val="both"/>
+      </w:pPr>
+      <w:r>
+        <w:t xml:space="preserve">Nel titolo del </w:t>
+      </w:r>
+      <w:proofErr w:type="spellStart"/>
+      <w:r>
+        <w:t>commit</w:t>
+      </w:r>
+      <w:proofErr w:type="spellEnd"/>
+      <w:r>
+        <w:t xml:space="preserve"> ci deve essere in generale le modifiche principali apportate e cosa cambia di importante rispetto alla versione precedente. Nella descrizione è possibile aggiungere tutte le informazioni necessarie che descrivono i cambiamenti passo per passo, le scelte effettuate, le motivazioni se necessarie e tutto ciò che permette di comprendere al meglio da una persona esterna cosa è cambiato in seguito alle modifiche effettuate.</w:t>
+      </w:r>
+    </w:p>
+    <w:p>
+      <w:pPr>
+        <w:spacing w:after="0"/>
+        <w:jc w:val="both"/>
+      </w:pPr>
+      <w:r>
+        <w:t xml:space="preserve">La documentazione è da consegnare necessariamente in seguito al cambiamento del macro argomento su cui stiamo lavorando. </w:t>
+      </w:r>
+    </w:p>
+    <w:p>
+      <w:pPr>
+        <w:spacing w:after="0"/>
+        <w:jc w:val="both"/>
+      </w:pPr>
+      <w:r>
+        <w:t xml:space="preserve">Non è necessario fare commenti se i cambiamenti sono ininfluenti sul funzionamento generale dell’applicazione, piuttosto meglio attendere e fare </w:t>
+      </w:r>
+      <w:proofErr w:type="spellStart"/>
+      <w:r>
+        <w:t>push</w:t>
+      </w:r>
+      <w:proofErr w:type="spellEnd"/>
+      <w:r>
+        <w:t xml:space="preserve"> una volta aggiunto qualcosa di realmente significativo.</w:t>
+      </w:r>
+    </w:p>
+    <w:p>
+      <w:pPr>
+        <w:spacing w:after="0"/>
+        <w:jc w:val="both"/>
+      </w:pPr>
+      <w:r>
+        <w:t xml:space="preserve">Nel caso di modifiche con bug presenti (leggeri non che annullano il funzionamento generale)  è consigliato comunque fare </w:t>
+      </w:r>
+      <w:proofErr w:type="spellStart"/>
+      <w:r>
+        <w:t>commit</w:t>
+      </w:r>
+      <w:proofErr w:type="spellEnd"/>
+      <w:r>
+        <w:t>, magari aggiungendo la descrizione dell’errore. In questo modo ognuno è aggiornato alla versione corretta ed è possibile risolvere il bug o in parallelo allo sviluppo, oppure alla fine del progetto.</w:t>
+      </w:r>
+    </w:p>
+    <w:p>
+      <w:pPr>
+        <w:spacing w:after="0"/>
+        <w:jc w:val="both"/>
+      </w:pPr>
+      <w:r>
+        <w:t>Ci si aspetta che ognuno rispetti le linee guida in maniera autonoma, nessun membro del gruppo verifica che gli altri membri rispettino le linee guida.</w:t>
+      </w:r>
+    </w:p>
+    <w:p>
+      <w:pPr>
+        <w:spacing w:after="0"/>
+        <w:jc w:val="both"/>
+      </w:pPr>
+      <w:r>
+        <w:t>Ogni membro del gruppo è responsabile della qualità e della coerenza del codice che scrive.</w:t>
+      </w:r>
+    </w:p>
+    <w:p>
+      <w:pPr>
+        <w:spacing w:after="0"/>
+        <w:jc w:val="both"/>
+      </w:pPr>
+    </w:p>
+    <w:p>
+      <w:pPr>
+        <w:spacing w:after="0"/>
+        <w:jc w:val="both"/>
+      </w:pPr>
+      <w:r>
+        <w:t>Il gruppo utilizza inoltre la tabella presente nel documento di specifica di requisiti per visualizzare lo stato di avanzamento del progetto, segnando la data di raggiungimento di determinati requisiti.</w:t>
+      </w:r>
+    </w:p>
+    <w:p>
+      <w:pPr>
+        <w:spacing w:after="0"/>
+        <w:jc w:val="both"/>
+      </w:pPr>
+    </w:p>
+    <w:p>
+      <w:pPr>
+        <w:spacing w:after="0"/>
+        <w:jc w:val="both"/>
+        <w:rPr>
+          <w:i/>
+          <w:iCs/>
+        </w:rPr>
+      </w:pPr>
+      <w:r>
+        <w:rPr>
+          <w:i/>
+          <w:iCs/>
+        </w:rPr>
+        <w:t>Standard utilizzati</w:t>
+      </w:r>
+    </w:p>
+    <w:p>
+      <w:pPr>
+        <w:spacing w:after="0"/>
+        <w:jc w:val="both"/>
+      </w:pPr>
+    </w:p>
+    <w:p>
+      <w:pPr>
+        <w:spacing w:after="0"/>
+        <w:jc w:val="both"/>
+      </w:pPr>
+      <w:r>
+        <w:t>Gli standard di programmazione sono quelli classici di java definite da Oracle.</w:t>
+      </w:r>
+      <w:r>
+        <w:t xml:space="preserve"> </w:t>
+      </w:r>
+    </w:p>
+    <w:p>
+      <w:pPr>
+        <w:spacing w:after="0"/>
+        <w:jc w:val="both"/>
+      </w:pPr>
+      <w:r>
+        <w:t xml:space="preserve">Vengono rispettate convenzioni su classi, attributi e metodi. </w:t>
+      </w:r>
+    </w:p>
+    <w:p>
+      <w:pPr>
+        <w:spacing w:after="0"/>
+        <w:jc w:val="both"/>
+      </w:pPr>
+      <w:r>
+        <w:t xml:space="preserve">Ogni classe deve </w:t>
+      </w:r>
+      <w:r>
+        <w:t>essere introdotta da una descrizione generale del suo funzionamento, degli autori  e della versione che abbiamo modificato.</w:t>
+      </w:r>
+    </w:p>
+    <w:p>
+      <w:pPr>
+        <w:spacing w:after="0"/>
+        <w:jc w:val="both"/>
+      </w:pPr>
+      <w:r>
+        <w:t>Per ogni metodo invece è necessaria una descrizione generica e una spiegazione dettagliata dei parametri utilizzati e del tipo di ritorno della funzione.</w:t>
+      </w:r>
+    </w:p>
+    <w:p>
+      <w:pPr>
+        <w:spacing w:after="0"/>
+        <w:jc w:val="both"/>
+      </w:pPr>
+      <w:r>
+        <w:t xml:space="preserve">Queste funzioni avvengono tramite </w:t>
+      </w:r>
+      <w:proofErr w:type="spellStart"/>
+      <w:r>
+        <w:t>Javadoc</w:t>
+      </w:r>
+      <w:proofErr w:type="spellEnd"/>
+      <w:r>
+        <w:t xml:space="preserve"> (/**)</w:t>
+      </w:r>
+    </w:p>
+    <w:p>
+      <w:pPr>
+        <w:spacing w:after="0"/>
+        <w:jc w:val="both"/>
+      </w:pPr>
+      <w:r>
+        <w:t>Commenti secondari utili per la comprensione devono essere inseriti all’interno del metodo stesso, nel modo // o /*.</w:t>
+      </w:r>
+    </w:p>
+    <w:p>
+      <w:pPr>
+        <w:spacing w:after="0"/>
+        <w:jc w:val="both"/>
+      </w:pPr>
+    </w:p>
+    <w:p>
+      <w:pPr>
+        <w:spacing w:after="0"/>
+        <w:jc w:val="both"/>
+        <w:rPr>
+          <w:i/>
+          <w:iCs/>
+        </w:rPr>
+      </w:pPr>
+      <w:r>
+        <w:rPr>
+          <w:i/>
+          <w:iCs/>
+        </w:rPr>
+        <w:t>Gestione del database</w:t>
+      </w:r>
+    </w:p>
+    <w:p>
+      <w:pPr>
+        <w:spacing w:after="0"/>
+        <w:jc w:val="both"/>
+      </w:pPr>
+      <w:r>
+        <w:t>Per la gestione dei dati</w:t>
+      </w:r>
+      <w:r>
+        <w:t xml:space="preserve"> </w:t>
+      </w:r>
+      <w:r>
+        <w:t>si utilizza F</w:t>
+      </w:r>
+      <w:r>
+        <w:t>irebase</w:t>
+      </w:r>
+      <w:r>
+        <w:t xml:space="preserve"> Realtime Database</w:t>
+      </w:r>
+      <w:r>
+        <w:t>, basato su linguaggio NOSQL.</w:t>
+      </w:r>
+    </w:p>
+    <w:p>
+      <w:pPr>
+        <w:spacing w:after="0"/>
+        <w:jc w:val="both"/>
+      </w:pPr>
+      <w:r>
+        <w:t>Questo permette l’accesso simultaneo di più utenti e l’aggiornamento in tempo reale.</w:t>
+      </w:r>
+    </w:p>
+    <w:p>
+      <w:pPr>
+        <w:spacing w:after="0"/>
+        <w:jc w:val="both"/>
+      </w:pPr>
+      <w:r>
+        <w:t>Si utilizzano</w:t>
+      </w:r>
+      <w:r>
+        <w:t xml:space="preserve"> regole standard (preimpostate da Firebase)</w:t>
+      </w:r>
+      <w:r>
+        <w:t xml:space="preserve">, database privato, in modo che solo i membri interni al gruppo possano visualizzare e modificare. </w:t>
+      </w:r>
+    </w:p>
+    <w:p>
+      <w:pPr>
+        <w:spacing w:after="0"/>
+        <w:jc w:val="both"/>
+      </w:pPr>
+      <w:r>
+        <w:t>Il ruolo assegnato al service account di firebase è quello minimo, utile solo per leggere e scrivere sul database.</w:t>
+      </w:r>
+    </w:p>
+    <w:p>
+      <w:pPr>
+        <w:spacing w:after="0"/>
+        <w:jc w:val="both"/>
+      </w:pPr>
+      <w:r>
+        <w:t>Non è gestita parte di password criptate</w:t>
+      </w:r>
+      <w:r>
+        <w:t>; in un contesto professionale sarebbe da implementare.</w:t>
+      </w:r>
+    </w:p>
+    <w:p>
+      <w:pPr>
+        <w:spacing w:after="0"/>
+        <w:jc w:val="both"/>
+      </w:pPr>
+    </w:p>
+    <w:p>
+      <w:pPr>
+        <w:spacing w:after="0"/>
+        <w:jc w:val="both"/>
+      </w:pPr>
+      <w:r>
+        <w:lastRenderedPageBreak/>
+        <w:t xml:space="preserve">Tramite questo </w:t>
+      </w:r>
+      <w:r>
+        <w:t>si gestisce</w:t>
+      </w:r>
+      <w:r>
+        <w:t xml:space="preserve"> tutta la parte di salvataggio, autenticazione, controlli.</w:t>
+      </w:r>
+    </w:p>
+    <w:p>
+      <w:pPr>
+        <w:spacing w:after="0"/>
+        <w:jc w:val="both"/>
+      </w:pPr>
+      <w:r>
+        <w:t>Si prevedono tre nodi principali</w:t>
+      </w:r>
+      <w:r>
+        <w:t xml:space="preserve">: uno che rappresenta gli </w:t>
+      </w:r>
+      <w:r>
+        <w:rPr>
+          <w:b/>
+          <w:bCs/>
+        </w:rPr>
+        <w:t>utenti</w:t>
+      </w:r>
+      <w:r>
+        <w:t xml:space="preserve">, uno che rappresenta le </w:t>
+      </w:r>
+      <w:r>
+        <w:rPr>
+          <w:b/>
+          <w:bCs/>
+        </w:rPr>
+        <w:t>prenotazioni</w:t>
+      </w:r>
+      <w:r>
+        <w:t xml:space="preserve"> e uno che rappresenta le </w:t>
+      </w:r>
+      <w:r>
+        <w:t>colonnine.</w:t>
+      </w:r>
+    </w:p>
+    <w:p>
+      <w:pPr>
+        <w:spacing w:after="0"/>
+        <w:jc w:val="both"/>
+      </w:pPr>
+      <w:r>
+        <w:t xml:space="preserve">La gestione dei </w:t>
+      </w:r>
+      <w:r>
+        <w:t>sotto nodi</w:t>
+      </w:r>
+      <w:r>
+        <w:t xml:space="preserve"> sarà definita in maniera più chiara in fase di implementazione.</w:t>
+      </w:r>
+    </w:p>
+    <w:p>
+      <w:pPr>
+        <w:spacing w:after="0"/>
+        <w:jc w:val="both"/>
+        <w:rPr>
+          <w:i/>
+          <w:iCs/>
+        </w:rPr>
+      </w:pPr>
+    </w:p>
+    <w:p>
+      <w:pPr>
+        <w:spacing w:after="0"/>
+        <w:jc w:val="both"/>
+        <w:rPr>
+          <w:i/>
+          <w:iCs/>
+        </w:rPr>
+      </w:pPr>
+      <w:r>
+        <w:rPr>
+          <w:i/>
+          <w:iCs/>
+        </w:rPr>
+        <w:t>Interfaccia grafica</w:t>
+      </w:r>
+    </w:p>
+    <w:p>
+      <w:pPr>
+        <w:spacing w:after="0"/>
+        <w:jc w:val="both"/>
+        <w:rPr>
+          <w:i/>
+          <w:iCs/>
+        </w:rPr>
+      </w:pPr>
+    </w:p>
+    <w:p>
+      <w:pPr>
+        <w:spacing w:after="0"/>
+        <w:jc w:val="both"/>
+      </w:pPr>
+      <w:r>
+        <w:t xml:space="preserve">Per la parte grafica </w:t>
+      </w:r>
+      <w:r>
+        <w:t>si utilizza</w:t>
+      </w:r>
+      <w:r>
+        <w:t xml:space="preserve"> </w:t>
+      </w:r>
+      <w:proofErr w:type="spellStart"/>
+      <w:r>
+        <w:rPr>
+          <w:b/>
+          <w:bCs/>
+        </w:rPr>
+        <w:t>Vaadin</w:t>
+      </w:r>
+      <w:proofErr w:type="spellEnd"/>
+      <w:r>
+        <w:t xml:space="preserve">. </w:t>
+      </w:r>
+    </w:p>
+    <w:p>
+      <w:pPr>
+        <w:spacing w:after="0"/>
+        <w:jc w:val="both"/>
+      </w:pPr>
+      <w:r>
+        <w:t xml:space="preserve">Oltre a gestire la parte </w:t>
+      </w:r>
+      <w:r>
+        <w:t>visiva delle interfacce (</w:t>
+      </w:r>
+      <w:r>
+        <w:t>già integrata</w:t>
+      </w:r>
+      <w:r>
+        <w:t>)</w:t>
+      </w:r>
+      <w:r>
+        <w:t xml:space="preserve">, </w:t>
+      </w:r>
+      <w:r>
+        <w:t xml:space="preserve">rende </w:t>
+      </w:r>
+      <w:r>
+        <w:t>più semplice il collegamento con la parte back end dell’applicazione.</w:t>
+      </w:r>
+    </w:p>
+    <w:p>
+      <w:pPr>
+        <w:spacing w:after="0"/>
+        <w:jc w:val="both"/>
+      </w:pPr>
+      <w:r>
+        <w:t xml:space="preserve">Per la gestione stili e colore di caratteri e in generale della parte web visiva abbiamo integrato </w:t>
+      </w:r>
+      <w:proofErr w:type="spellStart"/>
+      <w:r>
+        <w:t>Vaadin</w:t>
+      </w:r>
+      <w:proofErr w:type="spellEnd"/>
+      <w:r>
+        <w:t xml:space="preserve"> (che è limitato sotto tale punto di vista) con delle aggiunte </w:t>
+      </w:r>
+      <w:r>
+        <w:t xml:space="preserve">di file </w:t>
+      </w:r>
+      <w:r>
+        <w:rPr>
+          <w:b/>
+          <w:bCs/>
+        </w:rPr>
+        <w:t>CSS</w:t>
+      </w:r>
+      <w:r>
+        <w:t xml:space="preserve"> e </w:t>
+      </w:r>
+      <w:r>
+        <w:rPr>
+          <w:b/>
+          <w:bCs/>
+        </w:rPr>
+        <w:t>JavaScript</w:t>
+      </w:r>
+      <w:r>
+        <w:t>.</w:t>
+      </w:r>
+    </w:p>
+    <w:p>
+      <w:pPr>
+        <w:spacing w:after="0"/>
+        <w:jc w:val="both"/>
+      </w:pPr>
+      <w:r>
+        <w:t>Per la mappa si è optato</w:t>
+      </w:r>
+      <w:r>
+        <w:t xml:space="preserve"> per </w:t>
+      </w:r>
+      <w:proofErr w:type="spellStart"/>
+      <w:r>
+        <w:rPr>
+          <w:b/>
+          <w:bCs/>
+        </w:rPr>
+        <w:t>Leaflet</w:t>
+      </w:r>
+      <w:proofErr w:type="spellEnd"/>
+      <w:r>
+        <w:t xml:space="preserve">, un software open source che ci permette di usare mappe interattive senza troppi problemi (inizialmente </w:t>
+      </w:r>
+      <w:r>
+        <w:t xml:space="preserve">si era </w:t>
+      </w:r>
+      <w:r>
+        <w:t>pensato a</w:t>
+      </w:r>
+      <w:r>
+        <w:t>lle API di Google Maps</w:t>
+      </w:r>
+      <w:r>
+        <w:t xml:space="preserve"> ma la procedura di ottenimento della chiave era molto più complessa).</w:t>
+      </w:r>
+    </w:p>
+    <w:p>
+      <w:pPr>
+        <w:spacing w:after="0"/>
+        <w:jc w:val="both"/>
+      </w:pPr>
+    </w:p>
+    <w:p>
+      <w:pPr>
+        <w:spacing w:after="0"/>
+        <w:jc w:val="both"/>
+      </w:pPr>
+    </w:p>
+    <w:p>
+      <w:pPr>
+        <w:spacing w:after="0"/>
+        <w:jc w:val="both"/>
+      </w:pPr>
+      <w:r>
+        <w:t>Queste aggiunte rendono la nostra applicazione più professionale e, in un futuro, realmente utilizzabile</w:t>
+      </w:r>
+      <w:r>
+        <w:t>.</w:t>
+      </w:r>
+    </w:p>
+    <w:p>
+      <w:pPr>
+        <w:spacing w:after="0"/>
+        <w:jc w:val="both"/>
+      </w:pPr>
+      <w:r>
+        <w:t>È infatti facilmente scalabile: si possono aggiungere nuovi nodi e funzionalità mantenendo il design implementato dal team.</w:t>
+      </w:r>
+    </w:p>
+    <w:p>
+      <w:pPr>
+        <w:jc w:val="both"/>
+      </w:pPr>
+    </w:p>
+    <w:p>
+      <w:pPr>
+        <w:jc w:val="both"/>
+      </w:pPr>
+    </w:p>
+    <w:p>
+      <w:pPr>
+        <w:jc w:val="both"/>
+      </w:pPr>
+    </w:p>
+    <w:p>
+      <w:pPr>
+        <w:jc w:val="both"/>
+      </w:pPr>
+    </w:p>
+    <w:p>
+      <w:pPr>
+        <w:jc w:val="both"/>
+      </w:pPr>
+    </w:p>
+    <w:p>
+      <w:pPr>
+        <w:jc w:val="both"/>
+      </w:pPr>
+    </w:p>
+    <w:p>
+      <w:pPr>
+        <w:jc w:val="both"/>
+      </w:pPr>
+    </w:p>
+    <w:p>
+      <w:pPr>
+        <w:jc w:val="both"/>
+      </w:pPr>
+    </w:p>
+    <w:p>
+      <w:pPr>
+        <w:jc w:val="both"/>
+      </w:pPr>
+    </w:p>
+    <w:p>
+      <w:pPr>
+        <w:jc w:val="both"/>
+      </w:pPr>
+    </w:p>
+    <w:p>
+      <w:pPr>
+        <w:jc w:val="both"/>
+      </w:pPr>
+    </w:p>
+    <w:p>
+      <w:pPr>
+        <w:jc w:val="both"/>
+      </w:pPr>
+    </w:p>
+    <w:p>
+      <w:pPr>
+        <w:jc w:val="both"/>
+      </w:pPr>
+    </w:p>
+    <w:p>
+      <w:pPr>
+        <w:jc w:val="both"/>
+      </w:pPr>
+    </w:p>
+    <w:p>
+      <w:pPr>
+        <w:jc w:val="both"/>
+      </w:pPr>
+    </w:p>
+    <w:p>
+      <w:pPr>
+        <w:jc w:val="both"/>
+      </w:pPr>
+    </w:p>
+    <w:p>
+      <w:pPr>
+        <w:jc w:val="both"/>
+      </w:pPr>
+    </w:p>
+    <w:p>
+      <w:pPr>
+        <w:jc w:val="both"/>
+      </w:pPr>
+    </w:p>
+    <w:p>
+      <w:pPr>
+        <w:jc w:val="both"/>
+      </w:pPr>
+    </w:p>
+    <w:p>
+      <w:pPr>
+        <w:jc w:val="both"/>
         <w:rPr>
           <w:b/>
           <w:bCs/>
           <w:sz w:val="28"/>
           <w:szCs w:val="28"/>
         </w:rPr>
+      </w:pPr>
+      <w:r>
+        <w:rPr>
+          <w:b/>
+          <w:bCs/>
+          <w:sz w:val="28"/>
+          <w:szCs w:val="28"/>
+        </w:rPr>
+        <w:lastRenderedPageBreak/>
+        <w:t>ATTIVITÀ DI GESTIONE</w:t>
+      </w:r>
+    </w:p>
+    <w:p>
+      <w:pPr>
+        <w:jc w:val="both"/>
+      </w:pPr>
+      <w:r>
+        <w:t xml:space="preserve">La gestione del progetto avviene attraverso </w:t>
+      </w:r>
+      <w:r>
+        <w:t>incontri in presenza</w:t>
+      </w:r>
+      <w:r>
+        <w:t xml:space="preserve"> soprattutto in ambiente universitario</w:t>
+      </w:r>
+      <w:r>
+        <w:t>, che avvengono in particolare nei giorni adibiti alla fase di backlog e di sprint review.</w:t>
+      </w:r>
+    </w:p>
+    <w:p>
+      <w:pPr>
+        <w:jc w:val="both"/>
+      </w:pPr>
+      <w:r>
+        <w:t>Durante l‘incontro ogni membro aggiorna il gruppo sulle modifiche apportate al codice, eventuali problemi che ha rilevato, accorgimenti e un ipotetica suddivisione dei compiti che devono essere assegnati agli altri membri nel caso siano necessari per lo sviluppo del progetto.</w:t>
+      </w:r>
+    </w:p>
+    <w:p>
+      <w:pPr>
+        <w:jc w:val="both"/>
+      </w:pPr>
+      <w:r>
+        <w:t xml:space="preserve">Naturalmente tutto ciò, oltre ad essere tema di incontro, deve essere dettagliatamente descritto nella documentazione o negli </w:t>
+      </w:r>
+      <w:proofErr w:type="spellStart"/>
+      <w:r>
+        <w:t>issue</w:t>
+      </w:r>
+      <w:proofErr w:type="spellEnd"/>
+      <w:r>
+        <w:t xml:space="preserve"> tramite GitHub.</w:t>
+      </w:r>
+    </w:p>
+    <w:p>
+      <w:pPr>
+        <w:jc w:val="both"/>
+      </w:pPr>
+      <w:r>
+        <w:t xml:space="preserve">In caso di domande o dubbi dopo i vari incontri possono essere chiariti anche tramite gruppo Whatsapp creato per una messaggistica rapida, a cui può seguire una chiamata o una discussione per la ricerca di una possibile risoluzione della problematica. </w:t>
+      </w:r>
+    </w:p>
+    <w:p>
+      <w:pPr>
+        <w:jc w:val="both"/>
+      </w:pPr>
+      <w:r>
+        <w:t xml:space="preserve">La gestione degli errori e la ricerca della soluzione è guidata </w:t>
+      </w:r>
+      <w:r>
+        <w:t>dallo Scrum Master del team – Tommaso Maistrello.</w:t>
+      </w:r>
+    </w:p>
+    <w:p>
+      <w:pPr>
+        <w:jc w:val="both"/>
+      </w:pPr>
+      <w:r>
+        <w:t xml:space="preserve">In caso di mancata soluzione al problema, e la conseguente impossibilità di chiusura della </w:t>
+      </w:r>
+      <w:proofErr w:type="spellStart"/>
+      <w:r>
+        <w:t>issue</w:t>
+      </w:r>
+      <w:proofErr w:type="spellEnd"/>
+      <w:r>
+        <w:t xml:space="preserve"> nel caso sia stata creata, si opterà per un nuovo incontro di gruppo.</w:t>
+      </w:r>
+    </w:p>
+    <w:p>
+      <w:pPr>
+        <w:jc w:val="both"/>
+      </w:pPr>
+    </w:p>
+    <w:p>
+      <w:pPr>
+        <w:jc w:val="both"/>
+      </w:pPr>
+    </w:p>
+    <w:p>
+      <w:pPr>
+        <w:jc w:val="both"/>
+      </w:pPr>
+    </w:p>
+    <w:p>
+      <w:pPr>
+        <w:jc w:val="both"/>
+      </w:pPr>
+    </w:p>
+    <w:p>
+      <w:pPr>
+        <w:jc w:val="both"/>
+      </w:pPr>
+    </w:p>
+    <w:p>
+      <w:pPr>
+        <w:jc w:val="both"/>
+      </w:pPr>
+    </w:p>
+    <w:p>
+      <w:pPr>
+        <w:jc w:val="both"/>
+      </w:pPr>
+    </w:p>
+    <w:p>
+      <w:pPr>
+        <w:jc w:val="both"/>
+      </w:pPr>
+    </w:p>
+    <w:p>
+      <w:pPr>
+        <w:jc w:val="both"/>
+      </w:pPr>
+    </w:p>
+    <w:p>
+      <w:pPr>
+        <w:jc w:val="both"/>
+      </w:pPr>
+    </w:p>
+    <w:p>
+      <w:pPr>
+        <w:jc w:val="both"/>
+      </w:pPr>
+    </w:p>
+    <w:p>
+      <w:pPr>
+        <w:jc w:val="both"/>
+      </w:pPr>
+    </w:p>
+    <w:p>
+      <w:pPr>
+        <w:jc w:val="both"/>
+      </w:pPr>
+    </w:p>
+    <w:p>
+      <w:pPr>
+        <w:jc w:val="both"/>
+      </w:pPr>
+    </w:p>
+    <w:p>
+      <w:pPr>
+        <w:jc w:val="both"/>
+      </w:pPr>
+    </w:p>
+    <w:p>
+      <w:pPr>
+        <w:jc w:val="both"/>
+      </w:pPr>
+    </w:p>
+    <w:p>
+      <w:pPr>
+        <w:jc w:val="both"/>
+      </w:pPr>
+    </w:p>
+    <w:p>
+      <w:pPr>
+        <w:jc w:val="both"/>
+      </w:pPr>
+    </w:p>
+    <w:p>
+      <w:pPr>
+        <w:jc w:val="both"/>
+      </w:pPr>
+    </w:p>
+    <w:p>
+      <w:pPr>
+        <w:jc w:val="both"/>
+        <w:rPr>
+          <w:b/>
+          <w:bCs/>
+          <w:sz w:val="28"/>
+          <w:szCs w:val="28"/>
+        </w:rPr>
+      </w:pPr>
+      <w:r>
+        <w:rPr>
+          <w:b/>
+          <w:bCs/>
+          <w:sz w:val="28"/>
+          <w:szCs w:val="28"/>
+        </w:rPr>
         <w:lastRenderedPageBreak/>
         <w:t>POTENZIALI RISCHI</w:t>
       </w:r>
@@ -1771,47 +1975,143 @@
         <w:jc w:val="both"/>
       </w:pPr>
       <w:r>
-        <w:t xml:space="preserve">Utilizzando </w:t>
+        <w:t>Utilizzando firebase database (nessun membro del gruppo lo aveva mai utilizzato in precedenza) potrebbero sorgere problematiche di gestione dei dati, creazione database</w:t>
+      </w:r>
+      <w:r>
+        <w:t xml:space="preserve"> e interrogazioni.</w:t>
+      </w:r>
+      <w:r>
+        <w:t xml:space="preserve"> </w:t>
+      </w:r>
+    </w:p>
+    <w:p>
+      <w:pPr>
+        <w:spacing w:after="0"/>
+        <w:jc w:val="both"/>
+      </w:pPr>
+      <w:r>
+        <w:t>Importante è anche capire come gestire la chiave privata del service account e tutti i rischi di sicurezza ad essa legata.</w:t>
+      </w:r>
+    </w:p>
+    <w:p>
+      <w:pPr>
+        <w:spacing w:after="0"/>
+        <w:jc w:val="both"/>
+      </w:pPr>
+      <w:r>
+        <w:t>Questi fanno parte dei rischi denominat</w:t>
+      </w:r>
+      <w:r>
+        <w:t>i</w:t>
+      </w:r>
+      <w:r>
+        <w:t xml:space="preserve"> </w:t>
+      </w:r>
+      <w:r>
+        <w:rPr>
+          <w:u w:val="single"/>
+        </w:rPr>
+        <w:t>rischi di sicurezza</w:t>
+      </w:r>
+      <w:r>
+        <w:t>.</w:t>
+      </w:r>
+    </w:p>
+    <w:p>
+      <w:pPr>
+        <w:spacing w:after="0"/>
+        <w:jc w:val="both"/>
+      </w:pPr>
+      <w:r>
+        <w:t>Infatti è altamente sconsigliato inserire la chiave direttamente sulla repository online GitHub (se privata è possibile, ma non una buona norma).</w:t>
+      </w:r>
+    </w:p>
+    <w:p>
+      <w:pPr>
+        <w:spacing w:after="0"/>
+        <w:jc w:val="both"/>
+      </w:pPr>
+      <w:r>
+        <w:t xml:space="preserve">Utilizzando inoltre </w:t>
       </w:r>
       <w:proofErr w:type="spellStart"/>
       <w:r>
-        <w:t>firebase</w:t>
+        <w:t>noSQL</w:t>
       </w:r>
       <w:proofErr w:type="spellEnd"/>
       <w:r>
-        <w:t xml:space="preserve"> database (nessun membro del gruppo lo aveva mai utilizzato in precedenza) potrebbero sorgere problematiche di gestione dei dati, creazione database, interrogazioni </w:t>
+        <w:t xml:space="preserve"> i problemi potrebbero essere maggiori e più complicati da risolvere nel tempo.</w:t>
+      </w:r>
+    </w:p>
+    <w:p>
+      <w:pPr>
+        <w:spacing w:after="0"/>
+        <w:jc w:val="both"/>
+      </w:pPr>
+      <w:r>
+        <w:t>E’ ancora più necessario in questa parte il contributo di tutto il gruppo.</w:t>
+      </w:r>
+    </w:p>
+    <w:p>
+      <w:pPr>
+        <w:spacing w:after="0"/>
+        <w:jc w:val="both"/>
+      </w:pPr>
+      <w:r>
+        <w:t xml:space="preserve">Nello stesso modo vale per </w:t>
       </w:r>
       <w:proofErr w:type="spellStart"/>
       <w:r>
-        <w:t>ecc</w:t>
+        <w:t>Vaadin</w:t>
       </w:r>
       <w:proofErr w:type="spellEnd"/>
       <w:r>
-        <w:t xml:space="preserve"> ecc. </w:t>
-      </w:r>
-    </w:p>
-    <w:p>
-      <w:pPr>
-        <w:spacing w:after="0"/>
-        <w:jc w:val="both"/>
-      </w:pPr>
-      <w:r>
-        <w:t>Importante è anche capire come gestire la chiave privata del service account e tutti i rischi di sicurezza ad essa legata.</w:t>
-      </w:r>
-    </w:p>
-    <w:p>
-      <w:pPr>
-        <w:spacing w:after="0"/>
-        <w:jc w:val="both"/>
-      </w:pPr>
-      <w:r>
-        <w:t xml:space="preserve">Questi fanno parte dei rischi denominato </w:t>
+        <w:t>.</w:t>
+      </w:r>
+    </w:p>
+    <w:p>
+      <w:pPr>
+        <w:spacing w:after="0"/>
+        <w:jc w:val="both"/>
+      </w:pPr>
+      <w:r>
+        <w:t>È necessaria una fase inziale di comprensione su come utilizzarlo, cosa permette di fare e se è effettivamente utile e necessario al nostro progetto.</w:t>
+      </w:r>
+    </w:p>
+    <w:p>
+      <w:pPr>
+        <w:spacing w:after="0"/>
+        <w:jc w:val="both"/>
+      </w:pPr>
+      <w:r>
+        <w:t>In generale, per avere maggiore realismo e serietà dell’app ci sono innumerevoli rischi e problemi a cui andremo incontro, vista l’assente conoscenza nell’ambito di tutti i membri del gruppo.</w:t>
+      </w:r>
+    </w:p>
+    <w:p>
+      <w:pPr>
+        <w:spacing w:after="0"/>
+        <w:jc w:val="both"/>
+      </w:pPr>
+      <w:r>
+        <w:t>Sono sempre poi possibili complessi bug che fanno parte di ogni progetto ed è necessario risolverli prima della consegna dell’elaborato.</w:t>
+      </w:r>
+    </w:p>
+    <w:p>
+      <w:pPr>
+        <w:spacing w:after="0"/>
+        <w:jc w:val="both"/>
+      </w:pPr>
+      <w:r>
+        <w:t>Riferendosi invece alla funzionalità dell’app i problemi riguardano principalmente la concorrenza e il fatto che più utenti possono accedere al database in maniera simultanea.</w:t>
+      </w:r>
+      <w:r>
+        <w:t xml:space="preserve"> Possono essere quindi diversi i </w:t>
       </w:r>
       <w:r>
         <w:rPr>
           <w:u w:val="single"/>
         </w:rPr>
-        <w:t>rischi di sicurezza</w:t>
+        <w:t>rischi legati alle funzionalità dell’app</w:t>
       </w:r>
       <w:r>
         <w:t>.</w:t>
@@ -1823,106 +2123,6 @@
         <w:jc w:val="both"/>
       </w:pPr>
       <w:r>
-        <w:t>Infatti è altamente sconsigliato inserire la chiave direttamente sulla repository online GitHub (se privata è possibile, ma non una buona norma).</w:t>
-      </w:r>
-    </w:p>
-    <w:p>
-      <w:pPr>
-        <w:spacing w:after="0"/>
-        <w:jc w:val="both"/>
-      </w:pPr>
-      <w:r>
-        <w:t xml:space="preserve">Utilizzando inoltre </w:t>
-      </w:r>
-      <w:proofErr w:type="spellStart"/>
-      <w:r>
-        <w:t>noSQL</w:t>
-      </w:r>
-      <w:proofErr w:type="spellEnd"/>
-      <w:r>
-        <w:t xml:space="preserve"> i problemi potrebbero essere maggiori e più complicati da risolvere nel tempo.</w:t>
-      </w:r>
-    </w:p>
-    <w:p>
-      <w:pPr>
-        <w:spacing w:after="0"/>
-        <w:jc w:val="both"/>
-      </w:pPr>
-      <w:r>
-        <w:t>E’ ancora più necessario in questa parte il contributo di tutto il gruppo.</w:t>
-      </w:r>
-    </w:p>
-    <w:p>
-      <w:pPr>
-        <w:spacing w:after="0"/>
-        <w:jc w:val="both"/>
-      </w:pPr>
-      <w:r>
-        <w:t xml:space="preserve">Nello stesso modo vale per </w:t>
-      </w:r>
-      <w:proofErr w:type="spellStart"/>
-      <w:r>
-        <w:t>Vaadin</w:t>
-      </w:r>
-      <w:proofErr w:type="spellEnd"/>
-      <w:r>
-        <w:t>.</w:t>
-      </w:r>
-    </w:p>
-    <w:p>
-      <w:pPr>
-        <w:spacing w:after="0"/>
-        <w:jc w:val="both"/>
-      </w:pPr>
-      <w:r>
-        <w:t>È necessaria una fase inziale di comprensione su come utilizzarlo, cosa permette di fare e se è effettivamente utile e necessario al nostro progetto.</w:t>
-      </w:r>
-    </w:p>
-    <w:p>
-      <w:pPr>
-        <w:spacing w:after="0"/>
-        <w:jc w:val="both"/>
-      </w:pPr>
-      <w:r>
-        <w:t>In generale, per avere maggiore realismo e serietà dell’app ci sono innumerevoli rischi e problemi a cui andremo incontro, vista l’assente conoscenza nell’ambito di tutti i membri del gruppo.</w:t>
-      </w:r>
-    </w:p>
-    <w:p>
-      <w:pPr>
-        <w:spacing w:after="0"/>
-        <w:jc w:val="both"/>
-      </w:pPr>
-      <w:r>
-        <w:t>Sono sempre poi possibili complessi bug che fanno parte di ogni progetto ed è necessario risolverli prima della consegna dell’elaborato.</w:t>
-      </w:r>
-    </w:p>
-    <w:p>
-      <w:pPr>
-        <w:spacing w:after="0"/>
-        <w:jc w:val="both"/>
-      </w:pPr>
-      <w:r>
-        <w:t>Riferendosi invece alla funzionalità dell’app i problemi riguardano principalmente la concorrenza e il fatto che più utenti possono accedere al database in maniera simultanea.</w:t>
-      </w:r>
-      <w:r>
-        <w:t xml:space="preserve"> Possono essere quindi diversi i </w:t>
-      </w:r>
-      <w:r>
-        <w:rPr>
-          <w:u w:val="single"/>
-        </w:rPr>
-        <w:t>rischi legati alle funzionalità dell’app</w:t>
-      </w:r>
-      <w:r>
-        <w:t>.</w:t>
-      </w:r>
-    </w:p>
-    <w:p>
-      <w:pPr>
-        <w:spacing w:after="0"/>
-        <w:jc w:val="both"/>
-      </w:pPr>
-      <w:r>
         <w:t>Occorre implementare meccanismi di controllo che garantiscano che due utenti non possano prenotare due colonnine nella stessa fascia oraria.</w:t>
       </w:r>
     </w:p>
@@ -1941,29 +2141,873 @@
         <w:jc w:val="both"/>
       </w:pPr>
       <w:r>
-        <w:t xml:space="preserve">Sono sempre poi presenti potenziali rischi riguardo </w:t>
-      </w:r>
-      <w:r>
-        <w:t>numerosi</w:t>
-      </w:r>
-      <w:r>
-        <w:t xml:space="preserve"> aspetti dell’applicazione ma questi li andremo a gestire passo dopo passo, risolvendo o prendendo altre strade per evitarli.</w:t>
-      </w:r>
-    </w:p>
-    <w:p>
-      <w:pPr>
-        <w:spacing w:after="0"/>
-        <w:jc w:val="both"/>
-      </w:pPr>
-    </w:p>
-    <w:p>
-      <w:pPr>
-        <w:spacing w:after="0"/>
-        <w:jc w:val="both"/>
-      </w:pPr>
-      <w:r>
-        <w:t>Potremmo dividere meglio tra le tipologie di rischio</w:t>
-      </w:r>
+        <w:t>I potenziali rischi che verranno rilevati con l’avanzamento dell’applicazione saranno gestiti in maniera singola, analizzando il problema e trovando la soluzione più adatta.</w:t>
+      </w:r>
+    </w:p>
+    <w:p>
+      <w:pPr>
+        <w:spacing w:after="0"/>
+        <w:jc w:val="both"/>
+      </w:pPr>
+    </w:p>
+    <w:p>
+      <w:pPr>
+        <w:spacing w:after="0"/>
+        <w:jc w:val="both"/>
+      </w:pPr>
+    </w:p>
+    <w:p>
+      <w:pPr>
+        <w:spacing w:after="0"/>
+        <w:jc w:val="both"/>
+      </w:pPr>
+      <w:r>
+        <w:t>Qui una tabella riassuntiva:</w:t>
+      </w:r>
+    </w:p>
+    <w:p>
+      <w:pPr>
+        <w:spacing w:after="0"/>
+        <w:jc w:val="both"/>
+      </w:pPr>
+    </w:p>
+    <w:tbl>
+      <w:tblPr>
+        <w:tblW w:w="0" w:type="auto"/>
+        <w:tblCellSpacing w:w="15" w:type="dxa"/>
+        <w:tblCellMar>
+          <w:left w:w="0" w:type="dxa"/>
+          <w:right w:w="0" w:type="dxa"/>
+        </w:tblCellMar>
+        <w:tblLook w:val="04A0" w:firstRow="1" w:lastRow="0" w:firstColumn="1" w:lastColumn="0" w:noHBand="0" w:noVBand="1"/>
+      </w:tblPr>
+      <w:tblGrid>
+        <w:gridCol w:w="1977"/>
+        <w:gridCol w:w="2278"/>
+        <w:gridCol w:w="5367"/>
+      </w:tblGrid>
+      <w:tr>
+        <w:trPr>
+          <w:tblHeader/>
+          <w:tblCellSpacing w:w="15" w:type="dxa"/>
+        </w:trPr>
+        <w:tc>
+          <w:tcPr>
+            <w:tcW w:w="1932" w:type="dxa"/>
+            <w:tcBorders>
+              <w:top w:val="single" w:sz="6" w:space="0" w:color="auto"/>
+              <w:left w:val="single" w:sz="6" w:space="0" w:color="auto"/>
+              <w:bottom w:val="single" w:sz="6" w:space="0" w:color="auto"/>
+              <w:right w:val="single" w:sz="6" w:space="0" w:color="auto"/>
+            </w:tcBorders>
+            <w:tcMar>
+              <w:top w:w="120" w:type="dxa"/>
+              <w:left w:w="180" w:type="dxa"/>
+              <w:bottom w:w="120" w:type="dxa"/>
+              <w:right w:w="180" w:type="dxa"/>
+            </w:tcMar>
+            <w:vAlign w:val="center"/>
+            <w:hideMark/>
+          </w:tcPr>
+          <w:p>
+            <w:pPr>
+              <w:spacing w:after="0"/>
+              <w:jc w:val="both"/>
+            </w:pPr>
+            <w:r>
+              <w:rPr>
+                <w:b/>
+                <w:bCs/>
+              </w:rPr>
+              <w:t>Tipologia Rischio</w:t>
+            </w:r>
+          </w:p>
+        </w:tc>
+        <w:tc>
+          <w:tcPr>
+            <w:tcW w:w="2248" w:type="dxa"/>
+            <w:tcBorders>
+              <w:top w:val="single" w:sz="6" w:space="0" w:color="auto"/>
+              <w:left w:val="single" w:sz="6" w:space="0" w:color="auto"/>
+              <w:bottom w:val="single" w:sz="6" w:space="0" w:color="auto"/>
+              <w:right w:val="single" w:sz="6" w:space="0" w:color="auto"/>
+            </w:tcBorders>
+            <w:tcMar>
+              <w:top w:w="120" w:type="dxa"/>
+              <w:left w:w="180" w:type="dxa"/>
+              <w:bottom w:w="120" w:type="dxa"/>
+              <w:right w:w="180" w:type="dxa"/>
+            </w:tcMar>
+            <w:vAlign w:val="center"/>
+            <w:hideMark/>
+          </w:tcPr>
+          <w:p>
+            <w:pPr>
+              <w:spacing w:after="0"/>
+              <w:jc w:val="both"/>
+            </w:pPr>
+            <w:r>
+              <w:rPr>
+                <w:b/>
+                <w:bCs/>
+              </w:rPr>
+              <w:t>Descrizione</w:t>
+            </w:r>
+          </w:p>
+        </w:tc>
+        <w:tc>
+          <w:tcPr>
+            <w:tcW w:w="0" w:type="auto"/>
+            <w:tcBorders>
+              <w:top w:val="single" w:sz="6" w:space="0" w:color="auto"/>
+              <w:left w:val="single" w:sz="6" w:space="0" w:color="auto"/>
+              <w:bottom w:val="single" w:sz="6" w:space="0" w:color="auto"/>
+              <w:right w:val="single" w:sz="6" w:space="0" w:color="auto"/>
+            </w:tcBorders>
+            <w:tcMar>
+              <w:top w:w="120" w:type="dxa"/>
+              <w:left w:w="180" w:type="dxa"/>
+              <w:bottom w:w="120" w:type="dxa"/>
+              <w:right w:w="180" w:type="dxa"/>
+            </w:tcMar>
+            <w:vAlign w:val="center"/>
+            <w:hideMark/>
+          </w:tcPr>
+          <w:p>
+            <w:pPr>
+              <w:spacing w:after="0"/>
+              <w:jc w:val="both"/>
+            </w:pPr>
+            <w:r>
+              <w:rPr>
+                <w:b/>
+                <w:bCs/>
+              </w:rPr>
+              <w:t>Soluzione</w:t>
+            </w:r>
+          </w:p>
+        </w:tc>
+      </w:tr>
+      <w:tr>
+        <w:trPr>
+          <w:tblCellSpacing w:w="15" w:type="dxa"/>
+        </w:trPr>
+        <w:tc>
+          <w:tcPr>
+            <w:tcW w:w="1932" w:type="dxa"/>
+            <w:tcBorders>
+              <w:top w:val="single" w:sz="6" w:space="0" w:color="auto"/>
+              <w:left w:val="single" w:sz="6" w:space="0" w:color="auto"/>
+              <w:bottom w:val="single" w:sz="6" w:space="0" w:color="auto"/>
+              <w:right w:val="single" w:sz="6" w:space="0" w:color="auto"/>
+            </w:tcBorders>
+            <w:tcMar>
+              <w:top w:w="120" w:type="dxa"/>
+              <w:left w:w="180" w:type="dxa"/>
+              <w:bottom w:w="120" w:type="dxa"/>
+              <w:right w:w="180" w:type="dxa"/>
+            </w:tcMar>
+            <w:vAlign w:val="center"/>
+            <w:hideMark/>
+          </w:tcPr>
+          <w:p>
+            <w:pPr>
+              <w:spacing w:after="0"/>
+              <w:jc w:val="both"/>
+            </w:pPr>
+            <w:r>
+              <w:rPr>
+                <w:b/>
+                <w:bCs/>
+              </w:rPr>
+              <w:t>Gestionale</w:t>
+            </w:r>
+          </w:p>
+        </w:tc>
+        <w:tc>
+          <w:tcPr>
+            <w:tcW w:w="2248" w:type="dxa"/>
+            <w:tcBorders>
+              <w:top w:val="single" w:sz="6" w:space="0" w:color="auto"/>
+              <w:left w:val="single" w:sz="6" w:space="0" w:color="auto"/>
+              <w:bottom w:val="single" w:sz="6" w:space="0" w:color="auto"/>
+              <w:right w:val="single" w:sz="6" w:space="0" w:color="auto"/>
+            </w:tcBorders>
+            <w:tcMar>
+              <w:top w:w="120" w:type="dxa"/>
+              <w:left w:w="180" w:type="dxa"/>
+              <w:bottom w:w="120" w:type="dxa"/>
+              <w:right w:w="180" w:type="dxa"/>
+            </w:tcMar>
+            <w:vAlign w:val="center"/>
+            <w:hideMark/>
+          </w:tcPr>
+          <w:p>
+            <w:pPr>
+              <w:spacing w:after="0"/>
+              <w:jc w:val="both"/>
+            </w:pPr>
+            <w:r>
+              <w:t>Calo produttività e ritardi causa esami.</w:t>
+            </w:r>
+          </w:p>
+        </w:tc>
+        <w:tc>
+          <w:tcPr>
+            <w:tcW w:w="0" w:type="auto"/>
+            <w:tcBorders>
+              <w:top w:val="single" w:sz="6" w:space="0" w:color="auto"/>
+              <w:left w:val="single" w:sz="6" w:space="0" w:color="auto"/>
+              <w:bottom w:val="single" w:sz="6" w:space="0" w:color="auto"/>
+              <w:right w:val="single" w:sz="6" w:space="0" w:color="auto"/>
+            </w:tcBorders>
+            <w:tcMar>
+              <w:top w:w="120" w:type="dxa"/>
+              <w:left w:w="180" w:type="dxa"/>
+              <w:bottom w:w="120" w:type="dxa"/>
+              <w:right w:w="180" w:type="dxa"/>
+            </w:tcMar>
+            <w:vAlign w:val="center"/>
+            <w:hideMark/>
+          </w:tcPr>
+          <w:p>
+            <w:pPr>
+              <w:spacing w:after="0"/>
+              <w:jc w:val="both"/>
+            </w:pPr>
+            <w:r>
+              <w:t>Pianificare durante la sessione di esame degli sprint più brevi e leggeri, senza implementare funzionalità troppo complesse</w:t>
+            </w:r>
+          </w:p>
+        </w:tc>
+      </w:tr>
+      <w:tr>
+        <w:trPr>
+          <w:tblCellSpacing w:w="15" w:type="dxa"/>
+        </w:trPr>
+        <w:tc>
+          <w:tcPr>
+            <w:tcW w:w="1932" w:type="dxa"/>
+            <w:tcBorders>
+              <w:top w:val="single" w:sz="6" w:space="0" w:color="auto"/>
+              <w:left w:val="single" w:sz="6" w:space="0" w:color="auto"/>
+              <w:bottom w:val="single" w:sz="6" w:space="0" w:color="auto"/>
+              <w:right w:val="single" w:sz="6" w:space="0" w:color="auto"/>
+            </w:tcBorders>
+            <w:tcMar>
+              <w:top w:w="120" w:type="dxa"/>
+              <w:left w:w="180" w:type="dxa"/>
+              <w:bottom w:w="120" w:type="dxa"/>
+              <w:right w:w="180" w:type="dxa"/>
+            </w:tcMar>
+            <w:vAlign w:val="center"/>
+            <w:hideMark/>
+          </w:tcPr>
+          <w:p>
+            <w:pPr>
+              <w:spacing w:after="0"/>
+              <w:jc w:val="both"/>
+            </w:pPr>
+            <w:r>
+              <w:rPr>
+                <w:b/>
+                <w:bCs/>
+              </w:rPr>
+              <w:t>Tecnico</w:t>
+            </w:r>
+          </w:p>
+        </w:tc>
+        <w:tc>
+          <w:tcPr>
+            <w:tcW w:w="2248" w:type="dxa"/>
+            <w:tcBorders>
+              <w:top w:val="single" w:sz="6" w:space="0" w:color="auto"/>
+              <w:left w:val="single" w:sz="6" w:space="0" w:color="auto"/>
+              <w:bottom w:val="single" w:sz="6" w:space="0" w:color="auto"/>
+              <w:right w:val="single" w:sz="6" w:space="0" w:color="auto"/>
+            </w:tcBorders>
+            <w:tcMar>
+              <w:top w:w="120" w:type="dxa"/>
+              <w:left w:w="180" w:type="dxa"/>
+              <w:bottom w:w="120" w:type="dxa"/>
+              <w:right w:w="180" w:type="dxa"/>
+            </w:tcMar>
+            <w:vAlign w:val="center"/>
+            <w:hideMark/>
+          </w:tcPr>
+          <w:p>
+            <w:pPr>
+              <w:spacing w:after="0"/>
+              <w:jc w:val="both"/>
+            </w:pPr>
+            <w:r>
+              <w:t>Inesperienza</w:t>
+            </w:r>
+            <w:r>
+              <w:t xml:space="preserve"> </w:t>
+            </w:r>
+            <w:r>
+              <w:t xml:space="preserve">Firebase e </w:t>
+            </w:r>
+            <w:proofErr w:type="spellStart"/>
+            <w:r>
+              <w:t>NoSql</w:t>
+            </w:r>
+            <w:proofErr w:type="spellEnd"/>
+          </w:p>
+        </w:tc>
+        <w:tc>
+          <w:tcPr>
+            <w:tcW w:w="0" w:type="auto"/>
+            <w:tcBorders>
+              <w:top w:val="single" w:sz="6" w:space="0" w:color="auto"/>
+              <w:left w:val="single" w:sz="6" w:space="0" w:color="auto"/>
+              <w:bottom w:val="single" w:sz="6" w:space="0" w:color="auto"/>
+              <w:right w:val="single" w:sz="6" w:space="0" w:color="auto"/>
+            </w:tcBorders>
+            <w:tcMar>
+              <w:top w:w="120" w:type="dxa"/>
+              <w:left w:w="180" w:type="dxa"/>
+              <w:bottom w:w="120" w:type="dxa"/>
+              <w:right w:w="180" w:type="dxa"/>
+            </w:tcMar>
+            <w:vAlign w:val="center"/>
+            <w:hideMark/>
+          </w:tcPr>
+          <w:p>
+            <w:pPr>
+              <w:spacing w:after="0"/>
+              <w:jc w:val="both"/>
+            </w:pPr>
+            <w:r>
+              <w:t>Cercare informazioni online prima di iniziare con l’implementazione vera e propria</w:t>
+            </w:r>
+          </w:p>
+        </w:tc>
+      </w:tr>
+      <w:tr>
+        <w:trPr>
+          <w:tblCellSpacing w:w="15" w:type="dxa"/>
+        </w:trPr>
+        <w:tc>
+          <w:tcPr>
+            <w:tcW w:w="1932" w:type="dxa"/>
+            <w:tcBorders>
+              <w:top w:val="single" w:sz="6" w:space="0" w:color="auto"/>
+              <w:left w:val="single" w:sz="6" w:space="0" w:color="auto"/>
+              <w:bottom w:val="single" w:sz="6" w:space="0" w:color="auto"/>
+              <w:right w:val="single" w:sz="6" w:space="0" w:color="auto"/>
+            </w:tcBorders>
+            <w:tcMar>
+              <w:top w:w="120" w:type="dxa"/>
+              <w:left w:w="180" w:type="dxa"/>
+              <w:bottom w:w="120" w:type="dxa"/>
+              <w:right w:w="180" w:type="dxa"/>
+            </w:tcMar>
+            <w:vAlign w:val="center"/>
+            <w:hideMark/>
+          </w:tcPr>
+          <w:p>
+            <w:pPr>
+              <w:spacing w:after="0"/>
+              <w:jc w:val="both"/>
+            </w:pPr>
+            <w:r>
+              <w:rPr>
+                <w:b/>
+                <w:bCs/>
+              </w:rPr>
+              <w:t>Tecnico</w:t>
+            </w:r>
+          </w:p>
+        </w:tc>
+        <w:tc>
+          <w:tcPr>
+            <w:tcW w:w="2248" w:type="dxa"/>
+            <w:tcBorders>
+              <w:top w:val="single" w:sz="6" w:space="0" w:color="auto"/>
+              <w:left w:val="single" w:sz="6" w:space="0" w:color="auto"/>
+              <w:bottom w:val="single" w:sz="6" w:space="0" w:color="auto"/>
+              <w:right w:val="single" w:sz="6" w:space="0" w:color="auto"/>
+            </w:tcBorders>
+            <w:tcMar>
+              <w:top w:w="120" w:type="dxa"/>
+              <w:left w:w="180" w:type="dxa"/>
+              <w:bottom w:w="120" w:type="dxa"/>
+              <w:right w:w="180" w:type="dxa"/>
+            </w:tcMar>
+            <w:vAlign w:val="center"/>
+            <w:hideMark/>
+          </w:tcPr>
+          <w:p>
+            <w:pPr>
+              <w:spacing w:after="0"/>
+              <w:jc w:val="both"/>
+            </w:pPr>
+            <w:r>
+              <w:t xml:space="preserve">Inesperienza </w:t>
+            </w:r>
+            <w:proofErr w:type="spellStart"/>
+            <w:r>
+              <w:t>Vaadin</w:t>
+            </w:r>
+            <w:proofErr w:type="spellEnd"/>
+            <w:r>
+              <w:t xml:space="preserve"> e </w:t>
+            </w:r>
+            <w:proofErr w:type="spellStart"/>
+            <w:r>
+              <w:t>Leaflet</w:t>
+            </w:r>
+            <w:proofErr w:type="spellEnd"/>
+          </w:p>
+        </w:tc>
+        <w:tc>
+          <w:tcPr>
+            <w:tcW w:w="0" w:type="auto"/>
+            <w:tcBorders>
+              <w:top w:val="single" w:sz="6" w:space="0" w:color="auto"/>
+              <w:left w:val="single" w:sz="6" w:space="0" w:color="auto"/>
+              <w:bottom w:val="single" w:sz="6" w:space="0" w:color="auto"/>
+              <w:right w:val="single" w:sz="6" w:space="0" w:color="auto"/>
+            </w:tcBorders>
+            <w:tcMar>
+              <w:top w:w="120" w:type="dxa"/>
+              <w:left w:w="180" w:type="dxa"/>
+              <w:bottom w:w="120" w:type="dxa"/>
+              <w:right w:w="180" w:type="dxa"/>
+            </w:tcMar>
+            <w:vAlign w:val="center"/>
+            <w:hideMark/>
+          </w:tcPr>
+          <w:p>
+            <w:pPr>
+              <w:spacing w:after="0"/>
+              <w:jc w:val="both"/>
+            </w:pPr>
+            <w:r>
+              <w:t>Ricerche online e collaborazione tra membri per velocizzare il processo</w:t>
+            </w:r>
+          </w:p>
+        </w:tc>
+      </w:tr>
+      <w:tr>
+        <w:trPr>
+          <w:tblCellSpacing w:w="15" w:type="dxa"/>
+        </w:trPr>
+        <w:tc>
+          <w:tcPr>
+            <w:tcW w:w="1932" w:type="dxa"/>
+            <w:tcBorders>
+              <w:top w:val="single" w:sz="6" w:space="0" w:color="auto"/>
+              <w:left w:val="single" w:sz="6" w:space="0" w:color="auto"/>
+              <w:bottom w:val="single" w:sz="6" w:space="0" w:color="auto"/>
+              <w:right w:val="single" w:sz="6" w:space="0" w:color="auto"/>
+            </w:tcBorders>
+            <w:tcMar>
+              <w:top w:w="120" w:type="dxa"/>
+              <w:left w:w="180" w:type="dxa"/>
+              <w:bottom w:w="120" w:type="dxa"/>
+              <w:right w:w="180" w:type="dxa"/>
+            </w:tcMar>
+            <w:vAlign w:val="center"/>
+            <w:hideMark/>
+          </w:tcPr>
+          <w:p>
+            <w:pPr>
+              <w:spacing w:after="0"/>
+              <w:jc w:val="both"/>
+            </w:pPr>
+            <w:r>
+              <w:rPr>
+                <w:b/>
+                <w:bCs/>
+              </w:rPr>
+              <w:lastRenderedPageBreak/>
+              <w:t>Sicurezza</w:t>
+            </w:r>
+          </w:p>
+        </w:tc>
+        <w:tc>
+          <w:tcPr>
+            <w:tcW w:w="2248" w:type="dxa"/>
+            <w:tcBorders>
+              <w:top w:val="single" w:sz="6" w:space="0" w:color="auto"/>
+              <w:left w:val="single" w:sz="6" w:space="0" w:color="auto"/>
+              <w:bottom w:val="single" w:sz="6" w:space="0" w:color="auto"/>
+              <w:right w:val="single" w:sz="6" w:space="0" w:color="auto"/>
+            </w:tcBorders>
+            <w:tcMar>
+              <w:top w:w="120" w:type="dxa"/>
+              <w:left w:w="180" w:type="dxa"/>
+              <w:bottom w:w="120" w:type="dxa"/>
+              <w:right w:w="180" w:type="dxa"/>
+            </w:tcMar>
+            <w:vAlign w:val="center"/>
+            <w:hideMark/>
+          </w:tcPr>
+          <w:p>
+            <w:pPr>
+              <w:spacing w:after="0"/>
+              <w:jc w:val="both"/>
+            </w:pPr>
+            <w:r>
+              <w:t>Esposizione della chiave privata del Service Account</w:t>
+            </w:r>
+          </w:p>
+        </w:tc>
+        <w:tc>
+          <w:tcPr>
+            <w:tcW w:w="0" w:type="auto"/>
+            <w:tcBorders>
+              <w:top w:val="single" w:sz="6" w:space="0" w:color="auto"/>
+              <w:left w:val="single" w:sz="6" w:space="0" w:color="auto"/>
+              <w:bottom w:val="single" w:sz="6" w:space="0" w:color="auto"/>
+              <w:right w:val="single" w:sz="6" w:space="0" w:color="auto"/>
+            </w:tcBorders>
+            <w:tcMar>
+              <w:top w:w="120" w:type="dxa"/>
+              <w:left w:w="180" w:type="dxa"/>
+              <w:bottom w:w="120" w:type="dxa"/>
+              <w:right w:w="180" w:type="dxa"/>
+            </w:tcMar>
+            <w:vAlign w:val="center"/>
+            <w:hideMark/>
+          </w:tcPr>
+          <w:p>
+            <w:pPr>
+              <w:spacing w:after="0"/>
+              <w:jc w:val="both"/>
+            </w:pPr>
+            <w:r>
+              <w:t xml:space="preserve">Mettere la repository privata e ridurre al minimo i ruoli del </w:t>
+            </w:r>
+            <w:proofErr w:type="spellStart"/>
+            <w:r>
+              <w:t>serviceAccount</w:t>
+            </w:r>
+            <w:proofErr w:type="spellEnd"/>
+            <w:r>
+              <w:t xml:space="preserve"> (solo lettura e scrittura, senza accesso ad altre funzionalità)</w:t>
+            </w:r>
+            <w:r>
+              <w:t>.</w:t>
+            </w:r>
+          </w:p>
+          <w:p>
+            <w:pPr>
+              <w:spacing w:after="0"/>
+              <w:jc w:val="both"/>
+            </w:pPr>
+            <w:r>
+              <w:t>Per maggiore sicurezza mettere la chiave nel .</w:t>
+            </w:r>
+            <w:proofErr w:type="spellStart"/>
+            <w:r>
+              <w:t>gitignore</w:t>
+            </w:r>
+            <w:proofErr w:type="spellEnd"/>
+            <w:r>
+              <w:t xml:space="preserve"> o utilizzare variabili d’ambiente.</w:t>
+            </w:r>
+          </w:p>
+        </w:tc>
+      </w:tr>
+      <w:tr>
+        <w:trPr>
+          <w:tblCellSpacing w:w="15" w:type="dxa"/>
+        </w:trPr>
+        <w:tc>
+          <w:tcPr>
+            <w:tcW w:w="1932" w:type="dxa"/>
+            <w:tcBorders>
+              <w:top w:val="single" w:sz="6" w:space="0" w:color="auto"/>
+              <w:left w:val="single" w:sz="6" w:space="0" w:color="auto"/>
+              <w:bottom w:val="single" w:sz="6" w:space="0" w:color="auto"/>
+              <w:right w:val="single" w:sz="6" w:space="0" w:color="auto"/>
+            </w:tcBorders>
+            <w:tcMar>
+              <w:top w:w="120" w:type="dxa"/>
+              <w:left w:w="180" w:type="dxa"/>
+              <w:bottom w:w="120" w:type="dxa"/>
+              <w:right w:w="180" w:type="dxa"/>
+            </w:tcMar>
+            <w:vAlign w:val="center"/>
+            <w:hideMark/>
+          </w:tcPr>
+          <w:p>
+            <w:pPr>
+              <w:spacing w:after="0"/>
+              <w:jc w:val="both"/>
+            </w:pPr>
+            <w:r>
+              <w:rPr>
+                <w:b/>
+                <w:bCs/>
+              </w:rPr>
+              <w:t>Funzionale</w:t>
+            </w:r>
+          </w:p>
+        </w:tc>
+        <w:tc>
+          <w:tcPr>
+            <w:tcW w:w="2248" w:type="dxa"/>
+            <w:tcBorders>
+              <w:top w:val="single" w:sz="6" w:space="0" w:color="auto"/>
+              <w:left w:val="single" w:sz="6" w:space="0" w:color="auto"/>
+              <w:bottom w:val="single" w:sz="6" w:space="0" w:color="auto"/>
+              <w:right w:val="single" w:sz="6" w:space="0" w:color="auto"/>
+            </w:tcBorders>
+            <w:tcMar>
+              <w:top w:w="120" w:type="dxa"/>
+              <w:left w:w="180" w:type="dxa"/>
+              <w:bottom w:w="120" w:type="dxa"/>
+              <w:right w:w="180" w:type="dxa"/>
+            </w:tcMar>
+            <w:vAlign w:val="center"/>
+            <w:hideMark/>
+          </w:tcPr>
+          <w:p>
+            <w:pPr>
+              <w:spacing w:after="0"/>
+              <w:jc w:val="both"/>
+            </w:pPr>
+            <w:r>
+              <w:t>Concorrenza di prenotazioni</w:t>
+            </w:r>
+          </w:p>
+        </w:tc>
+        <w:tc>
+          <w:tcPr>
+            <w:tcW w:w="0" w:type="auto"/>
+            <w:tcBorders>
+              <w:top w:val="single" w:sz="6" w:space="0" w:color="auto"/>
+              <w:left w:val="single" w:sz="6" w:space="0" w:color="auto"/>
+              <w:bottom w:val="single" w:sz="6" w:space="0" w:color="auto"/>
+              <w:right w:val="single" w:sz="6" w:space="0" w:color="auto"/>
+            </w:tcBorders>
+            <w:tcMar>
+              <w:top w:w="120" w:type="dxa"/>
+              <w:left w:w="180" w:type="dxa"/>
+              <w:bottom w:w="120" w:type="dxa"/>
+              <w:right w:w="180" w:type="dxa"/>
+            </w:tcMar>
+            <w:vAlign w:val="center"/>
+            <w:hideMark/>
+          </w:tcPr>
+          <w:p>
+            <w:pPr>
+              <w:spacing w:after="0"/>
+              <w:jc w:val="both"/>
+            </w:pPr>
+            <w:r>
+              <w:t xml:space="preserve">Gestire tramite firebase un controllo delle prenotazioni al momento del click. </w:t>
+            </w:r>
+          </w:p>
+          <w:p>
+            <w:pPr>
+              <w:spacing w:after="0"/>
+              <w:jc w:val="both"/>
+            </w:pPr>
+            <w:r>
+              <w:t xml:space="preserve">Se necessario implementare le </w:t>
+            </w:r>
+            <w:proofErr w:type="spellStart"/>
+            <w:r>
+              <w:t>Transactions</w:t>
+            </w:r>
+            <w:proofErr w:type="spellEnd"/>
+            <w:r>
+              <w:t>.</w:t>
+            </w:r>
+          </w:p>
+        </w:tc>
+      </w:tr>
+      <w:tr>
+        <w:trPr>
+          <w:tblCellSpacing w:w="15" w:type="dxa"/>
+        </w:trPr>
+        <w:tc>
+          <w:tcPr>
+            <w:tcW w:w="1932" w:type="dxa"/>
+            <w:tcBorders>
+              <w:top w:val="single" w:sz="6" w:space="0" w:color="auto"/>
+              <w:left w:val="single" w:sz="6" w:space="0" w:color="auto"/>
+              <w:bottom w:val="single" w:sz="6" w:space="0" w:color="auto"/>
+              <w:right w:val="single" w:sz="6" w:space="0" w:color="auto"/>
+            </w:tcBorders>
+            <w:tcMar>
+              <w:top w:w="120" w:type="dxa"/>
+              <w:left w:w="180" w:type="dxa"/>
+              <w:bottom w:w="120" w:type="dxa"/>
+              <w:right w:w="180" w:type="dxa"/>
+            </w:tcMar>
+            <w:vAlign w:val="center"/>
+            <w:hideMark/>
+          </w:tcPr>
+          <w:p>
+            <w:pPr>
+              <w:spacing w:after="0"/>
+              <w:jc w:val="both"/>
+            </w:pPr>
+            <w:r>
+              <w:rPr>
+                <w:b/>
+                <w:bCs/>
+              </w:rPr>
+              <w:t>Qualità</w:t>
+            </w:r>
+          </w:p>
+        </w:tc>
+        <w:tc>
+          <w:tcPr>
+            <w:tcW w:w="2248" w:type="dxa"/>
+            <w:tcBorders>
+              <w:top w:val="single" w:sz="6" w:space="0" w:color="auto"/>
+              <w:left w:val="single" w:sz="6" w:space="0" w:color="auto"/>
+              <w:bottom w:val="single" w:sz="6" w:space="0" w:color="auto"/>
+              <w:right w:val="single" w:sz="6" w:space="0" w:color="auto"/>
+            </w:tcBorders>
+            <w:tcMar>
+              <w:top w:w="120" w:type="dxa"/>
+              <w:left w:w="180" w:type="dxa"/>
+              <w:bottom w:w="120" w:type="dxa"/>
+              <w:right w:w="180" w:type="dxa"/>
+            </w:tcMar>
+            <w:vAlign w:val="center"/>
+            <w:hideMark/>
+          </w:tcPr>
+          <w:p>
+            <w:pPr>
+              <w:spacing w:after="0"/>
+              <w:jc w:val="both"/>
+            </w:pPr>
+            <w:r>
+              <w:t>Bug ed errori in corso d’opera</w:t>
+            </w:r>
+          </w:p>
+        </w:tc>
+        <w:tc>
+          <w:tcPr>
+            <w:tcW w:w="0" w:type="auto"/>
+            <w:tcBorders>
+              <w:top w:val="single" w:sz="6" w:space="0" w:color="auto"/>
+              <w:left w:val="single" w:sz="6" w:space="0" w:color="auto"/>
+              <w:bottom w:val="single" w:sz="6" w:space="0" w:color="auto"/>
+              <w:right w:val="single" w:sz="6" w:space="0" w:color="auto"/>
+            </w:tcBorders>
+            <w:tcMar>
+              <w:top w:w="120" w:type="dxa"/>
+              <w:left w:w="180" w:type="dxa"/>
+              <w:bottom w:w="120" w:type="dxa"/>
+              <w:right w:w="180" w:type="dxa"/>
+            </w:tcMar>
+            <w:vAlign w:val="center"/>
+            <w:hideMark/>
+          </w:tcPr>
+          <w:p>
+            <w:pPr>
+              <w:spacing w:after="0"/>
+              <w:jc w:val="both"/>
+            </w:pPr>
+            <w:r>
+              <w:t xml:space="preserve">Revisione attenta del codice prima di caricare nella repository. Se si utilizza un </w:t>
+            </w:r>
+            <w:proofErr w:type="spellStart"/>
+            <w:r>
+              <w:t>branch</w:t>
+            </w:r>
+            <w:proofErr w:type="spellEnd"/>
+            <w:r>
+              <w:t xml:space="preserve"> secondario, creare pull </w:t>
+            </w:r>
+            <w:proofErr w:type="spellStart"/>
+            <w:r>
+              <w:t>request</w:t>
+            </w:r>
+            <w:proofErr w:type="spellEnd"/>
+            <w:r>
+              <w:t xml:space="preserve"> e, se sono modifiche importante, attendere l’accettazione da parte di un altro membro.</w:t>
+            </w:r>
+          </w:p>
+        </w:tc>
+      </w:tr>
+    </w:tbl>
+    <w:p>
+      <w:pPr>
+        <w:spacing w:after="0"/>
+        <w:jc w:val="both"/>
+      </w:pPr>
+    </w:p>
+    <w:p>
+      <w:pPr>
+        <w:jc w:val="both"/>
+      </w:pPr>
+    </w:p>
+    <w:p>
+      <w:pPr>
+        <w:jc w:val="both"/>
+      </w:pPr>
+    </w:p>
+    <w:p>
+      <w:pPr>
+        <w:jc w:val="both"/>
+      </w:pPr>
+    </w:p>
+    <w:p>
+      <w:pPr>
+        <w:jc w:val="both"/>
+      </w:pPr>
+    </w:p>
+    <w:p>
+      <w:pPr>
+        <w:jc w:val="both"/>
+      </w:pPr>
+    </w:p>
+    <w:p>
+      <w:pPr>
+        <w:jc w:val="both"/>
+      </w:pPr>
+    </w:p>
+    <w:p>
+      <w:pPr>
+        <w:jc w:val="both"/>
+      </w:pPr>
+    </w:p>
+    <w:p>
+      <w:pPr>
+        <w:jc w:val="both"/>
+      </w:pPr>
+    </w:p>
+    <w:p>
+      <w:pPr>
+        <w:jc w:val="both"/>
+      </w:pPr>
+    </w:p>
+    <w:p>
+      <w:pPr>
+        <w:jc w:val="both"/>
+      </w:pPr>
+    </w:p>
+    <w:p>
+      <w:pPr>
+        <w:jc w:val="both"/>
+      </w:pPr>
+    </w:p>
+    <w:p>
+      <w:pPr>
+        <w:jc w:val="both"/>
+      </w:pPr>
+    </w:p>
+    <w:p>
+      <w:pPr>
+        <w:jc w:val="both"/>
+      </w:pPr>
+    </w:p>
+    <w:p>
+      <w:pPr>
+        <w:jc w:val="both"/>
+      </w:pPr>
     </w:p>
     <w:p>
       <w:pPr>
@@ -2029,7 +3073,6 @@
           <w:sz w:val="28"/>
           <w:szCs w:val="28"/>
         </w:rPr>
-        <w:lastRenderedPageBreak/>
         <w:t>PERSONALE</w:t>
       </w:r>
     </w:p>
@@ -2211,7 +3254,6 @@
           <w:sz w:val="28"/>
           <w:szCs w:val="28"/>
         </w:rPr>
-        <w:lastRenderedPageBreak/>
         <w:t>METODI E TECNICHE</w:t>
       </w:r>
     </w:p>
@@ -2409,7 +3451,6 @@
           <w:sz w:val="28"/>
           <w:szCs w:val="28"/>
         </w:rPr>
-        <w:lastRenderedPageBreak/>
         <w:t>GARANZIE DI QUALITÀ</w:t>
       </w:r>
     </w:p>
@@ -2759,51 +3800,7 @@
           <w:lang w:eastAsia="it-IT"/>
           <w14:ligatures w14:val="none"/>
         </w:rPr>
-        <w:t xml:space="preserve">Configurazione </w:t>
-      </w:r>
-      <w:proofErr w:type="spellStart"/>
-      <w:r>
-        <w:rPr>
-          <w:rFonts w:eastAsia="Times New Roman" w:cstheme="minorHAnsi"/>
-          <w:color w:val="000000"/>
-          <w:kern w:val="0"/>
-          <w:lang w:eastAsia="it-IT"/>
-          <w14:ligatures w14:val="none"/>
-        </w:rPr>
-        <w:t>Firebase</w:t>
-      </w:r>
-      <w:proofErr w:type="spellEnd"/>
-      <w:r>
-        <w:rPr>
-          <w:rFonts w:eastAsia="Times New Roman" w:cstheme="minorHAnsi"/>
-          <w:color w:val="000000"/>
-          <w:kern w:val="0"/>
-          <w:lang w:eastAsia="it-IT"/>
-          <w14:ligatures w14:val="none"/>
-        </w:rPr>
-        <w:t xml:space="preserve"> (</w:t>
-      </w:r>
-      <w:proofErr w:type="spellStart"/>
-      <w:r>
-        <w:rPr>
-          <w:rFonts w:eastAsia="Times New Roman" w:cstheme="minorHAnsi"/>
-          <w:color w:val="000000"/>
-          <w:kern w:val="0"/>
-          <w:lang w:eastAsia="it-IT"/>
-          <w14:ligatures w14:val="none"/>
-        </w:rPr>
-        <w:t>Realtime</w:t>
-      </w:r>
-      <w:proofErr w:type="spellEnd"/>
-      <w:r>
-        <w:rPr>
-          <w:rFonts w:eastAsia="Times New Roman" w:cstheme="minorHAnsi"/>
-          <w:color w:val="000000"/>
-          <w:kern w:val="0"/>
-          <w:lang w:eastAsia="it-IT"/>
-          <w14:ligatures w14:val="none"/>
-        </w:rPr>
-        <w:t xml:space="preserve"> Database) e chiavi di accesso nella classe apposita</w:t>
+        <w:t>Configurazione Firebase (Realtime Database) e chiavi di accesso nella classe apposita</w:t>
       </w:r>
     </w:p>
     <w:p>
@@ -3141,29 +4138,7 @@
           <w:lang w:eastAsia="it-IT"/>
           <w14:ligatures w14:val="none"/>
         </w:rPr>
-        <w:t xml:space="preserve">Caricamento dei marker delle colonnine da </w:t>
-      </w:r>
-      <w:proofErr w:type="spellStart"/>
-      <w:r>
-        <w:rPr>
-          <w:rFonts w:eastAsia="Times New Roman" w:cstheme="minorHAnsi"/>
-          <w:color w:val="000000"/>
-          <w:kern w:val="0"/>
-          <w:lang w:eastAsia="it-IT"/>
-          <w14:ligatures w14:val="none"/>
-        </w:rPr>
-        <w:t>Firebase</w:t>
-      </w:r>
-      <w:proofErr w:type="spellEnd"/>
-      <w:r>
-        <w:rPr>
-          <w:rFonts w:eastAsia="Times New Roman" w:cstheme="minorHAnsi"/>
-          <w:color w:val="000000"/>
-          <w:kern w:val="0"/>
-          <w:lang w:eastAsia="it-IT"/>
-          <w14:ligatures w14:val="none"/>
-        </w:rPr>
-        <w:t xml:space="preserve"> sulla mappa </w:t>
+        <w:t xml:space="preserve">Caricamento dei marker delle colonnine da Firebase sulla mappa </w:t>
       </w:r>
       <w:proofErr w:type="spellStart"/>
       <w:r>
@@ -3520,29 +4495,7 @@
           <w:lang w:eastAsia="it-IT"/>
           <w14:ligatures w14:val="none"/>
         </w:rPr>
-        <w:t xml:space="preserve">Implementazione in </w:t>
-      </w:r>
-      <w:proofErr w:type="spellStart"/>
-      <w:r>
-        <w:rPr>
-          <w:rFonts w:eastAsia="Times New Roman" w:cstheme="minorHAnsi"/>
-          <w:color w:val="000000"/>
-          <w:kern w:val="0"/>
-          <w:lang w:eastAsia="it-IT"/>
-          <w14:ligatures w14:val="none"/>
-        </w:rPr>
-        <w:t>Firebase</w:t>
-      </w:r>
-      <w:proofErr w:type="spellEnd"/>
-      <w:r>
-        <w:rPr>
-          <w:rFonts w:eastAsia="Times New Roman" w:cstheme="minorHAnsi"/>
-          <w:color w:val="000000"/>
-          <w:kern w:val="0"/>
-          <w:lang w:eastAsia="it-IT"/>
-          <w14:ligatures w14:val="none"/>
-        </w:rPr>
-        <w:t xml:space="preserve"> Service di tutti i nodi necessari per corretta gestione DB</w:t>
+        <w:t>Implementazione in Firebase Service di tutti i nodi necessari per corretta gestione DB</w:t>
       </w:r>
     </w:p>
     <w:p>
@@ -3796,6 +4749,7 @@
           <w:lang w:eastAsia="it-IT"/>
           <w14:ligatures w14:val="none"/>
         </w:rPr>
+        <w:lastRenderedPageBreak/>
         <w:t>Salvataggio del QR code nel database, utilizzabile poi nella pagina utente</w:t>
       </w:r>
     </w:p>
@@ -4227,7 +5181,6 @@
           <w:sz w:val="28"/>
           <w:szCs w:val="28"/>
         </w:rPr>
-        <w:lastRenderedPageBreak/>
         <w:t>RISORSE</w:t>
       </w:r>
     </w:p>
@@ -4321,21 +5274,8 @@
         </w:numPr>
         <w:jc w:val="both"/>
       </w:pPr>
-      <w:proofErr w:type="spellStart"/>
-      <w:r>
-        <w:t>Firebase</w:t>
-      </w:r>
-      <w:proofErr w:type="spellEnd"/>
-      <w:r>
-        <w:t xml:space="preserve"> </w:t>
-      </w:r>
-      <w:proofErr w:type="spellStart"/>
-      <w:r>
-        <w:t>Realtime</w:t>
-      </w:r>
-      <w:proofErr w:type="spellEnd"/>
-      <w:r>
-        <w:t xml:space="preserve"> Database (piano gratuito).</w:t>
+      <w:r>
+        <w:t>Firebase Realtime Database (piano gratuito).</w:t>
       </w:r>
     </w:p>
     <w:p>
@@ -4600,7 +5540,6 @@
           <w:sz w:val="28"/>
           <w:szCs w:val="28"/>
         </w:rPr>
-        <w:lastRenderedPageBreak/>
         <w:t>BUDGET</w:t>
       </w:r>
     </w:p>
@@ -4657,15 +5596,7 @@
       </w:r>
       <w:proofErr w:type="spellEnd"/>
       <w:r>
-        <w:t xml:space="preserve">, </w:t>
-      </w:r>
-      <w:proofErr w:type="spellStart"/>
-      <w:r>
-        <w:t>Firebase</w:t>
-      </w:r>
-      <w:proofErr w:type="spellEnd"/>
-      <w:r>
-        <w:t xml:space="preserve"> piano base, GitHub Free) sono gratuite per gli scopi del progetto</w:t>
+        <w:t>, Firebase piano base, GitHub Free) sono gratuite per gli scopi del progetto</w:t>
       </w:r>
       <w:r>
         <w:t>.</w:t>
@@ -4864,7 +5795,6 @@
           <w:sz w:val="28"/>
           <w:szCs w:val="28"/>
         </w:rPr>
-        <w:lastRenderedPageBreak/>
         <w:t>CAMBIAMENTI</w:t>
       </w:r>
     </w:p>
@@ -5067,7 +5997,6 @@
           <w:sz w:val="28"/>
           <w:szCs w:val="28"/>
         </w:rPr>
-        <w:lastRenderedPageBreak/>
         <w:t>CONSEGNA</w:t>
       </w:r>
     </w:p>
@@ -6807,7 +7736,6 @@
   <w:style w:type="character" w:default="1" w:styleId="Carpredefinitoparagrafo">
     <w:name w:val="Default Paragraph Font"/>
     <w:uiPriority w:val="1"/>
-    <w:semiHidden/>
     <w:unhideWhenUsed/>
   </w:style>
   <w:style w:type="table" w:default="1" w:styleId="Tabellanormale">

</xml_diff>

<commit_message>
Aggiornamento e miglioramento project plan
Ho aggiunto elementi in particolare ai punti 6 e successivi.
Ho corretto errori logici presenti al suo interno.
Modifiche generali.
</commit_message>
<xml_diff>
--- a/documentazione/project plan.docx
+++ b/documentazione/project plan.docx
@@ -329,6 +329,69 @@
         <w:jc w:val="both"/>
       </w:pPr>
       <w:r>
+        <w:t>Prima dell’avvio effettivo del progetto si svolgono due settimane di fase di prototipazione.</w:t>
+      </w:r>
+    </w:p>
+    <w:p>
+      <w:pPr>
+        <w:spacing w:after="0"/>
+        <w:jc w:val="both"/>
+      </w:pPr>
+      <w:r>
+        <w:t>L’obiettivo di questa fase è comprendere il funzionamento del database, dell’interfaccia grafica e delle attività base che saranno implementate.</w:t>
+      </w:r>
+    </w:p>
+    <w:p>
+      <w:pPr>
+        <w:spacing w:after="0"/>
+        <w:jc w:val="both"/>
+      </w:pPr>
+      <w:r>
+        <w:t>In questo modo si ottiene una visione oggettiva degli obiettivi che possiamo raggiungere, delle difficoltà e permette di fare una stima temporale in relazione alle funzionalità.</w:t>
+      </w:r>
+    </w:p>
+    <w:p>
+      <w:pPr>
+        <w:spacing w:after="0"/>
+        <w:jc w:val="both"/>
+      </w:pPr>
+      <w:r>
+        <w:t>Questa parte di prototipazione è di tipologia</w:t>
+      </w:r>
+      <w:r>
+        <w:t xml:space="preserve"> sia usa e getta che evolutiva.</w:t>
+      </w:r>
+    </w:p>
+    <w:p>
+      <w:pPr>
+        <w:spacing w:after="0"/>
+        <w:jc w:val="both"/>
+      </w:pPr>
+      <w:r>
+        <w:t xml:space="preserve">Il progetto verrà poi avviato in maniera definitiva </w:t>
+      </w:r>
+      <w:r>
+        <w:t xml:space="preserve">da zero (usa e getta) </w:t>
+      </w:r>
+      <w:r>
+        <w:t>e parti del codice del prototipo verranno riutilizzate</w:t>
+      </w:r>
+      <w:r>
+        <w:t xml:space="preserve"> (evolutiva).</w:t>
+      </w:r>
+    </w:p>
+    <w:p>
+      <w:pPr>
+        <w:spacing w:after="0"/>
+        <w:jc w:val="both"/>
+      </w:pPr>
+    </w:p>
+    <w:p>
+      <w:pPr>
+        <w:spacing w:after="0"/>
+        <w:jc w:val="both"/>
+      </w:pPr>
+      <w:r>
         <w:t>La suddivisione del tempo a disposizione avviene in tale maniera:</w:t>
       </w:r>
     </w:p>
@@ -337,8 +400,23 @@
         <w:spacing w:after="0"/>
         <w:jc w:val="both"/>
       </w:pPr>
-      <w:r>
-        <w:t>Backlog: 3 giorni di decisione riguardo funzioni da implementare e obiettivi da raggiungere nella fase di Sprint</w:t>
+    </w:p>
+    <w:p>
+      <w:pPr>
+        <w:spacing w:after="0"/>
+        <w:jc w:val="both"/>
+      </w:pPr>
+      <w:r>
+        <w:t>Planning</w:t>
+      </w:r>
+      <w:r>
+        <w:t xml:space="preserve">: </w:t>
+      </w:r>
+      <w:r>
+        <w:t xml:space="preserve">2 </w:t>
+      </w:r>
+      <w:r>
+        <w:t>giorni di decisione riguardo funzioni da implementare e obiettivi da raggiungere nella fase di Sprint</w:t>
       </w:r>
     </w:p>
     <w:p>
@@ -373,6 +451,12 @@
         <w:spacing w:after="0"/>
         <w:jc w:val="both"/>
       </w:pPr>
+    </w:p>
+    <w:p>
+      <w:pPr>
+        <w:spacing w:after="0"/>
+        <w:jc w:val="both"/>
+      </w:pPr>
       <w:r>
         <w:t>Durante la fase di review e di backlog si può procedere con la stesura dei documenti necessari.</w:t>
       </w:r>
@@ -388,93 +472,462 @@
     </w:p>
     <w:p>
       <w:pPr>
-        <w:spacing w:after="0"/>
-        <w:jc w:val="both"/>
-        <w:rPr>
-          <w:sz w:val="24"/>
-          <w:szCs w:val="24"/>
-        </w:rPr>
-      </w:pPr>
-    </w:p>
-    <w:p>
-      <w:pPr>
-        <w:jc w:val="both"/>
-      </w:pPr>
-    </w:p>
-    <w:p>
-      <w:pPr>
-        <w:jc w:val="both"/>
-      </w:pPr>
-    </w:p>
-    <w:p>
-      <w:pPr>
-        <w:jc w:val="both"/>
-      </w:pPr>
-    </w:p>
-    <w:p>
-      <w:pPr>
-        <w:jc w:val="both"/>
-      </w:pPr>
-    </w:p>
-    <w:p>
-      <w:pPr>
-        <w:jc w:val="both"/>
-      </w:pPr>
-    </w:p>
-    <w:p>
-      <w:pPr>
-        <w:jc w:val="both"/>
-      </w:pPr>
-    </w:p>
-    <w:p>
-      <w:pPr>
-        <w:jc w:val="both"/>
-      </w:pPr>
-    </w:p>
-    <w:p>
-      <w:pPr>
-        <w:jc w:val="both"/>
-      </w:pPr>
-    </w:p>
-    <w:p>
-      <w:pPr>
-        <w:jc w:val="both"/>
-      </w:pPr>
-    </w:p>
-    <w:p>
-      <w:pPr>
-        <w:jc w:val="both"/>
-      </w:pPr>
-    </w:p>
-    <w:p>
-      <w:pPr>
-        <w:jc w:val="both"/>
-      </w:pPr>
-    </w:p>
-    <w:p>
-      <w:pPr>
-        <w:jc w:val="both"/>
-      </w:pPr>
-    </w:p>
-    <w:p>
-      <w:pPr>
-        <w:jc w:val="both"/>
-      </w:pPr>
-    </w:p>
-    <w:p>
-      <w:pPr>
-        <w:jc w:val="both"/>
-      </w:pPr>
-    </w:p>
-    <w:p>
-      <w:pPr>
-        <w:jc w:val="both"/>
-      </w:pPr>
-    </w:p>
-    <w:p>
-      <w:pPr>
-        <w:jc w:val="both"/>
-      </w:pPr>
+        <w:jc w:val="both"/>
+      </w:pPr>
+      <w:r>
+        <w:t>A seguire un esempio di pianificazione per i primi due sprint:</w:t>
+      </w:r>
+    </w:p>
+    <w:tbl>
+      <w:tblPr>
+        <w:tblW w:w="0" w:type="auto"/>
+        <w:tblCellSpacing w:w="15" w:type="dxa"/>
+        <w:tblCellMar>
+          <w:top w:w="15" w:type="dxa"/>
+          <w:left w:w="15" w:type="dxa"/>
+          <w:bottom w:w="15" w:type="dxa"/>
+          <w:right w:w="15" w:type="dxa"/>
+        </w:tblCellMar>
+        <w:tblLook w:val="04A0" w:firstRow="1" w:lastRow="0" w:firstColumn="1" w:lastColumn="0" w:noHBand="0" w:noVBand="1"/>
+      </w:tblPr>
+      <w:tblGrid>
+        <w:gridCol w:w="2835"/>
+        <w:gridCol w:w="1418"/>
+        <w:gridCol w:w="823"/>
+      </w:tblGrid>
+      <w:tr>
+        <w:trPr>
+          <w:tblHeader/>
+          <w:tblCellSpacing w:w="15" w:type="dxa"/>
+        </w:trPr>
+        <w:tc>
+          <w:tcPr>
+            <w:tcW w:w="2790" w:type="dxa"/>
+            <w:vAlign w:val="center"/>
+            <w:hideMark/>
+          </w:tcPr>
+          <w:p>
+            <w:pPr>
+              <w:jc w:val="both"/>
+              <w:rPr>
+                <w:b/>
+                <w:bCs/>
+              </w:rPr>
+            </w:pPr>
+            <w:r>
+              <w:rPr>
+                <w:b/>
+                <w:bCs/>
+              </w:rPr>
+              <w:t>Fase</w:t>
+            </w:r>
+          </w:p>
+        </w:tc>
+        <w:tc>
+          <w:tcPr>
+            <w:tcW w:w="1388" w:type="dxa"/>
+            <w:vAlign w:val="center"/>
+            <w:hideMark/>
+          </w:tcPr>
+          <w:p>
+            <w:pPr>
+              <w:jc w:val="both"/>
+              <w:rPr>
+                <w:b/>
+                <w:bCs/>
+              </w:rPr>
+            </w:pPr>
+            <w:r>
+              <w:rPr>
+                <w:b/>
+                <w:bCs/>
+              </w:rPr>
+              <w:t>Durata</w:t>
+            </w:r>
+          </w:p>
+        </w:tc>
+        <w:tc>
+          <w:tcPr>
+            <w:tcW w:w="778" w:type="dxa"/>
+            <w:vAlign w:val="center"/>
+            <w:hideMark/>
+          </w:tcPr>
+          <w:p>
+            <w:pPr>
+              <w:jc w:val="both"/>
+              <w:rPr>
+                <w:b/>
+                <w:bCs/>
+              </w:rPr>
+            </w:pPr>
+            <w:r>
+              <w:rPr>
+                <w:b/>
+                <w:bCs/>
+              </w:rPr>
+              <w:t xml:space="preserve">Periodo </w:t>
+            </w:r>
+          </w:p>
+        </w:tc>
+      </w:tr>
+      <w:tr>
+        <w:trPr>
+          <w:tblCellSpacing w:w="15" w:type="dxa"/>
+        </w:trPr>
+        <w:tc>
+          <w:tcPr>
+            <w:tcW w:w="2790" w:type="dxa"/>
+            <w:vAlign w:val="center"/>
+            <w:hideMark/>
+          </w:tcPr>
+          <w:p>
+            <w:pPr>
+              <w:jc w:val="both"/>
+            </w:pPr>
+            <w:r>
+              <w:t>Prototipazione iniziale</w:t>
+            </w:r>
+          </w:p>
+        </w:tc>
+        <w:tc>
+          <w:tcPr>
+            <w:tcW w:w="1388" w:type="dxa"/>
+            <w:vAlign w:val="center"/>
+            <w:hideMark/>
+          </w:tcPr>
+          <w:p>
+            <w:pPr>
+              <w:jc w:val="both"/>
+            </w:pPr>
+            <w:r>
+              <w:t>2 settimane</w:t>
+            </w:r>
+          </w:p>
+        </w:tc>
+        <w:tc>
+          <w:tcPr>
+            <w:tcW w:w="778" w:type="dxa"/>
+            <w:vAlign w:val="center"/>
+            <w:hideMark/>
+          </w:tcPr>
+          <w:p>
+            <w:pPr>
+              <w:jc w:val="both"/>
+            </w:pPr>
+            <w:r>
+              <w:t>1 – 14</w:t>
+            </w:r>
+          </w:p>
+        </w:tc>
+      </w:tr>
+      <w:tr>
+        <w:trPr>
+          <w:tblCellSpacing w:w="15" w:type="dxa"/>
+        </w:trPr>
+        <w:tc>
+          <w:tcPr>
+            <w:tcW w:w="2790" w:type="dxa"/>
+            <w:vAlign w:val="center"/>
+            <w:hideMark/>
+          </w:tcPr>
+          <w:p>
+            <w:pPr>
+              <w:jc w:val="both"/>
+            </w:pPr>
+            <w:r>
+              <w:t>Sprint 1 – Product Backlog</w:t>
+            </w:r>
+          </w:p>
+        </w:tc>
+        <w:tc>
+          <w:tcPr>
+            <w:tcW w:w="1388" w:type="dxa"/>
+            <w:vAlign w:val="center"/>
+            <w:hideMark/>
+          </w:tcPr>
+          <w:p>
+            <w:pPr>
+              <w:jc w:val="both"/>
+            </w:pPr>
+            <w:r>
+              <w:t>2 giorni</w:t>
+            </w:r>
+          </w:p>
+        </w:tc>
+        <w:tc>
+          <w:tcPr>
+            <w:tcW w:w="778" w:type="dxa"/>
+            <w:vAlign w:val="center"/>
+            <w:hideMark/>
+          </w:tcPr>
+          <w:p>
+            <w:pPr>
+              <w:jc w:val="both"/>
+            </w:pPr>
+            <w:r>
+              <w:t>15 – 16</w:t>
+            </w:r>
+          </w:p>
+        </w:tc>
+      </w:tr>
+      <w:tr>
+        <w:trPr>
+          <w:tblCellSpacing w:w="15" w:type="dxa"/>
+        </w:trPr>
+        <w:tc>
+          <w:tcPr>
+            <w:tcW w:w="2790" w:type="dxa"/>
+            <w:vAlign w:val="center"/>
+            <w:hideMark/>
+          </w:tcPr>
+          <w:p>
+            <w:pPr>
+              <w:jc w:val="both"/>
+            </w:pPr>
+            <w:r>
+              <w:t>Sprint 1 – Sviluppo</w:t>
+            </w:r>
+          </w:p>
+        </w:tc>
+        <w:tc>
+          <w:tcPr>
+            <w:tcW w:w="1388" w:type="dxa"/>
+            <w:vAlign w:val="center"/>
+            <w:hideMark/>
+          </w:tcPr>
+          <w:p>
+            <w:pPr>
+              <w:jc w:val="both"/>
+            </w:pPr>
+            <w:r>
+              <w:t>10 giorni</w:t>
+            </w:r>
+          </w:p>
+        </w:tc>
+        <w:tc>
+          <w:tcPr>
+            <w:tcW w:w="778" w:type="dxa"/>
+            <w:vAlign w:val="center"/>
+            <w:hideMark/>
+          </w:tcPr>
+          <w:p>
+            <w:pPr>
+              <w:jc w:val="both"/>
+            </w:pPr>
+            <w:r>
+              <w:t>17 – 26</w:t>
+            </w:r>
+          </w:p>
+        </w:tc>
+      </w:tr>
+      <w:tr>
+        <w:trPr>
+          <w:tblCellSpacing w:w="15" w:type="dxa"/>
+        </w:trPr>
+        <w:tc>
+          <w:tcPr>
+            <w:tcW w:w="2790" w:type="dxa"/>
+            <w:vAlign w:val="center"/>
+            <w:hideMark/>
+          </w:tcPr>
+          <w:p>
+            <w:pPr>
+              <w:jc w:val="both"/>
+            </w:pPr>
+            <w:r>
+              <w:t>Sprint 1 – Review</w:t>
+            </w:r>
+          </w:p>
+        </w:tc>
+        <w:tc>
+          <w:tcPr>
+            <w:tcW w:w="1388" w:type="dxa"/>
+            <w:vAlign w:val="center"/>
+            <w:hideMark/>
+          </w:tcPr>
+          <w:p>
+            <w:pPr>
+              <w:jc w:val="both"/>
+            </w:pPr>
+            <w:r>
+              <w:t>2 giorni</w:t>
+            </w:r>
+          </w:p>
+        </w:tc>
+        <w:tc>
+          <w:tcPr>
+            <w:tcW w:w="778" w:type="dxa"/>
+            <w:vAlign w:val="center"/>
+            <w:hideMark/>
+          </w:tcPr>
+          <w:p>
+            <w:pPr>
+              <w:jc w:val="both"/>
+            </w:pPr>
+            <w:r>
+              <w:t>27 – 28</w:t>
+            </w:r>
+          </w:p>
+        </w:tc>
+      </w:tr>
+      <w:tr>
+        <w:trPr>
+          <w:tblCellSpacing w:w="15" w:type="dxa"/>
+        </w:trPr>
+        <w:tc>
+          <w:tcPr>
+            <w:tcW w:w="2790" w:type="dxa"/>
+            <w:vAlign w:val="center"/>
+            <w:hideMark/>
+          </w:tcPr>
+          <w:p>
+            <w:pPr>
+              <w:jc w:val="both"/>
+            </w:pPr>
+            <w:r>
+              <w:t xml:space="preserve">Sprint 2 – Product Backlog </w:t>
+            </w:r>
+          </w:p>
+        </w:tc>
+        <w:tc>
+          <w:tcPr>
+            <w:tcW w:w="1388" w:type="dxa"/>
+            <w:vAlign w:val="center"/>
+            <w:hideMark/>
+          </w:tcPr>
+          <w:p>
+            <w:pPr>
+              <w:jc w:val="both"/>
+            </w:pPr>
+            <w:r>
+              <w:t>2 giorni</w:t>
+            </w:r>
+          </w:p>
+        </w:tc>
+        <w:tc>
+          <w:tcPr>
+            <w:tcW w:w="778" w:type="dxa"/>
+            <w:vAlign w:val="center"/>
+            <w:hideMark/>
+          </w:tcPr>
+          <w:p>
+            <w:pPr>
+              <w:jc w:val="both"/>
+            </w:pPr>
+            <w:r>
+              <w:t>29 – 30</w:t>
+            </w:r>
+          </w:p>
+        </w:tc>
+      </w:tr>
+      <w:tr>
+        <w:trPr>
+          <w:tblCellSpacing w:w="15" w:type="dxa"/>
+        </w:trPr>
+        <w:tc>
+          <w:tcPr>
+            <w:tcW w:w="2790" w:type="dxa"/>
+            <w:vAlign w:val="center"/>
+            <w:hideMark/>
+          </w:tcPr>
+          <w:p>
+            <w:pPr>
+              <w:jc w:val="both"/>
+            </w:pPr>
+            <w:r>
+              <w:t>Sprint 2 – Sviluppo</w:t>
+            </w:r>
+          </w:p>
+        </w:tc>
+        <w:tc>
+          <w:tcPr>
+            <w:tcW w:w="1388" w:type="dxa"/>
+            <w:vAlign w:val="center"/>
+            <w:hideMark/>
+          </w:tcPr>
+          <w:p>
+            <w:pPr>
+              <w:jc w:val="both"/>
+            </w:pPr>
+            <w:r>
+              <w:t>10 giorni</w:t>
+            </w:r>
+          </w:p>
+        </w:tc>
+        <w:tc>
+          <w:tcPr>
+            <w:tcW w:w="778" w:type="dxa"/>
+            <w:vAlign w:val="center"/>
+            <w:hideMark/>
+          </w:tcPr>
+          <w:p>
+            <w:pPr>
+              <w:jc w:val="both"/>
+            </w:pPr>
+            <w:r>
+              <w:t>31 – 40</w:t>
+            </w:r>
+          </w:p>
+        </w:tc>
+      </w:tr>
+      <w:tr>
+        <w:trPr>
+          <w:tblCellSpacing w:w="15" w:type="dxa"/>
+        </w:trPr>
+        <w:tc>
+          <w:tcPr>
+            <w:tcW w:w="2790" w:type="dxa"/>
+            <w:vAlign w:val="center"/>
+            <w:hideMark/>
+          </w:tcPr>
+          <w:p>
+            <w:pPr>
+              <w:jc w:val="both"/>
+            </w:pPr>
+            <w:r>
+              <w:t>Sprint 2 – Review</w:t>
+            </w:r>
+          </w:p>
+        </w:tc>
+        <w:tc>
+          <w:tcPr>
+            <w:tcW w:w="1388" w:type="dxa"/>
+            <w:vAlign w:val="center"/>
+            <w:hideMark/>
+          </w:tcPr>
+          <w:p>
+            <w:pPr>
+              <w:jc w:val="both"/>
+            </w:pPr>
+            <w:r>
+              <w:t>2 giorni</w:t>
+            </w:r>
+          </w:p>
+        </w:tc>
+        <w:tc>
+          <w:tcPr>
+            <w:tcW w:w="778" w:type="dxa"/>
+            <w:vAlign w:val="center"/>
+            <w:hideMark/>
+          </w:tcPr>
+          <w:p>
+            <w:pPr>
+              <w:jc w:val="both"/>
+            </w:pPr>
+            <w:r>
+              <w:t>41 – 42</w:t>
+            </w:r>
+          </w:p>
+        </w:tc>
+      </w:tr>
+    </w:tbl>
+    <w:p>
+      <w:pPr>
+        <w:jc w:val="both"/>
+      </w:pPr>
+      <w:r>
+        <w:t>Il numero di sprint da effettuare sarà commisurato alle funzionalità che il gruppo implementerà.</w:t>
+      </w:r>
     </w:p>
     <w:p>
       <w:pPr>
@@ -486,16 +939,422 @@
           <w:szCs w:val="28"/>
         </w:rPr>
       </w:pPr>
-    </w:p>
-    <w:p>
-      <w:pPr>
-        <w:jc w:val="both"/>
+      <w:r>
         <w:rPr>
           <w:b/>
           <w:bCs/>
           <w:sz w:val="28"/>
           <w:szCs w:val="28"/>
         </w:rPr>
+        <w:lastRenderedPageBreak/>
+        <w:t>ORGANIZZAZIONE DEL PROCESSO</w:t>
+      </w:r>
+    </w:p>
+    <w:p>
+      <w:pPr>
+        <w:spacing w:after="0"/>
+        <w:jc w:val="both"/>
+      </w:pPr>
+      <w:r>
+        <w:t>Sono stati definiti i seguenti ruoli, in accordo con le regole del metodo SCRUM utilizzato.</w:t>
+      </w:r>
+    </w:p>
+    <w:p>
+      <w:pPr>
+        <w:spacing w:after="0"/>
+        <w:jc w:val="both"/>
+      </w:pPr>
+      <w:r>
+        <w:rPr>
+          <w:b/>
+          <w:bCs/>
+        </w:rPr>
+        <w:t>Product owner</w:t>
+      </w:r>
+      <w:r>
+        <w:t xml:space="preserve"> </w:t>
+      </w:r>
+      <w:r>
+        <w:t>-</w:t>
+      </w:r>
+      <w:r>
+        <w:t xml:space="preserve"> Davide Mascheretti </w:t>
+      </w:r>
+      <w:r>
+        <w:t>: responsabile della gestione generale del progetto, delle risorse e delle funzionalità principali.</w:t>
+      </w:r>
+    </w:p>
+    <w:p>
+      <w:pPr>
+        <w:spacing w:after="0"/>
+        <w:jc w:val="both"/>
+      </w:pPr>
+      <w:r>
+        <w:rPr>
+          <w:b/>
+          <w:bCs/>
+        </w:rPr>
+        <w:t>Scrum master</w:t>
+      </w:r>
+      <w:r>
+        <w:t xml:space="preserve"> </w:t>
+      </w:r>
+      <w:r>
+        <w:t>-</w:t>
+      </w:r>
+      <w:r>
+        <w:t xml:space="preserve"> Tommaso Maistrello</w:t>
+      </w:r>
+      <w:r>
+        <w:t xml:space="preserve"> : responsabile del corretto svolgimento dell’approccio agile, della comunicazione nel team e risolutore di problemi di natura tecnica e non.</w:t>
+      </w:r>
+    </w:p>
+    <w:p>
+      <w:pPr>
+        <w:spacing w:after="0"/>
+        <w:jc w:val="both"/>
+      </w:pPr>
+      <w:r>
+        <w:rPr>
+          <w:b/>
+          <w:bCs/>
+        </w:rPr>
+        <w:t>Team di implementazione</w:t>
+      </w:r>
+      <w:r>
+        <w:t xml:space="preserve"> </w:t>
+      </w:r>
+      <w:r>
+        <w:t xml:space="preserve">- </w:t>
+      </w:r>
+      <w:r>
+        <w:t>Tommaso Maistrello, Davide Mascheretti, Claudio Morgera, Francesco Valenari</w:t>
+      </w:r>
+      <w:r>
+        <w:t xml:space="preserve"> : responsabili dello sviluppo del software e della documentazione.</w:t>
+      </w:r>
+    </w:p>
+    <w:p>
+      <w:pPr>
+        <w:spacing w:after="0"/>
+        <w:jc w:val="both"/>
+      </w:pPr>
+    </w:p>
+    <w:p>
+      <w:pPr>
+        <w:spacing w:after="0"/>
+        <w:jc w:val="both"/>
+      </w:pPr>
+      <w:r>
+        <w:t>Inoltre, a</w:t>
+      </w:r>
+      <w:r>
+        <w:t>ll’interno del team di implementazione</w:t>
+      </w:r>
+      <w:r>
+        <w:t>,</w:t>
+      </w:r>
+      <w:r>
+        <w:t xml:space="preserve"> i ruoli sono stati cos</w:t>
+      </w:r>
+      <w:r>
+        <w:t>ì</w:t>
+      </w:r>
+      <w:r>
+        <w:t xml:space="preserve"> ridefiniti.</w:t>
+      </w:r>
+    </w:p>
+    <w:p>
+      <w:pPr>
+        <w:spacing w:after="0"/>
+        <w:jc w:val="both"/>
+      </w:pPr>
+    </w:p>
+    <w:p>
+      <w:pPr>
+        <w:spacing w:after="0"/>
+        <w:jc w:val="both"/>
+      </w:pPr>
+      <w:r>
+        <w:rPr>
+          <w:b/>
+          <w:bCs/>
+        </w:rPr>
+        <w:t>Frontend</w:t>
+      </w:r>
+      <w:r>
+        <w:t>: sviluppo interfaccia, mappa interattiva, passaggio tra pagine, menù.</w:t>
+      </w:r>
+    </w:p>
+    <w:p>
+      <w:pPr>
+        <w:spacing w:after="0"/>
+        <w:jc w:val="both"/>
+      </w:pPr>
+      <w:r>
+        <w:rPr>
+          <w:b/>
+          <w:bCs/>
+        </w:rPr>
+        <w:t>Backend</w:t>
+      </w:r>
+      <w:r>
+        <w:rPr>
+          <w:b/>
+          <w:bCs/>
+        </w:rPr>
+        <w:t xml:space="preserve"> </w:t>
+      </w:r>
+      <w:r>
+        <w:rPr>
+          <w:b/>
+          <w:bCs/>
+        </w:rPr>
+        <w:t>+</w:t>
+      </w:r>
+      <w:r>
+        <w:rPr>
+          <w:b/>
+          <w:bCs/>
+        </w:rPr>
+        <w:t xml:space="preserve"> </w:t>
+      </w:r>
+      <w:r>
+        <w:rPr>
+          <w:b/>
+          <w:bCs/>
+        </w:rPr>
+        <w:t>Database</w:t>
+      </w:r>
+      <w:r>
+        <w:t>: gestione firebase Realtime Database, controlli utente e prenotazioni, salvataggio dati, sicurezza</w:t>
+      </w:r>
+      <w:r>
+        <w:t>.</w:t>
+      </w:r>
+    </w:p>
+    <w:p>
+      <w:pPr>
+        <w:spacing w:after="0"/>
+        <w:jc w:val="both"/>
+      </w:pPr>
+      <w:r>
+        <w:rPr>
+          <w:b/>
+          <w:bCs/>
+        </w:rPr>
+        <w:t xml:space="preserve">Testing: </w:t>
+      </w:r>
+      <w:r>
+        <w:t>controllo corretta funzionalità di metodi e di classi, verifica eccezioni.</w:t>
+      </w:r>
+    </w:p>
+    <w:p>
+      <w:pPr>
+        <w:spacing w:after="0"/>
+        <w:jc w:val="both"/>
+      </w:pPr>
+      <w:r>
+        <w:rPr>
+          <w:b/>
+          <w:bCs/>
+        </w:rPr>
+        <w:t>Documentazione</w:t>
+      </w:r>
+      <w:r>
+        <w:t>: project plan, diagrammi UML, informazioni generali.</w:t>
+      </w:r>
+    </w:p>
+    <w:p>
+      <w:pPr>
+        <w:spacing w:after="0"/>
+        <w:jc w:val="both"/>
+      </w:pPr>
+      <w:r>
+        <w:t xml:space="preserve">Le specifiche e l’assegnazione di questi ruoli all’interno del team sono </w:t>
+      </w:r>
+      <w:r>
+        <w:t>illustrate in maniera più dettagliata</w:t>
+      </w:r>
+      <w:r>
+        <w:t xml:space="preserve"> all’interno del paragrafo </w:t>
+      </w:r>
+      <w:r>
+        <w:t>Personale</w:t>
+      </w:r>
+      <w:r>
+        <w:t>.</w:t>
+      </w:r>
+    </w:p>
+    <w:p>
+      <w:pPr>
+        <w:spacing w:after="0"/>
+        <w:jc w:val="both"/>
+      </w:pPr>
+    </w:p>
+    <w:p>
+      <w:pPr>
+        <w:spacing w:after="0"/>
+        <w:jc w:val="both"/>
+      </w:pPr>
+      <w:r>
+        <w:t>Nonostante ciò, nel caso di necessità un membro del gruppo può contribuire alla collaborazione con il membro affidato a quel ruolo.</w:t>
+      </w:r>
+    </w:p>
+    <w:p>
+      <w:pPr>
+        <w:spacing w:after="0"/>
+        <w:jc w:val="both"/>
+      </w:pPr>
+      <w:r>
+        <w:t>La conoscenza deve essere utilizzata in maniera trasversale</w:t>
+      </w:r>
+      <w:r>
+        <w:t xml:space="preserve"> e il gruppo deve adottare un approccio collaborativo.</w:t>
+      </w:r>
+    </w:p>
+    <w:p>
+      <w:pPr>
+        <w:spacing w:after="0"/>
+        <w:jc w:val="both"/>
+      </w:pPr>
+      <w:r>
+        <w:t>La documentazione chiara e dettagliata è considerata responsabilità condivisa tra tutti i membri del gruppo, essa deve essere il compito di tutti.</w:t>
+      </w:r>
+    </w:p>
+    <w:p>
+      <w:pPr>
+        <w:spacing w:after="0"/>
+        <w:jc w:val="both"/>
+      </w:pPr>
+    </w:p>
+    <w:p>
+      <w:pPr>
+        <w:spacing w:after="0"/>
+        <w:jc w:val="both"/>
+      </w:pPr>
+      <w:r>
+        <w:t>La comunicazione quotidiana interna avviene tramite un gruppo Whatsapp dedicato, utilizzato per scambio di informazioni, aggiornamenti, domande inerenti al progetto o a problemi riscontrati.</w:t>
+      </w:r>
+    </w:p>
+    <w:p>
+      <w:pPr>
+        <w:spacing w:after="0"/>
+        <w:jc w:val="both"/>
+      </w:pPr>
+      <w:r>
+        <w:t>Sono previsti inoltre b</w:t>
+      </w:r>
+      <w:r>
+        <w:t xml:space="preserve">revi meeting principalmente non online per risolvere problemi </w:t>
+      </w:r>
+      <w:r>
+        <w:t xml:space="preserve">e </w:t>
+      </w:r>
+      <w:r>
+        <w:t xml:space="preserve">per </w:t>
+      </w:r>
+      <w:r>
+        <w:t xml:space="preserve">eventuali </w:t>
+      </w:r>
+      <w:r>
+        <w:t>chiarimenti</w:t>
+      </w:r>
+      <w:r>
+        <w:t>.</w:t>
+      </w:r>
+    </w:p>
+    <w:p>
+      <w:pPr>
+        <w:spacing w:after="0"/>
+        <w:jc w:val="both"/>
+      </w:pPr>
+      <w:r>
+        <w:t>Decisioni, urgenze e task vengono gestiti dal gruppo stesso durante i meeting settimanali, in cui si decide anche se è necessario un cambio di ruoli.</w:t>
+      </w:r>
+    </w:p>
+    <w:p>
+      <w:pPr>
+        <w:spacing w:after="0"/>
+        <w:jc w:val="both"/>
+      </w:pPr>
+      <w:r>
+        <w:t>La gestione delle attività che ogni membro svolge sul codice viene gestita tramite l’u</w:t>
+      </w:r>
+      <w:r>
+        <w:t xml:space="preserve">tilizzo di GitHub privato condiviso </w:t>
+      </w:r>
+      <w:r>
+        <w:t>con il gruppo.</w:t>
+      </w:r>
+    </w:p>
+    <w:p>
+      <w:pPr>
+        <w:spacing w:after="0"/>
+        <w:jc w:val="both"/>
+      </w:pPr>
+      <w:r>
+        <w:t xml:space="preserve">Esso è inoltre utilizzato per la tracciabilità e per la gestione delle </w:t>
+      </w:r>
+      <w:proofErr w:type="spellStart"/>
+      <w:r>
+        <w:t>issue</w:t>
+      </w:r>
+      <w:proofErr w:type="spellEnd"/>
+      <w:r>
+        <w:t>.</w:t>
+      </w:r>
+    </w:p>
+    <w:p>
+      <w:pPr>
+        <w:spacing w:after="0"/>
+        <w:jc w:val="both"/>
+      </w:pPr>
+      <w:r>
+        <w:t>La documentazione viene inizialmente caricata e modificata in un file condiviso in Google Drive per poi essere integrata ufficialmente nella repository.</w:t>
+      </w:r>
+    </w:p>
+    <w:p>
+      <w:pPr>
+        <w:spacing w:after="0"/>
+        <w:jc w:val="both"/>
+      </w:pPr>
+      <w:r>
+        <w:t>Questa tipologia di organizzazione permette ai membri del gruppo di avere una definita suddivisone dei ruoli, in cui ognuno è a conoscenza delle sue responsabilità al fine di avere una corretta evoluzione del progetto.</w:t>
+      </w:r>
+    </w:p>
+    <w:p>
+      <w:pPr>
+        <w:spacing w:after="0"/>
+        <w:jc w:val="both"/>
+      </w:pPr>
+      <w:r>
+        <w:t>È necessario lavoro costante da parte di tutto il team.</w:t>
+      </w:r>
+    </w:p>
+    <w:p>
+      <w:pPr>
+        <w:jc w:val="both"/>
+      </w:pPr>
+    </w:p>
+    <w:p>
+      <w:pPr>
+        <w:jc w:val="both"/>
+      </w:pPr>
+    </w:p>
+    <w:p>
+      <w:pPr>
+        <w:jc w:val="both"/>
+      </w:pPr>
+    </w:p>
+    <w:p>
+      <w:pPr>
+        <w:jc w:val="both"/>
+      </w:pPr>
+    </w:p>
+    <w:p>
+      <w:pPr>
+        <w:jc w:val="both"/>
       </w:pPr>
     </w:p>
     <w:p>
@@ -516,241 +1375,652 @@
           <w:szCs w:val="28"/>
         </w:rPr>
         <w:lastRenderedPageBreak/>
-        <w:t>ORGANIZZAZIONE DEL PROCESSO</w:t>
-      </w:r>
-    </w:p>
-    <w:p>
-      <w:pPr>
-        <w:spacing w:after="0"/>
-        <w:jc w:val="both"/>
-      </w:pPr>
-      <w:r>
-        <w:t>Sono stati definiti i seguenti ruoli, in accordo con le regole del metodo SCRUM utilizzato.</w:t>
-      </w:r>
-    </w:p>
-    <w:p>
-      <w:pPr>
-        <w:spacing w:after="0"/>
-        <w:jc w:val="both"/>
-      </w:pPr>
+        <w:t>STANDARD, LINEE GUIDE E PROCEDURE</w:t>
+      </w:r>
+    </w:p>
+    <w:p>
+      <w:pPr>
+        <w:jc w:val="both"/>
+        <w:rPr>
+          <w:i/>
+          <w:iCs/>
+        </w:rPr>
+      </w:pPr>
+      <w:r>
+        <w:rPr>
+          <w:i/>
+          <w:iCs/>
+        </w:rPr>
+        <w:t>Gestione codice</w:t>
+      </w:r>
+    </w:p>
+    <w:p>
+      <w:pPr>
+        <w:spacing w:after="0"/>
+        <w:jc w:val="both"/>
+      </w:pPr>
+      <w:r>
+        <w:t xml:space="preserve">Per gestire tutte le procedure e tutti i cambiamenti del nostro progetto </w:t>
+      </w:r>
+      <w:r>
+        <w:t xml:space="preserve">è obbligatorio utilizzare </w:t>
+      </w:r>
+      <w:proofErr w:type="spellStart"/>
+      <w:r>
+        <w:t>Github</w:t>
+      </w:r>
+      <w:proofErr w:type="spellEnd"/>
+      <w:r>
+        <w:t xml:space="preserve">, gestore di configurazione online distribuito che permette ad ognuno di avere una propria </w:t>
+      </w:r>
+      <w:proofErr w:type="spellStart"/>
+      <w:r>
+        <w:t>local</w:t>
+      </w:r>
+      <w:proofErr w:type="spellEnd"/>
+      <w:r>
+        <w:t xml:space="preserve"> repo</w:t>
+      </w:r>
+      <w:r>
+        <w:t>sitory</w:t>
+      </w:r>
+      <w:r>
+        <w:t>.</w:t>
+      </w:r>
+      <w:r>
+        <w:t xml:space="preserve"> </w:t>
+      </w:r>
+    </w:p>
+    <w:p>
+      <w:pPr>
+        <w:spacing w:after="0"/>
+        <w:jc w:val="both"/>
+      </w:pPr>
+      <w:r>
+        <w:t xml:space="preserve">Riguardo la documentazione è necessaria chiarezza sia per le classi aggiunte, che devono essere esplicitamente e dettagliatamente spiegate, sia per tutti i </w:t>
+      </w:r>
+      <w:proofErr w:type="spellStart"/>
+      <w:r>
+        <w:t>commit</w:t>
+      </w:r>
+      <w:proofErr w:type="spellEnd"/>
+      <w:r>
+        <w:t xml:space="preserve"> che vengono fatti.</w:t>
+      </w:r>
+    </w:p>
+    <w:p>
+      <w:pPr>
+        <w:spacing w:after="0"/>
+        <w:jc w:val="both"/>
+      </w:pPr>
+      <w:r>
+        <w:t>La tracciabilità delle modifiche deve essere un aspetto fondamentale.</w:t>
+      </w:r>
+    </w:p>
+    <w:p>
+      <w:pPr>
+        <w:spacing w:after="0"/>
+        <w:jc w:val="both"/>
+      </w:pPr>
+      <w:r>
+        <w:t xml:space="preserve">Nel titolo del </w:t>
+      </w:r>
+      <w:proofErr w:type="spellStart"/>
+      <w:r>
+        <w:t>commit</w:t>
+      </w:r>
+      <w:proofErr w:type="spellEnd"/>
+      <w:r>
+        <w:t xml:space="preserve"> ci deve essere in generale le modifiche principali apportate e cosa cambia di importante rispetto alla versione precedente. Nella descrizione è possibile aggiungere tutte le informazioni necessarie che descrivono i cambiamenti passo per passo, le scelte effettuate, le motivazioni se necessarie e tutto ciò che permette di comprendere al meglio da una persona esterna cosa è cambiato in seguito alle modifiche effettuate.</w:t>
+      </w:r>
+    </w:p>
+    <w:p>
+      <w:pPr>
+        <w:spacing w:after="0"/>
+        <w:jc w:val="both"/>
+      </w:pPr>
+      <w:r>
+        <w:t xml:space="preserve">La documentazione è da consegnare necessariamente in seguito al cambiamento del macro argomento su cui stiamo lavorando. </w:t>
+      </w:r>
+    </w:p>
+    <w:p>
+      <w:pPr>
+        <w:spacing w:after="0"/>
+        <w:jc w:val="both"/>
+      </w:pPr>
+      <w:r>
+        <w:t xml:space="preserve">È obbligatorio effettuare </w:t>
+      </w:r>
+      <w:proofErr w:type="spellStart"/>
+      <w:r>
+        <w:t>commit</w:t>
+      </w:r>
+      <w:proofErr w:type="spellEnd"/>
+      <w:r>
+        <w:t xml:space="preserve"> frequenti, anche se piccoli, se rappresentano una modifica logica.</w:t>
+      </w:r>
+    </w:p>
+    <w:p>
+      <w:pPr>
+        <w:spacing w:after="0"/>
+        <w:jc w:val="both"/>
+      </w:pPr>
+      <w:r>
+        <w:t xml:space="preserve">Nel caso di modifiche con bug presenti (leggeri non che annullano il funzionamento generale)  è consigliato comunque fare </w:t>
+      </w:r>
+      <w:proofErr w:type="spellStart"/>
+      <w:r>
+        <w:t>commit</w:t>
+      </w:r>
+      <w:proofErr w:type="spellEnd"/>
+      <w:r>
+        <w:t>, magari aggiungendo la descrizione dell’errore. In questo modo ognuno è aggiornato alla versione corretta ed è possibile risolvere il bug o in parallelo allo sviluppo, oppure alla fine del progetto.</w:t>
+      </w:r>
+    </w:p>
+    <w:p>
+      <w:pPr>
+        <w:spacing w:after="0"/>
+        <w:jc w:val="both"/>
+      </w:pPr>
+      <w:r>
+        <w:t xml:space="preserve">È necessario avere almeno un </w:t>
+      </w:r>
+      <w:proofErr w:type="spellStart"/>
+      <w:r>
+        <w:t>commit</w:t>
+      </w:r>
+      <w:proofErr w:type="spellEnd"/>
+      <w:r>
+        <w:t xml:space="preserve"> al giorno da parte del gruppo per tenere la repository aggiornata.</w:t>
+      </w:r>
+    </w:p>
+    <w:p>
+      <w:pPr>
+        <w:spacing w:after="0"/>
+        <w:jc w:val="both"/>
+      </w:pPr>
+      <w:r>
+        <w:t>Ci si aspetta che ognuno rispetti le linee guida in maniera autonoma, nessun membro del gruppo verifica che gli altri membri rispettino le linee guida.</w:t>
+      </w:r>
+    </w:p>
+    <w:p>
+      <w:pPr>
+        <w:spacing w:after="0"/>
+        <w:jc w:val="both"/>
+      </w:pPr>
+      <w:r>
+        <w:t>Ogni membro del gruppo è responsabile della qualità e della coerenza del codice che scrive.</w:t>
+      </w:r>
+    </w:p>
+    <w:p>
+      <w:pPr>
+        <w:spacing w:after="0"/>
+        <w:jc w:val="both"/>
+      </w:pPr>
+    </w:p>
+    <w:p>
+      <w:pPr>
+        <w:spacing w:after="0"/>
+        <w:jc w:val="both"/>
+      </w:pPr>
+      <w:r>
+        <w:t>Il gruppo utilizza inoltre la tabella presente nel documento di specifica di requisiti per visualizzare lo stato di avanzamento del progetto, segnando la data di raggiungimento di determinati requisiti.</w:t>
+      </w:r>
+    </w:p>
+    <w:p>
+      <w:pPr>
+        <w:spacing w:after="0"/>
+        <w:jc w:val="both"/>
+      </w:pPr>
+    </w:p>
+    <w:p>
+      <w:pPr>
+        <w:spacing w:after="0"/>
+        <w:jc w:val="both"/>
+        <w:rPr>
+          <w:i/>
+          <w:iCs/>
+        </w:rPr>
+      </w:pPr>
+      <w:r>
+        <w:rPr>
+          <w:i/>
+          <w:iCs/>
+        </w:rPr>
+        <w:t>Standard utilizzati</w:t>
+      </w:r>
+    </w:p>
+    <w:p>
+      <w:pPr>
+        <w:spacing w:after="0"/>
+        <w:jc w:val="both"/>
+      </w:pPr>
+    </w:p>
+    <w:p>
+      <w:pPr>
+        <w:spacing w:after="0"/>
+        <w:jc w:val="both"/>
+      </w:pPr>
+      <w:r>
+        <w:t>Gli standard di programmazione sono quelli classici di java definite da Oracle.</w:t>
+      </w:r>
+      <w:r>
+        <w:t xml:space="preserve"> </w:t>
+      </w:r>
+    </w:p>
+    <w:p>
+      <w:pPr>
+        <w:spacing w:after="0"/>
+        <w:jc w:val="both"/>
+      </w:pPr>
+      <w:r>
+        <w:t xml:space="preserve">Vengono rispettate convenzioni su classi, attributi e metodi. </w:t>
+      </w:r>
+    </w:p>
+    <w:p>
+      <w:pPr>
+        <w:spacing w:after="0"/>
+        <w:jc w:val="both"/>
+      </w:pPr>
+      <w:r>
+        <w:t xml:space="preserve">Ogni classe deve </w:t>
+      </w:r>
+      <w:r>
+        <w:t>essere introdotta da una descrizione generale del suo funzionamento, degli autori  e della versione che abbiamo modificato.</w:t>
+      </w:r>
+    </w:p>
+    <w:p>
+      <w:pPr>
+        <w:spacing w:after="0"/>
+        <w:jc w:val="both"/>
+      </w:pPr>
+      <w:r>
+        <w:t>Per ogni metodo invece è necessaria una descrizione generica e una spiegazione dettagliata dei parametri utilizzati e del tipo di ritorno della funzione.</w:t>
+      </w:r>
+    </w:p>
+    <w:p>
+      <w:pPr>
+        <w:spacing w:after="0"/>
+        <w:jc w:val="both"/>
+      </w:pPr>
+      <w:r>
+        <w:t xml:space="preserve">Queste funzioni avvengono tramite </w:t>
+      </w:r>
+      <w:proofErr w:type="spellStart"/>
+      <w:r>
+        <w:t>Javadoc</w:t>
+      </w:r>
+      <w:proofErr w:type="spellEnd"/>
+      <w:r>
+        <w:t xml:space="preserve"> (/**)</w:t>
+      </w:r>
+    </w:p>
+    <w:p>
+      <w:pPr>
+        <w:spacing w:after="0"/>
+        <w:jc w:val="both"/>
+      </w:pPr>
+      <w:r>
+        <w:t>Commenti secondari utili per la comprensione devono essere inseriti all’interno del metodo stesso, nel modo // o /*.</w:t>
+      </w:r>
+    </w:p>
+    <w:p>
+      <w:pPr>
+        <w:spacing w:after="0"/>
+        <w:jc w:val="both"/>
+      </w:pPr>
+    </w:p>
+    <w:p>
+      <w:pPr>
+        <w:spacing w:after="0"/>
+        <w:jc w:val="both"/>
+        <w:rPr>
+          <w:i/>
+          <w:iCs/>
+        </w:rPr>
+      </w:pPr>
+      <w:r>
+        <w:rPr>
+          <w:i/>
+          <w:iCs/>
+        </w:rPr>
+        <w:t>Gestione del database</w:t>
+      </w:r>
+    </w:p>
+    <w:p>
+      <w:pPr>
+        <w:spacing w:after="0"/>
+        <w:jc w:val="both"/>
+        <w:rPr>
+          <w:i/>
+          <w:iCs/>
+        </w:rPr>
+      </w:pPr>
+    </w:p>
+    <w:p>
+      <w:pPr>
+        <w:spacing w:after="0"/>
+        <w:jc w:val="both"/>
+      </w:pPr>
+      <w:r>
+        <w:t>Per la gestione dei dati</w:t>
+      </w:r>
+      <w:r>
+        <w:t xml:space="preserve"> </w:t>
+      </w:r>
+      <w:r>
+        <w:t>si utilizza F</w:t>
+      </w:r>
+      <w:r>
+        <w:t>irebase</w:t>
+      </w:r>
+      <w:r>
+        <w:t xml:space="preserve"> Realtime Database</w:t>
+      </w:r>
+      <w:r>
+        <w:t>, basato su linguaggio NOSQL.</w:t>
+      </w:r>
+    </w:p>
+    <w:p>
+      <w:pPr>
+        <w:spacing w:after="0"/>
+        <w:jc w:val="both"/>
+      </w:pPr>
+      <w:r>
+        <w:t>Questo permette l’accesso simultaneo di più utenti e l’aggiornamento in tempo reale.</w:t>
+      </w:r>
+    </w:p>
+    <w:p>
+      <w:pPr>
+        <w:spacing w:after="0"/>
+        <w:jc w:val="both"/>
+      </w:pPr>
+      <w:r>
+        <w:t>Si utilizzano regole standard (preimpostate da Firebase)</w:t>
+      </w:r>
+      <w:r>
+        <w:t xml:space="preserve">, database privato, in modo che solo i membri interni al gruppo possano visualizzare e modificare. </w:t>
+      </w:r>
+    </w:p>
+    <w:p>
+      <w:pPr>
+        <w:spacing w:after="0"/>
+        <w:jc w:val="both"/>
+      </w:pPr>
+      <w:r>
+        <w:t>Il ruolo assegnato al service account di firebase è quello minimo, utile solo per leggere e scrivere sul database.</w:t>
+      </w:r>
+    </w:p>
+    <w:p>
+      <w:pPr>
+        <w:spacing w:after="0"/>
+        <w:jc w:val="both"/>
+      </w:pPr>
+      <w:r>
+        <w:t>Non è gestita parte di password criptate</w:t>
+      </w:r>
+      <w:r>
+        <w:t>; in un contesto professionale sarebbe da implementare.</w:t>
+      </w:r>
+    </w:p>
+    <w:p>
+      <w:pPr>
+        <w:spacing w:after="0"/>
+        <w:jc w:val="both"/>
+      </w:pPr>
+    </w:p>
+    <w:p>
+      <w:pPr>
+        <w:spacing w:after="0"/>
+        <w:jc w:val="both"/>
+      </w:pPr>
+      <w:r>
+        <w:lastRenderedPageBreak/>
+        <w:t xml:space="preserve">Tramite questo </w:t>
+      </w:r>
+      <w:r>
+        <w:t>si gestisce</w:t>
+      </w:r>
+      <w:r>
+        <w:t xml:space="preserve"> tutta la parte di salvataggio, autenticazione, controlli.</w:t>
+      </w:r>
+    </w:p>
+    <w:p>
+      <w:pPr>
+        <w:spacing w:after="0"/>
+        <w:jc w:val="both"/>
+      </w:pPr>
+      <w:r>
+        <w:t>Si prevedono tre nodi principali</w:t>
+      </w:r>
+      <w:r>
+        <w:t xml:space="preserve">: uno che rappresenta gli </w:t>
+      </w:r>
       <w:r>
         <w:rPr>
           <w:b/>
           <w:bCs/>
         </w:rPr>
-        <w:t>Product owner</w:t>
-      </w:r>
-      <w:r>
-        <w:t xml:space="preserve"> </w:t>
-      </w:r>
-      <w:r>
-        <w:t>-</w:t>
-      </w:r>
-      <w:r>
-        <w:t xml:space="preserve"> Davide Mascheretti </w:t>
-      </w:r>
-      <w:r>
-        <w:t>: responsabile della gestione generale del progetto, delle risorse e delle funzionalità principali.</w:t>
-      </w:r>
-    </w:p>
-    <w:p>
-      <w:pPr>
-        <w:spacing w:after="0"/>
-        <w:jc w:val="both"/>
-      </w:pPr>
+        <w:t>utenti</w:t>
+      </w:r>
+      <w:r>
+        <w:t xml:space="preserve">, uno che rappresenta le </w:t>
+      </w:r>
       <w:r>
         <w:rPr>
           <w:b/>
           <w:bCs/>
         </w:rPr>
-        <w:t>Scrum master</w:t>
+        <w:t>prenotazioni</w:t>
+      </w:r>
+      <w:r>
+        <w:t xml:space="preserve"> e uno che rappresenta le </w:t>
+      </w:r>
+      <w:r>
+        <w:t>colonnine.</w:t>
+      </w:r>
+    </w:p>
+    <w:p>
+      <w:pPr>
+        <w:spacing w:after="0"/>
+        <w:jc w:val="both"/>
+      </w:pPr>
+      <w:r>
+        <w:t xml:space="preserve">La gestione dei </w:t>
+      </w:r>
+      <w:r>
+        <w:t>sotto nodi</w:t>
+      </w:r>
+      <w:r>
+        <w:t xml:space="preserve"> sarà definita in maniera più chiara in fase di implementazione.</w:t>
+      </w:r>
+    </w:p>
+    <w:p>
+      <w:pPr>
+        <w:spacing w:after="0"/>
+        <w:jc w:val="both"/>
+        <w:rPr>
+          <w:i/>
+          <w:iCs/>
+        </w:rPr>
+      </w:pPr>
+    </w:p>
+    <w:p>
+      <w:pPr>
+        <w:spacing w:after="0"/>
+        <w:jc w:val="both"/>
+        <w:rPr>
+          <w:i/>
+          <w:iCs/>
+        </w:rPr>
+      </w:pPr>
+      <w:r>
+        <w:rPr>
+          <w:i/>
+          <w:iCs/>
+        </w:rPr>
+        <w:t>Interfaccia grafica</w:t>
+      </w:r>
+    </w:p>
+    <w:p>
+      <w:pPr>
+        <w:spacing w:after="0"/>
+        <w:jc w:val="both"/>
+        <w:rPr>
+          <w:i/>
+          <w:iCs/>
+        </w:rPr>
+      </w:pPr>
+    </w:p>
+    <w:p>
+      <w:pPr>
+        <w:spacing w:after="0"/>
+        <w:jc w:val="both"/>
+      </w:pPr>
+      <w:r>
+        <w:t xml:space="preserve">Per la parte grafica </w:t>
+      </w:r>
+      <w:r>
+        <w:t>si utilizza</w:t>
       </w:r>
       <w:r>
         <w:t xml:space="preserve"> </w:t>
       </w:r>
-      <w:r>
-        <w:t>-</w:t>
-      </w:r>
-      <w:r>
-        <w:t xml:space="preserve"> Tommaso Maistrello</w:t>
-      </w:r>
-      <w:r>
-        <w:t xml:space="preserve"> : responsabile del corretto svolgimento dell’approccio agile, della comunicazione nel team e risolutore di problemi di natura tecnica e non.</w:t>
-      </w:r>
-    </w:p>
-    <w:p>
-      <w:pPr>
-        <w:spacing w:after="0"/>
-        <w:jc w:val="both"/>
-      </w:pPr>
+      <w:proofErr w:type="spellStart"/>
       <w:r>
         <w:rPr>
           <w:b/>
           <w:bCs/>
         </w:rPr>
-        <w:t>Team di implementazione</w:t>
-      </w:r>
-      <w:r>
-        <w:t xml:space="preserve"> </w:t>
-      </w:r>
-      <w:r>
-        <w:t xml:space="preserve">- </w:t>
-      </w:r>
-      <w:r>
-        <w:t>Tommaso Maistrello, Davide Mascheretti, Claudio Morgera, Francesco Valenari</w:t>
-      </w:r>
-      <w:r>
-        <w:t xml:space="preserve"> : responsabili dello sviluppo del software e della documentazione.</w:t>
-      </w:r>
-    </w:p>
-    <w:p>
-      <w:pPr>
-        <w:spacing w:after="0"/>
-        <w:jc w:val="both"/>
-      </w:pPr>
-    </w:p>
-    <w:p>
-      <w:pPr>
-        <w:spacing w:after="0"/>
-        <w:jc w:val="both"/>
-      </w:pPr>
-      <w:r>
-        <w:t>Inoltre, a</w:t>
-      </w:r>
-      <w:r>
-        <w:t>ll’interno del team di implementazione</w:t>
-      </w:r>
-      <w:r>
-        <w:t>,</w:t>
-      </w:r>
-      <w:r>
-        <w:t xml:space="preserve"> i ruoli sono stati inoltre cos</w:t>
-      </w:r>
-      <w:r>
-        <w:t>ì</w:t>
-      </w:r>
-      <w:r>
-        <w:t xml:space="preserve"> ridefiniti.</w:t>
-      </w:r>
-    </w:p>
-    <w:p>
-      <w:pPr>
-        <w:spacing w:after="0"/>
-        <w:jc w:val="both"/>
-      </w:pPr>
-    </w:p>
-    <w:p>
-      <w:pPr>
-        <w:spacing w:after="0"/>
-        <w:jc w:val="both"/>
-      </w:pPr>
+        <w:t>Vaadin</w:t>
+      </w:r>
+      <w:proofErr w:type="spellEnd"/>
+      <w:r>
+        <w:t xml:space="preserve">. </w:t>
+      </w:r>
+    </w:p>
+    <w:p>
+      <w:pPr>
+        <w:spacing w:after="0"/>
+        <w:jc w:val="both"/>
+      </w:pPr>
+      <w:r>
+        <w:t xml:space="preserve">Oltre a gestire la parte </w:t>
+      </w:r>
+      <w:r>
+        <w:t>visiva delle interfacce (</w:t>
+      </w:r>
+      <w:r>
+        <w:t>già integrata</w:t>
+      </w:r>
+      <w:r>
+        <w:t>)</w:t>
+      </w:r>
+      <w:r>
+        <w:t xml:space="preserve">, </w:t>
+      </w:r>
+      <w:r>
+        <w:t xml:space="preserve">rende </w:t>
+      </w:r>
+      <w:r>
+        <w:t>più semplice il collegamento con la parte back end dell’applicazione.</w:t>
+      </w:r>
+    </w:p>
+    <w:p>
+      <w:pPr>
+        <w:spacing w:after="0"/>
+        <w:jc w:val="both"/>
+      </w:pPr>
+      <w:r>
+        <w:t xml:space="preserve">Per la gestione stili e colore di caratteri e in generale della parte web visiva abbiamo integrato </w:t>
+      </w:r>
+      <w:proofErr w:type="spellStart"/>
+      <w:r>
+        <w:t>Vaadin</w:t>
+      </w:r>
+      <w:proofErr w:type="spellEnd"/>
+      <w:r>
+        <w:t xml:space="preserve"> (che è limitato sotto tale punto di vista) con delle aggiunte </w:t>
+      </w:r>
+      <w:r>
+        <w:t xml:space="preserve">di file </w:t>
+      </w:r>
       <w:r>
         <w:rPr>
           <w:b/>
           <w:bCs/>
         </w:rPr>
-        <w:t>Frontend</w:t>
-      </w:r>
-      <w:r>
-        <w:t>: sviluppo interfaccia, mappa interattiva, passaggio tra pagine, menù.</w:t>
-      </w:r>
-    </w:p>
-    <w:p>
-      <w:pPr>
-        <w:spacing w:after="0"/>
-        <w:jc w:val="both"/>
-      </w:pPr>
+        <w:t>CSS</w:t>
+      </w:r>
+      <w:r>
+        <w:t xml:space="preserve"> e </w:t>
+      </w:r>
       <w:r>
         <w:rPr>
           <w:b/>
           <w:bCs/>
         </w:rPr>
-        <w:t>Backend</w:t>
-      </w:r>
+        <w:t>JavaScript</w:t>
+      </w:r>
+      <w:r>
+        <w:t>.</w:t>
+      </w:r>
+    </w:p>
+    <w:p>
+      <w:pPr>
+        <w:spacing w:after="0"/>
+        <w:jc w:val="both"/>
+      </w:pPr>
+      <w:r>
+        <w:t>Per la mappa si è optato</w:t>
+      </w:r>
+      <w:r>
+        <w:t xml:space="preserve"> per </w:t>
+      </w:r>
+      <w:proofErr w:type="spellStart"/>
       <w:r>
         <w:rPr>
           <w:b/>
           <w:bCs/>
         </w:rPr>
-        <w:t xml:space="preserve"> </w:t>
-      </w:r>
-      <w:r>
-        <w:rPr>
-          <w:b/>
-          <w:bCs/>
-        </w:rPr>
-        <w:t>+</w:t>
-      </w:r>
-      <w:r>
-        <w:rPr>
-          <w:b/>
-          <w:bCs/>
-        </w:rPr>
-        <w:t xml:space="preserve"> </w:t>
-      </w:r>
-      <w:r>
-        <w:rPr>
-          <w:b/>
-          <w:bCs/>
-        </w:rPr>
-        <w:t>Database</w:t>
-      </w:r>
-      <w:r>
-        <w:t>: gestione firebase Realtime Database, controlli utente e prenotazioni, salvataggio dati, sicurezza</w:t>
-      </w:r>
-    </w:p>
-    <w:p>
-      <w:pPr>
-        <w:spacing w:after="0"/>
-        <w:jc w:val="both"/>
-        <w:rPr>
-          <w:b/>
-          <w:bCs/>
-        </w:rPr>
-      </w:pPr>
-      <w:r>
-        <w:rPr>
-          <w:b/>
-          <w:bCs/>
-        </w:rPr>
-        <w:t xml:space="preserve">Testing: </w:t>
-      </w:r>
-    </w:p>
-    <w:p>
-      <w:pPr>
-        <w:spacing w:after="0"/>
-        <w:jc w:val="both"/>
-      </w:pPr>
-      <w:r>
-        <w:rPr>
-          <w:b/>
-          <w:bCs/>
-        </w:rPr>
-        <w:t>Documentazione</w:t>
-      </w:r>
-      <w:r>
-        <w:t>: project plan, diagrammi UML, informazioni generali.</w:t>
-      </w:r>
-    </w:p>
-    <w:p>
-      <w:pPr>
-        <w:spacing w:after="0"/>
-        <w:jc w:val="both"/>
-      </w:pPr>
-      <w:r>
-        <w:t xml:space="preserve">Le specifiche e l’assegnazione di questi ruoli all’interno del team sono </w:t>
-      </w:r>
-      <w:r>
-        <w:t>illustrate in maniera più dettagliata</w:t>
-      </w:r>
-      <w:r>
-        <w:t xml:space="preserve"> all’interno del paragrafo </w:t>
-      </w:r>
-      <w:r>
-        <w:rPr>
-          <w:u w:val="single"/>
-        </w:rPr>
-        <w:t>Personale</w:t>
+        <w:t>Leaflet</w:t>
+      </w:r>
+      <w:proofErr w:type="spellEnd"/>
+      <w:r>
+        <w:t xml:space="preserve">, un software open source che ci permette di usare mappe interattive senza troppi problemi (inizialmente </w:t>
+      </w:r>
+      <w:r>
+        <w:t xml:space="preserve">si era </w:t>
+      </w:r>
+      <w:r>
+        <w:t>pensato a</w:t>
+      </w:r>
+      <w:r>
+        <w:t>lle API di Google Maps</w:t>
+      </w:r>
+      <w:r>
+        <w:t xml:space="preserve"> ma la procedura di ottenimento della chiave era molto più complessa).</w:t>
+      </w:r>
+    </w:p>
+    <w:p>
+      <w:pPr>
+        <w:spacing w:after="0"/>
+        <w:jc w:val="both"/>
+      </w:pPr>
+    </w:p>
+    <w:p>
+      <w:pPr>
+        <w:spacing w:after="0"/>
+        <w:jc w:val="both"/>
+      </w:pPr>
+    </w:p>
+    <w:p>
+      <w:pPr>
+        <w:spacing w:after="0"/>
+        <w:jc w:val="both"/>
+      </w:pPr>
+      <w:r>
+        <w:t>Queste aggiunte rendono la nostra applicazione più professionale e, in un futuro, realmente utilizzabile</w:t>
       </w:r>
       <w:r>
         <w:t>.</w:t>
@@ -761,842 +2031,9 @@
         <w:spacing w:after="0"/>
         <w:jc w:val="both"/>
       </w:pPr>
-    </w:p>
-    <w:p>
-      <w:pPr>
-        <w:spacing w:after="0"/>
-        <w:jc w:val="both"/>
-      </w:pPr>
-      <w:r>
-        <w:t>Nonostante ciò, nel caso di necessità un membro del gruppo può contribuire alla collaborazione con il membro affidato a quel ruolo.</w:t>
-      </w:r>
-    </w:p>
-    <w:p>
-      <w:pPr>
-        <w:spacing w:after="0"/>
-        <w:jc w:val="both"/>
-      </w:pPr>
-      <w:r>
-        <w:t>La conoscenza deve essere utilizzata in maniera trasversale</w:t>
-      </w:r>
-      <w:r>
-        <w:t xml:space="preserve"> e il gruppo deve adottare un approccio collaborativo.</w:t>
-      </w:r>
-    </w:p>
-    <w:p>
-      <w:pPr>
-        <w:spacing w:after="0"/>
-        <w:jc w:val="both"/>
-      </w:pPr>
-      <w:r>
-        <w:t>La documentazione chiara e dettagliata è considerata responsabilità condivisa tra tutti i membri del gruppo, essa deve essere il compito di tutti.</w:t>
-      </w:r>
-    </w:p>
-    <w:p>
-      <w:pPr>
-        <w:spacing w:after="0"/>
-        <w:jc w:val="both"/>
-      </w:pPr>
-    </w:p>
-    <w:p>
-      <w:pPr>
-        <w:spacing w:after="0"/>
-        <w:jc w:val="both"/>
-      </w:pPr>
-      <w:r>
-        <w:t xml:space="preserve">La comunicazione quotidiana interna avviene tramite un gruppo Whatsapp </w:t>
-      </w:r>
-      <w:r>
-        <w:t>dedicato</w:t>
-      </w:r>
-      <w:r>
-        <w:t>, utilizzato per scambio di informazioni</w:t>
-      </w:r>
-      <w:r>
-        <w:t xml:space="preserve">, aggiornamenti, </w:t>
-      </w:r>
-      <w:r>
-        <w:t>domande inerenti al progetto o a problemi riscontrati.</w:t>
-      </w:r>
-    </w:p>
-    <w:p>
-      <w:pPr>
-        <w:spacing w:after="0"/>
-        <w:jc w:val="both"/>
-      </w:pPr>
-      <w:r>
-        <w:t>Sono previsti inoltre b</w:t>
-      </w:r>
-      <w:r>
-        <w:t xml:space="preserve">revi meeting principalmente non online per risolvere problemi </w:t>
-      </w:r>
-      <w:r>
-        <w:t xml:space="preserve">e </w:t>
-      </w:r>
-      <w:r>
-        <w:t xml:space="preserve">per </w:t>
-      </w:r>
-      <w:r>
-        <w:t xml:space="preserve">eventuali </w:t>
-      </w:r>
-      <w:r>
-        <w:t>chiarimenti</w:t>
-      </w:r>
-      <w:r>
-        <w:t>.</w:t>
-      </w:r>
-    </w:p>
-    <w:p>
-      <w:pPr>
-        <w:spacing w:after="0"/>
-        <w:jc w:val="both"/>
-      </w:pPr>
-      <w:r>
-        <w:t>Decisioni, urgenze e task vengono gestiti dal gruppo stesso durante i meeting settimanali, in cui si decide anche se è necessario un cambio di ruoli.</w:t>
-      </w:r>
-    </w:p>
-    <w:p>
-      <w:pPr>
-        <w:spacing w:after="0"/>
-        <w:jc w:val="both"/>
-      </w:pPr>
-      <w:r>
-        <w:t>La gestione delle attività che ogni membro svolge sul codice viene gestita tramite l’u</w:t>
-      </w:r>
-      <w:r>
-        <w:t xml:space="preserve">tilizzo di GitHub privato condiviso </w:t>
-      </w:r>
-      <w:r>
-        <w:t>con il gruppo.</w:t>
-      </w:r>
-    </w:p>
-    <w:p>
-      <w:pPr>
-        <w:spacing w:after="0"/>
-        <w:jc w:val="both"/>
-      </w:pPr>
-      <w:r>
-        <w:t xml:space="preserve">Esso è inoltre utilizzato per la tracciabilità e per la gestione delle </w:t>
-      </w:r>
-      <w:proofErr w:type="spellStart"/>
-      <w:r>
-        <w:t>issue</w:t>
-      </w:r>
-      <w:proofErr w:type="spellEnd"/>
-      <w:r>
-        <w:t>.</w:t>
-      </w:r>
-    </w:p>
-    <w:p>
-      <w:pPr>
-        <w:spacing w:after="0"/>
-        <w:jc w:val="both"/>
-      </w:pPr>
-      <w:r>
-        <w:t>La documentazione viene inizialmente caricata e modificata in un file condiviso in Google Drive per poi essere integrata ufficialmente nella repository.</w:t>
-      </w:r>
-    </w:p>
-    <w:p>
-      <w:pPr>
-        <w:spacing w:after="0"/>
-        <w:jc w:val="both"/>
-      </w:pPr>
-      <w:r>
-        <w:t>Questa tipologia di organizzazione permette ai membri del gruppo di avere una definita suddivisone dei ruoli, in cui ognuno è a conoscenza delle sue responsabilità al fine di avere una corretta evoluzione del progetto.</w:t>
-      </w:r>
-    </w:p>
-    <w:p>
-      <w:pPr>
-        <w:spacing w:after="0"/>
-        <w:jc w:val="both"/>
-      </w:pPr>
-      <w:r>
-        <w:t>È necessario lavoro costante da parte di tutto il team.</w:t>
-      </w:r>
-    </w:p>
-    <w:p>
-      <w:pPr>
-        <w:jc w:val="both"/>
-      </w:pPr>
-    </w:p>
-    <w:p>
-      <w:pPr>
-        <w:jc w:val="both"/>
-      </w:pPr>
-    </w:p>
-    <w:p>
-      <w:pPr>
-        <w:jc w:val="both"/>
-      </w:pPr>
-    </w:p>
-    <w:p>
-      <w:pPr>
-        <w:jc w:val="both"/>
-      </w:pPr>
-    </w:p>
-    <w:p>
-      <w:pPr>
-        <w:jc w:val="both"/>
-      </w:pPr>
-    </w:p>
-    <w:p>
-      <w:pPr>
-        <w:jc w:val="both"/>
-        <w:rPr>
-          <w:b/>
-          <w:bCs/>
-          <w:sz w:val="28"/>
-          <w:szCs w:val="28"/>
-        </w:rPr>
-      </w:pPr>
-      <w:r>
-        <w:rPr>
-          <w:b/>
-          <w:bCs/>
-          <w:sz w:val="28"/>
-          <w:szCs w:val="28"/>
-        </w:rPr>
-        <w:lastRenderedPageBreak/>
-        <w:t>STANDARD, LINEE GUIDE E PROCEDURE</w:t>
-      </w:r>
-    </w:p>
-    <w:p>
-      <w:pPr>
-        <w:jc w:val="both"/>
-        <w:rPr>
-          <w:i/>
-          <w:iCs/>
-        </w:rPr>
-      </w:pPr>
-      <w:r>
-        <w:rPr>
-          <w:i/>
-          <w:iCs/>
-        </w:rPr>
-        <w:t>Gestione codice</w:t>
-      </w:r>
-    </w:p>
-    <w:p>
-      <w:pPr>
-        <w:spacing w:after="0"/>
-        <w:jc w:val="both"/>
-      </w:pPr>
-      <w:r>
-        <w:t xml:space="preserve">Per gestire tutte le procedure e tutti i cambiamenti del nostro progetto </w:t>
-      </w:r>
-      <w:r>
-        <w:t xml:space="preserve">è obbligatorio utilizzare </w:t>
-      </w:r>
-      <w:proofErr w:type="spellStart"/>
-      <w:r>
-        <w:t>Github</w:t>
-      </w:r>
-      <w:proofErr w:type="spellEnd"/>
-      <w:r>
-        <w:t xml:space="preserve">, gestore di configurazione online distribuito che permette ad ognuno di avere una propria </w:t>
-      </w:r>
-      <w:proofErr w:type="spellStart"/>
-      <w:r>
-        <w:t>local</w:t>
-      </w:r>
-      <w:proofErr w:type="spellEnd"/>
-      <w:r>
-        <w:t xml:space="preserve"> repo</w:t>
-      </w:r>
-      <w:r>
-        <w:t>sitory</w:t>
-      </w:r>
-      <w:r>
-        <w:t>.</w:t>
-      </w:r>
-      <w:r>
-        <w:t xml:space="preserve"> </w:t>
-      </w:r>
-    </w:p>
-    <w:p>
-      <w:pPr>
-        <w:spacing w:after="0"/>
-        <w:jc w:val="both"/>
-      </w:pPr>
-      <w:r>
-        <w:t xml:space="preserve">Riguardo la documentazione è necessaria chiarezza sia per le classi aggiunte, che devono essere esplicitamente e dettagliatamente spiegate, sia per tutti i </w:t>
-      </w:r>
-      <w:proofErr w:type="spellStart"/>
-      <w:r>
-        <w:t>commit</w:t>
-      </w:r>
-      <w:proofErr w:type="spellEnd"/>
-      <w:r>
-        <w:t xml:space="preserve"> che vengono fatti.</w:t>
-      </w:r>
-    </w:p>
-    <w:p>
-      <w:pPr>
-        <w:spacing w:after="0"/>
-        <w:jc w:val="both"/>
-      </w:pPr>
-      <w:r>
-        <w:t>La tracciabilità delle modifiche deve essere un aspetto fondamentale.</w:t>
-      </w:r>
-    </w:p>
-    <w:p>
-      <w:pPr>
-        <w:spacing w:after="0"/>
-        <w:jc w:val="both"/>
-      </w:pPr>
-      <w:r>
-        <w:t xml:space="preserve">Nel titolo del </w:t>
-      </w:r>
-      <w:proofErr w:type="spellStart"/>
-      <w:r>
-        <w:t>commit</w:t>
-      </w:r>
-      <w:proofErr w:type="spellEnd"/>
-      <w:r>
-        <w:t xml:space="preserve"> ci deve essere in generale le modifiche principali apportate e cosa cambia di importante rispetto alla versione precedente. Nella descrizione è possibile aggiungere tutte le informazioni necessarie che descrivono i cambiamenti passo per passo, le scelte effettuate, le motivazioni se necessarie e tutto ciò che permette di comprendere al meglio da una persona esterna cosa è cambiato in seguito alle modifiche effettuate.</w:t>
-      </w:r>
-    </w:p>
-    <w:p>
-      <w:pPr>
-        <w:spacing w:after="0"/>
-        <w:jc w:val="both"/>
-      </w:pPr>
-      <w:r>
-        <w:t xml:space="preserve">La documentazione è da consegnare necessariamente in seguito al cambiamento del macro argomento su cui stiamo lavorando. </w:t>
-      </w:r>
-    </w:p>
-    <w:p>
-      <w:pPr>
-        <w:spacing w:after="0"/>
-        <w:jc w:val="both"/>
-      </w:pPr>
-      <w:r>
-        <w:t xml:space="preserve">Non è necessario fare commenti se i cambiamenti sono ininfluenti sul funzionamento generale dell’applicazione, piuttosto meglio attendere e fare </w:t>
-      </w:r>
-      <w:proofErr w:type="spellStart"/>
-      <w:r>
-        <w:t>push</w:t>
-      </w:r>
-      <w:proofErr w:type="spellEnd"/>
-      <w:r>
-        <w:t xml:space="preserve"> una volta aggiunto qualcosa di realmente significativo.</w:t>
-      </w:r>
-    </w:p>
-    <w:p>
-      <w:pPr>
-        <w:spacing w:after="0"/>
-        <w:jc w:val="both"/>
-      </w:pPr>
-      <w:r>
-        <w:t xml:space="preserve">Nel caso di modifiche con bug presenti (leggeri non che annullano il funzionamento generale)  è consigliato comunque fare </w:t>
-      </w:r>
-      <w:proofErr w:type="spellStart"/>
-      <w:r>
-        <w:t>commit</w:t>
-      </w:r>
-      <w:proofErr w:type="spellEnd"/>
-      <w:r>
-        <w:t>, magari aggiungendo la descrizione dell’errore. In questo modo ognuno è aggiornato alla versione corretta ed è possibile risolvere il bug o in parallelo allo sviluppo, oppure alla fine del progetto.</w:t>
-      </w:r>
-    </w:p>
-    <w:p>
-      <w:pPr>
-        <w:spacing w:after="0"/>
-        <w:jc w:val="both"/>
-      </w:pPr>
-      <w:r>
-        <w:t>Ci si aspetta che ognuno rispetti le linee guida in maniera autonoma, nessun membro del gruppo verifica che gli altri membri rispettino le linee guida.</w:t>
-      </w:r>
-    </w:p>
-    <w:p>
-      <w:pPr>
-        <w:spacing w:after="0"/>
-        <w:jc w:val="both"/>
-      </w:pPr>
-      <w:r>
-        <w:t>Ogni membro del gruppo è responsabile della qualità e della coerenza del codice che scrive.</w:t>
-      </w:r>
-    </w:p>
-    <w:p>
-      <w:pPr>
-        <w:spacing w:after="0"/>
-        <w:jc w:val="both"/>
-      </w:pPr>
-    </w:p>
-    <w:p>
-      <w:pPr>
-        <w:spacing w:after="0"/>
-        <w:jc w:val="both"/>
-      </w:pPr>
-      <w:r>
-        <w:t>Il gruppo utilizza inoltre la tabella presente nel documento di specifica di requisiti per visualizzare lo stato di avanzamento del progetto, segnando la data di raggiungimento di determinati requisiti.</w:t>
-      </w:r>
-    </w:p>
-    <w:p>
-      <w:pPr>
-        <w:spacing w:after="0"/>
-        <w:jc w:val="both"/>
-      </w:pPr>
-    </w:p>
-    <w:p>
-      <w:pPr>
-        <w:spacing w:after="0"/>
-        <w:jc w:val="both"/>
-        <w:rPr>
-          <w:i/>
-          <w:iCs/>
-        </w:rPr>
-      </w:pPr>
-      <w:r>
-        <w:rPr>
-          <w:i/>
-          <w:iCs/>
-        </w:rPr>
-        <w:t>Standard utilizzati</w:t>
-      </w:r>
-    </w:p>
-    <w:p>
-      <w:pPr>
-        <w:spacing w:after="0"/>
-        <w:jc w:val="both"/>
-      </w:pPr>
-    </w:p>
-    <w:p>
-      <w:pPr>
-        <w:spacing w:after="0"/>
-        <w:jc w:val="both"/>
-      </w:pPr>
-      <w:r>
-        <w:t>Gli standard di programmazione sono quelli classici di java definite da Oracle.</w:t>
-      </w:r>
-      <w:r>
-        <w:t xml:space="preserve"> </w:t>
-      </w:r>
-    </w:p>
-    <w:p>
-      <w:pPr>
-        <w:spacing w:after="0"/>
-        <w:jc w:val="both"/>
-      </w:pPr>
-      <w:r>
-        <w:t xml:space="preserve">Vengono rispettate convenzioni su classi, attributi e metodi. </w:t>
-      </w:r>
-    </w:p>
-    <w:p>
-      <w:pPr>
-        <w:spacing w:after="0"/>
-        <w:jc w:val="both"/>
-      </w:pPr>
-      <w:r>
-        <w:t xml:space="preserve">Ogni classe deve </w:t>
-      </w:r>
-      <w:r>
-        <w:t>essere introdotta da una descrizione generale del suo funzionamento, degli autori  e della versione che abbiamo modificato.</w:t>
-      </w:r>
-    </w:p>
-    <w:p>
-      <w:pPr>
-        <w:spacing w:after="0"/>
-        <w:jc w:val="both"/>
-      </w:pPr>
-      <w:r>
-        <w:t>Per ogni metodo invece è necessaria una descrizione generica e una spiegazione dettagliata dei parametri utilizzati e del tipo di ritorno della funzione.</w:t>
-      </w:r>
-    </w:p>
-    <w:p>
-      <w:pPr>
-        <w:spacing w:after="0"/>
-        <w:jc w:val="both"/>
-      </w:pPr>
-      <w:r>
-        <w:t xml:space="preserve">Queste funzioni avvengono tramite </w:t>
-      </w:r>
-      <w:proofErr w:type="spellStart"/>
-      <w:r>
-        <w:t>Javadoc</w:t>
-      </w:r>
-      <w:proofErr w:type="spellEnd"/>
-      <w:r>
-        <w:t xml:space="preserve"> (/**)</w:t>
-      </w:r>
-    </w:p>
-    <w:p>
-      <w:pPr>
-        <w:spacing w:after="0"/>
-        <w:jc w:val="both"/>
-      </w:pPr>
-      <w:r>
-        <w:t>Commenti secondari utili per la comprensione devono essere inseriti all’interno del metodo stesso, nel modo // o /*.</w:t>
-      </w:r>
-    </w:p>
-    <w:p>
-      <w:pPr>
-        <w:spacing w:after="0"/>
-        <w:jc w:val="both"/>
-      </w:pPr>
-    </w:p>
-    <w:p>
-      <w:pPr>
-        <w:spacing w:after="0"/>
-        <w:jc w:val="both"/>
-        <w:rPr>
-          <w:i/>
-          <w:iCs/>
-        </w:rPr>
-      </w:pPr>
-      <w:r>
-        <w:rPr>
-          <w:i/>
-          <w:iCs/>
-        </w:rPr>
-        <w:t>Gestione del database</w:t>
-      </w:r>
-    </w:p>
-    <w:p>
-      <w:pPr>
-        <w:spacing w:after="0"/>
-        <w:jc w:val="both"/>
-      </w:pPr>
-      <w:r>
-        <w:t>Per la gestione dei dati</w:t>
-      </w:r>
-      <w:r>
-        <w:t xml:space="preserve"> </w:t>
-      </w:r>
-      <w:r>
-        <w:t>si utilizza F</w:t>
-      </w:r>
-      <w:r>
-        <w:t>irebase</w:t>
-      </w:r>
-      <w:r>
-        <w:t xml:space="preserve"> Realtime Database</w:t>
-      </w:r>
-      <w:r>
-        <w:t>, basato su linguaggio NOSQL.</w:t>
-      </w:r>
-    </w:p>
-    <w:p>
-      <w:pPr>
-        <w:spacing w:after="0"/>
-        <w:jc w:val="both"/>
-      </w:pPr>
-      <w:r>
-        <w:t>Questo permette l’accesso simultaneo di più utenti e l’aggiornamento in tempo reale.</w:t>
-      </w:r>
-    </w:p>
-    <w:p>
-      <w:pPr>
-        <w:spacing w:after="0"/>
-        <w:jc w:val="both"/>
-      </w:pPr>
-      <w:r>
-        <w:t>Si utilizzano</w:t>
-      </w:r>
-      <w:r>
-        <w:t xml:space="preserve"> regole standard (preimpostate da Firebase)</w:t>
-      </w:r>
-      <w:r>
-        <w:t xml:space="preserve">, database privato, in modo che solo i membri interni al gruppo possano visualizzare e modificare. </w:t>
-      </w:r>
-    </w:p>
-    <w:p>
-      <w:pPr>
-        <w:spacing w:after="0"/>
-        <w:jc w:val="both"/>
-      </w:pPr>
-      <w:r>
-        <w:t>Il ruolo assegnato al service account di firebase è quello minimo, utile solo per leggere e scrivere sul database.</w:t>
-      </w:r>
-    </w:p>
-    <w:p>
-      <w:pPr>
-        <w:spacing w:after="0"/>
-        <w:jc w:val="both"/>
-      </w:pPr>
-      <w:r>
-        <w:t>Non è gestita parte di password criptate</w:t>
-      </w:r>
-      <w:r>
-        <w:t>; in un contesto professionale sarebbe da implementare.</w:t>
-      </w:r>
-    </w:p>
-    <w:p>
-      <w:pPr>
-        <w:spacing w:after="0"/>
-        <w:jc w:val="both"/>
-      </w:pPr>
-    </w:p>
-    <w:p>
-      <w:pPr>
-        <w:spacing w:after="0"/>
-        <w:jc w:val="both"/>
-      </w:pPr>
-      <w:r>
-        <w:lastRenderedPageBreak/>
-        <w:t xml:space="preserve">Tramite questo </w:t>
-      </w:r>
-      <w:r>
-        <w:t>si gestisce</w:t>
-      </w:r>
-      <w:r>
-        <w:t xml:space="preserve"> tutta la parte di salvataggio, autenticazione, controlli.</w:t>
-      </w:r>
-    </w:p>
-    <w:p>
-      <w:pPr>
-        <w:spacing w:after="0"/>
-        <w:jc w:val="both"/>
-      </w:pPr>
-      <w:r>
-        <w:t>Si prevedono tre nodi principali</w:t>
-      </w:r>
-      <w:r>
-        <w:t xml:space="preserve">: uno che rappresenta gli </w:t>
-      </w:r>
-      <w:r>
-        <w:rPr>
-          <w:b/>
-          <w:bCs/>
-        </w:rPr>
-        <w:t>utenti</w:t>
-      </w:r>
-      <w:r>
-        <w:t xml:space="preserve">, uno che rappresenta le </w:t>
-      </w:r>
-      <w:r>
-        <w:rPr>
-          <w:b/>
-          <w:bCs/>
-        </w:rPr>
-        <w:t>prenotazioni</w:t>
-      </w:r>
-      <w:r>
-        <w:t xml:space="preserve"> e uno che rappresenta le </w:t>
-      </w:r>
-      <w:r>
-        <w:t>colonnine.</w:t>
-      </w:r>
-    </w:p>
-    <w:p>
-      <w:pPr>
-        <w:spacing w:after="0"/>
-        <w:jc w:val="both"/>
-      </w:pPr>
-      <w:r>
-        <w:t xml:space="preserve">La gestione dei </w:t>
-      </w:r>
-      <w:r>
-        <w:t>sotto nodi</w:t>
-      </w:r>
-      <w:r>
-        <w:t xml:space="preserve"> sarà definita in maniera più chiara in fase di implementazione.</w:t>
-      </w:r>
-    </w:p>
-    <w:p>
-      <w:pPr>
-        <w:spacing w:after="0"/>
-        <w:jc w:val="both"/>
-        <w:rPr>
-          <w:i/>
-          <w:iCs/>
-        </w:rPr>
-      </w:pPr>
-    </w:p>
-    <w:p>
-      <w:pPr>
-        <w:spacing w:after="0"/>
-        <w:jc w:val="both"/>
-        <w:rPr>
-          <w:i/>
-          <w:iCs/>
-        </w:rPr>
-      </w:pPr>
-      <w:r>
-        <w:rPr>
-          <w:i/>
-          <w:iCs/>
-        </w:rPr>
-        <w:t>Interfaccia grafica</w:t>
-      </w:r>
-    </w:p>
-    <w:p>
-      <w:pPr>
-        <w:spacing w:after="0"/>
-        <w:jc w:val="both"/>
-        <w:rPr>
-          <w:i/>
-          <w:iCs/>
-        </w:rPr>
-      </w:pPr>
-    </w:p>
-    <w:p>
-      <w:pPr>
-        <w:spacing w:after="0"/>
-        <w:jc w:val="both"/>
-      </w:pPr>
-      <w:r>
-        <w:t xml:space="preserve">Per la parte grafica </w:t>
-      </w:r>
-      <w:r>
-        <w:t>si utilizza</w:t>
-      </w:r>
-      <w:r>
-        <w:t xml:space="preserve"> </w:t>
-      </w:r>
-      <w:proofErr w:type="spellStart"/>
-      <w:r>
-        <w:rPr>
-          <w:b/>
-          <w:bCs/>
-        </w:rPr>
-        <w:t>Vaadin</w:t>
-      </w:r>
-      <w:proofErr w:type="spellEnd"/>
-      <w:r>
-        <w:t xml:space="preserve">. </w:t>
-      </w:r>
-    </w:p>
-    <w:p>
-      <w:pPr>
-        <w:spacing w:after="0"/>
-        <w:jc w:val="both"/>
-      </w:pPr>
-      <w:r>
-        <w:t xml:space="preserve">Oltre a gestire la parte </w:t>
-      </w:r>
-      <w:r>
-        <w:t>visiva delle interfacce (</w:t>
-      </w:r>
-      <w:r>
-        <w:t>già integrata</w:t>
-      </w:r>
-      <w:r>
-        <w:t>)</w:t>
-      </w:r>
-      <w:r>
-        <w:t xml:space="preserve">, </w:t>
-      </w:r>
-      <w:r>
-        <w:t xml:space="preserve">rende </w:t>
-      </w:r>
-      <w:r>
-        <w:t>più semplice il collegamento con la parte back end dell’applicazione.</w:t>
-      </w:r>
-    </w:p>
-    <w:p>
-      <w:pPr>
-        <w:spacing w:after="0"/>
-        <w:jc w:val="both"/>
-      </w:pPr>
-      <w:r>
-        <w:t xml:space="preserve">Per la gestione stili e colore di caratteri e in generale della parte web visiva abbiamo integrato </w:t>
-      </w:r>
-      <w:proofErr w:type="spellStart"/>
-      <w:r>
-        <w:t>Vaadin</w:t>
-      </w:r>
-      <w:proofErr w:type="spellEnd"/>
-      <w:r>
-        <w:t xml:space="preserve"> (che è limitato sotto tale punto di vista) con delle aggiunte </w:t>
-      </w:r>
-      <w:r>
-        <w:t xml:space="preserve">di file </w:t>
-      </w:r>
-      <w:r>
-        <w:rPr>
-          <w:b/>
-          <w:bCs/>
-        </w:rPr>
-        <w:t>CSS</w:t>
-      </w:r>
-      <w:r>
-        <w:t xml:space="preserve"> e </w:t>
-      </w:r>
-      <w:r>
-        <w:rPr>
-          <w:b/>
-          <w:bCs/>
-        </w:rPr>
-        <w:t>JavaScript</w:t>
-      </w:r>
-      <w:r>
-        <w:t>.</w:t>
-      </w:r>
-    </w:p>
-    <w:p>
-      <w:pPr>
-        <w:spacing w:after="0"/>
-        <w:jc w:val="both"/>
-      </w:pPr>
-      <w:r>
-        <w:t>Per la mappa si è optato</w:t>
-      </w:r>
-      <w:r>
-        <w:t xml:space="preserve"> per </w:t>
-      </w:r>
-      <w:proofErr w:type="spellStart"/>
-      <w:r>
-        <w:rPr>
-          <w:b/>
-          <w:bCs/>
-        </w:rPr>
-        <w:t>Leaflet</w:t>
-      </w:r>
-      <w:proofErr w:type="spellEnd"/>
-      <w:r>
-        <w:t xml:space="preserve">, un software open source che ci permette di usare mappe interattive senza troppi problemi (inizialmente </w:t>
-      </w:r>
-      <w:r>
-        <w:t xml:space="preserve">si era </w:t>
-      </w:r>
-      <w:r>
-        <w:t>pensato a</w:t>
-      </w:r>
-      <w:r>
-        <w:t>lle API di Google Maps</w:t>
-      </w:r>
-      <w:r>
-        <w:t xml:space="preserve"> ma la procedura di ottenimento della chiave era molto più complessa).</w:t>
-      </w:r>
-    </w:p>
-    <w:p>
-      <w:pPr>
-        <w:spacing w:after="0"/>
-        <w:jc w:val="both"/>
-      </w:pPr>
-    </w:p>
-    <w:p>
-      <w:pPr>
-        <w:spacing w:after="0"/>
-        <w:jc w:val="both"/>
-      </w:pPr>
-    </w:p>
-    <w:p>
-      <w:pPr>
-        <w:spacing w:after="0"/>
-        <w:jc w:val="both"/>
-      </w:pPr>
-      <w:r>
-        <w:t>Queste aggiunte rendono la nostra applicazione più professionale e, in un futuro, realmente utilizzabile</w:t>
-      </w:r>
-      <w:r>
-        <w:t>.</w:t>
-      </w:r>
-    </w:p>
-    <w:p>
-      <w:pPr>
-        <w:spacing w:after="0"/>
-        <w:jc w:val="both"/>
-      </w:pPr>
       <w:r>
         <w:t>È infatti facilmente scalabile: si possono aggiungere nuovi nodi e funzionalità mantenendo il design implementato dal team.</w:t>
       </w:r>
-    </w:p>
-    <w:p>
-      <w:pPr>
-        <w:jc w:val="both"/>
-      </w:pPr>
     </w:p>
     <w:p>
       <w:pPr>
@@ -2378,6 +2815,9 @@
             <w:r>
               <w:t>Pianificare durante la sessione di esame degli sprint più brevi e leggeri, senza implementare funzionalità troppo complesse</w:t>
             </w:r>
+            <w:r>
+              <w:t>.</w:t>
+            </w:r>
           </w:p>
         </w:tc>
       </w:tr>
@@ -2482,6 +2922,9 @@
             <w:r>
               <w:t>Cercare informazioni online prima di iniziare con l’implementazione vera e propria</w:t>
             </w:r>
+            <w:r>
+              <w:t>.</w:t>
+            </w:r>
           </w:p>
         </w:tc>
       </w:tr>
@@ -2517,6 +2960,7 @@
                 <w:b/>
                 <w:bCs/>
               </w:rPr>
+              <w:lastRenderedPageBreak/>
               <w:t>Tecnico</w:t>
             </w:r>
           </w:p>
@@ -2588,6 +3032,9 @@
             <w:r>
               <w:t>Ricerche online e collaborazione tra membri per velocizzare il processo</w:t>
             </w:r>
+            <w:r>
+              <w:t>.</w:t>
+            </w:r>
           </w:p>
         </w:tc>
       </w:tr>
@@ -2623,7 +3070,6 @@
                 <w:b/>
                 <w:bCs/>
               </w:rPr>
-              <w:lastRenderedPageBreak/>
               <w:t>Sicurezza</w:t>
             </w:r>
           </w:p>
@@ -3032,31 +3478,6 @@
     <w:p>
       <w:pPr>
         <w:jc w:val="both"/>
-      </w:pPr>
-    </w:p>
-    <w:p>
-      <w:pPr>
-        <w:jc w:val="both"/>
-      </w:pPr>
-    </w:p>
-    <w:p>
-      <w:pPr>
-        <w:jc w:val="both"/>
-      </w:pPr>
-    </w:p>
-    <w:p>
-      <w:pPr>
-        <w:jc w:val="both"/>
-      </w:pPr>
-    </w:p>
-    <w:p>
-      <w:pPr>
-        <w:jc w:val="both"/>
-      </w:pPr>
-    </w:p>
-    <w:p>
-      <w:pPr>
-        <w:jc w:val="both"/>
         <w:rPr>
           <w:rFonts w:cstheme="minorHAnsi"/>
           <w:b/>
@@ -3073,6 +3494,7 @@
           <w:sz w:val="28"/>
           <w:szCs w:val="28"/>
         </w:rPr>
+        <w:lastRenderedPageBreak/>
         <w:t>PERSONALE</w:t>
       </w:r>
     </w:p>
@@ -3081,91 +3503,242 @@
         <w:jc w:val="both"/>
       </w:pPr>
       <w:r>
-        <w:t>Il progetto prevede il coinvolgimento costante di quattro membri, studenti del corso di laurea in Ingegneria Informatica. Tutti possiedono competenze nello sviluppo software in Java e nell’utilizzo dell’ambiente di sviluppo Eclipse.</w:t>
-      </w:r>
-    </w:p>
-    <w:p>
-      <w:pPr>
-        <w:jc w:val="both"/>
-      </w:pPr>
-      <w:r>
-        <w:t>Non sono previsti costi per il personale, poiché si tratta di un progetto universitario a scopo formativo.</w:t>
-      </w:r>
-    </w:p>
-    <w:p>
-      <w:pPr>
-        <w:jc w:val="both"/>
-      </w:pPr>
-      <w:r>
-        <w:t>Ciascun componente del gruppo partecipa attivamente alla programmazione, con attività sia di Front End sia di Back End, secondo le proprie competenze. Per una migliore organizzazione del lavoro, i ruoli principali sono così assegnati:</w:t>
-      </w:r>
-    </w:p>
-    <w:p>
-      <w:pPr>
-        <w:jc w:val="both"/>
-      </w:pPr>
-      <w:r>
-        <w:t>[Davide Mascheretti] — Project Manager e Sviluppatore Back End</w:t>
-      </w:r>
-    </w:p>
-    <w:p>
-      <w:pPr>
-        <w:jc w:val="both"/>
-      </w:pPr>
-      <w:r>
-        <w:t>Coordina le attività del gruppo, pianifica le scadenze. Implementa la logica applicativa e gestisce l’integrazione tra moduli, servizi  e database contenenti i dati del progetto.</w:t>
-      </w:r>
-    </w:p>
-    <w:p>
-      <w:pPr>
-        <w:jc w:val="both"/>
-      </w:pPr>
-      <w:r>
-        <w:t>[Francesco Valenari] — Progettista Software e Collaboratore Front End</w:t>
-      </w:r>
-    </w:p>
-    <w:p>
-      <w:pPr>
-        <w:jc w:val="both"/>
-      </w:pPr>
-      <w:r>
-        <w:t>Definisce l’architettura del sistema, la struttura del codice e i diagrammi UML, garantendo coerenza e qualità del design. Aiuta nella realizzazione dell'interfaccia utente.</w:t>
-      </w:r>
-    </w:p>
-    <w:p>
-      <w:pPr>
-        <w:jc w:val="both"/>
-      </w:pPr>
-      <w:r>
-        <w:t>[Tommaso Maistrello] — Analista dei requisiti e Sviluppatore Front End</w:t>
-      </w:r>
-    </w:p>
-    <w:p>
-      <w:pPr>
-        <w:jc w:val="both"/>
-      </w:pPr>
-      <w:r>
-        <w:t>Cura la documentazione e raccoglie i requisiti funzionali e non funzionali. Realizza l’interfaccia utente.</w:t>
-      </w:r>
-    </w:p>
-    <w:p>
-      <w:pPr>
-        <w:jc w:val="both"/>
-      </w:pPr>
-      <w:r>
-        <w:t>[Claudio Morgera] — Collaboratore Back End e Tester</w:t>
-      </w:r>
-    </w:p>
-    <w:p>
-      <w:pPr>
-        <w:jc w:val="both"/>
-      </w:pPr>
-      <w:r>
-        <w:t>Aiuta nell‘implementazione della logica applicativa e gestisce l’integrazione tra moduli, servizi e database. Si occupa dei test funzionali e unitari e verifica la correttezza complessiva del software.</w:t>
-      </w:r>
-    </w:p>
-    <w:p>
-      <w:pPr>
+        <w:t xml:space="preserve">Il progetto prevede il </w:t>
+      </w:r>
+      <w:r>
+        <w:t>lavoro e la collaborazione</w:t>
+      </w:r>
+      <w:r>
+        <w:t xml:space="preserve"> costante di quattro membri, studenti del corso di laurea in Ingegneria Informatica.</w:t>
+      </w:r>
+    </w:p>
+    <w:p>
+      <w:pPr>
+        <w:jc w:val="both"/>
+      </w:pPr>
+      <w:r>
+        <w:t>Tutti possiedono</w:t>
+      </w:r>
+      <w:r>
+        <w:t xml:space="preserve"> conoscenze e competen</w:t>
+      </w:r>
+      <w:r>
+        <w:t>z</w:t>
+      </w:r>
+      <w:r>
+        <w:t xml:space="preserve">e </w:t>
+      </w:r>
+      <w:r>
+        <w:t>nello sviluppo software in Java e nell’utilizzo dell’ambiente di Eclipse</w:t>
+      </w:r>
+      <w:r>
+        <w:t>.</w:t>
+      </w:r>
+    </w:p>
+    <w:p>
+      <w:pPr>
+        <w:jc w:val="both"/>
+      </w:pPr>
+      <w:r>
+        <w:t>Ciascun componente del gruppo partecipa</w:t>
+      </w:r>
+      <w:r>
+        <w:t xml:space="preserve"> sia alla fase di stesura di documenti sia</w:t>
+      </w:r>
+      <w:r>
+        <w:t xml:space="preserve"> all</w:t>
+      </w:r>
+      <w:r>
+        <w:t>a fase di implementazione di codice</w:t>
+      </w:r>
+      <w:r>
+        <w:t>, con attività sia di Front End sia di Back End, secondo le proprie competenze</w:t>
+      </w:r>
+      <w:r>
+        <w:t xml:space="preserve"> e i ruoli assegnati dal Project Manager.</w:t>
+      </w:r>
+    </w:p>
+    <w:p>
+      <w:pPr>
+        <w:jc w:val="both"/>
+      </w:pPr>
+      <w:r>
+        <w:t>I ruoli sono stati infatti così assegnati:</w:t>
+      </w:r>
+    </w:p>
+    <w:p>
+      <w:pPr>
+        <w:jc w:val="both"/>
+      </w:pPr>
+      <w:r>
+        <w:t>Davide Mascheretti</w:t>
+      </w:r>
+      <w:r>
+        <w:t xml:space="preserve"> </w:t>
+      </w:r>
+      <w:r>
+        <w:t>— Project Manager e Sviluppatore Back End</w:t>
+      </w:r>
+    </w:p>
+    <w:p>
+      <w:pPr>
+        <w:spacing w:after="0"/>
+        <w:jc w:val="both"/>
+      </w:pPr>
+      <w:r>
+        <w:t>Coordina le attività, pianifica le scadenze</w:t>
+      </w:r>
+      <w:r>
+        <w:t>, approva funzionalità aggiuntive e verifica richieste di modifica.</w:t>
+      </w:r>
+    </w:p>
+    <w:p>
+      <w:pPr>
+        <w:spacing w:after="0"/>
+        <w:jc w:val="both"/>
+      </w:pPr>
+      <w:r>
+        <w:t>Implementa la logica applicativa</w:t>
+      </w:r>
+      <w:r>
+        <w:t>, la gestione del database e delle dipendenze necessarie per il corretto funzionamento dell’applicazione.</w:t>
+      </w:r>
+    </w:p>
+    <w:p>
+      <w:pPr>
+        <w:spacing w:after="0"/>
+        <w:jc w:val="both"/>
+      </w:pPr>
+    </w:p>
+    <w:p>
+      <w:pPr>
+        <w:jc w:val="both"/>
+      </w:pPr>
+      <w:r>
+        <w:t>Francesco Valenari</w:t>
+      </w:r>
+      <w:r>
+        <w:t xml:space="preserve"> </w:t>
+      </w:r>
+      <w:r>
+        <w:t>— Progettista Software e Collaboratore Front End</w:t>
+      </w:r>
+    </w:p>
+    <w:p>
+      <w:pPr>
+        <w:spacing w:after="0"/>
+        <w:jc w:val="both"/>
+      </w:pPr>
+      <w:r>
+        <w:t>Definisce l’architettura del sistema, la struttura del codice e i diagrammi UML, garantendo coerenza e qualità del design.</w:t>
+      </w:r>
+    </w:p>
+    <w:p>
+      <w:pPr>
+        <w:spacing w:after="0"/>
+        <w:jc w:val="both"/>
+      </w:pPr>
+      <w:r>
+        <w:t>Aiuta nella realizzazione dell'interfaccia utente.</w:t>
+      </w:r>
+    </w:p>
+    <w:p>
+      <w:pPr>
+        <w:spacing w:after="0"/>
+        <w:jc w:val="both"/>
+      </w:pPr>
+    </w:p>
+    <w:p>
+      <w:pPr>
+        <w:jc w:val="both"/>
+      </w:pPr>
+      <w:r>
+        <w:t>Tommaso Maistrello</w:t>
+      </w:r>
+      <w:r>
+        <w:t xml:space="preserve"> </w:t>
+      </w:r>
+      <w:r>
+        <w:t>— Analista dei requisiti e Sviluppatore Front End</w:t>
+      </w:r>
+    </w:p>
+    <w:p>
+      <w:pPr>
+        <w:spacing w:after="0"/>
+        <w:jc w:val="both"/>
+      </w:pPr>
+      <w:r>
+        <w:t>Cura la documentazione e raccoglie i requisiti funzionali e non funzionali</w:t>
+      </w:r>
+      <w:r>
+        <w:t xml:space="preserve"> in un file specifico.</w:t>
+      </w:r>
+    </w:p>
+    <w:p>
+      <w:pPr>
+        <w:spacing w:after="0"/>
+        <w:jc w:val="both"/>
+      </w:pPr>
+      <w:r>
+        <w:t>Realizza l’interfaccia utente.</w:t>
+      </w:r>
+    </w:p>
+    <w:p>
+      <w:pPr>
+        <w:spacing w:after="0"/>
+        <w:jc w:val="both"/>
+      </w:pPr>
+    </w:p>
+    <w:p>
+      <w:pPr>
+        <w:jc w:val="both"/>
+      </w:pPr>
+      <w:r>
+        <w:t>Claudio Morgera— Collaboratore Back End e Tester</w:t>
+      </w:r>
+    </w:p>
+    <w:p>
+      <w:pPr>
+        <w:spacing w:after="0"/>
+        <w:jc w:val="both"/>
+      </w:pPr>
+      <w:r>
+        <w:t>Aiuta nell‘implementazione della logica applicativa e gestisce l’integrazione tra moduli, servizi e database.</w:t>
+      </w:r>
+    </w:p>
+    <w:p>
+      <w:pPr>
+        <w:spacing w:after="0"/>
+        <w:jc w:val="both"/>
+      </w:pPr>
+      <w:r>
+        <w:t>Si occupa della parte di test e verifica il corretto funzionamento del software in ogni fase.</w:t>
+      </w:r>
+    </w:p>
+    <w:p>
+      <w:pPr>
+        <w:spacing w:after="0"/>
+        <w:jc w:val="both"/>
+      </w:pPr>
+    </w:p>
+    <w:p>
+      <w:pPr>
+        <w:spacing w:after="0"/>
+        <w:jc w:val="both"/>
+      </w:pPr>
+      <w:r>
+        <w:t>Tale suddivisione garantisce chiarezza e divisione netta delle responsabilità.</w:t>
+      </w:r>
+    </w:p>
+    <w:p>
+      <w:pPr>
+        <w:spacing w:after="0"/>
+        <w:jc w:val="both"/>
+      </w:pPr>
+    </w:p>
+    <w:p>
+      <w:pPr>
+        <w:spacing w:after="0"/>
         <w:jc w:val="both"/>
       </w:pPr>
       <w:r>
@@ -3174,33 +3747,12 @@
     </w:p>
     <w:p>
       <w:pPr>
-        <w:jc w:val="both"/>
-      </w:pPr>
-    </w:p>
-    <w:p>
-      <w:pPr>
-        <w:jc w:val="both"/>
-      </w:pPr>
-    </w:p>
-    <w:p>
-      <w:pPr>
-        <w:jc w:val="both"/>
-      </w:pPr>
-    </w:p>
-    <w:p>
-      <w:pPr>
-        <w:jc w:val="both"/>
-      </w:pPr>
-    </w:p>
-    <w:p>
-      <w:pPr>
-        <w:jc w:val="both"/>
-      </w:pPr>
-    </w:p>
-    <w:p>
-      <w:pPr>
-        <w:jc w:val="both"/>
-      </w:pPr>
+        <w:spacing w:after="0"/>
+        <w:jc w:val="both"/>
+      </w:pPr>
+      <w:r>
+        <w:t>Si sottolinea inoltre come la documentazione e la fase di testing sono compiti di ogni membro del team, in particolare dopo che effettua modifiche al codice.</w:t>
+      </w:r>
     </w:p>
     <w:p>
       <w:pPr>
@@ -3254,6 +3806,7 @@
           <w:sz w:val="28"/>
           <w:szCs w:val="28"/>
         </w:rPr>
+        <w:lastRenderedPageBreak/>
         <w:t>METODI E TECNICHE</w:t>
       </w:r>
     </w:p>
@@ -3267,11 +3820,80 @@
     </w:p>
     <w:p>
       <w:pPr>
-        <w:jc w:val="both"/>
-      </w:pPr>
-      <w:r>
-        <w:t>Ingegneria dei requisiti: i requisiti saranno raccolti tramite incontri di gruppo e discussioni guidate dal Project Manager. Saranno documentati in modo strutturato utilizzando diagrammi dei casi d’uso e specifiche testuali, redatte con strumenti di videoscrittura condivisi (ad esempio Google Docs o simili).</w:t>
-      </w:r>
+        <w:spacing w:after="0"/>
+        <w:jc w:val="both"/>
+      </w:pPr>
+      <w:r>
+        <w:t>Ingegneria dei requisiti: i requisiti saranno raccolti tramite incontri di gruppo e discussioni guidate dal Project Manager.</w:t>
+      </w:r>
+    </w:p>
+    <w:p>
+      <w:pPr>
+        <w:spacing w:after="0"/>
+        <w:jc w:val="both"/>
+      </w:pPr>
+      <w:r>
+        <w:t xml:space="preserve">Saranno documentati in modo strutturato utilizzando diagrammi dei casi d’uso e specifiche testuali, redatte con strumenti </w:t>
+      </w:r>
+      <w:r>
+        <w:t>(in particolare Google Documenti nella fase iniziale).</w:t>
+      </w:r>
+    </w:p>
+    <w:p>
+      <w:pPr>
+        <w:spacing w:after="0"/>
+        <w:jc w:val="both"/>
+      </w:pPr>
+      <w:r>
+        <w:t>Verrà poi redatto un documento a parte denominato “Specifica dei requisiti” che raggruppa e suddivide i requisiti in base alla loro funzionalità e prioritizzazione.</w:t>
+      </w:r>
+    </w:p>
+    <w:p>
+      <w:pPr>
+        <w:spacing w:after="0"/>
+        <w:jc w:val="both"/>
+      </w:pPr>
+      <w:r>
+        <w:t xml:space="preserve">È stata infatti utilizzata una prioritizzazione di </w:t>
+      </w:r>
+      <w:proofErr w:type="spellStart"/>
+      <w:r>
+        <w:t>MoSCoW</w:t>
+      </w:r>
+      <w:proofErr w:type="spellEnd"/>
+      <w:r>
+        <w:t xml:space="preserve"> : la suddivisione dei requisiti in must, </w:t>
+      </w:r>
+      <w:proofErr w:type="spellStart"/>
+      <w:r>
+        <w:t>should</w:t>
+      </w:r>
+      <w:proofErr w:type="spellEnd"/>
+      <w:r>
+        <w:t xml:space="preserve">, </w:t>
+      </w:r>
+      <w:proofErr w:type="spellStart"/>
+      <w:r>
+        <w:t>could</w:t>
+      </w:r>
+      <w:proofErr w:type="spellEnd"/>
+      <w:r>
+        <w:t xml:space="preserve"> e </w:t>
+      </w:r>
+      <w:proofErr w:type="spellStart"/>
+      <w:r>
+        <w:t>won’t</w:t>
+      </w:r>
+      <w:proofErr w:type="spellEnd"/>
+      <w:r>
+        <w:t xml:space="preserve"> permette di definire in maniera più chiara le scadenze e il tempo da dedicare ad ogni requisiti, dai più importanti e centrali a quelli minori.</w:t>
+      </w:r>
+    </w:p>
+    <w:p>
+      <w:pPr>
+        <w:spacing w:after="0"/>
+        <w:jc w:val="both"/>
+      </w:pPr>
     </w:p>
     <w:p>
       <w:pPr>
@@ -3291,11 +3913,27 @@
     </w:p>
     <w:p>
       <w:pPr>
-        <w:jc w:val="both"/>
-      </w:pPr>
-      <w:r>
-        <w:t>Implementazione: lo sviluppo sarà realizzato in Java, utilizzando l’ambiente Eclipse IDE. Verrà seguito un processo incrementale e iterativo dove ciascun componente sarà sviluppato, testato e integrato progressivamente per tutta la durata del progetto.</w:t>
-      </w:r>
+        <w:spacing w:after="0"/>
+        <w:jc w:val="both"/>
+      </w:pPr>
+      <w:r>
+        <w:t>Implementazione: lo sviluppo sarà realizzato in Java, utilizzando l’ambiente Eclipse IDE.</w:t>
+      </w:r>
+    </w:p>
+    <w:p>
+      <w:pPr>
+        <w:spacing w:after="0"/>
+        <w:jc w:val="both"/>
+      </w:pPr>
+      <w:r>
+        <w:t>Verrà seguito un processo incrementale e iterativo dove ciascun componente sarà sviluppato, testato e integrato progressivamente per tutta la durata del progetto.</w:t>
+      </w:r>
+    </w:p>
+    <w:p>
+      <w:pPr>
+        <w:spacing w:after="0"/>
+        <w:jc w:val="both"/>
+      </w:pPr>
     </w:p>
     <w:p>
       <w:pPr>
@@ -3314,7 +3952,7 @@
       </w:r>
       <w:proofErr w:type="spellStart"/>
       <w:r>
-        <w:t>versioneamento</w:t>
+        <w:t>versionamento</w:t>
       </w:r>
       <w:proofErr w:type="spellEnd"/>
       <w:r>
@@ -3368,26 +4006,6 @@
       <w:r>
         <w:t>Integrazione e test: i componenti saranno testati in ordine crescente di complessità, iniziando dai moduli di base fino alla versione integrata. I test di accettazione verranno eseguiti sotto la supervisione del gruppo, verificando la conformità ai requisiti funzionali e prestazionali.</w:t>
       </w:r>
-    </w:p>
-    <w:p>
-      <w:pPr>
-        <w:jc w:val="both"/>
-      </w:pPr>
-    </w:p>
-    <w:p>
-      <w:pPr>
-        <w:jc w:val="both"/>
-      </w:pPr>
-    </w:p>
-    <w:p>
-      <w:pPr>
-        <w:jc w:val="both"/>
-      </w:pPr>
-    </w:p>
-    <w:p>
-      <w:pPr>
-        <w:jc w:val="both"/>
-      </w:pPr>
     </w:p>
     <w:p>
       <w:pPr>
@@ -3451,6 +4069,7 @@
           <w:sz w:val="28"/>
           <w:szCs w:val="28"/>
         </w:rPr>
+        <w:lastRenderedPageBreak/>
         <w:t>GARANZIE DI QUALITÀ</w:t>
       </w:r>
     </w:p>
@@ -3475,15 +4094,45 @@
         <w:jc w:val="both"/>
       </w:pPr>
       <w:r>
-        <w:t>Controllo della qualità del codice: verranno adottate convenzioni di programmazione condivise (stile, nomenclatura, formattazione) e saranno effettuate revisioni periodiche del codice tramite code review su GitHub.</w:t>
-      </w:r>
-    </w:p>
-    <w:p>
-      <w:pPr>
-        <w:jc w:val="both"/>
-      </w:pPr>
-      <w:r>
-        <w:t>Test di qualità: saranno realizzati test unitari, di integrazione e di sistema per garantire il corretto funzionamento del software. Gli esiti dei test saranno documentati in appositi report.</w:t>
+        <w:t>Controllo della qualità del codice: verranno adottate convenzioni di programmazione condivise (stile, nomenclatura, formattazione) e saranno effettuate revisioni periodiche del codice</w:t>
+      </w:r>
+      <w:r>
+        <w:t xml:space="preserve"> collaborative</w:t>
+      </w:r>
+      <w:r>
+        <w:t xml:space="preserve"> da parte d</w:t>
+      </w:r>
+      <w:r>
+        <w:t>egli altri membri del team</w:t>
+      </w:r>
+      <w:r>
+        <w:t>, che fornir</w:t>
+      </w:r>
+      <w:r>
+        <w:t>anno</w:t>
+      </w:r>
+      <w:r>
+        <w:t xml:space="preserve"> consigli e proporr</w:t>
+      </w:r>
+      <w:r>
+        <w:t>anno</w:t>
+      </w:r>
+      <w:r>
+        <w:t xml:space="preserve"> modiche</w:t>
+      </w:r>
+      <w:r>
+        <w:t>.</w:t>
+      </w:r>
+    </w:p>
+    <w:p>
+      <w:pPr>
+        <w:jc w:val="both"/>
+      </w:pPr>
+      <w:r>
+        <w:t>Test di qualità: saranno realizzati test unitari, di integrazione e di sistema per garantire il corretto funzionamento del software</w:t>
+      </w:r>
+      <w:r>
+        <w:t>. Ogni membro del team è responsabile di fare test sulle parti di codice che implementa. Se il codice non è funzionante deve segnalarlo a tutto il team.</w:t>
       </w:r>
     </w:p>
     <w:p>
@@ -3493,6 +4142,17 @@
       <w:r>
         <w:t>Tracciabilità: verrà mantenuta una corrispondenza tra requisiti, componenti implementati e casi di test, per assicurare la copertura completa delle funzionalità.</w:t>
       </w:r>
+      <w:r>
+        <w:t xml:space="preserve"> Per la parte di </w:t>
+      </w:r>
+      <w:proofErr w:type="spellStart"/>
+      <w:r>
+        <w:t>requuisiti</w:t>
+      </w:r>
+      <w:proofErr w:type="spellEnd"/>
+      <w:r>
+        <w:t xml:space="preserve"> verrà inoltra tracciata la data del raggiungimento del requisito nell’apposito file.</w:t>
+      </w:r>
     </w:p>
     <w:p>
       <w:pPr>
@@ -3507,39 +4167,33 @@
       </w:r>
       <w:proofErr w:type="spellEnd"/>
       <w:r>
-        <w:t xml:space="preserve"> </w:t>
+        <w:t xml:space="preserve"> Git</w:t>
+      </w:r>
+      <w:r>
+        <w:t>Hub</w:t>
+      </w:r>
+      <w:r>
+        <w:t>, garantendo il controllo delle revisioni e la riproducibilità del lavoro.</w:t>
+      </w:r>
+    </w:p>
+    <w:p>
+      <w:pPr>
+        <w:jc w:val="both"/>
+      </w:pPr>
+      <w:r>
+        <w:t>Verifica finale: prima della consegna, il software sarà sottoposto a un test di accettazione finale per confermare la conformità alle specifiche e la stabilità del sistema.</w:t>
+      </w:r>
+      <w:r>
+        <w:t xml:space="preserve"> Verrà chiesto ad ogni membro del team di testare più volte il software al fine di trovare problematiche non notate in </w:t>
       </w:r>
       <w:proofErr w:type="spellStart"/>
       <w:r>
-        <w:t>Git</w:t>
+        <w:t>precdenza</w:t>
       </w:r>
       <w:proofErr w:type="spellEnd"/>
       <w:r>
-        <w:t>, garantendo il controllo delle revisioni e la riproducibilità del lavoro.</w:t>
-      </w:r>
-    </w:p>
-    <w:p>
-      <w:pPr>
-        <w:jc w:val="both"/>
-      </w:pPr>
-      <w:r>
-        <w:t>Verifica finale: prima della consegna, il software sarà sottoposto a un test di accettazione finale per confermare la conformità alle specifiche e la stabilità del sistema.</w:t>
-      </w:r>
-    </w:p>
-    <w:p>
-      <w:pPr>
-        <w:jc w:val="both"/>
-      </w:pPr>
-    </w:p>
-    <w:p>
-      <w:pPr>
-        <w:jc w:val="both"/>
-      </w:pPr>
-    </w:p>
-    <w:p>
-      <w:pPr>
-        <w:jc w:val="both"/>
-      </w:pPr>
+        <w:t>.</w:t>
+      </w:r>
     </w:p>
     <w:p>
       <w:pPr>
@@ -3638,6 +4292,7 @@
           <w:sz w:val="28"/>
           <w:szCs w:val="28"/>
         </w:rPr>
+        <w:lastRenderedPageBreak/>
         <w:t>PACCHETTI DI LAVORO</w:t>
       </w:r>
     </w:p>
@@ -3711,6 +4366,18 @@
           <w14:ligatures w14:val="none"/>
         </w:rPr>
         <w:t xml:space="preserve"> Inizializzazione progetto e configurazione dipendenze</w:t>
+      </w:r>
+      <w:r>
+        <w:rPr>
+          <w:rFonts w:eastAsia="Times New Roman" w:cstheme="minorHAnsi"/>
+          <w:i/>
+          <w:iCs/>
+          <w:color w:val="000000"/>
+          <w:kern w:val="0"/>
+          <w:lang w:eastAsia="it-IT"/>
+          <w14:ligatures w14:val="none"/>
+        </w:rPr>
+        <w:t>:</w:t>
       </w:r>
     </w:p>
     <w:p>
@@ -3881,6 +4548,18 @@
         </w:rPr>
         <w:t>Gestione Utente</w:t>
       </w:r>
+      <w:r>
+        <w:rPr>
+          <w:rFonts w:eastAsia="Times New Roman" w:cstheme="minorHAnsi"/>
+          <w:i/>
+          <w:iCs/>
+          <w:color w:val="000000"/>
+          <w:kern w:val="0"/>
+          <w:lang w:eastAsia="it-IT"/>
+          <w14:ligatures w14:val="none"/>
+        </w:rPr>
+        <w:t>:</w:t>
+      </w:r>
     </w:p>
     <w:p>
       <w:pPr>
@@ -4548,6 +5227,18 @@
         </w:rPr>
         <w:t>Menu laterale e pagine dedicate</w:t>
       </w:r>
+      <w:r>
+        <w:rPr>
+          <w:rFonts w:eastAsia="Times New Roman" w:cstheme="minorHAnsi"/>
+          <w:i/>
+          <w:iCs/>
+          <w:color w:val="000000"/>
+          <w:kern w:val="0"/>
+          <w:lang w:eastAsia="it-IT"/>
+          <w14:ligatures w14:val="none"/>
+        </w:rPr>
+        <w:t>:</w:t>
+      </w:r>
     </w:p>
     <w:p>
       <w:pPr>
@@ -4749,7 +5440,6 @@
           <w:lang w:eastAsia="it-IT"/>
           <w14:ligatures w14:val="none"/>
         </w:rPr>
-        <w:lastRenderedPageBreak/>
         <w:t>Salvataggio del QR code nel database, utilizzabile poi nella pagina utente</w:t>
       </w:r>
     </w:p>
@@ -4822,6 +5512,18 @@
           <w14:ligatures w14:val="none"/>
         </w:rPr>
         <w:t>Fase di testing</w:t>
+      </w:r>
+      <w:r>
+        <w:rPr>
+          <w:rFonts w:eastAsia="Times New Roman" w:cstheme="minorHAnsi"/>
+          <w:i/>
+          <w:iCs/>
+          <w:color w:val="000000"/>
+          <w:kern w:val="0"/>
+          <w:lang w:eastAsia="it-IT"/>
+          <w14:ligatures w14:val="none"/>
+        </w:rPr>
+        <w:t>:</w:t>
       </w:r>
     </w:p>
     <w:p>
@@ -4883,21 +5585,6 @@
     <w:p>
       <w:pPr>
         <w:spacing w:after="0" w:line="240" w:lineRule="auto"/>
-        <w:ind w:left="1440"/>
-        <w:jc w:val="both"/>
-        <w:textAlignment w:val="baseline"/>
-        <w:rPr>
-          <w:rFonts w:eastAsia="Times New Roman" w:cstheme="minorHAnsi"/>
-          <w:color w:val="000000"/>
-          <w:kern w:val="0"/>
-          <w:lang w:eastAsia="it-IT"/>
-          <w14:ligatures w14:val="none"/>
-        </w:rPr>
-      </w:pPr>
-    </w:p>
-    <w:p>
-      <w:pPr>
-        <w:spacing w:after="0" w:line="240" w:lineRule="auto"/>
         <w:jc w:val="both"/>
         <w:textAlignment w:val="baseline"/>
         <w:rPr>
@@ -4932,6 +5619,7 @@
           <w:lang w:eastAsia="it-IT"/>
           <w14:ligatures w14:val="none"/>
         </w:rPr>
+        <w:lastRenderedPageBreak/>
         <w:t xml:space="preserve">8- </w:t>
       </w:r>
       <w:r>
@@ -4945,6 +5633,18 @@
           <w14:ligatures w14:val="none"/>
         </w:rPr>
         <w:t>Modifiche e aggiunte finali</w:t>
+      </w:r>
+      <w:r>
+        <w:rPr>
+          <w:rFonts w:eastAsia="Times New Roman" w:cstheme="minorHAnsi"/>
+          <w:i/>
+          <w:iCs/>
+          <w:color w:val="000000"/>
+          <w:kern w:val="0"/>
+          <w:lang w:eastAsia="it-IT"/>
+          <w14:ligatures w14:val="none"/>
+        </w:rPr>
+        <w:t>:</w:t>
       </w:r>
     </w:p>
     <w:p>
@@ -5181,6 +5881,7 @@
           <w:sz w:val="28"/>
           <w:szCs w:val="28"/>
         </w:rPr>
+        <w:lastRenderedPageBreak/>
         <w:t>RISORSE</w:t>
       </w:r>
     </w:p>
@@ -5212,7 +5913,13 @@
         <w:jc w:val="both"/>
       </w:pPr>
       <w:r>
-        <w:t>4 membri del team di sviluppo</w:t>
+        <w:t>Quattro</w:t>
+      </w:r>
+      <w:r>
+        <w:t xml:space="preserve"> membri del team</w:t>
+      </w:r>
+      <w:r>
+        <w:t>, ciascuno con il proprio ruolo e responsabilità (descritti meglio nella sezione Personale)</w:t>
       </w:r>
     </w:p>
     <w:p>
@@ -5227,7 +5934,13 @@
         <w:t xml:space="preserve">Software </w:t>
       </w:r>
       <w:r>
-        <w:t xml:space="preserve">(piattaforme): </w:t>
+        <w:t>(piattaforme</w:t>
+      </w:r>
+      <w:r>
+        <w:t>, versioni delle dipendenze</w:t>
+      </w:r>
+      <w:r>
+        <w:t xml:space="preserve">): </w:t>
       </w:r>
     </w:p>
     <w:p>
@@ -5251,7 +5964,13 @@
         <w:jc w:val="both"/>
       </w:pPr>
       <w:r>
-        <w:t>JDK (Java Development Kit) + inserire versione</w:t>
+        <w:t>JDK (Java Development Kit)</w:t>
+      </w:r>
+      <w:r>
+        <w:t xml:space="preserve"> - </w:t>
+      </w:r>
+      <w:r>
+        <w:t>versione 17</w:t>
       </w:r>
     </w:p>
     <w:p>
@@ -5263,7 +5982,7 @@
         <w:jc w:val="both"/>
       </w:pPr>
       <w:r>
-        <w:t>GitHub (per repository privato).</w:t>
+        <w:t>GitHub (per repository privato)</w:t>
       </w:r>
     </w:p>
     <w:p>
@@ -5275,7 +5994,16 @@
         <w:jc w:val="both"/>
       </w:pPr>
       <w:r>
-        <w:t>Firebase Realtime Database (piano gratuito).</w:t>
+        <w:t>Firebase Realtime Database (piano gratuito)</w:t>
+      </w:r>
+      <w:r>
+        <w:t xml:space="preserve"> - </w:t>
+      </w:r>
+      <w:r>
+        <w:t xml:space="preserve">versione </w:t>
+      </w:r>
+      <w:r>
+        <w:t>9.2.0</w:t>
       </w:r>
     </w:p>
     <w:p>
@@ -5292,7 +6020,16 @@
       </w:r>
       <w:proofErr w:type="spellEnd"/>
       <w:r>
-        <w:t xml:space="preserve"> + inserire versione</w:t>
+        <w:t xml:space="preserve"> </w:t>
+      </w:r>
+      <w:r>
+        <w:t>versione</w:t>
+      </w:r>
+      <w:r>
+        <w:t xml:space="preserve"> - </w:t>
+      </w:r>
+      <w:r>
+        <w:t>24.3.3</w:t>
       </w:r>
     </w:p>
     <w:p>
@@ -5304,7 +6041,16 @@
         <w:jc w:val="both"/>
       </w:pPr>
       <w:r>
-        <w:t>Spring Boot + inserire versione</w:t>
+        <w:t xml:space="preserve">Spring Boot </w:t>
+      </w:r>
+      <w:r>
+        <w:t>versione</w:t>
+      </w:r>
+      <w:r>
+        <w:t xml:space="preserve"> - </w:t>
+      </w:r>
+      <w:r>
+        <w:t>3.2.2</w:t>
       </w:r>
     </w:p>
     <w:p>
@@ -5321,7 +6067,13 @@
       </w:r>
       <w:proofErr w:type="spellEnd"/>
       <w:r>
-        <w:t xml:space="preserve"> (per la mappa)</w:t>
+        <w:t xml:space="preserve"> versione</w:t>
+      </w:r>
+      <w:r>
+        <w:t xml:space="preserve"> - </w:t>
+      </w:r>
+      <w:r>
+        <w:t>4.1.1</w:t>
       </w:r>
     </w:p>
     <w:p>
@@ -5419,6 +6171,37 @@
         <w:jc w:val="both"/>
       </w:pPr>
       <w:r>
+        <w:t xml:space="preserve">GitHub per la revisione dei </w:t>
+      </w:r>
+      <w:proofErr w:type="spellStart"/>
+      <w:r>
+        <w:t>commit</w:t>
+      </w:r>
+      <w:proofErr w:type="spellEnd"/>
+      <w:r>
+        <w:t>,</w:t>
+      </w:r>
+      <w:r>
+        <w:t xml:space="preserve"> la tracciabilità delle modifiche</w:t>
+      </w:r>
+      <w:r>
+        <w:t xml:space="preserve"> e la gestione delle </w:t>
+      </w:r>
+      <w:proofErr w:type="spellStart"/>
+      <w:r>
+        <w:t>issues</w:t>
+      </w:r>
+      <w:proofErr w:type="spellEnd"/>
+    </w:p>
+    <w:p>
+      <w:pPr>
+        <w:numPr>
+          <w:ilvl w:val="1"/>
+          <w:numId w:val="2"/>
+        </w:numPr>
+        <w:jc w:val="both"/>
+      </w:pPr>
+      <w:r>
         <w:t xml:space="preserve">GitHub </w:t>
       </w:r>
       <w:r>
@@ -5521,11 +6304,6 @@
     <w:p>
       <w:pPr>
         <w:jc w:val="both"/>
-      </w:pPr>
-    </w:p>
-    <w:p>
-      <w:pPr>
-        <w:jc w:val="both"/>
         <w:rPr>
           <w:b/>
           <w:bCs/>
@@ -5540,6 +6318,7 @@
           <w:sz w:val="28"/>
           <w:szCs w:val="28"/>
         </w:rPr>
+        <w:lastRenderedPageBreak/>
         <w:t>BUDGET</w:t>
       </w:r>
     </w:p>
@@ -5776,11 +6555,6 @@
     <w:p>
       <w:pPr>
         <w:jc w:val="both"/>
-      </w:pPr>
-    </w:p>
-    <w:p>
-      <w:pPr>
-        <w:jc w:val="both"/>
         <w:rPr>
           <w:b/>
           <w:bCs/>
@@ -5795,6 +6569,7 @@
           <w:sz w:val="28"/>
           <w:szCs w:val="28"/>
         </w:rPr>
+        <w:lastRenderedPageBreak/>
         <w:t>CAMBIAMENTI</w:t>
       </w:r>
     </w:p>
@@ -5811,7 +6586,24 @@
         <w:jc w:val="both"/>
       </w:pPr>
       <w:r>
-        <w:t>Poiché il progetto segue un approccio iterativo e leggero, i cambiamenti corposi saranno gestiti in maniera agile: ogni nuova iterazione di questo tipo introdurrà miglioramenti del software con una documentazione ben dettagliata.</w:t>
+        <w:t>Ogni modifica effettuata deve essere coerente, completa, tracciata e non ambigua.</w:t>
+      </w:r>
+    </w:p>
+    <w:p>
+      <w:pPr>
+        <w:jc w:val="both"/>
+      </w:pPr>
+      <w:r>
+        <w:t>Poiché il progetto segue un approccio iterativo e leggero, i cambiamenti corposi saranno gestiti in maniera agile</w:t>
+      </w:r>
+      <w:r>
+        <w:t xml:space="preserve">. </w:t>
+      </w:r>
+      <w:r>
+        <w:t>Nonostante ciò</w:t>
+      </w:r>
+      <w:r>
+        <w:t xml:space="preserve"> è essenziale che in ogni momento il software sia correttamente funzionante.</w:t>
       </w:r>
     </w:p>
     <w:p>
@@ -5827,63 +6619,174 @@
         <w:jc w:val="both"/>
       </w:pPr>
       <w:r>
-        <w:t>Ogni proposta di modifica (ai requisiti, al design o al codice) dovrà essere discussa e approvata dal gruppo, in particolare dal Project Manager.</w:t>
-      </w:r>
-    </w:p>
-    <w:p>
-      <w:pPr>
-        <w:jc w:val="both"/>
-      </w:pPr>
-      <w:r>
-        <w:t>Una volta approvata, la modifica sarà documentata brevemente indicando la motivazione, l’impatto stimato e i file coinvolti.</w:t>
-      </w:r>
-    </w:p>
-    <w:p>
-      <w:pPr>
-        <w:jc w:val="both"/>
-      </w:pPr>
-      <w:r>
-        <w:t xml:space="preserve">Le modifiche al codice saranno gestite tramite </w:t>
+        <w:t xml:space="preserve">Ogni proposta di modifica </w:t>
+      </w:r>
+      <w:r>
+        <w:t xml:space="preserve">di rilevante importanza </w:t>
+      </w:r>
+      <w:r>
+        <w:t>(ai requisiti, al design o al codice) dovrà essere discussa e approvata dal gruppo, in particolare dal Project Manager.</w:t>
+      </w:r>
+    </w:p>
+    <w:p>
+      <w:pPr>
+        <w:jc w:val="both"/>
+      </w:pPr>
+      <w:r>
+        <w:t>Una volta approvata, la modifica sarà documentata indicando la motivazione, l’impatto stimato e i file coinvolti.</w:t>
+      </w:r>
+    </w:p>
+    <w:p>
+      <w:pPr>
+        <w:jc w:val="both"/>
+      </w:pPr>
+      <w:r>
+        <w:t>In caso di modifiche minori ciascun membro del gruppo si assume la responsabilità delle proprie implementazioni e non è necessaria un’ approvazione da parte del team</w:t>
+      </w:r>
+      <w:r>
+        <w:t>.</w:t>
+      </w:r>
+    </w:p>
+    <w:p>
+      <w:pPr>
+        <w:jc w:val="both"/>
+      </w:pPr>
+      <w:r>
+        <w:t>Per evitare ambiguità si definiscono “modifiche di rilevante importanza”:</w:t>
+      </w:r>
+    </w:p>
+    <w:p>
+      <w:pPr>
+        <w:pStyle w:val="Paragrafoelenco"/>
+        <w:numPr>
+          <w:ilvl w:val="0"/>
+          <w:numId w:val="8"/>
+        </w:numPr>
+        <w:jc w:val="both"/>
+      </w:pPr>
+      <w:r>
+        <w:t>Modifiche alla struttura del database (aggiunta di nodi o modifiche di Firebase)</w:t>
+      </w:r>
+    </w:p>
+    <w:p>
+      <w:pPr>
+        <w:pStyle w:val="Paragrafoelenco"/>
+        <w:numPr>
+          <w:ilvl w:val="0"/>
+          <w:numId w:val="8"/>
+        </w:numPr>
+        <w:jc w:val="both"/>
+      </w:pPr>
+      <w:r>
+        <w:t>Aggiunta di funzionalità che prima non esistevano</w:t>
+      </w:r>
+    </w:p>
+    <w:p>
+      <w:pPr>
+        <w:pStyle w:val="Paragrafoelenco"/>
+        <w:numPr>
+          <w:ilvl w:val="0"/>
+          <w:numId w:val="8"/>
+        </w:numPr>
+        <w:jc w:val="both"/>
+      </w:pPr>
+      <w:r>
+        <w:t>Aggiunta di nuove classi o aggiunte di metodi rilevanti a classi preesistenti</w:t>
+      </w:r>
+    </w:p>
+    <w:p>
+      <w:pPr>
+        <w:jc w:val="both"/>
+      </w:pPr>
+      <w:r>
+        <w:t>Le modifiche al codice saranno gestite tramite Git</w:t>
+      </w:r>
+      <w:r>
+        <w:t>Hub</w:t>
+      </w:r>
+      <w:r>
+        <w:t xml:space="preserve">, creando un nuovo </w:t>
       </w:r>
       <w:proofErr w:type="spellStart"/>
       <w:r>
-        <w:t>Git</w:t>
+        <w:t>branch</w:t>
       </w:r>
       <w:proofErr w:type="spellEnd"/>
       <w:r>
-        <w:t xml:space="preserve">, creando un nuovo </w:t>
+        <w:t xml:space="preserve"> o </w:t>
       </w:r>
       <w:proofErr w:type="spellStart"/>
       <w:r>
+        <w:t>commit</w:t>
+      </w:r>
+      <w:proofErr w:type="spellEnd"/>
+      <w:r>
+        <w:t xml:space="preserve"> dedicato e una pull </w:t>
+      </w:r>
+      <w:proofErr w:type="spellStart"/>
+      <w:r>
+        <w:t>request</w:t>
+      </w:r>
+      <w:proofErr w:type="spellEnd"/>
+      <w:r>
+        <w:t xml:space="preserve"> per la revisione</w:t>
+      </w:r>
+      <w:r>
+        <w:t xml:space="preserve">. </w:t>
+      </w:r>
+    </w:p>
+    <w:p>
+      <w:pPr>
+        <w:jc w:val="both"/>
+      </w:pPr>
+      <w:r>
+        <w:t xml:space="preserve">Nonostante sia utilizzato un metodo agile è importante che la descrizione del </w:t>
+      </w:r>
+      <w:proofErr w:type="spellStart"/>
+      <w:r>
+        <w:t>commit</w:t>
+      </w:r>
+      <w:proofErr w:type="spellEnd"/>
+      <w:r>
+        <w:t xml:space="preserve"> sia ben dettagliata e spieghi in maniera precisa i cambiamenti rispetto alla versione precedente.</w:t>
+      </w:r>
+    </w:p>
+    <w:p>
+      <w:pPr>
+        <w:jc w:val="both"/>
+      </w:pPr>
+      <w:r>
+        <w:t xml:space="preserve">Nel caso di </w:t>
+      </w:r>
+      <w:proofErr w:type="spellStart"/>
+      <w:r>
         <w:t>branch</w:t>
       </w:r>
       <w:proofErr w:type="spellEnd"/>
       <w:r>
-        <w:t xml:space="preserve"> o </w:t>
+        <w:t xml:space="preserve"> secondario, a seguito della pull </w:t>
       </w:r>
       <w:proofErr w:type="spellStart"/>
       <w:r>
-        <w:t>commit</w:t>
+        <w:t>request</w:t>
       </w:r>
       <w:proofErr w:type="spellEnd"/>
       <w:r>
-        <w:t xml:space="preserve"> dedicato e una pull </w:t>
-      </w:r>
-      <w:proofErr w:type="spellStart"/>
-      <w:r>
-        <w:t>request</w:t>
-      </w:r>
-      <w:proofErr w:type="spellEnd"/>
-      <w:r>
-        <w:t xml:space="preserve"> per la revisione e l’integrazione.</w:t>
-      </w:r>
-    </w:p>
-    <w:p>
-      <w:pPr>
-        <w:jc w:val="both"/>
-      </w:pPr>
-      <w:r>
-        <w:t>Le modifiche che comportano aggiornamenti alla documentazione tecnica (diagrammi, manuali o specifiche) saranno riportate anche nei relativi file, per mantenere la coerenza tra codice e documentazione.</w:t>
+        <w:t xml:space="preserve"> ci si aspetta che un altro membro del gruppo visualizzi la richiesta e la approvi o non la approvi con le adeguate motivazioni.</w:t>
+      </w:r>
+    </w:p>
+    <w:p>
+      <w:pPr>
+        <w:jc w:val="both"/>
+      </w:pPr>
+      <w:r>
+        <w:t>Le modifiche che comportano aggiornamenti alla documentazione tecnica (</w:t>
+      </w:r>
+      <w:r>
+        <w:t>ad esempio i diagrammi UML</w:t>
+      </w:r>
+      <w:r>
+        <w:t>) saranno riportate anche nei relativi file, per mantenere la coerenza tra codice e documentazione.</w:t>
       </w:r>
     </w:p>
     <w:p>
@@ -5893,46 +6796,6 @@
       <w:r>
         <w:t>Questo approccio permette di mantenere un controllo chiaro sulle versioni del software e di prevenire modifiche non tracciate che potrebbero compromettere la qualità e aumentare i tempi di sviluppo.</w:t>
       </w:r>
-    </w:p>
-    <w:p>
-      <w:pPr>
-        <w:jc w:val="both"/>
-      </w:pPr>
-    </w:p>
-    <w:p>
-      <w:pPr>
-        <w:jc w:val="both"/>
-      </w:pPr>
-    </w:p>
-    <w:p>
-      <w:pPr>
-        <w:jc w:val="both"/>
-      </w:pPr>
-    </w:p>
-    <w:p>
-      <w:pPr>
-        <w:jc w:val="both"/>
-      </w:pPr>
-    </w:p>
-    <w:p>
-      <w:pPr>
-        <w:jc w:val="both"/>
-      </w:pPr>
-    </w:p>
-    <w:p>
-      <w:pPr>
-        <w:jc w:val="both"/>
-      </w:pPr>
-    </w:p>
-    <w:p>
-      <w:pPr>
-        <w:jc w:val="both"/>
-      </w:pPr>
-    </w:p>
-    <w:p>
-      <w:pPr>
-        <w:jc w:val="both"/>
-      </w:pPr>
     </w:p>
     <w:p>
       <w:pPr>
@@ -5997,11 +6860,13 @@
           <w:sz w:val="28"/>
           <w:szCs w:val="28"/>
         </w:rPr>
+        <w:lastRenderedPageBreak/>
         <w:t>CONSEGNA</w:t>
       </w:r>
     </w:p>
     <w:p>
       <w:pPr>
+        <w:spacing w:after="0"/>
         <w:jc w:val="both"/>
       </w:pPr>
       <w:r>
@@ -6013,7 +6878,7 @@
       </w:r>
       <w:proofErr w:type="spellEnd"/>
       <w:r>
-        <w:t xml:space="preserve"> da condividere preventivamente con il professore (account </w:t>
+        <w:t xml:space="preserve"> da condividere con il professore (account </w:t>
       </w:r>
       <w:proofErr w:type="spellStart"/>
       <w:r>
@@ -6045,7 +6910,40 @@
       </w:r>
       <w:proofErr w:type="spellEnd"/>
       <w:r>
-        <w:t>). Mentre per i tempi di consegna possono variare in base alla decisione del gruppo nel voler svolgere l‘esame di Ingegneria del Software, siccome il project plan deve essere pronto un mese circa prima dell’esame. Il progetto deve essere completato 5 giorni prima della sua presentazione.</w:t>
+        <w:t xml:space="preserve">). </w:t>
+      </w:r>
+    </w:p>
+    <w:p>
+      <w:pPr>
+        <w:spacing w:after="0"/>
+        <w:jc w:val="both"/>
+      </w:pPr>
+      <w:r>
+        <w:t>I</w:t>
+      </w:r>
+      <w:r>
+        <w:t xml:space="preserve"> tempi di consegna possono variare in base alla decisione del gruppo nel voler svolgere l‘esame di Ingegneria del Software</w:t>
+      </w:r>
+      <w:r>
+        <w:t>.</w:t>
+      </w:r>
+    </w:p>
+    <w:p>
+      <w:pPr>
+        <w:spacing w:after="0"/>
+        <w:jc w:val="both"/>
+      </w:pPr>
+      <w:r>
+        <w:t>I</w:t>
+      </w:r>
+      <w:r>
+        <w:t>l project plan deve essere pronto un mese circa prima dell’esame</w:t>
+      </w:r>
+      <w:r>
+        <w:t xml:space="preserve"> e i</w:t>
+      </w:r>
+      <w:r>
+        <w:t>l progetto deve essere completato 5 giorni prima della sua presentazione.</w:t>
       </w:r>
     </w:p>
     <w:p>
@@ -6054,6 +6952,7 @@
       </w:pPr>
     </w:p>
     <w:sectPr>
+      <w:footerReference w:type="default" r:id="rId8"/>
       <w:pgSz w:w="11906" w:h="16838"/>
       <w:pgMar w:top="1417" w:right="1134" w:bottom="1134" w:left="1134" w:header="708" w:footer="708" w:gutter="0"/>
       <w:cols w:space="708"/>
@@ -6061,6 +6960,98 @@
     </w:sectPr>
   </w:body>
 </w:document>
+</file>
+
+<file path=word/endnotes.xml><?xml version="1.0" encoding="utf-8"?>
+<w:endnotes xmlns:wpc="http://schemas.microsoft.com/office/word/2010/wordprocessingCanvas" xmlns:cx="http://schemas.microsoft.com/office/drawing/2014/chartex" xmlns:cx1="http://schemas.microsoft.com/office/drawing/2015/9/8/chartex" xmlns:cx2="http://schemas.microsoft.com/office/drawing/2015/10/21/chartex" xmlns:cx3="http://schemas.microsoft.com/office/drawing/2016/5/9/chartex" xmlns:cx4="http://schemas.microsoft.com/office/drawing/2016/5/10/chartex" xmlns:cx5="http://schemas.microsoft.com/office/drawing/2016/5/11/chartex" xmlns:cx6="http://schemas.microsoft.com/office/drawing/2016/5/12/chartex" xmlns:cx7="http://schemas.microsoft.com/office/drawing/2016/5/13/chartex" xmlns:cx8="http://schemas.microsoft.com/office/drawing/2016/5/14/chartex" xmlns:mc="http://schemas.openxmlformats.org/markup-compatibility/2006" xmlns:aink="http://schemas.microsoft.com/office/drawing/2016/ink" xmlns:am3d="http://schemas.microsoft.com/office/drawing/2017/model3d" xmlns:o="urn:schemas-microsoft-com:office:office" xmlns:oel="http://schemas.microsoft.com/office/2019/extlst" xmlns:r="http://schemas.openxmlformats.org/officeDocument/2006/relationships" xmlns:m="http://schemas.openxmlformats.org/officeDocument/2006/math" xmlns:v="urn:schemas-microsoft-com:vml" xmlns:wp14="http://schemas.microsoft.com/office/word/2010/wordprocessingDrawing" xmlns:wp="http://schemas.openxmlformats.org/drawingml/2006/wordprocessingDrawing" xmlns:w10="urn:schemas-microsoft-com:office:word" xmlns:w="http://schemas.openxmlformats.org/wordprocessingml/2006/main" xmlns:w14="http://schemas.microsoft.com/office/word/2010/wordml" xmlns:w15="http://schemas.microsoft.com/office/word/2012/wordml" xmlns:w16cex="http://schemas.microsoft.com/office/word/2018/wordml/cex" xmlns:w16cid="http://schemas.microsoft.com/office/word/2016/wordml/cid" xmlns:w16="http://schemas.microsoft.com/office/word/2018/wordml" xmlns:w16du="http://schemas.microsoft.com/office/word/2023/wordml/word16du" xmlns:w16sdtdh="http://schemas.microsoft.com/office/word/2020/wordml/sdtdatahash" xmlns:w16sdtfl="http://schemas.microsoft.com/office/word/2024/wordml/sdtformatlock" xmlns:w16se="http://schemas.microsoft.com/office/word/2015/wordml/symex" xmlns:wpg="http://schemas.microsoft.com/office/word/2010/wordprocessingGroup" xmlns:wpi="http://schemas.microsoft.com/office/word/2010/wordprocessingInk" xmlns:wne="http://schemas.microsoft.com/office/word/2006/wordml" xmlns:wps="http://schemas.microsoft.com/office/word/2010/wordprocessingShape" mc:Ignorable="w14 w15 w16se w16cid w16 w16cex w16sdtdh w16sdtfl w16du wp14">
+  <w:endnote w:type="separator" w:id="-1">
+    <w:p>
+      <w:pPr>
+        <w:spacing w:after="0" w:line="240" w:lineRule="auto"/>
+      </w:pPr>
+      <w:r>
+        <w:separator/>
+      </w:r>
+    </w:p>
+  </w:endnote>
+  <w:endnote w:type="continuationSeparator" w:id="0">
+    <w:p>
+      <w:pPr>
+        <w:spacing w:after="0" w:line="240" w:lineRule="auto"/>
+      </w:pPr>
+      <w:r>
+        <w:continuationSeparator/>
+      </w:r>
+    </w:p>
+  </w:endnote>
+</w:endnotes>
+</file>
+
+<file path=word/footer1.xml><?xml version="1.0" encoding="utf-8"?>
+<w:ftr xmlns:wpc="http://schemas.microsoft.com/office/word/2010/wordprocessingCanvas" xmlns:cx="http://schemas.microsoft.com/office/drawing/2014/chartex" xmlns:cx1="http://schemas.microsoft.com/office/drawing/2015/9/8/chartex" xmlns:cx2="http://schemas.microsoft.com/office/drawing/2015/10/21/chartex" xmlns:cx3="http://schemas.microsoft.com/office/drawing/2016/5/9/chartex" xmlns:cx4="http://schemas.microsoft.com/office/drawing/2016/5/10/chartex" xmlns:cx5="http://schemas.microsoft.com/office/drawing/2016/5/11/chartex" xmlns:cx6="http://schemas.microsoft.com/office/drawing/2016/5/12/chartex" xmlns:cx7="http://schemas.microsoft.com/office/drawing/2016/5/13/chartex" xmlns:cx8="http://schemas.microsoft.com/office/drawing/2016/5/14/chartex" xmlns:mc="http://schemas.openxmlformats.org/markup-compatibility/2006" xmlns:aink="http://schemas.microsoft.com/office/drawing/2016/ink" xmlns:am3d="http://schemas.microsoft.com/office/drawing/2017/model3d" xmlns:o="urn:schemas-microsoft-com:office:office" xmlns:oel="http://schemas.microsoft.com/office/2019/extlst" xmlns:r="http://schemas.openxmlformats.org/officeDocument/2006/relationships" xmlns:m="http://schemas.openxmlformats.org/officeDocument/2006/math" xmlns:v="urn:schemas-microsoft-com:vml" xmlns:wp14="http://schemas.microsoft.com/office/word/2010/wordprocessingDrawing" xmlns:wp="http://schemas.openxmlformats.org/drawingml/2006/wordprocessingDrawing" xmlns:w10="urn:schemas-microsoft-com:office:word" xmlns:w="http://schemas.openxmlformats.org/wordprocessingml/2006/main" xmlns:w14="http://schemas.microsoft.com/office/word/2010/wordml" xmlns:w15="http://schemas.microsoft.com/office/word/2012/wordml" xmlns:w16cex="http://schemas.microsoft.com/office/word/2018/wordml/cex" xmlns:w16cid="http://schemas.microsoft.com/office/word/2016/wordml/cid" xmlns:w16="http://schemas.microsoft.com/office/word/2018/wordml" xmlns:w16du="http://schemas.microsoft.com/office/word/2023/wordml/word16du" xmlns:w16sdtdh="http://schemas.microsoft.com/office/word/2020/wordml/sdtdatahash" xmlns:w16sdtfl="http://schemas.microsoft.com/office/word/2024/wordml/sdtformatlock" xmlns:w16se="http://schemas.microsoft.com/office/word/2015/wordml/symex" xmlns:wpg="http://schemas.microsoft.com/office/word/2010/wordprocessingGroup" xmlns:wpi="http://schemas.microsoft.com/office/word/2010/wordprocessingInk" xmlns:wne="http://schemas.microsoft.com/office/word/2006/wordml" xmlns:wps="http://schemas.microsoft.com/office/word/2010/wordprocessingShape" mc:Ignorable="w14 w15 w16se w16cid w16 w16cex w16sdtdh w16sdtfl w16du wp14">
+  <w:sdt>
+    <w:sdtPr>
+      <w:id w:val="-1456631894"/>
+      <w:docPartObj>
+        <w:docPartGallery w:val="Page Numbers (Bottom of Page)"/>
+        <w:docPartUnique/>
+      </w:docPartObj>
+    </w:sdtPr>
+    <w:sdtContent>
+      <w:p>
+        <w:pPr>
+          <w:pStyle w:val="Pidipagina"/>
+          <w:jc w:val="right"/>
+        </w:pPr>
+        <w:r>
+          <w:fldChar w:fldCharType="begin"/>
+        </w:r>
+        <w:r>
+          <w:instrText>PAGE   \* MERGEFORMAT</w:instrText>
+        </w:r>
+        <w:r>
+          <w:fldChar w:fldCharType="separate"/>
+        </w:r>
+        <w:r>
+          <w:t>2</w:t>
+        </w:r>
+        <w:r>
+          <w:fldChar w:fldCharType="end"/>
+        </w:r>
+      </w:p>
+    </w:sdtContent>
+  </w:sdt>
+  <w:p>
+    <w:pPr>
+      <w:pStyle w:val="Pidipagina"/>
+    </w:pPr>
+  </w:p>
+</w:ftr>
+</file>
+
+<file path=word/footnotes.xml><?xml version="1.0" encoding="utf-8"?>
+<w:footnotes xmlns:wpc="http://schemas.microsoft.com/office/word/2010/wordprocessingCanvas" xmlns:cx="http://schemas.microsoft.com/office/drawing/2014/chartex" xmlns:cx1="http://schemas.microsoft.com/office/drawing/2015/9/8/chartex" xmlns:cx2="http://schemas.microsoft.com/office/drawing/2015/10/21/chartex" xmlns:cx3="http://schemas.microsoft.com/office/drawing/2016/5/9/chartex" xmlns:cx4="http://schemas.microsoft.com/office/drawing/2016/5/10/chartex" xmlns:cx5="http://schemas.microsoft.com/office/drawing/2016/5/11/chartex" xmlns:cx6="http://schemas.microsoft.com/office/drawing/2016/5/12/chartex" xmlns:cx7="http://schemas.microsoft.com/office/drawing/2016/5/13/chartex" xmlns:cx8="http://schemas.microsoft.com/office/drawing/2016/5/14/chartex" xmlns:mc="http://schemas.openxmlformats.org/markup-compatibility/2006" xmlns:aink="http://schemas.microsoft.com/office/drawing/2016/ink" xmlns:am3d="http://schemas.microsoft.com/office/drawing/2017/model3d" xmlns:o="urn:schemas-microsoft-com:office:office" xmlns:oel="http://schemas.microsoft.com/office/2019/extlst" xmlns:r="http://schemas.openxmlformats.org/officeDocument/2006/relationships" xmlns:m="http://schemas.openxmlformats.org/officeDocument/2006/math" xmlns:v="urn:schemas-microsoft-com:vml" xmlns:wp14="http://schemas.microsoft.com/office/word/2010/wordprocessingDrawing" xmlns:wp="http://schemas.openxmlformats.org/drawingml/2006/wordprocessingDrawing" xmlns:w10="urn:schemas-microsoft-com:office:word" xmlns:w="http://schemas.openxmlformats.org/wordprocessingml/2006/main" xmlns:w14="http://schemas.microsoft.com/office/word/2010/wordml" xmlns:w15="http://schemas.microsoft.com/office/word/2012/wordml" xmlns:w16cex="http://schemas.microsoft.com/office/word/2018/wordml/cex" xmlns:w16cid="http://schemas.microsoft.com/office/word/2016/wordml/cid" xmlns:w16="http://schemas.microsoft.com/office/word/2018/wordml" xmlns:w16du="http://schemas.microsoft.com/office/word/2023/wordml/word16du" xmlns:w16sdtdh="http://schemas.microsoft.com/office/word/2020/wordml/sdtdatahash" xmlns:w16sdtfl="http://schemas.microsoft.com/office/word/2024/wordml/sdtformatlock" xmlns:w16se="http://schemas.microsoft.com/office/word/2015/wordml/symex" xmlns:wpg="http://schemas.microsoft.com/office/word/2010/wordprocessingGroup" xmlns:wpi="http://schemas.microsoft.com/office/word/2010/wordprocessingInk" xmlns:wne="http://schemas.microsoft.com/office/word/2006/wordml" xmlns:wps="http://schemas.microsoft.com/office/word/2010/wordprocessingShape" mc:Ignorable="w14 w15 w16se w16cid w16 w16cex w16sdtdh w16sdtfl w16du wp14">
+  <w:footnote w:type="separator" w:id="-1">
+    <w:p>
+      <w:pPr>
+        <w:spacing w:after="0" w:line="240" w:lineRule="auto"/>
+      </w:pPr>
+      <w:r>
+        <w:separator/>
+      </w:r>
+    </w:p>
+  </w:footnote>
+  <w:footnote w:type="continuationSeparator" w:id="0">
+    <w:p>
+      <w:pPr>
+        <w:spacing w:after="0" w:line="240" w:lineRule="auto"/>
+      </w:pPr>
+      <w:r>
+        <w:continuationSeparator/>
+      </w:r>
+    </w:p>
+  </w:footnote>
+</w:footnotes>
 </file>
 
 <file path=word/numbering.xml><?xml version="1.0" encoding="utf-8"?>
@@ -7107,6 +8098,92 @@
         <w:rFonts w:ascii="Wingdings" w:hAnsi="Wingdings" w:hint="default"/>
         <w:sz w:val="20"/>
       </w:rPr>
+    </w:lvl>
+  </w:abstractNum>
+  <w:abstractNum w:abstractNumId="7" w15:restartNumberingAfterBreak="0">
+    <w:nsid w:val="62F351C0"/>
+    <w:multiLevelType w:val="hybridMultilevel"/>
+    <w:tmpl w:val="F118BEF0"/>
+    <w:lvl w:ilvl="0" w:tplc="0410000F">
+      <w:start w:val="1"/>
+      <w:numFmt w:val="decimal"/>
+      <w:lvlText w:val="%1."/>
+      <w:lvlJc w:val="left"/>
+      <w:pPr>
+        <w:ind w:left="720" w:hanging="360"/>
+      </w:pPr>
+    </w:lvl>
+    <w:lvl w:ilvl="1" w:tplc="04100019" w:tentative="1">
+      <w:start w:val="1"/>
+      <w:numFmt w:val="lowerLetter"/>
+      <w:lvlText w:val="%2."/>
+      <w:lvlJc w:val="left"/>
+      <w:pPr>
+        <w:ind w:left="1440" w:hanging="360"/>
+      </w:pPr>
+    </w:lvl>
+    <w:lvl w:ilvl="2" w:tplc="0410001B" w:tentative="1">
+      <w:start w:val="1"/>
+      <w:numFmt w:val="lowerRoman"/>
+      <w:lvlText w:val="%3."/>
+      <w:lvlJc w:val="right"/>
+      <w:pPr>
+        <w:ind w:left="2160" w:hanging="180"/>
+      </w:pPr>
+    </w:lvl>
+    <w:lvl w:ilvl="3" w:tplc="0410000F" w:tentative="1">
+      <w:start w:val="1"/>
+      <w:numFmt w:val="decimal"/>
+      <w:lvlText w:val="%4."/>
+      <w:lvlJc w:val="left"/>
+      <w:pPr>
+        <w:ind w:left="2880" w:hanging="360"/>
+      </w:pPr>
+    </w:lvl>
+    <w:lvl w:ilvl="4" w:tplc="04100019" w:tentative="1">
+      <w:start w:val="1"/>
+      <w:numFmt w:val="lowerLetter"/>
+      <w:lvlText w:val="%5."/>
+      <w:lvlJc w:val="left"/>
+      <w:pPr>
+        <w:ind w:left="3600" w:hanging="360"/>
+      </w:pPr>
+    </w:lvl>
+    <w:lvl w:ilvl="5" w:tplc="0410001B" w:tentative="1">
+      <w:start w:val="1"/>
+      <w:numFmt w:val="lowerRoman"/>
+      <w:lvlText w:val="%6."/>
+      <w:lvlJc w:val="right"/>
+      <w:pPr>
+        <w:ind w:left="4320" w:hanging="180"/>
+      </w:pPr>
+    </w:lvl>
+    <w:lvl w:ilvl="6" w:tplc="0410000F" w:tentative="1">
+      <w:start w:val="1"/>
+      <w:numFmt w:val="decimal"/>
+      <w:lvlText w:val="%7."/>
+      <w:lvlJc w:val="left"/>
+      <w:pPr>
+        <w:ind w:left="5040" w:hanging="360"/>
+      </w:pPr>
+    </w:lvl>
+    <w:lvl w:ilvl="7" w:tplc="04100019" w:tentative="1">
+      <w:start w:val="1"/>
+      <w:numFmt w:val="lowerLetter"/>
+      <w:lvlText w:val="%8."/>
+      <w:lvlJc w:val="left"/>
+      <w:pPr>
+        <w:ind w:left="5760" w:hanging="360"/>
+      </w:pPr>
+    </w:lvl>
+    <w:lvl w:ilvl="8" w:tplc="0410001B" w:tentative="1">
+      <w:start w:val="1"/>
+      <w:numFmt w:val="lowerRoman"/>
+      <w:lvlText w:val="%9."/>
+      <w:lvlJc w:val="right"/>
+      <w:pPr>
+        <w:ind w:left="6480" w:hanging="180"/>
+      </w:pPr>
     </w:lvl>
   </w:abstractNum>
   <w:num w:numId="1" w16cid:durableId="2015645311">
@@ -7129,6 +8206,9 @@
   </w:num>
   <w:num w:numId="7" w16cid:durableId="1114785242">
     <w:abstractNumId w:val="1"/>
+  </w:num>
+  <w:num w:numId="8" w16cid:durableId="1217085736">
+    <w:abstractNumId w:val="7"/>
   </w:num>
 </w:numbering>
 </file>
@@ -7736,6 +8816,7 @@
   <w:style w:type="character" w:default="1" w:styleId="Carpredefinitoparagrafo">
     <w:name w:val="Default Paragraph Font"/>
     <w:uiPriority w:val="1"/>
+    <w:semiHidden/>
     <w:unhideWhenUsed/>
   </w:style>
   <w:style w:type="table" w:default="1" w:styleId="Tabellanormale">
@@ -8059,6 +9140,69 @@
       </w:numPr>
     </w:pPr>
   </w:style>
+  <w:style w:type="table" w:styleId="Grigliatabella">
+    <w:name w:val="Table Grid"/>
+    <w:basedOn w:val="Tabellanormale"/>
+    <w:uiPriority w:val="39"/>
+    <w:rsid w:val="00474CDE"/>
+    <w:pPr>
+      <w:spacing w:after="0" w:line="240" w:lineRule="auto"/>
+    </w:pPr>
+    <w:tblPr>
+      <w:tblBorders>
+        <w:top w:val="single" w:sz="4" w:space="0" w:color="auto"/>
+        <w:left w:val="single" w:sz="4" w:space="0" w:color="auto"/>
+        <w:bottom w:val="single" w:sz="4" w:space="0" w:color="auto"/>
+        <w:right w:val="single" w:sz="4" w:space="0" w:color="auto"/>
+        <w:insideH w:val="single" w:sz="4" w:space="0" w:color="auto"/>
+        <w:insideV w:val="single" w:sz="4" w:space="0" w:color="auto"/>
+      </w:tblBorders>
+    </w:tblPr>
+  </w:style>
+  <w:style w:type="paragraph" w:styleId="Intestazione">
+    <w:name w:val="header"/>
+    <w:basedOn w:val="Normale"/>
+    <w:link w:val="IntestazioneCarattere"/>
+    <w:uiPriority w:val="99"/>
+    <w:unhideWhenUsed/>
+    <w:rsid w:val="0028250A"/>
+    <w:pPr>
+      <w:tabs>
+        <w:tab w:val="center" w:pos="4819"/>
+        <w:tab w:val="right" w:pos="9638"/>
+      </w:tabs>
+      <w:spacing w:after="0" w:line="240" w:lineRule="auto"/>
+    </w:pPr>
+  </w:style>
+  <w:style w:type="character" w:customStyle="1" w:styleId="IntestazioneCarattere">
+    <w:name w:val="Intestazione Carattere"/>
+    <w:basedOn w:val="Carpredefinitoparagrafo"/>
+    <w:link w:val="Intestazione"/>
+    <w:uiPriority w:val="99"/>
+    <w:rsid w:val="0028250A"/>
+  </w:style>
+  <w:style w:type="paragraph" w:styleId="Pidipagina">
+    <w:name w:val="footer"/>
+    <w:basedOn w:val="Normale"/>
+    <w:link w:val="PidipaginaCarattere"/>
+    <w:uiPriority w:val="99"/>
+    <w:unhideWhenUsed/>
+    <w:rsid w:val="0028250A"/>
+    <w:pPr>
+      <w:tabs>
+        <w:tab w:val="center" w:pos="4819"/>
+        <w:tab w:val="right" w:pos="9638"/>
+      </w:tabs>
+      <w:spacing w:after="0" w:line="240" w:lineRule="auto"/>
+    </w:pPr>
+  </w:style>
+  <w:style w:type="character" w:customStyle="1" w:styleId="PidipaginaCarattere">
+    <w:name w:val="Piè di pagina Carattere"/>
+    <w:basedOn w:val="Carpredefinitoparagrafo"/>
+    <w:link w:val="Pidipagina"/>
+    <w:uiPriority w:val="99"/>
+    <w:rsid w:val="0028250A"/>
+  </w:style>
 </w:styles>
 </file>
 
@@ -8355,4 +9499,16 @@
     </a:ext>
   </a:extLst>
 </a:theme>
+</file>
+
+<file path=customXml/item1.xml><?xml version="1.0" encoding="utf-8"?>
+<b:Sources xmlns:b="http://schemas.openxmlformats.org/officeDocument/2006/bibliography" xmlns="http://schemas.openxmlformats.org/officeDocument/2006/bibliography" SelectedStyle="\APASixthEditionOfficeOnline.xsl" StyleName="APA" Version="6"/>
+</file>
+
+<file path=customXml/itemProps1.xml><?xml version="1.0" encoding="utf-8"?>
+<ds:datastoreItem xmlns:ds="http://schemas.openxmlformats.org/officeDocument/2006/customXml" ds:itemID="{34C86918-C686-4C4E-904E-852BDC11721C}">
+  <ds:schemaRefs>
+    <ds:schemaRef ds:uri="http://schemas.openxmlformats.org/officeDocument/2006/bibliography"/>
+  </ds:schemaRefs>
+</ds:datastoreItem>
 </file>
</xml_diff>

<commit_message>
Modifiche a project plan
</commit_message>
<xml_diff>
--- a/documentazione/project plan.docx
+++ b/documentazione/project plan.docx
@@ -241,37 +241,497 @@
         <w:rPr>
           <w:b/>
           <w:bCs/>
-          <w:sz w:val="28"/>
-          <w:szCs w:val="28"/>
-        </w:rPr>
-      </w:pPr>
-      <w:r>
+          <w:sz w:val="24"/>
+          <w:szCs w:val="24"/>
+        </w:rPr>
+      </w:pPr>
+      <w:r>
+        <w:rPr>
+          <w:b/>
+          <w:bCs/>
+          <w:sz w:val="24"/>
+          <w:szCs w:val="24"/>
+        </w:rPr>
+        <w:t>Docente:</w:t>
+      </w:r>
+      <w:r>
+        <w:rPr>
+          <w:b/>
+          <w:bCs/>
+          <w:sz w:val="24"/>
+          <w:szCs w:val="24"/>
+        </w:rPr>
+        <w:tab/>
+      </w:r>
+      <w:r>
+        <w:rPr>
+          <w:b/>
+          <w:bCs/>
+          <w:sz w:val="24"/>
+          <w:szCs w:val="24"/>
+        </w:rPr>
+        <w:tab/>
+      </w:r>
+      <w:r>
+        <w:rPr>
+          <w:b/>
+          <w:bCs/>
+          <w:sz w:val="24"/>
+          <w:szCs w:val="24"/>
+        </w:rPr>
+        <w:tab/>
+      </w:r>
+      <w:r>
+        <w:rPr>
+          <w:b/>
+          <w:bCs/>
+          <w:sz w:val="24"/>
+          <w:szCs w:val="24"/>
+        </w:rPr>
+        <w:tab/>
+      </w:r>
+      <w:r>
+        <w:rPr>
+          <w:b/>
+          <w:bCs/>
+          <w:sz w:val="24"/>
+          <w:szCs w:val="24"/>
+        </w:rPr>
+        <w:tab/>
+      </w:r>
+      <w:r>
+        <w:rPr>
+          <w:b/>
+          <w:bCs/>
+          <w:sz w:val="24"/>
+          <w:szCs w:val="24"/>
+        </w:rPr>
+        <w:tab/>
+      </w:r>
+      <w:r>
+        <w:rPr>
+          <w:b/>
+          <w:bCs/>
+          <w:sz w:val="24"/>
+          <w:szCs w:val="24"/>
+        </w:rPr>
+        <w:tab/>
+      </w:r>
+      <w:r>
+        <w:rPr>
+          <w:b/>
+          <w:bCs/>
+          <w:sz w:val="24"/>
+          <w:szCs w:val="24"/>
+        </w:rPr>
+        <w:tab/>
+        <w:t>Gruppo di lavoro:</w:t>
+      </w:r>
+    </w:p>
+    <w:p>
+      <w:pPr>
+        <w:tabs>
+          <w:tab w:val="left" w:pos="3518"/>
+        </w:tabs>
+        <w:rPr>
+          <w:b/>
+          <w:bCs/>
+          <w:sz w:val="24"/>
+          <w:szCs w:val="24"/>
+        </w:rPr>
+      </w:pPr>
+      <w:r>
+        <w:rPr>
+          <w:b/>
+          <w:bCs/>
+          <w:sz w:val="24"/>
+          <w:szCs w:val="24"/>
+        </w:rPr>
+        <w:t>Prof. Angelo Gargantini</w:t>
+      </w:r>
+      <w:r>
+        <w:rPr>
+          <w:b/>
+          <w:bCs/>
+          <w:sz w:val="24"/>
+          <w:szCs w:val="24"/>
+        </w:rPr>
+        <w:tab/>
+      </w:r>
+      <w:r>
+        <w:rPr>
+          <w:b/>
+          <w:bCs/>
+          <w:sz w:val="24"/>
+          <w:szCs w:val="24"/>
+        </w:rPr>
+        <w:tab/>
+      </w:r>
+      <w:r>
+        <w:rPr>
+          <w:b/>
+          <w:bCs/>
+          <w:sz w:val="24"/>
+          <w:szCs w:val="24"/>
+        </w:rPr>
+        <w:tab/>
+      </w:r>
+      <w:r>
+        <w:rPr>
+          <w:b/>
+          <w:bCs/>
+          <w:sz w:val="24"/>
+          <w:szCs w:val="24"/>
+        </w:rPr>
+        <w:tab/>
+      </w:r>
+      <w:r>
+        <w:rPr>
+          <w:b/>
+          <w:bCs/>
+          <w:sz w:val="24"/>
+          <w:szCs w:val="24"/>
+        </w:rPr>
+        <w:tab/>
+      </w:r>
+      <w:r>
+        <w:rPr>
+          <w:b/>
+          <w:bCs/>
+          <w:sz w:val="24"/>
+          <w:szCs w:val="24"/>
+        </w:rPr>
+        <w:tab/>
+        <w:t>Maistrello Tommaso</w:t>
+      </w:r>
+      <w:r>
+        <w:rPr>
+          <w:b/>
+          <w:bCs/>
+          <w:sz w:val="24"/>
+          <w:szCs w:val="24"/>
+        </w:rPr>
+        <w:tab/>
+      </w:r>
+      <w:r>
+        <w:rPr>
+          <w:b/>
+          <w:bCs/>
+          <w:sz w:val="24"/>
+          <w:szCs w:val="24"/>
+        </w:rPr>
+        <w:t>1093176</w:t>
+      </w:r>
+    </w:p>
+    <w:p>
+      <w:pPr>
+        <w:tabs>
+          <w:tab w:val="left" w:pos="3518"/>
+        </w:tabs>
+        <w:rPr>
+          <w:b/>
+          <w:bCs/>
+          <w:sz w:val="24"/>
+          <w:szCs w:val="24"/>
+        </w:rPr>
+      </w:pPr>
+      <w:r>
+        <w:rPr>
+          <w:b/>
+          <w:bCs/>
+          <w:sz w:val="24"/>
+          <w:szCs w:val="24"/>
+        </w:rPr>
+        <w:tab/>
+      </w:r>
+      <w:r>
+        <w:rPr>
+          <w:b/>
+          <w:bCs/>
+          <w:sz w:val="24"/>
+          <w:szCs w:val="24"/>
+        </w:rPr>
+        <w:tab/>
+      </w:r>
+      <w:r>
+        <w:rPr>
+          <w:b/>
+          <w:bCs/>
+          <w:sz w:val="24"/>
+          <w:szCs w:val="24"/>
+        </w:rPr>
+        <w:tab/>
+      </w:r>
+      <w:r>
+        <w:rPr>
+          <w:b/>
+          <w:bCs/>
+          <w:sz w:val="24"/>
+          <w:szCs w:val="24"/>
+        </w:rPr>
+        <w:tab/>
+      </w:r>
+      <w:r>
+        <w:rPr>
+          <w:b/>
+          <w:bCs/>
+          <w:sz w:val="24"/>
+          <w:szCs w:val="24"/>
+        </w:rPr>
+        <w:tab/>
+      </w:r>
+      <w:r>
+        <w:rPr>
+          <w:b/>
+          <w:bCs/>
+          <w:sz w:val="24"/>
+          <w:szCs w:val="24"/>
+        </w:rPr>
+        <w:tab/>
+        <w:t>Mascheretti Davide</w:t>
+      </w:r>
+      <w:r>
+        <w:rPr>
+          <w:b/>
+          <w:bCs/>
+          <w:sz w:val="24"/>
+          <w:szCs w:val="24"/>
+        </w:rPr>
+        <w:t xml:space="preserve"> </w:t>
+      </w:r>
+      <w:r>
+        <w:rPr>
+          <w:b/>
+          <w:bCs/>
+          <w:sz w:val="24"/>
+          <w:szCs w:val="24"/>
+        </w:rPr>
+        <w:tab/>
+      </w:r>
+      <w:r>
+        <w:rPr>
+          <w:b/>
+          <w:bCs/>
+          <w:sz w:val="24"/>
+          <w:szCs w:val="24"/>
+        </w:rPr>
+        <w:t>1093276</w:t>
+      </w:r>
+    </w:p>
+    <w:p>
+      <w:pPr>
+        <w:tabs>
+          <w:tab w:val="left" w:pos="3518"/>
+        </w:tabs>
+        <w:rPr>
+          <w:b/>
+          <w:bCs/>
+          <w:sz w:val="24"/>
+          <w:szCs w:val="24"/>
+        </w:rPr>
+      </w:pPr>
+      <w:r>
+        <w:rPr>
+          <w:b/>
+          <w:bCs/>
+          <w:sz w:val="24"/>
+          <w:szCs w:val="24"/>
+        </w:rPr>
+        <w:tab/>
+      </w:r>
+      <w:r>
+        <w:rPr>
+          <w:b/>
+          <w:bCs/>
+          <w:sz w:val="24"/>
+          <w:szCs w:val="24"/>
+        </w:rPr>
+        <w:tab/>
+      </w:r>
+      <w:r>
+        <w:rPr>
+          <w:b/>
+          <w:bCs/>
+          <w:sz w:val="24"/>
+          <w:szCs w:val="24"/>
+        </w:rPr>
+        <w:tab/>
+      </w:r>
+      <w:r>
+        <w:rPr>
+          <w:b/>
+          <w:bCs/>
+          <w:sz w:val="24"/>
+          <w:szCs w:val="24"/>
+        </w:rPr>
+        <w:tab/>
+      </w:r>
+      <w:r>
+        <w:rPr>
+          <w:b/>
+          <w:bCs/>
+          <w:sz w:val="24"/>
+          <w:szCs w:val="24"/>
+        </w:rPr>
+        <w:tab/>
+      </w:r>
+      <w:r>
+        <w:rPr>
+          <w:b/>
+          <w:bCs/>
+          <w:sz w:val="24"/>
+          <w:szCs w:val="24"/>
+        </w:rPr>
+        <w:tab/>
+        <w:t>Morgera Claudio</w:t>
+      </w:r>
+      <w:r>
+        <w:rPr>
+          <w:b/>
+          <w:bCs/>
+          <w:sz w:val="24"/>
+          <w:szCs w:val="24"/>
+        </w:rPr>
+        <w:t xml:space="preserve"> </w:t>
+      </w:r>
+      <w:r>
+        <w:rPr>
+          <w:b/>
+          <w:bCs/>
+          <w:sz w:val="24"/>
+          <w:szCs w:val="24"/>
+        </w:rPr>
+        <w:tab/>
+        <w:t>1093069</w:t>
+      </w:r>
+    </w:p>
+    <w:p>
+      <w:pPr>
+        <w:tabs>
+          <w:tab w:val="left" w:pos="3518"/>
+        </w:tabs>
+        <w:rPr>
+          <w:b/>
+          <w:bCs/>
+          <w:sz w:val="24"/>
+          <w:szCs w:val="24"/>
+        </w:rPr>
+      </w:pPr>
+      <w:r>
+        <w:rPr>
+          <w:b/>
+          <w:bCs/>
+          <w:sz w:val="24"/>
+          <w:szCs w:val="24"/>
+        </w:rPr>
+        <w:tab/>
+      </w:r>
+      <w:r>
+        <w:rPr>
+          <w:b/>
+          <w:bCs/>
+          <w:sz w:val="24"/>
+          <w:szCs w:val="24"/>
+        </w:rPr>
+        <w:tab/>
+      </w:r>
+      <w:r>
+        <w:rPr>
+          <w:b/>
+          <w:bCs/>
+          <w:sz w:val="24"/>
+          <w:szCs w:val="24"/>
+        </w:rPr>
+        <w:tab/>
+      </w:r>
+      <w:r>
+        <w:rPr>
+          <w:b/>
+          <w:bCs/>
+          <w:sz w:val="24"/>
+          <w:szCs w:val="24"/>
+        </w:rPr>
+        <w:tab/>
+      </w:r>
+      <w:r>
+        <w:rPr>
+          <w:b/>
+          <w:bCs/>
+          <w:sz w:val="24"/>
+          <w:szCs w:val="24"/>
+        </w:rPr>
+        <w:tab/>
+      </w:r>
+      <w:r>
+        <w:rPr>
+          <w:b/>
+          <w:bCs/>
+          <w:sz w:val="24"/>
+          <w:szCs w:val="24"/>
+        </w:rPr>
+        <w:tab/>
+        <w:t>Valenari Francesco</w:t>
+      </w:r>
+      <w:r>
+        <w:rPr>
+          <w:b/>
+          <w:bCs/>
+          <w:sz w:val="24"/>
+          <w:szCs w:val="24"/>
+        </w:rPr>
+        <w:t xml:space="preserve"> </w:t>
+      </w:r>
+      <w:r>
+        <w:rPr>
+          <w:b/>
+          <w:bCs/>
+          <w:sz w:val="24"/>
+          <w:szCs w:val="24"/>
+        </w:rPr>
+        <w:tab/>
+      </w:r>
+      <w:r>
+        <w:rPr>
+          <w:b/>
+          <w:bCs/>
+          <w:sz w:val="24"/>
+          <w:szCs w:val="24"/>
+        </w:rPr>
+        <w:t>1092572</w:t>
+      </w:r>
+    </w:p>
+    <w:p>
+      <w:pPr>
+        <w:jc w:val="center"/>
         <w:rPr>
           <w:b/>
           <w:bCs/>
           <w:sz w:val="28"/>
           <w:szCs w:val="28"/>
         </w:rPr>
-        <w:t>Docente:</w:t>
-      </w:r>
-      <w:r>
+      </w:pPr>
+    </w:p>
+    <w:p>
+      <w:pPr>
+        <w:jc w:val="both"/>
         <w:rPr>
           <w:b/>
           <w:bCs/>
           <w:sz w:val="28"/>
           <w:szCs w:val="28"/>
         </w:rPr>
-        <w:tab/>
-      </w:r>
-      <w:r>
+      </w:pPr>
+    </w:p>
+    <w:p>
+      <w:pPr>
+        <w:jc w:val="center"/>
         <w:rPr>
           <w:b/>
           <w:bCs/>
           <w:sz w:val="28"/>
           <w:szCs w:val="28"/>
         </w:rPr>
-        <w:tab/>
-      </w:r>
+      </w:pPr>
       <w:r>
         <w:rPr>
           <w:b/>
@@ -279,388 +739,20 @@
           <w:sz w:val="28"/>
           <w:szCs w:val="28"/>
         </w:rPr>
-        <w:tab/>
-      </w:r>
-      <w:r>
-        <w:rPr>
-          <w:b/>
-          <w:bCs/>
-          <w:sz w:val="28"/>
-          <w:szCs w:val="28"/>
-        </w:rPr>
-        <w:tab/>
-      </w:r>
-      <w:r>
-        <w:rPr>
-          <w:b/>
-          <w:bCs/>
-          <w:sz w:val="28"/>
-          <w:szCs w:val="28"/>
-        </w:rPr>
-        <w:tab/>
-      </w:r>
-      <w:r>
-        <w:rPr>
-          <w:b/>
-          <w:bCs/>
-          <w:sz w:val="28"/>
-          <w:szCs w:val="28"/>
-        </w:rPr>
-        <w:tab/>
-      </w:r>
-      <w:r>
-        <w:rPr>
-          <w:b/>
-          <w:bCs/>
-          <w:sz w:val="28"/>
-          <w:szCs w:val="28"/>
-        </w:rPr>
-        <w:tab/>
-      </w:r>
-      <w:r>
-        <w:rPr>
-          <w:b/>
-          <w:bCs/>
-          <w:sz w:val="28"/>
-          <w:szCs w:val="28"/>
-        </w:rPr>
-        <w:tab/>
-        <w:t>Gruppo di lavoro:</w:t>
-      </w:r>
-    </w:p>
-    <w:p>
-      <w:pPr>
-        <w:tabs>
-          <w:tab w:val="left" w:pos="3518"/>
-        </w:tabs>
-        <w:rPr>
-          <w:b/>
-          <w:bCs/>
-          <w:sz w:val="28"/>
-          <w:szCs w:val="28"/>
-        </w:rPr>
-      </w:pPr>
-      <w:r>
-        <w:rPr>
-          <w:b/>
-          <w:bCs/>
-          <w:sz w:val="28"/>
-          <w:szCs w:val="28"/>
-        </w:rPr>
-        <w:t>Prof. Angelo Gargantini</w:t>
-      </w:r>
-      <w:r>
-        <w:rPr>
-          <w:b/>
-          <w:bCs/>
-          <w:sz w:val="28"/>
-          <w:szCs w:val="28"/>
-        </w:rPr>
-        <w:tab/>
-      </w:r>
-      <w:r>
-        <w:rPr>
-          <w:b/>
-          <w:bCs/>
-          <w:sz w:val="28"/>
-          <w:szCs w:val="28"/>
-        </w:rPr>
-        <w:tab/>
-      </w:r>
-      <w:r>
-        <w:rPr>
-          <w:b/>
-          <w:bCs/>
-          <w:sz w:val="28"/>
-          <w:szCs w:val="28"/>
-        </w:rPr>
-        <w:tab/>
-      </w:r>
-      <w:r>
-        <w:rPr>
-          <w:b/>
-          <w:bCs/>
-          <w:sz w:val="28"/>
-          <w:szCs w:val="28"/>
-        </w:rPr>
-        <w:tab/>
-      </w:r>
-      <w:r>
-        <w:rPr>
-          <w:b/>
-          <w:bCs/>
-          <w:sz w:val="28"/>
-          <w:szCs w:val="28"/>
-        </w:rPr>
-        <w:tab/>
-      </w:r>
-      <w:r>
-        <w:rPr>
-          <w:b/>
-          <w:bCs/>
-          <w:sz w:val="28"/>
-          <w:szCs w:val="28"/>
-        </w:rPr>
-        <w:tab/>
-      </w:r>
-      <w:r>
-        <w:rPr>
-          <w:b/>
-          <w:bCs/>
-          <w:sz w:val="28"/>
-          <w:szCs w:val="28"/>
-        </w:rPr>
-        <w:t>Maistrello Tommaso</w:t>
-      </w:r>
-    </w:p>
-    <w:p>
-      <w:pPr>
-        <w:tabs>
-          <w:tab w:val="left" w:pos="3518"/>
-        </w:tabs>
-        <w:rPr>
-          <w:b/>
-          <w:bCs/>
-          <w:sz w:val="28"/>
-          <w:szCs w:val="28"/>
-        </w:rPr>
-      </w:pPr>
-      <w:r>
-        <w:rPr>
-          <w:b/>
-          <w:bCs/>
-          <w:sz w:val="28"/>
-          <w:szCs w:val="28"/>
-        </w:rPr>
-        <w:tab/>
-      </w:r>
-      <w:r>
-        <w:rPr>
-          <w:b/>
-          <w:bCs/>
-          <w:sz w:val="28"/>
-          <w:szCs w:val="28"/>
-        </w:rPr>
-        <w:tab/>
-      </w:r>
-      <w:r>
-        <w:rPr>
-          <w:b/>
-          <w:bCs/>
-          <w:sz w:val="28"/>
-          <w:szCs w:val="28"/>
-        </w:rPr>
-        <w:tab/>
-      </w:r>
-      <w:r>
-        <w:rPr>
-          <w:b/>
-          <w:bCs/>
-          <w:sz w:val="28"/>
-          <w:szCs w:val="28"/>
-        </w:rPr>
-        <w:tab/>
-      </w:r>
-      <w:r>
-        <w:rPr>
-          <w:b/>
-          <w:bCs/>
-          <w:sz w:val="28"/>
-          <w:szCs w:val="28"/>
-        </w:rPr>
-        <w:tab/>
-      </w:r>
-      <w:r>
-        <w:rPr>
-          <w:b/>
-          <w:bCs/>
-          <w:sz w:val="28"/>
-          <w:szCs w:val="28"/>
-        </w:rPr>
-        <w:tab/>
-        <w:t>Mascheretti Davide</w:t>
-      </w:r>
-    </w:p>
-    <w:p>
-      <w:pPr>
-        <w:tabs>
-          <w:tab w:val="left" w:pos="3518"/>
-        </w:tabs>
-        <w:rPr>
-          <w:b/>
-          <w:bCs/>
-          <w:sz w:val="28"/>
-          <w:szCs w:val="28"/>
-        </w:rPr>
-      </w:pPr>
-      <w:r>
-        <w:rPr>
-          <w:b/>
-          <w:bCs/>
-          <w:sz w:val="28"/>
-          <w:szCs w:val="28"/>
-        </w:rPr>
-        <w:tab/>
-      </w:r>
-      <w:r>
-        <w:rPr>
-          <w:b/>
-          <w:bCs/>
-          <w:sz w:val="28"/>
-          <w:szCs w:val="28"/>
-        </w:rPr>
-        <w:tab/>
-      </w:r>
-      <w:r>
-        <w:rPr>
-          <w:b/>
-          <w:bCs/>
-          <w:sz w:val="28"/>
-          <w:szCs w:val="28"/>
-        </w:rPr>
-        <w:tab/>
-      </w:r>
-      <w:r>
-        <w:rPr>
-          <w:b/>
-          <w:bCs/>
-          <w:sz w:val="28"/>
-          <w:szCs w:val="28"/>
-        </w:rPr>
-        <w:tab/>
-      </w:r>
-      <w:r>
-        <w:rPr>
-          <w:b/>
-          <w:bCs/>
-          <w:sz w:val="28"/>
-          <w:szCs w:val="28"/>
-        </w:rPr>
-        <w:tab/>
-      </w:r>
-      <w:r>
-        <w:rPr>
-          <w:b/>
-          <w:bCs/>
-          <w:sz w:val="28"/>
-          <w:szCs w:val="28"/>
-        </w:rPr>
-        <w:tab/>
-        <w:t>Morgera Claudio</w:t>
-      </w:r>
-    </w:p>
-    <w:p>
-      <w:pPr>
-        <w:tabs>
-          <w:tab w:val="left" w:pos="3518"/>
-        </w:tabs>
-        <w:rPr>
-          <w:b/>
-          <w:bCs/>
-          <w:sz w:val="28"/>
-          <w:szCs w:val="28"/>
-        </w:rPr>
-      </w:pPr>
-      <w:r>
-        <w:rPr>
-          <w:b/>
-          <w:bCs/>
-          <w:sz w:val="28"/>
-          <w:szCs w:val="28"/>
-        </w:rPr>
-        <w:tab/>
-      </w:r>
-      <w:r>
-        <w:rPr>
-          <w:b/>
-          <w:bCs/>
-          <w:sz w:val="28"/>
-          <w:szCs w:val="28"/>
-        </w:rPr>
-        <w:tab/>
-      </w:r>
-      <w:r>
-        <w:rPr>
-          <w:b/>
-          <w:bCs/>
-          <w:sz w:val="28"/>
-          <w:szCs w:val="28"/>
-        </w:rPr>
-        <w:tab/>
-      </w:r>
-      <w:r>
-        <w:rPr>
-          <w:b/>
-          <w:bCs/>
-          <w:sz w:val="28"/>
-          <w:szCs w:val="28"/>
-        </w:rPr>
-        <w:tab/>
-      </w:r>
-      <w:r>
-        <w:rPr>
-          <w:b/>
-          <w:bCs/>
-          <w:sz w:val="28"/>
-          <w:szCs w:val="28"/>
-        </w:rPr>
-        <w:tab/>
-      </w:r>
-      <w:r>
-        <w:rPr>
-          <w:b/>
-          <w:bCs/>
-          <w:sz w:val="28"/>
-          <w:szCs w:val="28"/>
-        </w:rPr>
-        <w:tab/>
-        <w:t>Valenari Francesco</w:t>
-      </w:r>
-    </w:p>
-    <w:p>
-      <w:pPr>
-        <w:jc w:val="center"/>
-        <w:rPr>
-          <w:b/>
-          <w:bCs/>
-          <w:sz w:val="28"/>
-          <w:szCs w:val="28"/>
-        </w:rPr>
-      </w:pPr>
-    </w:p>
-    <w:p>
-      <w:pPr>
-        <w:jc w:val="both"/>
-        <w:rPr>
-          <w:b/>
-          <w:bCs/>
-          <w:sz w:val="28"/>
-          <w:szCs w:val="28"/>
-        </w:rPr>
-      </w:pPr>
-    </w:p>
-    <w:p>
-      <w:pPr>
-        <w:jc w:val="center"/>
-        <w:rPr>
-          <w:b/>
-          <w:bCs/>
-          <w:sz w:val="28"/>
-          <w:szCs w:val="28"/>
-        </w:rPr>
-      </w:pPr>
-      <w:r>
-        <w:rPr>
-          <w:b/>
-          <w:bCs/>
-          <w:sz w:val="28"/>
-          <w:szCs w:val="28"/>
-        </w:rPr>
         <w:t>Anno Accademico 2025/2026</w:t>
       </w:r>
     </w:p>
     <w:sdt>
       <w:sdtPr>
+        <w:rPr>
+          <w:rFonts w:asciiTheme="minorHAnsi" w:eastAsiaTheme="minorHAnsi" w:hAnsiTheme="minorHAnsi" w:cstheme="minorBidi"/>
+          <w:color w:val="auto"/>
+          <w:kern w:val="2"/>
+          <w:sz w:val="22"/>
+          <w:szCs w:val="22"/>
+          <w:lang w:eastAsia="en-US"/>
+          <w14:ligatures w14:val="standardContextual"/>
+        </w:rPr>
         <w:id w:val="-517078545"/>
         <w:docPartObj>
           <w:docPartGallery w:val="Table of Contents"/>
@@ -669,15 +761,8 @@
       </w:sdtPr>
       <w:sdtEndPr>
         <w:rPr>
-          <w:rFonts w:asciiTheme="minorHAnsi" w:eastAsiaTheme="minorHAnsi" w:hAnsiTheme="minorHAnsi" w:cstheme="minorBidi"/>
           <w:b/>
           <w:bCs/>
-          <w:color w:val="auto"/>
-          <w:kern w:val="2"/>
-          <w:sz w:val="22"/>
-          <w:szCs w:val="22"/>
-          <w:lang w:eastAsia="en-US"/>
-          <w14:ligatures w14:val="standardContextual"/>
         </w:rPr>
       </w:sdtEndPr>
       <w:sdtContent>
@@ -692,9 +777,6 @@
         <w:p>
           <w:pPr>
             <w:pStyle w:val="Sommario1"/>
-            <w:tabs>
-              <w:tab w:val="right" w:leader="dot" w:pos="9628"/>
-            </w:tabs>
             <w:rPr>
               <w:rFonts w:eastAsiaTheme="minorEastAsia"/>
               <w:noProof/>
@@ -712,7 +794,7 @@
           <w:r>
             <w:fldChar w:fldCharType="separate"/>
           </w:r>
-          <w:hyperlink w:anchor="_Toc215752536" w:history="1">
+          <w:hyperlink w:anchor="_Toc216341997" w:history="1">
             <w:r>
               <w:rPr>
                 <w:rStyle w:val="Collegamentoipertestuale"/>
@@ -739,7 +821,7 @@
                 <w:noProof/>
                 <w:webHidden/>
               </w:rPr>
-              <w:instrText xml:space="preserve"> PAGEREF _Toc215752536 \h </w:instrText>
+              <w:instrText xml:space="preserve"> PAGEREF _Toc216341997 \h </w:instrText>
             </w:r>
             <w:r>
               <w:rPr>
@@ -773,9 +855,6 @@
         <w:p>
           <w:pPr>
             <w:pStyle w:val="Sommario1"/>
-            <w:tabs>
-              <w:tab w:val="right" w:leader="dot" w:pos="9628"/>
-            </w:tabs>
             <w:rPr>
               <w:rFonts w:eastAsiaTheme="minorEastAsia"/>
               <w:noProof/>
@@ -784,7 +863,7 @@
               <w:lang w:eastAsia="it-IT"/>
             </w:rPr>
           </w:pPr>
-          <w:hyperlink w:anchor="_Toc215752537" w:history="1">
+          <w:hyperlink w:anchor="_Toc216341998" w:history="1">
             <w:r>
               <w:rPr>
                 <w:rStyle w:val="Collegamentoipertestuale"/>
@@ -811,7 +890,7 @@
                 <w:noProof/>
                 <w:webHidden/>
               </w:rPr>
-              <w:instrText xml:space="preserve"> PAGEREF _Toc215752537 \h </w:instrText>
+              <w:instrText xml:space="preserve"> PAGEREF _Toc216341998 \h </w:instrText>
             </w:r>
             <w:r>
               <w:rPr>
@@ -845,9 +924,6 @@
         <w:p>
           <w:pPr>
             <w:pStyle w:val="Sommario1"/>
-            <w:tabs>
-              <w:tab w:val="right" w:leader="dot" w:pos="9628"/>
-            </w:tabs>
             <w:rPr>
               <w:rFonts w:eastAsiaTheme="minorEastAsia"/>
               <w:noProof/>
@@ -856,7 +932,7 @@
               <w:lang w:eastAsia="it-IT"/>
             </w:rPr>
           </w:pPr>
-          <w:hyperlink w:anchor="_Toc215752538" w:history="1">
+          <w:hyperlink w:anchor="_Toc216341999" w:history="1">
             <w:r>
               <w:rPr>
                 <w:rStyle w:val="Collegamentoipertestuale"/>
@@ -883,7 +959,7 @@
                 <w:noProof/>
                 <w:webHidden/>
               </w:rPr>
-              <w:instrText xml:space="preserve"> PAGEREF _Toc215752538 \h </w:instrText>
+              <w:instrText xml:space="preserve"> PAGEREF _Toc216341999 \h </w:instrText>
             </w:r>
             <w:r>
               <w:rPr>
@@ -917,9 +993,6 @@
         <w:p>
           <w:pPr>
             <w:pStyle w:val="Sommario1"/>
-            <w:tabs>
-              <w:tab w:val="right" w:leader="dot" w:pos="9628"/>
-            </w:tabs>
             <w:rPr>
               <w:rFonts w:eastAsiaTheme="minorEastAsia"/>
               <w:noProof/>
@@ -928,27 +1001,13 @@
               <w:lang w:eastAsia="it-IT"/>
             </w:rPr>
           </w:pPr>
-          <w:hyperlink w:anchor="_Toc215752539" w:history="1">
+          <w:hyperlink w:anchor="_Toc216342000" w:history="1">
             <w:r>
               <w:rPr>
                 <w:rStyle w:val="Collegamentoipertestuale"/>
                 <w:noProof/>
               </w:rPr>
-              <w:t>STANDARD, LINEE GUIDE E PRO</w:t>
-            </w:r>
-            <w:r>
-              <w:rPr>
-                <w:rStyle w:val="Collegamentoipertestuale"/>
-                <w:noProof/>
-              </w:rPr>
-              <w:t>C</w:t>
-            </w:r>
-            <w:r>
-              <w:rPr>
-                <w:rStyle w:val="Collegamentoipertestuale"/>
-                <w:noProof/>
-              </w:rPr>
-              <w:t>EDURE</w:t>
+              <w:t>STANDARD, LINEE GUIDE E PROCEDURE</w:t>
             </w:r>
             <w:r>
               <w:rPr>
@@ -969,7 +1028,7 @@
                 <w:noProof/>
                 <w:webHidden/>
               </w:rPr>
-              <w:instrText xml:space="preserve"> PAGEREF _Toc215752539 \h </w:instrText>
+              <w:instrText xml:space="preserve"> PAGEREF _Toc216342000 \h </w:instrText>
             </w:r>
             <w:r>
               <w:rPr>
@@ -1014,7 +1073,7 @@
               <w:lang w:eastAsia="it-IT"/>
             </w:rPr>
           </w:pPr>
-          <w:hyperlink w:anchor="_Toc215752540" w:history="1">
+          <w:hyperlink w:anchor="_Toc216342001" w:history="1">
             <w:r>
               <w:rPr>
                 <w:rStyle w:val="Collegamentoipertestuale"/>
@@ -1041,7 +1100,7 @@
                 <w:noProof/>
                 <w:webHidden/>
               </w:rPr>
-              <w:instrText xml:space="preserve"> PAGEREF _Toc215752540 \h </w:instrText>
+              <w:instrText xml:space="preserve"> PAGEREF _Toc216342001 \h </w:instrText>
             </w:r>
             <w:r>
               <w:rPr>
@@ -1086,7 +1145,7 @@
               <w:lang w:eastAsia="it-IT"/>
             </w:rPr>
           </w:pPr>
-          <w:hyperlink w:anchor="_Toc215752541" w:history="1">
+          <w:hyperlink w:anchor="_Toc216342002" w:history="1">
             <w:r>
               <w:rPr>
                 <w:rStyle w:val="Collegamentoipertestuale"/>
@@ -1113,7 +1172,7 @@
                 <w:noProof/>
                 <w:webHidden/>
               </w:rPr>
-              <w:instrText xml:space="preserve"> PAGEREF _Toc215752541 \h </w:instrText>
+              <w:instrText xml:space="preserve"> PAGEREF _Toc216342002 \h </w:instrText>
             </w:r>
             <w:r>
               <w:rPr>
@@ -1158,7 +1217,7 @@
               <w:lang w:eastAsia="it-IT"/>
             </w:rPr>
           </w:pPr>
-          <w:hyperlink w:anchor="_Toc215752542" w:history="1">
+          <w:hyperlink w:anchor="_Toc216342003" w:history="1">
             <w:r>
               <w:rPr>
                 <w:rStyle w:val="Collegamentoipertestuale"/>
@@ -1185,7 +1244,7 @@
                 <w:noProof/>
                 <w:webHidden/>
               </w:rPr>
-              <w:instrText xml:space="preserve"> PAGEREF _Toc215752542 \h </w:instrText>
+              <w:instrText xml:space="preserve"> PAGEREF _Toc216342003 \h </w:instrText>
             </w:r>
             <w:r>
               <w:rPr>
@@ -1230,7 +1289,7 @@
               <w:lang w:eastAsia="it-IT"/>
             </w:rPr>
           </w:pPr>
-          <w:hyperlink w:anchor="_Toc215752543" w:history="1">
+          <w:hyperlink w:anchor="_Toc216342004" w:history="1">
             <w:r>
               <w:rPr>
                 <w:rStyle w:val="Collegamentoipertestuale"/>
@@ -1257,7 +1316,7 @@
                 <w:noProof/>
                 <w:webHidden/>
               </w:rPr>
-              <w:instrText xml:space="preserve"> PAGEREF _Toc215752543 \h </w:instrText>
+              <w:instrText xml:space="preserve"> PAGEREF _Toc216342004 \h </w:instrText>
             </w:r>
             <w:r>
               <w:rPr>
@@ -1291,9 +1350,6 @@
         <w:p>
           <w:pPr>
             <w:pStyle w:val="Sommario1"/>
-            <w:tabs>
-              <w:tab w:val="right" w:leader="dot" w:pos="9628"/>
-            </w:tabs>
             <w:rPr>
               <w:rFonts w:eastAsiaTheme="minorEastAsia"/>
               <w:noProof/>
@@ -1302,7 +1358,7 @@
               <w:lang w:eastAsia="it-IT"/>
             </w:rPr>
           </w:pPr>
-          <w:hyperlink w:anchor="_Toc215752544" w:history="1">
+          <w:hyperlink w:anchor="_Toc216342005" w:history="1">
             <w:r>
               <w:rPr>
                 <w:rStyle w:val="Collegamentoipertestuale"/>
@@ -1329,7 +1385,7 @@
                 <w:noProof/>
                 <w:webHidden/>
               </w:rPr>
-              <w:instrText xml:space="preserve"> PAGEREF _Toc215752544 \h </w:instrText>
+              <w:instrText xml:space="preserve"> PAGEREF _Toc216342005 \h </w:instrText>
             </w:r>
             <w:r>
               <w:rPr>
@@ -1363,9 +1419,6 @@
         <w:p>
           <w:pPr>
             <w:pStyle w:val="Sommario1"/>
-            <w:tabs>
-              <w:tab w:val="right" w:leader="dot" w:pos="9628"/>
-            </w:tabs>
             <w:rPr>
               <w:rFonts w:eastAsiaTheme="minorEastAsia"/>
               <w:noProof/>
@@ -1374,7 +1427,7 @@
               <w:lang w:eastAsia="it-IT"/>
             </w:rPr>
           </w:pPr>
-          <w:hyperlink w:anchor="_Toc215752545" w:history="1">
+          <w:hyperlink w:anchor="_Toc216342006" w:history="1">
             <w:r>
               <w:rPr>
                 <w:rStyle w:val="Collegamentoipertestuale"/>
@@ -1401,7 +1454,7 @@
                 <w:noProof/>
                 <w:webHidden/>
               </w:rPr>
-              <w:instrText xml:space="preserve"> PAGEREF _Toc215752545 \h </w:instrText>
+              <w:instrText xml:space="preserve"> PAGEREF _Toc216342006 \h </w:instrText>
             </w:r>
             <w:r>
               <w:rPr>
@@ -1435,9 +1488,6 @@
         <w:p>
           <w:pPr>
             <w:pStyle w:val="Sommario1"/>
-            <w:tabs>
-              <w:tab w:val="right" w:leader="dot" w:pos="9628"/>
-            </w:tabs>
             <w:rPr>
               <w:rFonts w:eastAsiaTheme="minorEastAsia"/>
               <w:noProof/>
@@ -1446,7 +1496,7 @@
               <w:lang w:eastAsia="it-IT"/>
             </w:rPr>
           </w:pPr>
-          <w:hyperlink w:anchor="_Toc215752546" w:history="1">
+          <w:hyperlink w:anchor="_Toc216342007" w:history="1">
             <w:r>
               <w:rPr>
                 <w:rStyle w:val="Collegamentoipertestuale"/>
@@ -1473,7 +1523,7 @@
                 <w:noProof/>
                 <w:webHidden/>
               </w:rPr>
-              <w:instrText xml:space="preserve"> PAGEREF _Toc215752546 \h </w:instrText>
+              <w:instrText xml:space="preserve"> PAGEREF _Toc216342007 \h </w:instrText>
             </w:r>
             <w:r>
               <w:rPr>
@@ -1507,9 +1557,6 @@
         <w:p>
           <w:pPr>
             <w:pStyle w:val="Sommario1"/>
-            <w:tabs>
-              <w:tab w:val="right" w:leader="dot" w:pos="9628"/>
-            </w:tabs>
             <w:rPr>
               <w:rFonts w:eastAsiaTheme="minorEastAsia"/>
               <w:noProof/>
@@ -1518,7 +1565,7 @@
               <w:lang w:eastAsia="it-IT"/>
             </w:rPr>
           </w:pPr>
-          <w:hyperlink w:anchor="_Toc215752547" w:history="1">
+          <w:hyperlink w:anchor="_Toc216342008" w:history="1">
             <w:r>
               <w:rPr>
                 <w:rStyle w:val="Collegamentoipertestuale"/>
@@ -1545,7 +1592,7 @@
                 <w:noProof/>
                 <w:webHidden/>
               </w:rPr>
-              <w:instrText xml:space="preserve"> PAGEREF _Toc215752547 \h </w:instrText>
+              <w:instrText xml:space="preserve"> PAGEREF _Toc216342008 \h </w:instrText>
             </w:r>
             <w:r>
               <w:rPr>
@@ -1579,9 +1626,6 @@
         <w:p>
           <w:pPr>
             <w:pStyle w:val="Sommario1"/>
-            <w:tabs>
-              <w:tab w:val="right" w:leader="dot" w:pos="9628"/>
-            </w:tabs>
             <w:rPr>
               <w:rFonts w:eastAsiaTheme="minorEastAsia"/>
               <w:noProof/>
@@ -1590,7 +1634,7 @@
               <w:lang w:eastAsia="it-IT"/>
             </w:rPr>
           </w:pPr>
-          <w:hyperlink w:anchor="_Toc215752548" w:history="1">
+          <w:hyperlink w:anchor="_Toc216342009" w:history="1">
             <w:r>
               <w:rPr>
                 <w:rStyle w:val="Collegamentoipertestuale"/>
@@ -1617,7 +1661,7 @@
                 <w:noProof/>
                 <w:webHidden/>
               </w:rPr>
-              <w:instrText xml:space="preserve"> PAGEREF _Toc215752548 \h </w:instrText>
+              <w:instrText xml:space="preserve"> PAGEREF _Toc216342009 \h </w:instrText>
             </w:r>
             <w:r>
               <w:rPr>
@@ -1651,9 +1695,6 @@
         <w:p>
           <w:pPr>
             <w:pStyle w:val="Sommario1"/>
-            <w:tabs>
-              <w:tab w:val="right" w:leader="dot" w:pos="9628"/>
-            </w:tabs>
             <w:rPr>
               <w:rFonts w:eastAsiaTheme="minorEastAsia"/>
               <w:noProof/>
@@ -1662,7 +1703,7 @@
               <w:lang w:eastAsia="it-IT"/>
             </w:rPr>
           </w:pPr>
-          <w:hyperlink w:anchor="_Toc215752549" w:history="1">
+          <w:hyperlink w:anchor="_Toc216342010" w:history="1">
             <w:r>
               <w:rPr>
                 <w:rStyle w:val="Collegamentoipertestuale"/>
@@ -1689,7 +1730,7 @@
                 <w:noProof/>
                 <w:webHidden/>
               </w:rPr>
-              <w:instrText xml:space="preserve"> PAGEREF _Toc215752549 \h </w:instrText>
+              <w:instrText xml:space="preserve"> PAGEREF _Toc216342010 \h </w:instrText>
             </w:r>
             <w:r>
               <w:rPr>
@@ -1723,9 +1764,6 @@
         <w:p>
           <w:pPr>
             <w:pStyle w:val="Sommario1"/>
-            <w:tabs>
-              <w:tab w:val="right" w:leader="dot" w:pos="9628"/>
-            </w:tabs>
             <w:rPr>
               <w:rFonts w:eastAsiaTheme="minorEastAsia"/>
               <w:noProof/>
@@ -1734,7 +1772,7 @@
               <w:lang w:eastAsia="it-IT"/>
             </w:rPr>
           </w:pPr>
-          <w:hyperlink w:anchor="_Toc215752550" w:history="1">
+          <w:hyperlink w:anchor="_Toc216342011" w:history="1">
             <w:r>
               <w:rPr>
                 <w:rStyle w:val="Collegamentoipertestuale"/>
@@ -1761,7 +1799,7 @@
                 <w:noProof/>
                 <w:webHidden/>
               </w:rPr>
-              <w:instrText xml:space="preserve"> PAGEREF _Toc215752550 \h </w:instrText>
+              <w:instrText xml:space="preserve"> PAGEREF _Toc216342011 \h </w:instrText>
             </w:r>
             <w:r>
               <w:rPr>
@@ -1795,9 +1833,6 @@
         <w:p>
           <w:pPr>
             <w:pStyle w:val="Sommario1"/>
-            <w:tabs>
-              <w:tab w:val="right" w:leader="dot" w:pos="9628"/>
-            </w:tabs>
             <w:rPr>
               <w:rFonts w:eastAsiaTheme="minorEastAsia"/>
               <w:noProof/>
@@ -1806,7 +1841,7 @@
               <w:lang w:eastAsia="it-IT"/>
             </w:rPr>
           </w:pPr>
-          <w:hyperlink w:anchor="_Toc215752551" w:history="1">
+          <w:hyperlink w:anchor="_Toc216342012" w:history="1">
             <w:r>
               <w:rPr>
                 <w:rStyle w:val="Collegamentoipertestuale"/>
@@ -1833,7 +1868,7 @@
                 <w:noProof/>
                 <w:webHidden/>
               </w:rPr>
-              <w:instrText xml:space="preserve"> PAGEREF _Toc215752551 \h </w:instrText>
+              <w:instrText xml:space="preserve"> PAGEREF _Toc216342012 \h </w:instrText>
             </w:r>
             <w:r>
               <w:rPr>
@@ -1867,9 +1902,6 @@
         <w:p>
           <w:pPr>
             <w:pStyle w:val="Sommario1"/>
-            <w:tabs>
-              <w:tab w:val="right" w:leader="dot" w:pos="9628"/>
-            </w:tabs>
             <w:rPr>
               <w:rFonts w:eastAsiaTheme="minorEastAsia"/>
               <w:noProof/>
@@ -1878,7 +1910,7 @@
               <w:lang w:eastAsia="it-IT"/>
             </w:rPr>
           </w:pPr>
-          <w:hyperlink w:anchor="_Toc215752552" w:history="1">
+          <w:hyperlink w:anchor="_Toc216342013" w:history="1">
             <w:r>
               <w:rPr>
                 <w:rStyle w:val="Collegamentoipertestuale"/>
@@ -1905,7 +1937,7 @@
                 <w:noProof/>
                 <w:webHidden/>
               </w:rPr>
-              <w:instrText xml:space="preserve"> PAGEREF _Toc215752552 \h </w:instrText>
+              <w:instrText xml:space="preserve"> PAGEREF _Toc216342013 \h </w:instrText>
             </w:r>
             <w:r>
               <w:rPr>
@@ -1939,9 +1971,6 @@
         <w:p>
           <w:pPr>
             <w:pStyle w:val="Sommario1"/>
-            <w:tabs>
-              <w:tab w:val="right" w:leader="dot" w:pos="9628"/>
-            </w:tabs>
             <w:rPr>
               <w:rFonts w:eastAsiaTheme="minorEastAsia"/>
               <w:noProof/>
@@ -1950,7 +1979,7 @@
               <w:lang w:eastAsia="it-IT"/>
             </w:rPr>
           </w:pPr>
-          <w:hyperlink w:anchor="_Toc215752553" w:history="1">
+          <w:hyperlink w:anchor="_Toc216342014" w:history="1">
             <w:r>
               <w:rPr>
                 <w:rStyle w:val="Collegamentoipertestuale"/>
@@ -1977,7 +2006,7 @@
                 <w:noProof/>
                 <w:webHidden/>
               </w:rPr>
-              <w:instrText xml:space="preserve"> PAGEREF _Toc215752553 \h </w:instrText>
+              <w:instrText xml:space="preserve"> PAGEREF _Toc216342014 \h </w:instrText>
             </w:r>
             <w:r>
               <w:rPr>
@@ -2092,7 +2121,7 @@
       <w:pPr>
         <w:pStyle w:val="Stile1"/>
       </w:pPr>
-      <w:bookmarkStart w:id="0" w:name="_Toc215752536"/>
+      <w:bookmarkStart w:id="0" w:name="_Toc216341997"/>
       <w:r>
         <w:lastRenderedPageBreak/>
         <w:t>INTRODUZIONE</w:t>
@@ -2114,80 +2143,131 @@
         <w:jc w:val="both"/>
       </w:pPr>
       <w:r>
-        <w:t>L’app consente agli utenti di bloccare uno slot orario dalla durata di 30 minuti, cumulabili fino ad un massimo di 2 ore, scegliendo direttamente da una mappa integrata</w:t>
+        <w:t>L’app consente agli utenti di bloccare uno slot orario dalla durata di 30 minuti scegliendo direttamente da una mappa integrata</w:t>
       </w:r>
       <w:r>
         <w:t>, centrata sulla posizione corrente dell’utente.</w:t>
       </w:r>
-    </w:p>
-    <w:p>
-      <w:pPr>
-        <w:spacing w:after="0"/>
-        <w:jc w:val="both"/>
-      </w:pPr>
-      <w:r>
-        <w:t>La ricerca può essere filtrata per tipologia, nome e posizione</w:t>
-      </w:r>
-      <w:r>
-        <w:t xml:space="preserve"> sia dalla mappa sia tramite una sezione apposita contenente tutt</w:t>
+      <w:r>
+        <w:t xml:space="preserve"> All’apertura l’utente visualizza la mappa con i marker </w:t>
+      </w:r>
+      <w:r>
+        <w:t>che identificano le colonnine presenti nella zona scelta</w:t>
+      </w:r>
+      <w:r>
+        <w:t xml:space="preserve"> e può accedere, o registrarsi se necessario, tramite un pulsante presente nel menù. Solo dopo aver eseguito l’accesso l’utente può effettuare una prenotazione. </w:t>
+      </w:r>
+      <w:r>
+        <w:t xml:space="preserve"> </w:t>
+      </w:r>
+    </w:p>
+    <w:p>
+      <w:pPr>
+        <w:spacing w:after="0"/>
+        <w:jc w:val="both"/>
+      </w:pPr>
+      <w:r>
+        <w:t>La prenotazione può avvenire sia tramite una barra laterale</w:t>
+      </w:r>
+      <w:r>
+        <w:t xml:space="preserve"> sulla mappa</w:t>
+      </w:r>
+      <w:r>
+        <w:t xml:space="preserve"> che appare nel momento in cui si clicca su un</w:t>
+      </w:r>
+      <w:r>
+        <w:t xml:space="preserve"> marker,</w:t>
+      </w:r>
+      <w:r>
+        <w:t xml:space="preserve"> sia tramite </w:t>
+      </w:r>
+      <w:r>
+        <w:t>la</w:t>
+      </w:r>
+      <w:r>
+        <w:t xml:space="preserve"> pagina</w:t>
+      </w:r>
+      <w:r>
+        <w:t xml:space="preserve"> delle colonnine </w:t>
+      </w:r>
+      <w:r>
+        <w:t>presente nel menù laterale</w:t>
+      </w:r>
+      <w:r>
+        <w:t xml:space="preserve">, </w:t>
+      </w:r>
+      <w:r>
+        <w:t>contenente tutt</w:t>
       </w:r>
       <w:r>
         <w:t>o</w:t>
       </w:r>
       <w:r>
-        <w:t xml:space="preserve"> l’elenco completo delle colonnine disponibili.</w:t>
-      </w:r>
-    </w:p>
-    <w:p>
-      <w:pPr>
-        <w:spacing w:after="0"/>
-        <w:jc w:val="both"/>
-      </w:pPr>
-      <w:r>
-        <w:t>Dopo una prima fase di registrazione (se necessaria) e login, si apre direttamente la mappa stessa con marker che identificano le colonnine presenti nella zona scelta.</w:t>
-      </w:r>
-    </w:p>
-    <w:p>
-      <w:pPr>
-        <w:spacing w:after="0"/>
-        <w:jc w:val="both"/>
-      </w:pPr>
-      <w:r>
-        <w:t xml:space="preserve">La prenotazione può avvenire sia tramite una barra laterale che appare nel momento in cui si clicca su una colonnina, sia tramite una pagina </w:t>
-      </w:r>
-      <w:r>
-        <w:t>presente nel menù laterale.</w:t>
-      </w:r>
-    </w:p>
-    <w:p>
-      <w:pPr>
-        <w:spacing w:after="0"/>
-        <w:jc w:val="both"/>
-      </w:pPr>
-      <w:r>
-        <w:t>A conferma dell’operazione, il sistema genera automaticamente un QR code univoco associato alla colonnina, alla data e all’orario della prenotazione.</w:t>
-      </w:r>
-    </w:p>
-    <w:p>
-      <w:pPr>
-        <w:spacing w:after="0"/>
-        <w:jc w:val="both"/>
-      </w:pPr>
-      <w:r>
-        <w:t xml:space="preserve">Esso viene salvato nella sezione “profilo </w:t>
-      </w:r>
-      <w:r>
-        <w:t>utente” dell’app</w:t>
-      </w:r>
-      <w:r>
-        <w:t xml:space="preserve"> e permette poi tramite la scansione direttamente sulla colonnina di controllare che tutto corrisponda per poi avviare l’erogazione della corrente e la ricarica dell’auto (la gestione di questa fase non rientra nel nostro progetto).</w:t>
-      </w:r>
-    </w:p>
-    <w:p>
-      <w:pPr>
-        <w:spacing w:after="0"/>
-        <w:jc w:val="both"/>
-      </w:pPr>
+        <w:t xml:space="preserve"> l’elenco completo delle colonnine</w:t>
+      </w:r>
+      <w:r>
+        <w:t xml:space="preserve"> e le loro caratteristiche. Questa permette inoltre di filtrare la ricerca</w:t>
+      </w:r>
+      <w:r>
+        <w:t xml:space="preserve"> per tipologia, nome e posizione</w:t>
+      </w:r>
+      <w:r>
+        <w:t>.</w:t>
+      </w:r>
+    </w:p>
+    <w:p>
+      <w:pPr>
+        <w:spacing w:after="0"/>
+        <w:jc w:val="both"/>
+      </w:pPr>
+      <w:r>
+        <w:t>Una volta confermata la prenotazione, e</w:t>
+      </w:r>
+      <w:r>
+        <w:t>ss</w:t>
+      </w:r>
+      <w:r>
+        <w:t>a</w:t>
+      </w:r>
+      <w:r>
+        <w:t xml:space="preserve"> viene salvat</w:t>
+      </w:r>
+      <w:r>
+        <w:t>a</w:t>
+      </w:r>
+      <w:r>
+        <w:t xml:space="preserve"> nella sezione </w:t>
+      </w:r>
+      <w:r>
+        <w:t>“prenotazioni”</w:t>
+      </w:r>
+      <w:r>
+        <w:t xml:space="preserve"> dell’app</w:t>
+      </w:r>
+      <w:r>
+        <w:t>. Cinque minuti prima dell’inizio dello slot orario prenotato, verrà generato un QR Code univoco della prenotazion</w:t>
+      </w:r>
+      <w:r>
+        <w:t>e; questo</w:t>
+      </w:r>
+      <w:r>
+        <w:t xml:space="preserve"> permett</w:t>
+      </w:r>
+      <w:r>
+        <w:t xml:space="preserve">e </w:t>
+      </w:r>
+      <w:r>
+        <w:t>tramite scansione diretta</w:t>
+      </w:r>
+      <w:r>
+        <w:t xml:space="preserve"> a</w:t>
+      </w:r>
+      <w:r>
+        <w:t>lla colonnina di controllare che tutto corrisponda per poi avviare l’erogazione della corrente e la ricarica dell’auto (la gestione di questa fase non rientra nel nostro progetto).</w:t>
+      </w:r>
+      <w:r>
+        <w:t xml:space="preserve"> </w:t>
+      </w:r>
       <w:r>
         <w:t xml:space="preserve">L’idea del QR code permette che solo l’utente che ha prenotato in quello slot </w:t>
       </w:r>
@@ -2204,6 +2284,27 @@
         <w:jc w:val="both"/>
       </w:pPr>
       <w:r>
+        <w:t>L’applicazione include inoltre funzionalità di valutazione</w:t>
+      </w:r>
+      <w:r>
+        <w:t xml:space="preserve"> delle colonnine</w:t>
+      </w:r>
+      <w:r>
+        <w:t xml:space="preserve"> e segnalazione dei guasti</w:t>
+      </w:r>
+      <w:r>
+        <w:t xml:space="preserve"> o occupazioni illecite</w:t>
+      </w:r>
+      <w:r>
+        <w:t>.</w:t>
+      </w:r>
+    </w:p>
+    <w:p>
+      <w:pPr>
+        <w:spacing w:after="0"/>
+        <w:jc w:val="both"/>
+      </w:pPr>
+      <w:r>
         <w:t>L’utente può in ogni momento effettuare il logout dall’applicazione tramite un apposito pulsante presente nel menu.</w:t>
       </w:r>
     </w:p>
@@ -2213,25 +2314,16 @@
         <w:jc w:val="both"/>
       </w:pPr>
       <w:r>
-        <w:t>L’applicazione include inoltre funzionalità di recensione, valutazione e segnalazione dei guasti.</w:t>
-      </w:r>
-    </w:p>
-    <w:p>
-      <w:pPr>
-        <w:spacing w:after="0"/>
-        <w:jc w:val="both"/>
-      </w:pPr>
-      <w:r>
-        <w:t>La nostra applicazione andrebbe a risolvere il problema che, in un futuro con un maggior numero di auto elettriche, una persona che necessita ricarica non rischia di trovare la colonnina occupata, sapendo che nello slot prenotato sarà sicuramente libera.</w:t>
-      </w:r>
-    </w:p>
-    <w:p>
-      <w:pPr>
-        <w:spacing w:after="0"/>
-        <w:jc w:val="both"/>
-      </w:pPr>
-      <w:r>
-        <w:t>Risolve dunque il problema di allocazione</w:t>
+        <w:t>La nostra applicazione andrebbe a risolvere il problema che, in un futuro con un maggior numero di auto elettriche, una persona che necessita ricarica non rischia di trovare la colonnina occupata</w:t>
+      </w:r>
+      <w:r>
+        <w:t xml:space="preserve">. </w:t>
+      </w:r>
+      <w:r>
+        <w:t xml:space="preserve">Risolve dunque il problema di </w:t>
+      </w:r>
+      <w:r>
+        <w:t>assegnazione</w:t>
       </w:r>
       <w:r>
         <w:t xml:space="preserve"> e il diritto di ricarica</w:t>
@@ -2249,7 +2341,25 @@
         <w:t>È</w:t>
       </w:r>
       <w:r>
-        <w:t xml:space="preserve"> inoltre molto semplice rendere questa app scalabile anche a grandi città, in cui utenti possono anche collaborare segnalando la presenza di nuove colonnine, guasti e talvolta recensioni e commenti che possono essere inseriti nella scheda della colonnina corrispondente.</w:t>
+        <w:t xml:space="preserve"> inoltre molto semplice rendere questa app scalabile anche a grandi città, in cui </w:t>
+      </w:r>
+      <w:r>
+        <w:t xml:space="preserve">gli </w:t>
+      </w:r>
+      <w:r>
+        <w:t xml:space="preserve">utenti possono collaborare segnalando </w:t>
+      </w:r>
+      <w:r>
+        <w:t xml:space="preserve">anche </w:t>
+      </w:r>
+      <w:r>
+        <w:t>la presenza di nuove colonnine</w:t>
+      </w:r>
+      <w:r>
+        <w:t xml:space="preserve"> o condividere feedback e suggerimenti agli sviluppatori</w:t>
+      </w:r>
+      <w:r>
+        <w:t>.</w:t>
       </w:r>
     </w:p>
     <w:p>
@@ -2327,7 +2437,7 @@
       <w:pPr>
         <w:pStyle w:val="Stile1"/>
       </w:pPr>
-      <w:bookmarkStart w:id="1" w:name="_Toc215752537"/>
+      <w:bookmarkStart w:id="1" w:name="_Toc216341998"/>
       <w:r>
         <w:lastRenderedPageBreak/>
         <w:t>MODELLO DI PROCESSO</w:t>
@@ -2364,17 +2474,26 @@
         <w:t>realizzare</w:t>
       </w:r>
       <w:r>
-        <w:t xml:space="preserve"> piccoli incrementi molto frequenti che ci fanno proseguire con lo sviluppo della nostra applicazione senza avere documenti e fasi rigide da seguire come avverrebbe per altri modelli</w:t>
+        <w:t xml:space="preserve"> piccoli incrementi molto frequenti che fanno proseguire lo sviluppo della nostra applicazione senza avere documenti e fasi rigide da seguire</w:t>
+      </w:r>
+      <w:r>
+        <w:t>,</w:t>
+      </w:r>
+      <w:r>
+        <w:t xml:space="preserve"> come </w:t>
+      </w:r>
+      <w:r>
+        <w:t xml:space="preserve">invece </w:t>
+      </w:r>
+      <w:r>
+        <w:t>avverrebbe per altri modelli</w:t>
       </w:r>
       <w:r>
         <w:t>.</w:t>
       </w:r>
-    </w:p>
-    <w:p>
-      <w:pPr>
-        <w:spacing w:after="0"/>
-        <w:jc w:val="both"/>
-      </w:pPr>
+      <w:r>
+        <w:t xml:space="preserve"> </w:t>
+      </w:r>
       <w:r>
         <w:t>L’adozione di un metodo agile favorisce</w:t>
       </w:r>
@@ -2384,20 +2503,29 @@
       <w:r>
         <w:t>maggiore libertà, collaborazione continua e assicura l’esistenza di un software funzionante in ogni fase del progetto.</w:t>
       </w:r>
-    </w:p>
-    <w:p>
-      <w:pPr>
-        <w:spacing w:after="0"/>
-        <w:jc w:val="both"/>
-      </w:pPr>
+      <w:r>
+        <w:t xml:space="preserve"> </w:t>
+      </w:r>
       <w:r>
         <w:t>Si pone dunque maggiore attenzione</w:t>
       </w:r>
       <w:r>
-        <w:t xml:space="preserve"> su design semplice, meeting frequenti ma brevi e </w:t>
-      </w:r>
-      <w:r>
-        <w:t xml:space="preserve">a processi di </w:t>
+        <w:t xml:space="preserve"> </w:t>
+      </w:r>
+      <w:r>
+        <w:t>su</w:t>
+      </w:r>
+      <w:r>
+        <w:t xml:space="preserve"> design semplic</w:t>
+      </w:r>
+      <w:r>
+        <w:t>i</w:t>
+      </w:r>
+      <w:r>
+        <w:t xml:space="preserve">, meeting frequenti ma brevi e </w:t>
+      </w:r>
+      <w:r>
+        <w:t xml:space="preserve">processi di </w:t>
       </w:r>
       <w:r>
         <w:t>cambiament</w:t>
@@ -2427,16 +2555,19 @@
         <w:jc w:val="both"/>
       </w:pPr>
       <w:r>
-        <w:t>Di seguito le strategie utilizzate.</w:t>
-      </w:r>
-    </w:p>
-    <w:p>
-      <w:pPr>
-        <w:spacing w:after="0"/>
-        <w:jc w:val="both"/>
-      </w:pPr>
-      <w:r>
-        <w:t>Prima dell’avvio effettivo del progetto si svolgono due settimane di fase di prototipazione</w:t>
+        <w:t>Di seguito le strategie utilizzate</w:t>
+      </w:r>
+      <w:r>
+        <w:t>.</w:t>
+      </w:r>
+    </w:p>
+    <w:p>
+      <w:pPr>
+        <w:spacing w:after="0"/>
+        <w:jc w:val="both"/>
+      </w:pPr>
+      <w:r>
+        <w:t>Prima dell’avvio effettivo del progetto si svolgono due settimane di prototipazione</w:t>
       </w:r>
       <w:r>
         <w:t>, considerabile come Sprint 0.</w:t>
@@ -2859,7 +2990,6 @@
               <w:jc w:val="both"/>
             </w:pPr>
             <w:r>
-              <w:lastRenderedPageBreak/>
               <w:t>Sprint 2 – Product Backlog</w:t>
             </w:r>
           </w:p>
@@ -2896,6 +3026,7 @@
               <w:jc w:val="both"/>
             </w:pPr>
             <w:r>
+              <w:lastRenderedPageBreak/>
               <w:t>Sprint 2 – Sviluppo</w:t>
             </w:r>
           </w:p>
@@ -3085,9 +3216,8 @@
       <w:pPr>
         <w:pStyle w:val="Stile1"/>
       </w:pPr>
-      <w:bookmarkStart w:id="2" w:name="_Toc215752538"/>
-      <w:r>
-        <w:lastRenderedPageBreak/>
+      <w:bookmarkStart w:id="2" w:name="_Toc216341999"/>
+      <w:r>
         <w:t>ORGANIZZAZIONE DEL PROCESSO</w:t>
       </w:r>
       <w:bookmarkEnd w:id="2"/>
@@ -3120,6 +3250,7 @@
           <w:b/>
           <w:bCs/>
         </w:rPr>
+        <w:lastRenderedPageBreak/>
         <w:t>Product owner</w:t>
       </w:r>
       <w:r>
@@ -3509,7 +3640,7 @@
       <w:pPr>
         <w:pStyle w:val="Stile1"/>
       </w:pPr>
-      <w:bookmarkStart w:id="3" w:name="_Toc215752539"/>
+      <w:bookmarkStart w:id="3" w:name="_Toc216342000"/>
       <w:r>
         <w:lastRenderedPageBreak/>
         <w:t>STANDARD, LINEE GUIDE E PROCEDURE</w:t>
@@ -3520,7 +3651,7 @@
       <w:pPr>
         <w:pStyle w:val="Stile2"/>
       </w:pPr>
-      <w:bookmarkStart w:id="4" w:name="_Toc215752540"/>
+      <w:bookmarkStart w:id="4" w:name="_Toc216342001"/>
       <w:r>
         <w:t>Gestione codice</w:t>
       </w:r>
@@ -3671,7 +3802,7 @@
       <w:pPr>
         <w:pStyle w:val="Stile2"/>
       </w:pPr>
-      <w:bookmarkStart w:id="5" w:name="_Toc215752541"/>
+      <w:bookmarkStart w:id="5" w:name="_Toc216342002"/>
       <w:r>
         <w:t>Standard utilizzati</w:t>
       </w:r>
@@ -3759,7 +3890,7 @@
       <w:pPr>
         <w:pStyle w:val="Stile2"/>
       </w:pPr>
-      <w:bookmarkStart w:id="6" w:name="_Toc215752542"/>
+      <w:bookmarkStart w:id="6" w:name="_Toc216342003"/>
       <w:r>
         <w:t>Gestione del database</w:t>
       </w:r>
@@ -3913,7 +4044,7 @@
       <w:pPr>
         <w:pStyle w:val="Stile2"/>
       </w:pPr>
-      <w:bookmarkStart w:id="7" w:name="_Toc215752543"/>
+      <w:bookmarkStart w:id="7" w:name="_Toc216342004"/>
       <w:r>
         <w:t>Interfaccia grafica</w:t>
       </w:r>
@@ -4174,7 +4305,7 @@
       <w:pPr>
         <w:pStyle w:val="Stile1"/>
       </w:pPr>
-      <w:bookmarkStart w:id="8" w:name="_Toc215752544"/>
+      <w:bookmarkStart w:id="8" w:name="_Toc216342005"/>
       <w:r>
         <w:lastRenderedPageBreak/>
         <w:t>ATTIVITÀ DI GESTIONE</w:t>
@@ -4349,7 +4480,7 @@
       <w:pPr>
         <w:pStyle w:val="Stile1"/>
       </w:pPr>
-      <w:bookmarkStart w:id="9" w:name="_Toc215752545"/>
+      <w:bookmarkStart w:id="9" w:name="_Toc216342006"/>
       <w:r>
         <w:lastRenderedPageBreak/>
         <w:t>POTENZIALI RISCHI</w:t>
@@ -5421,7 +5552,7 @@
       <w:pPr>
         <w:pStyle w:val="Stile1"/>
       </w:pPr>
-      <w:bookmarkStart w:id="10" w:name="_Toc215752546"/>
+      <w:bookmarkStart w:id="10" w:name="_Toc216342007"/>
       <w:r>
         <w:lastRenderedPageBreak/>
         <w:t>PERSONALE</w:t>
@@ -5727,7 +5858,7 @@
       <w:pPr>
         <w:pStyle w:val="Stile1"/>
       </w:pPr>
-      <w:bookmarkStart w:id="11" w:name="_Toc215752547"/>
+      <w:bookmarkStart w:id="11" w:name="_Toc216342008"/>
       <w:r>
         <w:lastRenderedPageBreak/>
         <w:t>METODI E TECNICHE</w:t>
@@ -5927,7 +6058,7 @@
       <w:pPr>
         <w:pStyle w:val="Stile1"/>
       </w:pPr>
-      <w:bookmarkStart w:id="12" w:name="_Toc215752548"/>
+      <w:bookmarkStart w:id="12" w:name="_Toc216342009"/>
       <w:r>
         <w:lastRenderedPageBreak/>
         <w:t>GARANZIE DI QUALITÀ</w:t>
@@ -6137,7 +6268,7 @@
       <w:pPr>
         <w:pStyle w:val="Stile1"/>
       </w:pPr>
-      <w:bookmarkStart w:id="13" w:name="_Toc215752549"/>
+      <w:bookmarkStart w:id="13" w:name="_Toc216342010"/>
       <w:r>
         <w:lastRenderedPageBreak/>
         <w:t>PACCHETTI DI LAVORO</w:t>
@@ -7576,7 +7707,7 @@
       <w:pPr>
         <w:pStyle w:val="Stile1"/>
       </w:pPr>
-      <w:bookmarkStart w:id="14" w:name="_Toc215752550"/>
+      <w:bookmarkStart w:id="14" w:name="_Toc216342011"/>
       <w:r>
         <w:lastRenderedPageBreak/>
         <w:t>RISORSE</w:t>
@@ -7997,7 +8128,7 @@
       <w:pPr>
         <w:pStyle w:val="Stile1"/>
       </w:pPr>
-      <w:bookmarkStart w:id="15" w:name="_Toc215752551"/>
+      <w:bookmarkStart w:id="15" w:name="_Toc216342012"/>
       <w:r>
         <w:lastRenderedPageBreak/>
         <w:t>BUDGET</w:t>
@@ -8241,7 +8372,7 @@
       <w:pPr>
         <w:pStyle w:val="Stile1"/>
       </w:pPr>
-      <w:bookmarkStart w:id="16" w:name="_Toc215752552"/>
+      <w:bookmarkStart w:id="16" w:name="_Toc216342013"/>
       <w:r>
         <w:lastRenderedPageBreak/>
         <w:t>CAMBIAMENTI</w:t>
@@ -8483,7 +8614,7 @@
       <w:pPr>
         <w:pStyle w:val="Stile1"/>
       </w:pPr>
-      <w:bookmarkStart w:id="17" w:name="_Toc215752553"/>
+      <w:bookmarkStart w:id="17" w:name="_Toc216342014"/>
       <w:r>
         <w:lastRenderedPageBreak/>
         <w:t>CONSEGNA</w:t>
@@ -10898,9 +11029,12 @@
     <w:autoRedefine/>
     <w:uiPriority w:val="39"/>
     <w:unhideWhenUsed/>
-    <w:rsid w:val="007041EC"/>
+    <w:rsid w:val="00281AFA"/>
     <w:pPr>
-      <w:spacing w:after="100"/>
+      <w:tabs>
+        <w:tab w:val="right" w:leader="dot" w:pos="9628"/>
+      </w:tabs>
+      <w:spacing w:before="240" w:after="100"/>
     </w:pPr>
   </w:style>
   <w:style w:type="paragraph" w:styleId="Sommario2">

</xml_diff>

<commit_message>
Modifiche leggere a project plan e a file meeting/sprint
+ aggiunte timbrature
</commit_message>
<xml_diff>
--- a/documentazione/project plan.docx
+++ b/documentazione/project plan.docx
@@ -4387,15 +4387,7 @@
         <w:jc w:val="both"/>
       </w:pPr>
       <w:r>
-        <w:t xml:space="preserve">È previsto l’utilizzo di una </w:t>
-      </w:r>
-      <w:proofErr w:type="spellStart"/>
-      <w:r>
-        <w:t>Kanban</w:t>
-      </w:r>
-      <w:proofErr w:type="spellEnd"/>
-      <w:r>
-        <w:t xml:space="preserve"> Board per tenere traccia dello sviluppo del lavoro.</w:t>
+        <w:t>È previsto l’utilizzo di una Kanban Board per tenere traccia dello sviluppo del lavoro.</w:t>
       </w:r>
     </w:p>
     <w:p>
@@ -4500,21 +4492,12 @@
         <w:spacing w:after="0"/>
         <w:jc w:val="both"/>
       </w:pPr>
-      <w:proofErr w:type="spellStart"/>
-      <w:r>
-        <w:rPr>
-          <w:b/>
-          <w:bCs/>
-        </w:rPr>
-        <w:t>Daily</w:t>
-      </w:r>
-      <w:proofErr w:type="spellEnd"/>
-      <w:r>
-        <w:rPr>
-          <w:b/>
-          <w:bCs/>
-        </w:rPr>
-        <w:t xml:space="preserve"> </w:t>
+      <w:r>
+        <w:rPr>
+          <w:b/>
+          <w:bCs/>
+        </w:rPr>
+        <w:t xml:space="preserve">Daily </w:t>
       </w:r>
       <w:r>
         <w:rPr>
@@ -4745,13 +4728,8 @@
             <w:pPr>
               <w:jc w:val="both"/>
             </w:pPr>
-            <w:proofErr w:type="gramStart"/>
-            <w:r>
-              <w:t>10</w:t>
-            </w:r>
-            <w:proofErr w:type="gramEnd"/>
-            <w:r>
-              <w:t xml:space="preserve"> giorni</w:t>
+            <w:r>
+              <w:t>10 giorni</w:t>
             </w:r>
           </w:p>
         </w:tc>
@@ -4832,7 +4810,10 @@
               <w:jc w:val="both"/>
             </w:pPr>
             <w:r>
-              <w:t>1/2 giorni</w:t>
+              <w:t xml:space="preserve">1/2 </w:t>
+            </w:r>
+            <w:r>
+              <w:t>meeting</w:t>
             </w:r>
           </w:p>
         </w:tc>
@@ -4870,13 +4851,8 @@
             <w:pPr>
               <w:jc w:val="both"/>
             </w:pPr>
-            <w:proofErr w:type="gramStart"/>
-            <w:r>
-              <w:t>10</w:t>
-            </w:r>
-            <w:proofErr w:type="gramEnd"/>
-            <w:r>
-              <w:t xml:space="preserve"> giorni</w:t>
+            <w:r>
+              <w:t>10 giorni</w:t>
             </w:r>
           </w:p>
         </w:tc>
@@ -5012,13 +4988,42 @@
         <w:t xml:space="preserve"> Tommaso Maistrello</w:t>
       </w:r>
       <w:r>
-        <w:t xml:space="preserve">: responsabile del corretto svolgimento dell’approccio agile, della comunicazione nel team e risolutore di problemi di natura tecnica e </w:t>
-      </w:r>
-      <w:proofErr w:type="gramStart"/>
-      <w:r>
-        <w:t>non</w:t>
-      </w:r>
-      <w:proofErr w:type="gramEnd"/>
+        <w:t>: responsabile del corretto svolgimento dell’approccio agile, della comunicazione nel team e risolutore di problemi di natura tecnica e non.</w:t>
+      </w:r>
+    </w:p>
+    <w:p>
+      <w:pPr>
+        <w:spacing w:after="0"/>
+        <w:jc w:val="both"/>
+      </w:pPr>
+      <w:r>
+        <w:rPr>
+          <w:b/>
+          <w:bCs/>
+        </w:rPr>
+        <w:t>Team di implementazione</w:t>
+      </w:r>
+      <w:r>
+        <w:t xml:space="preserve"> </w:t>
+      </w:r>
+      <w:r>
+        <w:t xml:space="preserve">- </w:t>
+      </w:r>
+      <w:r>
+        <w:t>Tommaso Maistrello, Davide Mascheretti, Claudio Morgera, Francesco Valenari</w:t>
+      </w:r>
+      <w:r>
+        <w:t>: responsabili dello sviluppo del software</w:t>
+      </w:r>
+      <w:r>
+        <w:t xml:space="preserve">, </w:t>
+      </w:r>
+      <w:r>
+        <w:t>della documentazione</w:t>
+      </w:r>
+      <w:r>
+        <w:t xml:space="preserve"> e del testing</w:t>
+      </w:r>
       <w:r>
         <w:t>.</w:t>
       </w:r>
@@ -5029,98 +5034,75 @@
         <w:jc w:val="both"/>
       </w:pPr>
       <w:r>
-        <w:rPr>
-          <w:b/>
-          <w:bCs/>
-        </w:rPr>
-        <w:t>Team di implementazione</w:t>
-      </w:r>
-      <w:r>
+        <w:t>Dato il team ridotto il Product Owner e lo Scrum Master svolgono anche il ruolo di sviluppatori.</w:t>
+      </w:r>
+    </w:p>
+    <w:p>
+      <w:pPr>
+        <w:pStyle w:val="Stile2"/>
+      </w:pPr>
+      <w:bookmarkStart w:id="5" w:name="_Toc216349571"/>
+      <w:r>
+        <w:t>Ruoli</w:t>
+      </w:r>
+      <w:bookmarkEnd w:id="5"/>
+    </w:p>
+    <w:p>
+      <w:pPr>
+        <w:spacing w:after="0"/>
+        <w:jc w:val="both"/>
+      </w:pPr>
+      <w:r>
+        <w:t xml:space="preserve">Inoltre, seppur non sia coerente totalmente con il metodo SCRUM classico, all’interno del team di implementazione abbiamo suddiviso </w:t>
+      </w:r>
+      <w:r>
+        <w:t xml:space="preserve">approssimativamente </w:t>
+      </w:r>
+      <w:r>
+        <w:t>i ruoli in base alle competenze prevalenti.</w:t>
+      </w:r>
+    </w:p>
+    <w:p>
+      <w:pPr>
+        <w:spacing w:after="0"/>
+        <w:jc w:val="both"/>
+      </w:pPr>
+      <w:r>
+        <w:rPr>
+          <w:b/>
+          <w:bCs/>
+        </w:rPr>
+        <w:t>Frontend</w:t>
+      </w:r>
+      <w:r>
+        <w:t>: sviluppo interfaccia, mappa interattiva, passaggio tra pagine, menù.</w:t>
+      </w:r>
+    </w:p>
+    <w:p>
+      <w:pPr>
+        <w:spacing w:after="0"/>
+        <w:jc w:val="both"/>
+      </w:pPr>
+      <w:r>
+        <w:rPr>
+          <w:b/>
+          <w:bCs/>
+        </w:rPr>
+        <w:t>Backend</w:t>
+      </w:r>
+      <w:r>
+        <w:rPr>
+          <w:b/>
+          <w:bCs/>
+        </w:rPr>
         <w:t xml:space="preserve"> </w:t>
       </w:r>
       <w:r>
-        <w:t xml:space="preserve">- </w:t>
-      </w:r>
-      <w:r>
-        <w:t>Tommaso Maistrello, Davide Mascheretti, Claudio Morgera, Francesco Valenari</w:t>
-      </w:r>
-      <w:r>
-        <w:t>: responsabili dello sviluppo del software</w:t>
-      </w:r>
-      <w:r>
-        <w:t xml:space="preserve">, </w:t>
-      </w:r>
-      <w:r>
-        <w:t>della documentazione</w:t>
-      </w:r>
-      <w:r>
-        <w:t xml:space="preserve"> e del testing</w:t>
-      </w:r>
-      <w:r>
-        <w:t>.</w:t>
-      </w:r>
-    </w:p>
-    <w:p>
-      <w:pPr>
-        <w:spacing w:after="0"/>
-        <w:jc w:val="both"/>
-      </w:pPr>
-      <w:r>
-        <w:t>Dato il team ridotto il Product Owner e lo Scrum Master svolgono anche il ruolo di sviluppatori.</w:t>
-      </w:r>
-    </w:p>
-    <w:p>
-      <w:pPr>
-        <w:pStyle w:val="Stile2"/>
-      </w:pPr>
-      <w:bookmarkStart w:id="5" w:name="_Toc216349571"/>
-      <w:r>
-        <w:t>Ruoli</w:t>
-      </w:r>
-      <w:bookmarkEnd w:id="5"/>
-    </w:p>
-    <w:p>
-      <w:pPr>
-        <w:spacing w:after="0"/>
-        <w:jc w:val="both"/>
-      </w:pPr>
-      <w:r>
-        <w:t xml:space="preserve">Inoltre, seppur non sia coerente totalmente con il metodo SCRUM classico, all’interno del team di implementazione abbiamo suddiviso </w:t>
-      </w:r>
-      <w:r>
-        <w:t xml:space="preserve">approssimativamente </w:t>
-      </w:r>
-      <w:r>
-        <w:t>i ruoli in base alle competenze prevalenti.</w:t>
-      </w:r>
-    </w:p>
-    <w:p>
-      <w:pPr>
-        <w:spacing w:after="0"/>
-        <w:jc w:val="both"/>
-      </w:pPr>
-      <w:r>
-        <w:rPr>
-          <w:b/>
-          <w:bCs/>
-        </w:rPr>
-        <w:t>Frontend</w:t>
-      </w:r>
-      <w:r>
-        <w:t>: sviluppo interfaccia, mappa interattiva, passaggio tra pagine, menù.</w:t>
-      </w:r>
-    </w:p>
-    <w:p>
-      <w:pPr>
-        <w:spacing w:after="0"/>
-        <w:jc w:val="both"/>
-      </w:pPr>
-      <w:r>
-        <w:rPr>
-          <w:b/>
-          <w:bCs/>
-        </w:rPr>
-        <w:t>Backend</w:t>
+        <w:rPr>
+          <w:b/>
+          <w:bCs/>
+        </w:rPr>
+        <w:t>+</w:t>
       </w:r>
       <w:r>
         <w:rPr>
@@ -5134,20 +5116,6 @@
           <w:b/>
           <w:bCs/>
         </w:rPr>
-        <w:t>+</w:t>
-      </w:r>
-      <w:r>
-        <w:rPr>
-          <w:b/>
-          <w:bCs/>
-        </w:rPr>
-        <w:t xml:space="preserve"> </w:t>
-      </w:r>
-      <w:r>
-        <w:rPr>
-          <w:b/>
-          <w:bCs/>
-        </w:rPr>
         <w:t>Database</w:t>
       </w:r>
       <w:r>
@@ -5157,15 +5125,7 @@
         <w:t>F</w:t>
       </w:r>
       <w:r>
-        <w:t xml:space="preserve">irebase </w:t>
-      </w:r>
-      <w:proofErr w:type="spellStart"/>
-      <w:r>
-        <w:t>Realtime</w:t>
-      </w:r>
-      <w:proofErr w:type="spellEnd"/>
-      <w:r>
-        <w:t xml:space="preserve"> Database, controlli utente e prenotazioni, salvataggio dati, sicurezza</w:t>
+        <w:t>irebase Realtime Database, controlli utente e prenotazioni, salvataggio dati, sicurezza</w:t>
       </w:r>
       <w:r>
         <w:t>.</w:t>
@@ -5522,13 +5482,8 @@
         <w:t xml:space="preserve"> consigliato comunque fare commit, magari aggiungendo la descrizione dell’errore</w:t>
       </w:r>
       <w:r>
-        <w:t xml:space="preserve"> o un </w:t>
-      </w:r>
-      <w:proofErr w:type="spellStart"/>
-      <w:r>
-        <w:t>issue</w:t>
-      </w:r>
-      <w:proofErr w:type="spellEnd"/>
+        <w:t xml:space="preserve"> o un issue</w:t>
+      </w:r>
       <w:r>
         <w:t>. In questo modo ognuno è aggiornato alla versione corretta ed è possibile risolvere il bug</w:t>
       </w:r>
@@ -6387,15 +6342,7 @@
         <w:jc w:val="both"/>
       </w:pPr>
       <w:r>
-        <w:t xml:space="preserve">Un ulteriore problema si potrebbe riscontrare nell’utilizzo di </w:t>
-      </w:r>
-      <w:proofErr w:type="spellStart"/>
-      <w:r>
-        <w:t>Papyrus</w:t>
-      </w:r>
-      <w:proofErr w:type="spellEnd"/>
-      <w:r>
-        <w:t xml:space="preserve"> perché è complesso il lavoro simultaneo anche su diagrammi differenti.</w:t>
+        <w:t>Un ulteriore problema si potrebbe riscontrare nell’utilizzo di Papyrus perché è complesso il lavoro simultaneo anche su diagrammi differenti.</w:t>
       </w:r>
     </w:p>
     <w:p>
@@ -7409,15 +7356,7 @@
         <w:t xml:space="preserve"> e i ruoli assegnati dal </w:t>
       </w:r>
       <w:r>
-        <w:t xml:space="preserve">Product </w:t>
-      </w:r>
-      <w:proofErr w:type="spellStart"/>
-      <w:r>
-        <w:t>Owner</w:t>
-      </w:r>
-      <w:proofErr w:type="spellEnd"/>
-      <w:r>
-        <w:t>.</w:t>
+        <w:t>Product Owner.</w:t>
       </w:r>
     </w:p>
     <w:p>
@@ -7460,23 +7399,7 @@
           <w:b/>
           <w:bCs/>
         </w:rPr>
-        <w:t xml:space="preserve">oduct </w:t>
-      </w:r>
-      <w:proofErr w:type="spellStart"/>
-      <w:r>
-        <w:rPr>
-          <w:b/>
-          <w:bCs/>
-        </w:rPr>
-        <w:t>Owner</w:t>
-      </w:r>
-      <w:proofErr w:type="spellEnd"/>
-      <w:r>
-        <w:rPr>
-          <w:b/>
-          <w:bCs/>
-        </w:rPr>
-        <w:t xml:space="preserve"> </w:t>
+        <w:t xml:space="preserve">oduct Owner </w:t>
       </w:r>
       <w:r>
         <w:rPr>
@@ -7936,15 +7859,7 @@
         <w:t xml:space="preserve">: i requisiti saranno raccolti tramite incontri di gruppo e discussioni guidate dal </w:t>
       </w:r>
       <w:r>
-        <w:t xml:space="preserve">Product </w:t>
-      </w:r>
-      <w:proofErr w:type="spellStart"/>
-      <w:r>
-        <w:t>Owner</w:t>
-      </w:r>
-      <w:proofErr w:type="spellEnd"/>
-      <w:r>
-        <w:t xml:space="preserve"> e dallo </w:t>
+        <w:t xml:space="preserve">Product Owner e dallo </w:t>
       </w:r>
       <w:r>
         <w:t>SCRUM</w:t>
@@ -8313,6 +8228,15 @@
         <w:spacing w:after="0"/>
         <w:jc w:val="both"/>
       </w:pPr>
+      <w:r>
+        <w:t>Verranno effettuati test automatici con JUnit per testare principalmente l’ inserimento dati da parte dell’utente.</w:t>
+      </w:r>
+    </w:p>
+    <w:p>
+      <w:pPr>
+        <w:spacing w:after="0"/>
+        <w:jc w:val="both"/>
+      </w:pPr>
     </w:p>
     <w:p>
       <w:pPr>
@@ -8344,6 +8268,9 @@
       <w:r>
         <w:t xml:space="preserve"> tracciata la data del raggiungimento del requisito nell’apposito file.</w:t>
       </w:r>
+      <w:r>
+        <w:t xml:space="preserve"> Ogni incontro, modifica e problema verranno tracciati all’interno di appositi documenti o tramite le issues di GitHub.</w:t>
+      </w:r>
     </w:p>
     <w:p>
       <w:pPr>
@@ -8402,11 +8329,6 @@
       <w:r>
         <w:t>.</w:t>
       </w:r>
-    </w:p>
-    <w:p>
-      <w:pPr>
-        <w:jc w:val="both"/>
-      </w:pPr>
     </w:p>
     <w:p>
       <w:pPr>
@@ -8568,20 +8490,8 @@
           <w:lang w:eastAsia="it-IT"/>
           <w14:ligatures w14:val="none"/>
         </w:rPr>
-        <w:t xml:space="preserve">Creazione repository privata GitHub e struttura progetto Vaadin e Spring Boot con dipendenze nel </w:t>
-      </w:r>
-      <w:proofErr w:type="spellStart"/>
-      <w:r>
-        <w:rPr>
-          <w:rFonts w:eastAsia="Times New Roman" w:cstheme="minorHAnsi"/>
-          <w:color w:val="000000"/>
-          <w:kern w:val="0"/>
-          <w:lang w:eastAsia="it-IT"/>
-          <w14:ligatures w14:val="none"/>
-        </w:rPr>
-        <w:t>pom</w:t>
-      </w:r>
-      <w:proofErr w:type="spellEnd"/>
+        <w:t>Creazione repository privata GitHub e struttura progetto Vaadin e Spring Boot con dipendenze nel pom</w:t>
+      </w:r>
     </w:p>
     <w:p>
       <w:pPr>
@@ -8747,17 +8657,7 @@
           <w:lang w:eastAsia="it-IT"/>
           <w14:ligatures w14:val="none"/>
         </w:rPr>
-        <w:t>pagina principale</w:t>
-      </w:r>
-      <w:r>
-        <w:rPr>
-          <w:rFonts w:eastAsia="Times New Roman" w:cstheme="minorHAnsi"/>
-          <w:color w:val="000000"/>
-          <w:kern w:val="0"/>
-          <w:lang w:eastAsia="it-IT"/>
-          <w14:ligatures w14:val="none"/>
-        </w:rPr>
-        <w:t xml:space="preserve"> </w:t>
+        <w:t xml:space="preserve">pagina principale </w:t>
       </w:r>
       <w:r>
         <w:rPr>
@@ -9576,6 +9476,16 @@
         </w:rPr>
         <w:t>Testing</w:t>
       </w:r>
+      <w:r>
+        <w:rPr>
+          <w:rFonts w:eastAsia="Times New Roman" w:cstheme="minorHAnsi"/>
+          <w:color w:val="000000"/>
+          <w:kern w:val="0"/>
+          <w:lang w:eastAsia="it-IT"/>
+          <w14:ligatures w14:val="none"/>
+        </w:rPr>
+        <w:t xml:space="preserve"> automatici finali</w:t>
+      </w:r>
     </w:p>
     <w:p>
       <w:pPr>
@@ -9991,21 +9901,7 @@
         <w:rPr>
           <w:lang w:val="en-GB"/>
         </w:rPr>
-        <w:t xml:space="preserve">Papyrus - </w:t>
-      </w:r>
-      <w:proofErr w:type="spellStart"/>
-      <w:r>
-        <w:rPr>
-          <w:lang w:val="en-GB"/>
-        </w:rPr>
-        <w:t>versione</w:t>
-      </w:r>
-      <w:proofErr w:type="spellEnd"/>
-      <w:r>
-        <w:rPr>
-          <w:lang w:val="en-GB"/>
-        </w:rPr>
-        <w:t xml:space="preserve"> 2024-06</w:t>
+        <w:t>Papyrus - versione 2024-06</w:t>
       </w:r>
     </w:p>
     <w:p>
@@ -10198,13 +10094,8 @@
         <w:ind w:left="567"/>
         <w:jc w:val="both"/>
       </w:pPr>
-      <w:proofErr w:type="spellStart"/>
-      <w:r>
-        <w:t>Apexcharts</w:t>
-      </w:r>
-      <w:proofErr w:type="spellEnd"/>
-      <w:r>
-        <w:t xml:space="preserve"> - versione </w:t>
+      <w:r>
+        <w:t xml:space="preserve">Apexcharts - versione </w:t>
       </w:r>
       <w:r>
         <w:t>23.0.1</w:t>
@@ -10222,13 +10113,8 @@
         </w:tabs>
         <w:ind w:left="567"/>
       </w:pPr>
-      <w:proofErr w:type="spellStart"/>
-      <w:r>
-        <w:t>BCrypt</w:t>
-      </w:r>
-      <w:proofErr w:type="spellEnd"/>
-      <w:r>
-        <w:t xml:space="preserve"> per criptare le password </w:t>
+      <w:r>
+        <w:t xml:space="preserve">BCrypt per criptare le password </w:t>
       </w:r>
     </w:p>
     <w:p>
@@ -10492,13 +10378,8 @@
         <w:t>utte le tecnologie e piattaforme utilizzate (</w:t>
       </w:r>
       <w:r>
-        <w:t xml:space="preserve">Eclipse, </w:t>
-      </w:r>
-      <w:proofErr w:type="spellStart"/>
-      <w:r>
-        <w:t>Papyrus</w:t>
-      </w:r>
-      <w:proofErr w:type="spellEnd"/>
+        <w:t>Eclipse, Papyrus</w:t>
+      </w:r>
       <w:r>
         <w:t>, Vaadin, Leaflet, Firebase piano base, GitHub Free) sono gratuite per gli scopi del progetto</w:t>
       </w:r>
@@ -12935,6 +12816,7 @@
   <w:style w:type="character" w:default="1" w:styleId="Carpredefinitoparagrafo">
     <w:name w:val="Default Paragraph Font"/>
     <w:uiPriority w:val="1"/>
+    <w:semiHidden/>
     <w:unhideWhenUsed/>
   </w:style>
   <w:style w:type="table" w:default="1" w:styleId="Tabellanormale">

</xml_diff>

<commit_message>
Update project plan document
Revised the project plan.docx file with new changes. Refer to the document for updated project planning details.
</commit_message>
<xml_diff>
--- a/documentazione/project plan.docx
+++ b/documentazione/project plan.docx
@@ -150,6 +150,7 @@
       <w:pPr>
         <w:jc w:val="center"/>
         <w:rPr>
+          <w:rFonts w:ascii="Lucida Bright" w:hAnsi="Lucida Bright"/>
           <w:b/>
           <w:bCs/>
           <w:sz w:val="36"/>
@@ -158,12 +159,53 @@
       </w:pPr>
       <w:r>
         <w:rPr>
+          <w:rFonts w:ascii="Lucida Bright" w:hAnsi="Lucida Bright"/>
           <w:b/>
           <w:bCs/>
           <w:sz w:val="36"/>
           <w:szCs w:val="36"/>
         </w:rPr>
-        <w:t xml:space="preserve">FIND&amp;CHARGE </w:t>
+        <w:t>FIND</w:t>
+      </w:r>
+      <w:r>
+        <w:rPr>
+          <w:rFonts w:ascii="Lucida Bright" w:hAnsi="Lucida Bright"/>
+          <w:b/>
+          <w:bCs/>
+          <w:sz w:val="18"/>
+          <w:szCs w:val="18"/>
+        </w:rPr>
+        <w:t xml:space="preserve"> </w:t>
+      </w:r>
+      <w:r>
+        <w:rPr>
+          <w:rFonts w:ascii="Lucida Bright" w:hAnsi="Lucida Bright"/>
+          <w:b/>
+          <w:bCs/>
+          <w:sz w:val="36"/>
+          <w:szCs w:val="36"/>
+        </w:rPr>
+        <w:t>&amp;</w:t>
+      </w:r>
+      <w:r>
+        <w:rPr>
+          <w:rFonts w:ascii="Lucida Bright" w:hAnsi="Lucida Bright"/>
+          <w:b/>
+          <w:bCs/>
+          <w:sz w:val="18"/>
+          <w:szCs w:val="18"/>
+        </w:rPr>
+        <w:t xml:space="preserve"> </w:t>
+      </w:r>
+      <w:r>
+        <w:rPr>
+          <w:rFonts w:ascii="Lucida Bright" w:hAnsi="Lucida Bright"/>
+          <w:b/>
+          <w:bCs/>
+          <w:sz w:val="36"/>
+          <w:szCs w:val="36"/>
+        </w:rPr>
+        <w:t xml:space="preserve">CHARGE </w:t>
       </w:r>
     </w:p>
     <w:p>
@@ -4266,7 +4308,15 @@
         <w:t>i</w:t>
       </w:r>
       <w:r>
-        <w:t xml:space="preserve">, meeting frequenti ma brevi e </w:t>
+        <w:t xml:space="preserve">, </w:t>
+      </w:r>
+      <w:proofErr w:type="gramStart"/>
+      <w:r>
+        <w:t>meeting frequenti ma brevi</w:t>
+      </w:r>
+      <w:proofErr w:type="gramEnd"/>
+      <w:r>
+        <w:t xml:space="preserve"> e </w:t>
       </w:r>
       <w:r>
         <w:t xml:space="preserve">processi di </w:t>
@@ -4387,7 +4437,15 @@
         <w:jc w:val="both"/>
       </w:pPr>
       <w:r>
-        <w:t>È previsto l’utilizzo di una Kanban Board per tenere traccia dello sviluppo del lavoro.</w:t>
+        <w:t xml:space="preserve">È previsto l’utilizzo di una </w:t>
+      </w:r>
+      <w:proofErr w:type="spellStart"/>
+      <w:r>
+        <w:t>Kanban</w:t>
+      </w:r>
+      <w:proofErr w:type="spellEnd"/>
+      <w:r>
+        <w:t xml:space="preserve"> Board per tenere traccia dello sviluppo del lavoro.</w:t>
       </w:r>
     </w:p>
     <w:p>
@@ -4452,11 +4510,16 @@
       <w:r>
         <w:t xml:space="preserve"> effettiva delle funzionalità decise in precedenza </w:t>
       </w:r>
+      <w:proofErr w:type="gramStart"/>
       <w:r>
         <w:t>nei</w:t>
       </w:r>
       <w:r>
-        <w:t xml:space="preserve"> meeting in presenza per aggiornamenti su eventuali problematiche</w:t>
+        <w:t xml:space="preserve"> meeting</w:t>
+      </w:r>
+      <w:proofErr w:type="gramEnd"/>
+      <w:r>
+        <w:t xml:space="preserve"> in presenza per aggiornamenti su eventuali problematiche</w:t>
       </w:r>
       <w:r>
         <w:t>.</w:t>
@@ -4492,12 +4555,21 @@
         <w:spacing w:after="0"/>
         <w:jc w:val="both"/>
       </w:pPr>
-      <w:r>
-        <w:rPr>
-          <w:b/>
-          <w:bCs/>
-        </w:rPr>
-        <w:t xml:space="preserve">Daily </w:t>
+      <w:proofErr w:type="spellStart"/>
+      <w:r>
+        <w:rPr>
+          <w:b/>
+          <w:bCs/>
+        </w:rPr>
+        <w:t>Daily</w:t>
+      </w:r>
+      <w:proofErr w:type="spellEnd"/>
+      <w:r>
+        <w:rPr>
+          <w:b/>
+          <w:bCs/>
+        </w:rPr>
+        <w:t xml:space="preserve"> </w:t>
       </w:r>
       <w:r>
         <w:rPr>
@@ -4507,7 +4579,15 @@
         <w:t>SCRUM</w:t>
       </w:r>
       <w:r>
-        <w:t>: ogni giorno il team si ritrova fisicamente per una condivisione delle modifiche apportate e degli eventuali problemi riscontrati.</w:t>
+        <w:t xml:space="preserve">: ogni giorno </w:t>
+      </w:r>
+      <w:proofErr w:type="gramStart"/>
+      <w:r>
+        <w:t>il team</w:t>
+      </w:r>
+      <w:proofErr w:type="gramEnd"/>
+      <w:r>
+        <w:t xml:space="preserve"> si ritrova fisicamente per una condivisione delle modifiche apportate e degli eventuali problemi riscontrati.</w:t>
       </w:r>
     </w:p>
     <w:p>
@@ -4650,8 +4730,13 @@
             <w:pPr>
               <w:jc w:val="both"/>
             </w:pPr>
-            <w:r>
-              <w:t>2 settimane</w:t>
+            <w:proofErr w:type="gramStart"/>
+            <w:r>
+              <w:t>2</w:t>
+            </w:r>
+            <w:proofErr w:type="gramEnd"/>
+            <w:r>
+              <w:t xml:space="preserve"> settimane</w:t>
             </w:r>
           </w:p>
         </w:tc>
@@ -4728,8 +4813,13 @@
             <w:pPr>
               <w:jc w:val="both"/>
             </w:pPr>
-            <w:r>
-              <w:t>10 giorni</w:t>
+            <w:proofErr w:type="gramStart"/>
+            <w:r>
+              <w:t>10</w:t>
+            </w:r>
+            <w:proofErr w:type="gramEnd"/>
+            <w:r>
+              <w:t xml:space="preserve"> giorni</w:t>
             </w:r>
           </w:p>
         </w:tc>
@@ -4851,8 +4941,13 @@
             <w:pPr>
               <w:jc w:val="both"/>
             </w:pPr>
-            <w:r>
-              <w:t>10 giorni</w:t>
+            <w:proofErr w:type="gramStart"/>
+            <w:r>
+              <w:t>10</w:t>
+            </w:r>
+            <w:proofErr w:type="gramEnd"/>
+            <w:r>
+              <w:t xml:space="preserve"> giorni</w:t>
             </w:r>
           </w:p>
         </w:tc>
@@ -4941,8 +5036,17 @@
           <w:b/>
           <w:bCs/>
         </w:rPr>
-        <w:t>Product owner</w:t>
-      </w:r>
+        <w:t xml:space="preserve">Product </w:t>
+      </w:r>
+      <w:proofErr w:type="spellStart"/>
+      <w:r>
+        <w:rPr>
+          <w:b/>
+          <w:bCs/>
+        </w:rPr>
+        <w:t>owner</w:t>
+      </w:r>
+      <w:proofErr w:type="spellEnd"/>
       <w:r>
         <w:t xml:space="preserve"> </w:t>
       </w:r>
@@ -4988,7 +5092,23 @@
         <w:t xml:space="preserve"> Tommaso Maistrello</w:t>
       </w:r>
       <w:r>
-        <w:t>: responsabile del corretto svolgimento dell’approccio agile, della comunicazione nel team e risolutore di problemi di natura tecnica e non.</w:t>
+        <w:t xml:space="preserve">: responsabile del corretto svolgimento dell’approccio agile, della comunicazione </w:t>
+      </w:r>
+      <w:proofErr w:type="gramStart"/>
+      <w:r>
+        <w:t>nel team</w:t>
+      </w:r>
+      <w:proofErr w:type="gramEnd"/>
+      <w:r>
+        <w:t xml:space="preserve"> e risolutore di problemi di natura tecnica e </w:t>
+      </w:r>
+      <w:proofErr w:type="gramStart"/>
+      <w:r>
+        <w:t>non</w:t>
+      </w:r>
+      <w:proofErr w:type="gramEnd"/>
+      <w:r>
+        <w:t>.</w:t>
       </w:r>
     </w:p>
     <w:p>
@@ -5034,7 +5154,31 @@
         <w:jc w:val="both"/>
       </w:pPr>
       <w:r>
-        <w:t>Dato il team ridotto il Product Owner e lo Scrum Master svolgono anche il ruolo di sviluppatori.</w:t>
+        <w:t xml:space="preserve">Dato </w:t>
+      </w:r>
+      <w:proofErr w:type="gramStart"/>
+      <w:r>
+        <w:t>il team ridotto</w:t>
+      </w:r>
+      <w:proofErr w:type="gramEnd"/>
+      <w:r>
+        <w:t xml:space="preserve"> il Product </w:t>
+      </w:r>
+      <w:proofErr w:type="spellStart"/>
+      <w:r>
+        <w:t>Owner</w:t>
+      </w:r>
+      <w:proofErr w:type="spellEnd"/>
+      <w:r>
+        <w:t xml:space="preserve"> e lo </w:t>
+      </w:r>
+      <w:proofErr w:type="spellStart"/>
+      <w:r>
+        <w:t>Scrum</w:t>
+      </w:r>
+      <w:proofErr w:type="spellEnd"/>
+      <w:r>
+        <w:t xml:space="preserve"> Master svolgono anche il ruolo di sviluppatori.</w:t>
       </w:r>
     </w:p>
     <w:p>
@@ -5053,7 +5197,15 @@
         <w:jc w:val="both"/>
       </w:pPr>
       <w:r>
-        <w:t xml:space="preserve">Inoltre, seppur non sia coerente totalmente con il metodo SCRUM classico, all’interno del team di implementazione abbiamo suddiviso </w:t>
+        <w:t xml:space="preserve">Inoltre, seppur non sia coerente totalmente con il metodo SCRUM classico, all’interno </w:t>
+      </w:r>
+      <w:proofErr w:type="gramStart"/>
+      <w:r>
+        <w:t>del team</w:t>
+      </w:r>
+      <w:proofErr w:type="gramEnd"/>
+      <w:r>
+        <w:t xml:space="preserve"> di implementazione abbiamo suddiviso </w:t>
       </w:r>
       <w:r>
         <w:t xml:space="preserve">approssimativamente </w:t>
@@ -5067,6 +5219,7 @@
         <w:spacing w:after="0"/>
         <w:jc w:val="both"/>
       </w:pPr>
+      <w:proofErr w:type="spellStart"/>
       <w:r>
         <w:rPr>
           <w:b/>
@@ -5074,6 +5227,7 @@
         </w:rPr>
         <w:t>Frontend</w:t>
       </w:r>
+      <w:proofErr w:type="spellEnd"/>
       <w:r>
         <w:t>: sviluppo interfaccia, mappa interattiva, passaggio tra pagine, menù.</w:t>
       </w:r>
@@ -5083,6 +5237,7 @@
         <w:spacing w:after="0"/>
         <w:jc w:val="both"/>
       </w:pPr>
+      <w:proofErr w:type="spellStart"/>
       <w:r>
         <w:rPr>
           <w:b/>
@@ -5090,6 +5245,7 @@
         </w:rPr>
         <w:t>Backend</w:t>
       </w:r>
+      <w:proofErr w:type="spellEnd"/>
       <w:r>
         <w:rPr>
           <w:b/>
@@ -5121,11 +5277,24 @@
       <w:r>
         <w:t xml:space="preserve">: gestione </w:t>
       </w:r>
+      <w:proofErr w:type="spellStart"/>
       <w:r>
         <w:t>F</w:t>
       </w:r>
       <w:r>
-        <w:t>irebase Realtime Database, controlli utente e prenotazioni, salvataggio dati, sicurezza</w:t>
+        <w:t>irebase</w:t>
+      </w:r>
+      <w:proofErr w:type="spellEnd"/>
+      <w:r>
+        <w:t xml:space="preserve"> </w:t>
+      </w:r>
+      <w:proofErr w:type="spellStart"/>
+      <w:r>
+        <w:t>Realtime</w:t>
+      </w:r>
+      <w:proofErr w:type="spellEnd"/>
+      <w:r>
+        <w:t xml:space="preserve"> Database, controlli utente e prenotazioni, salvataggio dati, sicurezza</w:t>
       </w:r>
       <w:r>
         <w:t>.</w:t>
@@ -5169,7 +5338,15 @@
         <w:jc w:val="both"/>
       </w:pPr>
       <w:r>
-        <w:t xml:space="preserve">Le specifiche e l’assegnazione di questi ruoli all’interno del team sono </w:t>
+        <w:t xml:space="preserve">Le specifiche e l’assegnazione di questi ruoli all’interno </w:t>
+      </w:r>
+      <w:proofErr w:type="gramStart"/>
+      <w:r>
+        <w:t>del team</w:t>
+      </w:r>
+      <w:proofErr w:type="gramEnd"/>
+      <w:r>
+        <w:t xml:space="preserve"> sono </w:t>
       </w:r>
       <w:r>
         <w:t>illustrate in maniera più dettagliata</w:t>
@@ -5254,7 +5431,15 @@
         <w:t>Sono previsti inoltre b</w:t>
       </w:r>
       <w:r>
-        <w:t xml:space="preserve">revi meeting principalmente non online per risolvere problemi </w:t>
+        <w:t xml:space="preserve">revi </w:t>
+      </w:r>
+      <w:proofErr w:type="gramStart"/>
+      <w:r>
+        <w:t>meeting principalmente non online</w:t>
+      </w:r>
+      <w:proofErr w:type="gramEnd"/>
+      <w:r>
+        <w:t xml:space="preserve"> per risolvere problemi </w:t>
       </w:r>
       <w:r>
         <w:t xml:space="preserve">e </w:t>
@@ -5278,8 +5463,13 @@
         <w:jc w:val="both"/>
       </w:pPr>
       <w:r>
-        <w:t>Decisioni, urgenze e task vengono gestiti dal gruppo stesso durante i meeting settimanali</w:t>
-      </w:r>
+        <w:t xml:space="preserve">Decisioni, urgenze e task vengono gestiti dal gruppo stesso durante </w:t>
+      </w:r>
+      <w:proofErr w:type="gramStart"/>
+      <w:r>
+        <w:t>i meeting settimanali</w:t>
+      </w:r>
+      <w:proofErr w:type="gramEnd"/>
       <w:r>
         <w:t xml:space="preserve"> di durata superiore rispetto a quello quotidiani</w:t>
       </w:r>
@@ -5305,11 +5495,16 @@
         <w:t xml:space="preserve"> </w:t>
       </w:r>
       <w:r>
-        <w:t>Esso è inoltre utilizzato per la tracciabilità e per la gestione delle issue</w:t>
+        <w:t xml:space="preserve">Esso è inoltre utilizzato per la tracciabilità e per la gestione delle </w:t>
+      </w:r>
+      <w:proofErr w:type="spellStart"/>
+      <w:r>
+        <w:t>issue</w:t>
       </w:r>
       <w:r>
         <w:t>s</w:t>
       </w:r>
+      <w:proofErr w:type="spellEnd"/>
       <w:r>
         <w:t>.</w:t>
       </w:r>
@@ -5320,7 +5515,15 @@
         <w:jc w:val="both"/>
       </w:pPr>
       <w:r>
-        <w:t>La documentazione viene inizialmente caricata e modificata in un file condiviso in Google Drive per poi essere integrata ufficialmente nella repository.</w:t>
+        <w:t xml:space="preserve">La documentazione viene inizialmente caricata e modificata in un file condiviso in Google Drive per poi essere integrata ufficialmente </w:t>
+      </w:r>
+      <w:proofErr w:type="gramStart"/>
+      <w:r>
+        <w:t>nella repository</w:t>
+      </w:r>
+      <w:proofErr w:type="gramEnd"/>
+      <w:r>
+        <w:t>.</w:t>
       </w:r>
     </w:p>
     <w:p>
@@ -5329,7 +5532,15 @@
         <w:jc w:val="both"/>
       </w:pPr>
       <w:r>
-        <w:t>È necessario lavoro costante da parte di tutto il team.</w:t>
+        <w:t xml:space="preserve">È necessario lavoro costante da parte di </w:t>
+      </w:r>
+      <w:proofErr w:type="gramStart"/>
+      <w:r>
+        <w:t>tutto il team</w:t>
+      </w:r>
+      <w:proofErr w:type="gramEnd"/>
+      <w:r>
+        <w:t>.</w:t>
       </w:r>
     </w:p>
     <w:p>
@@ -5383,7 +5594,15 @@
         <w:t>GitHub</w:t>
       </w:r>
       <w:r>
-        <w:t>, gestore di configurazione online distribuito che permette ad ognuno di avere una propria local repo</w:t>
+        <w:t xml:space="preserve">, gestore di configurazione online distribuito che permette ad ognuno di avere una propria </w:t>
+      </w:r>
+      <w:proofErr w:type="spellStart"/>
+      <w:r>
+        <w:t>local</w:t>
+      </w:r>
+      <w:proofErr w:type="spellEnd"/>
+      <w:r>
+        <w:t xml:space="preserve"> repo</w:t>
       </w:r>
       <w:r>
         <w:t>sitory</w:t>
@@ -5401,7 +5620,15 @@
         <w:jc w:val="both"/>
       </w:pPr>
       <w:r>
-        <w:t>Riguardo la documentazione è necessaria chiarezza sia per le classi aggiunte, che devono essere esplicitamente e dettagliatamente spiegate, sia per tutti i commit che vengono fatti.</w:t>
+        <w:t xml:space="preserve">Riguardo la documentazione è necessaria chiarezza sia per le classi aggiunte, che devono essere esplicitamente e dettagliatamente spiegate, sia per tutti i </w:t>
+      </w:r>
+      <w:proofErr w:type="spellStart"/>
+      <w:r>
+        <w:t>commit</w:t>
+      </w:r>
+      <w:proofErr w:type="spellEnd"/>
+      <w:r>
+        <w:t xml:space="preserve"> che vengono fatti.</w:t>
       </w:r>
     </w:p>
     <w:p>
@@ -5419,7 +5646,15 @@
         <w:jc w:val="both"/>
       </w:pPr>
       <w:r>
-        <w:t>Nel titolo del commit ci dev</w:t>
+        <w:t xml:space="preserve">Nel titolo del </w:t>
+      </w:r>
+      <w:proofErr w:type="spellStart"/>
+      <w:r>
+        <w:t>commit</w:t>
+      </w:r>
+      <w:proofErr w:type="spellEnd"/>
+      <w:r>
+        <w:t xml:space="preserve"> ci dev</w:t>
       </w:r>
       <w:r>
         <w:t>ono</w:t>
@@ -5452,7 +5687,15 @@
         <w:jc w:val="both"/>
       </w:pPr>
       <w:r>
-        <w:t>È obbligatorio effettuare commit frequenti, anche se piccoli, se rappresentano una modifica logica.</w:t>
+        <w:t xml:space="preserve">È obbligatorio effettuare </w:t>
+      </w:r>
+      <w:proofErr w:type="spellStart"/>
+      <w:r>
+        <w:t>commit</w:t>
+      </w:r>
+      <w:proofErr w:type="spellEnd"/>
+      <w:r>
+        <w:t xml:space="preserve"> frequenti, anche se piccoli, se rappresentano una modifica logica.</w:t>
       </w:r>
     </w:p>
     <w:p>
@@ -5479,11 +5722,24 @@
         <w:t>generale) è</w:t>
       </w:r>
       <w:r>
-        <w:t xml:space="preserve"> consigliato comunque fare commit, magari aggiungendo la descrizione dell’errore</w:t>
-      </w:r>
-      <w:r>
-        <w:t xml:space="preserve"> o un issue</w:t>
-      </w:r>
+        <w:t xml:space="preserve"> consigliato comunque fare </w:t>
+      </w:r>
+      <w:proofErr w:type="spellStart"/>
+      <w:r>
+        <w:t>commit</w:t>
+      </w:r>
+      <w:proofErr w:type="spellEnd"/>
+      <w:r>
+        <w:t>, magari aggiungendo la descrizione dell’errore</w:t>
+      </w:r>
+      <w:r>
+        <w:t xml:space="preserve"> o un </w:t>
+      </w:r>
+      <w:proofErr w:type="spellStart"/>
+      <w:r>
+        <w:t>issue</w:t>
+      </w:r>
+      <w:proofErr w:type="spellEnd"/>
       <w:r>
         <w:t>. In questo modo ognuno è aggiornato alla versione corretta ed è possibile risolvere il bug</w:t>
       </w:r>
@@ -5590,7 +5846,15 @@
         <w:jc w:val="both"/>
       </w:pPr>
       <w:r>
-        <w:t>Queste funzioni avvengono tramite Javadoc (/**)</w:t>
+        <w:t xml:space="preserve">Queste funzioni avvengono tramite </w:t>
+      </w:r>
+      <w:proofErr w:type="spellStart"/>
+      <w:r>
+        <w:t>Javadoc</w:t>
+      </w:r>
+      <w:proofErr w:type="spellEnd"/>
+      <w:r>
+        <w:t xml:space="preserve"> (/**)</w:t>
       </w:r>
       <w:r>
         <w:t xml:space="preserve">. </w:t>
@@ -5623,21 +5887,54 @@
       <w:r>
         <w:t xml:space="preserve">si utilizza </w:t>
       </w:r>
-      <w:r>
-        <w:rPr>
-          <w:b/>
-          <w:bCs/>
-        </w:rPr>
-        <w:t>Firebase Realtime Database</w:t>
-      </w:r>
-      <w:r>
-        <w:t>, basato su linguaggio N</w:t>
+      <w:proofErr w:type="spellStart"/>
+      <w:r>
+        <w:rPr>
+          <w:b/>
+          <w:bCs/>
+        </w:rPr>
+        <w:t>Firebase</w:t>
+      </w:r>
+      <w:proofErr w:type="spellEnd"/>
+      <w:r>
+        <w:rPr>
+          <w:b/>
+          <w:bCs/>
+        </w:rPr>
+        <w:t xml:space="preserve"> </w:t>
+      </w:r>
+      <w:proofErr w:type="spellStart"/>
+      <w:r>
+        <w:rPr>
+          <w:b/>
+          <w:bCs/>
+        </w:rPr>
+        <w:t>Realtime</w:t>
+      </w:r>
+      <w:proofErr w:type="spellEnd"/>
+      <w:r>
+        <w:rPr>
+          <w:b/>
+          <w:bCs/>
+        </w:rPr>
+        <w:t xml:space="preserve"> Database</w:t>
+      </w:r>
+      <w:r>
+        <w:t xml:space="preserve">, basato su linguaggio </w:t>
+      </w:r>
+      <w:proofErr w:type="spellStart"/>
+      <w:r>
+        <w:t>N</w:t>
       </w:r>
       <w:r>
         <w:t>o</w:t>
       </w:r>
       <w:r>
-        <w:t>SQL.</w:t>
+        <w:t>SQL</w:t>
+      </w:r>
+      <w:proofErr w:type="spellEnd"/>
+      <w:r>
+        <w:t>.</w:t>
       </w:r>
       <w:r>
         <w:t xml:space="preserve"> </w:t>
@@ -5649,7 +5946,15 @@
         <w:t xml:space="preserve"> </w:t>
       </w:r>
       <w:r>
-        <w:t>Si utilizzano regole standard (preimpostate da Firebase)</w:t>
+        <w:t xml:space="preserve">Si utilizzano regole standard (preimpostate da </w:t>
+      </w:r>
+      <w:proofErr w:type="spellStart"/>
+      <w:r>
+        <w:t>Firebase</w:t>
+      </w:r>
+      <w:proofErr w:type="spellEnd"/>
+      <w:r>
+        <w:t>)</w:t>
       </w:r>
       <w:r>
         <w:t xml:space="preserve">, database privato, in modo che solo i membri interni al gruppo possano visualizzare e modificare. </w:t>
@@ -5657,11 +5962,16 @@
       <w:r>
         <w:t xml:space="preserve">Il ruolo assegnato al service account di </w:t>
       </w:r>
+      <w:proofErr w:type="spellStart"/>
       <w:r>
         <w:t>F</w:t>
       </w:r>
       <w:r>
-        <w:t>irebase è quello minimo, utile solo per leggere e scrivere sul database.</w:t>
+        <w:t>irebase</w:t>
+      </w:r>
+      <w:proofErr w:type="spellEnd"/>
+      <w:r>
+        <w:t xml:space="preserve"> è quello minimo, utile solo per leggere e scrivere sul database.</w:t>
       </w:r>
     </w:p>
     <w:p>
@@ -5754,6 +6064,7 @@
       <w:r>
         <w:t xml:space="preserve"> </w:t>
       </w:r>
+      <w:proofErr w:type="spellStart"/>
       <w:r>
         <w:rPr>
           <w:b/>
@@ -5761,6 +6072,7 @@
         </w:rPr>
         <w:t>Vaadin</w:t>
       </w:r>
+      <w:proofErr w:type="spellEnd"/>
       <w:r>
         <w:t xml:space="preserve">. </w:t>
       </w:r>
@@ -5805,7 +6117,15 @@
       </w:pPr>
       <w:r>
         <w:lastRenderedPageBreak/>
-        <w:t xml:space="preserve">Per la gestione stili e colore di caratteri e in generale della parte web visiva abbiamo integrato Vaadin (che è limitato sotto tale punto di vista) con delle aggiunte </w:t>
+        <w:t xml:space="preserve">Per la gestione stili e colore di caratteri e in generale della parte web visiva abbiamo integrato </w:t>
+      </w:r>
+      <w:proofErr w:type="spellStart"/>
+      <w:r>
+        <w:t>Vaadin</w:t>
+      </w:r>
+      <w:proofErr w:type="spellEnd"/>
+      <w:r>
+        <w:t xml:space="preserve"> (che è limitato sotto tale punto di vista) con delle aggiunte </w:t>
       </w:r>
       <w:r>
         <w:t xml:space="preserve">di </w:t>
@@ -5848,6 +6168,7 @@
       <w:r>
         <w:t xml:space="preserve"> per </w:t>
       </w:r>
+      <w:proofErr w:type="spellStart"/>
       <w:r>
         <w:rPr>
           <w:b/>
@@ -5855,6 +6176,7 @@
         </w:rPr>
         <w:t>Leaflet</w:t>
       </w:r>
+      <w:proofErr w:type="spellEnd"/>
       <w:r>
         <w:t xml:space="preserve">, un software open source che ci permette di </w:t>
       </w:r>
@@ -5892,7 +6214,15 @@
         <w:t xml:space="preserve"> </w:t>
       </w:r>
       <w:r>
-        <w:t>È infatti facilmente scalabile: si possono aggiungere nuovi nodi e funzionalità mantenendo il design implementato dal team.</w:t>
+        <w:t xml:space="preserve">È infatti facilmente scalabile: si possono aggiungere nuovi nodi e funzionalità mantenendo il design implementato </w:t>
+      </w:r>
+      <w:proofErr w:type="gramStart"/>
+      <w:r>
+        <w:t>dal team</w:t>
+      </w:r>
+      <w:proofErr w:type="gramEnd"/>
+      <w:r>
+        <w:t>.</w:t>
       </w:r>
     </w:p>
     <w:p>
@@ -6061,7 +6391,15 @@
         <w:jc w:val="both"/>
       </w:pPr>
       <w:r>
-        <w:t>Durante l‘incontro ogni membro aggiorna il gruppo sulle modifiche apportate al codice, eventuali problemi che ha rilevato, accorgimenti e un ipotetica suddivisione dei compiti che devono essere assegnati agli altri membri nel caso siano necessari per lo sviluppo del progetto.</w:t>
+        <w:t xml:space="preserve">Durante l‘incontro ogni membro aggiorna il gruppo sulle modifiche apportate al codice, eventuali problemi che ha rilevato, accorgimenti e </w:t>
+      </w:r>
+      <w:proofErr w:type="gramStart"/>
+      <w:r>
+        <w:t>un ipotetica</w:t>
+      </w:r>
+      <w:proofErr w:type="gramEnd"/>
+      <w:r>
+        <w:t xml:space="preserve"> suddivisione dei compiti che devono essere assegnati agli altri membri nel caso siano necessari per lo sviluppo del progetto.</w:t>
       </w:r>
     </w:p>
     <w:p>
@@ -6070,7 +6408,15 @@
         <w:jc w:val="both"/>
       </w:pPr>
       <w:r>
-        <w:t>Naturalmente tutto ciò, oltre ad essere tema di incontro, deve essere dettagliatamente descritto nella documentazione o negli issue tramite GitHub.</w:t>
+        <w:t xml:space="preserve">Naturalmente tutto ciò, oltre ad essere tema di incontro, deve essere dettagliatamente descritto nella documentazione o negli </w:t>
+      </w:r>
+      <w:proofErr w:type="spellStart"/>
+      <w:r>
+        <w:t>issue</w:t>
+      </w:r>
+      <w:proofErr w:type="spellEnd"/>
+      <w:r>
+        <w:t xml:space="preserve"> tramite GitHub.</w:t>
       </w:r>
     </w:p>
     <w:p>
@@ -6097,10 +6443,26 @@
         <w:t>SCRUM</w:t>
       </w:r>
       <w:r>
-        <w:t xml:space="preserve"> Master del team </w:t>
-      </w:r>
-      <w:r>
-        <w:t>ed è poi implementata dal team di sviluppatori in base al ruolo assegnato.</w:t>
+        <w:t xml:space="preserve"> Master </w:t>
+      </w:r>
+      <w:proofErr w:type="gramStart"/>
+      <w:r>
+        <w:t>del team</w:t>
+      </w:r>
+      <w:proofErr w:type="gramEnd"/>
+      <w:r>
+        <w:t xml:space="preserve"> </w:t>
+      </w:r>
+      <w:r>
+        <w:t xml:space="preserve">ed è poi implementata </w:t>
+      </w:r>
+      <w:proofErr w:type="gramStart"/>
+      <w:r>
+        <w:t>dal team</w:t>
+      </w:r>
+      <w:proofErr w:type="gramEnd"/>
+      <w:r>
+        <w:t xml:space="preserve"> di sviluppatori in base al ruolo assegnato.</w:t>
       </w:r>
     </w:p>
     <w:p>
@@ -6109,7 +6471,15 @@
         <w:jc w:val="both"/>
       </w:pPr>
       <w:r>
-        <w:t>In caso di mancata soluzione al problema, e la conseguente impossibilità di chiusura della issue nel caso sia stata creata, si opterà per un nuovo incontro di gruppo.</w:t>
+        <w:t xml:space="preserve">In caso di mancata soluzione al problema, e la conseguente impossibilità di chiusura della </w:t>
+      </w:r>
+      <w:proofErr w:type="spellStart"/>
+      <w:r>
+        <w:t>issue</w:t>
+      </w:r>
+      <w:proofErr w:type="spellEnd"/>
+      <w:r>
+        <w:t xml:space="preserve"> nel caso sia stata creata, si opterà per un nuovo incontro di gruppo.</w:t>
       </w:r>
     </w:p>
     <w:p>
@@ -6260,7 +6630,15 @@
         <w:jc w:val="both"/>
       </w:pPr>
       <w:r>
-        <w:t>Potrebbe succedere che per alcuni periodi (di esami) sia più complicato lavorare al progetto, rallentando la sua evoluzione e diminuendo la produttività e il numero di commit effettuati.</w:t>
+        <w:t xml:space="preserve">Potrebbe succedere che per alcuni periodi (di esami) sia più complicato lavorare al progetto, rallentando la sua evoluzione e diminuendo la produttività e il numero di </w:t>
+      </w:r>
+      <w:proofErr w:type="spellStart"/>
+      <w:r>
+        <w:t>commit</w:t>
+      </w:r>
+      <w:proofErr w:type="spellEnd"/>
+      <w:r>
+        <w:t xml:space="preserve"> effettuati.</w:t>
       </w:r>
     </w:p>
     <w:p>
@@ -6302,11 +6680,16 @@
       <w:r>
         <w:t xml:space="preserve">Altri problemi potrebbero ad esempio riguardare il database. Utilizzando </w:t>
       </w:r>
+      <w:proofErr w:type="spellStart"/>
       <w:r>
         <w:t>F</w:t>
       </w:r>
       <w:r>
-        <w:t>irebase database (nessun membro del gruppo lo aveva mai utilizzato in precedenza) potrebbero sorgere problematiche di gestione dei dati, creazione database</w:t>
+        <w:t>irebase</w:t>
+      </w:r>
+      <w:proofErr w:type="spellEnd"/>
+      <w:r>
+        <w:t xml:space="preserve"> database (nessun membro del gruppo lo aveva mai utilizzato in precedenza) potrebbero sorgere problematiche di gestione dei dati, creazione database</w:t>
       </w:r>
       <w:r>
         <w:t xml:space="preserve"> e interrogazioni.</w:t>
@@ -6315,7 +6698,15 @@
         <w:t xml:space="preserve"> </w:t>
       </w:r>
       <w:r>
-        <w:t>Utilizzando inoltre NoSQL i problemi potrebbero essere maggiori e più complicati da risolvere nel tempo.</w:t>
+        <w:t xml:space="preserve">Utilizzando inoltre </w:t>
+      </w:r>
+      <w:proofErr w:type="spellStart"/>
+      <w:r>
+        <w:t>NoSQL</w:t>
+      </w:r>
+      <w:proofErr w:type="spellEnd"/>
+      <w:r>
+        <w:t xml:space="preserve"> i problemi potrebbero essere maggiori e più complicati da risolvere nel tempo.</w:t>
       </w:r>
     </w:p>
     <w:p>
@@ -6333,7 +6724,15 @@
         <w:jc w:val="both"/>
       </w:pPr>
       <w:r>
-        <w:t>Nello stesso modo vale per Vaadin. È necessaria una fase inziale di comprensione su come utilizzarlo, cosa permette di fare e se è effettivamente utile e necessario al nostro progetto.</w:t>
+        <w:t xml:space="preserve">Nello stesso modo vale per </w:t>
+      </w:r>
+      <w:proofErr w:type="spellStart"/>
+      <w:r>
+        <w:t>Vaadin</w:t>
+      </w:r>
+      <w:proofErr w:type="spellEnd"/>
+      <w:r>
+        <w:t>. È necessaria una fase inziale di comprensione su come utilizzarlo, cosa permette di fare e se è effettivamente utile e necessario al nostro progetto.</w:t>
       </w:r>
     </w:p>
     <w:p>
@@ -6342,7 +6741,15 @@
         <w:jc w:val="both"/>
       </w:pPr>
       <w:r>
-        <w:t>Un ulteriore problema si potrebbe riscontrare nell’utilizzo di Papyrus perché è complesso il lavoro simultaneo anche su diagrammi differenti.</w:t>
+        <w:t xml:space="preserve">Un ulteriore problema si potrebbe riscontrare nell’utilizzo di </w:t>
+      </w:r>
+      <w:proofErr w:type="spellStart"/>
+      <w:r>
+        <w:t>Papyrus</w:t>
+      </w:r>
+      <w:proofErr w:type="spellEnd"/>
+      <w:r>
+        <w:t xml:space="preserve"> perché è complesso il lavoro simultaneo anche su diagrammi differenti.</w:t>
       </w:r>
     </w:p>
     <w:p>
@@ -6366,8 +6773,13 @@
       <w:r>
         <w:t xml:space="preserve"> </w:t>
       </w:r>
-      <w:r>
-        <w:t>Infatti è altamente sconsigliato inserire la chiave direttamente sulla repository online GitHub (se privata è possibile, ma non una buona norma).</w:t>
+      <w:proofErr w:type="gramStart"/>
+      <w:r>
+        <w:t>Infatti</w:t>
+      </w:r>
+      <w:proofErr w:type="gramEnd"/>
+      <w:r>
+        <w:t xml:space="preserve"> è altamente sconsigliato inserire la chiave direttamente sulla repository online GitHub (se privata è possibile, ma non una buona norma).</w:t>
       </w:r>
     </w:p>
     <w:p>
@@ -6731,12 +7143,19 @@
             <w:r>
               <w:t xml:space="preserve"> </w:t>
             </w:r>
-            <w:r>
-              <w:t xml:space="preserve">Firebase e </w:t>
-            </w:r>
+            <w:proofErr w:type="spellStart"/>
+            <w:r>
+              <w:t>Firebase</w:t>
+            </w:r>
+            <w:proofErr w:type="spellEnd"/>
+            <w:r>
+              <w:t xml:space="preserve"> e </w:t>
+            </w:r>
+            <w:proofErr w:type="spellStart"/>
             <w:r>
               <w:t>NoSQL</w:t>
             </w:r>
+            <w:proofErr w:type="spellEnd"/>
           </w:p>
         </w:tc>
         <w:tc>
@@ -6831,8 +7250,21 @@
               <w:spacing w:after="0"/>
             </w:pPr>
             <w:r>
-              <w:t>Inesperienza Vaadin e Leaflet</w:t>
-            </w:r>
+              <w:t xml:space="preserve">Inesperienza </w:t>
+            </w:r>
+            <w:proofErr w:type="spellStart"/>
+            <w:r>
+              <w:t>Vaadin</w:t>
+            </w:r>
+            <w:proofErr w:type="spellEnd"/>
+            <w:r>
+              <w:t xml:space="preserve"> e </w:t>
+            </w:r>
+            <w:proofErr w:type="spellStart"/>
+            <w:r>
+              <w:t>Leaflet</w:t>
+            </w:r>
+            <w:proofErr w:type="spellEnd"/>
           </w:p>
         </w:tc>
         <w:tc>
@@ -6954,7 +7386,15 @@
               <w:jc w:val="both"/>
             </w:pPr>
             <w:r>
-              <w:t>Mettere la repository privata e ridurre al minimo i ruoli del service</w:t>
+              <w:t xml:space="preserve">Mettere </w:t>
+            </w:r>
+            <w:proofErr w:type="gramStart"/>
+            <w:r>
+              <w:t>la repository</w:t>
+            </w:r>
+            <w:proofErr w:type="gramEnd"/>
+            <w:r>
+              <w:t xml:space="preserve"> privata e ridurre al minimo i ruoli del service</w:t>
             </w:r>
             <w:r>
               <w:t xml:space="preserve"> a</w:t>
@@ -6972,7 +7412,20 @@
               <w:jc w:val="both"/>
             </w:pPr>
             <w:r>
-              <w:t>Per maggiore sicurezza mettere la chiave nel .gitignore o utilizzare variabili d’ambiente.</w:t>
+              <w:t xml:space="preserve">Per maggiore sicurezza mettere la chiave </w:t>
+            </w:r>
+            <w:proofErr w:type="gramStart"/>
+            <w:r>
+              <w:t>nel .</w:t>
+            </w:r>
+            <w:proofErr w:type="spellStart"/>
+            <w:r>
+              <w:t>gitignore</w:t>
+            </w:r>
+            <w:proofErr w:type="spellEnd"/>
+            <w:proofErr w:type="gramEnd"/>
+            <w:r>
+              <w:t xml:space="preserve"> o utilizzare variabili d’ambiente.</w:t>
             </w:r>
           </w:p>
         </w:tc>
@@ -7066,11 +7519,16 @@
             <w:r>
               <w:t xml:space="preserve">Gestire tramite </w:t>
             </w:r>
+            <w:proofErr w:type="spellStart"/>
             <w:r>
               <w:t>F</w:t>
             </w:r>
             <w:r>
-              <w:t xml:space="preserve">irebase un controllo delle prenotazioni al momento del click. </w:t>
+              <w:t>irebase</w:t>
+            </w:r>
+            <w:proofErr w:type="spellEnd"/>
+            <w:r>
+              <w:t xml:space="preserve"> un controllo delle prenotazioni al momento del click. </w:t>
             </w:r>
           </w:p>
           <w:p>
@@ -7079,7 +7537,15 @@
               <w:jc w:val="both"/>
             </w:pPr>
             <w:r>
-              <w:t>Se necessario implementare le Transactions.</w:t>
+              <w:t xml:space="preserve">Se necessario implementare le </w:t>
+            </w:r>
+            <w:proofErr w:type="spellStart"/>
+            <w:r>
+              <w:t>Transactions</w:t>
+            </w:r>
+            <w:proofErr w:type="spellEnd"/>
+            <w:r>
+              <w:t>.</w:t>
             </w:r>
           </w:p>
         </w:tc>
@@ -7171,7 +7637,31 @@
               <w:jc w:val="both"/>
             </w:pPr>
             <w:r>
-              <w:t>Revisione attenta del codice prima di caricare nella repository. Se si utilizza un branch secondario, creare pull request e, se sono modifiche importante, attendere l’accettazione da parte di un altro membro.</w:t>
+              <w:t xml:space="preserve">Revisione attenta del codice prima di caricare </w:t>
+            </w:r>
+            <w:proofErr w:type="gramStart"/>
+            <w:r>
+              <w:t>nella repository</w:t>
+            </w:r>
+            <w:proofErr w:type="gramEnd"/>
+            <w:r>
+              <w:t xml:space="preserve">. Se si utilizza un </w:t>
+            </w:r>
+            <w:proofErr w:type="spellStart"/>
+            <w:r>
+              <w:t>branch</w:t>
+            </w:r>
+            <w:proofErr w:type="spellEnd"/>
+            <w:r>
+              <w:t xml:space="preserve"> secondario, creare pull </w:t>
+            </w:r>
+            <w:proofErr w:type="spellStart"/>
+            <w:r>
+              <w:t>request</w:t>
+            </w:r>
+            <w:proofErr w:type="spellEnd"/>
+            <w:r>
+              <w:t xml:space="preserve"> e, se sono modifiche importante, attendere l’accettazione da parte di un altro membro.</w:t>
             </w:r>
           </w:p>
         </w:tc>
@@ -7356,7 +7846,15 @@
         <w:t xml:space="preserve"> e i ruoli assegnati dal </w:t>
       </w:r>
       <w:r>
-        <w:t>Product Owner.</w:t>
+        <w:t xml:space="preserve">Product </w:t>
+      </w:r>
+      <w:proofErr w:type="spellStart"/>
+      <w:r>
+        <w:t>Owner</w:t>
+      </w:r>
+      <w:proofErr w:type="spellEnd"/>
+      <w:r>
+        <w:t>.</w:t>
       </w:r>
     </w:p>
     <w:p>
@@ -7399,7 +7897,23 @@
           <w:b/>
           <w:bCs/>
         </w:rPr>
-        <w:t xml:space="preserve">oduct Owner </w:t>
+        <w:t xml:space="preserve">oduct </w:t>
+      </w:r>
+      <w:proofErr w:type="spellStart"/>
+      <w:r>
+        <w:rPr>
+          <w:b/>
+          <w:bCs/>
+        </w:rPr>
+        <w:t>Owner</w:t>
+      </w:r>
+      <w:proofErr w:type="spellEnd"/>
+      <w:r>
+        <w:rPr>
+          <w:b/>
+          <w:bCs/>
+        </w:rPr>
+        <w:t xml:space="preserve"> </w:t>
       </w:r>
       <w:r>
         <w:rPr>
@@ -7506,7 +8020,15 @@
         <w:t>Cura la documentazione e raccoglie i requisiti funzionali e non funzionali in un file specifico</w:t>
       </w:r>
       <w:r>
-        <w:t xml:space="preserve"> in collaborazione con il Product Owner.</w:t>
+        <w:t xml:space="preserve"> in collaborazione con il Product </w:t>
+      </w:r>
+      <w:proofErr w:type="spellStart"/>
+      <w:r>
+        <w:t>Owner</w:t>
+      </w:r>
+      <w:proofErr w:type="spellEnd"/>
+      <w:r>
+        <w:t>.</w:t>
       </w:r>
     </w:p>
     <w:p>
@@ -7736,7 +8258,15 @@
         <w:t xml:space="preserve"> </w:t>
       </w:r>
       <w:r>
-        <w:t>Si sottolinea inoltre come la documentazione e la fase di testing sono compiti di ogni membro del team, in particolare dopo che effettua modifiche al codice.</w:t>
+        <w:t xml:space="preserve">Si sottolinea inoltre come la documentazione e la fase di testing sono compiti di ogni membro </w:t>
+      </w:r>
+      <w:proofErr w:type="gramStart"/>
+      <w:r>
+        <w:t>del team</w:t>
+      </w:r>
+      <w:proofErr w:type="gramEnd"/>
+      <w:r>
+        <w:t>, in particolare dopo che effettua modifiche al codice.</w:t>
       </w:r>
       <w:r>
         <w:t xml:space="preserve"> Il confine tra questi ruoli è labile.</w:t>
@@ -7859,7 +8389,15 @@
         <w:t xml:space="preserve">: i requisiti saranno raccolti tramite incontri di gruppo e discussioni guidate dal </w:t>
       </w:r>
       <w:r>
-        <w:t xml:space="preserve">Product Owner e dallo </w:t>
+        <w:t xml:space="preserve">Product </w:t>
+      </w:r>
+      <w:proofErr w:type="spellStart"/>
+      <w:r>
+        <w:t>Owner</w:t>
+      </w:r>
+      <w:proofErr w:type="spellEnd"/>
+      <w:r>
+        <w:t xml:space="preserve"> e dallo </w:t>
       </w:r>
       <w:r>
         <w:t>SCRUM</w:t>
@@ -7888,11 +8426,40 @@
       <w:r>
         <w:t xml:space="preserve">È stata infatti utilizzata una prioritizzazione di </w:t>
       </w:r>
-      <w:r>
-        <w:t>MoSCoW:</w:t>
-      </w:r>
-      <w:r>
-        <w:t xml:space="preserve"> la suddivisione dei requisiti in must, should, could e won’t permette di definire in maniera più chiara le scadenze e il tempo da dedicare ad ogni requisit</w:t>
+      <w:proofErr w:type="spellStart"/>
+      <w:r>
+        <w:t>MoSCoW</w:t>
+      </w:r>
+      <w:proofErr w:type="spellEnd"/>
+      <w:r>
+        <w:t>:</w:t>
+      </w:r>
+      <w:r>
+        <w:t xml:space="preserve"> la suddivisione dei requisiti in must, </w:t>
+      </w:r>
+      <w:proofErr w:type="spellStart"/>
+      <w:r>
+        <w:t>should</w:t>
+      </w:r>
+      <w:proofErr w:type="spellEnd"/>
+      <w:r>
+        <w:t xml:space="preserve">, </w:t>
+      </w:r>
+      <w:proofErr w:type="spellStart"/>
+      <w:r>
+        <w:t>could</w:t>
+      </w:r>
+      <w:proofErr w:type="spellEnd"/>
+      <w:r>
+        <w:t xml:space="preserve"> e </w:t>
+      </w:r>
+      <w:proofErr w:type="spellStart"/>
+      <w:r>
+        <w:t>won’t</w:t>
+      </w:r>
+      <w:proofErr w:type="spellEnd"/>
+      <w:r>
+        <w:t xml:space="preserve"> permette di definire in maniera più chiara le scadenze e il tempo da dedicare ad ogni requisit</w:t>
       </w:r>
       <w:r>
         <w:t>o</w:t>
@@ -7928,11 +8495,16 @@
       <w:r>
         <w:t>bject-</w:t>
       </w:r>
+      <w:proofErr w:type="spellStart"/>
       <w:r>
         <w:t>O</w:t>
       </w:r>
       <w:r>
-        <w:t>riented (OO), con l’ausilio di diagrammi UML per rappresentare classi, sequenze e componenti. La progettazione sarà validata in gruppo prima dell’inizio della codifica.</w:t>
+        <w:t>riented</w:t>
+      </w:r>
+      <w:proofErr w:type="spellEnd"/>
+      <w:r>
+        <w:t xml:space="preserve"> (OO), con l’ausilio di diagrammi UML per rappresentare classi, sequenze e componenti. La progettazione sarà validata in gruppo prima dell’inizio della codifica.</w:t>
       </w:r>
     </w:p>
     <w:p>
@@ -7984,10 +8556,50 @@
         <w:t>Controllo di versione</w:t>
       </w:r>
       <w:r>
-        <w:t xml:space="preserve">: il codice sarà gestito tramite Git, con repository su GitHub per il versionamento, la collaborazione e la revisione del codice. Ogni membro effettuerà commit regolari e aprirà pull request per l’integrazione </w:t>
-      </w:r>
-      <w:r>
-        <w:t>nel caso di lavoro su branch secondari</w:t>
+        <w:t xml:space="preserve">: il codice sarà gestito tramite </w:t>
+      </w:r>
+      <w:proofErr w:type="spellStart"/>
+      <w:r>
+        <w:t>Git</w:t>
+      </w:r>
+      <w:proofErr w:type="spellEnd"/>
+      <w:r>
+        <w:t xml:space="preserve">, con repository su GitHub per il </w:t>
+      </w:r>
+      <w:proofErr w:type="spellStart"/>
+      <w:r>
+        <w:t>versionamento</w:t>
+      </w:r>
+      <w:proofErr w:type="spellEnd"/>
+      <w:r>
+        <w:t xml:space="preserve">, la collaborazione e la revisione del codice. Ogni membro effettuerà </w:t>
+      </w:r>
+      <w:proofErr w:type="spellStart"/>
+      <w:r>
+        <w:t>commit</w:t>
+      </w:r>
+      <w:proofErr w:type="spellEnd"/>
+      <w:r>
+        <w:t xml:space="preserve"> regolari e aprirà pull </w:t>
+      </w:r>
+      <w:proofErr w:type="spellStart"/>
+      <w:r>
+        <w:t>request</w:t>
+      </w:r>
+      <w:proofErr w:type="spellEnd"/>
+      <w:r>
+        <w:t xml:space="preserve"> per l’integrazione </w:t>
+      </w:r>
+      <w:r>
+        <w:t xml:space="preserve">nel caso di lavoro su </w:t>
+      </w:r>
+      <w:proofErr w:type="spellStart"/>
+      <w:r>
+        <w:t>branch</w:t>
+      </w:r>
+      <w:proofErr w:type="spellEnd"/>
+      <w:r>
+        <w:t xml:space="preserve"> secondari</w:t>
       </w:r>
       <w:r>
         <w:t>.</w:t>
@@ -8005,7 +8617,15 @@
         <w:t>Documentazione tecnica</w:t>
       </w:r>
       <w:r>
-        <w:t>: sarà prodotta e mantenuta durante tutto il progetto, comprendendo specifiche dei requisiti, manuali tecnici e relazioni di test. I documenti saranno salvati in formato digitale condiviso e versionati insieme al codice.</w:t>
+        <w:t xml:space="preserve">: sarà prodotta e mantenuta durante tutto il progetto, comprendendo specifiche dei requisiti, manuali tecnici e relazioni di test. I documenti saranno salvati in formato digitale condiviso e </w:t>
+      </w:r>
+      <w:proofErr w:type="spellStart"/>
+      <w:r>
+        <w:t>versionati</w:t>
+      </w:r>
+      <w:proofErr w:type="spellEnd"/>
+      <w:r>
+        <w:t xml:space="preserve"> insieme al codice.</w:t>
       </w:r>
     </w:p>
     <w:p>
@@ -8044,7 +8664,15 @@
         <w:t xml:space="preserve">: i componenti saranno testati </w:t>
       </w:r>
       <w:r>
-        <w:t xml:space="preserve">manualmente ad ogni commit mentre il testing automatico verrà effettuato </w:t>
+        <w:t xml:space="preserve">manualmente ad ogni </w:t>
+      </w:r>
+      <w:proofErr w:type="spellStart"/>
+      <w:r>
+        <w:t>commit</w:t>
+      </w:r>
+      <w:proofErr w:type="spellEnd"/>
+      <w:r>
+        <w:t xml:space="preserve"> mentre il testing automatico verrà effettuato </w:t>
       </w:r>
       <w:r>
         <w:t xml:space="preserve">durante </w:t>
@@ -8168,8 +8796,13 @@
         <w:t xml:space="preserve"> da parte d</w:t>
       </w:r>
       <w:r>
-        <w:t>egli altri membri del team</w:t>
-      </w:r>
+        <w:t xml:space="preserve">egli altri membri </w:t>
+      </w:r>
+      <w:proofErr w:type="gramStart"/>
+      <w:r>
+        <w:t>del team</w:t>
+      </w:r>
+      <w:proofErr w:type="gramEnd"/>
       <w:r>
         <w:t>, che fornir</w:t>
       </w:r>
@@ -8211,7 +8844,23 @@
         <w:t>: saranno realizzati test unitari, di integrazione e di sistema per garantire il corretto funzionamento del software</w:t>
       </w:r>
       <w:r>
-        <w:t>. Ogni membro del team è responsabile di fare test sulle parti di codice che implementa. Se il codice non è funzionante deve segnalarlo a tutto il team.</w:t>
+        <w:t xml:space="preserve">. Ogni membro </w:t>
+      </w:r>
+      <w:proofErr w:type="gramStart"/>
+      <w:r>
+        <w:t>del team</w:t>
+      </w:r>
+      <w:proofErr w:type="gramEnd"/>
+      <w:r>
+        <w:t xml:space="preserve"> è responsabile di fare test sulle parti di codice che implementa. Se il codice non è funzionante deve segnalarlo a </w:t>
+      </w:r>
+      <w:proofErr w:type="gramStart"/>
+      <w:r>
+        <w:t>tutto il team</w:t>
+      </w:r>
+      <w:proofErr w:type="gramEnd"/>
+      <w:r>
+        <w:t>.</w:t>
       </w:r>
     </w:p>
     <w:p>
@@ -8229,7 +8878,21 @@
         <w:jc w:val="both"/>
       </w:pPr>
       <w:r>
-        <w:t>Verranno effettuati test automatici con JUnit per testare principalmente l’ inserimento dati da parte dell’utente.</w:t>
+        <w:t xml:space="preserve">Verranno effettuati test automatici con </w:t>
+      </w:r>
+      <w:proofErr w:type="spellStart"/>
+      <w:r>
+        <w:t>JUnit</w:t>
+      </w:r>
+      <w:proofErr w:type="spellEnd"/>
+      <w:r>
+        <w:t xml:space="preserve"> per testare principalmente </w:t>
+      </w:r>
+      <w:r>
+        <w:t>l’inserimento</w:t>
+      </w:r>
+      <w:r>
+        <w:t xml:space="preserve"> dati da parte dell’utente.</w:t>
       </w:r>
     </w:p>
     <w:p>
@@ -8269,7 +8932,15 @@
         <w:t xml:space="preserve"> tracciata la data del raggiungimento del requisito nell’apposito file.</w:t>
       </w:r>
       <w:r>
-        <w:t xml:space="preserve"> Ogni incontro, modifica e problema verranno tracciati all’interno di appositi documenti o tramite le issues di GitHub.</w:t>
+        <w:t xml:space="preserve"> Ogni incontro, modifica e problema verranno tracciati all’interno di appositi documenti o tramite le </w:t>
+      </w:r>
+      <w:proofErr w:type="spellStart"/>
+      <w:r>
+        <w:t>issues</w:t>
+      </w:r>
+      <w:proofErr w:type="spellEnd"/>
+      <w:r>
+        <w:t xml:space="preserve"> di GitHub.</w:t>
       </w:r>
     </w:p>
     <w:p>
@@ -8321,7 +8992,15 @@
         <w:t>: prima della consegna, il software sarà sottoposto a un test di accettazione finale per confermare la conformità alle specifiche e la stabilità del sistema.</w:t>
       </w:r>
       <w:r>
-        <w:t xml:space="preserve"> Verrà chiesto ad ogni membro del team di testare più volte il software al fine di trovare problematiche non notate in </w:t>
+        <w:t xml:space="preserve"> Verrà chiesto ad ogni membro </w:t>
+      </w:r>
+      <w:proofErr w:type="gramStart"/>
+      <w:r>
+        <w:t>del team</w:t>
+      </w:r>
+      <w:proofErr w:type="gramEnd"/>
+      <w:r>
+        <w:t xml:space="preserve"> di testare più volte il software al fine di trovare problematiche non notate in </w:t>
       </w:r>
       <w:r>
         <w:t>precedenza</w:t>
@@ -8490,8 +9169,42 @@
           <w:lang w:eastAsia="it-IT"/>
           <w14:ligatures w14:val="none"/>
         </w:rPr>
-        <w:t>Creazione repository privata GitHub e struttura progetto Vaadin e Spring Boot con dipendenze nel pom</w:t>
-      </w:r>
+        <w:t xml:space="preserve">Creazione repository privata GitHub e struttura progetto </w:t>
+      </w:r>
+      <w:proofErr w:type="spellStart"/>
+      <w:r>
+        <w:rPr>
+          <w:rFonts w:eastAsia="Times New Roman" w:cstheme="minorHAnsi"/>
+          <w:color w:val="000000"/>
+          <w:kern w:val="0"/>
+          <w:lang w:eastAsia="it-IT"/>
+          <w14:ligatures w14:val="none"/>
+        </w:rPr>
+        <w:t>Vaadin</w:t>
+      </w:r>
+      <w:proofErr w:type="spellEnd"/>
+      <w:r>
+        <w:rPr>
+          <w:rFonts w:eastAsia="Times New Roman" w:cstheme="minorHAnsi"/>
+          <w:color w:val="000000"/>
+          <w:kern w:val="0"/>
+          <w:lang w:eastAsia="it-IT"/>
+          <w14:ligatures w14:val="none"/>
+        </w:rPr>
+        <w:t xml:space="preserve"> e Spring Boot con dipendenze nel </w:t>
+      </w:r>
+      <w:proofErr w:type="spellStart"/>
+      <w:r>
+        <w:rPr>
+          <w:rFonts w:eastAsia="Times New Roman" w:cstheme="minorHAnsi"/>
+          <w:color w:val="000000"/>
+          <w:kern w:val="0"/>
+          <w:lang w:eastAsia="it-IT"/>
+          <w14:ligatures w14:val="none"/>
+        </w:rPr>
+        <w:t>pom</w:t>
+      </w:r>
+      <w:proofErr w:type="spellEnd"/>
     </w:p>
     <w:p>
       <w:pPr>
@@ -8523,7 +9236,51 @@
           <w:lang w:eastAsia="it-IT"/>
           <w14:ligatures w14:val="none"/>
         </w:rPr>
-        <w:t>Configurazione Firebase (Realtime Database) e chiavi di accesso nella classe apposita</w:t>
+        <w:t xml:space="preserve">Configurazione </w:t>
+      </w:r>
+      <w:proofErr w:type="spellStart"/>
+      <w:r>
+        <w:rPr>
+          <w:rFonts w:eastAsia="Times New Roman" w:cstheme="minorHAnsi"/>
+          <w:color w:val="000000"/>
+          <w:kern w:val="0"/>
+          <w:lang w:eastAsia="it-IT"/>
+          <w14:ligatures w14:val="none"/>
+        </w:rPr>
+        <w:t>Firebase</w:t>
+      </w:r>
+      <w:proofErr w:type="spellEnd"/>
+      <w:r>
+        <w:rPr>
+          <w:rFonts w:eastAsia="Times New Roman" w:cstheme="minorHAnsi"/>
+          <w:color w:val="000000"/>
+          <w:kern w:val="0"/>
+          <w:lang w:eastAsia="it-IT"/>
+          <w14:ligatures w14:val="none"/>
+        </w:rPr>
+        <w:t xml:space="preserve"> (</w:t>
+      </w:r>
+      <w:proofErr w:type="spellStart"/>
+      <w:r>
+        <w:rPr>
+          <w:rFonts w:eastAsia="Times New Roman" w:cstheme="minorHAnsi"/>
+          <w:color w:val="000000"/>
+          <w:kern w:val="0"/>
+          <w:lang w:eastAsia="it-IT"/>
+          <w14:ligatures w14:val="none"/>
+        </w:rPr>
+        <w:t>Realtime</w:t>
+      </w:r>
+      <w:proofErr w:type="spellEnd"/>
+      <w:r>
+        <w:rPr>
+          <w:rFonts w:eastAsia="Times New Roman" w:cstheme="minorHAnsi"/>
+          <w:color w:val="000000"/>
+          <w:kern w:val="0"/>
+          <w:lang w:eastAsia="it-IT"/>
+          <w14:ligatures w14:val="none"/>
+        </w:rPr>
+        <w:t xml:space="preserve"> Database) e chiavi di accesso nella classe apposita</w:t>
       </w:r>
     </w:p>
     <w:p>
@@ -8794,8 +9551,20 @@
           <w:lang w:eastAsia="it-IT"/>
           <w14:ligatures w14:val="none"/>
         </w:rPr>
-        <w:t>Implementazione delle dipendenze necessarie per utilizzare Leaflet</w:t>
-      </w:r>
+        <w:t xml:space="preserve">Implementazione delle dipendenze necessarie per utilizzare </w:t>
+      </w:r>
+      <w:proofErr w:type="spellStart"/>
+      <w:r>
+        <w:rPr>
+          <w:rFonts w:eastAsia="Times New Roman" w:cstheme="minorHAnsi"/>
+          <w:color w:val="000000"/>
+          <w:kern w:val="0"/>
+          <w:lang w:eastAsia="it-IT"/>
+          <w14:ligatures w14:val="none"/>
+        </w:rPr>
+        <w:t>Leaflet</w:t>
+      </w:r>
+      <w:proofErr w:type="spellEnd"/>
     </w:p>
     <w:p>
       <w:pPr>
@@ -8860,7 +9629,51 @@
           <w:lang w:eastAsia="it-IT"/>
           <w14:ligatures w14:val="none"/>
         </w:rPr>
-        <w:t>Caricamento dei marker delle colonnine da Firebase sulla mappa Leaflet, con coordinate</w:t>
+        <w:t xml:space="preserve">Caricamento dei marker delle colonnine da </w:t>
+      </w:r>
+      <w:proofErr w:type="spellStart"/>
+      <w:r>
+        <w:rPr>
+          <w:rFonts w:eastAsia="Times New Roman" w:cstheme="minorHAnsi"/>
+          <w:color w:val="000000"/>
+          <w:kern w:val="0"/>
+          <w:lang w:eastAsia="it-IT"/>
+          <w14:ligatures w14:val="none"/>
+        </w:rPr>
+        <w:t>Firebase</w:t>
+      </w:r>
+      <w:proofErr w:type="spellEnd"/>
+      <w:r>
+        <w:rPr>
+          <w:rFonts w:eastAsia="Times New Roman" w:cstheme="minorHAnsi"/>
+          <w:color w:val="000000"/>
+          <w:kern w:val="0"/>
+          <w:lang w:eastAsia="it-IT"/>
+          <w14:ligatures w14:val="none"/>
+        </w:rPr>
+        <w:t xml:space="preserve"> sulla mappa </w:t>
+      </w:r>
+      <w:proofErr w:type="spellStart"/>
+      <w:r>
+        <w:rPr>
+          <w:rFonts w:eastAsia="Times New Roman" w:cstheme="minorHAnsi"/>
+          <w:color w:val="000000"/>
+          <w:kern w:val="0"/>
+          <w:lang w:eastAsia="it-IT"/>
+          <w14:ligatures w14:val="none"/>
+        </w:rPr>
+        <w:t>Leaflet</w:t>
+      </w:r>
+      <w:proofErr w:type="spellEnd"/>
+      <w:r>
+        <w:rPr>
+          <w:rFonts w:eastAsia="Times New Roman" w:cstheme="minorHAnsi"/>
+          <w:color w:val="000000"/>
+          <w:kern w:val="0"/>
+          <w:lang w:eastAsia="it-IT"/>
+          <w14:ligatures w14:val="none"/>
+        </w:rPr>
+        <w:t>, con coordinate</w:t>
       </w:r>
     </w:p>
     <w:p>
@@ -8926,7 +9739,29 @@
           <w:lang w:eastAsia="it-IT"/>
           <w14:ligatures w14:val="none"/>
         </w:rPr>
-        <w:t>Visualizzazione sidebar con dettagli colonnina al click sul marker con al suo interno tasto prenota, recensioni e segnalazioni</w:t>
+        <w:t xml:space="preserve">Visualizzazione </w:t>
+      </w:r>
+      <w:proofErr w:type="spellStart"/>
+      <w:r>
+        <w:rPr>
+          <w:rFonts w:eastAsia="Times New Roman" w:cstheme="minorHAnsi"/>
+          <w:color w:val="000000"/>
+          <w:kern w:val="0"/>
+          <w:lang w:eastAsia="it-IT"/>
+          <w14:ligatures w14:val="none"/>
+        </w:rPr>
+        <w:t>sidebar</w:t>
+      </w:r>
+      <w:proofErr w:type="spellEnd"/>
+      <w:r>
+        <w:rPr>
+          <w:rFonts w:eastAsia="Times New Roman" w:cstheme="minorHAnsi"/>
+          <w:color w:val="000000"/>
+          <w:kern w:val="0"/>
+          <w:lang w:eastAsia="it-IT"/>
+          <w14:ligatures w14:val="none"/>
+        </w:rPr>
+        <w:t xml:space="preserve"> con dettagli colonnina al click sul marker con al suo interno tasto prenota, recensioni e segnalazioni</w:t>
       </w:r>
     </w:p>
     <w:p>
@@ -9011,7 +9846,29 @@
           <w:lang w:eastAsia="it-IT"/>
           <w14:ligatures w14:val="none"/>
         </w:rPr>
-        <w:t>Sviluppo interfaccia di selezione data e slot orari con menù a tendina nella sidebar che si visualizza dopo il click sulla colonnina</w:t>
+        <w:t xml:space="preserve">Sviluppo interfaccia di selezione data e slot orari con menù a tendina nella </w:t>
+      </w:r>
+      <w:proofErr w:type="spellStart"/>
+      <w:r>
+        <w:rPr>
+          <w:rFonts w:eastAsia="Times New Roman" w:cstheme="minorHAnsi"/>
+          <w:color w:val="000000"/>
+          <w:kern w:val="0"/>
+          <w:lang w:eastAsia="it-IT"/>
+          <w14:ligatures w14:val="none"/>
+        </w:rPr>
+        <w:t>sidebar</w:t>
+      </w:r>
+      <w:proofErr w:type="spellEnd"/>
+      <w:r>
+        <w:rPr>
+          <w:rFonts w:eastAsia="Times New Roman" w:cstheme="minorHAnsi"/>
+          <w:color w:val="000000"/>
+          <w:kern w:val="0"/>
+          <w:lang w:eastAsia="it-IT"/>
+          <w14:ligatures w14:val="none"/>
+        </w:rPr>
+        <w:t xml:space="preserve"> che si visualizza dopo il click sulla colonnina</w:t>
       </w:r>
     </w:p>
     <w:p>
@@ -9045,7 +9902,29 @@
           <w:lang w:eastAsia="it-IT"/>
           <w14:ligatures w14:val="none"/>
         </w:rPr>
-        <w:t xml:space="preserve">Implementazione logica backend per la validazione della prenotazione, gestione </w:t>
+        <w:t xml:space="preserve">Implementazione logica </w:t>
+      </w:r>
+      <w:proofErr w:type="spellStart"/>
+      <w:r>
+        <w:rPr>
+          <w:rFonts w:eastAsia="Times New Roman" w:cstheme="minorHAnsi"/>
+          <w:color w:val="000000"/>
+          <w:kern w:val="0"/>
+          <w:lang w:eastAsia="it-IT"/>
+          <w14:ligatures w14:val="none"/>
+        </w:rPr>
+        <w:t>backend</w:t>
+      </w:r>
+      <w:proofErr w:type="spellEnd"/>
+      <w:r>
+        <w:rPr>
+          <w:rFonts w:eastAsia="Times New Roman" w:cstheme="minorHAnsi"/>
+          <w:color w:val="000000"/>
+          <w:kern w:val="0"/>
+          <w:lang w:eastAsia="it-IT"/>
+          <w14:ligatures w14:val="none"/>
+        </w:rPr>
+        <w:t xml:space="preserve"> per la validazione della prenotazione, gestione </w:t>
       </w:r>
       <w:r>
         <w:rPr>
@@ -9133,7 +10012,29 @@
           <w:lang w:eastAsia="it-IT"/>
           <w14:ligatures w14:val="none"/>
         </w:rPr>
-        <w:t>Implementazione in Firebase Service di tutti i nodi necessari per corretta gestione DB</w:t>
+        <w:t xml:space="preserve">Implementazione in </w:t>
+      </w:r>
+      <w:proofErr w:type="spellStart"/>
+      <w:r>
+        <w:rPr>
+          <w:rFonts w:eastAsia="Times New Roman" w:cstheme="minorHAnsi"/>
+          <w:color w:val="000000"/>
+          <w:kern w:val="0"/>
+          <w:lang w:eastAsia="it-IT"/>
+          <w14:ligatures w14:val="none"/>
+        </w:rPr>
+        <w:t>Firebase</w:t>
+      </w:r>
+      <w:proofErr w:type="spellEnd"/>
+      <w:r>
+        <w:rPr>
+          <w:rFonts w:eastAsia="Times New Roman" w:cstheme="minorHAnsi"/>
+          <w:color w:val="000000"/>
+          <w:kern w:val="0"/>
+          <w:lang w:eastAsia="it-IT"/>
+          <w14:ligatures w14:val="none"/>
+        </w:rPr>
+        <w:t xml:space="preserve"> Service di tutti i nodi necessari per corretta gestione DB</w:t>
       </w:r>
     </w:p>
     <w:p>
@@ -9624,152 +10525,6 @@
     <w:p>
       <w:pPr>
         <w:jc w:val="both"/>
-      </w:pPr>
-    </w:p>
-    <w:p>
-      <w:pPr>
-        <w:jc w:val="both"/>
-      </w:pPr>
-    </w:p>
-    <w:p>
-      <w:pPr>
-        <w:jc w:val="both"/>
-      </w:pPr>
-    </w:p>
-    <w:p>
-      <w:pPr>
-        <w:jc w:val="both"/>
-      </w:pPr>
-    </w:p>
-    <w:p>
-      <w:pPr>
-        <w:jc w:val="both"/>
-      </w:pPr>
-    </w:p>
-    <w:p>
-      <w:pPr>
-        <w:jc w:val="both"/>
-      </w:pPr>
-    </w:p>
-    <w:p>
-      <w:pPr>
-        <w:jc w:val="both"/>
-      </w:pPr>
-    </w:p>
-    <w:p>
-      <w:pPr>
-        <w:jc w:val="both"/>
-      </w:pPr>
-    </w:p>
-    <w:p>
-      <w:pPr>
-        <w:jc w:val="both"/>
-      </w:pPr>
-    </w:p>
-    <w:p>
-      <w:pPr>
-        <w:jc w:val="both"/>
-      </w:pPr>
-    </w:p>
-    <w:p>
-      <w:pPr>
-        <w:jc w:val="both"/>
-      </w:pPr>
-    </w:p>
-    <w:p>
-      <w:pPr>
-        <w:jc w:val="both"/>
-      </w:pPr>
-    </w:p>
-    <w:p>
-      <w:pPr>
-        <w:jc w:val="both"/>
-      </w:pPr>
-    </w:p>
-    <w:p>
-      <w:pPr>
-        <w:jc w:val="both"/>
-      </w:pPr>
-    </w:p>
-    <w:p>
-      <w:pPr>
-        <w:jc w:val="both"/>
-      </w:pPr>
-    </w:p>
-    <w:p>
-      <w:pPr>
-        <w:jc w:val="both"/>
-      </w:pPr>
-    </w:p>
-    <w:p>
-      <w:pPr>
-        <w:jc w:val="both"/>
-      </w:pPr>
-    </w:p>
-    <w:p>
-      <w:pPr>
-        <w:jc w:val="both"/>
-      </w:pPr>
-    </w:p>
-    <w:p>
-      <w:pPr>
-        <w:jc w:val="both"/>
-      </w:pPr>
-    </w:p>
-    <w:p>
-      <w:pPr>
-        <w:jc w:val="both"/>
-      </w:pPr>
-    </w:p>
-    <w:p>
-      <w:pPr>
-        <w:jc w:val="both"/>
-      </w:pPr>
-    </w:p>
-    <w:p>
-      <w:pPr>
-        <w:jc w:val="both"/>
-      </w:pPr>
-    </w:p>
-    <w:p>
-      <w:pPr>
-        <w:jc w:val="both"/>
-      </w:pPr>
-    </w:p>
-    <w:p>
-      <w:pPr>
-        <w:jc w:val="both"/>
-      </w:pPr>
-    </w:p>
-    <w:p>
-      <w:pPr>
-        <w:jc w:val="both"/>
-      </w:pPr>
-    </w:p>
-    <w:p>
-      <w:pPr>
-        <w:jc w:val="both"/>
-      </w:pPr>
-    </w:p>
-    <w:p>
-      <w:pPr>
-        <w:jc w:val="both"/>
-      </w:pPr>
-    </w:p>
-    <w:p>
-      <w:pPr>
-        <w:jc w:val="both"/>
-        <w:rPr>
-          <w:b/>
-          <w:bCs/>
-          <w:sz w:val="28"/>
-          <w:szCs w:val="28"/>
-        </w:rPr>
-      </w:pPr>
-    </w:p>
-    <w:p>
-      <w:pPr>
-        <w:jc w:val="both"/>
         <w:rPr>
           <w:b/>
           <w:bCs/>
@@ -9821,8 +10576,13 @@
         <w:t>Quattro</w:t>
       </w:r>
       <w:r>
-        <w:t xml:space="preserve"> membri del team</w:t>
-      </w:r>
+        <w:t xml:space="preserve"> membri </w:t>
+      </w:r>
+      <w:proofErr w:type="gramStart"/>
+      <w:r>
+        <w:t>del team</w:t>
+      </w:r>
+      <w:proofErr w:type="gramEnd"/>
       <w:r>
         <w:t xml:space="preserve">, ciascuno con il proprio ruolo e responsabilità (descritti meglio nella sezione </w:t>
       </w:r>
@@ -9901,7 +10661,21 @@
         <w:rPr>
           <w:lang w:val="en-GB"/>
         </w:rPr>
-        <w:t>Papyrus - versione 2024-06</w:t>
+        <w:t xml:space="preserve">Papyrus - </w:t>
+      </w:r>
+      <w:proofErr w:type="spellStart"/>
+      <w:r>
+        <w:rPr>
+          <w:lang w:val="en-GB"/>
+        </w:rPr>
+        <w:t>versione</w:t>
+      </w:r>
+      <w:proofErr w:type="spellEnd"/>
+      <w:r>
+        <w:rPr>
+          <w:lang w:val="en-GB"/>
+        </w:rPr>
+        <w:t xml:space="preserve"> 2024-06</w:t>
       </w:r>
     </w:p>
     <w:p>
@@ -9932,11 +10706,19 @@
         </w:rPr>
         <w:t xml:space="preserve"> - </w:t>
       </w:r>
+      <w:proofErr w:type="spellStart"/>
       <w:r>
         <w:rPr>
           <w:lang w:val="en-GB"/>
         </w:rPr>
-        <w:t>versione 17</w:t>
+        <w:t>versione</w:t>
+      </w:r>
+      <w:proofErr w:type="spellEnd"/>
+      <w:r>
+        <w:rPr>
+          <w:lang w:val="en-GB"/>
+        </w:rPr>
+        <w:t xml:space="preserve"> 17</w:t>
       </w:r>
     </w:p>
     <w:p>
@@ -9969,8 +10751,21 @@
         <w:ind w:left="567"/>
         <w:jc w:val="both"/>
       </w:pPr>
-      <w:r>
-        <w:t>Firebase Realtime Database (piano gratuito</w:t>
+      <w:proofErr w:type="spellStart"/>
+      <w:r>
+        <w:t>Firebase</w:t>
+      </w:r>
+      <w:proofErr w:type="spellEnd"/>
+      <w:r>
+        <w:t xml:space="preserve"> </w:t>
+      </w:r>
+      <w:proofErr w:type="spellStart"/>
+      <w:r>
+        <w:t>Realtime</w:t>
+      </w:r>
+      <w:proofErr w:type="spellEnd"/>
+      <w:r>
+        <w:t xml:space="preserve"> Database (piano gratuito</w:t>
       </w:r>
       <w:r>
         <w:t xml:space="preserve"> Spark</w:t>
@@ -10001,8 +10796,13 @@
         <w:ind w:left="567"/>
         <w:jc w:val="both"/>
       </w:pPr>
-      <w:r>
-        <w:t xml:space="preserve">Vaadin </w:t>
+      <w:proofErr w:type="spellStart"/>
+      <w:r>
+        <w:t>Vaadin</w:t>
+      </w:r>
+      <w:proofErr w:type="spellEnd"/>
+      <w:r>
+        <w:t xml:space="preserve"> </w:t>
       </w:r>
       <w:r>
         <w:t xml:space="preserve">- </w:t>
@@ -10062,9 +10862,11 @@
         <w:ind w:left="567"/>
         <w:jc w:val="both"/>
       </w:pPr>
+      <w:proofErr w:type="spellStart"/>
       <w:r>
         <w:t>Leaflet</w:t>
       </w:r>
+      <w:proofErr w:type="spellEnd"/>
       <w:r>
         <w:t xml:space="preserve"> </w:t>
       </w:r>
@@ -10094,8 +10896,13 @@
         <w:ind w:left="567"/>
         <w:jc w:val="both"/>
       </w:pPr>
-      <w:r>
-        <w:t xml:space="preserve">Apexcharts - versione </w:t>
+      <w:proofErr w:type="spellStart"/>
+      <w:r>
+        <w:t>Apexcharts</w:t>
+      </w:r>
+      <w:proofErr w:type="spellEnd"/>
+      <w:r>
+        <w:t xml:space="preserve"> - versione </w:t>
       </w:r>
       <w:r>
         <w:t>23.0.1</w:t>
@@ -10113,8 +10920,13 @@
         </w:tabs>
         <w:ind w:left="567"/>
       </w:pPr>
-      <w:r>
-        <w:t xml:space="preserve">BCrypt per criptare le password </w:t>
+      <w:proofErr w:type="spellStart"/>
+      <w:r>
+        <w:t>BCrypt</w:t>
+      </w:r>
+      <w:proofErr w:type="spellEnd"/>
+      <w:r>
+        <w:t xml:space="preserve"> per criptare le password </w:t>
       </w:r>
     </w:p>
     <w:p>
@@ -10130,8 +10942,13 @@
         <w:ind w:left="567"/>
         <w:jc w:val="both"/>
       </w:pPr>
-      <w:r>
-        <w:t>ZXing per la generazione di QR code</w:t>
+      <w:proofErr w:type="spellStart"/>
+      <w:r>
+        <w:t>ZXing</w:t>
+      </w:r>
+      <w:proofErr w:type="spellEnd"/>
+      <w:r>
+        <w:t xml:space="preserve"> per la generazione di QR code</w:t>
       </w:r>
       <w:r>
         <w:t xml:space="preserve"> - versione3.5.2</w:t>
@@ -10160,7 +10977,15 @@
         <w:t xml:space="preserve"> necessaria</w:t>
       </w:r>
       <w:r>
-        <w:t>, tutti i piano sono gratuiti e limitati</w:t>
+        <w:t xml:space="preserve">, tutti </w:t>
+      </w:r>
+      <w:proofErr w:type="gramStart"/>
+      <w:r>
+        <w:t>i piano</w:t>
+      </w:r>
+      <w:proofErr w:type="gramEnd"/>
+      <w:r>
+        <w:t xml:space="preserve"> sono gratuiti e limitati</w:t>
       </w:r>
     </w:p>
     <w:p>
@@ -10230,8 +11055,13 @@
         <w:jc w:val="both"/>
       </w:pPr>
       <w:r>
-        <w:t>GitHub per la revisione dei commit</w:t>
-      </w:r>
+        <w:t xml:space="preserve">GitHub per la revisione dei </w:t>
+      </w:r>
+      <w:proofErr w:type="spellStart"/>
+      <w:r>
+        <w:t>commit</w:t>
+      </w:r>
+      <w:proofErr w:type="spellEnd"/>
       <w:r>
         <w:t>,</w:t>
       </w:r>
@@ -10239,8 +11069,13 @@
         <w:t xml:space="preserve"> la tracciabilità delle modifiche</w:t>
       </w:r>
       <w:r>
-        <w:t xml:space="preserve"> e la gestione delle issues</w:t>
-      </w:r>
+        <w:t xml:space="preserve"> e la gestione delle </w:t>
+      </w:r>
+      <w:proofErr w:type="spellStart"/>
+      <w:r>
+        <w:t>issues</w:t>
+      </w:r>
+      <w:proofErr w:type="spellEnd"/>
     </w:p>
     <w:p>
       <w:pPr>
@@ -10261,7 +11096,15 @@
         <w:t>D</w:t>
       </w:r>
       <w:r>
-        <w:t>esktop per i commit e le modifiche</w:t>
+        <w:t xml:space="preserve">esktop per i </w:t>
+      </w:r>
+      <w:proofErr w:type="spellStart"/>
+      <w:r>
+        <w:t>commit</w:t>
+      </w:r>
+      <w:proofErr w:type="spellEnd"/>
+      <w:r>
+        <w:t xml:space="preserve"> e le modifiche</w:t>
       </w:r>
     </w:p>
     <w:p>
@@ -10288,8 +11131,13 @@
         <w:jc w:val="both"/>
       </w:pPr>
       <w:r>
-        <w:t>PC di ogni membro del team</w:t>
-      </w:r>
+        <w:t xml:space="preserve">PC di ogni membro </w:t>
+      </w:r>
+      <w:proofErr w:type="gramStart"/>
+      <w:r>
+        <w:t>del team</w:t>
+      </w:r>
+      <w:proofErr w:type="gramEnd"/>
       <w:r>
         <w:t xml:space="preserve"> già in suo possesso</w:t>
       </w:r>
@@ -10378,10 +11226,39 @@
         <w:t>utte le tecnologie e piattaforme utilizzate (</w:t>
       </w:r>
       <w:r>
-        <w:t>Eclipse, Papyrus</w:t>
-      </w:r>
-      <w:r>
-        <w:t>, Vaadin, Leaflet, Firebase piano base, GitHub Free) sono gratuite per gli scopi del progetto</w:t>
+        <w:t xml:space="preserve">Eclipse, </w:t>
+      </w:r>
+      <w:proofErr w:type="spellStart"/>
+      <w:r>
+        <w:t>Papyrus</w:t>
+      </w:r>
+      <w:proofErr w:type="spellEnd"/>
+      <w:r>
+        <w:t xml:space="preserve">, </w:t>
+      </w:r>
+      <w:proofErr w:type="spellStart"/>
+      <w:r>
+        <w:t>Vaadin</w:t>
+      </w:r>
+      <w:proofErr w:type="spellEnd"/>
+      <w:r>
+        <w:t xml:space="preserve">, </w:t>
+      </w:r>
+      <w:proofErr w:type="spellStart"/>
+      <w:r>
+        <w:t>Leaflet</w:t>
+      </w:r>
+      <w:proofErr w:type="spellEnd"/>
+      <w:r>
+        <w:t xml:space="preserve">, </w:t>
+      </w:r>
+      <w:proofErr w:type="spellStart"/>
+      <w:r>
+        <w:t>Firebase</w:t>
+      </w:r>
+      <w:proofErr w:type="spellEnd"/>
+      <w:r>
+        <w:t xml:space="preserve"> piano base, GitHub Free) sono gratuite per gli scopi del progetto</w:t>
       </w:r>
       <w:r>
         <w:t>.</w:t>
@@ -10473,7 +11350,15 @@
         <w:t>20-160 ore</w:t>
       </w:r>
       <w:r>
-        <w:t xml:space="preserve"> di sviluppo puro (la parte di studio, comprensione e comunicazione nel team non sono comprese)</w:t>
+        <w:t xml:space="preserve"> di sviluppo puro (la parte di studio, comprensione e comunicazione </w:t>
+      </w:r>
+      <w:proofErr w:type="gramStart"/>
+      <w:r>
+        <w:t>nel team</w:t>
+      </w:r>
+      <w:proofErr w:type="gramEnd"/>
+      <w:r>
+        <w:t xml:space="preserve"> non sono comprese)</w:t>
       </w:r>
       <w:r>
         <w:t>.</w:t>
@@ -10647,7 +11532,15 @@
         <w:t xml:space="preserve">(ai requisiti, al design o al codice) dovrà essere discussa e approvata dal gruppo, in particolare dal </w:t>
       </w:r>
       <w:r>
-        <w:t>Product Owner.</w:t>
+        <w:t xml:space="preserve">Product </w:t>
+      </w:r>
+      <w:proofErr w:type="spellStart"/>
+      <w:r>
+        <w:t>Owner</w:t>
+      </w:r>
+      <w:proofErr w:type="spellEnd"/>
+      <w:r>
+        <w:t>.</w:t>
       </w:r>
     </w:p>
     <w:p>
@@ -10671,8 +11564,13 @@
         <w:t>un’approvazione</w:t>
       </w:r>
       <w:r>
-        <w:t xml:space="preserve"> da parte del team</w:t>
-      </w:r>
+        <w:t xml:space="preserve"> da parte </w:t>
+      </w:r>
+      <w:proofErr w:type="gramStart"/>
+      <w:r>
+        <w:t>del team</w:t>
+      </w:r>
+      <w:proofErr w:type="gramEnd"/>
       <w:r>
         <w:t>.</w:t>
       </w:r>
@@ -10703,7 +11601,15 @@
         <w:t>m</w:t>
       </w:r>
       <w:r>
-        <w:t>odifiche alla struttura del database (aggiunta di nodi o modifiche di Firebase)</w:t>
+        <w:t xml:space="preserve">odifiche alla struttura del database (aggiunta di nodi o modifiche di </w:t>
+      </w:r>
+      <w:proofErr w:type="spellStart"/>
+      <w:r>
+        <w:t>Firebase</w:t>
+      </w:r>
+      <w:proofErr w:type="spellEnd"/>
+      <w:r>
+        <w:t>)</w:t>
       </w:r>
       <w:r>
         <w:t>;</w:t>
@@ -10761,7 +11667,31 @@
         <w:t>Hub</w:t>
       </w:r>
       <w:r>
-        <w:t>, creando un nuovo branch o commit dedicato e una pull request per la revisione</w:t>
+        <w:t xml:space="preserve">, creando un nuovo </w:t>
+      </w:r>
+      <w:proofErr w:type="spellStart"/>
+      <w:r>
+        <w:t>branch</w:t>
+      </w:r>
+      <w:proofErr w:type="spellEnd"/>
+      <w:r>
+        <w:t xml:space="preserve"> o </w:t>
+      </w:r>
+      <w:proofErr w:type="spellStart"/>
+      <w:r>
+        <w:t>commit</w:t>
+      </w:r>
+      <w:proofErr w:type="spellEnd"/>
+      <w:r>
+        <w:t xml:space="preserve"> dedicato e una pull </w:t>
+      </w:r>
+      <w:proofErr w:type="spellStart"/>
+      <w:r>
+        <w:t>request</w:t>
+      </w:r>
+      <w:proofErr w:type="spellEnd"/>
+      <w:r>
+        <w:t xml:space="preserve"> per la revisione</w:t>
       </w:r>
       <w:r>
         <w:t xml:space="preserve">. </w:t>
@@ -10773,7 +11703,15 @@
         <w:jc w:val="both"/>
       </w:pPr>
       <w:r>
-        <w:t>Nonostante sia utilizzato un metodo agile è importante che la descrizione del commit sia ben dettagliata e spieghi in maniera precisa i cambiamenti rispetto alla versione precedente.</w:t>
+        <w:t xml:space="preserve">Nonostante sia utilizzato un metodo agile è importante che la descrizione del </w:t>
+      </w:r>
+      <w:proofErr w:type="spellStart"/>
+      <w:r>
+        <w:t>commit</w:t>
+      </w:r>
+      <w:proofErr w:type="spellEnd"/>
+      <w:r>
+        <w:t xml:space="preserve"> sia ben dettagliata e spieghi in maniera precisa i cambiamenti rispetto alla versione precedente.</w:t>
       </w:r>
     </w:p>
     <w:p>
@@ -10782,13 +11720,29 @@
         <w:jc w:val="both"/>
       </w:pPr>
       <w:r>
-        <w:t xml:space="preserve">Nel caso di branch secondario, a seguito </w:t>
+        <w:t xml:space="preserve">Nel caso di </w:t>
+      </w:r>
+      <w:proofErr w:type="spellStart"/>
+      <w:r>
+        <w:t>branch</w:t>
+      </w:r>
+      <w:proofErr w:type="spellEnd"/>
+      <w:r>
+        <w:t xml:space="preserve"> secondario, a seguito </w:t>
       </w:r>
       <w:r>
         <w:t>di</w:t>
       </w:r>
       <w:r>
-        <w:t xml:space="preserve"> pull request ci si aspetta che un altro membro del gruppo visualizzi la richiesta e la approvi o non la approvi con le adeguate motivazioni.</w:t>
+        <w:t xml:space="preserve"> pull </w:t>
+      </w:r>
+      <w:proofErr w:type="spellStart"/>
+      <w:r>
+        <w:t>request</w:t>
+      </w:r>
+      <w:proofErr w:type="spellEnd"/>
+      <w:r>
+        <w:t xml:space="preserve"> ci si aspetta che un altro membro del gruppo visualizzi la richiesta e la approvi o non la approvi con le adeguate motivazioni.</w:t>
       </w:r>
     </w:p>
     <w:p>
@@ -10898,13 +11852,29 @@
         <w:t>GitHub</w:t>
       </w:r>
       <w:r>
-        <w:t xml:space="preserve">: garganti) e con l’esercitatrice (account </w:t>
+        <w:t xml:space="preserve">: </w:t>
+      </w:r>
+      <w:proofErr w:type="spellStart"/>
+      <w:r>
+        <w:t>garganti</w:t>
+      </w:r>
+      <w:proofErr w:type="spellEnd"/>
+      <w:r>
+        <w:t xml:space="preserve">) e con l’esercitatrice (account </w:t>
       </w:r>
       <w:r>
         <w:t>GitHub</w:t>
       </w:r>
       <w:r>
-        <w:t xml:space="preserve">: silviabonfanti). </w:t>
+        <w:t xml:space="preserve">: </w:t>
+      </w:r>
+      <w:proofErr w:type="spellStart"/>
+      <w:r>
+        <w:t>silviabonfanti</w:t>
+      </w:r>
+      <w:proofErr w:type="spellEnd"/>
+      <w:r>
+        <w:t xml:space="preserve">). </w:t>
       </w:r>
     </w:p>
     <w:p>

</xml_diff>

<commit_message>
Ultime modifiche al project plan e aggiunta versione pdf
</commit_message>
<xml_diff>
--- a/documentazione/project plan.docx
+++ b/documentazione/project plan.docx
@@ -389,7 +389,16 @@
           <w:sz w:val="24"/>
           <w:szCs w:val="24"/>
         </w:rPr>
-        <w:t>Prof. Angelo Gargantini</w:t>
+        <w:t xml:space="preserve">Prof. </w:t>
+      </w:r>
+      <w:r>
+        <w:rPr>
+          <w:b/>
+          <w:bCs/>
+          <w:sz w:val="24"/>
+          <w:szCs w:val="24"/>
+        </w:rPr>
+        <w:t>Gargantini Angelo</w:t>
       </w:r>
       <w:r>
         <w:rPr>
@@ -477,6 +486,15 @@
           <w:szCs w:val="24"/>
         </w:rPr>
       </w:pPr>
+      <w:r>
+        <w:rPr>
+          <w:b/>
+          <w:bCs/>
+          <w:sz w:val="24"/>
+          <w:szCs w:val="24"/>
+        </w:rPr>
+        <w:t>Prof.ssa. Bonfanti Silvia</w:t>
+      </w:r>
       <w:r>
         <w:rPr>
           <w:b/>
@@ -3101,7 +3119,7 @@
                 <w:noProof/>
                 <w:webHidden/>
               </w:rPr>
-              <w:t>17</w:t>
+              <w:t>16</w:t>
             </w:r>
             <w:r>
               <w:rPr>
@@ -3173,7 +3191,7 @@
                 <w:noProof/>
                 <w:webHidden/>
               </w:rPr>
-              <w:t>17</w:t>
+              <w:t>16</w:t>
             </w:r>
             <w:r>
               <w:rPr>
@@ -3245,7 +3263,7 @@
                 <w:noProof/>
                 <w:webHidden/>
               </w:rPr>
-              <w:t>17</w:t>
+              <w:t>16</w:t>
             </w:r>
             <w:r>
               <w:rPr>
@@ -3317,7 +3335,7 @@
                 <w:noProof/>
                 <w:webHidden/>
               </w:rPr>
-              <w:t>17</w:t>
+              <w:t>16</w:t>
             </w:r>
             <w:r>
               <w:rPr>
@@ -3389,7 +3407,7 @@
                 <w:noProof/>
                 <w:webHidden/>
               </w:rPr>
-              <w:t>17</w:t>
+              <w:t>16</w:t>
             </w:r>
             <w:r>
               <w:rPr>
@@ -3458,7 +3476,7 @@
                 <w:noProof/>
                 <w:webHidden/>
               </w:rPr>
-              <w:t>18</w:t>
+              <w:t>17</w:t>
             </w:r>
             <w:r>
               <w:rPr>
@@ -3530,7 +3548,7 @@
                 <w:noProof/>
                 <w:webHidden/>
               </w:rPr>
-              <w:t>18</w:t>
+              <w:t>17</w:t>
             </w:r>
             <w:r>
               <w:rPr>
@@ -3602,7 +3620,7 @@
                 <w:noProof/>
                 <w:webHidden/>
               </w:rPr>
-              <w:t>18</w:t>
+              <w:t>17</w:t>
             </w:r>
             <w:r>
               <w:rPr>
@@ -3674,7 +3692,7 @@
                 <w:noProof/>
                 <w:webHidden/>
               </w:rPr>
-              <w:t>18</w:t>
+              <w:t>17</w:t>
             </w:r>
             <w:r>
               <w:rPr>
@@ -3743,7 +3761,7 @@
                 <w:noProof/>
                 <w:webHidden/>
               </w:rPr>
-              <w:t>19</w:t>
+              <w:t>18</w:t>
             </w:r>
             <w:r>
               <w:rPr>
@@ -3812,7 +3830,7 @@
                 <w:noProof/>
                 <w:webHidden/>
               </w:rPr>
-              <w:t>20</w:t>
+              <w:t>19</w:t>
             </w:r>
             <w:r>
               <w:rPr>
@@ -4046,10 +4064,13 @@
         <w:t>tramite scansione diretta</w:t>
       </w:r>
       <w:r>
-        <w:t xml:space="preserve"> a</w:t>
-      </w:r>
-      <w:r>
-        <w:t>lla colonnina di controllare che tutto corrisponda per poi avviare l’erogazione della corrente e la ricarica dell’auto (la gestione di questa fase non rientra nel nostro progetto).</w:t>
+        <w:t xml:space="preserve"> </w:t>
+      </w:r>
+      <w:r>
+        <w:t>sul lettore presente sulla</w:t>
+      </w:r>
+      <w:r>
+        <w:t xml:space="preserve"> colonnina di controllare che tutto corrisponda per poi avviare l’erogazione della corrente e la ricarica dell’auto (la gestione di questa fase non rientra nel nostro progetto).</w:t>
       </w:r>
       <w:r>
         <w:t xml:space="preserve"> </w:t>
@@ -4308,15 +4329,7 @@
         <w:t>i</w:t>
       </w:r>
       <w:r>
-        <w:t xml:space="preserve">, </w:t>
-      </w:r>
-      <w:proofErr w:type="gramStart"/>
-      <w:r>
-        <w:t>meeting frequenti ma brevi</w:t>
-      </w:r>
-      <w:proofErr w:type="gramEnd"/>
-      <w:r>
-        <w:t xml:space="preserve"> e </w:t>
+        <w:t xml:space="preserve">, meeting frequenti ma brevi e </w:t>
       </w:r>
       <w:r>
         <w:t xml:space="preserve">processi di </w:t>
@@ -4510,16 +4523,11 @@
       <w:r>
         <w:t xml:space="preserve"> effettiva delle funzionalità decise in precedenza </w:t>
       </w:r>
-      <w:proofErr w:type="gramStart"/>
       <w:r>
         <w:t>nei</w:t>
       </w:r>
       <w:r>
-        <w:t xml:space="preserve"> meeting</w:t>
-      </w:r>
-      <w:proofErr w:type="gramEnd"/>
-      <w:r>
-        <w:t xml:space="preserve"> in presenza per aggiornamenti su eventuali problematiche</w:t>
+        <w:t xml:space="preserve"> meeting in presenza</w:t>
       </w:r>
       <w:r>
         <w:t>.</w:t>
@@ -4549,14 +4557,25 @@
       <w:r>
         <w:t xml:space="preserve"> </w:t>
       </w:r>
-    </w:p>
-    <w:p>
-      <w:pPr>
-        <w:spacing w:after="0"/>
-        <w:jc w:val="both"/>
-      </w:pPr>
+      <w:r>
+        <w:t xml:space="preserve">Lo sprint </w:t>
+      </w:r>
       <w:proofErr w:type="spellStart"/>
       <w:r>
+        <w:t>retrospective</w:t>
+      </w:r>
+      <w:proofErr w:type="spellEnd"/>
+      <w:r>
+        <w:t xml:space="preserve"> è compreso in questa fase.</w:t>
+      </w:r>
+    </w:p>
+    <w:p>
+      <w:pPr>
+        <w:spacing w:after="0"/>
+        <w:jc w:val="both"/>
+      </w:pPr>
+      <w:proofErr w:type="spellStart"/>
+      <w:r>
         <w:rPr>
           <w:b/>
           <w:bCs/>
@@ -4579,15 +4598,7 @@
         <w:t>SCRUM</w:t>
       </w:r>
       <w:r>
-        <w:t xml:space="preserve">: ogni giorno </w:t>
-      </w:r>
-      <w:proofErr w:type="gramStart"/>
-      <w:r>
-        <w:t>il team</w:t>
-      </w:r>
-      <w:proofErr w:type="gramEnd"/>
-      <w:r>
-        <w:t xml:space="preserve"> si ritrova fisicamente per una condivisione delle modifiche apportate e degli eventuali problemi riscontrati.</w:t>
+        <w:t>: ogni giorno il team si ritrova fisicamente per una condivisione delle modifiche apportate e degli eventuali problemi riscontrati.</w:t>
       </w:r>
     </w:p>
     <w:p>
@@ -4730,13 +4741,8 @@
             <w:pPr>
               <w:jc w:val="both"/>
             </w:pPr>
-            <w:proofErr w:type="gramStart"/>
-            <w:r>
-              <w:t>2</w:t>
-            </w:r>
-            <w:proofErr w:type="gramEnd"/>
-            <w:r>
-              <w:t xml:space="preserve"> settimane</w:t>
+            <w:r>
+              <w:t>2 settimane</w:t>
             </w:r>
           </w:p>
         </w:tc>
@@ -4813,13 +4819,8 @@
             <w:pPr>
               <w:jc w:val="both"/>
             </w:pPr>
-            <w:proofErr w:type="gramStart"/>
-            <w:r>
-              <w:t>10</w:t>
-            </w:r>
-            <w:proofErr w:type="gramEnd"/>
-            <w:r>
-              <w:t xml:space="preserve"> giorni</w:t>
+            <w:r>
+              <w:t>10 giorni</w:t>
             </w:r>
           </w:p>
         </w:tc>
@@ -4941,13 +4942,8 @@
             <w:pPr>
               <w:jc w:val="both"/>
             </w:pPr>
-            <w:proofErr w:type="gramStart"/>
-            <w:r>
-              <w:t>10</w:t>
-            </w:r>
-            <w:proofErr w:type="gramEnd"/>
-            <w:r>
-              <w:t xml:space="preserve"> giorni</w:t>
+            <w:r>
+              <w:t>10 giorni</w:t>
             </w:r>
           </w:p>
         </w:tc>
@@ -5023,91 +5019,420 @@
         <w:t xml:space="preserve"> SCRUM</w:t>
       </w:r>
       <w:r>
-        <w:t xml:space="preserve"> dal gruppo utilizzato.</w:t>
-      </w:r>
-    </w:p>
-    <w:p>
-      <w:pPr>
-        <w:spacing w:after="0"/>
-        <w:jc w:val="both"/>
-      </w:pPr>
-      <w:r>
-        <w:rPr>
-          <w:b/>
-          <w:bCs/>
-        </w:rPr>
-        <w:t xml:space="preserve">Product </w:t>
+        <w:t xml:space="preserve"> </w:t>
+      </w:r>
+      <w:r>
+        <w:t>adottato dal gruppo</w:t>
+      </w:r>
+      <w:r>
+        <w:t>.</w:t>
+      </w:r>
+    </w:p>
+    <w:p>
+      <w:pPr>
+        <w:spacing w:after="0"/>
+        <w:jc w:val="both"/>
+      </w:pPr>
+      <w:r>
+        <w:rPr>
+          <w:b/>
+          <w:bCs/>
+        </w:rPr>
+        <w:t>Product owner</w:t>
+      </w:r>
+      <w:r>
+        <w:t xml:space="preserve"> </w:t>
+      </w:r>
+      <w:r>
+        <w:t>-</w:t>
+      </w:r>
+      <w:r>
+        <w:t xml:space="preserve"> Davide Mascheretti</w:t>
+      </w:r>
+      <w:r>
+        <w:t xml:space="preserve">: responsabile della gestione generale del progetto, delle risorse e delle </w:t>
+      </w:r>
+      <w:r>
+        <w:t>priorità.</w:t>
+      </w:r>
+    </w:p>
+    <w:p>
+      <w:pPr>
+        <w:spacing w:after="0"/>
+        <w:jc w:val="both"/>
+      </w:pPr>
+      <w:r>
+        <w:rPr>
+          <w:b/>
+          <w:bCs/>
+        </w:rPr>
+        <w:t>SCRUM</w:t>
+      </w:r>
+      <w:r>
+        <w:rPr>
+          <w:b/>
+          <w:bCs/>
+        </w:rPr>
+        <w:t xml:space="preserve"> master</w:t>
+      </w:r>
+      <w:r>
+        <w:t xml:space="preserve"> </w:t>
+      </w:r>
+      <w:r>
+        <w:t>-</w:t>
+      </w:r>
+      <w:r>
+        <w:t xml:space="preserve"> Tommaso Maistrello</w:t>
+      </w:r>
+      <w:r>
+        <w:t>: responsabile del corretto svolgimento dell’approccio agile, della comunicazione nel team e risolutore di problemi di natura tecnica e non.</w:t>
+      </w:r>
+    </w:p>
+    <w:p>
+      <w:pPr>
+        <w:spacing w:after="0"/>
+        <w:jc w:val="both"/>
+      </w:pPr>
+      <w:r>
+        <w:rPr>
+          <w:b/>
+          <w:bCs/>
+        </w:rPr>
+        <w:t>Team di implementazione</w:t>
+      </w:r>
+      <w:r>
+        <w:t xml:space="preserve"> </w:t>
+      </w:r>
+      <w:r>
+        <w:t xml:space="preserve">- </w:t>
+      </w:r>
+      <w:r>
+        <w:t>Tommaso Maistrello, Davide Mascheretti, Claudio Morgera, Francesco Valenari</w:t>
+      </w:r>
+      <w:r>
+        <w:t>: responsabili dello sviluppo del software</w:t>
+      </w:r>
+      <w:r>
+        <w:t xml:space="preserve">, </w:t>
+      </w:r>
+      <w:r>
+        <w:t>della documentazione</w:t>
+      </w:r>
+      <w:r>
+        <w:t xml:space="preserve"> e del testing</w:t>
+      </w:r>
+      <w:r>
+        <w:t>.</w:t>
+      </w:r>
+    </w:p>
+    <w:p>
+      <w:pPr>
+        <w:spacing w:after="0"/>
+        <w:jc w:val="both"/>
+      </w:pPr>
+      <w:r>
+        <w:t>Dato il team ridotto il Product Owner e lo Scrum Master svolgono anche il ruolo di sviluppatori.</w:t>
+      </w:r>
+    </w:p>
+    <w:p>
+      <w:pPr>
+        <w:pStyle w:val="Stile2"/>
+      </w:pPr>
+      <w:bookmarkStart w:id="5" w:name="_Toc216349571"/>
+      <w:r>
+        <w:t>Ruoli</w:t>
+      </w:r>
+      <w:bookmarkEnd w:id="5"/>
+    </w:p>
+    <w:p>
+      <w:pPr>
+        <w:spacing w:after="0"/>
+        <w:jc w:val="both"/>
+      </w:pPr>
+      <w:r>
+        <w:t xml:space="preserve">Inoltre, seppur non sia coerente totalmente con il metodo SCRUM classico, all’interno del team di implementazione abbiamo suddiviso </w:t>
+      </w:r>
+      <w:r>
+        <w:t xml:space="preserve">approssimativamente </w:t>
+      </w:r>
+      <w:r>
+        <w:t>i ruoli in base alle competenze prevalenti.</w:t>
+      </w:r>
+    </w:p>
+    <w:p>
+      <w:pPr>
+        <w:spacing w:after="0"/>
+        <w:jc w:val="both"/>
+      </w:pPr>
+      <w:r>
+        <w:rPr>
+          <w:b/>
+          <w:bCs/>
+        </w:rPr>
+        <w:t>Frontend</w:t>
+      </w:r>
+      <w:r>
+        <w:t>: sviluppo interfaccia, mappa interattiva, passaggio tra pagine, menù.</w:t>
+      </w:r>
+    </w:p>
+    <w:p>
+      <w:pPr>
+        <w:spacing w:after="0"/>
+        <w:jc w:val="both"/>
+      </w:pPr>
+      <w:r>
+        <w:rPr>
+          <w:b/>
+          <w:bCs/>
+        </w:rPr>
+        <w:t>Backend</w:t>
+      </w:r>
+      <w:r>
+        <w:rPr>
+          <w:b/>
+          <w:bCs/>
+        </w:rPr>
+        <w:t xml:space="preserve"> </w:t>
+      </w:r>
+      <w:r>
+        <w:rPr>
+          <w:b/>
+          <w:bCs/>
+        </w:rPr>
+        <w:t>+</w:t>
+      </w:r>
+      <w:r>
+        <w:rPr>
+          <w:b/>
+          <w:bCs/>
+        </w:rPr>
+        <w:t xml:space="preserve"> </w:t>
+      </w:r>
+      <w:r>
+        <w:rPr>
+          <w:b/>
+          <w:bCs/>
+        </w:rPr>
+        <w:t>Database</w:t>
+      </w:r>
+      <w:r>
+        <w:t xml:space="preserve">: gestione </w:t>
+      </w:r>
+      <w:r>
+        <w:t>F</w:t>
+      </w:r>
+      <w:r>
+        <w:t>irebase Realtime Database, controlli utente e prenotazioni, salvataggio dati, sicurezza</w:t>
+      </w:r>
+      <w:r>
+        <w:t>.</w:t>
+      </w:r>
+    </w:p>
+    <w:p>
+      <w:pPr>
+        <w:spacing w:after="0"/>
+        <w:jc w:val="both"/>
+      </w:pPr>
+      <w:r>
+        <w:rPr>
+          <w:b/>
+          <w:bCs/>
+        </w:rPr>
+        <w:t xml:space="preserve">Testing: </w:t>
+      </w:r>
+      <w:r>
+        <w:t>controllo corretta funzionalità di metodi e di classi, verifica eccezioni.</w:t>
+      </w:r>
+    </w:p>
+    <w:p>
+      <w:pPr>
+        <w:spacing w:after="0"/>
+        <w:jc w:val="both"/>
+      </w:pPr>
+      <w:r>
+        <w:rPr>
+          <w:b/>
+          <w:bCs/>
+        </w:rPr>
+        <w:t>Documentazione</w:t>
+      </w:r>
+      <w:r>
+        <w:t>: project plan, diagrammi UML, informazioni generali.</w:t>
+      </w:r>
+    </w:p>
+    <w:p>
+      <w:pPr>
+        <w:spacing w:after="0"/>
+        <w:jc w:val="both"/>
+      </w:pPr>
+      <w:r>
+        <w:t xml:space="preserve">Le specifiche e l’assegnazione di questi ruoli all’interno del team sono </w:t>
+      </w:r>
+      <w:r>
+        <w:t>illustrate in maniera più dettagliata</w:t>
+      </w:r>
+      <w:r>
+        <w:t xml:space="preserve"> all’interno del paragrafo </w:t>
+      </w:r>
+      <w:r>
+        <w:t>“</w:t>
+      </w:r>
+      <w:r>
+        <w:t>Personale</w:t>
+      </w:r>
+      <w:r>
+        <w:t xml:space="preserve">”. </w:t>
+      </w:r>
+      <w:r>
+        <w:t xml:space="preserve">Nonostante </w:t>
+      </w:r>
+      <w:r>
+        <w:t>la divisione dei ruoli</w:t>
+      </w:r>
+      <w:r>
+        <w:t>, nel caso di necessità un membro del gruppo può contribuire alla collaborazione con il membro affidato a quel ruolo.</w:t>
+      </w:r>
+    </w:p>
+    <w:p>
+      <w:pPr>
+        <w:spacing w:after="0"/>
+        <w:jc w:val="both"/>
+      </w:pPr>
+      <w:r>
+        <w:t>La conoscenza deve essere utilizzata in maniera trasversale</w:t>
+      </w:r>
+      <w:r>
+        <w:t xml:space="preserve"> e il gruppo deve adottare un approccio collaborativo.</w:t>
+      </w:r>
+    </w:p>
+    <w:p>
+      <w:pPr>
+        <w:spacing w:after="0"/>
+        <w:jc w:val="both"/>
+      </w:pPr>
+      <w:r>
+        <w:t>La documentazione chiara e dettagliata è considerata responsabilità condivisa tra tutti i membri del gruppo, essa deve essere il compito di tutti.</w:t>
+      </w:r>
+    </w:p>
+    <w:p>
+      <w:pPr>
+        <w:spacing w:after="0"/>
+        <w:jc w:val="both"/>
+      </w:pPr>
+      <w:r>
+        <w:t>Questa tipologia di organizzazione permette ai membri del gruppo di avere una definita suddivis</w:t>
+      </w:r>
+      <w:r>
+        <w:t>i</w:t>
+      </w:r>
+      <w:r>
+        <w:t>one dei ruoli, in cui ognuno è a conoscenza delle sue responsabilità al fine di avere una corretta evoluzione del progetto.</w:t>
+      </w:r>
+    </w:p>
+    <w:p>
+      <w:pPr>
+        <w:pStyle w:val="Stile2"/>
+      </w:pPr>
+      <w:bookmarkStart w:id="6" w:name="_Toc216349572"/>
+      <w:r>
+        <w:t>Attività</w:t>
+      </w:r>
+      <w:bookmarkEnd w:id="6"/>
+    </w:p>
+    <w:p>
+      <w:pPr>
+        <w:spacing w:after="0"/>
+      </w:pPr>
+      <w:r>
+        <w:t>La comunicazione quotidiana interna avviene tramite un gruppo Whatsapp dedicato, utilizzato per scambio di informazioni, aggiornamenti, domande inerenti al progetto o a problemi riscontrati.</w:t>
+      </w:r>
+    </w:p>
+    <w:p>
+      <w:pPr>
+        <w:spacing w:after="0"/>
+        <w:jc w:val="both"/>
+      </w:pPr>
+      <w:r>
+        <w:t>Sono previsti inoltre b</w:t>
+      </w:r>
+      <w:r>
+        <w:t xml:space="preserve">revi meeting principalmente </w:t>
+      </w:r>
+      <w:r>
+        <w:t xml:space="preserve">in presenza </w:t>
+      </w:r>
+      <w:r>
+        <w:t xml:space="preserve">per risolvere problemi </w:t>
+      </w:r>
+      <w:r>
+        <w:t xml:space="preserve">e </w:t>
+      </w:r>
+      <w:r>
+        <w:t xml:space="preserve">per </w:t>
+      </w:r>
+      <w:r>
+        <w:t xml:space="preserve">eventuali </w:t>
+      </w:r>
+      <w:r>
+        <w:t>chiarimenti</w:t>
+      </w:r>
+      <w:r>
+        <w:t>.</w:t>
+      </w:r>
+    </w:p>
+    <w:p>
+      <w:pPr>
+        <w:spacing w:after="0"/>
+        <w:jc w:val="both"/>
+      </w:pPr>
+      <w:r>
+        <w:t>Decisioni, urgenze e task vengono gestiti dal gruppo stesso durante i meeting settimanali</w:t>
+      </w:r>
+      <w:r>
+        <w:t xml:space="preserve"> di durata superiore rispetto a quell</w:t>
+      </w:r>
+      <w:r>
+        <w:t>i</w:t>
+      </w:r>
+      <w:r>
+        <w:t xml:space="preserve"> quotidiani</w:t>
+      </w:r>
+      <w:r>
+        <w:t>, in cui si deci</w:t>
+      </w:r>
+      <w:r>
+        <w:t>de se sono necessari cambiamenti nei metodi di lavoro del team.</w:t>
+      </w:r>
+    </w:p>
+    <w:p>
+      <w:pPr>
+        <w:spacing w:after="0"/>
+        <w:jc w:val="both"/>
+      </w:pPr>
+      <w:r>
+        <w:t>La gestione delle attività che ogni membro svolge sul codice viene gestita tramite l’u</w:t>
+      </w:r>
+      <w:r>
+        <w:t xml:space="preserve">tilizzo di GitHub privato condiviso </w:t>
+      </w:r>
+      <w:r>
+        <w:t>con il gruppo.</w:t>
+      </w:r>
+      <w:r>
+        <w:t xml:space="preserve"> </w:t>
+      </w:r>
+      <w:r>
+        <w:t xml:space="preserve">Esso è inoltre utilizzato per la tracciabilità e per la gestione delle </w:t>
       </w:r>
       <w:proofErr w:type="spellStart"/>
       <w:r>
-        <w:rPr>
-          <w:b/>
-          <w:bCs/>
-        </w:rPr>
-        <w:t>owner</w:t>
+        <w:t>issue</w:t>
+      </w:r>
+      <w:r>
+        <w:t>s</w:t>
       </w:r>
       <w:proofErr w:type="spellEnd"/>
       <w:r>
-        <w:t xml:space="preserve"> </w:t>
-      </w:r>
-      <w:r>
-        <w:t>-</w:t>
-      </w:r>
-      <w:r>
-        <w:t xml:space="preserve"> Davide Mascheretti</w:t>
-      </w:r>
-      <w:r>
-        <w:t xml:space="preserve">: responsabile della gestione generale del progetto, delle risorse e delle </w:t>
-      </w:r>
-      <w:r>
-        <w:t>priorità.</w:t>
-      </w:r>
-    </w:p>
-    <w:p>
-      <w:pPr>
-        <w:spacing w:after="0"/>
-        <w:jc w:val="both"/>
-      </w:pPr>
-      <w:r>
-        <w:rPr>
-          <w:b/>
-          <w:bCs/>
-        </w:rPr>
-        <w:t>SCRUM</w:t>
-      </w:r>
-      <w:r>
-        <w:rPr>
-          <w:b/>
-          <w:bCs/>
-        </w:rPr>
-        <w:t xml:space="preserve"> master</w:t>
-      </w:r>
-      <w:r>
-        <w:t xml:space="preserve"> </w:t>
-      </w:r>
-      <w:r>
-        <w:t>-</w:t>
-      </w:r>
-      <w:r>
-        <w:t xml:space="preserve"> Tommaso Maistrello</w:t>
-      </w:r>
-      <w:r>
-        <w:t xml:space="preserve">: responsabile del corretto svolgimento dell’approccio agile, della comunicazione </w:t>
-      </w:r>
-      <w:proofErr w:type="gramStart"/>
-      <w:r>
-        <w:t>nel team</w:t>
-      </w:r>
-      <w:proofErr w:type="gramEnd"/>
-      <w:r>
-        <w:t xml:space="preserve"> e risolutore di problemi di natura tecnica e </w:t>
-      </w:r>
-      <w:proofErr w:type="gramStart"/>
-      <w:r>
-        <w:t>non</w:t>
-      </w:r>
-      <w:proofErr w:type="gramEnd"/>
-      <w:r>
         <w:t>.</w:t>
       </w:r>
     </w:p>
@@ -5117,430 +5442,16 @@
         <w:jc w:val="both"/>
       </w:pPr>
       <w:r>
-        <w:rPr>
-          <w:b/>
-          <w:bCs/>
-        </w:rPr>
-        <w:t>Team di implementazione</w:t>
-      </w:r>
-      <w:r>
-        <w:t xml:space="preserve"> </w:t>
-      </w:r>
-      <w:r>
-        <w:t xml:space="preserve">- </w:t>
-      </w:r>
-      <w:r>
-        <w:t>Tommaso Maistrello, Davide Mascheretti, Claudio Morgera, Francesco Valenari</w:t>
-      </w:r>
-      <w:r>
-        <w:t>: responsabili dello sviluppo del software</w:t>
-      </w:r>
-      <w:r>
-        <w:t xml:space="preserve">, </w:t>
-      </w:r>
-      <w:r>
-        <w:t>della documentazione</w:t>
-      </w:r>
-      <w:r>
-        <w:t xml:space="preserve"> e del testing</w:t>
-      </w:r>
-      <w:r>
-        <w:t>.</w:t>
-      </w:r>
-    </w:p>
-    <w:p>
-      <w:pPr>
-        <w:spacing w:after="0"/>
-        <w:jc w:val="both"/>
-      </w:pPr>
-      <w:r>
-        <w:t xml:space="preserve">Dato </w:t>
-      </w:r>
-      <w:proofErr w:type="gramStart"/>
-      <w:r>
-        <w:t>il team ridotto</w:t>
-      </w:r>
-      <w:proofErr w:type="gramEnd"/>
-      <w:r>
-        <w:t xml:space="preserve"> il Product </w:t>
-      </w:r>
-      <w:proofErr w:type="spellStart"/>
-      <w:r>
-        <w:t>Owner</w:t>
-      </w:r>
-      <w:proofErr w:type="spellEnd"/>
-      <w:r>
-        <w:t xml:space="preserve"> e lo </w:t>
-      </w:r>
-      <w:proofErr w:type="spellStart"/>
-      <w:r>
-        <w:t>Scrum</w:t>
-      </w:r>
-      <w:proofErr w:type="spellEnd"/>
-      <w:r>
-        <w:t xml:space="preserve"> Master svolgono anche il ruolo di sviluppatori.</w:t>
-      </w:r>
-    </w:p>
-    <w:p>
-      <w:pPr>
-        <w:pStyle w:val="Stile2"/>
-      </w:pPr>
-      <w:bookmarkStart w:id="5" w:name="_Toc216349571"/>
-      <w:r>
-        <w:t>Ruoli</w:t>
-      </w:r>
-      <w:bookmarkEnd w:id="5"/>
-    </w:p>
-    <w:p>
-      <w:pPr>
-        <w:spacing w:after="0"/>
-        <w:jc w:val="both"/>
-      </w:pPr>
-      <w:r>
-        <w:t xml:space="preserve">Inoltre, seppur non sia coerente totalmente con il metodo SCRUM classico, all’interno </w:t>
-      </w:r>
-      <w:proofErr w:type="gramStart"/>
-      <w:r>
-        <w:t>del team</w:t>
-      </w:r>
-      <w:proofErr w:type="gramEnd"/>
-      <w:r>
-        <w:t xml:space="preserve"> di implementazione abbiamo suddiviso </w:t>
-      </w:r>
-      <w:r>
-        <w:t xml:space="preserve">approssimativamente </w:t>
-      </w:r>
-      <w:r>
-        <w:t>i ruoli in base alle competenze prevalenti.</w:t>
-      </w:r>
-    </w:p>
-    <w:p>
-      <w:pPr>
-        <w:spacing w:after="0"/>
-        <w:jc w:val="both"/>
-      </w:pPr>
-      <w:proofErr w:type="spellStart"/>
-      <w:r>
-        <w:rPr>
-          <w:b/>
-          <w:bCs/>
-        </w:rPr>
-        <w:t>Frontend</w:t>
-      </w:r>
-      <w:proofErr w:type="spellEnd"/>
-      <w:r>
-        <w:t>: sviluppo interfaccia, mappa interattiva, passaggio tra pagine, menù.</w:t>
-      </w:r>
-    </w:p>
-    <w:p>
-      <w:pPr>
-        <w:spacing w:after="0"/>
-        <w:jc w:val="both"/>
-      </w:pPr>
-      <w:proofErr w:type="spellStart"/>
-      <w:r>
-        <w:rPr>
-          <w:b/>
-          <w:bCs/>
-        </w:rPr>
-        <w:t>Backend</w:t>
-      </w:r>
-      <w:proofErr w:type="spellEnd"/>
-      <w:r>
-        <w:rPr>
-          <w:b/>
-          <w:bCs/>
-        </w:rPr>
-        <w:t xml:space="preserve"> </w:t>
-      </w:r>
-      <w:r>
-        <w:rPr>
-          <w:b/>
-          <w:bCs/>
-        </w:rPr>
-        <w:t>+</w:t>
-      </w:r>
-      <w:r>
-        <w:rPr>
-          <w:b/>
-          <w:bCs/>
-        </w:rPr>
-        <w:t xml:space="preserve"> </w:t>
-      </w:r>
-      <w:r>
-        <w:rPr>
-          <w:b/>
-          <w:bCs/>
-        </w:rPr>
-        <w:t>Database</w:t>
-      </w:r>
-      <w:r>
-        <w:t xml:space="preserve">: gestione </w:t>
-      </w:r>
-      <w:proofErr w:type="spellStart"/>
-      <w:r>
-        <w:t>F</w:t>
-      </w:r>
-      <w:r>
-        <w:t>irebase</w:t>
-      </w:r>
-      <w:proofErr w:type="spellEnd"/>
-      <w:r>
-        <w:t xml:space="preserve"> </w:t>
-      </w:r>
-      <w:proofErr w:type="spellStart"/>
-      <w:r>
-        <w:t>Realtime</w:t>
-      </w:r>
-      <w:proofErr w:type="spellEnd"/>
-      <w:r>
-        <w:t xml:space="preserve"> Database, controlli utente e prenotazioni, salvataggio dati, sicurezza</w:t>
-      </w:r>
-      <w:r>
-        <w:t>.</w:t>
-      </w:r>
-    </w:p>
-    <w:p>
-      <w:pPr>
-        <w:spacing w:after="0"/>
-        <w:jc w:val="both"/>
-      </w:pPr>
-      <w:r>
-        <w:rPr>
-          <w:b/>
-          <w:bCs/>
-        </w:rPr>
-        <w:t xml:space="preserve">Testing: </w:t>
-      </w:r>
-      <w:r>
-        <w:t>controllo corretta funzionalità di metodi e di classi, verifica eccezioni.</w:t>
-      </w:r>
-    </w:p>
-    <w:p>
-      <w:pPr>
-        <w:spacing w:after="0"/>
-        <w:jc w:val="both"/>
-      </w:pPr>
-      <w:r>
-        <w:rPr>
-          <w:b/>
-          <w:bCs/>
-        </w:rPr>
-        <w:t>Documentazione</w:t>
-      </w:r>
-      <w:r>
-        <w:t>: project plan, diagrammi UML, informazioni generali.</w:t>
-      </w:r>
-    </w:p>
-    <w:p>
-      <w:pPr>
-        <w:spacing w:after="0"/>
-        <w:jc w:val="both"/>
-      </w:pPr>
-      <w:r>
-        <w:t xml:space="preserve">Le specifiche e l’assegnazione di questi ruoli all’interno </w:t>
-      </w:r>
-      <w:proofErr w:type="gramStart"/>
-      <w:r>
-        <w:t>del team</w:t>
-      </w:r>
-      <w:proofErr w:type="gramEnd"/>
-      <w:r>
-        <w:t xml:space="preserve"> sono </w:t>
-      </w:r>
-      <w:r>
-        <w:t>illustrate in maniera più dettagliata</w:t>
-      </w:r>
-      <w:r>
-        <w:t xml:space="preserve"> all’interno del paragrafo </w:t>
-      </w:r>
-      <w:r>
-        <w:t>“</w:t>
-      </w:r>
-      <w:r>
-        <w:t>Personale</w:t>
-      </w:r>
-      <w:r>
-        <w:t xml:space="preserve">”. </w:t>
-      </w:r>
-      <w:r>
-        <w:t xml:space="preserve">Nonostante </w:t>
-      </w:r>
-      <w:r>
-        <w:t>la divisione dei ruoli</w:t>
-      </w:r>
-      <w:r>
-        <w:t>, nel caso di necessità un membro del gruppo può contribuire alla collaborazione con il membro affidato a quel ruolo.</w:t>
-      </w:r>
-    </w:p>
-    <w:p>
-      <w:pPr>
-        <w:spacing w:after="0"/>
-        <w:jc w:val="both"/>
-      </w:pPr>
-      <w:r>
-        <w:t>La conoscenza deve essere utilizzata in maniera trasversale</w:t>
-      </w:r>
-      <w:r>
-        <w:t xml:space="preserve"> e il gruppo deve adottare un approccio collaborativo.</w:t>
-      </w:r>
-    </w:p>
-    <w:p>
-      <w:pPr>
-        <w:spacing w:after="0"/>
-        <w:jc w:val="both"/>
-      </w:pPr>
-      <w:r>
-        <w:t>La documentazione chiara e dettagliata è considerata responsabilità condivisa tra tutti i membri del gruppo, essa deve essere il compito di tutti.</w:t>
-      </w:r>
-    </w:p>
-    <w:p>
-      <w:pPr>
-        <w:spacing w:after="0"/>
-        <w:jc w:val="both"/>
-      </w:pPr>
-      <w:r>
-        <w:t>Questa tipologia di organizzazione permette ai membri del gruppo di avere una definita suddivisone dei ruoli, in cui ognuno è a conoscenza delle sue responsabilità al fine di avere una corretta evoluzione del progetto.</w:t>
-      </w:r>
-    </w:p>
-    <w:p>
-      <w:pPr>
-        <w:pStyle w:val="Stile2"/>
-      </w:pPr>
-      <w:bookmarkStart w:id="6" w:name="_Toc216349572"/>
-      <w:r>
-        <w:t>Attività</w:t>
-      </w:r>
-      <w:bookmarkEnd w:id="6"/>
-    </w:p>
-    <w:p>
-      <w:pPr>
-        <w:spacing w:after="0"/>
-        <w:jc w:val="both"/>
-      </w:pPr>
-      <w:r>
-        <w:t>La comunicazione quotidiana interna avviene tramite un gruppo Whatsapp dedicato, utilizzato per scambio di informazioni, aggiornamenti, domande inerenti al progetto o a problemi riscontrati.</w:t>
-      </w:r>
-    </w:p>
-    <w:p>
-      <w:pPr>
-        <w:spacing w:after="0"/>
-        <w:jc w:val="both"/>
-      </w:pPr>
-      <w:r>
-        <w:t>Sono previsti inoltre b</w:t>
-      </w:r>
-      <w:r>
-        <w:t xml:space="preserve">revi </w:t>
-      </w:r>
-      <w:proofErr w:type="gramStart"/>
-      <w:r>
-        <w:t>meeting principalmente non online</w:t>
-      </w:r>
-      <w:proofErr w:type="gramEnd"/>
-      <w:r>
-        <w:t xml:space="preserve"> per risolvere problemi </w:t>
-      </w:r>
-      <w:r>
-        <w:t xml:space="preserve">e </w:t>
-      </w:r>
-      <w:r>
-        <w:t xml:space="preserve">per </w:t>
-      </w:r>
-      <w:r>
-        <w:t xml:space="preserve">eventuali </w:t>
-      </w:r>
-      <w:r>
-        <w:t>chiarimenti</w:t>
-      </w:r>
-      <w:r>
-        <w:t>.</w:t>
-      </w:r>
-    </w:p>
-    <w:p>
-      <w:pPr>
-        <w:spacing w:after="0"/>
-        <w:jc w:val="both"/>
-      </w:pPr>
-      <w:r>
-        <w:t xml:space="preserve">Decisioni, urgenze e task vengono gestiti dal gruppo stesso durante </w:t>
-      </w:r>
-      <w:proofErr w:type="gramStart"/>
-      <w:r>
-        <w:t>i meeting settimanali</w:t>
-      </w:r>
-      <w:proofErr w:type="gramEnd"/>
-      <w:r>
-        <w:t xml:space="preserve"> di durata superiore rispetto a quello quotidiani</w:t>
-      </w:r>
-      <w:r>
-        <w:t>, in cui si decide anche se è necessario un cambio di ruoli.</w:t>
-      </w:r>
-    </w:p>
-    <w:p>
-      <w:pPr>
-        <w:spacing w:after="0"/>
-        <w:jc w:val="both"/>
-      </w:pPr>
-      <w:r>
-        <w:t>La gestione delle attività che ogni membro svolge sul codice viene gestita tramite l’u</w:t>
-      </w:r>
-      <w:r>
-        <w:t xml:space="preserve">tilizzo di GitHub privato condiviso </w:t>
-      </w:r>
-      <w:r>
-        <w:t>con il gruppo.</w:t>
-      </w:r>
-      <w:r>
-        <w:t xml:space="preserve"> </w:t>
-      </w:r>
-      <w:r>
-        <w:t xml:space="preserve">Esso è inoltre utilizzato per la tracciabilità e per la gestione delle </w:t>
-      </w:r>
-      <w:proofErr w:type="spellStart"/>
-      <w:r>
-        <w:t>issue</w:t>
-      </w:r>
-      <w:r>
-        <w:t>s</w:t>
-      </w:r>
-      <w:proofErr w:type="spellEnd"/>
-      <w:r>
-        <w:t>.</w:t>
-      </w:r>
-    </w:p>
-    <w:p>
-      <w:pPr>
-        <w:spacing w:after="0"/>
-        <w:jc w:val="both"/>
-      </w:pPr>
-      <w:r>
-        <w:t xml:space="preserve">La documentazione viene inizialmente caricata e modificata in un file condiviso in Google Drive per poi essere integrata ufficialmente </w:t>
-      </w:r>
-      <w:proofErr w:type="gramStart"/>
-      <w:r>
-        <w:t>nella repository</w:t>
-      </w:r>
-      <w:proofErr w:type="gramEnd"/>
-      <w:r>
-        <w:t>.</w:t>
-      </w:r>
-    </w:p>
-    <w:p>
-      <w:pPr>
-        <w:spacing w:after="0"/>
-        <w:jc w:val="both"/>
-      </w:pPr>
-      <w:r>
-        <w:t xml:space="preserve">È necessario lavoro costante da parte di </w:t>
-      </w:r>
-      <w:proofErr w:type="gramStart"/>
-      <w:r>
-        <w:t>tutto il team</w:t>
-      </w:r>
-      <w:proofErr w:type="gramEnd"/>
-      <w:r>
-        <w:t>.</w:t>
+        <w:t>La documentazione viene inizialmente caricata e modificata in un file condiviso in Google Drive per poi essere integrata ufficialmente nella repository.</w:t>
+      </w:r>
+    </w:p>
+    <w:p>
+      <w:pPr>
+        <w:spacing w:after="0"/>
+        <w:jc w:val="both"/>
+      </w:pPr>
+      <w:r>
+        <w:t>È necessario lavoro costante da parte di tutto il team.</w:t>
       </w:r>
     </w:p>
     <w:p>
@@ -5756,205 +5667,184 @@
         <w:jc w:val="both"/>
       </w:pPr>
       <w:r>
-        <w:t>Ci si aspetta che ognuno rispetti le linee guida in maniera autonoma, nessun membro del gruppo verifica che gli altri membri rispettino le linee guida.</w:t>
+        <w:t>Ci si aspetta che ognuno rispetti le linee guida in maniera autonoma, nessun membro del gruppo verifica che gli altri membri rispettino le linee guida</w:t>
+      </w:r>
+      <w:r>
+        <w:t xml:space="preserve"> per modifiche minori. Nonostante ciò il gruppo adotta un approccio di revisione collettiv</w:t>
+      </w:r>
+      <w:r>
+        <w:t>a</w:t>
+      </w:r>
+      <w:r>
+        <w:t xml:space="preserve"> in caso di funzionalità maggiori implementate. </w:t>
+      </w:r>
+      <w:r>
+        <w:t>Ogni membro del gruppo è responsabile della qualità e della coerenza del codice che scrive.</w:t>
+      </w:r>
+    </w:p>
+    <w:p>
+      <w:pPr>
+        <w:spacing w:after="0"/>
+        <w:jc w:val="both"/>
+      </w:pPr>
+      <w:r>
+        <w:t>Il gruppo utilizza inoltre la tabella presente nel documento di specifica di requisiti per visualizzare lo stato di avanzamento del progetto, segnando la data di raggiungimento di determinati requisiti.</w:t>
+      </w:r>
+    </w:p>
+    <w:p>
+      <w:pPr>
+        <w:pStyle w:val="Stile2"/>
+      </w:pPr>
+      <w:bookmarkStart w:id="9" w:name="_Toc216349575"/>
+      <w:r>
+        <w:t>Standard utilizzati</w:t>
+      </w:r>
+      <w:bookmarkEnd w:id="9"/>
+    </w:p>
+    <w:p>
+      <w:pPr>
+        <w:spacing w:after="0"/>
+        <w:jc w:val="both"/>
+      </w:pPr>
+      <w:r>
+        <w:t xml:space="preserve">Gli standard di programmazione sono quelli classici di </w:t>
+      </w:r>
+      <w:r>
+        <w:rPr>
+          <w:b/>
+          <w:bCs/>
+        </w:rPr>
+        <w:t>J</w:t>
+      </w:r>
+      <w:r>
+        <w:rPr>
+          <w:b/>
+          <w:bCs/>
+        </w:rPr>
+        <w:t>ava</w:t>
+      </w:r>
+      <w:r>
+        <w:t xml:space="preserve"> definit</w:t>
+      </w:r>
+      <w:r>
+        <w:t>i</w:t>
+      </w:r>
+      <w:r>
+        <w:t xml:space="preserve"> da Oracle.</w:t>
+      </w:r>
+      <w:r>
+        <w:t xml:space="preserve"> Vengono rispettate convenzioni su classi, attributi e metodi. </w:t>
+      </w:r>
+    </w:p>
+    <w:p>
+      <w:pPr>
+        <w:spacing w:after="0"/>
+        <w:jc w:val="both"/>
+      </w:pPr>
+      <w:r>
+        <w:t xml:space="preserve">Ogni classe deve </w:t>
+      </w:r>
+      <w:r>
+        <w:t xml:space="preserve">essere introdotta da una descrizione generale del suo funzionamento, degli </w:t>
+      </w:r>
+      <w:r>
+        <w:t>autori e</w:t>
+      </w:r>
+      <w:r>
+        <w:t xml:space="preserve"> della versione che abbiamo modificato.</w:t>
+      </w:r>
+    </w:p>
+    <w:p>
+      <w:pPr>
+        <w:spacing w:after="0"/>
+        <w:jc w:val="both"/>
+      </w:pPr>
+      <w:r>
+        <w:t>Per ogni metodo invece è necessaria una descrizione generica e una spiegazione dettagliata dei parametri utilizzati e del tipo di ritorno della funzione.</w:t>
+      </w:r>
+    </w:p>
+    <w:p>
+      <w:pPr>
+        <w:spacing w:after="0"/>
+        <w:jc w:val="both"/>
+      </w:pPr>
+      <w:r>
+        <w:t xml:space="preserve">Queste funzioni avvengono tramite </w:t>
+      </w:r>
+      <w:proofErr w:type="spellStart"/>
+      <w:r>
+        <w:t>Javadoc</w:t>
+      </w:r>
+      <w:proofErr w:type="spellEnd"/>
+      <w:r>
+        <w:t xml:space="preserve"> (/**)</w:t>
+      </w:r>
+      <w:r>
+        <w:t xml:space="preserve">. </w:t>
+      </w:r>
+      <w:r>
+        <w:t>Commenti secondari utili per la comprensione devono essere inseriti all’interno del metodo stesso, nel modo // o /*.</w:t>
+      </w:r>
+    </w:p>
+    <w:p>
+      <w:pPr>
+        <w:pStyle w:val="Stile2"/>
+      </w:pPr>
+      <w:bookmarkStart w:id="10" w:name="_Toc216349576"/>
+      <w:r>
+        <w:t>Gestione del database</w:t>
+      </w:r>
+      <w:bookmarkEnd w:id="10"/>
+    </w:p>
+    <w:p>
+      <w:pPr>
+        <w:spacing w:after="0"/>
+        <w:jc w:val="both"/>
+      </w:pPr>
+      <w:r>
+        <w:t>Per la gestione dei dati</w:t>
       </w:r>
       <w:r>
         <w:t xml:space="preserve"> </w:t>
       </w:r>
       <w:r>
-        <w:t>Ogni membro del gruppo è responsabile della qualità e della coerenza del codice che scrive.</w:t>
-      </w:r>
-    </w:p>
-    <w:p>
-      <w:pPr>
-        <w:spacing w:after="0"/>
-        <w:jc w:val="both"/>
-      </w:pPr>
-      <w:r>
-        <w:t>Il gruppo utilizza inoltre la tabella presente nel documento di specifica di requisiti per visualizzare lo stato di avanzamento del progetto, segnando la data di raggiungimento di determinati requisiti.</w:t>
-      </w:r>
-    </w:p>
-    <w:p>
-      <w:pPr>
-        <w:pStyle w:val="Stile2"/>
-      </w:pPr>
-      <w:bookmarkStart w:id="9" w:name="_Toc216349575"/>
-      <w:r>
-        <w:t>Standard utilizzati</w:t>
-      </w:r>
-      <w:bookmarkEnd w:id="9"/>
-    </w:p>
-    <w:p>
-      <w:pPr>
-        <w:spacing w:after="0"/>
-        <w:jc w:val="both"/>
-      </w:pPr>
-      <w:r>
-        <w:t xml:space="preserve">Gli standard di programmazione sono quelli classici di </w:t>
-      </w:r>
-      <w:r>
-        <w:rPr>
-          <w:b/>
-          <w:bCs/>
-        </w:rPr>
-        <w:t>J</w:t>
-      </w:r>
-      <w:r>
-        <w:rPr>
-          <w:b/>
-          <w:bCs/>
-        </w:rPr>
-        <w:t>ava</w:t>
-      </w:r>
-      <w:r>
-        <w:t xml:space="preserve"> definite da Oracle.</w:t>
-      </w:r>
-      <w:r>
-        <w:t xml:space="preserve"> Vengono rispettate convenzioni su classi, attributi e metodi. </w:t>
-      </w:r>
-    </w:p>
-    <w:p>
-      <w:pPr>
-        <w:spacing w:after="0"/>
-        <w:jc w:val="both"/>
-      </w:pPr>
-      <w:r>
-        <w:t xml:space="preserve">Ogni classe deve </w:t>
-      </w:r>
-      <w:r>
-        <w:t xml:space="preserve">essere introdotta da una descrizione generale del suo funzionamento, degli </w:t>
-      </w:r>
-      <w:r>
-        <w:t>autori e</w:t>
-      </w:r>
-      <w:r>
-        <w:t xml:space="preserve"> della versione che abbiamo modificato.</w:t>
-      </w:r>
-    </w:p>
-    <w:p>
-      <w:pPr>
-        <w:spacing w:after="0"/>
-        <w:jc w:val="both"/>
-      </w:pPr>
-      <w:r>
-        <w:t>Per ogni metodo invece è necessaria una descrizione generica e una spiegazione dettagliata dei parametri utilizzati e del tipo di ritorno della funzione.</w:t>
-      </w:r>
-    </w:p>
-    <w:p>
-      <w:pPr>
-        <w:spacing w:after="0"/>
-        <w:jc w:val="both"/>
-      </w:pPr>
-      <w:r>
-        <w:t xml:space="preserve">Queste funzioni avvengono tramite </w:t>
+        <w:t xml:space="preserve">si utilizza </w:t>
+      </w:r>
+      <w:r>
+        <w:rPr>
+          <w:b/>
+          <w:bCs/>
+        </w:rPr>
+        <w:t>Firebase Realtime Database</w:t>
+      </w:r>
+      <w:r>
+        <w:t xml:space="preserve">, basato su linguaggio </w:t>
       </w:r>
       <w:proofErr w:type="spellStart"/>
       <w:r>
-        <w:t>Javadoc</w:t>
+        <w:t>N</w:t>
+      </w:r>
+      <w:r>
+        <w:t>o</w:t>
+      </w:r>
+      <w:r>
+        <w:t>SQL</w:t>
       </w:r>
       <w:proofErr w:type="spellEnd"/>
       <w:r>
-        <w:t xml:space="preserve"> (/**)</w:t>
-      </w:r>
-      <w:r>
-        <w:t xml:space="preserve">. </w:t>
-      </w:r>
-      <w:r>
-        <w:t>Commenti secondari utili per la comprensione devono essere inseriti all’interno del metodo stesso, nel modo // o /*.</w:t>
-      </w:r>
-    </w:p>
-    <w:p>
-      <w:pPr>
-        <w:pStyle w:val="Stile2"/>
-      </w:pPr>
-      <w:bookmarkStart w:id="10" w:name="_Toc216349576"/>
-      <w:r>
-        <w:t>Gestione del database</w:t>
-      </w:r>
-      <w:bookmarkEnd w:id="10"/>
-    </w:p>
-    <w:p>
-      <w:pPr>
-        <w:spacing w:after="0"/>
-        <w:jc w:val="both"/>
-      </w:pPr>
-      <w:r>
-        <w:t>Per la gestione dei dati</w:t>
+        <w:t>.</w:t>
       </w:r>
       <w:r>
         <w:t xml:space="preserve"> </w:t>
       </w:r>
       <w:r>
-        <w:t xml:space="preserve">si utilizza </w:t>
-      </w:r>
-      <w:proofErr w:type="spellStart"/>
-      <w:r>
-        <w:rPr>
-          <w:b/>
-          <w:bCs/>
-        </w:rPr>
-        <w:t>Firebase</w:t>
-      </w:r>
-      <w:proofErr w:type="spellEnd"/>
-      <w:r>
-        <w:rPr>
-          <w:b/>
-          <w:bCs/>
-        </w:rPr>
+        <w:t>Questo permette l’accesso simultaneo di più utenti e l’aggiornamento in tempo reale.</w:t>
+      </w:r>
+      <w:r>
         <w:t xml:space="preserve"> </w:t>
       </w:r>
-      <w:proofErr w:type="spellStart"/>
-      <w:r>
-        <w:rPr>
-          <w:b/>
-          <w:bCs/>
-        </w:rPr>
-        <w:t>Realtime</w:t>
-      </w:r>
-      <w:proofErr w:type="spellEnd"/>
-      <w:r>
-        <w:rPr>
-          <w:b/>
-          <w:bCs/>
-        </w:rPr>
-        <w:t xml:space="preserve"> Database</w:t>
-      </w:r>
-      <w:r>
-        <w:t xml:space="preserve">, basato su linguaggio </w:t>
-      </w:r>
-      <w:proofErr w:type="spellStart"/>
-      <w:r>
-        <w:t>N</w:t>
-      </w:r>
-      <w:r>
-        <w:t>o</w:t>
-      </w:r>
-      <w:r>
-        <w:t>SQL</w:t>
-      </w:r>
-      <w:proofErr w:type="spellEnd"/>
-      <w:r>
-        <w:t>.</w:t>
-      </w:r>
-      <w:r>
-        <w:t xml:space="preserve"> </w:t>
-      </w:r>
-      <w:r>
-        <w:t>Questo permette l’accesso simultaneo di più utenti e l’aggiornamento in tempo reale.</w:t>
-      </w:r>
-      <w:r>
-        <w:t xml:space="preserve"> </w:t>
-      </w:r>
-      <w:r>
-        <w:t xml:space="preserve">Si utilizzano regole standard (preimpostate da </w:t>
-      </w:r>
-      <w:proofErr w:type="spellStart"/>
-      <w:r>
-        <w:t>Firebase</w:t>
-      </w:r>
-      <w:proofErr w:type="spellEnd"/>
-      <w:r>
-        <w:t>)</w:t>
+      <w:r>
+        <w:t>Si utilizzano regole standard (preimpostate da Firebase)</w:t>
       </w:r>
       <w:r>
         <w:t xml:space="preserve">, database privato, in modo che solo i membri interni al gruppo possano visualizzare e modificare. </w:t>
@@ -5962,16 +5852,11 @@
       <w:r>
         <w:t xml:space="preserve">Il ruolo assegnato al service account di </w:t>
       </w:r>
-      <w:proofErr w:type="spellStart"/>
       <w:r>
         <w:t>F</w:t>
       </w:r>
       <w:r>
-        <w:t>irebase</w:t>
-      </w:r>
-      <w:proofErr w:type="spellEnd"/>
-      <w:r>
-        <w:t xml:space="preserve"> è quello minimo, utile solo per leggere e scrivere sul database.</w:t>
+        <w:t>irebase è quello minimo, utile solo per leggere e scrivere sul database.</w:t>
       </w:r>
     </w:p>
     <w:p>
@@ -6214,15 +6099,7 @@
         <w:t xml:space="preserve"> </w:t>
       </w:r>
       <w:r>
-        <w:t xml:space="preserve">È infatti facilmente scalabile: si possono aggiungere nuovi nodi e funzionalità mantenendo il design implementato </w:t>
-      </w:r>
-      <w:proofErr w:type="gramStart"/>
-      <w:r>
-        <w:t>dal team</w:t>
-      </w:r>
-      <w:proofErr w:type="gramEnd"/>
-      <w:r>
-        <w:t>.</w:t>
+        <w:t>È infatti facilmente scalabile: si possono aggiungere nuovi nodi e funzionalità mantenendo il design implementato dal team.</w:t>
       </w:r>
     </w:p>
     <w:p>
@@ -6382,24 +6259,33 @@
         <w:t xml:space="preserve">planning </w:t>
       </w:r>
       <w:r>
-        <w:t>e di sprint review.</w:t>
-      </w:r>
-    </w:p>
-    <w:p>
-      <w:pPr>
-        <w:spacing w:after="0"/>
-        <w:jc w:val="both"/>
-      </w:pPr>
-      <w:r>
-        <w:t xml:space="preserve">Durante l‘incontro ogni membro aggiorna il gruppo sulle modifiche apportate al codice, eventuali problemi che ha rilevato, accorgimenti e </w:t>
-      </w:r>
-      <w:proofErr w:type="gramStart"/>
-      <w:r>
-        <w:t>un ipotetica</w:t>
-      </w:r>
-      <w:proofErr w:type="gramEnd"/>
-      <w:r>
-        <w:t xml:space="preserve"> suddivisione dei compiti che devono essere assegnati agli altri membri nel caso siano necessari per lo sviluppo del progetto.</w:t>
+        <w:t>e di sprint review</w:t>
+      </w:r>
+      <w:r>
+        <w:t xml:space="preserve">, oltre al </w:t>
+      </w:r>
+      <w:proofErr w:type="spellStart"/>
+      <w:r>
+        <w:t>daily</w:t>
+      </w:r>
+      <w:proofErr w:type="spellEnd"/>
+      <w:r>
+        <w:t xml:space="preserve"> SCRUM.</w:t>
+      </w:r>
+    </w:p>
+    <w:p>
+      <w:pPr>
+        <w:spacing w:after="0"/>
+        <w:jc w:val="both"/>
+      </w:pPr>
+      <w:r>
+        <w:t>Durante l‘incontro ogni membro aggiorna il gruppo sulle modifiche apportate al codice, eventuali problemi che ha rilevato, accorgimenti e un</w:t>
+      </w:r>
+      <w:r>
+        <w:t>’</w:t>
+      </w:r>
+      <w:r>
+        <w:t>ipotetica suddivisione dei compiti che devono essere assegnati agli altri membri nel caso siano necessari per lo sviluppo del progetto.</w:t>
       </w:r>
     </w:p>
     <w:p>
@@ -6425,7 +6311,10 @@
         <w:jc w:val="both"/>
       </w:pPr>
       <w:r>
-        <w:t xml:space="preserve">In caso di domande o dubbi dopo i vari incontri possono essere chiariti anche tramite gruppo Whatsapp creato per una messaggistica rapida, a cui può seguire una chiamata o una discussione per la ricerca di una possibile risoluzione della problematica. </w:t>
+        <w:t>Eventuali dubbi e domande sorti</w:t>
+      </w:r>
+      <w:r>
+        <w:t xml:space="preserve"> dopo i vari incontri possono essere chiariti anche tramite gruppo Whatsapp creato per una messaggistica rapida, a cui può seguire una chiamata o una discussione per la ricerca di una possibile risoluzione della problematica. </w:t>
       </w:r>
     </w:p>
     <w:p>
@@ -6443,26 +6332,10 @@
         <w:t>SCRUM</w:t>
       </w:r>
       <w:r>
-        <w:t xml:space="preserve"> Master </w:t>
-      </w:r>
-      <w:proofErr w:type="gramStart"/>
-      <w:r>
-        <w:t>del team</w:t>
-      </w:r>
-      <w:proofErr w:type="gramEnd"/>
-      <w:r>
-        <w:t xml:space="preserve"> </w:t>
-      </w:r>
-      <w:r>
-        <w:t xml:space="preserve">ed è poi implementata </w:t>
-      </w:r>
-      <w:proofErr w:type="gramStart"/>
-      <w:r>
-        <w:t>dal team</w:t>
-      </w:r>
-      <w:proofErr w:type="gramEnd"/>
-      <w:r>
-        <w:t xml:space="preserve"> di sviluppatori in base al ruolo assegnato.</w:t>
+        <w:t xml:space="preserve"> Master del team </w:t>
+      </w:r>
+      <w:r>
+        <w:t>ed è poi implementata dal team di sviluppatori in base al ruolo assegnato.</w:t>
       </w:r>
     </w:p>
     <w:p>
@@ -6621,7 +6494,13 @@
         <w:jc w:val="both"/>
       </w:pPr>
       <w:r>
-        <w:t xml:space="preserve">I principali problemi potrebbero riguardare ritardi nella stesura nei diversi diagrammi e nella consegna tendenzialmente giornaliera degli aggiornamenti e delle modifiche. </w:t>
+        <w:t xml:space="preserve">I principali problemi potrebbero riguardare ritardi nella stesura </w:t>
+      </w:r>
+      <w:r>
+        <w:t>d</w:t>
+      </w:r>
+      <w:r>
+        <w:t xml:space="preserve">ei diversi diagrammi e nella consegna tendenzialmente giornaliera degli aggiornamenti e delle modifiche. </w:t>
       </w:r>
     </w:p>
     <w:p>
@@ -6680,146 +6559,154 @@
       <w:r>
         <w:t xml:space="preserve">Altri problemi potrebbero ad esempio riguardare il database. Utilizzando </w:t>
       </w:r>
+      <w:r>
+        <w:t>F</w:t>
+      </w:r>
+      <w:r>
+        <w:t>irebase database (nessun membro del gruppo lo aveva mai utilizzato in precedenza) potrebbero sorgere problematiche di gestione dei dati, creazione database</w:t>
+      </w:r>
+      <w:r>
+        <w:t xml:space="preserve"> e interrogazioni.</w:t>
+      </w:r>
+      <w:r>
+        <w:t xml:space="preserve"> </w:t>
+      </w:r>
+      <w:r>
+        <w:t xml:space="preserve">Utilizzando inoltre </w:t>
+      </w:r>
       <w:proofErr w:type="spellStart"/>
       <w:r>
-        <w:t>F</w:t>
-      </w:r>
-      <w:r>
-        <w:t>irebase</w:t>
+        <w:t>NoSQL</w:t>
       </w:r>
       <w:proofErr w:type="spellEnd"/>
       <w:r>
-        <w:t xml:space="preserve"> database (nessun membro del gruppo lo aveva mai utilizzato in precedenza) potrebbero sorgere problematiche di gestione dei dati, creazione database</w:t>
-      </w:r>
-      <w:r>
-        <w:t xml:space="preserve"> e interrogazioni.</w:t>
+        <w:t xml:space="preserve"> i problemi potrebbero essere maggiori e più complicati da risolvere nel tempo.</w:t>
+      </w:r>
+    </w:p>
+    <w:p>
+      <w:pPr>
+        <w:spacing w:after="0"/>
+        <w:jc w:val="both"/>
+      </w:pPr>
+      <w:r>
+        <w:t>È ancora più necessario in questa parte il contributo di tutto il gruppo.</w:t>
+      </w:r>
+    </w:p>
+    <w:p>
+      <w:pPr>
+        <w:spacing w:after="0"/>
+        <w:jc w:val="both"/>
+      </w:pPr>
+      <w:r>
+        <w:t xml:space="preserve">Nello stesso modo vale per </w:t>
+      </w:r>
+      <w:proofErr w:type="spellStart"/>
+      <w:r>
+        <w:t>Vaadin</w:t>
+      </w:r>
+      <w:proofErr w:type="spellEnd"/>
+      <w:r>
+        <w:t>. È necessaria una fase in</w:t>
+      </w:r>
+      <w:r>
+        <w:t>i</w:t>
+      </w:r>
+      <w:r>
+        <w:t>ziale di comprensione su come utilizzarlo, cosa permette di fare e se è effettivamente utile e necessario al nostro progetto.</w:t>
+      </w:r>
+    </w:p>
+    <w:p>
+      <w:pPr>
+        <w:spacing w:after="0"/>
+        <w:jc w:val="both"/>
+      </w:pPr>
+      <w:r>
+        <w:t xml:space="preserve">Un ulteriore problema si potrebbe riscontrare nell’utilizzo di </w:t>
+      </w:r>
+      <w:proofErr w:type="spellStart"/>
+      <w:r>
+        <w:t>Papyrus</w:t>
+      </w:r>
+      <w:proofErr w:type="spellEnd"/>
+      <w:r>
+        <w:t xml:space="preserve"> perché è complesso il lavoro simultaneo anche su diagrammi differenti.</w:t>
+      </w:r>
+    </w:p>
+    <w:p>
+      <w:pPr>
+        <w:pStyle w:val="Stile2"/>
+      </w:pPr>
+      <w:bookmarkStart w:id="16" w:name="_Toc216349582"/>
+      <w:r>
+        <w:t>Rischi di sicurezza</w:t>
+      </w:r>
+      <w:bookmarkEnd w:id="16"/>
+    </w:p>
+    <w:p>
+      <w:pPr>
+        <w:spacing w:after="0"/>
+        <w:jc w:val="both"/>
+      </w:pPr>
+      <w:r>
+        <w:t>Importante è anche capire come gestire la chiave privata del service account e tutti i rischi di sicurezza ad essa legata.</w:t>
       </w:r>
       <w:r>
         <w:t xml:space="preserve"> </w:t>
       </w:r>
       <w:r>
-        <w:t xml:space="preserve">Utilizzando inoltre </w:t>
-      </w:r>
-      <w:proofErr w:type="spellStart"/>
-      <w:r>
-        <w:t>NoSQL</w:t>
-      </w:r>
-      <w:proofErr w:type="spellEnd"/>
-      <w:r>
-        <w:t xml:space="preserve"> i problemi potrebbero essere maggiori e più complicati da risolvere nel tempo.</w:t>
-      </w:r>
-    </w:p>
-    <w:p>
-      <w:pPr>
-        <w:spacing w:after="0"/>
-        <w:jc w:val="both"/>
-      </w:pPr>
-      <w:r>
-        <w:t>È ancora più necessario in questa parte il contributo di tutto il gruppo.</w:t>
-      </w:r>
-    </w:p>
-    <w:p>
-      <w:pPr>
-        <w:spacing w:after="0"/>
-        <w:jc w:val="both"/>
-      </w:pPr>
-      <w:r>
-        <w:t xml:space="preserve">Nello stesso modo vale per </w:t>
-      </w:r>
-      <w:proofErr w:type="spellStart"/>
-      <w:r>
-        <w:t>Vaadin</w:t>
-      </w:r>
-      <w:proofErr w:type="spellEnd"/>
-      <w:r>
-        <w:t>. È necessaria una fase inziale di comprensione su come utilizzarlo, cosa permette di fare e se è effettivamente utile e necessario al nostro progetto.</w:t>
-      </w:r>
-    </w:p>
-    <w:p>
-      <w:pPr>
-        <w:spacing w:after="0"/>
-        <w:jc w:val="both"/>
-      </w:pPr>
-      <w:r>
-        <w:t xml:space="preserve">Un ulteriore problema si potrebbe riscontrare nell’utilizzo di </w:t>
-      </w:r>
-      <w:proofErr w:type="spellStart"/>
-      <w:r>
-        <w:t>Papyrus</w:t>
-      </w:r>
-      <w:proofErr w:type="spellEnd"/>
-      <w:r>
-        <w:t xml:space="preserve"> perché è complesso il lavoro simultaneo anche su diagrammi differenti.</w:t>
+        <w:t>Infatti è altamente sconsigliato inserire la chiave direttamente sulla repository online GitHub (se privata è possibile, ma non una buona norma).</w:t>
       </w:r>
     </w:p>
     <w:p>
       <w:pPr>
         <w:pStyle w:val="Stile2"/>
       </w:pPr>
-      <w:bookmarkStart w:id="16" w:name="_Toc216349582"/>
-      <w:r>
-        <w:t>Rischi di sicurezza</w:t>
-      </w:r>
-      <w:bookmarkEnd w:id="16"/>
-    </w:p>
-    <w:p>
-      <w:pPr>
-        <w:spacing w:after="0"/>
-        <w:jc w:val="both"/>
-      </w:pPr>
-      <w:r>
-        <w:t>Importante è anche capire come gestire la chiave privata del service account e tutti i rischi di sicurezza ad essa legata.</w:t>
+      <w:bookmarkStart w:id="17" w:name="_Toc216349583"/>
+      <w:r>
+        <w:t>Rischi legati alle funzionalità dell’app</w:t>
+      </w:r>
+      <w:bookmarkEnd w:id="17"/>
+    </w:p>
+    <w:p>
+      <w:pPr>
+        <w:spacing w:after="0"/>
+        <w:jc w:val="both"/>
+      </w:pPr>
+      <w:r>
+        <w:t>In generale, per avere maggiore realismo e serietà dell’app ci sono innumerevoli rischi e problemi a cui andremo incontro, vista l’assente conoscenza nell’ambito di tutti i membri del gruppo.</w:t>
       </w:r>
       <w:r>
         <w:t xml:space="preserve"> </w:t>
       </w:r>
-      <w:proofErr w:type="gramStart"/>
-      <w:r>
-        <w:t>Infatti</w:t>
-      </w:r>
-      <w:proofErr w:type="gramEnd"/>
-      <w:r>
-        <w:t xml:space="preserve"> è altamente sconsigliato inserire la chiave direttamente sulla repository online GitHub (se privata è possibile, ma non una buona norma).</w:t>
-      </w:r>
-    </w:p>
-    <w:p>
-      <w:pPr>
-        <w:pStyle w:val="Stile2"/>
-      </w:pPr>
-      <w:bookmarkStart w:id="17" w:name="_Toc216349583"/>
-      <w:r>
-        <w:t>Rischi legati alle funzionalità dell’app</w:t>
-      </w:r>
-      <w:bookmarkEnd w:id="17"/>
-    </w:p>
-    <w:p>
-      <w:pPr>
-        <w:spacing w:after="0"/>
-        <w:jc w:val="both"/>
-      </w:pPr>
-      <w:r>
-        <w:t>In generale, per avere maggiore realismo e serietà dell’app ci sono innumerevoli rischi e problemi a cui andremo incontro, vista l’assente conoscenza nell’ambito di tutti i membri del gruppo.</w:t>
+      <w:r>
+        <w:t>Sono sempre possibili complessi bug che fanno parte di ogni progetto ed è necessario risolverli prima della consegna dell’elaborato.</w:t>
+      </w:r>
+    </w:p>
+    <w:p>
+      <w:pPr>
+        <w:spacing w:after="0"/>
+        <w:jc w:val="both"/>
+      </w:pPr>
+      <w:r>
+        <w:t>Riferendosi invece alla funzionalità dell’app i problemi riguardano principalmente la concorrenza e il fatto che più utenti possono accedere al database in maniera simultanea.</w:t>
       </w:r>
       <w:r>
         <w:t xml:space="preserve"> </w:t>
       </w:r>
       <w:r>
-        <w:t>Sono sempre possibili complessi bug che fanno parte di ogni progetto ed è necessario risolverli prima della consegna dell’elaborato.</w:t>
-      </w:r>
-    </w:p>
-    <w:p>
-      <w:pPr>
-        <w:spacing w:after="0"/>
-        <w:jc w:val="both"/>
-      </w:pPr>
-      <w:r>
-        <w:t>Riferendosi invece alla funzionalità dell’app i problemi riguardano principalmente la concorrenza e il fatto che più utenti possono accedere al database in maniera simultanea.</w:t>
-      </w:r>
-      <w:r>
-        <w:t xml:space="preserve"> </w:t>
-      </w:r>
-      <w:r>
-        <w:t>Occorre implementare meccanismi di controllo che garantiscano che due utenti non possano prenotare due colonnine nella stessa fascia oraria.</w:t>
+        <w:t xml:space="preserve">Occorre implementare meccanismi di controllo che garantiscano che due utenti non possano prenotare </w:t>
+      </w:r>
+      <w:r>
+        <w:t xml:space="preserve">la stessa </w:t>
+      </w:r>
+      <w:r>
+        <w:t>colonnin</w:t>
+      </w:r>
+      <w:r>
+        <w:t>a</w:t>
+      </w:r>
+      <w:r>
+        <w:t xml:space="preserve"> nella stessa fascia oraria.</w:t>
       </w:r>
     </w:p>
     <w:p>
@@ -7143,13 +7030,8 @@
             <w:r>
               <w:t xml:space="preserve"> </w:t>
             </w:r>
-            <w:proofErr w:type="spellStart"/>
-            <w:r>
-              <w:t>Firebase</w:t>
-            </w:r>
-            <w:proofErr w:type="spellEnd"/>
-            <w:r>
-              <w:t xml:space="preserve"> e </w:t>
+            <w:r>
+              <w:t xml:space="preserve">Firebase e </w:t>
             </w:r>
             <w:proofErr w:type="spellStart"/>
             <w:r>
@@ -7386,15 +7268,7 @@
               <w:jc w:val="both"/>
             </w:pPr>
             <w:r>
-              <w:t xml:space="preserve">Mettere </w:t>
-            </w:r>
-            <w:proofErr w:type="gramStart"/>
-            <w:r>
-              <w:t>la repository</w:t>
-            </w:r>
-            <w:proofErr w:type="gramEnd"/>
-            <w:r>
-              <w:t xml:space="preserve"> privata e ridurre al minimo i ruoli del service</w:t>
+              <w:t>Mettere la repository privata e ridurre al minimo i ruoli del service</w:t>
             </w:r>
             <w:r>
               <w:t xml:space="preserve"> a</w:t>
@@ -7412,18 +7286,13 @@
               <w:jc w:val="both"/>
             </w:pPr>
             <w:r>
-              <w:t xml:space="preserve">Per maggiore sicurezza mettere la chiave </w:t>
-            </w:r>
-            <w:proofErr w:type="gramStart"/>
-            <w:r>
-              <w:t>nel .</w:t>
+              <w:t>Per maggiore sicurezza mettere la chiave nel .</w:t>
             </w:r>
             <w:proofErr w:type="spellStart"/>
             <w:r>
               <w:t>gitignore</w:t>
             </w:r>
             <w:proofErr w:type="spellEnd"/>
-            <w:proofErr w:type="gramEnd"/>
             <w:r>
               <w:t xml:space="preserve"> o utilizzare variabili d’ambiente.</w:t>
             </w:r>
@@ -7519,16 +7388,11 @@
             <w:r>
               <w:t xml:space="preserve">Gestire tramite </w:t>
             </w:r>
-            <w:proofErr w:type="spellStart"/>
             <w:r>
               <w:t>F</w:t>
             </w:r>
             <w:r>
-              <w:t>irebase</w:t>
-            </w:r>
-            <w:proofErr w:type="spellEnd"/>
-            <w:r>
-              <w:t xml:space="preserve"> un controllo delle prenotazioni al momento del click. </w:t>
+              <w:t xml:space="preserve">irebase un controllo delle prenotazioni al momento del click. </w:t>
             </w:r>
           </w:p>
           <w:p>
@@ -7637,15 +7501,7 @@
               <w:jc w:val="both"/>
             </w:pPr>
             <w:r>
-              <w:t xml:space="preserve">Revisione attenta del codice prima di caricare </w:t>
-            </w:r>
-            <w:proofErr w:type="gramStart"/>
-            <w:r>
-              <w:t>nella repository</w:t>
-            </w:r>
-            <w:proofErr w:type="gramEnd"/>
-            <w:r>
-              <w:t xml:space="preserve">. Se si utilizza un </w:t>
+              <w:t xml:space="preserve">Revisione attenta del codice prima di caricare nella repository. Se si utilizza un </w:t>
             </w:r>
             <w:proofErr w:type="spellStart"/>
             <w:r>
@@ -7661,7 +7517,13 @@
             </w:r>
             <w:proofErr w:type="spellEnd"/>
             <w:r>
-              <w:t xml:space="preserve"> e, se sono modifiche importante, attendere l’accettazione da parte di un altro membro.</w:t>
+              <w:t xml:space="preserve"> e, se sono modifiche important</w:t>
+            </w:r>
+            <w:r>
+              <w:t>i</w:t>
+            </w:r>
+            <w:r>
+              <w:t>, attendere l’accettazione da parte di un altro membro.</w:t>
             </w:r>
           </w:p>
         </w:tc>
@@ -7846,436 +7708,426 @@
         <w:t xml:space="preserve"> e i ruoli assegnati dal </w:t>
       </w:r>
       <w:r>
-        <w:t xml:space="preserve">Product </w:t>
+        <w:t>Product Owner.</w:t>
+      </w:r>
+    </w:p>
+    <w:p>
+      <w:pPr>
+        <w:pStyle w:val="Stile2"/>
+      </w:pPr>
+      <w:bookmarkStart w:id="19" w:name="_Toc216349585"/>
+      <w:r>
+        <w:t>Ruoli</w:t>
+      </w:r>
+      <w:bookmarkEnd w:id="19"/>
+    </w:p>
+    <w:p>
+      <w:pPr>
+        <w:spacing w:after="0"/>
+        <w:jc w:val="both"/>
+        <w:rPr>
+          <w:b/>
+          <w:bCs/>
+        </w:rPr>
+      </w:pPr>
+      <w:r>
+        <w:t>Davide Mascheretti</w:t>
+      </w:r>
+      <w:r>
+        <w:t xml:space="preserve"> </w:t>
+      </w:r>
+      <w:r>
+        <w:t xml:space="preserve">— </w:t>
+      </w:r>
+      <w:r>
+        <w:rPr>
+          <w:b/>
+          <w:bCs/>
+        </w:rPr>
+        <w:t>Pr</w:t>
+      </w:r>
+      <w:r>
+        <w:rPr>
+          <w:b/>
+          <w:bCs/>
+        </w:rPr>
+        <w:t xml:space="preserve">oduct Owner </w:t>
+      </w:r>
+      <w:r>
+        <w:rPr>
+          <w:b/>
+          <w:bCs/>
+        </w:rPr>
+        <w:t>e Sviluppatore Back</w:t>
+      </w:r>
+      <w:r>
+        <w:rPr>
+          <w:b/>
+          <w:bCs/>
+        </w:rPr>
+        <w:t>-</w:t>
+      </w:r>
+      <w:r>
+        <w:rPr>
+          <w:b/>
+          <w:bCs/>
+        </w:rPr>
+        <w:t>End</w:t>
+      </w:r>
+    </w:p>
+    <w:p>
+      <w:pPr>
+        <w:spacing w:after="0"/>
+        <w:jc w:val="both"/>
+      </w:pPr>
+      <w:r>
+        <w:t>Coordina le attività, pianifica le scadenze</w:t>
+      </w:r>
+      <w:r>
+        <w:t xml:space="preserve">, </w:t>
+      </w:r>
+      <w:r>
+        <w:t>gestisce le</w:t>
+      </w:r>
+      <w:r>
+        <w:t xml:space="preserve"> funzionalità </w:t>
+      </w:r>
+      <w:r>
+        <w:t>dell’applicazione</w:t>
+      </w:r>
+      <w:r>
+        <w:t xml:space="preserve"> e verifica richieste di modifica.</w:t>
+      </w:r>
+    </w:p>
+    <w:p>
+      <w:pPr>
+        <w:spacing w:after="0"/>
+        <w:jc w:val="both"/>
+      </w:pPr>
+      <w:r>
+        <w:t>Implementa la logica applicativa</w:t>
+      </w:r>
+      <w:r>
+        <w:t>, la gestione del database e delle dipendenze necessarie per il corretto funzionamento dell’applicazione.</w:t>
+      </w:r>
+    </w:p>
+    <w:p>
+      <w:pPr>
+        <w:spacing w:after="0"/>
+        <w:jc w:val="both"/>
+      </w:pPr>
+    </w:p>
+    <w:p>
+      <w:pPr>
+        <w:spacing w:after="0"/>
+        <w:jc w:val="both"/>
+      </w:pPr>
+      <w:r>
+        <w:t xml:space="preserve">Tommaso Maistrello — </w:t>
+      </w:r>
+      <w:r>
+        <w:rPr>
+          <w:b/>
+          <w:bCs/>
+        </w:rPr>
+        <w:t>S</w:t>
+      </w:r>
+      <w:r>
+        <w:rPr>
+          <w:b/>
+          <w:bCs/>
+        </w:rPr>
+        <w:t>CRUM</w:t>
+      </w:r>
+      <w:r>
+        <w:rPr>
+          <w:b/>
+          <w:bCs/>
+        </w:rPr>
+        <w:t xml:space="preserve"> master e Sviluppatore Front</w:t>
+      </w:r>
+      <w:r>
+        <w:rPr>
+          <w:b/>
+          <w:bCs/>
+        </w:rPr>
+        <w:t>-</w:t>
+      </w:r>
+      <w:r>
+        <w:rPr>
+          <w:b/>
+          <w:bCs/>
+        </w:rPr>
+        <w:t>End</w:t>
+      </w:r>
+    </w:p>
+    <w:p>
+      <w:pPr>
+        <w:spacing w:after="0"/>
+        <w:jc w:val="both"/>
+      </w:pPr>
+      <w:r>
+        <w:t>Cura la documentazione e raccoglie i requisiti funzionali e non funzionali in un file specifico</w:t>
+      </w:r>
+      <w:r>
+        <w:t xml:space="preserve"> in collaborazione con il Product Owner.</w:t>
+      </w:r>
+    </w:p>
+    <w:p>
+      <w:pPr>
+        <w:spacing w:after="0"/>
+        <w:jc w:val="both"/>
+      </w:pPr>
+      <w:r>
+        <w:t>Realizza l’interfaccia utente.</w:t>
+      </w:r>
+    </w:p>
+    <w:p>
+      <w:pPr>
+        <w:spacing w:after="0"/>
+        <w:jc w:val="both"/>
+      </w:pPr>
+    </w:p>
+    <w:p>
+      <w:pPr>
+        <w:spacing w:after="0"/>
+        <w:jc w:val="both"/>
+      </w:pPr>
+      <w:r>
+        <w:t>Francesco Valenari</w:t>
+      </w:r>
+      <w:r>
+        <w:t xml:space="preserve"> </w:t>
+      </w:r>
+      <w:r>
+        <w:t xml:space="preserve">— </w:t>
+      </w:r>
+      <w:r>
+        <w:rPr>
+          <w:b/>
+          <w:bCs/>
+        </w:rPr>
+        <w:t>Sviluppatore</w:t>
+      </w:r>
+      <w:r>
+        <w:rPr>
+          <w:b/>
+          <w:bCs/>
+        </w:rPr>
+        <w:t xml:space="preserve"> </w:t>
+      </w:r>
+      <w:r>
+        <w:rPr>
+          <w:b/>
+          <w:bCs/>
+        </w:rPr>
+        <w:t>F</w:t>
+      </w:r>
+      <w:r>
+        <w:rPr>
+          <w:b/>
+          <w:bCs/>
+        </w:rPr>
+        <w:t>ront</w:t>
+      </w:r>
+      <w:r>
+        <w:rPr>
+          <w:b/>
+          <w:bCs/>
+        </w:rPr>
+        <w:t>-E</w:t>
+      </w:r>
+      <w:r>
+        <w:rPr>
+          <w:b/>
+          <w:bCs/>
+        </w:rPr>
+        <w:t xml:space="preserve">nd </w:t>
+      </w:r>
+      <w:r>
+        <w:rPr>
+          <w:b/>
+          <w:bCs/>
+        </w:rPr>
+        <w:t>e</w:t>
+      </w:r>
+      <w:r>
+        <w:rPr>
+          <w:b/>
+          <w:bCs/>
+        </w:rPr>
+        <w:t xml:space="preserve"> progett</w:t>
+      </w:r>
+      <w:r>
+        <w:rPr>
+          <w:b/>
+          <w:bCs/>
+        </w:rPr>
+        <w:t>ista</w:t>
+      </w:r>
+      <w:r>
+        <w:rPr>
+          <w:b/>
+          <w:bCs/>
+        </w:rPr>
+        <w:t xml:space="preserve"> software</w:t>
+      </w:r>
+    </w:p>
+    <w:p>
+      <w:pPr>
+        <w:spacing w:after="0"/>
+        <w:jc w:val="both"/>
+      </w:pPr>
+      <w:r>
+        <w:t>Definisce l’architettura del sistema, la struttura del codice e i diagrammi UML, garantendo coerenza e qualità del design.</w:t>
+      </w:r>
+    </w:p>
+    <w:p>
+      <w:pPr>
+        <w:spacing w:after="0"/>
+        <w:jc w:val="both"/>
+      </w:pPr>
+      <w:r>
+        <w:t>Aiuta nella realizzazione dell'interfaccia utente.</w:t>
+      </w:r>
+    </w:p>
+    <w:p>
+      <w:pPr>
+        <w:spacing w:after="0"/>
+        <w:jc w:val="both"/>
+      </w:pPr>
+    </w:p>
+    <w:p>
+      <w:pPr>
+        <w:spacing w:after="0"/>
+        <w:jc w:val="both"/>
+        <w:rPr>
+          <w:lang w:val="en-GB"/>
+        </w:rPr>
+      </w:pPr>
+      <w:r>
+        <w:rPr>
+          <w:lang w:val="en-GB"/>
+        </w:rPr>
+        <w:t>Claudio Morgera</w:t>
+      </w:r>
+      <w:r>
+        <w:rPr>
+          <w:lang w:val="en-GB"/>
+        </w:rPr>
+        <w:t xml:space="preserve"> </w:t>
+      </w:r>
+      <w:r>
+        <w:rPr>
+          <w:lang w:val="en-GB"/>
+        </w:rPr>
+        <w:t xml:space="preserve">— </w:t>
       </w:r>
       <w:proofErr w:type="spellStart"/>
       <w:r>
-        <w:t>Owner</w:t>
+        <w:rPr>
+          <w:b/>
+          <w:bCs/>
+          <w:lang w:val="en-GB"/>
+        </w:rPr>
+        <w:t>Sviluppatore</w:t>
       </w:r>
       <w:proofErr w:type="spellEnd"/>
       <w:r>
-        <w:t>.</w:t>
-      </w:r>
-    </w:p>
-    <w:p>
-      <w:pPr>
-        <w:pStyle w:val="Stile2"/>
-      </w:pPr>
-      <w:bookmarkStart w:id="19" w:name="_Toc216349585"/>
-      <w:r>
-        <w:t>Ruoli</w:t>
-      </w:r>
-      <w:bookmarkEnd w:id="19"/>
-    </w:p>
-    <w:p>
-      <w:pPr>
-        <w:spacing w:after="0"/>
-        <w:jc w:val="both"/>
-        <w:rPr>
-          <w:b/>
-          <w:bCs/>
-        </w:rPr>
-      </w:pPr>
-      <w:r>
-        <w:t>Davide Mascheretti</w:t>
-      </w:r>
-      <w:r>
+        <w:rPr>
+          <w:b/>
+          <w:bCs/>
+          <w:lang w:val="en-GB"/>
+        </w:rPr>
         <w:t xml:space="preserve"> </w:t>
       </w:r>
       <w:r>
-        <w:t xml:space="preserve">— </w:t>
-      </w:r>
-      <w:r>
-        <w:rPr>
-          <w:b/>
-          <w:bCs/>
-        </w:rPr>
-        <w:t>Pr</w:t>
-      </w:r>
-      <w:r>
-        <w:rPr>
-          <w:b/>
-          <w:bCs/>
-        </w:rPr>
-        <w:t xml:space="preserve">oduct </w:t>
-      </w:r>
-      <w:proofErr w:type="spellStart"/>
-      <w:r>
-        <w:rPr>
-          <w:b/>
-          <w:bCs/>
-        </w:rPr>
-        <w:t>Owner</w:t>
-      </w:r>
-      <w:proofErr w:type="spellEnd"/>
-      <w:r>
-        <w:rPr>
-          <w:b/>
-          <w:bCs/>
-        </w:rPr>
+        <w:rPr>
+          <w:b/>
+          <w:bCs/>
+          <w:lang w:val="en-GB"/>
+        </w:rPr>
+        <w:t>B</w:t>
+      </w:r>
+      <w:r>
+        <w:rPr>
+          <w:b/>
+          <w:bCs/>
+          <w:lang w:val="en-GB"/>
+        </w:rPr>
+        <w:t>ack</w:t>
+      </w:r>
+      <w:r>
+        <w:rPr>
+          <w:b/>
+          <w:bCs/>
+          <w:lang w:val="en-GB"/>
+        </w:rPr>
+        <w:t>-E</w:t>
+      </w:r>
+      <w:r>
+        <w:rPr>
+          <w:b/>
+          <w:bCs/>
+          <w:lang w:val="en-GB"/>
+        </w:rPr>
+        <w:t xml:space="preserve">nd </w:t>
+      </w:r>
+      <w:r>
+        <w:rPr>
+          <w:b/>
+          <w:bCs/>
+          <w:lang w:val="en-GB"/>
+        </w:rPr>
+        <w:t>e</w:t>
+      </w:r>
+      <w:r>
+        <w:rPr>
+          <w:b/>
+          <w:bCs/>
+          <w:lang w:val="en-GB"/>
+        </w:rPr>
+        <w:t xml:space="preserve"> testing</w:t>
+      </w:r>
+    </w:p>
+    <w:p>
+      <w:pPr>
+        <w:spacing w:after="0"/>
+        <w:jc w:val="both"/>
+      </w:pPr>
+      <w:r>
+        <w:t>Aiuta nell</w:t>
+      </w:r>
+      <w:r>
+        <w:t>’</w:t>
+      </w:r>
+      <w:r>
+        <w:t>implementazione della logica applicativa e gestisce l’integrazione tra moduli, servizi e database.</w:t>
+      </w:r>
+    </w:p>
+    <w:p>
+      <w:pPr>
+        <w:spacing w:after="0"/>
+        <w:jc w:val="both"/>
+      </w:pPr>
+    </w:p>
+    <w:p>
+      <w:pPr>
+        <w:spacing w:after="0"/>
+        <w:jc w:val="both"/>
+      </w:pPr>
+      <w:r>
+        <w:t>L’impegno dei membri sarà costante per tutta la durata del progetto, con maggiore intensità nelle fasi di sviluppo e collaudo.</w:t>
+      </w:r>
+      <w:r>
         <w:t xml:space="preserve"> </w:t>
       </w:r>
       <w:r>
-        <w:rPr>
-          <w:b/>
-          <w:bCs/>
-        </w:rPr>
-        <w:t>e Sviluppatore Back</w:t>
-      </w:r>
-      <w:r>
-        <w:rPr>
-          <w:b/>
-          <w:bCs/>
-        </w:rPr>
-        <w:t>-</w:t>
-      </w:r>
-      <w:r>
-        <w:rPr>
-          <w:b/>
-          <w:bCs/>
-        </w:rPr>
-        <w:t>End</w:t>
-      </w:r>
-    </w:p>
-    <w:p>
-      <w:pPr>
-        <w:spacing w:after="0"/>
-        <w:jc w:val="both"/>
-      </w:pPr>
-      <w:r>
-        <w:t>Coordina le attività, pianifica le scadenze</w:t>
-      </w:r>
-      <w:r>
-        <w:t>, approva funzionalità aggiuntive e verifica richieste di modifica.</w:t>
-      </w:r>
-    </w:p>
-    <w:p>
-      <w:pPr>
-        <w:spacing w:after="0"/>
-        <w:jc w:val="both"/>
-      </w:pPr>
-      <w:r>
-        <w:t>Implementa la logica applicativa</w:t>
-      </w:r>
-      <w:r>
-        <w:t>, la gestione del database e delle dipendenze necessarie per il corretto funzionamento dell’applicazione.</w:t>
-      </w:r>
-    </w:p>
-    <w:p>
-      <w:pPr>
-        <w:spacing w:after="0"/>
-        <w:jc w:val="both"/>
-      </w:pPr>
-    </w:p>
-    <w:p>
-      <w:pPr>
-        <w:spacing w:after="0"/>
-        <w:jc w:val="both"/>
-      </w:pPr>
-      <w:r>
-        <w:t xml:space="preserve">Tommaso Maistrello — </w:t>
-      </w:r>
-      <w:r>
-        <w:rPr>
-          <w:b/>
-          <w:bCs/>
-        </w:rPr>
-        <w:t>S</w:t>
-      </w:r>
-      <w:r>
-        <w:rPr>
-          <w:b/>
-          <w:bCs/>
-        </w:rPr>
-        <w:t>CRUM</w:t>
-      </w:r>
-      <w:r>
-        <w:rPr>
-          <w:b/>
-          <w:bCs/>
-        </w:rPr>
-        <w:t xml:space="preserve"> master e Sviluppatore Front</w:t>
-      </w:r>
-      <w:r>
-        <w:rPr>
-          <w:b/>
-          <w:bCs/>
-        </w:rPr>
-        <w:t>-</w:t>
-      </w:r>
-      <w:r>
-        <w:rPr>
-          <w:b/>
-          <w:bCs/>
-        </w:rPr>
-        <w:t>End</w:t>
-      </w:r>
-    </w:p>
-    <w:p>
-      <w:pPr>
-        <w:spacing w:after="0"/>
-        <w:jc w:val="both"/>
-      </w:pPr>
-      <w:r>
-        <w:t>Cura la documentazione e raccoglie i requisiti funzionali e non funzionali in un file specifico</w:t>
-      </w:r>
-      <w:r>
-        <w:t xml:space="preserve"> in collaborazione con il Product </w:t>
-      </w:r>
-      <w:proofErr w:type="spellStart"/>
-      <w:r>
-        <w:t>Owner</w:t>
-      </w:r>
-      <w:proofErr w:type="spellEnd"/>
-      <w:r>
-        <w:t>.</w:t>
-      </w:r>
-    </w:p>
-    <w:p>
-      <w:pPr>
-        <w:spacing w:after="0"/>
-        <w:jc w:val="both"/>
-      </w:pPr>
-      <w:r>
-        <w:t>Realizza l’interfaccia utente.</w:t>
-      </w:r>
-    </w:p>
-    <w:p>
-      <w:pPr>
-        <w:spacing w:after="0"/>
-        <w:jc w:val="both"/>
-      </w:pPr>
-    </w:p>
-    <w:p>
-      <w:pPr>
-        <w:spacing w:after="0"/>
-        <w:jc w:val="both"/>
-      </w:pPr>
-      <w:r>
-        <w:t>Francesco Valenari</w:t>
-      </w:r>
-      <w:r>
-        <w:t xml:space="preserve"> </w:t>
-      </w:r>
-      <w:r>
-        <w:t xml:space="preserve">— </w:t>
-      </w:r>
-      <w:r>
-        <w:rPr>
-          <w:b/>
-          <w:bCs/>
-        </w:rPr>
-        <w:t xml:space="preserve">Developer </w:t>
-      </w:r>
-      <w:r>
-        <w:rPr>
-          <w:b/>
-          <w:bCs/>
-        </w:rPr>
-        <w:t>F</w:t>
-      </w:r>
-      <w:r>
-        <w:rPr>
-          <w:b/>
-          <w:bCs/>
-        </w:rPr>
-        <w:t>ront</w:t>
-      </w:r>
-      <w:r>
-        <w:rPr>
-          <w:b/>
-          <w:bCs/>
-        </w:rPr>
-        <w:t>-E</w:t>
-      </w:r>
-      <w:r>
-        <w:rPr>
-          <w:b/>
-          <w:bCs/>
-        </w:rPr>
-        <w:t xml:space="preserve">nd </w:t>
-      </w:r>
-      <w:r>
-        <w:rPr>
-          <w:b/>
-          <w:bCs/>
-        </w:rPr>
-        <w:t>e</w:t>
-      </w:r>
-      <w:r>
-        <w:rPr>
-          <w:b/>
-          <w:bCs/>
-        </w:rPr>
-        <w:t xml:space="preserve"> progett</w:t>
-      </w:r>
-      <w:r>
-        <w:rPr>
-          <w:b/>
-          <w:bCs/>
-        </w:rPr>
-        <w:t>ista</w:t>
-      </w:r>
-      <w:r>
-        <w:rPr>
-          <w:b/>
-          <w:bCs/>
-        </w:rPr>
-        <w:t xml:space="preserve"> software</w:t>
-      </w:r>
-    </w:p>
-    <w:p>
-      <w:pPr>
-        <w:spacing w:after="0"/>
-        <w:jc w:val="both"/>
-      </w:pPr>
-      <w:r>
-        <w:t>Definisce l’architettura del sistema, la struttura del codice e i diagrammi UML, garantendo coerenza e qualità del design.</w:t>
-      </w:r>
-    </w:p>
-    <w:p>
-      <w:pPr>
-        <w:spacing w:after="0"/>
-        <w:jc w:val="both"/>
-      </w:pPr>
-      <w:r>
-        <w:t>Aiuta nella realizzazione dell'interfaccia utente.</w:t>
-      </w:r>
-    </w:p>
-    <w:p>
-      <w:pPr>
-        <w:spacing w:after="0"/>
-        <w:jc w:val="both"/>
-      </w:pPr>
-    </w:p>
-    <w:p>
-      <w:pPr>
-        <w:spacing w:after="0"/>
-        <w:jc w:val="both"/>
-        <w:rPr>
-          <w:lang w:val="en-GB"/>
-        </w:rPr>
-      </w:pPr>
-      <w:r>
-        <w:rPr>
-          <w:lang w:val="en-GB"/>
-        </w:rPr>
-        <w:t>Claudio Morgera</w:t>
-      </w:r>
-      <w:r>
-        <w:rPr>
-          <w:lang w:val="en-GB"/>
-        </w:rPr>
-        <w:t xml:space="preserve"> </w:t>
-      </w:r>
-      <w:r>
-        <w:rPr>
-          <w:lang w:val="en-GB"/>
-        </w:rPr>
-        <w:t xml:space="preserve">— </w:t>
-      </w:r>
-      <w:r>
-        <w:rPr>
-          <w:b/>
-          <w:bCs/>
-          <w:lang w:val="en-GB"/>
-        </w:rPr>
-        <w:t xml:space="preserve">Developer </w:t>
-      </w:r>
-      <w:r>
-        <w:rPr>
-          <w:b/>
-          <w:bCs/>
-          <w:lang w:val="en-GB"/>
-        </w:rPr>
-        <w:t>B</w:t>
-      </w:r>
-      <w:r>
-        <w:rPr>
-          <w:b/>
-          <w:bCs/>
-          <w:lang w:val="en-GB"/>
-        </w:rPr>
-        <w:t>ack</w:t>
-      </w:r>
-      <w:r>
-        <w:rPr>
-          <w:b/>
-          <w:bCs/>
-          <w:lang w:val="en-GB"/>
-        </w:rPr>
-        <w:t>-E</w:t>
-      </w:r>
-      <w:r>
-        <w:rPr>
-          <w:b/>
-          <w:bCs/>
-          <w:lang w:val="en-GB"/>
-        </w:rPr>
-        <w:t xml:space="preserve">nd </w:t>
-      </w:r>
-      <w:r>
-        <w:rPr>
-          <w:b/>
-          <w:bCs/>
-          <w:lang w:val="en-GB"/>
-        </w:rPr>
-        <w:t>e</w:t>
-      </w:r>
-      <w:r>
-        <w:rPr>
-          <w:b/>
-          <w:bCs/>
-          <w:lang w:val="en-GB"/>
-        </w:rPr>
-        <w:t xml:space="preserve"> testing</w:t>
-      </w:r>
-    </w:p>
-    <w:p>
-      <w:pPr>
-        <w:spacing w:after="0"/>
-        <w:jc w:val="both"/>
-      </w:pPr>
-      <w:r>
-        <w:t>Aiuta nell‘implementazione della logica applicativa e gestisce l’integrazione tra moduli, servizi e database.</w:t>
-      </w:r>
-    </w:p>
-    <w:p>
-      <w:pPr>
-        <w:spacing w:after="0"/>
-        <w:jc w:val="both"/>
-      </w:pPr>
-    </w:p>
-    <w:p>
-      <w:pPr>
-        <w:spacing w:after="0"/>
-        <w:jc w:val="both"/>
-      </w:pPr>
-      <w:r>
-        <w:t>L’impegno dei membri sarà costante per tutta la durata del progetto, con maggiore intensità nelle fasi di sviluppo e collaudo.</w:t>
-      </w:r>
-      <w:r>
-        <w:t xml:space="preserve"> </w:t>
-      </w:r>
-      <w:r>
-        <w:t xml:space="preserve">Si sottolinea inoltre come la documentazione e la fase di testing sono compiti di ogni membro </w:t>
-      </w:r>
-      <w:proofErr w:type="gramStart"/>
-      <w:r>
-        <w:t>del team</w:t>
-      </w:r>
-      <w:proofErr w:type="gramEnd"/>
-      <w:r>
-        <w:t>, in particolare dopo che effettua modifiche al codice.</w:t>
+        <w:t>Si sottolinea inoltre come la documentazione e la fase di testing sono compiti di ogni membro del team, in particolare dopo che effettua modifiche al codice.</w:t>
       </w:r>
       <w:r>
         <w:t xml:space="preserve"> Il confine tra questi ruoli è labile.</w:t>
       </w:r>
-    </w:p>
-    <w:p>
-      <w:pPr>
-        <w:jc w:val="both"/>
-      </w:pPr>
     </w:p>
     <w:p>
       <w:pPr>
@@ -8389,296 +8241,294 @@
         <w:t xml:space="preserve">: i requisiti saranno raccolti tramite incontri di gruppo e discussioni guidate dal </w:t>
       </w:r>
       <w:r>
-        <w:t xml:space="preserve">Product </w:t>
+        <w:t xml:space="preserve">Product Owner e dallo </w:t>
+      </w:r>
+      <w:r>
+        <w:t>SCRUM</w:t>
+      </w:r>
+      <w:r>
+        <w:t xml:space="preserve"> Master.</w:t>
+      </w:r>
+      <w:r>
+        <w:t xml:space="preserve"> </w:t>
+      </w:r>
+      <w:r>
+        <w:t>Saranno documentati in modo strutturato utilizzando diagrammi dei casi d’uso e specifiche testuali</w:t>
+      </w:r>
+      <w:r>
+        <w:t xml:space="preserve">. </w:t>
+      </w:r>
+      <w:r>
+        <w:t>Verrà poi redatto un documento a parte denominato “Specifica dei requisiti” che raggruppa e suddivide i requisiti in base alla loro funzionalità e prioritizzazione.</w:t>
+      </w:r>
+    </w:p>
+    <w:p>
+      <w:pPr>
+        <w:spacing w:after="0"/>
+        <w:jc w:val="both"/>
+      </w:pPr>
+      <w:r>
+        <w:t xml:space="preserve">È stata infatti utilizzata una prioritizzazione di </w:t>
       </w:r>
       <w:proofErr w:type="spellStart"/>
       <w:r>
-        <w:t>Owner</w:t>
+        <w:t>MoSCoW</w:t>
       </w:r>
       <w:proofErr w:type="spellEnd"/>
       <w:r>
-        <w:t xml:space="preserve"> e dallo </w:t>
-      </w:r>
-      <w:r>
-        <w:t>SCRUM</w:t>
-      </w:r>
-      <w:r>
-        <w:t xml:space="preserve"> Master.</w:t>
-      </w:r>
-      <w:r>
-        <w:t xml:space="preserve"> </w:t>
-      </w:r>
-      <w:r>
-        <w:t>Saranno documentati in modo strutturato utilizzando diagrammi dei casi d’uso e specifiche testuali</w:t>
-      </w:r>
-      <w:r>
-        <w:t xml:space="preserve">. </w:t>
-      </w:r>
-      <w:r>
-        <w:t>Verrà poi redatto un documento a parte denominato “Specifica dei requisiti” che raggruppa e suddivide i requisiti in base alla loro funzionalità e prioritizzazione.</w:t>
-      </w:r>
-    </w:p>
-    <w:p>
-      <w:pPr>
-        <w:spacing w:after="0"/>
-        <w:jc w:val="both"/>
-      </w:pPr>
-      <w:r>
-        <w:t xml:space="preserve">È stata infatti utilizzata una prioritizzazione di </w:t>
+        <w:t>:</w:t>
+      </w:r>
+      <w:r>
+        <w:t xml:space="preserve"> la suddivisione dei requisiti in must, </w:t>
       </w:r>
       <w:proofErr w:type="spellStart"/>
       <w:r>
-        <w:t>MoSCoW</w:t>
+        <w:t>should</w:t>
       </w:r>
       <w:proofErr w:type="spellEnd"/>
       <w:r>
-        <w:t>:</w:t>
-      </w:r>
-      <w:r>
-        <w:t xml:space="preserve"> la suddivisione dei requisiti in must, </w:t>
+        <w:t xml:space="preserve">, </w:t>
       </w:r>
       <w:proofErr w:type="spellStart"/>
       <w:r>
-        <w:t>should</w:t>
+        <w:t>could</w:t>
       </w:r>
       <w:proofErr w:type="spellEnd"/>
       <w:r>
-        <w:t xml:space="preserve">, </w:t>
+        <w:t xml:space="preserve"> e </w:t>
       </w:r>
       <w:proofErr w:type="spellStart"/>
       <w:r>
-        <w:t>could</w:t>
+        <w:t>won’t</w:t>
       </w:r>
       <w:proofErr w:type="spellEnd"/>
       <w:r>
-        <w:t xml:space="preserve"> e </w:t>
+        <w:t xml:space="preserve"> permette di definire in maniera più chiara le scadenze e il tempo da dedicare ad ogni requisit</w:t>
+      </w:r>
+      <w:r>
+        <w:t>o</w:t>
+      </w:r>
+      <w:r>
+        <w:t>, dai più importanti e centrali a quelli minori.</w:t>
+      </w:r>
+    </w:p>
+    <w:p>
+      <w:pPr>
+        <w:spacing w:after="0"/>
+        <w:jc w:val="both"/>
+      </w:pPr>
+    </w:p>
+    <w:p>
+      <w:pPr>
+        <w:spacing w:after="0"/>
+        <w:jc w:val="both"/>
+      </w:pPr>
+      <w:r>
+        <w:rPr>
+          <w:b/>
+          <w:bCs/>
+        </w:rPr>
+        <w:t>Progettazione</w:t>
+      </w:r>
+      <w:r>
+        <w:t xml:space="preserve">: sarà impiegato un approccio </w:t>
+      </w:r>
+      <w:r>
+        <w:t>O</w:t>
+      </w:r>
+      <w:r>
+        <w:t>bject-</w:t>
       </w:r>
       <w:proofErr w:type="spellStart"/>
       <w:r>
-        <w:t>won’t</w:t>
+        <w:t>O</w:t>
+      </w:r>
+      <w:r>
+        <w:t>riented</w:t>
       </w:r>
       <w:proofErr w:type="spellEnd"/>
       <w:r>
-        <w:t xml:space="preserve"> permette di definire in maniera più chiara le scadenze e il tempo da dedicare ad ogni requisit</w:t>
-      </w:r>
-      <w:r>
-        <w:t>o</w:t>
-      </w:r>
-      <w:r>
-        <w:t>, dai più importanti e centrali a quelli minori.</w:t>
-      </w:r>
-    </w:p>
-    <w:p>
-      <w:pPr>
-        <w:spacing w:after="0"/>
-        <w:jc w:val="both"/>
-      </w:pPr>
-    </w:p>
-    <w:p>
-      <w:pPr>
-        <w:spacing w:after="0"/>
-        <w:jc w:val="both"/>
-      </w:pPr>
-      <w:r>
-        <w:rPr>
-          <w:b/>
-          <w:bCs/>
-        </w:rPr>
-        <w:t>Progettazione</w:t>
-      </w:r>
-      <w:r>
-        <w:t xml:space="preserve">: sarà impiegato un approccio </w:t>
-      </w:r>
-      <w:r>
-        <w:t>O</w:t>
-      </w:r>
-      <w:r>
-        <w:t>bject-</w:t>
+        <w:t xml:space="preserve"> (OO), con l’ausilio di diagrammi UML per rappresentare classi, sequenze e componenti. La progettazione sarà validata in gruppo prima dell’inizio della codifica.</w:t>
+      </w:r>
+    </w:p>
+    <w:p>
+      <w:pPr>
+        <w:spacing w:after="0"/>
+        <w:jc w:val="both"/>
+      </w:pPr>
+    </w:p>
+    <w:p>
+      <w:pPr>
+        <w:spacing w:after="0"/>
+        <w:jc w:val="both"/>
+      </w:pPr>
+      <w:r>
+        <w:rPr>
+          <w:b/>
+          <w:bCs/>
+        </w:rPr>
+        <w:t>Implementazione</w:t>
+      </w:r>
+      <w:r>
+        <w:t>: lo sviluppo sarà realizzato in Java, utilizzando l’ambiente Eclipse IDE.</w:t>
+      </w:r>
+    </w:p>
+    <w:p>
+      <w:pPr>
+        <w:spacing w:after="0"/>
+        <w:jc w:val="both"/>
+      </w:pPr>
+      <w:r>
+        <w:t>Verrà seguito un processo incrementale e iterativo dove ciascun componente sarà sviluppato, testato e integrato progressivamente per tutta la durata del progetto.</w:t>
+      </w:r>
+    </w:p>
+    <w:p>
+      <w:pPr>
+        <w:spacing w:after="0"/>
+        <w:jc w:val="both"/>
+      </w:pPr>
+    </w:p>
+    <w:p>
+      <w:pPr>
+        <w:jc w:val="both"/>
+      </w:pPr>
+      <w:r>
+        <w:rPr>
+          <w:b/>
+          <w:bCs/>
+        </w:rPr>
+        <w:t>Controllo di versione</w:t>
+      </w:r>
+      <w:r>
+        <w:t xml:space="preserve">: il codice sarà gestito tramite </w:t>
       </w:r>
       <w:proofErr w:type="spellStart"/>
       <w:r>
-        <w:t>O</w:t>
-      </w:r>
-      <w:r>
-        <w:t>riented</w:t>
+        <w:t>Git</w:t>
       </w:r>
       <w:proofErr w:type="spellEnd"/>
       <w:r>
-        <w:t xml:space="preserve"> (OO), con l’ausilio di diagrammi UML per rappresentare classi, sequenze e componenti. La progettazione sarà validata in gruppo prima dell’inizio della codifica.</w:t>
-      </w:r>
-    </w:p>
-    <w:p>
-      <w:pPr>
-        <w:spacing w:after="0"/>
-        <w:jc w:val="both"/>
-      </w:pPr>
-    </w:p>
-    <w:p>
-      <w:pPr>
-        <w:spacing w:after="0"/>
-        <w:jc w:val="both"/>
-      </w:pPr>
-      <w:r>
-        <w:rPr>
-          <w:b/>
-          <w:bCs/>
-        </w:rPr>
-        <w:t>Implementazione</w:t>
-      </w:r>
-      <w:r>
-        <w:t>: lo sviluppo sarà realizzato in Java, utilizzando l’ambiente Eclipse IDE.</w:t>
-      </w:r>
-    </w:p>
-    <w:p>
-      <w:pPr>
-        <w:spacing w:after="0"/>
-        <w:jc w:val="both"/>
-      </w:pPr>
-      <w:r>
-        <w:t>Verrà seguito un processo incrementale e iterativo dove ciascun componente sarà sviluppato, testato e integrato progressivamente per tutta la durata del progetto.</w:t>
-      </w:r>
-    </w:p>
-    <w:p>
-      <w:pPr>
-        <w:spacing w:after="0"/>
-        <w:jc w:val="both"/>
-      </w:pPr>
-    </w:p>
-    <w:p>
-      <w:pPr>
-        <w:jc w:val="both"/>
-      </w:pPr>
-      <w:r>
-        <w:rPr>
-          <w:b/>
-          <w:bCs/>
-        </w:rPr>
-        <w:t>Controllo di versione</w:t>
-      </w:r>
-      <w:r>
-        <w:t xml:space="preserve">: il codice sarà gestito tramite </w:t>
+        <w:t xml:space="preserve">, con repository su GitHub per il </w:t>
       </w:r>
       <w:proofErr w:type="spellStart"/>
       <w:r>
-        <w:t>Git</w:t>
+        <w:t>versionamento</w:t>
       </w:r>
       <w:proofErr w:type="spellEnd"/>
       <w:r>
-        <w:t xml:space="preserve">, con repository su GitHub per il </w:t>
+        <w:t xml:space="preserve">, la collaborazione e la revisione del codice. Ogni membro effettuerà </w:t>
       </w:r>
       <w:proofErr w:type="spellStart"/>
       <w:r>
-        <w:t>versionamento</w:t>
+        <w:t>commit</w:t>
       </w:r>
       <w:proofErr w:type="spellEnd"/>
       <w:r>
-        <w:t xml:space="preserve">, la collaborazione e la revisione del codice. Ogni membro effettuerà </w:t>
+        <w:t xml:space="preserve"> regolari e aprirà pull </w:t>
       </w:r>
       <w:proofErr w:type="spellStart"/>
       <w:r>
+        <w:t>request</w:t>
+      </w:r>
+      <w:proofErr w:type="spellEnd"/>
+      <w:r>
+        <w:t xml:space="preserve"> per l’integrazione </w:t>
+      </w:r>
+      <w:r>
+        <w:t xml:space="preserve">nel caso di lavoro su </w:t>
+      </w:r>
+      <w:proofErr w:type="spellStart"/>
+      <w:r>
+        <w:t>branch</w:t>
+      </w:r>
+      <w:proofErr w:type="spellEnd"/>
+      <w:r>
+        <w:t xml:space="preserve"> secondari</w:t>
+      </w:r>
+      <w:r>
+        <w:t>.</w:t>
+      </w:r>
+    </w:p>
+    <w:p>
+      <w:pPr>
+        <w:jc w:val="both"/>
+      </w:pPr>
+      <w:r>
+        <w:rPr>
+          <w:b/>
+          <w:bCs/>
+        </w:rPr>
+        <w:t>Documentazione tecnica</w:t>
+      </w:r>
+      <w:r>
+        <w:t xml:space="preserve">: sarà prodotta e mantenuta durante tutto il progetto, comprendendo specifiche dei requisiti, manuali tecnici e relazioni di test. I documenti saranno salvati in formato digitale condiviso e </w:t>
+      </w:r>
+      <w:proofErr w:type="spellStart"/>
+      <w:r>
+        <w:t>versionati</w:t>
+      </w:r>
+      <w:proofErr w:type="spellEnd"/>
+      <w:r>
+        <w:t xml:space="preserve"> insieme al codice.</w:t>
+      </w:r>
+    </w:p>
+    <w:p>
+      <w:pPr>
+        <w:jc w:val="both"/>
+      </w:pPr>
+      <w:r>
+        <w:rPr>
+          <w:b/>
+          <w:bCs/>
+        </w:rPr>
+        <w:t>Ambiente di prova</w:t>
+      </w:r>
+      <w:r>
+        <w:t xml:space="preserve">: i test saranno condotti sui computer personali dotati di Java Development Kit (JDK) </w:t>
+      </w:r>
+      <w:r>
+        <w:t>ed</w:t>
+      </w:r>
+      <w:r>
+        <w:t xml:space="preserve"> Eclipse, replicando l’ambiente di esecuzione previsto.</w:t>
+      </w:r>
+    </w:p>
+    <w:p>
+      <w:pPr>
+        <w:jc w:val="both"/>
+      </w:pPr>
+      <w:r>
+        <w:rPr>
+          <w:b/>
+          <w:bCs/>
+        </w:rPr>
+        <w:t>Integrazione e test</w:t>
+      </w:r>
+      <w:r>
+        <w:t xml:space="preserve">: i componenti saranno testati </w:t>
+      </w:r>
+      <w:r>
+        <w:t xml:space="preserve">manualmente ad ogni </w:t>
+      </w:r>
+      <w:proofErr w:type="spellStart"/>
+      <w:r>
         <w:t>commit</w:t>
       </w:r>
       <w:proofErr w:type="spellEnd"/>
       <w:r>
-        <w:t xml:space="preserve"> regolari e aprirà pull </w:t>
-      </w:r>
-      <w:proofErr w:type="spellStart"/>
-      <w:r>
-        <w:t>request</w:t>
-      </w:r>
-      <w:proofErr w:type="spellEnd"/>
-      <w:r>
-        <w:t xml:space="preserve"> per l’integrazione </w:t>
-      </w:r>
-      <w:r>
-        <w:t xml:space="preserve">nel caso di lavoro su </w:t>
-      </w:r>
-      <w:proofErr w:type="spellStart"/>
-      <w:r>
-        <w:t>branch</w:t>
-      </w:r>
-      <w:proofErr w:type="spellEnd"/>
-      <w:r>
-        <w:t xml:space="preserve"> secondari</w:t>
+        <w:t xml:space="preserve"> mentre il testing automatico verrà effettuato </w:t>
+      </w:r>
+      <w:r>
+        <w:t xml:space="preserve">durante </w:t>
+      </w:r>
+      <w:r>
+        <w:t>la fase di implementazione.</w:t>
+      </w:r>
+      <w:r>
+        <w:t xml:space="preserve"> Sono previsti inoltre test automatici con appositi strumenti prima della consegna (vedi “Pacchetti di lavoro - 7”)</w:t>
       </w:r>
       <w:r>
         <w:t>.</w:t>
-      </w:r>
-    </w:p>
-    <w:p>
-      <w:pPr>
-        <w:jc w:val="both"/>
-      </w:pPr>
-      <w:r>
-        <w:rPr>
-          <w:b/>
-          <w:bCs/>
-        </w:rPr>
-        <w:t>Documentazione tecnica</w:t>
-      </w:r>
-      <w:r>
-        <w:t xml:space="preserve">: sarà prodotta e mantenuta durante tutto il progetto, comprendendo specifiche dei requisiti, manuali tecnici e relazioni di test. I documenti saranno salvati in formato digitale condiviso e </w:t>
-      </w:r>
-      <w:proofErr w:type="spellStart"/>
-      <w:r>
-        <w:t>versionati</w:t>
-      </w:r>
-      <w:proofErr w:type="spellEnd"/>
-      <w:r>
-        <w:t xml:space="preserve"> insieme al codice.</w:t>
-      </w:r>
-    </w:p>
-    <w:p>
-      <w:pPr>
-        <w:jc w:val="both"/>
-      </w:pPr>
-      <w:r>
-        <w:rPr>
-          <w:b/>
-          <w:bCs/>
-        </w:rPr>
-        <w:t>Ambiente di prova</w:t>
-      </w:r>
-      <w:r>
-        <w:t xml:space="preserve">: i test saranno condotti sui computer personali dotati di Java Development Kit (JDK) </w:t>
-      </w:r>
-      <w:r>
-        <w:t>ed</w:t>
-      </w:r>
-      <w:r>
-        <w:t xml:space="preserve"> Eclipse, replicando l’ambiente di esecuzione previsto.</w:t>
-      </w:r>
-    </w:p>
-    <w:p>
-      <w:pPr>
-        <w:jc w:val="both"/>
-      </w:pPr>
-      <w:r>
-        <w:rPr>
-          <w:b/>
-          <w:bCs/>
-        </w:rPr>
-        <w:t>Integrazione e test</w:t>
-      </w:r>
-      <w:r>
-        <w:t xml:space="preserve">: i componenti saranno testati </w:t>
-      </w:r>
-      <w:r>
-        <w:t xml:space="preserve">manualmente ad ogni </w:t>
-      </w:r>
-      <w:proofErr w:type="spellStart"/>
-      <w:r>
-        <w:t>commit</w:t>
-      </w:r>
-      <w:proofErr w:type="spellEnd"/>
-      <w:r>
-        <w:t xml:space="preserve"> mentre il testing automatico verrà effettuato </w:t>
-      </w:r>
-      <w:r>
-        <w:t xml:space="preserve">durante </w:t>
-      </w:r>
-      <w:r>
-        <w:t>la fase di implementazione.</w:t>
       </w:r>
     </w:p>
     <w:p>
@@ -8796,13 +8646,8 @@
         <w:t xml:space="preserve"> da parte d</w:t>
       </w:r>
       <w:r>
-        <w:t xml:space="preserve">egli altri membri </w:t>
-      </w:r>
-      <w:proofErr w:type="gramStart"/>
-      <w:r>
-        <w:t>del team</w:t>
-      </w:r>
-      <w:proofErr w:type="gramEnd"/>
+        <w:t>egli altri membri del team</w:t>
+      </w:r>
       <w:r>
         <w:t>, che fornir</w:t>
       </w:r>
@@ -8816,7 +8661,13 @@
         <w:t>anno</w:t>
       </w:r>
       <w:r>
-        <w:t xml:space="preserve"> modiche</w:t>
+        <w:t xml:space="preserve"> modi</w:t>
+      </w:r>
+      <w:r>
+        <w:t>fi</w:t>
+      </w:r>
+      <w:r>
+        <w:t>che</w:t>
       </w:r>
       <w:r>
         <w:t>.</w:t>
@@ -8844,23 +8695,7 @@
         <w:t>: saranno realizzati test unitari, di integrazione e di sistema per garantire il corretto funzionamento del software</w:t>
       </w:r>
       <w:r>
-        <w:t xml:space="preserve">. Ogni membro </w:t>
-      </w:r>
-      <w:proofErr w:type="gramStart"/>
-      <w:r>
-        <w:t>del team</w:t>
-      </w:r>
-      <w:proofErr w:type="gramEnd"/>
-      <w:r>
-        <w:t xml:space="preserve"> è responsabile di fare test sulle parti di codice che implementa. Se il codice non è funzionante deve segnalarlo a </w:t>
-      </w:r>
-      <w:proofErr w:type="gramStart"/>
-      <w:r>
-        <w:t>tutto il team</w:t>
-      </w:r>
-      <w:proofErr w:type="gramEnd"/>
-      <w:r>
-        <w:t>.</w:t>
+        <w:t>. Ogni membro del team è responsabile di fare test sulle parti di codice che implementa. Se il codice non è funzionante deve segnalarlo a tutto il team.</w:t>
       </w:r>
     </w:p>
     <w:p>
@@ -8992,15 +8827,7 @@
         <w:t>: prima della consegna, il software sarà sottoposto a un test di accettazione finale per confermare la conformità alle specifiche e la stabilità del sistema.</w:t>
       </w:r>
       <w:r>
-        <w:t xml:space="preserve"> Verrà chiesto ad ogni membro </w:t>
-      </w:r>
-      <w:proofErr w:type="gramStart"/>
-      <w:r>
-        <w:t>del team</w:t>
-      </w:r>
-      <w:proofErr w:type="gramEnd"/>
-      <w:r>
-        <w:t xml:space="preserve"> di testare più volte il software al fine di trovare problematiche non notate in </w:t>
+        <w:t xml:space="preserve"> Verrà chiesto ad ogni membro del team di testare più volte il software al fine di trovare problematiche non notate in </w:t>
       </w:r>
       <w:r>
         <w:t>precedenza</w:t>
@@ -9236,51 +9063,7 @@
           <w:lang w:eastAsia="it-IT"/>
           <w14:ligatures w14:val="none"/>
         </w:rPr>
-        <w:t xml:space="preserve">Configurazione </w:t>
-      </w:r>
-      <w:proofErr w:type="spellStart"/>
-      <w:r>
-        <w:rPr>
-          <w:rFonts w:eastAsia="Times New Roman" w:cstheme="minorHAnsi"/>
-          <w:color w:val="000000"/>
-          <w:kern w:val="0"/>
-          <w:lang w:eastAsia="it-IT"/>
-          <w14:ligatures w14:val="none"/>
-        </w:rPr>
-        <w:t>Firebase</w:t>
-      </w:r>
-      <w:proofErr w:type="spellEnd"/>
-      <w:r>
-        <w:rPr>
-          <w:rFonts w:eastAsia="Times New Roman" w:cstheme="minorHAnsi"/>
-          <w:color w:val="000000"/>
-          <w:kern w:val="0"/>
-          <w:lang w:eastAsia="it-IT"/>
-          <w14:ligatures w14:val="none"/>
-        </w:rPr>
-        <w:t xml:space="preserve"> (</w:t>
-      </w:r>
-      <w:proofErr w:type="spellStart"/>
-      <w:r>
-        <w:rPr>
-          <w:rFonts w:eastAsia="Times New Roman" w:cstheme="minorHAnsi"/>
-          <w:color w:val="000000"/>
-          <w:kern w:val="0"/>
-          <w:lang w:eastAsia="it-IT"/>
-          <w14:ligatures w14:val="none"/>
-        </w:rPr>
-        <w:t>Realtime</w:t>
-      </w:r>
-      <w:proofErr w:type="spellEnd"/>
-      <w:r>
-        <w:rPr>
-          <w:rFonts w:eastAsia="Times New Roman" w:cstheme="minorHAnsi"/>
-          <w:color w:val="000000"/>
-          <w:kern w:val="0"/>
-          <w:lang w:eastAsia="it-IT"/>
-          <w14:ligatures w14:val="none"/>
-        </w:rPr>
-        <w:t xml:space="preserve"> Database) e chiavi di accesso nella classe apposita</w:t>
+        <w:t>Configurazione Firebase (Realtime Database) e chiavi di accesso nella classe apposita</w:t>
       </w:r>
     </w:p>
     <w:p>
@@ -9629,29 +9412,7 @@
           <w:lang w:eastAsia="it-IT"/>
           <w14:ligatures w14:val="none"/>
         </w:rPr>
-        <w:t xml:space="preserve">Caricamento dei marker delle colonnine da </w:t>
-      </w:r>
-      <w:proofErr w:type="spellStart"/>
-      <w:r>
-        <w:rPr>
-          <w:rFonts w:eastAsia="Times New Roman" w:cstheme="minorHAnsi"/>
-          <w:color w:val="000000"/>
-          <w:kern w:val="0"/>
-          <w:lang w:eastAsia="it-IT"/>
-          <w14:ligatures w14:val="none"/>
-        </w:rPr>
-        <w:t>Firebase</w:t>
-      </w:r>
-      <w:proofErr w:type="spellEnd"/>
-      <w:r>
-        <w:rPr>
-          <w:rFonts w:eastAsia="Times New Roman" w:cstheme="minorHAnsi"/>
-          <w:color w:val="000000"/>
-          <w:kern w:val="0"/>
-          <w:lang w:eastAsia="it-IT"/>
-          <w14:ligatures w14:val="none"/>
-        </w:rPr>
-        <w:t xml:space="preserve"> sulla mappa </w:t>
+        <w:t xml:space="preserve">Caricamento dei marker delle colonnine da Firebase sulla mappa </w:t>
       </w:r>
       <w:proofErr w:type="spellStart"/>
       <w:r>
@@ -9794,7 +9555,7 @@
           <w:lang w:eastAsia="it-IT"/>
           <w14:ligatures w14:val="none"/>
         </w:rPr>
-        <w:t>Aggiunta barra laterale con pagine dedicate (utente, colonnine…) e tasto logout</w:t>
+        <w:t>Aggiunta barra laterale e tasto logout</w:t>
       </w:r>
     </w:p>
     <w:p>
@@ -10012,29 +9773,7 @@
           <w:lang w:eastAsia="it-IT"/>
           <w14:ligatures w14:val="none"/>
         </w:rPr>
-        <w:t xml:space="preserve">Implementazione in </w:t>
-      </w:r>
-      <w:proofErr w:type="spellStart"/>
-      <w:r>
-        <w:rPr>
-          <w:rFonts w:eastAsia="Times New Roman" w:cstheme="minorHAnsi"/>
-          <w:color w:val="000000"/>
-          <w:kern w:val="0"/>
-          <w:lang w:eastAsia="it-IT"/>
-          <w14:ligatures w14:val="none"/>
-        </w:rPr>
-        <w:t>Firebase</w:t>
-      </w:r>
-      <w:proofErr w:type="spellEnd"/>
-      <w:r>
-        <w:rPr>
-          <w:rFonts w:eastAsia="Times New Roman" w:cstheme="minorHAnsi"/>
-          <w:color w:val="000000"/>
-          <w:kern w:val="0"/>
-          <w:lang w:eastAsia="it-IT"/>
-          <w14:ligatures w14:val="none"/>
-        </w:rPr>
-        <w:t xml:space="preserve"> Service di tutti i nodi necessari per corretta gestione DB</w:t>
+        <w:t>Implementazione in Firebase Service di tutti i nodi necessari per corretta gestione DB</w:t>
       </w:r>
     </w:p>
     <w:p>
@@ -10334,7 +10073,21 @@
           <w:rFonts w:eastAsia="Times New Roman"/>
           <w:lang w:eastAsia="it-IT"/>
         </w:rPr>
-        <w:t>Ottimizzazione e test automatici</w:t>
+        <w:t xml:space="preserve">Ottimizzazione e test </w:t>
+      </w:r>
+      <w:r>
+        <w:rPr>
+          <w:rFonts w:eastAsia="Times New Roman"/>
+          <w:lang w:eastAsia="it-IT"/>
+        </w:rPr>
+        <w:t>final</w:t>
+      </w:r>
+      <w:r>
+        <w:rPr>
+          <w:rFonts w:eastAsia="Times New Roman"/>
+          <w:lang w:eastAsia="it-IT"/>
+        </w:rPr>
+        <w:t>i</w:t>
       </w:r>
       <w:r>
         <w:rPr>
@@ -10576,13 +10329,8 @@
         <w:t>Quattro</w:t>
       </w:r>
       <w:r>
-        <w:t xml:space="preserve"> membri </w:t>
-      </w:r>
-      <w:proofErr w:type="gramStart"/>
-      <w:r>
-        <w:t>del team</w:t>
-      </w:r>
-      <w:proofErr w:type="gramEnd"/>
+        <w:t xml:space="preserve"> membri del team</w:t>
+      </w:r>
       <w:r>
         <w:t xml:space="preserve">, ciascuno con il proprio ruolo e responsabilità (descritti meglio nella sezione </w:t>
       </w:r>
@@ -10751,21 +10499,8 @@
         <w:ind w:left="567"/>
         <w:jc w:val="both"/>
       </w:pPr>
-      <w:proofErr w:type="spellStart"/>
-      <w:r>
-        <w:t>Firebase</w:t>
-      </w:r>
-      <w:proofErr w:type="spellEnd"/>
-      <w:r>
-        <w:t xml:space="preserve"> </w:t>
-      </w:r>
-      <w:proofErr w:type="spellStart"/>
-      <w:r>
-        <w:t>Realtime</w:t>
-      </w:r>
-      <w:proofErr w:type="spellEnd"/>
-      <w:r>
-        <w:t xml:space="preserve"> Database (piano gratuito</w:t>
+      <w:r>
+        <w:t>Firebase Realtime Database (piano gratuito</w:t>
       </w:r>
       <w:r>
         <w:t xml:space="preserve"> Spark</w:t>
@@ -10951,7 +10686,19 @@
         <w:t xml:space="preserve"> per la generazione di QR code</w:t>
       </w:r>
       <w:r>
-        <w:t xml:space="preserve"> - versione3.5.2</w:t>
+        <w:t xml:space="preserve"> </w:t>
+      </w:r>
+      <w:r>
+        <w:t>–</w:t>
+      </w:r>
+      <w:r>
+        <w:t xml:space="preserve"> versione</w:t>
+      </w:r>
+      <w:r>
+        <w:t xml:space="preserve"> </w:t>
+      </w:r>
+      <w:r>
+        <w:t>3.5.2</w:t>
       </w:r>
     </w:p>
     <w:p>
@@ -10977,13 +10724,11 @@
         <w:t xml:space="preserve"> necessaria</w:t>
       </w:r>
       <w:r>
-        <w:t xml:space="preserve">, tutti </w:t>
-      </w:r>
-      <w:proofErr w:type="gramStart"/>
-      <w:r>
-        <w:t>i piano</w:t>
-      </w:r>
-      <w:proofErr w:type="gramEnd"/>
+        <w:t>, tutti i pian</w:t>
+      </w:r>
+      <w:r>
+        <w:t>i</w:t>
+      </w:r>
       <w:r>
         <w:t xml:space="preserve"> sono gratuiti e limitati</w:t>
       </w:r>
@@ -11131,13 +10876,8 @@
         <w:jc w:val="both"/>
       </w:pPr>
       <w:r>
-        <w:t xml:space="preserve">PC di ogni membro </w:t>
-      </w:r>
-      <w:proofErr w:type="gramStart"/>
-      <w:r>
-        <w:t>del team</w:t>
-      </w:r>
-      <w:proofErr w:type="gramEnd"/>
+        <w:t>PC di ogni membro del team</w:t>
+      </w:r>
       <w:r>
         <w:t xml:space="preserve"> già in suo possesso</w:t>
       </w:r>
@@ -11250,15 +10990,7 @@
       </w:r>
       <w:proofErr w:type="spellEnd"/>
       <w:r>
-        <w:t xml:space="preserve">, </w:t>
-      </w:r>
-      <w:proofErr w:type="spellStart"/>
-      <w:r>
-        <w:t>Firebase</w:t>
-      </w:r>
-      <w:proofErr w:type="spellEnd"/>
-      <w:r>
-        <w:t xml:space="preserve"> piano base, GitHub Free) sono gratuite per gli scopi del progetto</w:t>
+        <w:t>, Firebase piano base, GitHub Free) sono gratuite per gli scopi del progetto</w:t>
       </w:r>
       <w:r>
         <w:t>.</w:t>
@@ -11321,6 +11053,9 @@
         <w:t>ulli</w:t>
       </w:r>
       <w:r>
+        <w:t>:</w:t>
+      </w:r>
+      <w:r>
         <w:t xml:space="preserve"> I</w:t>
       </w:r>
       <w:r>
@@ -11344,21 +11079,19 @@
         <w:t xml:space="preserve"> temporale</w:t>
       </w:r>
       <w:r>
-        <w:t xml:space="preserve"> di circa 30-40 ore-uomo per un totale di 1</w:t>
+        <w:t xml:space="preserve"> di circa 30-40 ore-uomo</w:t>
+      </w:r>
+      <w:r>
+        <w:t xml:space="preserve"> a testa</w:t>
+      </w:r>
+      <w:r>
+        <w:t xml:space="preserve"> per un totale di 1</w:t>
       </w:r>
       <w:r>
         <w:t>20-160 ore</w:t>
       </w:r>
       <w:r>
-        <w:t xml:space="preserve"> di sviluppo puro (la parte di studio, comprensione e comunicazione </w:t>
-      </w:r>
-      <w:proofErr w:type="gramStart"/>
-      <w:r>
-        <w:t>nel team</w:t>
-      </w:r>
-      <w:proofErr w:type="gramEnd"/>
-      <w:r>
-        <w:t xml:space="preserve"> non sono comprese)</w:t>
+        <w:t xml:space="preserve"> di sviluppo puro (la parte di studio, comprensione e comunicazione nel team non sono comprese)</w:t>
       </w:r>
       <w:r>
         <w:t>.</w:t>
@@ -11532,15 +11265,7 @@
         <w:t xml:space="preserve">(ai requisiti, al design o al codice) dovrà essere discussa e approvata dal gruppo, in particolare dal </w:t>
       </w:r>
       <w:r>
-        <w:t xml:space="preserve">Product </w:t>
-      </w:r>
-      <w:proofErr w:type="spellStart"/>
-      <w:r>
-        <w:t>Owner</w:t>
-      </w:r>
-      <w:proofErr w:type="spellEnd"/>
-      <w:r>
-        <w:t>.</w:t>
+        <w:t>Product Owner.</w:t>
       </w:r>
     </w:p>
     <w:p>
@@ -11564,13 +11289,8 @@
         <w:t>un’approvazione</w:t>
       </w:r>
       <w:r>
-        <w:t xml:space="preserve"> da parte </w:t>
-      </w:r>
-      <w:proofErr w:type="gramStart"/>
-      <w:r>
-        <w:t>del team</w:t>
-      </w:r>
-      <w:proofErr w:type="gramEnd"/>
+        <w:t xml:space="preserve"> da parte del team</w:t>
+      </w:r>
       <w:r>
         <w:t>.</w:t>
       </w:r>
@@ -11601,15 +11321,7 @@
         <w:t>m</w:t>
       </w:r>
       <w:r>
-        <w:t xml:space="preserve">odifiche alla struttura del database (aggiunta di nodi o modifiche di </w:t>
-      </w:r>
-      <w:proofErr w:type="spellStart"/>
-      <w:r>
-        <w:t>Firebase</w:t>
-      </w:r>
-      <w:proofErr w:type="spellEnd"/>
-      <w:r>
-        <w:t>)</w:t>
+        <w:t>odifiche alla struttura del database (aggiunta di nodi o modifiche di Firebase)</w:t>
       </w:r>
       <w:r>
         <w:t>;</w:t>
@@ -11649,7 +11361,13 @@
         <w:t>a</w:t>
       </w:r>
       <w:r>
-        <w:t>ggiunta di nuove classi o aggiunte di metodi rilevanti a classi preesistenti</w:t>
+        <w:t>ggiunta di nuove classi o</w:t>
+      </w:r>
+      <w:r>
+        <w:t xml:space="preserve"> </w:t>
+      </w:r>
+      <w:r>
+        <w:t>di metodi rilevanti a classi preesistenti</w:t>
       </w:r>
       <w:r>
         <w:t>.</w:t>
@@ -11694,7 +11412,7 @@
         <w:t xml:space="preserve"> per la revisione</w:t>
       </w:r>
       <w:r>
-        <w:t xml:space="preserve">. </w:t>
+        <w:t xml:space="preserve"> se necessari.</w:t>
       </w:r>
     </w:p>
     <w:p>
@@ -11886,7 +11604,13 @@
         <w:t>I</w:t>
       </w:r>
       <w:r>
-        <w:t xml:space="preserve"> tempi di consegna possono variare in base alla decisione del gruppo nel voler svolgere l‘esame di Ingegneria del Software</w:t>
+        <w:t xml:space="preserve"> tempi di consegna possono variare in base alla decisione del gruppo nel voler svolgere l</w:t>
+      </w:r>
+      <w:r>
+        <w:t>’</w:t>
+      </w:r>
+      <w:r>
+        <w:t>esame di Ingegneria del Software</w:t>
       </w:r>
       <w:r>
         <w:t>.</w:t>

</xml_diff>